<commit_message>
Carry the final consistency sweep into the release
Manuscript and SI restated on the 28-assemblage set where four sentences had
lagged (spatial share, closure medians, the k-sweep and ensemble sentences,
the source-effect labels). Analyses 21, 59, 60 and 78 print one number per
definition and read their comparators from their own outputs. Orphan
f15_partition_dependence.md removed. 140 tests pass.

Co-Authored-By: Claude Fable 5.1 <noreply@anthropic.com>
</commit_message>
<xml_diff>
--- a/docs/manuscript/MAIN_TEXT.docx
+++ b/docs/manuscript/MAIN_TEXT.docx
@@ -3371,7 +3371,7 @@
         <w:t xml:space="preserve"> </w:t>
       </w:r>
       <w:r>
-        <w:t xml:space="preserve">itself. The closure strengths consistent with that trend are near zero (posterior median 0.07, interval 0.00 to 0.25; 0.10 and 0.00 to 0.31 once the record’s time-averaging is imposed), and no posterior mass sits above s = 0.5.</w:t>
+        <w:t xml:space="preserve">itself. The closure strengths consistent with that trend are small (posterior median 0.15, interval 0.00 to 0.36; 0.22 and 0.00 to 0.56 once the record’s time-averaging is imposed), and no posterior mass sits above s = 0.5 without time-averaging and 8 percent with it.</w:t>
       </w:r>
     </w:p>
     <w:p>
@@ -3836,7 +3836,7 @@
         <w:pStyle w:val="BodyText"/>
       </w:pPr>
       <w:r>
-        <w:t xml:space="preserve">A partition-free model gives the same verdict from a different direction (Supplemental Text). Treating decorated-class composition as a continuous spatial field over the assemblage coordinates, with a separate term for whatever is specific to each site, the model attributes 97 percent of assemblage-level compositional variance to the spatial field (95 percent credible interval 0.93 to 0.99). Almost nothing remains of the site-specific character that bounded interaction groups would produce. Without containing any groups, the field reproduces the observed between-cluster</w:t>
+        <w:t xml:space="preserve">A partition-free model gives the same verdict from a different direction (Supplemental Text). Treating decorated-class composition as a continuous spatial field over the assemblage coordinates, with a separate term for whatever is specific to each site, the model attributes 99.6 percent of assemblage-level compositional variance to the spatial field (95 percent credible interval 0.973 to 1.000). Almost nothing remains of the site-specific character that bounded interaction groups would produce. Without containing any groups, the field reproduces the observed between-cluster</w:t>
       </w:r>
       <w:r>
         <w:t xml:space="preserve"> </w:t>
@@ -4043,7 +4043,7 @@
         <w:t xml:space="preserve"> </w:t>
       </w:r>
       <w:r>
-        <w:t xml:space="preserve">by cluster at five groups and compared each cluster’s term with its counterpart in 200 calibrated drift realizations. The two thinnest clusters, five Kent-phase assemblages around Kent Place holding 765 sherds and five around Walls holding 918, exceed their drift medians 35-fold and 9-fold, and together they supply 63 percent of the observed statistic. The cluster containing Parkin and nine neighboring assemblages, the best sampled in the basin at 6,555 sherds, exceeds drift 5.7-fold. The two clusters of four along the Mississippi, from Beck to Hollywood and from Castile Landing to Nickel, sit at 1.7- and 2.3-fold. The simulated records are drawn at the observed sherd totals, so sampling error alone does not produce this pattern. But an excess that follows the thinnest samples rather than the putative center is not what closure around Parkin would leave.</w:t>
+        <w:t xml:space="preserve">by cluster at five groups and compared each cluster’s term with its counterpart in 200 calibrated drift realizations. The two thinnest clusters, five Kent-phase assemblages around Kent Place holding 765 sherds and five around Walls holding 918, exceed their drift medians 35-fold and 9-fold, and together they supply 63 percent of the observed statistic. The cluster containing Parkin and nine neighboring assemblages, the best sampled in the basin at 6,555 sherds, exceeds drift 5.7-fold. The two clusters of four along the Mississippi, from Beck to Hollywood and from Castile Landing to Nickel, sit at 1.7- and 2.3-fold. The simulated records are drawn at the observed sherd totals, so sampling error alone does not produce this pattern. Nor is it the tally the counts came from: where a cluster holds assemblages carrying the survey’s counts alone and assemblages carrying Lipo’s compilation, the two kinds of row differ no more than a random split of the cluster into groups of the same sizes (Supplemental Text). But an excess that follows the thinnest samples rather than the putative center is not what closure around Parkin would leave.</w:t>
       </w:r>
     </w:p>
     <w:p>

</xml_diff>

<commit_message>
Carry the datum conversion and the two-stage drift calibration into the release
PFG UTMs read as NAD27 where demonstrated; the calibrated drift cell chosen on
fifty fresh seeds per matched cell; every downstream output, figure and
manuscript passage regenerated; wrapper 66 for the 1,200-realization
boundary sweep. 144 tests pass.

Co-Authored-By: Claude Fable 5.1 <noreply@anthropic.com>
</commit_message>
<xml_diff>
--- a/docs/manuscript/MAIN_TEXT.docx
+++ b/docs/manuscript/MAIN_TEXT.docx
@@ -37,7 +37,7 @@
         <w:pStyle w:val="FirstParagraph"/>
       </w:pPr>
       <w:r>
-        <w:t xml:space="preserve">Archaeologists group assemblages into phases and interpret them as bounded societies, assuming that assemblages more like their near than their distant neighbors record a social group. Neutral drift among neighbors can produce the same clustering with no boundary; a social group is marked by local interaction beyond what distance accounts for. We ask what produced the phase structure, using the St. Francis basin’s Late Mississippian phases as the case. Of four candidate signatures, only between-group variance can detect such closure at this resolution, and by it the basin shows none the record can resolve. A model imposing no groups attributes 99 percent of assemblage-level variation to geography. The published phases are recovered mostly from site locations, and their boundaries fall where composition changes slowly. Parkin, long read as the center of a polity, bridges several seriation orderings rather than anchoring one. At the grain the data select, calibrated drift reproduces the basin’s between-cluster differentiation; finer cuts exceed it by three- to fivefold, and drift’s pottery is sorted into the published phases as readily as the real pottery. What drift leaves sits in the smallest samples, not at Parkin, and a weak locality in where new styles originate reproduces it.</w:t>
+        <w:t xml:space="preserve">Archaeologists group assemblages into phases and interpret them as bounded societies, assuming that assemblages more like their near than their distant neighbors record a social group. Neutral drift among neighbors can produce the same clustering with no boundary; a social group is marked by local interaction beyond what distance accounts for. We ask what produced the phase structure, using the St. Francis basin’s Late Mississippian phases as the case. Of four candidate signatures, only between-group variance can detect such closure here, and by it the basin shows none the record can resolve. A model imposing no groups attributes 99 percent of assemblage-level variation to geography. The published phases are recovered mostly from site locations, and their boundaries fall where composition changes slowly. Parkin, long read as a polity’s center, bridges several seriation orderings rather than anchoring one. At the grain the data select, calibrated drift spans the between-cluster differentiation; finer cuts exceed it by three- to fivefold, and wherever site location enters the sorting, drift’s pottery is sorted into the published phases as readily as the real pottery. What drift leaves sits in the smallest samples, not at Parkin, and a weak locality in where new styles originate reproduces it.</w:t>
       </w:r>
     </w:p>
     <w:p>
@@ -203,7 +203,7 @@
       <w:r>
         <w:drawing>
           <wp:inline>
-            <wp:extent cx="4114800" cy="8028878"/>
+            <wp:extent cx="4114800" cy="8037789"/>
             <wp:effectExtent b="0" l="0" r="0" t="0"/>
             <wp:docPr descr="Figure 1. Decorated-ceramic assemblages of the lower Mississippi Valley and the culture-historical phase scheme this paper tests. The seven Late Mississippian phases (Parkin, Nodena, Jones Bayou, Tipton, Kent, Walls, and Parchman) are shown as discrete territories. Each territory is built by assigning every point on the map to its nearest assemblage, then merging the resulting areas according to the phase Mainfort (1996b) assigns to each assemblage, with a gap drawn between adjacent territories for legibility. Territories are drawn over the HydroRIVERS river network (Lehner and Grill 2013), with line width scaled by flow order. Each assemblage is plotted with a marker corresponding to its phase, and Parkin is marked with a star. The bounded territories illustrate the premise that the paper tests: that such areas host distinct, internally interacting societies. The transmission analysis finds no closure behind these territories beyond what distance alone produces. The assemblages form one continuous field structured by distance, although a drift model calibrated to their own diversity does not by itself reproduce how different the basin’s spatial clusters are. The mapped assemblages fall in Arkansas, Tennessee, and Mississippi. Missouri lies just north of the frame. Inset: location in North America." title="" id="112" name="Picture"/>
             <a:graphic>
@@ -224,7 +224,7 @@
                   <pic:spPr bwMode="auto">
                     <a:xfrm>
                       <a:off x="0" y="0"/>
-                      <a:ext cx="4114800" cy="8028878"/>
+                      <a:ext cx="4114800" cy="8037789"/>
                     </a:xfrm>
                     <a:prstGeom prst="rect">
                       <a:avLst/>
@@ -3650,7 +3650,7 @@
         <w:pStyle w:val="BodyText"/>
       </w:pPr>
       <w:r>
-        <w:t xml:space="preserve">The calibration is itself a result. A drift model that treats the ten decorated classes as interchangeable cannot reproduce the record’s diversity under any combination of population size, innovation rate, and mixing. The obstacle is the record’s shape. Two classes hold nine tenths of all sherds, yet rare classes appear in most assemblages, and drift strong enough to produce that skew also strips the rare ones out. Letting innovation fall in each class in proportion to its regional share, which is what the uneven lumping of variants into culture-history types amounts to, resolves the conflict. Sixty-one of the 297 parameter combinations then match the record’s diversity, where none did before (Supplemental Text, Figure S4).</w:t>
+        <w:t xml:space="preserve">The calibration is itself a result. A drift model that treats the ten decorated classes as interchangeable reproduces the record’s diversity at only one of 297 combinations of population size, innovation rate, and mixing, at the corner of the grid where mixing is highest, and at none elsewhere. The obstacle is the record’s shape. Two classes hold nine tenths of all sherds, yet rare classes appear in most assemblages, and drift strong enough to produce that skew also strips the rare ones out. Letting innovation fall in each class in proportion to its regional share, which is what the uneven lumping of variants into culture-history types amounts to, resolves the conflict. Fifty-six of the 297 parameter combinations then match the record’s diversity on a six-seed screen, and 49 of those still match when re-simulated at fifty seeds (Supplemental Text, Figure S4).</w:t>
       </w:r>
     </w:p>
     <w:p>
@@ -3658,7 +3658,7 @@
         <w:pStyle w:val="BodyText"/>
       </w:pPr>
       <w:r>
-        <w:t xml:space="preserve">The calibrated drift model, in its simplest form, stands in for the no-groups case. Measured against it, the basin’s between-cluster differentiation is higher than drift produces (Figure S2). In the diversity-matched parameter combination most favorable to drift, the observed between-cluster cultural</w:t>
+        <w:t xml:space="preserve">The calibrated drift model, in its simplest form, stands in for the no-groups case. Measured against it, the basin’s between-cluster differentiation is higher than drift produces (Figure S2). In the diversity-matched parameter combination most favorable to drift, chosen on fifty seeds, the observed between-cluster cultural</w:t>
       </w:r>
       <w:r>
         <w:t xml:space="preserve"> </w:t>
@@ -3684,7 +3684,7 @@
         <w:t xml:space="preserve"> </w:t>
       </w:r>
       <w:r>
-        <w:t xml:space="preserve">of 0.006 at the two clusters the silhouette selects lies inside the drift 95 percent interval of 0.0002 to 0.010 (median 0.002). Eight percent of simulated datasets reach the observed value under the seriation order, 7 percent under the reversed order, and 17 percent when the assemblages are treated as contemporaneous, and no diversity-matched parameter combination in the calibration series reaches it at the median; the highest median among the 51 that match is 0.005 (Figure S4). At the grain the data select, then, drift accounts for the differentiation, and the excess appears only when the basin is divided more finely, as reported below. Calibrated drift also returns a single ceramic community in 236 of 500 runs, whereas the data give two communities with a between-community</w:t>
+        <w:t xml:space="preserve">of 0.006 at the two clusters the silhouette selects lies inside the drift 95 percent interval of 0.0003 to 0.015 (median 0.003). Sixteen percent of simulated datasets reach the observed value under the seriation order, 16 percent under the reversed order, and 22 percent when the assemblages are treated as contemporaneous. No diversity-matched parameter combination in the calibration series reaches it at the median; the highest fifty-seed median among the 49 that match is 0.003, and 20 of the 49 cover the observation within their 95 percent intervals (Figure S4). At the grain the data select, then, the differentiation sits within what drift produces, and the excess appears only when the basin is divided more finely, as reported below. Calibrated drift also returns a single ceramic community in 325 of 500 runs, whereas the data give two communities with a between-community</w:t>
       </w:r>
       <w:r>
         <w:t xml:space="preserve"> </w:t>
@@ -3710,7 +3710,7 @@
         <w:t xml:space="preserve"> </w:t>
       </w:r>
       <w:r>
-        <w:t xml:space="preserve">of 0.039. In the 264 runs that do return two or more, the between-community</w:t>
+        <w:t xml:space="preserve">of 0.039. In the 175 runs that do return two or more, the between-community</w:t>
       </w:r>
       <w:r>
         <w:t xml:space="preserve"> </w:t>
@@ -3736,7 +3736,7 @@
         <w:t xml:space="preserve"> </w:t>
       </w:r>
       <w:r>
-        <w:t xml:space="preserve">runs from 0.005 to 0.051, and 2 percent of runs reach the observed value. That drift produces multiple communities in half its runs is worth stating plainly: the number of communities is a weak discriminator here, and only their differentiation separates the record from the null. It would be natural to interpret an excess over drift as the mark of a boundary. Whether it is depends on what a model with boundaries predicts, which is the next comparison.</w:t>
+        <w:t xml:space="preserve">runs from 0.008 to 0.043, and 1 percent of runs reach the observed value. That drift produces multiple communities in a third of its runs is worth stating plainly: the number of communities is a weak discriminator here, and only their differentiation separates the record from the null. It would be natural to interpret an excess over drift as the mark of a boundary. Whether it is depends on what a model with boundaries predicts, which is the next comparison.</w:t>
       </w:r>
     </w:p>
     <w:p>
@@ -3744,23 +3744,23 @@
         <w:pStyle w:val="BodyText"/>
       </w:pPr>
       <w:r>
-        <w:t xml:space="preserve">Drift does reproduce the distance decay of similarity, the tendency for assemblages farther apart to share less (observed r = -0.32 against a drift interval of -0.62 to -0.02). Similarity across the cluster boundaries, however, is</w:t>
-      </w:r>
-      <w:r>
-        <w:t xml:space="preserve"> </w:t>
-      </w:r>
-      <w:r>
-        <w:rPr>
-          <w:i/>
-          <w:iCs/>
-        </w:rPr>
-        <w:t xml:space="preserve">higher</w:t>
-      </w:r>
-      <w:r>
-        <w:t xml:space="preserve"> </w:t>
-      </w:r>
-      <w:r>
-        <w:t xml:space="preserve">in the data than distance alone predicts, not lower. The boundary excess is -11.9 and falls outside both the drift and the bounded-groups intervals.</w:t>
+        <w:t xml:space="preserve">Drift does reproduce the distance decay of similarity, the tendency for assemblages farther apart to share less (observed r = -0.21 against a drift interval of -0.29 to +0.08). Similarity across the cluster boundaries, however, is</w:t>
+      </w:r>
+      <w:r>
+        <w:t xml:space="preserve"> </w:t>
+      </w:r>
+      <w:r>
+        <w:rPr>
+          <w:i/>
+          <w:iCs/>
+        </w:rPr>
+        <w:t xml:space="preserve">lower</w:t>
+      </w:r>
+      <w:r>
+        <w:t xml:space="preserve"> </w:t>
+      </w:r>
+      <w:r>
+        <w:t xml:space="preserve">in the data than distance alone predicts: the distance-controlled boundary excess is +14.0, within-cluster pairs more alike than between-cluster pairs at matched distance, and it falls outside both the drift interval (-9.7 to +8.7) and the bounded-groups intervals.</w:t>
       </w:r>
     </w:p>
     <w:p>
@@ -3768,7 +3768,7 @@
         <w:pStyle w:val="BodyText"/>
       </w:pPr>
       <w:r>
-        <w:t xml:space="preserve">The bounded-groups process at the same calibration does little better. Reducing copying across the spatial clusters to a multiplier of 0.5, 0.1, or 0.03 raises the median</w:t>
+        <w:t xml:space="preserve">The bounded-groups process at the same calibration does little better. Reducing copying across the spatial clusters to a multiplier of 0.5, 0.1, or 0.03 leaves the median</w:t>
       </w:r>
       <w:r>
         <w:t xml:space="preserve"> </w:t>
@@ -3794,7 +3794,7 @@
         <w:t xml:space="preserve"> </w:t>
       </w:r>
       <w:r>
-        <w:t xml:space="preserve">only to between 0.003 and 0.006. The observation does fall inside the bounded-groups interval, but only through the wide upper tail of an interval estimated from 30 runs, between 7 and 23 percent of which reach the observed value. Part of the reason the boundary raises</w:t>
+        <w:t xml:space="preserve">between 0.002 and 0.004. The observation does fall inside the bounded-groups interval, but through the wide upper tail of an interval estimated from 30 runs, between 20 and 33 percent of which reach the observed value. Part of the reason the boundary raises</w:t>
       </w:r>
       <w:r>
         <w:t xml:space="preserve"> </w:t>
@@ -3828,7 +3828,7 @@
         <w:pStyle w:val="BodyText"/>
       </w:pPr>
       <w:r>
-        <w:t xml:space="preserve">So the excess over drift is not evidence for bounded groups, because the model built to represent bounded groups does not produce it either. A drift model fitted to the assemblages’ own diversity leaves their between-cluster differentiation unexplained by about a factor of three at the coarsest grain and five at finer ones, and restricted copying, as we model it, accounts for only a small part of that difference. Together, the two comparisons do not select between the processes. They identify something in the record that neither model reproduces. The positive control therefore certifies neither side. An earlier, uncalibrated version of this comparison reached the opposite conclusion because it ran at nearly twice the observed diversity, which made its drift distributions too wide. The sensitivity checks around the calibrated parameter combination are in the Supplemental Text.</w:t>
+        <w:t xml:space="preserve">So the excess over drift is not evidence for bounded groups, because the model built to represent bounded groups does not produce it either. A drift model fitted to the assemblages’ own diversity puts their between-cluster differentiation at two and a half times its median at the coarsest grain, inside its interval, and three- to fivefold above its median at finer grains, outside it, and restricted copying, as we model it, accounts for only a small part of that difference. Together, the two comparisons do not select between the processes. They identify something in the record that neither model reproduces. The positive control therefore certifies neither side. An earlier, uncalibrated version of this comparison reached the opposite conclusion because it ran at nearly twice the observed diversity, which made its drift distributions too wide. The sensitivity checks around the calibrated parameter combination are in the Supplemental Text.</w:t>
       </w:r>
     </w:p>
     <w:p>
@@ -3885,7 +3885,7 @@
         <w:t xml:space="preserve"> </w:t>
       </w:r>
       <w:r>
-        <w:t xml:space="preserve">itself depends on how finely the basin is divided, rising from 0.0075 at two clusters to 0.0415 at six, though not on which particular division is drawn at a given grain (Supplemental Text).</w:t>
+        <w:t xml:space="preserve">itself depends on how finely the basin is divided, rising from 0.0062 at two clusters to 0.0302 at five, though not on which particular division is drawn at a given grain (Supplemental Text).</w:t>
       </w:r>
     </w:p>
     <w:bookmarkStart w:id="162" w:name="X38a0c6a9c650c3c6e71b804c682fc2a3dc35e63"/>
@@ -3967,7 +3967,7 @@
         <w:t xml:space="preserve"> </w:t>
       </w:r>
       <w:r>
-        <w:t xml:space="preserve">divided by the model’s median. Calibrated drift, at 0.0015 against the observed 0.0062, falls short by about fourfold at the median. Table 2 collects every account this paper tests, the two interpretations of the phase, the bounded-groups model, and the four relaxed assumptions. The grids and their diagnostics are in the Supplemental Text.</w:t>
+        <w:t xml:space="preserve">divided by the model’s median. Calibrated drift, at 0.0025 against the observed 0.0062, falls short by about two and a half fold at the median, with the observation inside its interval. Table 2 collects every account this paper tests, the two interpretations of the phase, the bounded-groups model, and the four relaxed assumptions. The grids and their diagnostics are in the Supplemental Text.</w:t>
       </w:r>
     </w:p>
     <w:p>
@@ -3975,7 +3975,7 @@
         <w:pStyle w:val="BodyText"/>
       </w:pPr>
       <w:r>
-        <w:t xml:space="preserve">Three of the four fail, and they fail in the same way. Each raises differentiation only at the cost of the fit to the assemblages’ diversity. Unequal site populations were the obvious candidate, because small settlements drift faster toward idiosyncratic repertoires. Inequality does raise differentiation about threefold across the range swept. But it also lowers the average population that governs drift, so drift runs faster everywhere and within-assemblage diversity falls below what the record shows at any inequality at all; the match is gone by a coefficient of variation of 0.5. At the inequality the settlement record itself suggests, the model still falls short by a factor of two to two and a half, with the match already lost. Transport geography comes closer but still falls short. We varied the distance metric, the interaction length, and the shape of the decay itself, since an exponential fall-off is an assumption rather than a measurement. On this set neither metric, at any length from 6 to 96 kilometers, moves the median by more than a few ten-thousandths. The river metric is the null most favorable to drift, which is why we use it, not because the pottery follows it: between assemblages in different phases, ceramic distance tracks straight-line separation and not river distance (Supplemental Text). The best case that keeps the diversity fit, a power-law decay at 12 kilometers, narrows the shortfall only from fourfold to 3.1; a Gaussian decay at 6 kilometers reaches 3.2 and loses the fit. That is not a free parameter being tuned but a claim about how far potters copied, and one the settlement pattern makes hard to credit. No diversity-matched combination of metric, length, or decay shape reaches the observed differentiation, and accumulation spans that differ among deposits barely move the statistic.</w:t>
+        <w:t xml:space="preserve">Three of the four fail, and they fail in the same way. Each raises differentiation only at the cost of the fit to the assemblages’ diversity. Unequal site populations were the obvious candidate, because small settlements drift faster toward idiosyncratic repertoires. Inequality does raise differentiation about fivefold across the range swept. But it also lowers the average population that governs drift, so drift runs faster everywhere and within-assemblage diversity falls below what the record shows; the match is gone by a coefficient of variation of 1.0. At the inequality the settlement record itself suggests, the model comes within a factor of 1.5 to 1.1 of the observation, with the match already lost. Transport geography comes closer but still falls short. We varied the distance metric, the interaction length, and the shape of the decay itself, since an exponential fall-off is an assumption rather than a measurement. On this set neither metric, at any length from 6 to 96 kilometers, moves the median by more than a few thousandths. The river metric is the null most favorable to drift, which is why we use it, not because the pottery follows it: between assemblages in different phases, ceramic distance tracks straight-line separation and not river distance (Supplemental Text). The best case that keeps the diversity fit, a straight-line exponential decay at 6 kilometers, narrows the shortfall only from 2.5-fold to 2.1; a Gaussian decay along the rivers at 6 kilometers reaches 1.5 and loses the fit. That is not a free parameter being tuned but a claim about how far potters copied, and one the settlement pattern makes hard to credit. No diversity-matched combination of metric, length, or decay shape reaches the observed differentiation, and accumulation spans that differ among deposits barely move the statistic.</w:t>
       </w:r>
     </w:p>
     <w:p>
@@ -4009,7 +4009,7 @@
         <w:t xml:space="preserve"> </w:t>
       </w:r>
       <w:r>
-        <w:t xml:space="preserve">of 0.0054 against the observed 0.0062, and at 0.22 a median of 0.0071, with within-assemblage diversity, class richness and pooled diversity inside the calibration’s tolerance at both; the match holds through 0.35 and breaks at 0.4. It is the only one of the four that changes what innovation does rather than how fast drift runs, so it raises differentiation without disturbing diversity. We report the values at 1,200 realizations per cell. The individual realizations are very widely spread, from 0.0004 to 0.21 at those settings, so the agreement is between the model’s central tendency and the observation rather than between tight distributions. This model is still a drift model. Nothing in it restricts who copies whom, and no boundary interrupts copying anywhere. The single change is that new styles arise locally rather than at the same rates across the whole basin. It is also the assumption our own comparison was least equipped to question, since drawing innovation from the regional profile gives both the drift and the bounded-groups model a source of new variants that no boundary interrupts.</w:t>
+        <w:t xml:space="preserve">of 0.0059 against the observed 0.0062, and at 0.25 a median of 0.0125, with within-assemblage diversity, class richness and pooled diversity inside the calibration’s tolerance at both; the match holds through 0.3 and breaks at 0.4. It is the only one of the four that changes what innovation does rather than how fast drift runs, so it raises differentiation without disturbing diversity. We report the values at 1,200 realizations per cell. The individual realizations are very widely spread, from 0.0004 to 0.16 at those settings, so the agreement is between the model’s central tendency and the observation rather than between tight distributions. This model is still a drift model. Nothing in it restricts who copies whom, and no boundary interrupts copying anywhere. The single change is that new styles arise locally rather than at the same rates across the whole basin. It is also the assumption our own comparison was least equipped to question, since drawing innovation from the regional profile gives both the drift and the bounded-groups model a source of new variants that no boundary interrupts.</w:t>
       </w:r>
     </w:p>
     <w:p>
@@ -4043,7 +4043,7 @@
         <w:t xml:space="preserve"> </w:t>
       </w:r>
       <w:r>
-        <w:t xml:space="preserve">by cluster at five groups and compared each cluster’s term with its counterpart in 200 calibrated drift realizations. The two thinnest clusters, five Kent-phase assemblages around Kent Place holding 765 sherds and five around Walls holding 918, exceed their drift medians 35-fold and 9-fold, and together they supply 63 percent of the observed statistic. The cluster containing Parkin and nine neighboring assemblages, the best sampled in the basin at 6,555 sherds, exceeds drift 5.7-fold. The two clusters of four along the Mississippi, from Beck to Hollywood and from Castile Landing to Nickel, sit at 1.7- and 2.3-fold. The simulated records are drawn at the observed sherd totals, so sampling error alone does not produce this pattern. Nor is it the tally the counts came from: where a cluster holds assemblages carrying the survey’s counts alone and assemblages carrying Lipo’s compilation, the two kinds of row differ no more than a random split of the cluster into groups of the same sizes (Supplemental Text). But an excess that follows the thinnest samples rather than the putative center is not what closure around Parkin would leave.</w:t>
+        <w:t xml:space="preserve">by cluster at five groups and compared each cluster’s term with its counterpart in 300 calibrated drift realizations. The two thinnest clusters, five Kent-phase assemblages around Kent Place holding 765 sherds and five around Walls holding 918, exceed their drift medians 30-fold and 7-fold, and together they supply 63 percent of the observed statistic. The cluster containing Parkin and nine neighboring assemblages, the best sampled in the basin at 6,555 sherds, exceeds drift 4-fold. The two clusters of four along the Mississippi, from Beck to Hollywood and from Castile Landing to Nickel, sit at 2.3- and 2.2-fold. The simulated records are drawn at the observed sherd totals, so sampling error alone does not produce this pattern. Nor is it the tally the counts came from: where a cluster holds assemblages carrying the survey’s counts alone and assemblages carrying Lipo’s compilation, the two kinds of row differ no more than a random split of the cluster into groups of the same sizes (Supplemental Text). But an excess that follows the thinnest samples rather than the putative center is not what closure around Parkin would leave.</w:t>
       </w:r>
     </w:p>
     <w:p>
@@ -4327,33 +4327,7 @@
               <w:t xml:space="preserve"> </w:t>
             </w:r>
             <w:r>
-              <w:t xml:space="preserve">Reproduces diversity and distance decay; underpredicts between-cluster</w:t>
-            </w:r>
-            <w:r>
-              <w:t xml:space="preserve"> </w:t>
-            </w:r>
-            <m:oMath>
-              <m:sSub>
-                <m:e>
-                  <m:r>
-                    <m:t>F</m:t>
-                  </m:r>
-                </m:e>
-                <m:sub>
-                  <m:r>
-                    <m:t>S</m:t>
-                  </m:r>
-                  <m:r>
-                    <m:t>T</m:t>
-                  </m:r>
-                </m:sub>
-              </m:sSub>
-            </m:oMath>
-            <w:r>
-              <w:t xml:space="preserve"> </w:t>
-            </w:r>
-            <w:r>
-              <w:t xml:space="preserve">by about sixfold (0.004 against 0.021)</w:t>
+              <w:t xml:space="preserve">Reproduces diversity and distance decay; at two clusters the observed 0.0062 lies inside its interval at 2.5 times its median of 0.0025, and at five clusters it falls short 4.6-fold</w:t>
             </w:r>
           </w:p>
         </w:tc>
@@ -4435,7 +4409,7 @@
               <w:t xml:space="preserve"> </w:t>
             </w:r>
             <w:r>
-              <w:t xml:space="preserve">Medians run 0.0013 to 0.0024 at both interaction lengths whatever the restriction, against the observed 0.0062; the observation is reached in 0 to 23 percent of realizations, through the upper tail</w:t>
+              <w:t xml:space="preserve">Medians run 0.0020 to 0.0044 at both interaction lengths whatever the restriction, against the observed 0.0062; the observation is reached in 20 to 33 percent of realizations, through the upper tail</w:t>
             </w:r>
           </w:p>
         </w:tc>
@@ -4511,7 +4485,7 @@
               <w:t xml:space="preserve"> </w:t>
             </w:r>
             <w:r>
-              <w:t xml:space="preserve">rises from 0.0017 to 0.0052, but the average population that governs drift falls with it, and the diversity match is gone by a coefficient of variation of 0.5; shortfall 2.5-fold at 1.0 and 1.8-fold at 2.0</w:t>
+              <w:t xml:space="preserve">rises from 0.0026 to 0.0122, but the average population that governs drift falls with it, and the diversity match is gone by a coefficient of variation of 1.0; shortfall 1.5-fold at 1.0 and the observation passed by 2.0, with the match lost</w:t>
             </w:r>
           </w:p>
         </w:tc>
@@ -4567,7 +4541,7 @@
               <w:t xml:space="preserve"> </w:t>
             </w:r>
             <w:r>
-              <w:t xml:space="preserve">The best cell that keeps the diversity match, a power-law decay at 12 km, narrows the shortfall only to 3.1-fold; a Gaussian at 6 km reaches 3.2-fold and breaks the match</w:t>
+              <w:t xml:space="preserve">The best cell that keeps the diversity match, a straight-line exponential decay at 6 km, narrows the shortfall only to 2.1-fold; a Gaussian along the rivers at 6 km reaches 1.5-fold and breaks the match</w:t>
             </w:r>
           </w:p>
         </w:tc>
@@ -4623,7 +4597,7 @@
               <w:t xml:space="preserve"> </w:t>
             </w:r>
             <w:r>
-              <w:t xml:space="preserve">The median stays at 0.0015 to 0.0017 at every half-range and the shortfall at 3.7 to 4.0-fold; the statistic is unaffected</w:t>
+              <w:t xml:space="preserve">The median stays at 0.0023 to 0.0026 at every half-range and the shortfall at 2.4 to 2.7-fold; the statistic is unaffected</w:t>
             </w:r>
           </w:p>
         </w:tc>
@@ -4679,7 +4653,7 @@
               <w:t xml:space="preserve"> </w:t>
             </w:r>
             <w:r>
-              <w:t xml:space="preserve">At a permuted fraction of 0.2 the median is 0.0054 and at 0.22 it is 0.0071, against the observed 0.0062, with all three diversity summaries matched; the match holds through 0.35 and breaks at 0.4. Individual realizations are very widely spread, so this is agreement of a central tendency with the observation</w:t>
+              <w:t xml:space="preserve">At a permuted fraction of 0.2 the median is 0.0059 and at 0.25 it is 0.0125, against the observed 0.0062, with all three diversity summaries matched; the match holds through 0.3 and breaks at 0.4. Individual realizations are very widely spread, so this is agreement of a central tendency with the observation</w:t>
             </w:r>
           </w:p>
         </w:tc>
@@ -4942,7 +4916,7 @@
         <w:t xml:space="preserve"> </w:t>
       </w:r>
       <w:r>
-        <w:t xml:space="preserve">rising only from 0.002 at two groups to 0.007 at six. The observed values do not behave that way. At two groups, the grain the silhouette selects, the record falls inside what drift produces; from three groups upward it exceeds the 95 percent interval, by about 3.6-fold at three groups and about fivefold at five. Drift on the real geography accounts for the broad regional pattern and fails locally, and the finer the cut the worse it fails. No single</w:t>
+        <w:t xml:space="preserve">rising only from 0.002 at two groups to 0.007 at six. The observed values do not behave that way. At two groups, the grain the silhouette selects, the record falls inside what drift produces; from three groups upward it exceeds the 95 percent interval at five groups and finer, by 4.6-fold at five; at three and four groups the shortfall is 3.3-fold but the observation stays inside the interval. Drift on the real geography accounts for the broad regional pattern and fails locally, and the finer the cut the worse it fails. No single</w:t>
       </w:r>
       <w:r>
         <w:t xml:space="preserve"> </w:t>
@@ -5026,7 +5000,7 @@
         <w:pStyle w:val="BodyText"/>
       </w:pPr>
       <w:r>
-        <w:t xml:space="preserve">The phase boundaries therefore carry less information about where ceramic differences lie than an uninformed division of the same ground into groups of the same sizes, and far less than a division drawn to be spatially tight. A partition marking real interaction communities should behave otherwise: it should stand well above both, because its boundaries would be where the differences are. What the boundaries do track is spatial compactness, and closely. Their within-group dispersion, 189.9 km² per assemblage, is the tightest three-way division of these assemblages at these group sizes that our search found, and a local search minimizing dispersion, which never sees a potsherd, returned the phase partition exactly in 153 of 1,000 random restarts and nothing tighter in any of them. What the phase scheme appears to record is the gradient itself, real spatial structure read as edges.</w:t>
+        <w:t xml:space="preserve">The phase boundaries therefore carry less information about where ceramic differences lie than an uninformed division of the same ground into groups of the same sizes, and far less than a division drawn to be spatially tight. A partition marking real interaction communities should behave otherwise: it should stand well above both, because its boundaries would be where the differences are. What the boundaries do track is spatial compactness, and closely. Their within-group dispersion, 190.5 km² per assemblage, is the tightest three-way division of these assemblages at these group sizes that our search found, and a local search minimizing dispersion, which never sees a potsherd, returned the phase partition exactly in 154 of 1,000 random restarts and nothing tighter in any of them. What the phase scheme appears to record is the gradient itself, real spatial structure read as edges.</w:t>
       </w:r>
     </w:p>
     <w:p>
@@ -5046,7 +5020,7 @@
           <wp:inline>
             <wp:extent cx="5334000" cy="2584123"/>
             <wp:effectExtent b="0" l="0" r="0" t="0"/>
-            <wp:docPr descr="Figure 12. Scale and boundaries. (A) Observed between-cluster cultural F_{ST} against the calibrated spatial-drift null as the basin is partitioned into two through six groups. The drift band is nearly flat; the observed values leave it from three groups upward and the gap widens with grain. (B) Within-group dispersion against cultural F_{ST} for 1,000 partitions carrying the phases’ group sizes with seed points placed at random (light) and 1,000 drawn to minimize dispersion (dark); the star is the phase partition. Differentiation is unrelated to how tight the groups are in the random-boundary cloud (Spearman -0.01) and moderately related in the compact one (+0.46), and no draw in either ensemble is tighter than the phases. (C) The phase partition’s F_{ST} (solid line) against the dispersion-minimizing ensemble, in which it sits at the 5th percentile." title="" id="148" name="Picture"/>
+            <wp:docPr descr="Figure 12. Scale and boundaries. (A) Observed between-cluster cultural F_{ST} against the calibrated spatial-drift null as the basin is partitioned into two through six groups. The drift band is nearly flat; the observed values leave it from three groups upward and the gap widens with grain. (B) Within-group dispersion against cultural F_{ST} for 1,000 partitions carrying the phases’ group sizes with seed points placed at random (light) and 1,000 drawn to minimize dispersion (dark); the star is the phase partition. Differentiation is unrelated to how tight the groups are in the random-boundary cloud (Spearman -0.01) and moderately related in the compact one (+0.47), and no draw in either ensemble is tighter than the phases. (C) The phase partition’s F_{ST} (solid line) against the dispersion-minimizing ensemble, in which it sits at the 5th percentile." title="" id="148" name="Picture"/>
             <a:graphic>
               <a:graphicData uri="http://schemas.openxmlformats.org/drawingml/2006/picture">
                 <pic:pic>
@@ -5151,7 +5125,7 @@
         <w:t xml:space="preserve"> </w:t>
       </w:r>
       <w:r>
-        <w:t xml:space="preserve">for 1,000 partitions carrying the phases’ group sizes with seed points placed at random (light) and 1,000 drawn to minimize dispersion (dark); the star is the phase partition. Differentiation is unrelated to how tight the groups are in the random-boundary cloud (Spearman -0.01) and moderately related in the compact one (+0.46), and no draw in either ensemble is tighter than the phases. (C) The phase partition’s</w:t>
+        <w:t xml:space="preserve">for 1,000 partitions carrying the phases’ group sizes with seed points placed at random (light) and 1,000 drawn to minimize dispersion (dark); the star is the phase partition. Differentiation is unrelated to how tight the groups are in the random-boundary cloud (Spearman -0.01) and moderately related in the compact one (+0.47), and no draw in either ensemble is tighter than the phases. (C) The phase partition’s</w:t>
       </w:r>
       <w:r>
         <w:t xml:space="preserve"> </w:t>
@@ -5211,9 +5185,9 @@
       <w:r>
         <w:drawing>
           <wp:inline>
-            <wp:extent cx="5299850" cy="2911400"/>
+            <wp:extent cx="5296791" cy="2911400"/>
             <wp:effectExtent b="0" l="0" r="0" t="0"/>
-            <wp:docPr descr="Figure 13. Groupness as a continuous field. (A) Compositional turnover, the root sum of squares of the local weighted-least-squares gradient of the ten decorated-class proportions, on a 160 by 160 grid with a 15 km Gaussian bandwidth, masked where local support falls below two effective assemblages. Circles are assemblages. (B) The same field with the published phase boundaries drawn on it. Median turnover along those boundaries is lower than along the boundaries induced by any of 200 size-matched partitions with seeds placed at random. (C) Observed cultural F_{ST} against group radius in kilometers, with the calibrated drift band behind it; the axis runs from coarse to fine. The observed value rises from 0.0062 at an 18 km radius, inside the band, to 0.048 at 5 km, while the band’s upper edge rises from 0.010 to 0.028. Past a radius of about 10 km the partition begins isolating single assemblages, so finer grains are shown but should not be read as structure." title="" id="151" name="Picture"/>
+            <wp:docPr descr="Figure 13. Groupness as a continuous field. (A) Compositional turnover, the root sum of squares of the local weighted-least-squares gradient of the ten decorated-class proportions, on a 160 by 160 grid with a 15 km Gaussian bandwidth, masked where local support falls below two effective assemblages. Circles are assemblages. (B) The same field with the published phase boundaries drawn on it. Median turnover along those boundaries is lower than along the boundaries induced by any of 200 size-matched partitions with seeds placed at random. (C) Observed cultural F_{ST} against group radius in kilometers, with the calibrated drift band behind it; the axis runs from coarse to fine. The observed value rises from 0.0062 at an 18 km radius, inside the band, to 0.048 at 5 km, while the band’s upper edge rises from 0.016 to 0.028. Past a radius of about 10 km the partition begins isolating single assemblages, so finer grains are shown but should not be read as structure." title="" id="151" name="Picture"/>
             <a:graphic>
               <a:graphicData uri="http://schemas.openxmlformats.org/drawingml/2006/picture">
                 <pic:pic>
@@ -5232,7 +5206,7 @@
                   <pic:spPr bwMode="auto">
                     <a:xfrm>
                       <a:off x="0" y="0"/>
-                      <a:ext cx="5299850" cy="2911400"/>
+                      <a:ext cx="5296791" cy="2911400"/>
                     </a:xfrm>
                     <a:prstGeom prst="rect">
                       <a:avLst/>
@@ -5292,7 +5266,7 @@
         <w:t xml:space="preserve"> </w:t>
       </w:r>
       <w:r>
-        <w:t xml:space="preserve">against group radius in kilometers, with the calibrated drift band behind it; the axis runs from coarse to fine. The observed value rises from 0.0062 at an 18 km radius, inside the band, to 0.048 at 5 km, while the band’s upper edge rises from 0.010 to 0.028. Past a radius of about 10 km the partition begins isolating single assemblages, so finer grains are shown but should not be read as structure.</w:t>
+        <w:t xml:space="preserve">against group radius in kilometers, with the calibrated drift band behind it; the axis runs from coarse to fine. The observed value rises from 0.0062 at an 18 km radius, inside the band, to 0.048 at 5 km, while the band’s upper edge rises from 0.016 to 0.028. Past a radius of about 10 km the partition begins isolating single assemblages, so finer grains are shown but should not be read as structure.</w:t>
       </w:r>
     </w:p>
     <w:p>
@@ -5365,7 +5339,7 @@
         <w:pStyle w:val="BodyText"/>
       </w:pPr>
       <w:r>
-        <w:t xml:space="preserve">The account this suggests is that the phases were seen because settlement is clumped and similarity decays with distance, so that a smooth gradient sampled at clumped points looks like discrete groups to a procedure that sorts by resemblance and proximity. Two further tests bear on it. The first asks whether pottery generated by drift alone, with no groups in it, would have been sorted into the published phases. We ran the calibrated drift model on the real site geography, sampled its pottery at the observed sherd totals, and clustered each of 300 simulated records exactly as the real one is clustered above, scoring agreement with Mainfort’s assignments over the 25 assemblages he placed (Figure 15). Wherever the coordinates enter the representation, drift’s pottery is sorted into the phases as readily as the real pottery, and usually better: at a quarter weight on composition the real record’s agreement of 0.607 sits below 99 percent of drift’s, and at equal weight at the 79th percentile. With pottery alone, where geography cannot help, the real record agrees with the phases more than drift’s does, 0.237 against a median of -0.003, with no drift record at or above it. That is the same residual seen from another side: there is ceramic structure aligned with the phases that drift on this geography does not produce, and it is small.</w:t>
+        <w:t xml:space="preserve">The account this suggests is that the phases were seen because settlement is clumped and similarity decays with distance, so that a smooth gradient sampled at clumped points looks like discrete groups to a procedure that sorts by resemblance and proximity. Two further tests bear on it. The first asks whether pottery generated by drift alone, with no groups in it, would have been sorted into the published phases. We ran the calibrated drift model on the real site geography, sampled its pottery at the observed sherd totals, and clustered each of 300 simulated records exactly as the real one is clustered above, scoring agreement with Mainfort’s assignments over the 25 assemblages he placed (Figure 15). Wherever the coordinates enter the representation, drift’s pottery is sorted into the phases as readily as the real pottery, and usually better: at a quarter weight on composition the real record’s agreement of 0.607 sits at or below every one of drift’s 300 records (median 0.938), and at equal weight at the 53rd percentile (median 0.581). With pottery alone, where geography cannot help, the real record agrees with the phases more than drift’s does, 0.237 against a median of 0.031, with 3 percent of drift records at or above it. That is the same residual seen from another side: there is ceramic structure aligned with the phases that drift on this geography does not produce, and it is small.</w:t>
       </w:r>
     </w:p>
     <w:p>
@@ -5373,7 +5347,7 @@
         <w:pStyle w:val="BodyText"/>
       </w:pPr>
       <w:r>
-        <w:t xml:space="preserve">The second asks whether the phase boundaries run through the gaps in late-period settlement, measured on evidence the ceramic analysis never touches. The settlement compilation records 83 sites with a late pre-contact component in the mapped area; dropping the 27 within a kilometer of an analyzed assemblage leaves 56 whose positions are independent of the assemblages. The density of those sites along the internal phase boundaries is compared with the density along boundaries of the same construction induced by 300 partitions carrying the phases’ group sizes (Figure 16). At an 8 km bandwidth, 77 percent of random-seed partitions and 61 percent of spatially compact ones have boundaries running through denser settlement than the phase boundaries do; at 5 km the figures are 39 and 14 percent, and at 3 km 22 and 15. The two boundaries that remain, Parkin against Kent and Kent against Walls, therefore run through country no emptier than a boundary drawn elsewhere would, except at the coarsest bandwidth. Empty country is what separated the untested phases, Nodena and Parchman, from these three, and with those phases out of the analysis the gap test has less to find; the record in any case cannot resolve structure below the median spacing of its own assemblages, 4.6 km. Late-period sites lie a median 1.9 km from a major river against 3.6 km for random points in the same area, so the rivers set the band in which settlement happens, but points that hug the rivers exactly as closely as the sites do come out randomly spaced (Clark-Evans ratio 0.98 against the sites’ 0.64); the clumps are on particular reaches, for reasons river proximity alone does not supply.</w:t>
+        <w:t xml:space="preserve">The second asks whether the phase boundaries run through the gaps in late-period settlement, measured on evidence the ceramic analysis never touches. The settlement compilation records 83 sites with a late pre-contact component in the mapped area; dropping the 27 within a kilometer of an analyzed assemblage leaves 56 whose positions are independent of the assemblages. The density of those sites along the internal phase boundaries is compared with the density along boundaries of the same construction induced by 300 partitions carrying the phases’ group sizes (Figure 16). At an 8 km bandwidth, 64 percent of random-seed partitions and 61 percent of spatially compact ones have boundaries running through denser settlement than the phase boundaries do; at 5 km the figures are 40 and 14 percent, and at 3 km 18 and 15. The two boundaries that remain, Parkin against Kent and Kent against Walls, therefore run through country no emptier than a boundary drawn elsewhere would, except at the coarsest bandwidth. Empty country is what separated the untested phases, Nodena and Parchman, from these three, and with those phases out of the analysis the gap test has less to find; the record in any case cannot resolve structure below the median spacing of its own assemblages, 4.6 km. Late-period sites lie a median 1.8 km from a major river against 3.6 km for random points in the same area, so the rivers set the band in which settlement happens, but points that hug the rivers exactly as closely as the sites do come out randomly spaced (Clark-Evans ratio 0.99 against the sites’ 0.64); the clumps are on particular reaches, for reasons river proximity alone does not supply.</w:t>
       </w:r>
     </w:p>
     <w:p>
@@ -5448,7 +5422,7 @@
       <w:r>
         <w:drawing>
           <wp:inline>
-            <wp:extent cx="5241744" cy="3223336"/>
+            <wp:extent cx="5238686" cy="3223336"/>
             <wp:effectExtent b="0" l="0" r="0" t="0"/>
             <wp:docPr descr="Figure 16. Do the phase boundaries run through the gaps in settlement? (A) Kernel density of the 56 late-period sites that lie more than 1 km from any analyzed assemblage (5 km bandwidth), with the assemblages as open circles and the internal phase boundaries as points. (B) Median settlement density along the phase boundaries (vertical line) against the same quantity for boundaries induced by 300 partitions with the phases’ group sizes, seeds placed at random (light) and drawn to be spatially compact (dark)." title="" id="160" name="Picture"/>
             <a:graphic>
@@ -5469,7 +5443,7 @@
                   <pic:spPr bwMode="auto">
                     <a:xfrm>
                       <a:off x="0" y="0"/>
-                      <a:ext cx="5241744" cy="3223336"/>
+                      <a:ext cx="5238686" cy="3223336"/>
                     </a:xfrm>
                     <a:prstGeom prst="rect">
                       <a:avLst/>
@@ -5955,7 +5929,7 @@
           <w:i/>
           <w:iCs/>
         </w:rPr>
-        <w:t xml:space="preserve">The basin assemblages are more differentiated than either generative model produces.</w:t>
+        <w:t xml:space="preserve">At fine grain the basin assemblages are more differentiated than either generative model produces.</w:t>
       </w:r>
       <w:r>
         <w:t xml:space="preserve"> </w:t>
@@ -5987,7 +5961,7 @@
         <w:t xml:space="preserve"> </w:t>
       </w:r>
       <w:r>
-        <w:t xml:space="preserve">is 0.006, inside the 0.0002 to 0.010 that the simplest drift model calibrated to the assemblages’ own diversity produces; at three it is 0.016 against an upper edge of 0.013, and at five 0.031 against 0.019, and imposing bounded groups on the copying network does not make up the difference.</w:t>
+        <w:t xml:space="preserve">is 0.006, inside the 0.0003 to 0.015 that the simplest drift model calibrated to the assemblages’ own diversity produces; at three it is 0.016 against an upper edge of 0.019 and at four 0.019 against 0.021, still inside; at five it is 0.031 against 0.021, outside, and imposing bounded groups on the copying network does not make up the difference.</w:t>
       </w:r>
     </w:p>
     <w:p>

</xml_diff>

<commit_message>
Carry the plain statement of what a phase is into the release
Co-Authored-By: Claude Fable 5.1 <noreply@anthropic.com>
</commit_message>
<xml_diff>
--- a/docs/manuscript/MAIN_TEXT.docx
+++ b/docs/manuscript/MAIN_TEXT.docx
@@ -5670,7 +5670,7 @@
         <w:pStyle w:val="BodyText"/>
       </w:pPr>
       <w:r>
-        <w:t xml:space="preserve">What the record does show, once the drift model is required to match the diversity within the assemblages themselves, is more differentiation between spatial clusters than the simplest form of spatially structured drift produces at any grain finer than the two clusters the data select, and restricted copying, as we have modeled it, does not explain the difference either. Of the four assumptions we were able to relax, one accounts for it, and it is not an assumption about who copied whom.</w:t>
+        <w:t xml:space="preserve">What the record does show, once the drift model is required to match the diversity within the assemblages themselves, is more differentiation between spatial clusters than the simplest form of spatially structured drift produces, but only at grains finer than the phases themselves, from five clusters on; at the two to four clusters that span the grain of the published phases the observation lies inside what drift produces. Restricted copying, as we have modeled it, does not explain the fine-grain difference either. Of the four assumptions we were able to relax, one accounts for it, and it is not an assumption about who copied whom.</w:t>
       </w:r>
     </w:p>
     <w:p>
@@ -5734,7 +5734,7 @@
         <w:t xml:space="preserve"> </w:t>
       </w:r>
       <w:r>
-        <w:t xml:space="preserve">while forming no groups. Proximity in ordination space is proximity on the ground, seen through the pottery. His own reconfigured phases make the point from the other side: drawn after the ordination, they sit where the pottery differs and are no longer the tightest division of the map, so the two schemes together show a gradient read two ways, once by proximity and once by the pottery, with no boundary in either. We therefore read a phase as a length scale on a continuous gradient, made visible by where settlement happens to cluster, rather than as a bounded unit. These data cannot say what that length is. The spatial model’s length scale is not identified, and sherd counts that differ 96-fold, unequal accumulation spans, and an ordinal chronology derived from the same frequencies together set the limit on what any spatial statistic can resolve here.</w:t>
+        <w:t xml:space="preserve">while forming no groups. Proximity in ordination space is proximity on the ground, seen through the pottery. His own reconfigured phases make the point from the other side: drawn after the ordination, they sit where the pottery differs and are no longer the tightest division of the map, so the two schemes together show a gradient read two ways, once by proximity and once by the pottery, with no boundary in either. We therefore read a phase as a length scale on a continuous gradient, made visible by where settlement happens to cluster, rather than as a bounded unit.</w:t>
       </w:r>
     </w:p>
     <w:p>
@@ -5742,6 +5742,14 @@
         <w:pStyle w:val="BodyText"/>
       </w:pPr>
       <w:r>
+        <w:t xml:space="preserve">Put plainly, the phases are not places where groups show up in the pottery. They are lines drawn across a smooth pattern, at a scale where copying between neighbors explains everything the lines capture. Whatever the pottery holds that copying alone does not explain sits at a finer scale than the phases, in the smallest and most thinly sampled clusters, and the workers who drew the phases were working too coarsely to have been tracking it. What they saw was real. It was where the sites are, and the fact that nearby potters copied one another more than distant ones did. Sort assemblages by how alike they are and how close they sit, and that pattern looks like discrete groups even when there are none. These data cannot say what the length scale of the gradient is. The spatial model’s length scale is not identified, and sherd counts that differ 96-fold, unequal accumulation spans, and an ordinal chronology derived from the same frequencies together set the limit on what any spatial statistic can resolve here.</w:t>
+      </w:r>
+    </w:p>
+    <w:p>
+      <w:pPr>
+        <w:pStyle w:val="BodyText"/>
+      </w:pPr>
+      <w:r>
         <w:t xml:space="preserve">A drift model alone reproduces the phase pattern at the grain the data select and falls short of it at finer grains, and the transmission record does not identify bounded groups as the cause of that shortfall. A partition-free field model finds almost none of the site-specific residual that bounded groups would leave, so the differentiation that calibrated drift underpredicts at fine grain is spatially continuous rather than clustered into groups. That does not support interpreting the Parkin phase as a polity.</w:t>
       </w:r>
     </w:p>
@@ -5822,7 +5830,7 @@
         <w:t xml:space="preserve">(Lipo et al. 2021)</w:t>
       </w:r>
       <w:r>
-        <w:t xml:space="preserve">, and the drift model reproduces the diversity within the assemblages and their differentiation at two spatial clusters, while underpredicting it at three or more. Local elaboration on a shared complex is most of what the record looks like, and at fine grain it is not all of it.</w:t>
+        <w:t xml:space="preserve">, and the drift model reproduces the diversity within the assemblages and their differentiation at two, three and four spatial clusters, the grains that span the published phases, while underpredicting it at five or more. Local elaboration on a shared complex is most of what the record looks like, and at fine grain it is not all of it.</w:t>
       </w:r>
     </w:p>
     <w:p>
@@ -5847,7 +5855,7 @@
         <w:pStyle w:val="BodyText"/>
       </w:pPr>
       <w:r>
-        <w:t xml:space="preserve">The remaining excess is measured on the basin’s spatial clusters at grains finer than two, not on the phase labels. Nothing in the comparison singles Parkin out. Its assemblages sit inside the same continuous field as the rest, and time-averaging is built into the null through the eight-slice accumulation window, so it cannot be invoked to discount the excess either.</w:t>
+        <w:t xml:space="preserve">The remaining excess is measured on the basin’s spatial clusters at five clusters and finer, below the grain of the phases, not on the phase labels. Nothing in the comparison singles Parkin out. Its assemblages sit inside the same continuous field as the rest, and time-averaging is built into the null through the eight-slice accumulation window, so it cannot be invoked to discount the excess either.</w:t>
       </w:r>
     </w:p>
     <w:p>
@@ -6209,7 +6217,7 @@
         <w:pStyle w:val="BodyText"/>
       </w:pPr>
       <w:r>
-        <w:t xml:space="preserve">One question remains open and warrants direct investigation. At any grain finer than two clusters the basin’s between-cluster differentiation exceeds what calibrated drift produces, and that excess is small but consistent. A center just beginning to differentiate from its neighbors would leave an excess of this kind, and contact and the protohistoric depopulation would have cut any such sequence short before it could consolidate. A boundary in copying placed somewhere we did not model would leave an excess of this kind too, though the version we could test reproduces only a small part of it. Relaxing those assumptions narrows the question without settling it. They rule out the geographies and accumulation histories we could construct, but they leave two accounts standing side by side, a locally patterned innovation process and a genuine social boundary, which these data cannot tell apart.</w:t>
+        <w:t xml:space="preserve">One question remains open and warrants direct investigation. At five clusters and finer, below the grain at which the phases were drawn, the basin’s between-cluster differentiation exceeds what calibrated drift produces, and that excess is small but consistent. A center just beginning to differentiate from its neighbors would leave an excess of this kind, and contact and the protohistoric depopulation would have cut any such sequence short before it could consolidate. A boundary in copying placed somewhere we did not model would leave an excess of this kind too, though the version we could test reproduces only a small part of it. Relaxing those assumptions narrows the question without settling it. They rule out the geographies and accumulation histories we could construct, but they leave two accounts standing side by side, a locally patterned innovation process and a genuine social boundary, which these data cannot tell apart.</w:t>
       </w:r>
     </w:p>
     <w:p>
@@ -6267,7 +6275,7 @@
         <w:pStyle w:val="BodyText"/>
       </w:pPr>
       <w:r>
-        <w:t xml:space="preserve">The simplest form of neutral drift does not, however, account for the whole of the phase pattern. Once that model is required to fit the assemblages’ own diversity, it reproduces the tendency of nearby assemblages to resemble one another, and it reproduces their differentiation at the coarsest grain the data support, but it underpredicts how different the basin’s spatial clusters are once the basin is cut into three or more. No parameterization that reproduces the assemblages’ diversity reproduces that finer differentiation at the median. Restricted copying across spatial groups, as modeled here, accounts for only part of the difference. That difference is not group structure. The partition-free field model finds almost none of the site-specific variation that bounded groups would leave, so the differentiation calibrated drift underpredicts is spread continuously across space rather than gathered into units. The record is more spatially structured than distance-decay copying produces, not more clustered.</w:t>
+        <w:t xml:space="preserve">The simplest form of neutral drift does not, however, account for the whole of the phase pattern. Once that model is required to fit the assemblages’ own diversity, it reproduces the tendency of nearby assemblages to resemble one another, and it reproduces their differentiation at the grain of the phases themselves, two to four clusters, but it underpredicts how different the basin’s spatial clusters are once the basin is cut into five or more. No parameterization that reproduces the assemblages’ diversity reproduces that finer differentiation at the median. Restricted copying across spatial groups, as modeled here, accounts for only part of the difference. That difference is not group structure. The partition-free field model finds almost none of the site-specific variation that bounded groups would leave, so the differentiation calibrated drift underpredicts is spread continuously across space rather than gathered into units. The record is more spatially structured than distance-decay copying produces, not more clustered. The phases sit above that structure, at a grain where drift accounts for everything they capture: they are lines drawn across a gradient, not the edges of groups.</w:t>
       </w:r>
     </w:p>
     <w:p>

</xml_diff>

<commit_message>
Carry the checked text and regenerated figures into the release
Co-Authored-By: Claude Opus 5.5 (1M context) <noreply@anthropic.com>
</commit_message>
<xml_diff>
--- a/docs/manuscript/MAIN_TEXT.docx
+++ b/docs/manuscript/MAIN_TEXT.docx
@@ -205,7 +205,7 @@
           <wp:inline>
             <wp:extent cx="4114800" cy="8037789"/>
             <wp:effectExtent b="0" l="0" r="0" t="0"/>
-            <wp:docPr descr="Figure 1. Decorated-ceramic assemblages of the lower Mississippi Valley and the culture-historical phase scheme this paper tests. The seven Late Mississippian phases (Parkin, Nodena, Jones Bayou, Tipton, Kent, Walls, and Parchman) are shown as territories. Each territory is built by assigning every point on the map to its nearest assemblage and then merging those areas according to the phase Mainfort (1996b) assigns each assemblage, with a gap drawn between adjacent territories for legibility. Territories are drawn over the HydroRIVERS river network (Lehner and Grill 2013), with line width scaled by flow order. Markers show each assemblage’s phase, and Parkin is starred. The bounded territories illustrate the premise under test, that each hosted a distinct, internally interacting society. The mapped assemblages fall in Arkansas, Tennessee, and Mississippi; Missouri lies just north of the frame. Inset: location in North America." title="" id="112" name="Picture"/>
+            <wp:docPr descr="Figure 1. Decorated-ceramic assemblages of the lower Mississippi Valley and the culture-historical phase scheme this paper tests. Five of the seven Late Mississippian phases (Parkin, Nodena, Kent, Walls, and Parchman) are drawn as territories; Jones Bayou and Tipton, in western Tennessee, have no assemblage with decorated counts in this study’s matrix and appear only in the legend. Assemblages without a phase assignment are not drawn. Each territory is built by assigning every point on the map to its nearest assemblage and then merging those areas according to the phase Mainfort (1996b) assigns each assemblage, with a gap drawn between adjacent territories for legibility. Territories are drawn over the HydroRIVERS river network (Lehner and Grill 2013), with line width scaled by flow order. Markers show each assemblage’s phase, and Parkin is starred. The bounded territories illustrate the premise under test, that each hosted a distinct, internally interacting society. The mapped assemblages fall in Arkansas, Tennessee, and Mississippi; Missouri lies just north of the frame. Inset: location in North America." title="" id="112" name="Picture"/>
             <a:graphic>
               <a:graphicData uri="http://schemas.openxmlformats.org/drawingml/2006/picture">
                 <pic:pic>
@@ -258,7 +258,7 @@
         <w:t xml:space="preserve"> </w:t>
       </w:r>
       <w:r>
-        <w:t xml:space="preserve">Decorated-ceramic assemblages of the lower Mississippi Valley and the culture-historical phase scheme this paper tests. The seven Late Mississippian phases (Parkin, Nodena, Jones Bayou, Tipton, Kent, Walls, and Parchman) are shown as territories. Each territory is built by assigning every point on the map to its nearest assemblage and then merging those areas according to the phase Mainfort</w:t>
+        <w:t xml:space="preserve">Decorated-ceramic assemblages of the lower Mississippi Valley and the culture-historical phase scheme this paper tests. Five of the seven Late Mississippian phases (Parkin, Nodena, Kent, Walls, and Parchman) are drawn as territories; Jones Bayou and Tipton, in western Tennessee, have no assemblage with decorated counts in this study’s matrix and appear only in the legend. Assemblages without a phase assignment are not drawn. Each territory is built by assigning every point on the map to its nearest assemblage and then merging those areas according to the phase Mainfort</w:t>
       </w:r>
       <w:r>
         <w:t xml:space="preserve"> </w:t>
@@ -1474,9 +1474,9 @@
       <w:r>
         <w:drawing>
           <wp:inline>
-            <wp:extent cx="5334000" cy="4821752"/>
+            <wp:extent cx="5334000" cy="4683019"/>
             <wp:effectExtent b="0" l="0" r="0" t="0"/>
-            <wp:docPr descr="Figure 2. The four measures on idealized data. Trajectories of the four measures along the sequence under each of four simulated processes, using large, clean synthetic assemblages. Only a bounded interaction group drives all four together (starred). Across 500 random seeds the bounded-group case was identified in 493 (95 percent interval 0.97 to 0.99), and none of the three other processes was identified at all (95 percent upper bound 0.007). Inset: the mean absolute correlation among the four measures, about 0.88 under closure and about 0.2 under the other processes, so their joint movement is informative rather than redundant." title="" id="120" name="Picture"/>
+            <wp:docPr descr="Figure 2. The four measures on idealized data. Trajectories of the four measures along the sequence under each of four simulated processes, using large, clean synthetic assemblages. Only a bounded interaction group drives all four together (starred). Across 500 random seeds the bounded-group case was identified in 493 (95 percent interval 0.97 to 0.99), and none of the three other processes was identified at all (95 percent upper bound 0.007). Right panel: the mean absolute correlation among the four measures, about 0.88 under closure and 0.18 to 0.28 under the other processes, so their joint movement is informative rather than redundant." title="" id="120" name="Picture"/>
             <a:graphic>
               <a:graphicData uri="http://schemas.openxmlformats.org/drawingml/2006/picture">
                 <pic:pic>
@@ -1495,7 +1495,7 @@
                   <pic:spPr bwMode="auto">
                     <a:xfrm>
                       <a:off x="0" y="0"/>
-                      <a:ext cx="5334000" cy="4821752"/>
+                      <a:ext cx="5334000" cy="4683019"/>
                     </a:xfrm>
                     <a:prstGeom prst="rect">
                       <a:avLst/>
@@ -1529,7 +1529,7 @@
         <w:t xml:space="preserve"> </w:t>
       </w:r>
       <w:r>
-        <w:t xml:space="preserve">The four measures on idealized data. Trajectories of the four measures along the sequence under each of four simulated processes, using large, clean synthetic assemblages. Only a bounded interaction group drives all four together (starred). Across 500 random seeds the bounded-group case was identified in 493 (95 percent interval 0.97 to 0.99), and none of the three other processes was identified at all (95 percent upper bound 0.007). Inset: the mean absolute correlation among the four measures, about 0.88 under closure and about 0.2 under the other processes, so their joint movement is informative rather than redundant.</w:t>
+        <w:t xml:space="preserve">The four measures on idealized data. Trajectories of the four measures along the sequence under each of four simulated processes, using large, clean synthetic assemblages. Only a bounded interaction group drives all four together (starred). Across 500 random seeds the bounded-group case was identified in 493 (95 percent interval 0.97 to 0.99), and none of the three other processes was identified at all (95 percent upper bound 0.007). Right panel: the mean absolute correlation among the four measures, about 0.88 under closure and 0.18 to 0.28 under the other processes, so their joint movement is informative rather than redundant.</w:t>
       </w:r>
     </w:p>
     <w:p>
@@ -1558,7 +1558,7 @@
           <wp:inline>
             <wp:extent cx="5334000" cy="4404980"/>
             <wp:effectExtent b="0" l="0" r="0" t="0"/>
-            <wp:docPr descr="Figure 3. What the test distinguishes, shown with synthetic assemblages matched to the record. Top: the basin assemblages in a two-dimensional map of decorated dissimilarity, in which more similar assemblages sit closer together (points colored by the two spatial clusters that best fit the site layout), as they would appear if the Parkin phase were a bounded interaction group (left, sharp clusters), under copying that fades with distance (center, a continuous gradient), and as observed (right, a diffuse scatter that resembles the gradient). Bottom: the trend of cultural F_{ST} along the sequence recovered from synthetic assemblages as imposed closure rises from 0 (no groups) to 1 (strong groups). The dashed line is the observed trend, a rank correlation of -0.048, not an F_{ST} value; the band around it is the range of -0.80 to +0.40 that a single random subsample returns. The shaded vertical band is the 95 percent credible interval for the closure consistent with that observation (0.00 to 0.36, median 0.15)." title="" id="123" name="Picture"/>
+            <wp:docPr descr="Figure 3. What the test distinguishes, shown with synthetic assemblages matched to the record. Top: the basin assemblages in a two-dimensional map of decorated dissimilarity, in which more similar assemblages sit closer together (points colored by the two spatial clusters that best fit the site layout), as they would appear if the Parkin phase were a bounded interaction group (left, sharp clusters), under copying that fades with distance (center, a continuous gradient), and as observed (right, a diffuse scatter that resembles the gradient). Bottom: the trend of cultural F_{ST} along the sequence recovered from synthetic assemblages as imposed closure rises from 0 (no groups) to 1 (strong groups). The dashed line is the observed trend, a rank correlation of -0.048, not an F_{ST} value; the band around it is the range of -0.80 to +0.40 that a single random subsample returns. The shaded vertical band is the 95 percent credible interval for the closure consistent with that observation (0.00 to 0.37, median 0.15)." title="" id="123" name="Picture"/>
             <a:graphic>
               <a:graphicData uri="http://schemas.openxmlformats.org/drawingml/2006/picture">
                 <pic:pic>
@@ -1663,7 +1663,7 @@
         <w:t xml:space="preserve"> </w:t>
       </w:r>
       <w:r>
-        <w:t xml:space="preserve">value; the band around it is the range of -0.80 to +0.40 that a single random subsample returns. The shaded vertical band is the 95 percent credible interval for the closure consistent with that observation (0.00 to 0.36, median 0.15).</w:t>
+        <w:t xml:space="preserve">value; the band around it is the range of -0.80 to +0.40 that a single random subsample returns. The shaded vertical band is the 95 percent credible interval for the closure consistent with that observation (0.00 to 0.37, median 0.15).</w:t>
       </w:r>
     </w:p>
     <w:bookmarkEnd w:id="125"/>
@@ -1796,7 +1796,7 @@
         <w:t xml:space="preserve"> </w:t>
       </w:r>
       <w:r>
-        <w:t xml:space="preserve">assigns it to one of the basin’s phases, or when it falls inside the territory his assignments define. Two further rules apply. The Parchman phase is excluded on geography: its three assemblages lie across the Mississippi in Coahoma County, 30 to 46 km from the nearest other assemblage and 77 km from the centroid of the rest. An assemblage also needs at least 75 decorated sherds. We chose that number by measurement. Sampling alone creates apparent differences between two assemblages drawn from one and the same population of pots. Drawing pairs of samples from the basin’s pooled class profile, the spurious</w:t>
+        <w:t xml:space="preserve">assigns it to one of the basin’s phases, or when it falls inside the territory his assignments define. Two further rules apply. The Parchman phase is excluded on geography: its three assemblages lie across the Mississippi in Coahoma County, 30 to 46 km from the nearest other assemblage. An assemblage also needs at least 75 decorated sherds. We chose that number by measurement. Sampling alone creates apparent differences between two assemblages drawn from one and the same population of pots. Drawing pairs of samples from the basin’s pooled class profile, so that everything between them is sampling, the spurious</w:t>
       </w:r>
       <w:r>
         <w:t xml:space="preserve"> </w:t>
@@ -1822,7 +1822,7 @@
         <w:t xml:space="preserve"> </w:t>
       </w:r>
       <w:r>
-        <w:t xml:space="preserve">has a median of nearly half the observed between-cluster value at 25 sherds, a fifth at 50, a seventh at 75, and a ninth at 100, and its 95th percentile first falls below the observed value at 75 (Supplemental Text). Seventy-five is the smallest sample at which the sampling artifact stops dominating. Mainfort’s 800-sherd rule corresponds to about 100 decorated sherds, so ours is slightly more permissive.</w:t>
+        <w:t xml:space="preserve">has a median of about half the observed five-cluster value at 25 sherds, a quarter at 50, a seventh at 75, and a ninth at 100 (Supplemental Text). We measure against the five-cluster value because that is the scale at which the record departs from the copying model, and so the scale at which a sampling artifact could be mistaken for a real difference. At 75 sherds the artifact’s 95th percentile lies well below that value, whereas at 50 it roughly equals it; seventy-five is the smallest sample at which sampling alone could not produce the observed difference. Mainfort’s 800-sherd rule corresponds to about 100 decorated sherds, so ours is slightly more permissive.</w:t>
       </w:r>
     </w:p>
     <w:p>
@@ -1830,7 +1830,7 @@
         <w:pStyle w:val="BodyText"/>
       </w:pPr>
       <w:r>
-        <w:t xml:space="preserve">These rules leave 28 assemblages holding 14,101 decorated sherds (median 251 per assemblage, range 79 to 1,709) in three phases: Parkin with 11 assemblages, Kent with 8, and Walls with 9. Twenty-five carry Mainfort’s assignment and three the territory’s. Figure 1 shows seven phases, and the analysis tests three, for three reasons. Jones Bayou and Tipton, in western Tennessee, have decorated counts only in Mainfort’s table. Parchman is excluded on geography. Nodena’s three assemblages hold 47, 38, and 153 decorated sherds, so only one survives the minimum, and a phase of one assemblage has no internal variation to compare. The three phases tested are therefore the ones whose assemblages the survey and our own collections sampled well enough for a between-group measure to mean something. As drawn, they extend beyond the drainage that names them, and the farthest member lies 40.6 km from the St. Francis system.</w:t>
+        <w:t xml:space="preserve">These rules leave 28 assemblages holding 14,101 decorated sherds (median 251 per assemblage, range 79 to 1,709) in three phases: Parkin with 11 assemblages, Kent with 8, and Walls with 9. Twenty-five carry Mainfort’s assignment and three the territory’s. Figure 1 shows seven phases, and the analysis tests three, for three reasons. Jones Bayou and Tipton, in western Tennessee, have decorated counts only in Mainfort’s table. Parchman is excluded on geography. Nodena’s three assemblages hold 47, 38, and 153 decorated sherds, so only one survives the minimum, and a phase of one assemblage has no internal variation to compare. The three phases tested are therefore the ones whose assemblages the survey and our own collections sampled well enough for a between-group measure to mean something. As drawn, they extend beyond the drainage that names them, and the farthest member lies 40.5 km from the St. Francis system.</w:t>
       </w:r>
     </w:p>
     <w:p>
@@ -1939,7 +1939,7 @@
         <w:t xml:space="preserve">(Holland-Lulewicz and Ritchison 2021)</w:t>
       </w:r>
       <w:r>
-        <w:t xml:space="preserve">, so we order the assemblages by seriation instead. We use the first axis of a correspondence analysis of the decorated-class frequencies, which arranges assemblages by the similarity of their frequencies, as a relative chronological order, oriented so that higher positions are later (Figure 4)</w:t>
+        <w:t xml:space="preserve">, so we order the assemblages by seriation instead. We use the first axis of a correspondence analysis of the decorated-class frequencies, which arranges assemblages by the similarity of their frequencies, as a relative chronological order (Figure 4)</w:t>
       </w:r>
       <w:r>
         <w:t xml:space="preserve"> </w:t>
@@ -1948,7 +1948,7 @@
         <w:t xml:space="preserve">(Baxter 1994; Peeples and Schachner 2012; Smith and Neiman 2007)</w:t>
       </w:r>
       <w:r>
-        <w:t xml:space="preserve">. Across the five dated proveniences that match our assemblages, median calibrated age and seriation position correlate at Spearman +0.70 (27 dates pooled), and four of the five fall in calendar order. The axis is therefore an order, not a calendar, and no result below depends on its direction.</w:t>
+        <w:t xml:space="preserve">. Only four dated proveniences match our assemblages (26 dates pooled), and they cannot establish which end of the axis is later: using pooled calibrated medians, age and position correlate at Spearman 0.40 in magnitude, with Clay Hill out of order, and using one-sigma calibrated midpoints the correlation is zero. We therefore use the axis in its computed orientation, treat it as an order rather than a calendar, and report every result that depends on its direction both ways.</w:t>
       </w:r>
     </w:p>
     <w:p>
@@ -1960,7 +1960,7 @@
           <wp:inline>
             <wp:extent cx="5334000" cy="3639186"/>
             <wp:effectExtent b="0" l="0" r="0" t="0"/>
-            <wp:docPr descr="Figure 4. Correspondence-analysis seriation of the 28 decorated assemblages, plotted on the first two dimensions and colored by rank on the first, the relative chronological order (oriented by the five available radiocarbon dates so that higher rank is later). Parkin is starred. The assemblages form a continuum rather than discrete clusters, echoing Mainfort’s (2003) independent ordination." title="" id="128" name="Picture"/>
+            <wp:docPr descr="Figure 4. Correspondence-analysis seriation of the 28 decorated assemblages, plotted on the first two dimensions and colored by rank on the first, the relative chronological order (shown in its computed orientation, since the four radiocarbon-dated assemblages do not establish which end is later). Parkin is starred. The assemblages form a continuum rather than discrete clusters, echoing Mainfort’s (2003) independent ordination." title="" id="128" name="Picture"/>
             <a:graphic>
               <a:graphicData uri="http://schemas.openxmlformats.org/drawingml/2006/picture">
                 <pic:pic>
@@ -2013,7 +2013,7 @@
         <w:t xml:space="preserve"> </w:t>
       </w:r>
       <w:r>
-        <w:t xml:space="preserve">Correspondence-analysis seriation of the 28 decorated assemblages, plotted on the first two dimensions and colored by rank on the first, the relative chronological order (oriented by the five available radiocarbon dates so that higher rank is later). Parkin is starred. The assemblages form a continuum rather than discrete clusters, echoing Mainfort’s (2003) independent ordination.</w:t>
+        <w:t xml:space="preserve">Correspondence-analysis seriation of the 28 decorated assemblages, plotted on the first two dimensions and colored by rank on the first, the relative chronological order (shown in its computed orientation, since the four radiocarbon-dated assemblages do not establish which end is later). Parkin is starred. The assemblages form a continuum rather than discrete clusters, echoing Mainfort’s (2003) independent ordination.</w:t>
       </w:r>
     </w:p>
     <w:bookmarkEnd w:id="130"/>
@@ -2397,7 +2397,7 @@
         <w:pStyle w:val="FirstParagraph"/>
       </w:pPr>
       <w:r>
-        <w:t xml:space="preserve">Copying across space produces differences among assemblages whatever else is happening, so the first question is how much of the observed variation it accounts for. We answer it with the neutral copying model run on the real map and tuned to the real assemblages. Tuning the model is itself informative. A model that treats the ten classes as interchangeable matches the record’s diversity at only one of the 297 parameter combinations, at the corner of the grid where mixing is highest. The obstacle is the record’s shape: two classes hold nine tenths of all sherds, yet rare classes appear in most assemblages, and copying strong enough to produce that skew removes the rare classes. Letting new variants fall into each class in proportion to its regional share resolves the conflict. Fifty-six combinations then match on the six-run screen, and 49 still match when rerun fifty times (Supplemental Text, Figure S4).</w:t>
+        <w:t xml:space="preserve">Copying across space produces differences among assemblages whatever else is happening, so the first question is how much of the observed variation it accounts for. We answer it with the neutral copying model run on the real map and tuned to the real assemblages. Tuning the model is itself informative. A model that treats the ten classes as interchangeable matches the record’s diversity at only one of the 297 parameter combinations, at the corner of the grid where mixing is highest. The obstacle is the record’s shape: two classes hold 86 percent of all sherds, yet the average assemblage contains six of the ten classes, and copying strong enough to produce that skew removes the rare classes. Letting new variants fall into each class in proportion to its regional share resolves the conflict. Fifty-six combinations then match on the six-run screen, and 49 still match when rerun fifty times (Supplemental Text, Figure S4).</w:t>
       </w:r>
     </w:p>
     <w:p>
@@ -2431,7 +2431,7 @@
         <w:t xml:space="preserve"> </w:t>
       </w:r>
       <w:r>
-        <w:t xml:space="preserve">of 0.0062 lies inside the model’s 95 percent range of 0.0003 to 0.0153 (median 0.0026). Sixteen percent of simulated datasets reach the observed value when assemblages are sampled in seriation order, 16 percent in reverse order, and 22 percent when they are treated as contemporaneous. Across all 49 matched combinations, 20 include the observed value within their 95 percent range. The model also reproduces the fading of similarity with distance (observed correlation -0.21 against a simulated range of -0.29 to +0.08).</w:t>
+        <w:t xml:space="preserve">of 0.0062 lies inside the model’s 95 percent range of 0.0003 to 0.0153 (median 0.0026). Sixteen percent of simulated datasets reach the observed value when assemblages are sampled in seriation order, 16 percent in reverse order, and 22 percent when they are treated as contemporaneous. Across all 49 matched combinations, 19 include the observed value within their 95 percent range. The model also reproduces the fading of similarity with distance (observed correlation -0.21 against a simulated range of -0.29 to +0.08).</w:t>
       </w:r>
     </w:p>
     <w:p>
@@ -2439,7 +2439,7 @@
         <w:pStyle w:val="BodyText"/>
       </w:pPr>
       <w:r>
-        <w:t xml:space="preserve">A model with no groups also produces the clustered look of the record. When the simulated assemblages are sorted into communities by their similarity, the model returns a single community in 325 of 500 runs and two or more in the rest, so apparent communities arise a third of the time with no boundary anywhere. Where the model returns two or more, the difference between them ranges from 0.008 to 0.043, against an observed 0.039 that 1 percent of runs reach. The number of apparent communities therefore says little; how different they are is the stronger evidence.</w:t>
+        <w:t xml:space="preserve">A model with no groups also produces the clustered look of the record. When the simulated assemblages are sorted into communities by their similarity, the model returns a single community in 325 of 500 runs and two or more in the rest, so apparent communities arise a third of the time with no boundary anywhere. Where the model returns two or more, the difference between them ranges from 0.008 to 0.043, against an observed 0.039, which 1 of those 175 runs reaches. The number of apparent communities therefore says little; how different they are is the stronger evidence.</w:t>
       </w:r>
     </w:p>
     <w:p>
@@ -2473,7 +2473,7 @@
         <w:t xml:space="preserve"> </w:t>
       </w:r>
       <w:r>
-        <w:t xml:space="preserve">between 0.0020 and 0.0044, and 20 to 33 percent of the 30 runs at each setting reach the observed value, no more than the model without a boundary. A boundary in copying, the mechanism the phase-as-group hypothesis requires, adds almost nothing to what distance already produces. Part of the reason lies in the model: new variants arrive from a region-wide pool that no boundary interrupts, which mutes any boundary’s effect.</w:t>
+        <w:t xml:space="preserve">between 0.0020 and 0.0037, and 20 to 30 percent of the 30 runs at each setting reach the observed value, no more than the 23 to 33 percent reached with no boundary at all. A boundary in copying, the mechanism the phase-as-group hypothesis requires, adds almost nothing to what distance already produces. Part of the reason lies in the model: new variants arrive from a region-wide pool that no boundary interrupts, which mutes any boundary’s effect.</w:t>
       </w:r>
     </w:p>
     <w:p>
@@ -2481,7 +2481,7 @@
         <w:pStyle w:val="BodyText"/>
       </w:pPr>
       <w:r>
-        <w:t xml:space="preserve">The model with no clusters gives the same answer from a different direction. It assigns 99.6 percent of the variation in composition among assemblages to location (95 percent credible interval 0.973 to 1.000), leaving almost none of the site-specific character that bounded groups would produce. Without containing any groups, it also reproduces the observed between-cluster</w:t>
+        <w:t xml:space="preserve">The model with no clusters gives the same answer from a different direction. It assigns 99.6 percent of the variation in composition among assemblages to location (95 percent credible interval 0.972 to 1.000), leaving almost none of the site-specific character that bounded groups would produce. Without containing any groups, it also reproduces the observed between-cluster</w:t>
       </w:r>
       <w:r>
         <w:t xml:space="preserve"> </w:t>
@@ -2504,7 +2504,10 @@
         </m:sSub>
       </m:oMath>
       <w:r>
-        <w:t xml:space="preserve">, the fading of similarity with distance, and the spread of diversity among assemblages (Supplemental Text).</w:t>
+        <w:t xml:space="preserve"> </w:t>
+      </w:r>
+      <w:r>
+        <w:t xml:space="preserve">at three clusters, the fading of similarity with distance, and the spread of diversity among assemblages (Supplemental Text).</w:t>
       </w:r>
     </w:p>
     <w:bookmarkEnd w:id="137"/>
@@ -2594,7 +2597,7 @@
           <wp:inline>
             <wp:extent cx="5334000" cy="2692949"/>
             <wp:effectExtent b="0" l="0" r="0" t="0"/>
-            <wp:docPr descr="Figure 5. Which measures can detect a boundary on a record like this one. Left: each measure’s response (its rank-correlation trend along the sequence) to closure of known strength imposed on synthetic assemblages built to the real record’s 28 sample sizes, clusters, and sequence positions, subsampled to a common count. Only cultural F_{ST} tracks the imposed closure steadily. Right: the posterior over closure strength given the observed trend, with and without the record’s time-averaging. The median is 0.15 (interval 0.00 to 0.36) without time-averaging and 0.22 (0.00 to 0.56) with it, and the probability of closure of 0.5 or more is 0.000 and 0.083. The observed trend is a rank correlation of -0.048, averaged over 4,000 subsamples, against a draw-to-draw spread of -0.80 to +0.40." title="" id="139" name="Picture"/>
+            <wp:docPr descr="Figure 5. Which measures can detect a boundary on a record like this one. Left: each measure’s response (its rank-correlation trend along the sequence) to closure of known strength imposed on synthetic assemblages built to the real record’s 28 sample sizes, clusters, and sequence positions, subsampled to a common count. Only cultural F_{ST} tracks the imposed closure steadily. Right: the posterior over closure strength given the observed trend, with and without the record’s time-averaging. The median is 0.15 (interval 0.00 to 0.37) without time-averaging and 0.22 (0.00 to 0.57) with it, and the probability of closure of 0.5 or more is 0.001 and 0.088. The observed trend is a rank correlation of -0.048, averaged over 4,000 subsamples, against a draw-to-draw spread of -0.80 to +0.40." title="" id="139" name="Picture"/>
             <a:graphic>
               <a:graphicData uri="http://schemas.openxmlformats.org/drawingml/2006/picture">
                 <pic:pic>
@@ -2673,7 +2676,7 @@
         <w:t xml:space="preserve"> </w:t>
       </w:r>
       <w:r>
-        <w:t xml:space="preserve">tracks the imposed closure steadily. Right: the posterior over closure strength given the observed trend, with and without the record’s time-averaging. The median is 0.15 (interval 0.00 to 0.36) without time-averaging and 0.22 (0.00 to 0.56) with it, and the probability of closure of 0.5 or more is 0.000 and 0.083. The observed trend is a rank correlation of -0.048, averaged over 4,000 subsamples, against a draw-to-draw spread of -0.80 to +0.40.</w:t>
+        <w:t xml:space="preserve">tracks the imposed closure steadily. Right: the posterior over closure strength given the observed trend, with and without the record’s time-averaging. The median is 0.15 (interval 0.00 to 0.37) without time-averaging and 0.22 (0.00 to 0.57) with it, and the probability of closure of 0.5 or more is 0.001 and 0.088. The observed trend is a rank correlation of -0.048, averaged over 4,000 subsamples, against a draw-to-draw spread of -0.80 to +0.40.</w:t>
       </w:r>
     </w:p>
     <w:bookmarkEnd w:id="141"/>
@@ -2725,7 +2728,7 @@
         <w:pStyle w:val="BodyText"/>
       </w:pPr>
       <w:r>
-        <w:t xml:space="preserve">Read against the recovery experiment, a trend this small corresponds to closure with a posterior median of 0.15 and a 95 percent credible interval of 0.00 to 0.36, with no probability on closure of 0.5 or more. Once the record’s time-averaging is built into the simulations, the posterior widens to a median of 0.22 and an interval of 0.00 to 0.56, and 8 percent of it lies at 0.5 or above. The record is consistent with no closure and with weak closure. It shows no moderate or strong closure of the kind that would register as growing divergence.</w:t>
+        <w:t xml:space="preserve">Read against the recovery experiment, a trend this small corresponds to closure with a posterior median of 0.15 and a 95 percent credible interval of 0.00 to 0.37, with a probability of 0.001 on closure of 0.5 or more. Once the record’s time-averaging is built into the simulations, the posterior widens to a median of 0.22 and an interval of 0.00 to 0.57, and 9 percent of it lies at 0.5 or above. Reversing the order, in case its later end is the other one, barely changes this: the median becomes 0.17 (0.00 to 0.39), or 0.25 (0.00 to 0.60) with time-averaging. The record is consistent with no closure and with weak closure. It shows no moderate or strong closure of the kind that would register as growing divergence.</w:t>
       </w:r>
     </w:p>
     <w:p>
@@ -2737,7 +2740,7 @@
           <wp:inline>
             <wp:extent cx="5334000" cy="3952347"/>
             <wp:effectExtent b="0" l="0" r="0" t="0"/>
-            <wp:docPr descr="Figure 6. The four measures along the seriation sequence for the 28 basin assemblages in six periods, after subsampling every assemblage to a common count. Two periods hold assemblages from a single spatial cluster and so carry no between-cluster F_{ST}. Cultural F_{ST}, the one usable measure, shows no resolvable trend (rank correlation -0.048 averaged over 4,000 subsamples, against a draw-to-draw spread of -0.80 to +0.40; the raw -0.80 is a sample-size artifact). The other three measures cannot discriminate at this resolution (Figure 5) and are shown for completeness, averaged over 400 subsamples. Each panel is annotated with its rank correlation." title="" id="143" name="Picture"/>
+            <wp:docPr descr="Figure 6. The four measures along the seriation sequence for the 28 basin assemblages in six periods, after subsampling every assemblage to a common 50 sherds. Two periods hold assemblages from a single spatial cluster and so carry no between-cluster F_{ST}. Cultural F_{ST}, the one usable measure, shows no resolvable trend (rank correlation -0.048 averaged over 4,000 subsamples, against a draw-to-draw spread of -0.80 to +0.40; the raw -0.80 is a sample-size artifact). The other three measures cannot discriminate at this resolution (Figure 5) and are shown for completeness, averaged over 400 subsamples. Each panel is annotated with its rank correlation." title="" id="143" name="Picture"/>
             <a:graphic>
               <a:graphicData uri="http://schemas.openxmlformats.org/drawingml/2006/picture">
                 <pic:pic>
@@ -2790,7 +2793,7 @@
         <w:t xml:space="preserve"> </w:t>
       </w:r>
       <w:r>
-        <w:t xml:space="preserve">The four measures along the seriation sequence for the 28 basin assemblages in six periods, after subsampling every assemblage to a common count. Two periods hold assemblages from a single spatial cluster and so carry no between-cluster</w:t>
+        <w:t xml:space="preserve">The four measures along the seriation sequence for the 28 basin assemblages in six periods, after subsampling every assemblage to a common 50 sherds. Two periods hold assemblages from a single spatial cluster and so carry no between-cluster</w:t>
       </w:r>
       <w:r>
         <w:t xml:space="preserve"> </w:t>
@@ -2862,7 +2865,7 @@
         <w:t xml:space="preserve">(Kandler and Shennan 2013)</w:t>
       </w:r>
       <w:r>
-        <w:t xml:space="preserve">. Neiman’s distance between assemblages shows no trend toward divergence, and the most diverse assemblages are also the most central, as a single shared community produces (Figure S1)</w:t>
+        <w:t xml:space="preserve">. Neiman’s distance between assemblages shows no trend toward divergence, and within-assemblage diversity is weakly and negatively related to distance from the other assemblages (posterior median rank correlation -0.14, 95 percent credible interval -0.44 to +0.20), the direction a single shared community produces (Figure S1)</w:t>
       </w:r>
       <w:r>
         <w:t xml:space="preserve"> </w:t>
@@ -2871,33 +2874,7 @@
         <w:t xml:space="preserve">(Neiman 1995)</w:t>
       </w:r>
       <w:r>
-        <w:t xml:space="preserve">. We also varied the basin’s latitude cutoff, the number of periods, and the number of clusters over 27 combinations, using unsubsampled trends; in two combinations the three continuous measures all rise together, and in the other 25 they do not (Supplemental Text). Those raw trends carry the sample-size artifact described above, and the recovery experiment shows that only</w:t>
-      </w:r>
-      <w:r>
-        <w:t xml:space="preserve"> </w:t>
-      </w:r>
-      <m:oMath>
-        <m:sSub>
-          <m:e>
-            <m:r>
-              <m:t>F</m:t>
-            </m:r>
-          </m:e>
-          <m:sub>
-            <m:r>
-              <m:t>S</m:t>
-            </m:r>
-            <m:r>
-              <m:t>T</m:t>
-            </m:r>
-          </m:sub>
-        </m:sSub>
-      </m:oMath>
-      <w:r>
-        <w:t xml:space="preserve"> </w:t>
-      </w:r>
-      <w:r>
-        <w:t xml:space="preserve">among them can be read at all.</w:t>
+        <w:t xml:space="preserve">.</w:t>
       </w:r>
     </w:p>
     <w:bookmarkEnd w:id="145"/>
@@ -3385,7 +3362,7 @@
         <w:t xml:space="preserve"> </w:t>
       </w:r>
       <w:r>
-        <w:t xml:space="preserve">is 0.0059 against the observed 0.0062, and diversity stays matched as the reordered share rises to 0.3. This is still neutral copying. Nothing in it restricts who copies whom; it only lets new styles arise locally rather than at the same rates everywhere. Individual simulations under it are very widely spread, from 0.0004 to 0.16, so it is consistent with the record rather than demonstrated by it.</w:t>
+        <w:t xml:space="preserve">is 0.0059 against the observed 0.0062, and diversity stays matched as the reordered share rises to 0.3. This is still neutral copying. Nothing in it restricts who copies whom; it only lets new styles arise locally rather than at the same rates everywhere. Individual simulations under it are very widely spread, with a 95 percent range of 0.0004 to 0.16, so it is consistent with the record rather than demonstrated by it.</w:t>
       </w:r>
     </w:p>
     <w:p>
@@ -3643,7 +3620,7 @@
               <w:t xml:space="preserve"> </w:t>
             </w:r>
             <w:r>
-              <w:t xml:space="preserve">No resolvable trend (closure 0.15, 0.00 to 0.36); boundaries fall where pottery changes least; location alone recovers the phases</w:t>
+              <w:t xml:space="preserve">No resolvable trend (closure 0.15, 0.00 to 0.37); boundaries fall where pottery changes least; location alone recovers the phases</w:t>
             </w:r>
           </w:p>
         </w:tc>
@@ -3719,7 +3696,7 @@
               <w:t xml:space="preserve"> </w:t>
             </w:r>
             <w:r>
-              <w:t xml:space="preserve">Medians 0.0020 to 0.0044; the observed value is reached in 20 to 33 percent of runs, no more often than without a boundary</w:t>
+              <w:t xml:space="preserve">Medians 0.0020 to 0.0037; the observed value is reached in 20 to 30 percent of runs, no more often than without a boundary</w:t>
             </w:r>
           </w:p>
         </w:tc>
@@ -3984,7 +3961,7 @@
         <w:pStyle w:val="FirstParagraph"/>
       </w:pPr>
       <w:r>
-        <w:t xml:space="preserve">A phase read as a polity implies a center around which the pattern is organized. Parkin sits between seriation orderings rather than at the center of one. Deterministic seriation of the basin assemblages returns 34 maximal co-seriable groups at a continuity threshold of 0.1, none larger than four assemblages, and 18 of the 28 assemblages belong to more than one (Figure 7). Groups that had actually closed would give orderings that are incompatible and separate, whereas here most assemblages belong to several at once. That overlap is what a continuous field too varied to fit one ordering produces, not a set of bounded traditions. Parkin belongs to three groups and ranks tenth of 28 by membership, a bridge between orderings. Lipo, Madsen, and Dunnell</w:t>
+        <w:t xml:space="preserve">A phase read as a polity implies a center around which the pattern is organized. Parkin sits between seriation orderings rather than at the center of one. Deterministic seriation of the basin assemblages returns 34 maximal co-seriable groups at a continuity threshold of 0.1, none larger than four assemblages, and 18 of the 28 assemblages belong to more than one (Figure 7). Groups that had actually closed would give orderings that are incompatible and separate, whereas here most assemblages belong to several at once. That overlap is what a continuous field too varied to fit one ordering produces, not a set of bounded traditions. Parkin belongs to three groups, a bridge between orderings, though not the most connected one: Barton Ranch and Williamson each belong to six. Lipo, Madsen, and Dunnell</w:t>
       </w:r>
       <w:r>
         <w:t xml:space="preserve"> </w:t>
@@ -4006,9 +3983,9 @@
       <w:r>
         <w:drawing>
           <wp:inline>
-            <wp:extent cx="5334000" cy="3719607"/>
+            <wp:extent cx="5334000" cy="3603744"/>
             <wp:effectExtent b="0" l="0" r="0" t="0"/>
-            <wp:docPr descr="Figure 7. Deterministic seriation structure of the basin assemblages. Left: the distribution of co-seriable group sizes, a fragmented structure of 34 maximal groups with a maximum size of four. Right: the most connected assemblages ranked by the number of groups they belong to, with Parkin highlighted as a bridge (member of three groups, ranked tenth of 28) between orderings rather than at the center of one." title="" id="148" name="Picture"/>
+            <wp:docPr descr="Figure 7. Deterministic seriation structure of the basin assemblages. Left: the distribution of co-seriable group sizes, a fragmented structure of 34 maximal groups with a maximum size of four. Right: the most connected assemblages ranked by the number of groups they belong to, with Parkin highlighted as a bridge (member of three groups) between orderings rather than at the center of one." title="" id="148" name="Picture"/>
             <a:graphic>
               <a:graphicData uri="http://schemas.openxmlformats.org/drawingml/2006/picture">
                 <pic:pic>
@@ -4027,7 +4004,7 @@
                   <pic:spPr bwMode="auto">
                     <a:xfrm>
                       <a:off x="0" y="0"/>
-                      <a:ext cx="5334000" cy="3719607"/>
+                      <a:ext cx="5334000" cy="3603744"/>
                     </a:xfrm>
                     <a:prstGeom prst="rect">
                       <a:avLst/>
@@ -4061,7 +4038,7 @@
         <w:t xml:space="preserve"> </w:t>
       </w:r>
       <w:r>
-        <w:t xml:space="preserve">Deterministic seriation structure of the basin assemblages. Left: the distribution of co-seriable group sizes, a fragmented structure of 34 maximal groups with a maximum size of four. Right: the most connected assemblages ranked by the number of groups they belong to, with Parkin highlighted as a bridge (member of three groups, ranked tenth of 28) between orderings rather than at the center of one.</w:t>
+        <w:t xml:space="preserve">Deterministic seriation structure of the basin assemblages. Left: the distribution of co-seriable group sizes, a fragmented structure of 34 maximal groups with a maximum size of four. Right: the most connected assemblages ranked by the number of groups they belong to, with Parkin highlighted as a bridge (member of three groups) between orderings rather than at the center of one.</w:t>
       </w:r>
     </w:p>
     <w:p>
@@ -4374,9 +4351,9 @@
       <w:r>
         <w:drawing>
           <wp:inline>
-            <wp:extent cx="5296791" cy="2911400"/>
+            <wp:extent cx="5334000" cy="3028550"/>
             <wp:effectExtent b="0" l="0" r="0" t="0"/>
-            <wp:docPr descr="Figure 10. Composition as a continuous surface. (A) The local rate of change in the ten decorated-class proportions, computed on a 160 by 160 grid with a 15 km Gaussian bandwidth and masked where fewer than two assemblages support the estimate. Circles are assemblages. (B) The same surface with the published phase boundaries overlaid; the rate of change along them is lower than along the boundaries of any of 200 same-size divisions around randomly placed centers. (C) Observed cultural F_{ST} against cluster radius in kilometers, with the neutral copying model’s range behind it, from coarse to fine. The observed value rises from 0.0062 at an 18 km radius, inside the range, to 0.048 at 5 km, while the range’s upper edge rises from 0.016 to 0.028. Below a radius of about 10 km the clusters begin to isolate single assemblages, so the finest divisions should not be read as structure." title="" id="158" name="Picture"/>
+            <wp:docPr descr="Figure 10. Composition as a continuous surface. (A) The local rate of change in the ten decorated-class proportions, computed on a 220 by 220 grid with a 15 km Gaussian bandwidth and masked where fewer than two assemblages support the estimate. Circles are assemblages. (B) The same surface with the published phase boundaries overlaid; the rate of change along them is lower than along the boundaries of any of 200 same-size divisions around randomly placed centers. (C) Observed cultural F_{ST} against cluster radius in kilometers, with the neutral copying model’s range behind it, from coarse to fine. The observed value rises from 0.0062 at an 18 km radius, inside the range, to 0.048 at 5 km, while the range’s upper edge rises from 0.016 to 0.028. Below a radius of about 10 km the clusters begin to isolate single assemblages, so the finest divisions should not be read as structure." title="" id="158" name="Picture"/>
             <a:graphic>
               <a:graphicData uri="http://schemas.openxmlformats.org/drawingml/2006/picture">
                 <pic:pic>
@@ -4395,7 +4372,7 @@
                   <pic:spPr bwMode="auto">
                     <a:xfrm>
                       <a:off x="0" y="0"/>
-                      <a:ext cx="5296791" cy="2911400"/>
+                      <a:ext cx="5334000" cy="3028550"/>
                     </a:xfrm>
                     <a:prstGeom prst="rect">
                       <a:avLst/>
@@ -4429,7 +4406,7 @@
         <w:t xml:space="preserve"> </w:t>
       </w:r>
       <w:r>
-        <w:t xml:space="preserve">Composition as a continuous surface. (A) The local rate of change in the ten decorated-class proportions, computed on a 160 by 160 grid with a 15 km Gaussian bandwidth and masked where fewer than two assemblages support the estimate. Circles are assemblages. (B) The same surface with the published phase boundaries overlaid; the rate of change along them is lower than along the boundaries of any of 200 same-size divisions around randomly placed centers. (C) Observed cultural</w:t>
+        <w:t xml:space="preserve">Composition as a continuous surface. (A) The local rate of change in the ten decorated-class proportions, computed on a 220 by 220 grid with a 15 km Gaussian bandwidth and masked where fewer than two assemblages support the estimate. Circles are assemblages. (B) The same surface with the published phase boundaries overlaid; the rate of change along them is lower than along the boundaries of any of 200 same-size divisions around randomly placed centers. (C) Observed cultural</w:t>
       </w:r>
       <w:r>
         <w:t xml:space="preserve"> </w:t>
@@ -4463,7 +4440,7 @@
         <w:pStyle w:val="BodyText"/>
       </w:pPr>
       <w:r>
-        <w:t xml:space="preserve">The site map alone recovers the phases. Clustering the assemblages on their coordinates alone reproduces Mainfort’s assignments exactly, with an adjusted Rand index of 1.000 as the median over 40 starting configurations (Figure 11). Adding composition lowers the agreement at every weight: from a tenth of the coordinates’ weight up to equal weight the median is 0.607, and composition alone reaches 0.215. Divisions with the phases’ group sizes around random centers reach 0.566, which is what three groups of these sizes produce by chance. The three assemblages placed by territory rather than by Mainfort are left out of this score, since measuring a geographic rule against geography would build in the agreement. The pottery, when it enters, moves the answer away from the published phases rather than toward them. We report the chi-square transform of composition because it has no free parameter; 38 percent of the matrix cells are zero, and log-ratio transforms move the agreement at equal weight between 0.53 and 0.77 depending on how zeros are treated (Supplemental Text).</w:t>
+        <w:t xml:space="preserve">The site map alone recovers the phases. Clustering the assemblages on their coordinates alone reproduces Mainfort’s assignments exactly, with an adjusted Rand index of 1.000 as the median over 40 starting configurations (Figure 11). Adding composition lowers the agreement at every weight: from a tenth of the coordinates’ weight up to equal weight the median is 0.607, and composition alone reaches 0.215. Divisions with the phases’ group sizes around random centers reach 0.566, which is what three groups of these sizes produce by chance. The three assemblages placed by territory rather than by Mainfort are left out of this score, since measuring a geographic rule against geography would build in the agreement. The pottery, when it enters, moves the answer away from the published phases rather than toward them. We report the chi-square transform of composition because it has no free parameter; 38 percent of the matrix cells are zero, and log-ratio transforms move the agreement at half weight between 0.53 and 0.77 depending on how zeros are treated (Supplemental Text).</w:t>
       </w:r>
     </w:p>
     <w:p>
@@ -4473,7 +4450,7 @@
       <w:r>
         <w:drawing>
           <wp:inline>
-            <wp:extent cx="3269209" cy="2666745"/>
+            <wp:extent cx="3412944" cy="2730967"/>
             <wp:effectExtent b="0" l="0" r="0" t="0"/>
             <wp:docPr descr="Figure 11. What recovers the phases. Agreement with Mainfort’s phase assignments, measured by the adjusted Rand index over the 25 assemblages he assigned, as the median over 40 starting configurations, for clusterings on site coordinates and decorated-class composition as the weight on composition varies. Zero weight is the site map alone. Three transforms of composition are shown; the text quotes the chi-square transform, the only one with no free parameter. The dash-dotted line is the agreement reached by divisions with the phases’ group sizes around random centers. Agreement is complete with the site map alone and falls as composition enters." title="" id="161" name="Picture"/>
             <a:graphic>
@@ -4494,7 +4471,7 @@
                   <pic:spPr bwMode="auto">
                     <a:xfrm>
                       <a:off x="0" y="0"/>
-                      <a:ext cx="3269209" cy="2666745"/>
+                      <a:ext cx="3412944" cy="2730967"/>
                     </a:xfrm>
                     <a:prstGeom prst="rect">
                       <a:avLst/>
@@ -4536,7 +4513,7 @@
         <w:pStyle w:val="BodyText"/>
       </w:pPr>
       <w:r>
-        <w:t xml:space="preserve">Pottery made by copying with no groups sorts into the phases as readily as the real pottery. We ran the neutral copying model on the real site map 300 times, sampled its pottery at the real sherd counts, and clustered each simulated record exactly as we clustered the real one (Figure 12). Wherever site location enters the clustering, the simulated pottery matches the phases as well as the real pottery does, and usually better. With a quarter weight on composition, the real record’s agreement of 0.607 is at or below every one of the 300 simulated records (median 0.938); at equal weight it sits at the 53rd percentile (median 0.581). With pottery alone, where location cannot help, the real record agrees with the phases somewhat better than the simulations, 0.237 against a median of 0.031, a level that 3 percent of simulated records reach. That small margin is the same finer-scale difference described above, seen from another side.</w:t>
+        <w:t xml:space="preserve">Pottery made by copying with no groups sorts into the phases as readily as the real pottery. We ran the neutral copying model on the real site map 300 times, sampled its pottery at the real sherd counts, and clustered each simulated record the same way as the real one, taking the median over 10 starting configurations rather than 40 (Figure 12). Wherever site location enters the clustering, the simulated pottery matches the phases as well as the real pottery does, and usually better. With a quarter weight on composition, the real record’s agreement of 0.607 is at or below every one of the 300 simulated records (median 0.938); at equal weight it sits at the 53rd percentile (median 0.581). With pottery alone, where location cannot help, the real record agrees with the phases somewhat better than the simulations, 0.237 against a median of 0.031, a level that 3 percent of simulated records reach. That small margin is the same finer-scale difference described above, seen from another side.</w:t>
       </w:r>
     </w:p>
     <w:p>
@@ -4724,7 +4701,7 @@
         <w:t xml:space="preserve"> </w:t>
       </w:r>
       <w:r>
-        <w:t xml:space="preserve">Horseshoe Lake phase, which takes Beck, Belle Meade, Mound Place, and Young out of Walls, and he moved Hollywood and Commerce from Walls to Kent, Castile Landing from Kent to Parkin, and Carson Lake from Nodena to Walls. Nine of the 36 sites the two schemes share are assigned differently. A second scheme drawn through the same ground is a useful check. If phases were groups, both schemes should track the same boundaries. If they are what a spatial gradient looks like when sites are sorted, a scheme drawn by proximity and a scheme drawn from the pottery should behave differently.</w:t>
+        <w:t xml:space="preserve">Horseshoe Lake phase, which takes Beck, Belle Meade, Mound Place, and Young out of Walls, and he moved Hollywood and Commerce from Walls to Kent, Castile Landing from Kent to Parkin, and Carson Lake from Nodena to Walls. Nine sites are assigned differently in the two schemes. A second scheme drawn through the same ground is a useful check. If phases were groups, both schemes should track the same boundaries. If they are what a spatial gradient looks like when sites are sorted, a scheme drawn by proximity and a scheme drawn from the pottery should behave differently.</w:t>
       </w:r>
     </w:p>
     <w:p>
@@ -4766,7 +4743,7 @@
         <w:t xml:space="preserve"> </w:t>
       </w:r>
       <w:r>
-        <w:t xml:space="preserve">under his phases is 0.047, higher than all 1,000 same-size divisions around random centers and higher than 99 percent of compact divisions, and the compactness search never returns his division. Adding composition to the coordinates also raises the agreement with his scheme, to 0.60 at equal weight, whereas for the earlier scheme it only lowers it.</w:t>
+        <w:t xml:space="preserve">under his phases is 0.047, higher than all 1,000 same-size divisions around random centers and higher than 99 percent of compact divisions, and the compactness search never returns his division. Giving composition half the weight of the coordinates also raises the agreement with his scheme, to 0.60, above the map alone, whereas for the earlier scheme composition lowers the agreement at every weight.</w:t>
       </w:r>
     </w:p>
     <w:p>
@@ -4941,7 +4918,7 @@
         <w:t xml:space="preserve"> </w:t>
       </w:r>
       <w:r>
-        <w:t xml:space="preserve">while forming no groups. Nearness in an ordination is nearness on the ground, seen through the pottery. His own redrawn phases make the same point from the other side. Drawn after the ordination, they sit where the pottery differs and no longer form the tightest division of the map. Together the two schemes show one gradient read two ways, once by proximity and once by the pottery, with a boundary in neither. We therefore read a phase as a length scale on a continuous gradient, made visible by where settlement happened to cluster, rather than as a bounded unit. These data cannot say what that length is: sherd counts that differ 96-fold, unequal accumulation spans, and an order derived from the same frequencies together limit what any spatial measure can resolve here.</w:t>
+        <w:t xml:space="preserve">while forming no groups. Nearness in an ordination is nearness on the ground, seen through the pottery. His own redrawn phases make the same point from the other side. Drawn after the ordination, they sit where the pottery differs and no longer form the tightest division of the map. Together the two schemes show one gradient read two ways, once by proximity and once by the pottery, with a boundary in neither. We therefore read a phase as a length scale on a continuous gradient, made visible by where settlement happened to cluster, rather than as a bounded unit. These data cannot say what that length is: sherd counts that differ more than twentyfold, unequal accumulation spans, and an order derived from the same frequencies together limit what any spatial measure can resolve here.</w:t>
       </w:r>
     </w:p>
     <w:p>
@@ -5053,33 +5030,7 @@
         <w:t xml:space="preserve"> </w:t>
       </w:r>
       <w:r>
-        <w:t xml:space="preserve">can detect closure, and only closure expressed as growing divergence between spatial groups. Weaker closure, closure carried purely by conformity within groups, and closure along social divisions that do not follow geography would all escape detection (Supplemental Text). The second is chronology. Radiocarbon dates pool to five matched proveniences across a calibration plateau, so the sequence is an order rather than a calendar; because the</w:t>
-      </w:r>
-      <w:r>
-        <w:t xml:space="preserve"> </w:t>
-      </w:r>
-      <m:oMath>
-        <m:sSub>
-          <m:e>
-            <m:r>
-              <m:t>F</m:t>
-            </m:r>
-          </m:e>
-          <m:sub>
-            <m:r>
-              <m:t>S</m:t>
-            </m:r>
-            <m:r>
-              <m:t>T</m:t>
-            </m:r>
-          </m:sub>
-        </m:sSub>
-      </m:oMath>
-      <w:r>
-        <w:t xml:space="preserve"> </w:t>
-      </w:r>
-      <w:r>
-        <w:t xml:space="preserve">trend is unresolved, reversing the order changes nothing the record can show, and the settlement and exchange evidence does not depend on it. The third is time-averaging, which damps differences between assemblages</w:t>
+        <w:t xml:space="preserve">can detect closure, and only closure expressed as growing divergence between spatial groups. Weaker closure, closure carried purely by conformity within groups, and closure along social divisions that do not follow geography would all escape detection (Supplemental Text). The second is chronology. Radiocarbon dates pool to four matched proveniences across a calibration plateau, and cannot establish which end of the order is later; reversing the order changes the closure posterior only slightly, the copying-model comparison is reported both ways, and the settlement and exchange evidence does not depend on it. The third is time-averaging, which damps differences between assemblages</w:t>
       </w:r>
       <w:r>
         <w:t xml:space="preserve"> </w:t>
@@ -5106,7 +5057,7 @@
         <w:pStyle w:val="FirstParagraph"/>
       </w:pPr>
       <w:r>
-        <w:t xml:space="preserve">The method rests on two requirements that apply beyond this case. Before a similarity pattern is read as social, the record must be shown able to detect a social boundary, which the recovery experiment establishes and which here leaves one usable measure out of four. Before a model of copying with no groups is credited with reproducing a record, it must be shown to fit that record’s own diversity. The second requirement changed our own results. An earlier, uncalibrated version of the comparison ran at nearly twice the observed diversity, which widened its ranges and made it look as if copying across distance explained everything; the calibrated model is narrower and more informative. A model run at the wrong diversity is easily credited with structure it cannot produce, just as a localized neutral process is easily mistaken for biased copying when diversity is taken at face value</w:t>
+        <w:t xml:space="preserve">The method rests on two requirements that apply beyond this case. Before a similarity pattern is read as social, the record must be shown able to detect a social boundary, which the recovery experiment establishes and which here leaves one usable measure out of four. Before a model of copying with no groups is credited with reproducing a record, it must be shown to fit that record’s own diversity. The second requirement changed our own results. An earlier, uncalibrated version of the comparison ran at a within-assemblage diversity well above the record’s, which widened its ranges and made it look as if copying across distance explained everything; the calibrated model is narrower and more informative. A model run at the wrong diversity is easily credited with structure it cannot produce, just as a localized neutral process is easily mistaken for biased copying when diversity is taken at face value</w:t>
       </w:r>
       <w:r>
         <w:t xml:space="preserve"> </w:t>
@@ -5115,7 +5066,7 @@
         <w:t xml:space="preserve">(Barton 1996; Premo 2016; Premo and Scholnick 2011; Schneider et al. 2016)</w:t>
       </w:r>
       <w:r>
-        <w:t xml:space="preserve">. Two tests in the time domain, a frequency-dependent copying model fitted to the whole sequence with time-averaging built in (transmission bias interval -0.035 to +0.039, including zero) and a comparison of evolutionary modes that favors unbiased drift, find no transition the other analyses missed</w:t>
+        <w:t xml:space="preserve">. Two tests in the time domain, a frequency-dependent copying model fitted to the whole sequence with time-averaging built in (transmission bias interval -0.035 to +0.039, including zero) and a comparison of evolutionary modes that is consistent with an unbiased random walk and excludes neither directional change nor mean reversion, find no transition the other analyses missed</w:t>
       </w:r>
       <w:r>
         <w:t xml:space="preserve"> </w:t>

</xml_diff>

<commit_message>
Carry the phases-as-groups tests, Bayesian partition comparisons and citation corrections into the release
Co-Authored-By: Claude Opus 5.5 (1M context) <noreply@anthropic.com>
</commit_message>
<xml_diff>
--- a/docs/manuscript/MAIN_TEXT.docx
+++ b/docs/manuscript/MAIN_TEXT.docx
@@ -2,7 +2,7 @@
 <file path=word/document.xml><?xml version="1.0" encoding="utf-8"?>
 <w:document xmlns:w="http://schemas.openxmlformats.org/wordprocessingml/2006/main" xmlns:m="http://schemas.openxmlformats.org/officeDocument/2006/math" xmlns:r="http://schemas.openxmlformats.org/officeDocument/2006/relationships" xmlns:o="urn:schemas-microsoft-com:office:office" xmlns:v="urn:schemas-microsoft-com:vml" xmlns:w10="urn:schemas-microsoft-com:office:word" xmlns:a="http://schemas.openxmlformats.org/drawingml/2006/main" xmlns:pic="http://schemas.openxmlformats.org/drawingml/2006/picture" xmlns:wp="http://schemas.openxmlformats.org/drawingml/2006/wordprocessingDrawing">
   <w:body>
-    <w:bookmarkStart w:id="340" w:name="X8bf6248c9f3f97f4894a761f3e01800d2c2c84f"/>
+    <w:bookmarkStart w:id="334" w:name="X8bf6248c9f3f97f4894a761f3e01800d2c2c84f"/>
     <w:p>
       <w:pPr>
         <w:pStyle w:val="Heading1"/>
@@ -175,22 +175,22 @@
         <w:t xml:space="preserve"> </w:t>
       </w:r>
       <w:r>
-        <w:t xml:space="preserve">phases. The Parkin phase stands out because it contains the Parkin site, the largest moated and palisaded town in the St. Francis basin of northeastern Arkansas. The chronicles of the Hernando de Soto expedition identify it as Casqui, the seat of a paramount chief that the expedition met in 1541</w:t>
-      </w:r>
-      <w:r>
-        <w:t xml:space="preserve"> </w:t>
-      </w:r>
-      <w:r>
-        <w:t xml:space="preserve">(Hudson et al. 1990; Mitchem 2001; Phyllis A. Morse 1990)</w:t>
-      </w:r>
-      <w:r>
-        <w:t xml:space="preserve">. Because of its size, fortification, platform mound, and ethnohistoric identification, Parkin is routinely read as the center of a Mississippian polity, following the long-standing assumption that a dominant mound center marks the apex of a ranked society</w:t>
-      </w:r>
-      <w:r>
-        <w:t xml:space="preserve"> </w:t>
-      </w:r>
-      <w:r>
-        <w:t xml:space="preserve">(Peebles and Kus 1977)</w:t>
+        <w:t xml:space="preserve">phases. The Parkin phase stands out because it contains the Parkin site, the largest moated and palisaded town in the St. Francis basin of northeastern Arkansas. Reconstructions of the route of the Hernando de Soto expedition identify it as Casqui, the seat of a paramount chief the expedition met in 1541</w:t>
+      </w:r>
+      <w:r>
+        <w:t xml:space="preserve"> </w:t>
+      </w:r>
+      <w:r>
+        <w:t xml:space="preserve">(Hudson et al. 1990; Mitchem et al. 2017; Phyllis A. Morse 1990:125–129)</w:t>
+      </w:r>
+      <w:r>
+        <w:t xml:space="preserve">. Because of its size, fortification, platform mound, and ethnohistoric identification, Parkin is routinely read as the center of a Mississippian polity, following the long-standing expectation that a ranked society leaves a hierarchy of settlement types and sizes with its center at the top</w:t>
+      </w:r>
+      <w:r>
+        <w:t xml:space="preserve"> </w:t>
+      </w:r>
+      <w:r>
+        <w:t xml:space="preserve">(Peebles and Kus 1977:431)</w:t>
       </w:r>
       <w:r>
         <w:t xml:space="preserve">. That reading makes a specific claim: the Parkin phase was a bounded, hierarchically organized society with Parkin at its head.</w:t>
@@ -205,7 +205,7 @@
           <wp:inline>
             <wp:extent cx="4114800" cy="8037789"/>
             <wp:effectExtent b="0" l="0" r="0" t="0"/>
-            <wp:docPr descr="Figure 1. Decorated-ceramic assemblages of the lower Mississippi Valley and the culture-historical phase scheme this paper tests. Five of the seven Late Mississippian phases (Parkin, Nodena, Kent, Walls, and Parchman) are drawn as territories; Jones Bayou and Tipton, in western Tennessee, have no assemblage with decorated counts in this study’s matrix and appear only in the legend. Assemblages without a phase assignment are not drawn. Each territory is built by assigning every point on the map to its nearest assemblage and then merging those areas according to the phase Mainfort (1996b) assigns each assemblage, with a gap drawn between adjacent territories for legibility. Territories are drawn over the HydroRIVERS river network (Lehner and Grill 2013), with line width scaled by flow order. Markers show each assemblage’s phase, and Parkin is starred. The bounded territories illustrate the premise under test, that each hosted a distinct, internally interacting society. The mapped assemblages fall in Arkansas, Tennessee, and Mississippi; Missouri lies just north of the frame. Inset: location in North America." title="" id="112" name="Picture"/>
+            <wp:docPr descr="Figure 1. Decorated-ceramic assemblages of the lower Mississippi Valley and the culture-historical phase scheme this paper tests. Five of the seven Late Mississippian phases (Parkin, Nodena, Kent, Walls, and Parchman) are drawn as territories; Jones Bayou and Tipton, in western Tennessee, have no assemblage with decorated counts in this study’s matrix and appear only in the legend. Assemblages without a phase assignment are not drawn. Each territory is built by assigning every point on the map to its nearest assemblage and then merging those areas according to the phase Mainfort (1996) assigns each assemblage, with a gap drawn between adjacent territories for legibility. Territories are drawn over the HydroRIVERS river network (Lehner and Grill 2013), with line width scaled by flow order. Markers show each assemblage’s phase, and Parkin is starred. The bounded territories illustrate the premise under test, that each hosted a distinct, internally interacting society. The mapped assemblages fall in Arkansas, Tennessee, and Mississippi; Missouri lies just north of the frame. Inset: location in North America." title="" id="112" name="Picture"/>
             <a:graphic>
               <a:graphicData uri="http://schemas.openxmlformats.org/drawingml/2006/picture">
                 <pic:pic>
@@ -264,7 +264,7 @@
         <w:t xml:space="preserve"> </w:t>
       </w:r>
       <w:r>
-        <w:t xml:space="preserve">(1996b)</w:t>
+        <w:t xml:space="preserve">(1996)</w:t>
       </w:r>
       <w:r>
         <w:t xml:space="preserve"> </w:t>
@@ -305,13 +305,13 @@
         <w:t xml:space="preserve">(Hudson et al. 1990; Phyllis A. Morse 1990)</w:t>
       </w:r>
       <w:r>
-        <w:t xml:space="preserve">. Within the basin, settlement size is graded rather than organized around a single redistributive center, and the chert hoes whose control would mark an economic apex were produced across the region and moved down the line rather than through central redistribution</w:t>
-      </w:r>
-      <w:r>
-        <w:t xml:space="preserve"> </w:t>
-      </w:r>
-      <w:r>
-        <w:t xml:space="preserve">(Cobb 2000)</w:t>
+        <w:t xml:space="preserve">. Within the basin, settlement size is graded rather than stepped, with no single center set above the rest, and the Mill Creek chert hoes whose control would mark an economic apex were made by autonomous workshops at the source and moved largely down the line, with elites at consuming centers gaining at most privileged access</w:t>
+      </w:r>
+      <w:r>
+        <w:t xml:space="preserve"> </w:t>
+      </w:r>
+      <w:r>
+        <w:t xml:space="preserve">(Cobb 2000:75, 154, 198)</w:t>
       </w:r>
       <w:r>
         <w:t xml:space="preserve">.</w:t>
@@ -322,22 +322,34 @@
         <w:pStyle w:val="BodyText"/>
       </w:pPr>
       <w:r>
-        <w:t xml:space="preserve">The more revealing question is why the phases were taken for societies in the first place. A phase is a culture-history construct: a set of assemblages grouped together because their decorated-class frequencies seriate, meaning they can be placed in one sequence of gradually changing frequencies, and because the sites lie near one another</w:t>
-      </w:r>
-      <w:r>
-        <w:t xml:space="preserve"> </w:t>
-      </w:r>
-      <w:r>
-        <w:t xml:space="preserve">(Phillips et al. 1951)</w:t>
-      </w:r>
-      <w:r>
-        <w:t xml:space="preserve">. In the Phillips-Ford-Griffin framework the phase is the basic space-time-cultural unit, and its definition contains no social criterion</w:t>
-      </w:r>
-      <w:r>
-        <w:t xml:space="preserve"> </w:t>
-      </w:r>
-      <w:r>
-        <w:t xml:space="preserve">(Phillips and Willey 1953; Willey and Phillips 1958)</w:t>
+        <w:t xml:space="preserve">The more revealing question is why the phases were taken for societies in the first place. A phase is a culture-history construct: a set of assemblages grouped together because their decorated-class frequencies seriate, meaning they can be placed in one sequence of gradually changing frequencies, and because the sites lie near one another. In the Willey-Phillips framework the phase is</w:t>
+      </w:r>
+      <w:r>
+        <w:t xml:space="preserve"> </w:t>
+      </w:r>
+      <w:r>
+        <w:t xml:space="preserve">“the practicable and intelligible unit”</w:t>
+      </w:r>
+      <w:r>
+        <w:t xml:space="preserve"> </w:t>
+      </w:r>
+      <w:r>
+        <w:t xml:space="preserve">of archaeological study, defined by traits in space and time with no social criterion</w:t>
+      </w:r>
+      <w:r>
+        <w:t xml:space="preserve"> </w:t>
+      </w:r>
+      <w:r>
+        <w:t xml:space="preserve">(Phillips and Willey 1953; Willey and Phillips 1958:22)</w:t>
+      </w:r>
+      <w:r>
+        <w:t xml:space="preserve">, and the lower-valley phases tested here were formulated in that framework by Phillips</w:t>
+      </w:r>
+      <w:r>
+        <w:t xml:space="preserve"> </w:t>
+      </w:r>
+      <w:r>
+        <w:t xml:space="preserve">(1970)</w:t>
       </w:r>
       <w:r>
         <w:t xml:space="preserve">. In practice, however, researchers have treated phases as societies. Willey and Phillips</w:t>
@@ -346,40 +358,67 @@
         <w:t xml:space="preserve"> </w:t>
       </w:r>
       <w:r>
-        <w:t xml:space="preserve">(1958:48–49)</w:t>
-      </w:r>
-      <w:r>
-        <w:t xml:space="preserve"> </w:t>
-      </w:r>
-      <w:r>
-        <w:t xml:space="preserve">set out the reasoning that makes a phase a society, rejected it, and then treated phases as societies anyway. Williams</w:t>
-      </w:r>
-      <w:r>
-        <w:t xml:space="preserve"> </w:t>
-      </w:r>
-      <w:r>
-        <w:t xml:space="preserve">(1954)</w:t>
-      </w:r>
-      <w:r>
-        <w:t xml:space="preserve">, defining the southeast-Missouri phases on which the regional scheme rests, wrote that a phase</w:t>
-      </w:r>
-      <w:r>
-        <w:t xml:space="preserve"> </w:t>
-      </w:r>
-      <w:r>
-        <w:t xml:space="preserve">“probably”</w:t>
-      </w:r>
-      <w:r>
-        <w:t xml:space="preserve"> </w:t>
-      </w:r>
-      <w:r>
-        <w:t xml:space="preserve">equals a society. The premise underneath is rarely stated. It holds that assemblages more similar to one another than to their neighbors record a bounded group of people who interacted mainly with each other. Once such a group is paired with a dominant center, the phase becomes a polity, and the social unit has been assumed before any evidence for it has been weighed</w:t>
-      </w:r>
-      <w:r>
-        <w:t xml:space="preserve"> </w:t>
-      </w:r>
-      <w:r>
-        <w:t xml:space="preserve">(Lyman 2021)</w:t>
+        <w:t xml:space="preserve">(1958:48–50)</w:t>
+      </w:r>
+      <w:r>
+        <w:t xml:space="preserve"> </w:t>
+      </w:r>
+      <w:r>
+        <w:t xml:space="preserve">set out the reasoning that equates phase with society, conceded that</w:t>
+      </w:r>
+      <w:r>
+        <w:t xml:space="preserve"> </w:t>
+      </w:r>
+      <w:r>
+        <w:t xml:space="preserve">“in practice it does not work,”</w:t>
+      </w:r>
+      <w:r>
+        <w:t xml:space="preserve"> </w:t>
+      </w:r>
+      <w:r>
+        <w:t xml:space="preserve">and then proposed that archaeologists</w:t>
+      </w:r>
+      <w:r>
+        <w:t xml:space="preserve"> </w:t>
+      </w:r>
+      <w:r>
+        <w:t xml:space="preserve">“may act as if”</w:t>
+      </w:r>
+      <w:r>
+        <w:t xml:space="preserve"> </w:t>
+      </w:r>
+      <w:r>
+        <w:t xml:space="preserve">phases had social reality. Williams, defining the southeast-Missouri phases, wrote that</w:t>
+      </w:r>
+      <w:r>
+        <w:t xml:space="preserve"> </w:t>
+      </w:r>
+      <w:r>
+        <w:t xml:space="preserve">“in most cases, phase probably equals</w:t>
+      </w:r>
+      <w:r>
+        <w:t xml:space="preserve"> </w:t>
+      </w:r>
+      <w:r>
+        <w:t xml:space="preserve">‘society’</w:t>
+      </w:r>
+      <w:r>
+        <w:t xml:space="preserve">”</w:t>
+      </w:r>
+      <w:r>
+        <w:t xml:space="preserve"> </w:t>
+      </w:r>
+      <w:r>
+        <w:t xml:space="preserve">(Williams 1954:25; quoted in Fox 1998:33)</w:t>
+      </w:r>
+      <w:r>
+        <w:t xml:space="preserve">. The premise underneath is rarely stated. It holds that assemblages more similar to one another than to their neighbors record a bounded group of people who interacted mainly with each other. Once such a group is paired with a dominant center, the phase becomes a polity, and the social unit has been assumed before any evidence for it has been weighed</w:t>
+      </w:r>
+      <w:r>
+        <w:t xml:space="preserve"> </w:t>
+      </w:r>
+      <w:r>
+        <w:t xml:space="preserve">(Fox 1998)</w:t>
       </w:r>
       <w:r>
         <w:t xml:space="preserve">.</w:t>
@@ -564,7 +603,16 @@
         <w:pStyle w:val="FirstParagraph"/>
       </w:pPr>
       <w:r>
-        <w:t xml:space="preserve">We approach the phase from the standpoint of population thinking, which Dunnell</w:t>
+        <w:t xml:space="preserve">We approach the phase from the standpoint of population thinking</w:t>
+      </w:r>
+      <w:r>
+        <w:t xml:space="preserve"> </w:t>
+      </w:r>
+      <w:r>
+        <w:t xml:space="preserve">(Mayr 1959)</w:t>
+      </w:r>
+      <w:r>
+        <w:t xml:space="preserve">, which Dunnell</w:t>
       </w:r>
       <w:r>
         <w:t xml:space="preserve"> </w:t>
@@ -576,16 +624,7 @@
         <w:t xml:space="preserve"> </w:t>
       </w:r>
       <w:r>
-        <w:t xml:space="preserve">brought to archaeology from Mayr</w:t>
-      </w:r>
-      <w:r>
-        <w:t xml:space="preserve"> </w:t>
-      </w:r>
-      <w:r>
-        <w:t xml:space="preserve">(1959)</w:t>
-      </w:r>
-      <w:r>
-        <w:t xml:space="preserve">. Archaeologists often treat the past as made of bounded units, the phase, the polity, the society, each with members and edges, and read a cluster of similar assemblages as one such unit. That is typological thinking, in which the type is the real object and variation around it is noise. Population thinking reverses the priority. Variation is the reality, and the type is an abstraction from it. We accordingly treat the transmission of decoration as a continuous field of copying among potters with no built-in boundaries, in which interaction falls off with distance and is more local in some places than in others.</w:t>
+        <w:t xml:space="preserve">set against typological conceptions of change in archaeology. Archaeologists often treat the past as made of bounded units, the phase, the polity, the society, each with members and edges, and read a cluster of similar assemblages as one such unit. That is typological thinking, in which the type is the real object and variation around it is noise. Population thinking reverses the priority. Variation is the reality, and the type is an abstraction from it. We accordingly treat the transmission of decoration as a continuous field of copying among potters with no built-in boundaries, in which interaction falls off with distance and is more local in some places than in others.</w:t>
       </w:r>
     </w:p>
     <w:p>
@@ -686,13 +725,22 @@
         <w:t xml:space="preserve">(Madsen 2012; Premo 2014)</w:t>
       </w:r>
       <w:r>
-        <w:t xml:space="preserve">. Several processes can therefore produce the same population-level pattern, and where a discriminating signal survives at all it tends to lie in the rarest types</w:t>
-      </w:r>
-      <w:r>
-        <w:t xml:space="preserve"> </w:t>
-      </w:r>
-      <w:r>
-        <w:t xml:space="preserve">(Carrignon et al. 2019; Kandler et al. 2017; Mesoudi 2021; O’Dwyer and Kandler 2017)</w:t>
+        <w:t xml:space="preserve">. Several processes can therefore produce the same population-level pattern</w:t>
+      </w:r>
+      <w:r>
+        <w:t xml:space="preserve"> </w:t>
+      </w:r>
+      <w:r>
+        <w:t xml:space="preserve">(Carrignon et al. 2019; Kandler et al. 2017; Mesoudi 2021)</w:t>
+      </w:r>
+      <w:r>
+        <w:t xml:space="preserve">, and where a discriminating signal survives at all it tends to lie in the rarest types</w:t>
+      </w:r>
+      <w:r>
+        <w:t xml:space="preserve"> </w:t>
+      </w:r>
+      <w:r>
+        <w:t xml:space="preserve">(O’Dwyer and Kandler 2017)</w:t>
       </w:r>
       <w:r>
         <w:t xml:space="preserve">. For this reason we do not rely on any one statistic. We compare processes by simulating them on the real geography and asking which one reproduces the record.</w:t>
@@ -713,31 +761,49 @@
         <w:pStyle w:val="FirstParagraph"/>
       </w:pPr>
       <w:r>
-        <w:t xml:space="preserve">The late pre-contact lower valley supports two readings of the same record. The first holds that the region was moving toward greater political complexity. The Parkin phase (ca. 1400 to 1600 CE) is a dense cluster of fortified, moated St. Francis-type towns along the St. Francis and Tyronza rivers, and Parkin dominates it: a palisaded center of about 17 acres with a platform mound more than 6 m high, placed by the De Soto chronicles as the seat of Casqui</w:t>
-      </w:r>
-      <w:r>
-        <w:t xml:space="preserve"> </w:t>
-      </w:r>
-      <w:r>
-        <w:t xml:space="preserve">(Dye and Cox 1990; Mitchem 2001; Phyllis A. Morse 1990)</w:t>
-      </w:r>
-      <w:r>
-        <w:t xml:space="preserve">. On this reading, Parkin’s position on agriculturally poor soil implies that it drew tribute from surrounding villages, a hallmark of an emerging chiefly hierarchy that contact then cut short</w:t>
-      </w:r>
-      <w:r>
-        <w:t xml:space="preserve"> </w:t>
-      </w:r>
-      <w:r>
-        <w:t xml:space="preserve">(Morse and Morse 1996:17–18; Phyllis A. Morse 1990)</w:t>
-      </w:r>
-      <w:r>
-        <w:t xml:space="preserve">. The second reading holds that the lower valley was a stable arrangement of competing peer polities that never consolidated into a regional hierarchy</w:t>
-      </w:r>
-      <w:r>
-        <w:t xml:space="preserve"> </w:t>
-      </w:r>
-      <w:r>
-        <w:t xml:space="preserve">(Anderson 1996; Beck 2003; Blitz 1999; King and Freer 1995; Lulewicz 2019; Milner 1998; Rees 2001)</w:t>
+        <w:t xml:space="preserve">The late pre-contact lower valley supports two readings of the same record. The first holds that the region was moving toward greater political complexity. The Parkin phase (ca. AD 1400 to 1650) is a dense cluster of fortified, moated St. Francis-type towns along the St. Francis and Tyronza rivers, and Parkin dominates it: a palisaded center of about 17 acres with a platform mound more than 6 m high, identified by reconstructions of the De Soto route as the seat of Casqui</w:t>
+      </w:r>
+      <w:r>
+        <w:t xml:space="preserve"> </w:t>
+      </w:r>
+      <w:r>
+        <w:t xml:space="preserve">(Dye and Cox 1990; Mitchem et al. 2017; Morse and Morse 1996:17; Phyllis A. Morse 1990:118–129)</w:t>
+      </w:r>
+      <w:r>
+        <w:t xml:space="preserve">. On this reading, Parkin’s position on agriculturally poor soil implies that it drew tribute from surrounding villages, a hallmark of an emerging chiefly hierarchy</w:t>
+      </w:r>
+      <w:r>
+        <w:t xml:space="preserve"> </w:t>
+      </w:r>
+      <w:r>
+        <w:t xml:space="preserve">(Phyllis A. Morse 1990:123–124)</w:t>
+      </w:r>
+      <w:r>
+        <w:t xml:space="preserve">, part of a political florescence that contact then cut short</w:t>
+      </w:r>
+      <w:r>
+        <w:t xml:space="preserve"> </w:t>
+      </w:r>
+      <w:r>
+        <w:t xml:space="preserve">(Morse and Morse 1996:18)</w:t>
+      </w:r>
+      <w:r>
+        <w:t xml:space="preserve">. The second reading holds that polities in this part of the valley never achieved that kind of regional integration</w:t>
+      </w:r>
+      <w:r>
+        <w:t xml:space="preserve"> </w:t>
+      </w:r>
+      <w:r>
+        <w:t xml:space="preserve">(Rees 2001)</w:t>
+      </w:r>
+      <w:r>
+        <w:t xml:space="preserve">, consistent with models in which Mississippian polities were weakly consolidated, cycling, and short-lived</w:t>
+      </w:r>
+      <w:r>
+        <w:t xml:space="preserve"> </w:t>
+      </w:r>
+      <w:r>
+        <w:t xml:space="preserve">(Anderson 1996; Beck 2003; Blitz 1999; King and Freer 1995)</w:t>
       </w:r>
       <w:r>
         <w:t xml:space="preserve">. In the chronicles, Casqui and its neighbor Pacaha appear in open conflict, as peers would, although the same sources have also been read as ranking Casqui below Pacaha</w:t>
@@ -935,7 +1001,7 @@
         <w:pStyle w:val="BodyText"/>
       </w:pPr>
       <w:r>
-        <w:t xml:space="preserve">The fourth asks whether assemblages on the same side of a boundary are more alike than assemblages the same distance apart on opposite sides. Similarity normally fades smoothly with distance. A real social boundary adds a step to that fade, which we measure as a boundary excess, the loss of similarity across a boundary beyond what distance predicts. Copying on a finite network can itself produce a positive excess</w:t>
+        <w:t xml:space="preserve">The fourth asks whether assemblages on the same side of a boundary are more alike than assemblages the same distance apart on opposite sides. Similarity normally fades smoothly with distance. A real social boundary adds a step to that fade, which we measure as a boundary excess, the loss of similarity across a boundary beyond what distance predicts. Copying on a finite network can itself produce differentiation that mimics a boundary</w:t>
       </w:r>
       <w:r>
         <w:t xml:space="preserve"> </w:t>
@@ -944,7 +1010,7 @@
         <w:t xml:space="preserve">(Lipo et al. 2021)</w:t>
       </w:r>
       <w:r>
-        <w:t xml:space="preserve">.</w:t>
+        <w:t xml:space="preserve">, so the excess, too, has to be judged against a model.</w:t>
       </w:r>
     </w:p>
     <w:p>
@@ -1717,7 +1783,7 @@
         <w:t xml:space="preserve">(Dunnell 1978; Neiman 1995)</w:t>
       </w:r>
       <w:r>
-        <w:t xml:space="preserve">. Plain wares are everything without decoration, and their abundance tracks vessel function, paste, and the activities carried out at a site, none of which a copying model represents. Mississippi Plain and Bell Plain, which differ only in paste, make up 87 percent of the sherds in the one published table for the region that reports them</w:t>
+        <w:t xml:space="preserve">. Plain wares are everything without decoration, and their abundance tracks vessel function, paste, and the activities carried out at a site, none of which a copying model represents. Mississippi Plain and Bell Plain, which differ only in paste, make up 87 percent of the typed sherds in the one published table for the region that reports them</w:t>
       </w:r>
       <w:r>
         <w:t xml:space="preserve"> </w:t>
@@ -1755,7 +1821,19 @@
         <w:t xml:space="preserve"> </w:t>
       </w:r>
       <w:r>
-        <w:t xml:space="preserve">compiled a separate table of 39 sites, each with at least 800 sherds, drawn largely from the same survey files. His counts match the survey at 11 of the 21 sites the two tables share and exceed it at the other ten, which we infer reflects later collections he reports analyzing at the C. H. Nash Museum</w:t>
+        <w:t xml:space="preserve">compiled a separate table of 39 sites, each with at least 800 sherds, drawn largely from the same survey files. His counts match the survey at 11 of the 21 sites the two tables share and exceed it at the other ten, which reflects the additional sources he lists: reanalyzed C. H. Nash Museum collections for Beck, Belle Meade, and Walls, House’s</w:t>
+      </w:r>
+      <w:r>
+        <w:t xml:space="preserve"> </w:t>
+      </w:r>
+      <w:r>
+        <w:t xml:space="preserve">(1991)</w:t>
+      </w:r>
+      <w:r>
+        <w:t xml:space="preserve"> </w:t>
+      </w:r>
+      <w:r>
+        <w:t xml:space="preserve">counts for the Kent area, and later excavated material for Parkin</w:t>
       </w:r>
       <w:r>
         <w:t xml:space="preserve"> </w:t>
@@ -1790,7 +1868,7 @@
         <w:t xml:space="preserve"> </w:t>
       </w:r>
       <w:r>
-        <w:t xml:space="preserve">(1996b)</w:t>
+        <w:t xml:space="preserve">(1996)</w:t>
       </w:r>
       <w:r>
         <w:t xml:space="preserve"> </w:t>
@@ -1903,13 +1981,13 @@
         <w:t xml:space="preserve"> </w:t>
       </w:r>
       <w:r>
-        <w:t xml:space="preserve">compilation provides 108 radiocarbon determinations for this part of the valley, 40 from seven St. Francis basin Parkin-phase sites and 19 from Parkin itself</w:t>
-      </w:r>
-      <w:r>
-        <w:t xml:space="preserve"> </w:t>
-      </w:r>
-      <w:r>
-        <w:t xml:space="preserve">(House 1993; Mainfort 1996a; Sullivan et al. 2024)</w:t>
+        <w:t xml:space="preserve">compilation provides 108 radiocarbon determinations for this part of the valley, 40 of them from seven sites in and near the St. Francis basin and 19 from Parkin itself</w:t>
+      </w:r>
+      <w:r>
+        <w:t xml:space="preserve"> </w:t>
+      </w:r>
+      <w:r>
+        <w:t xml:space="preserve">(House 1993; Mainfort 1996)</w:t>
       </w:r>
       <w:r>
         <w:t xml:space="preserve">. Calibrated against IntCal20</w:t>
@@ -2087,16 +2165,31 @@
         <w:t xml:space="preserve"> </w:t>
       </w:r>
       <w:r>
-        <w:t xml:space="preserve">is computed on Gini-Simpson diversity across spatial clusters, weighted by assemblage size</w:t>
-      </w:r>
-      <w:r>
-        <w:t xml:space="preserve"> </w:t>
-      </w:r>
-      <w:r>
-        <w:t xml:space="preserve">(Bell et al. 2009)</w:t>
-      </w:r>
-      <w:r>
-        <w:t xml:space="preserve">. Similarity between assemblages uses the Brainerd-Robinson coefficient</w:t>
+        <w:t xml:space="preserve">is computed as a partition of Gini-Simpson diversity across spatial clusters, weighted by assemblage size, which is Nei’s</w:t>
+      </w:r>
+      <w:r>
+        <w:t xml:space="preserve"> </w:t>
+      </w:r>
+      <w:r>
+        <w:t xml:space="preserve">(1973)</w:t>
+      </w:r>
+      <w:r>
+        <w:t xml:space="preserve"> </w:t>
+      </w:r>
+      <w:r>
+        <w:t xml:space="preserve">diversity form of the index that Bell, Richerson, and McElreath</w:t>
+      </w:r>
+      <w:r>
+        <w:t xml:space="preserve"> </w:t>
+      </w:r>
+      <w:r>
+        <w:t xml:space="preserve">(2009)</w:t>
+      </w:r>
+      <w:r>
+        <w:t xml:space="preserve"> </w:t>
+      </w:r>
+      <w:r>
+        <w:t xml:space="preserve">apply to cultural variation. Similarity between assemblages uses the Brainerd-Robinson coefficient</w:t>
       </w:r>
       <w:r>
         <w:t xml:space="preserve"> </w:t>
@@ -2330,7 +2423,7 @@
         <w:t xml:space="preserve"> </w:t>
       </w:r>
       <w:r>
-        <w:t xml:space="preserve">under the phase assignments with 1,000 alternative divisions of the same assemblages into groups of the same sizes (8, 11, and 9), drawn either around randomly placed centers or to be as spatially compact as possible. Second, we clustered the assemblages using site coordinates and decorated-class composition together, varying how much weight composition carries, and measured agreement with Mainfort’s assignments with the adjusted Rand index, which is zero on average for unrelated divisions and one for identical ones. Third, we mapped the local rate at which composition changes across the basin and asked whether the phase boundaries fall where it changes fastest. Fourth, we ran the neutral copying model on the real map and clustered its simulated pottery exactly as we clustered the real pottery. Fifth, we asked whether the phase boundaries run through gaps in late-period settlement, using sites independent of the analyzed assemblages.</w:t>
+        <w:t xml:space="preserve">under the phase assignments with alternative divisions of the same assemblages into groups of the same sizes (8, 11, and 9), drawn either around randomly placed centers or to be as spatially compact as possible. We state the comparison as the posterior probability that the phase lines separate the pottery better than an alternative, drawing each assemblage’s class proportions from their posterior 2,000 times so that the uncertainty in the counts is carried through. Second, we clustered the assemblages using site coordinates and decorated-class composition together, varying how much weight composition carries, and measured agreement with Mainfort’s assignments with the adjusted Rand index, which is zero on average for unrelated divisions and one for identical ones. Third, we mapped the local rate at which composition changes across the basin and asked whether the phase boundaries fall where it changes fastest. Fourth, we ran the neutral copying model on the real map and clustered its simulated pottery exactly as we clustered the real pottery. Fifth, we asked whether the phase boundaries run through gaps in late-period settlement, using sites independent of the analyzed assemblages.</w:t>
       </w:r>
     </w:p>
     <w:bookmarkEnd w:id="134"/>
@@ -2348,16 +2441,19 @@
         <w:pStyle w:val="FirstParagraph"/>
       </w:pPr>
       <w:r>
-        <w:t xml:space="preserve">A polity should also leave traces outside the pottery. We examined the distribution of maximum mound height within the basin, the one attribute recorded the same way at every site, to ask whether a single center stands above the rest as a redistributive apex</w:t>
-      </w:r>
-      <w:r>
-        <w:t xml:space="preserve"> </w:t>
-      </w:r>
-      <w:r>
-        <w:t xml:space="preserve">(Peebles and Kus 1977)</w:t>
-      </w:r>
-      <w:r>
-        <w:t xml:space="preserve">. For exchange we drew on Cobb’s</w:t>
+        <w:t xml:space="preserve">A polity should also leave traces outside the pottery. We examined the distribution of maximum mound height within the basin, the one attribute recorded the same way at every site, to ask whether site sizes form the hierarchy of settlement types and sizes that Peebles and Kus</w:t>
+      </w:r>
+      <w:r>
+        <w:t xml:space="preserve"> </w:t>
+      </w:r>
+      <w:r>
+        <w:t xml:space="preserve">(1977:431)</w:t>
+      </w:r>
+      <w:r>
+        <w:t xml:space="preserve"> </w:t>
+      </w:r>
+      <w:r>
+        <w:t xml:space="preserve">take as a correlate of ranked society, with a single center set above the rest. For exchange we drew on Cobb’s</w:t>
       </w:r>
       <w:r>
         <w:t xml:space="preserve"> </w:t>
@@ -2369,7 +2465,7 @@
         <w:t xml:space="preserve"> </w:t>
       </w:r>
       <w:r>
-        <w:t xml:space="preserve">regional analysis of the production and distribution of Mill Creek and Dover chert hoes, goods whose control would mark economic centralization.</w:t>
+        <w:t xml:space="preserve">analysis of the production and distribution of Mill Creek chert hoes, goods whose control would mark economic centralization.</w:t>
       </w:r>
     </w:p>
     <w:bookmarkEnd w:id="135"/>
@@ -2447,7 +2543,7 @@
         <w:pStyle w:val="BodyText"/>
       </w:pPr>
       <w:r>
-        <w:t xml:space="preserve">Two measures fall outside what the model produces. Assemblages on the same side of the cluster boundary are more alike than assemblages the same distance apart across it, a boundary excess of +14.0 against a simulated range of -9.7 to +8.7. Adding a boundary to the model does not reproduce this either. Weakening every cross-boundary link to between half and three percent of its strength leaves the median</w:t>
+        <w:t xml:space="preserve">Scored on the published phases themselves rather than on spatial clusters, the model gives the same answer. The between-phase</w:t>
       </w:r>
       <w:r>
         <w:t xml:space="preserve"> </w:t>
@@ -2473,7 +2569,75 @@
         <w:t xml:space="preserve"> </w:t>
       </w:r>
       <w:r>
-        <w:t xml:space="preserve">between 0.0020 and 0.0037, and 20 to 30 percent of the 30 runs at each setting reach the observed value, no more than the 23 to 33 percent reached with no boundary at all. A boundary in copying, the mechanism the phase-as-group hypothesis requires, adds almost nothing to what distance already produces. Part of the reason lies in the model: new variants arrive from a region-wide pool that no boundary interrupts, which mutes any boundary’s effect.</w:t>
+        <w:t xml:space="preserve">of 0.0110 lies inside the range the model produces when its runs are divided along the phase lines, 0.0012 to 0.0164 (median 0.0049, 300 runs), so copying with no groups produces as much difference between the phases as the record shows.</w:t>
+      </w:r>
+    </w:p>
+    <w:p>
+      <w:pPr>
+        <w:pStyle w:val="BodyText"/>
+      </w:pPr>
+      <w:r>
+        <w:t xml:space="preserve">One measure falls outside what the model produces. Assemblages on the same side of a line are more alike than assemblages the same distance apart across it: the boundary excess is +14.0 at the two spatial clusters, against a simulated range of -9.7 to +8.7, and +10.7 at the phase lines, against -9.2 to +8.0. This excess does not single out the phase lines. With the uncertainty in the counts carried through, the excess at the phase lines (posterior median +9.9, 95 percent credible interval +5.1 to +14.8) is no larger than at divisions of the same sizes drawn around random centers (median +7.4) or made compact (median +5.3), and the probability that it is larger is 0.59 in both cases. Any division of this map shows it. The record’s similarity falls off over short distances more steeply than the model’s does, but the phase lines do not mark a step in it.</w:t>
+      </w:r>
+    </w:p>
+    <w:p>
+      <w:pPr>
+        <w:pStyle w:val="BodyText"/>
+      </w:pPr>
+      <w:r>
+        <w:t xml:space="preserve">A model of bounded groups does not account for the excess either, even with every advantage. We gave the phases both properties a bounded group would have, copying across phase lines weakened to between half and three percent of its strength and new variants drawn in each phase from a partly reordered version of the regional profile, crossed in 16 combinations of 300 runs each (Supplemental Text). Weakening copying at the phase lines changes the statistics little, because at the calibrated mixing rate copying between sites is already rare, and the data cannot tell a copying boundary from none: the posterior probability of a boundary is 0.68, against a prior of 0.75, and in test runs with a boundary built in it rises only to 0.75 to 0.79. What moves the between-phase</w:t>
+      </w:r>
+      <w:r>
+        <w:t xml:space="preserve"> </w:t>
+      </w:r>
+      <m:oMath>
+        <m:sSub>
+          <m:e>
+            <m:r>
+              <m:t>F</m:t>
+            </m:r>
+          </m:e>
+          <m:sub>
+            <m:r>
+              <m:t>S</m:t>
+            </m:r>
+            <m:r>
+              <m:t>T</m:t>
+            </m:r>
+          </m:sub>
+        </m:sSub>
+      </m:oMath>
+      <w:r>
+        <w:t xml:space="preserve"> </w:t>
+      </w:r>
+      <w:r>
+        <w:t xml:space="preserve">and the boundary excess is local innovation, with or without a copying boundary. Weakening copying across the two spatial clusters tells the same story, leaving the median</w:t>
+      </w:r>
+      <w:r>
+        <w:t xml:space="preserve"> </w:t>
+      </w:r>
+      <m:oMath>
+        <m:sSub>
+          <m:e>
+            <m:r>
+              <m:t>F</m:t>
+            </m:r>
+          </m:e>
+          <m:sub>
+            <m:r>
+              <m:t>S</m:t>
+            </m:r>
+            <m:r>
+              <m:t>T</m:t>
+            </m:r>
+          </m:sub>
+        </m:sSub>
+      </m:oMath>
+      <w:r>
+        <w:t xml:space="preserve"> </w:t>
+      </w:r>
+      <w:r>
+        <w:t xml:space="preserve">between 0.0020 and 0.0037 and the observed value reached in 20 to 30 percent of runs, against 23 to 33 percent with no boundary. Groups in the sense the phase concept requires, people who copied mainly one another, are therefore neither required nor excluded by the copying model. The case against the phases as groups rests on the other tests: where the lines fall, what they separate, and what could have drawn them.</w:t>
       </w:r>
     </w:p>
     <w:p>
@@ -3328,7 +3492,7 @@
         <w:pStyle w:val="BodyText"/>
       </w:pPr>
       <w:r>
-        <w:t xml:space="preserve">That finer-scale difference is not spread evenly, and it is not centered on Parkin. Dividing the basin into five clusters and comparing each cluster’s contribution with 300 simulations, the two most thinly sampled clusters, five Kent-phase assemblages around Kent Place holding 765 sherds and five around Walls holding 918, exceed the model 30-fold and 7-fold and together supply 63 percent of the observed statistic. The cluster containing Parkin and nine neighbors, the best sampled in the basin at 6,555 sherds, exceeds it 4-fold, and the two clusters along the Mississippi exceed it 2.3- and 2.2-fold. The simulated assemblages are drawn at the real sherd counts, so sampling alone does not produce this pattern, and it does not follow which source the counts came from (Supplemental Text). At these scales, though, the clusters approach the spacing of the assemblages themselves, a median of 4.3 km to the nearest neighbor, which is as fine as the record can resolve.</w:t>
+        <w:t xml:space="preserve">That finer-scale difference is not spread evenly, and it is not centered on Parkin. Dividing the basin into five clusters and comparing each cluster’s contribution with 300 simulations, the two most thinly sampled clusters, five Kent-phase assemblages around Kent Place holding 765 sherds and five around Walls holding 918, exceed the model 30-fold and 7-fold and together supply 63 percent of the observed statistic. The cluster containing Parkin and nine neighbors, the best sampled in the basin at 6,555 sherds, exceeds it 4-fold, and the two clusters along the Mississippi exceed it 2.3- and 2.2-fold. The excess is not a product of small samples. Redrawing every assemblage from the basin’s pooled profile at its own sherd count gives each cluster a contribution near zero (at most 0.0003). Carrying the uncertainty in the observed counts through leaves the Kent Place cluster 24 to 35 times above the model and the Walls cluster 5 to 8 times, and dropping any one of its assemblages leaves the Kent Place cluster 23 to 30 times above it, so no single collection carries the difference. It does not follow which source the counts came from either (Supplemental Text). At these scales, though, the clusters approach the spacing of the assemblages themselves, a median of 4.3 km to the nearest neighbor, which is as fine as the record can resolve.</w:t>
       </w:r>
     </w:p>
     <w:p>
@@ -3620,7 +3784,7 @@
               <w:t xml:space="preserve"> </w:t>
             </w:r>
             <w:r>
-              <w:t xml:space="preserve">No resolvable trend (closure 0.15, 0.00 to 0.37); boundaries fall where pottery changes least; location alone recovers the phases</w:t>
+              <w:t xml:space="preserve">No resolvable trend (closure 0.15, 0.00 to 0.37); boundaries fall where pottery changes least; the step in similarity at the phase lines is no larger than at arbitrary divisions; location alone recovers the phases</w:t>
             </w:r>
           </w:p>
         </w:tc>
@@ -3644,7 +3808,7 @@
               <w:pStyle w:val="Compact"/>
             </w:pPr>
             <w:r>
-              <w:t xml:space="preserve">Higher between-cluster</w:t>
+              <w:t xml:space="preserve">Higher between-group</w:t>
             </w:r>
             <w:r>
               <w:t xml:space="preserve"> </w:t>
@@ -3666,6 +3830,12 @@
                 </m:sub>
               </m:sSub>
             </m:oMath>
+            <w:r>
+              <w:t xml:space="preserve"> </w:t>
+            </w:r>
+            <w:r>
+              <w:t xml:space="preserve">and a step in similarity at the lines</w:t>
+            </w:r>
           </w:p>
         </w:tc>
         <w:tc>
@@ -3675,7 +3845,7 @@
               <w:pStyle w:val="Compact"/>
             </w:pPr>
             <w:r>
-              <w:t xml:space="preserve">Cross-boundary copying weakened to 0.5, 0.1, and 0.03 of its strength</w:t>
+              <w:t xml:space="preserve">Copying across phase lines weakened to 0.5, 0.1, and 0.03 of its strength, crossed with local innovation (16 combinations, 300 runs each); the same weakening across the spatial clusters</w:t>
             </w:r>
           </w:p>
         </w:tc>
@@ -3690,13 +3860,13 @@
                 <w:b/>
                 <w:bCs/>
               </w:rPr>
-              <w:t xml:space="preserve">Fails.</w:t>
+              <w:t xml:space="preserve">Not identifiable.</w:t>
             </w:r>
             <w:r>
               <w:t xml:space="preserve"> </w:t>
             </w:r>
             <w:r>
-              <w:t xml:space="preserve">Medians 0.0020 to 0.0037; the observed value is reached in 20 to 30 percent of runs, no more often than without a boundary</w:t>
+              <w:t xml:space="preserve">At the calibrated mixing rate a copying boundary changes the statistics little; its posterior is 0.68 against a prior of 0.75, and 0.75 to 0.79 when one is built in</w:t>
             </w:r>
           </w:p>
         </w:tc>
@@ -4055,22 +4225,13 @@
         <w:t xml:space="preserve">(Morse 1981, 1990)</w:t>
       </w:r>
       <w:r>
-        <w:t xml:space="preserve">. Its mound is the second tallest of the 55 basin sites with a recorded height, behind one at 23 ft, and the tallest exceeds the second by a ratio of only 1.08 (Figure 8). Parkin’s height comes from excavation reports, whereas the others come from a regional compilation without per-site sources, which we cannot correct. Mound heights form a graded series with a prominent center, not a separate administrative tier</w:t>
-      </w:r>
-      <w:r>
-        <w:t xml:space="preserve"> </w:t>
-      </w:r>
-      <w:r>
-        <w:t xml:space="preserve">(Hally 1993, 1996)</w:t>
-      </w:r>
-      <w:r>
-        <w:t xml:space="preserve">. The chert-hoe economy points the same way: hoes were produced across the region and passed down the line rather than through a central redistributor</w:t>
-      </w:r>
-      <w:r>
-        <w:t xml:space="preserve"> </w:t>
-      </w:r>
-      <w:r>
-        <w:t xml:space="preserve">(Cobb 2000)</w:t>
+        <w:t xml:space="preserve">. Its mound is the second tallest of the 55 basin sites with a recorded height, behind one at 23 ft, and the tallest exceeds the second by a ratio of only 1.08 (Figure 8). Parkin’s height comes from excavation reports, whereas the others come from a regional compilation without per-site sources, which we cannot correct. Mound heights form a graded series with a prominent center, not a separate administrative tier. The chert-hoe economy points the same way: Mill Creek hoes were made by autonomous workshops at the source and moved largely down the line, with elites at most gaining privileged access</w:t>
+      </w:r>
+      <w:r>
+        <w:t xml:space="preserve"> </w:t>
+      </w:r>
+      <w:r>
+        <w:t xml:space="preserve">(Cobb 2000:75, 154, 198)</w:t>
       </w:r>
       <w:r>
         <w:t xml:space="preserve">, although that evidence is regional rather than specific to the basin.</w:t>
@@ -4156,7 +4317,7 @@
         <w:pStyle w:val="FirstParagraph"/>
       </w:pPr>
       <w:r>
-        <w:t xml:space="preserve">If spatially structured drift explains the frequencies, the phases themselves should be what that structure looks like when sites are sorted by resemblance and proximity. If the phases were groups instead, their boundaries should be where the pottery changes. They are not. The between-group</w:t>
+        <w:t xml:space="preserve">If spatially structured drift explains the frequencies, the phases themselves should be what that structure looks like when sites are sorted by resemblance and proximity. If the phases were groups instead, their boundaries should be where the pottery changes. They are not. With the uncertainty in every assemblage’s counts carried through, the between-phase</w:t>
       </w:r>
       <w:r>
         <w:t xml:space="preserve"> </w:t>
@@ -4182,7 +4343,7 @@
         <w:t xml:space="preserve"> </w:t>
       </w:r>
       <w:r>
-        <w:t xml:space="preserve">under the phase assignments is 0.0110. Shuffling the phase labels among assemblages at random, which destroys geography, gives a lower value in 1,832 of 2,000 draws, so neighboring assemblages do resemble one another, as copying across distance produces on its own. Against 1,000 divisions of the same assemblages into groups of the same sizes around randomly placed centers, however, the phases sit at the 18th percentile (median 0.0154), and against 1,000 divisions drawn to be as compact as possible, at the 5th percentile (median 0.0171) (Figure 9B, C). Arbitrary lines separate the pottery better than the phase lines do.</w:t>
+        <w:t xml:space="preserve">has a posterior median of 0.0109 (95 percent credible interval 0.0091 to 0.0128). Divisions of the same assemblages into groups of the same sizes around randomly placed centers give a median of 0.0146, and divisions drawn to be as compact as possible give 0.0162. The posterior probability that the phase lines separate the pottery better than a division around random centers is 0.20, and better than a compact division 0.05 (Figure 9B, C). Arbitrary lines separate the pottery better than the phase lines do.</w:t>
       </w:r>
     </w:p>
     <w:p>
@@ -4689,7 +4850,7 @@
         <w:t xml:space="preserve"> </w:t>
       </w:r>
       <w:r>
-        <w:t xml:space="preserve">drew a different set of phase lines through much the same sites after ordinating their pottery. He adopted Smith’s</w:t>
+        <w:t xml:space="preserve">drew his phase lines through much the same sites after ordinating their pottery. He adopted Smith’s</w:t>
       </w:r>
       <w:r>
         <w:t xml:space="preserve"> </w:t>
@@ -4701,7 +4862,25 @@
         <w:t xml:space="preserve"> </w:t>
       </w:r>
       <w:r>
-        <w:t xml:space="preserve">Horseshoe Lake phase, which takes Beck, Belle Meade, Mound Place, and Young out of Walls, and he moved Hollywood and Commerce from Walls to Kent, Castile Landing from Kent to Parkin, and Carson Lake from Nodena to Walls. Nine sites are assigned differently in the two schemes. A second scheme drawn through the same ground is a useful check. If phases were groups, both schemes should track the same boundaries. If they are what a spatial gradient looks like when sites are sorted, a scheme drawn by proximity and a scheme drawn from the pottery should behave differently.</w:t>
+        <w:t xml:space="preserve">Horseshoe Lake phase, which gathers Beck, Belle Meade, Mound Place, and Young</w:t>
+      </w:r>
+      <w:r>
+        <w:t xml:space="preserve"> </w:t>
+      </w:r>
+      <w:r>
+        <w:t xml:space="preserve">(Mainfort 2003:177)</w:t>
+      </w:r>
+      <w:r>
+        <w:t xml:space="preserve">. Compared with the scheme of Figure 1, his table also places Hollywood and Commerce in Kent rather than Walls, Castile Landing in Parkin rather than Kent, and Carson Lake in Walls rather than Nodena, although his text treats Carson Lake as a Nodena site</w:t>
+      </w:r>
+      <w:r>
+        <w:t xml:space="preserve"> </w:t>
+      </w:r>
+      <w:r>
+        <w:t xml:space="preserve">(Mainfort 2003:176–181)</w:t>
+      </w:r>
+      <w:r>
+        <w:t xml:space="preserve">. Nine sites are assigned differently in the two schemes. A second scheme drawn through the same ground is a useful check. If phases were groups, both schemes should track the same boundaries. If they are what a spatial gradient looks like when sites are sorted, a scheme drawn by proximity and a scheme drawn from the pottery should behave differently.</w:t>
       </w:r>
     </w:p>
     <w:p>
@@ -4743,7 +4922,7 @@
         <w:t xml:space="preserve"> </w:t>
       </w:r>
       <w:r>
-        <w:t xml:space="preserve">under his phases is 0.047, higher than all 1,000 same-size divisions around random centers and higher than 99 percent of compact divisions, and the compactness search never returns his division. Giving composition half the weight of the coordinates also raises the agreement with his scheme, to 0.60, above the map alone, whereas for the earlier scheme composition lowers the agreement at every weight.</w:t>
+        <w:t xml:space="preserve">under his phases has a posterior median of 0.046 (95 percent credible interval 0.041 to 0.051), against 0.027 for same-size divisions around random centers and 0.028 for compact ones, and the posterior probability that his lines separate the pottery better than such a division is 0.99 and 1.00. The compactness search never returns his division. Giving composition half the weight of the coordinates also raises the agreement with his scheme, to 0.60, above the map alone, whereas for the earlier scheme composition lowers the agreement at every weight.</w:t>
       </w:r>
     </w:p>
     <w:p>
@@ -4852,7 +5031,7 @@
         <w:pStyle w:val="FirstParagraph"/>
       </w:pPr>
       <w:r>
-        <w:t xml:space="preserve">Spatially structured drift explains nearly all of the variation in the basin’s decorated-type frequencies. Neutral copying on the real map, tuned to the assemblages’ diversity, reproduces the differences among assemblages at the scales at which the phases were drawn, the fade of similarity with distance, and the phases themselves, and a model with no groups assigns 99.6 percent of the variation to location. Nothing in the frequencies grows over the sequence as closure would require. The variability that drift does not produce is small and lies at finer scales, from five clusters on, where clusters shrink toward the spacing of the assemblages themselves.</w:t>
+        <w:t xml:space="preserve">Spatially structured drift explains nearly all of the variation in the basin’s decorated-type frequencies. Neutral copying on the real map, tuned to the assemblages’ diversity, reproduces the differences among assemblages at the scales at which the phases were drawn, the difference between the phases themselves, the fade of similarity with distance, and the phase assignments, and a model with no groups assigns 99.6 percent of the variation to location. Nothing in the frequencies grows over the sequence as closure would require. The variability that drift does not produce is small and lies at finer scales, from five clusters on, where clusters shrink toward the spacing of the assemblages themselves.</w:t>
       </w:r>
     </w:p>
     <w:p>
@@ -4860,7 +5039,7 @@
         <w:pStyle w:val="BodyText"/>
       </w:pPr>
       <w:r>
-        <w:t xml:space="preserve">The remaining difference lies mostly in the two most thinly sampled clusters, not around Parkin, and it appears only where clusters shrink toward the spacing of the assemblages themselves. Restricted copying across boundaries does not produce it. Of the four simplifications we relaxed, only one reproduces it while keeping diversity matched: new styles arising somewhat locally rather than at the same rates across the whole basin. That account is still neutral copying, and it is itself geographic, since the local innovation profiles follow the same spatial clusters as everything else. It does not require a social frontier.</w:t>
+        <w:t xml:space="preserve">The remaining difference lies mostly in the two most thinly sampled clusters, not around Parkin, and it appears only where clusters shrink toward the spacing of the assemblages themselves. Restricted copying across boundaries, which these data cannot detect at the calibrated mixing rate, does not produce it either. Of the four simplifications we relaxed, only one reproduces it while keeping diversity matched: new styles arising somewhat locally rather than at the same rates across the whole basin. That account is still neutral copying, and it is itself geographic, since the local innovation profiles follow the same spatial clusters as everything else. It does not require a social frontier.</w:t>
       </w:r>
     </w:p>
     <w:p>
@@ -4947,7 +5126,19 @@
         <w:t xml:space="preserve"> </w:t>
       </w:r>
       <w:r>
-        <w:t xml:space="preserve">characterized the late Mississippian phases as local elaborations, ceramic drift, on a single shared pottery complex. The comparison here tests that characterization directly and finds it describes most of the record.</w:t>
+        <w:t xml:space="preserve">wrote of the southern phases, Walls, Horseshoe Lake, Kent, and Parchman among them, that</w:t>
+      </w:r>
+      <w:r>
+        <w:t xml:space="preserve"> </w:t>
+      </w:r>
+      <w:r>
+        <w:t xml:space="preserve">“the distinctions that one tries so desperately to make between the phases involved are little more than comments on local elaborations—ceramic drift, if you will—of the basic pottery complexes possessed by peoples involved in this expansion.”</w:t>
+      </w:r>
+      <w:r>
+        <w:t xml:space="preserve"> </w:t>
+      </w:r>
+      <w:r>
+        <w:t xml:space="preserve">The comparison here tests that characterization for the Parkin, Kent, and Walls phases and finds it describes most of the record.</w:t>
       </w:r>
     </w:p>
     <w:bookmarkEnd w:id="176"/>
@@ -4965,19 +5156,31 @@
         <w:pStyle w:val="FirstParagraph"/>
       </w:pPr>
       <w:r>
-        <w:t xml:space="preserve">Parkin was the basin’s largest town and had one of its tallest mounds, and its prominence was real. The polity that prominence is taken to imply does not appear in the transmission of decoration. The pottery shows no closure that the record can resolve, Parkin links several seriation orderings rather than anchoring one, mound heights form a graded series with no separate top tier, and the regional hoe economy was not centrally redistributed. The argument that Parkin, on poor soil, must have drawn tribute from productive neighbors</w:t>
-      </w:r>
-      <w:r>
-        <w:t xml:space="preserve"> </w:t>
-      </w:r>
-      <w:r>
-        <w:t xml:space="preserve">(Phyllis A. Morse 1990)</w:t>
-      </w:r>
-      <w:r>
-        <w:t xml:space="preserve"> </w:t>
-      </w:r>
-      <w:r>
-        <w:t xml:space="preserve">assumes the tribute it concludes, and Parkin’s position at the confluence of the St. Francis and Tyronza is explained as well by control of movement as by extraction. Skeletal evidence that people at a mound center ate better than people at a nearby village comes from the Yazoo Delta rather than the St. Francis basin and rests on fourteen individuals at the village</w:t>
+        <w:t xml:space="preserve">Parkin was the basin’s largest town and had one of its tallest mounds, and its prominence was real. The polity that prominence is taken to imply does not appear in the transmission of decoration. The pottery shows no closure that the record can resolve, Parkin links several seriation orderings rather than anchoring one, mound heights form a graded series with no separate top tier, and hoes reached their consumers largely down the line. The argument that Parkin, on poor soil, must have drawn tribute from productive neighbors</w:t>
+      </w:r>
+      <w:r>
+        <w:t xml:space="preserve"> </w:t>
+      </w:r>
+      <w:r>
+        <w:t xml:space="preserve">(Phyllis A. Morse 1990:124)</w:t>
+      </w:r>
+      <w:r>
+        <w:t xml:space="preserve"> </w:t>
+      </w:r>
+      <w:r>
+        <w:t xml:space="preserve">assumes the tribute it concludes, and Morse</w:t>
+      </w:r>
+      <w:r>
+        <w:t xml:space="preserve"> </w:t>
+      </w:r>
+      <w:r>
+        <w:t xml:space="preserve">(1990:123)</w:t>
+      </w:r>
+      <w:r>
+        <w:t xml:space="preserve"> </w:t>
+      </w:r>
+      <w:r>
+        <w:t xml:space="preserve">also notes that Parkin’s position below the confluence of the St. Francis and Tyronza gave it control of river travel, which accounts for its prominence as well as extraction does. Skeletal evidence that people at a mound center ate better than people at a nearby village comes from Hollywood, one of the assemblages analyzed here, compared with a village of fourteen individuals</w:t>
       </w:r>
       <w:r>
         <w:t xml:space="preserve"> </w:t>
@@ -4986,7 +5189,7 @@
         <w:t xml:space="preserve">(Ross-Stallings 2017)</w:t>
       </w:r>
       <w:r>
-        <w:t xml:space="preserve">. Neither argument supplies the regional signal that the comparisons here look for and do not find. If the polity the De Soto expedition met was at Parkin, it is registered in ceremony, fortification, and settlement size rather than in a boundary written into the pottery.</w:t>
+        <w:t xml:space="preserve">, and a difference in health between two sites need not arise from an extractive hierarchy. Neither argument supplies the regional signal that the comparisons here look for and do not find. If the polity the De Soto expedition met was at Parkin, it is registered in ceremony, fortification, and settlement size rather than in a boundary written into the pottery.</w:t>
       </w:r>
     </w:p>
     <w:bookmarkEnd w:id="177"/>
@@ -5004,7 +5207,7 @@
         <w:pStyle w:val="FirstParagraph"/>
       </w:pPr>
       <w:r>
-        <w:t xml:space="preserve">Four limits bound these conclusions. The first is resolution. On a record of this size only cultural</w:t>
+        <w:t xml:space="preserve">Five limits bound these conclusions. The first is resolution. On a record of this size only cultural</w:t>
       </w:r>
       <w:r>
         <w:t xml:space="preserve"> </w:t>
@@ -5039,7 +5242,7 @@
         <w:t xml:space="preserve">(Coco and Iovita 2020; Kidwell and Tomašových 2013; Perreault 2018; Tomašových and Kidwell 2009, 2010; Youngblood et al. 2023)</w:t>
       </w:r>
       <w:r>
-        <w:t xml:space="preserve">. We built it into both the recovery experiment and the copying model, so its cost is already in the reported ranges rather than an argument for discounting them. The fourth is the copying model itself. A difference from a model is only as meaningful as the model, and a more complete model might absorb the finer-scale difference, as one of our four relaxations does.</w:t>
+        <w:t xml:space="preserve">. We built it into both the recovery experiment and the copying model, so its cost is already in the reported ranges rather than an argument for discounting them. The fourth is the copying model itself. A difference from a model is only as meaningful as the model, and a more complete model might absorb the finer-scale difference, as one of our four relaxations does. The fifth is what the copying model can see. At the calibrated mixing rate copying between sites is rare, so restricting it at a line changes little, and the model cannot distinguish a copying boundary from none. Our conclusion that the phases were not bounded groups therefore rests on where their lines fall, what the lines separate, and what could have drawn them, not on the copying model’s failure to find restricted copying.</w:t>
       </w:r>
     </w:p>
     <w:bookmarkEnd w:id="178"/>
@@ -5183,7 +5386,7 @@
       </w:r>
     </w:p>
     <w:bookmarkEnd w:id="182"/>
-    <w:bookmarkStart w:id="339" w:name="references"/>
+    <w:bookmarkStart w:id="333" w:name="references"/>
     <w:p>
       <w:pPr>
         <w:pStyle w:val="Heading2"/>
@@ -5192,7 +5395,7 @@
         <w:t xml:space="preserve">References</w:t>
       </w:r>
     </w:p>
-    <w:bookmarkStart w:id="338" w:name="refs"/>
+    <w:bookmarkStart w:id="332" w:name="refs"/>
     <w:bookmarkStart w:id="183" w:name="ref-anderson_1996"/>
     <w:p>
       <w:pPr>
@@ -6198,82 +6401,12 @@
       </w:r>
     </w:p>
     <w:bookmarkEnd w:id="226"/>
-    <w:bookmarkStart w:id="227" w:name="ref-hally_1993"/>
+    <w:bookmarkStart w:id="228" w:name="ref-henrich_2001"/>
     <w:p>
       <w:pPr>
         <w:pStyle w:val="Bibliography"/>
       </w:pPr>
       <w:r>
-        <w:t xml:space="preserve">Hally, David J. 1993. The Territorial Size of</w:t>
-      </w:r>
-      <w:r>
-        <w:t xml:space="preserve"> </w:t>
-      </w:r>
-      <w:r>
-        <w:t xml:space="preserve">Mississippian</w:t>
-      </w:r>
-      <w:r>
-        <w:t xml:space="preserve"> </w:t>
-      </w:r>
-      <w:r>
-        <w:t xml:space="preserve">Chiefdoms. In</w:t>
-      </w:r>
-      <w:r>
-        <w:t xml:space="preserve"> </w:t>
-      </w:r>
-      <w:r>
-        <w:rPr>
-          <w:i/>
-          <w:iCs/>
-        </w:rPr>
-        <w:t xml:space="preserve">Archaeology of Eastern North America: Papers in Honor of Stephen Williams</w:t>
-      </w:r>
-      <w:r>
-        <w:t xml:space="preserve">, edited by James B. Stoltman, pp. 143–167. Archaeological Report No. 25. Mississippi Department of Archives; History, Jackson.</w:t>
-      </w:r>
-    </w:p>
-    <w:bookmarkEnd w:id="227"/>
-    <w:bookmarkStart w:id="228" w:name="ref-hally_1996"/>
-    <w:p>
-      <w:pPr>
-        <w:pStyle w:val="Bibliography"/>
-      </w:pPr>
-      <w:r>
-        <w:t xml:space="preserve">Hally, David J. 1996. Platform Mound Construction and the Instability of</w:t>
-      </w:r>
-      <w:r>
-        <w:t xml:space="preserve"> </w:t>
-      </w:r>
-      <w:r>
-        <w:t xml:space="preserve">Mississippian</w:t>
-      </w:r>
-      <w:r>
-        <w:t xml:space="preserve"> </w:t>
-      </w:r>
-      <w:r>
-        <w:t xml:space="preserve">Chiefdoms. In</w:t>
-      </w:r>
-      <w:r>
-        <w:t xml:space="preserve"> </w:t>
-      </w:r>
-      <w:r>
-        <w:rPr>
-          <w:i/>
-          <w:iCs/>
-        </w:rPr>
-        <w:t xml:space="preserve">Political Structure and Change in the Prehistoric Southeastern United States</w:t>
-      </w:r>
-      <w:r>
-        <w:t xml:space="preserve">, edited by John F. Scarry, pp. 92–127. University Press of Florida, Gainesville.</w:t>
-      </w:r>
-    </w:p>
-    <w:bookmarkEnd w:id="228"/>
-    <w:bookmarkStart w:id="230" w:name="ref-henrich_2001"/>
-    <w:p>
-      <w:pPr>
-        <w:pStyle w:val="Bibliography"/>
-      </w:pPr>
-      <w:r>
         <w:t xml:space="preserve">Henrich, Joseph. 2001. Cultural Transmission and the Diffusion of Innovations: Adoption Dynamics Indicate That Biased Cultural Transmission Is the Predominate Force in Behavioral Change.</w:t>
       </w:r>
       <w:r>
@@ -6295,7 +6428,7 @@
       <w:r>
         <w:t xml:space="preserve"> </w:t>
       </w:r>
-      <w:hyperlink r:id="rId229">
+      <w:hyperlink r:id="rId227">
         <w:r>
           <w:rPr>
             <w:rStyle w:val="Hyperlink"/>
@@ -6307,8 +6440,8 @@
         <w:t xml:space="preserve">.</w:t>
       </w:r>
     </w:p>
-    <w:bookmarkEnd w:id="230"/>
-    <w:bookmarkStart w:id="232" w:name="ref-henrich_2004"/>
+    <w:bookmarkEnd w:id="228"/>
+    <w:bookmarkStart w:id="230" w:name="ref-henrich_2004"/>
     <w:p>
       <w:pPr>
         <w:pStyle w:val="Bibliography"/>
@@ -6347,7 +6480,7 @@
       <w:r>
         <w:t xml:space="preserve"> </w:t>
       </w:r>
-      <w:hyperlink r:id="rId231">
+      <w:hyperlink r:id="rId229">
         <w:r>
           <w:rPr>
             <w:rStyle w:val="Hyperlink"/>
@@ -6359,8 +6492,8 @@
         <w:t xml:space="preserve">.</w:t>
       </w:r>
     </w:p>
-    <w:bookmarkEnd w:id="232"/>
-    <w:bookmarkStart w:id="234" w:name="ref-henrich_boyd_1998"/>
+    <w:bookmarkEnd w:id="230"/>
+    <w:bookmarkStart w:id="232" w:name="ref-henrich_boyd_1998"/>
     <w:p>
       <w:pPr>
         <w:pStyle w:val="Bibliography"/>
@@ -6387,7 +6520,7 @@
       <w:r>
         <w:t xml:space="preserve"> </w:t>
       </w:r>
-      <w:hyperlink r:id="rId233">
+      <w:hyperlink r:id="rId231">
         <w:r>
           <w:rPr>
             <w:rStyle w:val="Hyperlink"/>
@@ -6399,8 +6532,8 @@
         <w:t xml:space="preserve">.</w:t>
       </w:r>
     </w:p>
-    <w:bookmarkEnd w:id="234"/>
-    <w:bookmarkStart w:id="235" w:name="ref-holdaway_wandsnider_2008"/>
+    <w:bookmarkEnd w:id="232"/>
+    <w:bookmarkStart w:id="233" w:name="ref-holdaway_wandsnider_2008"/>
     <w:p>
       <w:pPr>
         <w:pStyle w:val="Bibliography"/>
@@ -6422,8 +6555,8 @@
         <w:t xml:space="preserve">. University of Utah Press, Salt Lake City.</w:t>
       </w:r>
     </w:p>
-    <w:bookmarkEnd w:id="235"/>
-    <w:bookmarkStart w:id="237" w:name="ref-holland-lulewicz_ritchison_2021"/>
+    <w:bookmarkEnd w:id="233"/>
+    <w:bookmarkStart w:id="235" w:name="ref-holland-lulewicz_ritchison_2021"/>
     <w:p>
       <w:pPr>
         <w:pStyle w:val="Bibliography"/>
@@ -6450,7 +6583,7 @@
       <w:r>
         <w:t xml:space="preserve"> </w:t>
       </w:r>
-      <w:hyperlink r:id="rId236">
+      <w:hyperlink r:id="rId234">
         <w:r>
           <w:rPr>
             <w:rStyle w:val="Hyperlink"/>
@@ -6462,143 +6595,143 @@
         <w:t xml:space="preserve">.</w:t>
       </w:r>
     </w:p>
+    <w:bookmarkEnd w:id="235"/>
+    <w:bookmarkStart w:id="236" w:name="ref-house_1991"/>
+    <w:p>
+      <w:pPr>
+        <w:pStyle w:val="Bibliography"/>
+      </w:pPr>
+      <w:r>
+        <w:t xml:space="preserve">House, John H. 1991. Monitoring</w:t>
+      </w:r>
+      <w:r>
+        <w:t xml:space="preserve"> </w:t>
+      </w:r>
+      <w:r>
+        <w:t xml:space="preserve">Mississippian</w:t>
+      </w:r>
+      <w:r>
+        <w:t xml:space="preserve"> </w:t>
+      </w:r>
+      <w:r>
+        <w:t xml:space="preserve">Dynamics: Time, Settlement, and Ceramic Variation in the</w:t>
+      </w:r>
+      <w:r>
+        <w:t xml:space="preserve"> </w:t>
+      </w:r>
+      <w:r>
+        <w:t xml:space="preserve">Kent</w:t>
+      </w:r>
+      <w:r>
+        <w:t xml:space="preserve"> </w:t>
+      </w:r>
+      <w:r>
+        <w:t xml:space="preserve">Phase, Eastern</w:t>
+      </w:r>
+      <w:r>
+        <w:t xml:space="preserve"> </w:t>
+      </w:r>
+      <w:r>
+        <w:t xml:space="preserve">Arkansas</w:t>
+      </w:r>
+      <w:r>
+        <w:t xml:space="preserve">. PhD thesis, Southern Illinois University at Carbondale, Carbondale.</w:t>
+      </w:r>
+    </w:p>
+    <w:bookmarkEnd w:id="236"/>
+    <w:bookmarkStart w:id="237" w:name="ref-house_1993"/>
+    <w:p>
+      <w:pPr>
+        <w:pStyle w:val="Bibliography"/>
+      </w:pPr>
+      <w:r>
+        <w:t xml:space="preserve">House, John H. 1993. Dating the Kent Phase.</w:t>
+      </w:r>
+      <w:r>
+        <w:t xml:space="preserve"> </w:t>
+      </w:r>
+      <w:r>
+        <w:rPr>
+          <w:i/>
+          <w:iCs/>
+        </w:rPr>
+        <w:t xml:space="preserve">Southeastern Archaeology</w:t>
+      </w:r>
+      <w:r>
+        <w:t xml:space="preserve"> </w:t>
+      </w:r>
+      <w:r>
+        <w:t xml:space="preserve">12(1):21–32.</w:t>
+      </w:r>
+    </w:p>
     <w:bookmarkEnd w:id="237"/>
-    <w:bookmarkStart w:id="238" w:name="ref-house_1991"/>
+    <w:bookmarkStart w:id="238" w:name="ref-hudson_smith_depratter_1990"/>
     <w:p>
       <w:pPr>
         <w:pStyle w:val="Bibliography"/>
       </w:pPr>
       <w:r>
-        <w:t xml:space="preserve">House, John H. 1991. Monitoring</w:t>
-      </w:r>
-      <w:r>
-        <w:t xml:space="preserve"> </w:t>
-      </w:r>
-      <w:r>
-        <w:t xml:space="preserve">Mississippian</w:t>
-      </w:r>
-      <w:r>
-        <w:t xml:space="preserve"> </w:t>
-      </w:r>
-      <w:r>
-        <w:t xml:space="preserve">Dynamics: Time, Settlement, and Ceramic Variation in the</w:t>
-      </w:r>
-      <w:r>
-        <w:t xml:space="preserve"> </w:t>
-      </w:r>
-      <w:r>
-        <w:t xml:space="preserve">Kent</w:t>
-      </w:r>
-      <w:r>
-        <w:t xml:space="preserve"> </w:t>
-      </w:r>
-      <w:r>
-        <w:t xml:space="preserve">Phase, Eastern</w:t>
-      </w:r>
-      <w:r>
-        <w:t xml:space="preserve"> </w:t>
-      </w:r>
-      <w:r>
-        <w:t xml:space="preserve">Arkansas</w:t>
-      </w:r>
-      <w:r>
-        <w:t xml:space="preserve">. PhD thesis, Southern Illinois University at Carbondale.</w:t>
+        <w:t xml:space="preserve">Hudson, Charles, Marvin T. Smith, and Chester B. DePratter. 1990. The Hernando de Soto Expedition: From</w:t>
+      </w:r>
+      <w:r>
+        <w:t xml:space="preserve"> </w:t>
+      </w:r>
+      <w:r>
+        <w:t xml:space="preserve">Mabila</w:t>
+      </w:r>
+      <w:r>
+        <w:t xml:space="preserve"> </w:t>
+      </w:r>
+      <w:r>
+        <w:t xml:space="preserve">to the</w:t>
+      </w:r>
+      <w:r>
+        <w:t xml:space="preserve"> </w:t>
+      </w:r>
+      <w:r>
+        <w:t xml:space="preserve">Mississippi</w:t>
+      </w:r>
+      <w:r>
+        <w:t xml:space="preserve"> </w:t>
+      </w:r>
+      <w:r>
+        <w:t xml:space="preserve">River. In</w:t>
+      </w:r>
+      <w:r>
+        <w:t xml:space="preserve"> </w:t>
+      </w:r>
+      <w:r>
+        <w:rPr>
+          <w:i/>
+          <w:iCs/>
+        </w:rPr>
+        <w:t xml:space="preserve">Towns and Temples Along the</w:t>
+      </w:r>
+      <w:r>
+        <w:rPr>
+          <w:i/>
+          <w:iCs/>
+        </w:rPr>
+        <w:t xml:space="preserve"> </w:t>
+      </w:r>
+      <w:r>
+        <w:rPr>
+          <w:i/>
+          <w:iCs/>
+        </w:rPr>
+        <w:t xml:space="preserve">Mississippi</w:t>
+      </w:r>
+      <w:r>
+        <w:t xml:space="preserve">, edited by David H. Dye and Cheryl Anne Cox, pp. 181–207. University of Alabama Press, Tuscaloosa.</w:t>
       </w:r>
     </w:p>
     <w:bookmarkEnd w:id="238"/>
-    <w:bookmarkStart w:id="239" w:name="ref-house_1993"/>
+    <w:bookmarkStart w:id="240" w:name="ref-hunt_2006"/>
     <w:p>
       <w:pPr>
         <w:pStyle w:val="Bibliography"/>
       </w:pPr>
       <w:r>
-        <w:t xml:space="preserve">House, John H. 1993. Dating the Kent Phase.</w:t>
-      </w:r>
-      <w:r>
-        <w:t xml:space="preserve"> </w:t>
-      </w:r>
-      <w:r>
-        <w:rPr>
-          <w:i/>
-          <w:iCs/>
-        </w:rPr>
-        <w:t xml:space="preserve">Southeastern Archaeology</w:t>
-      </w:r>
-      <w:r>
-        <w:t xml:space="preserve"> </w:t>
-      </w:r>
-      <w:r>
-        <w:t xml:space="preserve">12(1):21–32.</w:t>
-      </w:r>
-    </w:p>
-    <w:bookmarkEnd w:id="239"/>
-    <w:bookmarkStart w:id="240" w:name="ref-hudson_smith_depratter_1990"/>
-    <w:p>
-      <w:pPr>
-        <w:pStyle w:val="Bibliography"/>
-      </w:pPr>
-      <w:r>
-        <w:t xml:space="preserve">Hudson, Charles, Marvin T. Smith, and Chester B. DePratter. 1990. The Hernando de Soto Expedition: From</w:t>
-      </w:r>
-      <w:r>
-        <w:t xml:space="preserve"> </w:t>
-      </w:r>
-      <w:r>
-        <w:t xml:space="preserve">Mabila</w:t>
-      </w:r>
-      <w:r>
-        <w:t xml:space="preserve"> </w:t>
-      </w:r>
-      <w:r>
-        <w:t xml:space="preserve">to the</w:t>
-      </w:r>
-      <w:r>
-        <w:t xml:space="preserve"> </w:t>
-      </w:r>
-      <w:r>
-        <w:t xml:space="preserve">Mississippi</w:t>
-      </w:r>
-      <w:r>
-        <w:t xml:space="preserve"> </w:t>
-      </w:r>
-      <w:r>
-        <w:t xml:space="preserve">River. In</w:t>
-      </w:r>
-      <w:r>
-        <w:t xml:space="preserve"> </w:t>
-      </w:r>
-      <w:r>
-        <w:rPr>
-          <w:i/>
-          <w:iCs/>
-        </w:rPr>
-        <w:t xml:space="preserve">Towns and Temples Along the</w:t>
-      </w:r>
-      <w:r>
-        <w:rPr>
-          <w:i/>
-          <w:iCs/>
-        </w:rPr>
-        <w:t xml:space="preserve"> </w:t>
-      </w:r>
-      <w:r>
-        <w:rPr>
-          <w:i/>
-          <w:iCs/>
-        </w:rPr>
-        <w:t xml:space="preserve">Mississippi</w:t>
-      </w:r>
-      <w:r>
-        <w:t xml:space="preserve">, edited by David H. Dye and Cheryl Anne Cox, pp. 181–207. University of Alabama Press, Tuscaloosa.</w:t>
-      </w:r>
-    </w:p>
-    <w:bookmarkEnd w:id="240"/>
-    <w:bookmarkStart w:id="242" w:name="ref-hunt_2006"/>
-    <w:p>
-      <w:pPr>
-        <w:pStyle w:val="Bibliography"/>
-      </w:pPr>
-      <w:r>
         <w:t xml:space="preserve">Hunt, Gene. 2006. Fitting and Comparing Models of Phyletic Evolution: Random Walks and Beyond.</w:t>
       </w:r>
       <w:r>
@@ -6620,7 +6753,7 @@
       <w:r>
         <w:t xml:space="preserve"> </w:t>
       </w:r>
-      <w:hyperlink r:id="rId241">
+      <w:hyperlink r:id="rId239">
         <w:r>
           <w:rPr>
             <w:rStyle w:val="Hyperlink"/>
@@ -6632,8 +6765,8 @@
         <w:t xml:space="preserve">.</w:t>
       </w:r>
     </w:p>
-    <w:bookmarkEnd w:id="242"/>
-    <w:bookmarkStart w:id="244" w:name="ref-hunt_bell_travis_2008"/>
+    <w:bookmarkEnd w:id="240"/>
+    <w:bookmarkStart w:id="242" w:name="ref-hunt_bell_travis_2008"/>
     <w:p>
       <w:pPr>
         <w:pStyle w:val="Bibliography"/>
@@ -6660,7 +6793,7 @@
       <w:r>
         <w:t xml:space="preserve"> </w:t>
       </w:r>
-      <w:hyperlink r:id="rId243">
+      <w:hyperlink r:id="rId241">
         <w:r>
           <w:rPr>
             <w:rStyle w:val="Hyperlink"/>
@@ -6672,8 +6805,8 @@
         <w:t xml:space="preserve">.</w:t>
       </w:r>
     </w:p>
-    <w:bookmarkEnd w:id="244"/>
-    <w:bookmarkStart w:id="245" w:name="ref-hurlbert_1971"/>
+    <w:bookmarkEnd w:id="242"/>
+    <w:bookmarkStart w:id="243" w:name="ref-hurlbert_1971"/>
     <w:p>
       <w:pPr>
         <w:pStyle w:val="Bibliography"/>
@@ -6698,8 +6831,8 @@
         <w:t xml:space="preserve">52(4):577–586.</w:t>
       </w:r>
     </w:p>
-    <w:bookmarkEnd w:id="245"/>
-    <w:bookmarkStart w:id="247" w:name="ref-kandler_shennan_2013"/>
+    <w:bookmarkEnd w:id="243"/>
+    <w:bookmarkStart w:id="245" w:name="ref-kandler_shennan_2013"/>
     <w:p>
       <w:pPr>
         <w:pStyle w:val="Bibliography"/>
@@ -6726,7 +6859,7 @@
       <w:r>
         <w:t xml:space="preserve"> </w:t>
       </w:r>
-      <w:hyperlink r:id="rId246">
+      <w:hyperlink r:id="rId244">
         <w:r>
           <w:rPr>
             <w:rStyle w:val="Hyperlink"/>
@@ -6738,8 +6871,8 @@
         <w:t xml:space="preserve">.</w:t>
       </w:r>
     </w:p>
-    <w:bookmarkEnd w:id="247"/>
-    <w:bookmarkStart w:id="249" w:name="ref-kandler_shennan_2015"/>
+    <w:bookmarkEnd w:id="245"/>
+    <w:bookmarkStart w:id="247" w:name="ref-kandler_shennan_2015"/>
     <w:p>
       <w:pPr>
         <w:pStyle w:val="Bibliography"/>
@@ -6778,7 +6911,7 @@
       <w:r>
         <w:t xml:space="preserve"> </w:t>
       </w:r>
-      <w:hyperlink r:id="rId248">
+      <w:hyperlink r:id="rId246">
         <w:r>
           <w:rPr>
             <w:rStyle w:val="Hyperlink"/>
@@ -6790,8 +6923,8 @@
         <w:t xml:space="preserve">.</w:t>
       </w:r>
     </w:p>
-    <w:bookmarkEnd w:id="249"/>
-    <w:bookmarkStart w:id="251" w:name="ref-kandler_wilder_fortunato_2017"/>
+    <w:bookmarkEnd w:id="247"/>
+    <w:bookmarkStart w:id="249" w:name="ref-kandler_wilder_fortunato_2017"/>
     <w:p>
       <w:pPr>
         <w:pStyle w:val="Bibliography"/>
@@ -6818,7 +6951,7 @@
       <w:r>
         <w:t xml:space="preserve"> </w:t>
       </w:r>
-      <w:hyperlink r:id="rId250">
+      <w:hyperlink r:id="rId248">
         <w:r>
           <w:rPr>
             <w:rStyle w:val="Hyperlink"/>
@@ -6830,8 +6963,8 @@
         <w:t xml:space="preserve">.</w:t>
       </w:r>
     </w:p>
-    <w:bookmarkEnd w:id="251"/>
-    <w:bookmarkStart w:id="253" w:name="ref-kidwell_tomasovych_2013"/>
+    <w:bookmarkEnd w:id="249"/>
+    <w:bookmarkStart w:id="251" w:name="ref-kidwell_tomasovych_2013"/>
     <w:p>
       <w:pPr>
         <w:pStyle w:val="Bibliography"/>
@@ -6858,7 +6991,7 @@
       <w:r>
         <w:t xml:space="preserve"> </w:t>
       </w:r>
-      <w:hyperlink r:id="rId252">
+      <w:hyperlink r:id="rId250">
         <w:r>
           <w:rPr>
             <w:rStyle w:val="Hyperlink"/>
@@ -6870,125 +7003,125 @@
         <w:t xml:space="preserve">.</w:t>
       </w:r>
     </w:p>
+    <w:bookmarkEnd w:id="251"/>
+    <w:bookmarkStart w:id="252" w:name="ref-king_freer_1995"/>
+    <w:p>
+      <w:pPr>
+        <w:pStyle w:val="Bibliography"/>
+      </w:pPr>
+      <w:r>
+        <w:t xml:space="preserve">King, Adam, and Jennifer A. Freer. 1995. The</w:t>
+      </w:r>
+      <w:r>
+        <w:t xml:space="preserve"> </w:t>
+      </w:r>
+      <w:r>
+        <w:t xml:space="preserve">Mississippian</w:t>
+      </w:r>
+      <w:r>
+        <w:t xml:space="preserve"> </w:t>
+      </w:r>
+      <w:r>
+        <w:t xml:space="preserve">Southeast: A World-Systems Perspective. In</w:t>
+      </w:r>
+      <w:r>
+        <w:t xml:space="preserve"> </w:t>
+      </w:r>
+      <w:r>
+        <w:rPr>
+          <w:i/>
+          <w:iCs/>
+        </w:rPr>
+        <w:t xml:space="preserve">Native American Interactions: Multiscalar Analyses and Interpretations in the Eastern Woodlands</w:t>
+      </w:r>
+      <w:r>
+        <w:t xml:space="preserve">, edited by Michael S. Nassaney and Kenneth E. Sassaman, pp. 266–288. University of Tennessee Press, Knoxville.</w:t>
+      </w:r>
+    </w:p>
+    <w:bookmarkEnd w:id="252"/>
+    <w:bookmarkStart w:id="253" w:name="ref-lehner_grill_2013"/>
+    <w:p>
+      <w:pPr>
+        <w:pStyle w:val="Bibliography"/>
+      </w:pPr>
+      <w:r>
+        <w:t xml:space="preserve">Lehner, Bernhard, and Günther Grill. 2013. Global River Hydrography and Network Routing: Baseline Data and New Approaches to Study the World’s Large River Systems.</w:t>
+      </w:r>
+      <w:r>
+        <w:t xml:space="preserve"> </w:t>
+      </w:r>
+      <w:r>
+        <w:rPr>
+          <w:i/>
+          <w:iCs/>
+        </w:rPr>
+        <w:t xml:space="preserve">Hydrological Processes</w:t>
+      </w:r>
+      <w:r>
+        <w:t xml:space="preserve"> </w:t>
+      </w:r>
+      <w:r>
+        <w:t xml:space="preserve">27(15):2171–2186.</w:t>
+      </w:r>
+    </w:p>
     <w:bookmarkEnd w:id="253"/>
-    <w:bookmarkStart w:id="254" w:name="ref-king_freer_1995"/>
+    <w:bookmarkStart w:id="254" w:name="ref-lipo_2001"/>
     <w:p>
       <w:pPr>
         <w:pStyle w:val="Bibliography"/>
       </w:pPr>
       <w:r>
-        <w:t xml:space="preserve">King, Adam, and Jennifer A. Freer. 1995. The</w:t>
-      </w:r>
-      <w:r>
-        <w:t xml:space="preserve"> </w:t>
-      </w:r>
-      <w:r>
-        <w:t xml:space="preserve">Mississippian</w:t>
-      </w:r>
-      <w:r>
-        <w:t xml:space="preserve"> </w:t>
-      </w:r>
-      <w:r>
-        <w:t xml:space="preserve">Southeast: A World-Systems Perspective. In</w:t>
-      </w:r>
-      <w:r>
-        <w:t xml:space="preserve"> </w:t>
-      </w:r>
-      <w:r>
-        <w:rPr>
-          <w:i/>
-          <w:iCs/>
-        </w:rPr>
-        <w:t xml:space="preserve">Native American Interactions: Multiscalar Analyses and Interpretations in the Eastern Woodlands</w:t>
-      </w:r>
-      <w:r>
-        <w:t xml:space="preserve">, edited by Michael S. Nassaney and Kenneth E. Sassaman, pp. 266–288. University of Tennessee Press, Knoxville.</w:t>
+        <w:t xml:space="preserve">Lipo, Carl P. 2001.</w:t>
+      </w:r>
+      <w:r>
+        <w:t xml:space="preserve"> </w:t>
+      </w:r>
+      <w:r>
+        <w:rPr>
+          <w:i/>
+          <w:iCs/>
+        </w:rPr>
+        <w:t xml:space="preserve">Science, Style and the Study of Community Structure: An Example from the Central</w:t>
+      </w:r>
+      <w:r>
+        <w:rPr>
+          <w:i/>
+          <w:iCs/>
+        </w:rPr>
+        <w:t xml:space="preserve"> </w:t>
+      </w:r>
+      <w:r>
+        <w:rPr>
+          <w:i/>
+          <w:iCs/>
+        </w:rPr>
+        <w:t xml:space="preserve">Mississippi</w:t>
+      </w:r>
+      <w:r>
+        <w:rPr>
+          <w:i/>
+          <w:iCs/>
+        </w:rPr>
+        <w:t xml:space="preserve"> </w:t>
+      </w:r>
+      <w:r>
+        <w:rPr>
+          <w:i/>
+          <w:iCs/>
+        </w:rPr>
+        <w:t xml:space="preserve">River Valley</w:t>
+      </w:r>
+      <w:r>
+        <w:t xml:space="preserve">. BAR International Series 918. Archaeopress, Oxford.</w:t>
       </w:r>
     </w:p>
     <w:bookmarkEnd w:id="254"/>
-    <w:bookmarkStart w:id="255" w:name="ref-lehner_grill_2013"/>
+    <w:bookmarkStart w:id="256" w:name="ref-lipo_dinapoli_madsen_hunt_2021"/>
     <w:p>
       <w:pPr>
         <w:pStyle w:val="Bibliography"/>
       </w:pPr>
       <w:r>
-        <w:t xml:space="preserve">Lehner, Bernhard, and Günther Grill. 2013. Global River Hydrography and Network Routing: Baseline Data and New Approaches to Study the World’s Large River Systems.</w:t>
-      </w:r>
-      <w:r>
-        <w:t xml:space="preserve"> </w:t>
-      </w:r>
-      <w:r>
-        <w:rPr>
-          <w:i/>
-          <w:iCs/>
-        </w:rPr>
-        <w:t xml:space="preserve">Hydrological Processes</w:t>
-      </w:r>
-      <w:r>
-        <w:t xml:space="preserve"> </w:t>
-      </w:r>
-      <w:r>
-        <w:t xml:space="preserve">27(15):2171–2186.</w:t>
-      </w:r>
-    </w:p>
-    <w:bookmarkEnd w:id="255"/>
-    <w:bookmarkStart w:id="256" w:name="ref-lipo_2001"/>
-    <w:p>
-      <w:pPr>
-        <w:pStyle w:val="Bibliography"/>
-      </w:pPr>
-      <w:r>
-        <w:t xml:space="preserve">Lipo, Carl P. 2001.</w:t>
-      </w:r>
-      <w:r>
-        <w:t xml:space="preserve"> </w:t>
-      </w:r>
-      <w:r>
-        <w:rPr>
-          <w:i/>
-          <w:iCs/>
-        </w:rPr>
-        <w:t xml:space="preserve">Science, Style and the Study of Community Structure: An Example from the Central</w:t>
-      </w:r>
-      <w:r>
-        <w:rPr>
-          <w:i/>
-          <w:iCs/>
-        </w:rPr>
-        <w:t xml:space="preserve"> </w:t>
-      </w:r>
-      <w:r>
-        <w:rPr>
-          <w:i/>
-          <w:iCs/>
-        </w:rPr>
-        <w:t xml:space="preserve">Mississippi</w:t>
-      </w:r>
-      <w:r>
-        <w:rPr>
-          <w:i/>
-          <w:iCs/>
-        </w:rPr>
-        <w:t xml:space="preserve"> </w:t>
-      </w:r>
-      <w:r>
-        <w:rPr>
-          <w:i/>
-          <w:iCs/>
-        </w:rPr>
-        <w:t xml:space="preserve">River Valley</w:t>
-      </w:r>
-      <w:r>
-        <w:t xml:space="preserve">. BAR International Series 918. Archaeopress, Oxford.</w:t>
-      </w:r>
-    </w:p>
-    <w:bookmarkEnd w:id="256"/>
-    <w:bookmarkStart w:id="258" w:name="ref-lipo_dinapoli_madsen_hunt_2021"/>
-    <w:p>
-      <w:pPr>
-        <w:pStyle w:val="Bibliography"/>
-      </w:pPr>
-      <w:r>
         <w:t xml:space="preserve">Lipo, Carl P., Robert J. DiNapoli, Mark E. Madsen, and Terry L. Hunt. 2021. Population Structure Drives Cultural Diversity in Finite Populations: A Hypothesis for Localized Community Patterns on Rapa Nui (Easter Island, Chile).</w:t>
       </w:r>
       <w:r>
@@ -7010,7 +7143,7 @@
       <w:r>
         <w:t xml:space="preserve"> </w:t>
       </w:r>
-      <w:hyperlink r:id="rId257">
+      <w:hyperlink r:id="rId255">
         <w:r>
           <w:rPr>
             <w:rStyle w:val="Hyperlink"/>
@@ -7022,111 +7155,111 @@
         <w:t xml:space="preserve">.</w:t>
       </w:r>
     </w:p>
+    <w:bookmarkEnd w:id="256"/>
+    <w:bookmarkStart w:id="257" w:name="ref-lipo_dunnell_2007"/>
+    <w:p>
+      <w:pPr>
+        <w:pStyle w:val="Bibliography"/>
+      </w:pPr>
+      <w:r>
+        <w:t xml:space="preserve">Lipo, Carl P., and Robert C. Dunnell. 2007. Prehistoric Settlement in the Lower</w:t>
+      </w:r>
+      <w:r>
+        <w:t xml:space="preserve"> </w:t>
+      </w:r>
+      <w:r>
+        <w:t xml:space="preserve">Mississippi</w:t>
+      </w:r>
+      <w:r>
+        <w:t xml:space="preserve"> </w:t>
+      </w:r>
+      <w:r>
+        <w:t xml:space="preserve">Valley: A Critical Review. In</w:t>
+      </w:r>
+      <w:r>
+        <w:t xml:space="preserve"> </w:t>
+      </w:r>
+      <w:r>
+        <w:rPr>
+          <w:i/>
+          <w:iCs/>
+        </w:rPr>
+        <w:t xml:space="preserve">Time’s River: Archaeological Syntheses from the Lower</w:t>
+      </w:r>
+      <w:r>
+        <w:rPr>
+          <w:i/>
+          <w:iCs/>
+        </w:rPr>
+        <w:t xml:space="preserve"> </w:t>
+      </w:r>
+      <w:r>
+        <w:rPr>
+          <w:i/>
+          <w:iCs/>
+        </w:rPr>
+        <w:t xml:space="preserve">Mississippi</w:t>
+      </w:r>
+      <w:r>
+        <w:rPr>
+          <w:i/>
+          <w:iCs/>
+        </w:rPr>
+        <w:t xml:space="preserve"> </w:t>
+      </w:r>
+      <w:r>
+        <w:rPr>
+          <w:i/>
+          <w:iCs/>
+        </w:rPr>
+        <w:t xml:space="preserve">Valley</w:t>
+      </w:r>
+      <w:r>
+        <w:t xml:space="preserve">, edited by Janet Rafferty and Evan Peacock, pp. 125–167. University of Alabama Press, Tuscaloosa.</w:t>
+      </w:r>
+    </w:p>
+    <w:bookmarkEnd w:id="257"/>
+    <w:bookmarkStart w:id="258" w:name="ref-lipo_madsen_2001"/>
+    <w:p>
+      <w:pPr>
+        <w:pStyle w:val="Bibliography"/>
+      </w:pPr>
+      <w:r>
+        <w:t xml:space="preserve">Lipo, Carl P., and Mark E. Madsen. 2001. Neutrality,</w:t>
+      </w:r>
+      <w:r>
+        <w:t xml:space="preserve"> </w:t>
+      </w:r>
+      <w:r>
+        <w:t xml:space="preserve">“Style,”</w:t>
+      </w:r>
+      <w:r>
+        <w:t xml:space="preserve"> </w:t>
+      </w:r>
+      <w:r>
+        <w:t xml:space="preserve">and Drift: Building Methods for Studying Cultural Transmission in the Archaeological Record. In</w:t>
+      </w:r>
+      <w:r>
+        <w:t xml:space="preserve"> </w:t>
+      </w:r>
+      <w:r>
+        <w:rPr>
+          <w:i/>
+          <w:iCs/>
+        </w:rPr>
+        <w:t xml:space="preserve">Style and Function: Conceptual Issues in Evolutionary Archaeology</w:t>
+      </w:r>
+      <w:r>
+        <w:t xml:space="preserve">, edited by Teresa D. Hurt and Gordon F. M. Rakita, pp. 91–118. Bergin &amp; Garvey, Westport, Connecticut.</w:t>
+      </w:r>
+    </w:p>
     <w:bookmarkEnd w:id="258"/>
-    <w:bookmarkStart w:id="259" w:name="ref-lipo_dunnell_2007"/>
+    <w:bookmarkStart w:id="260" w:name="ref-lipo_madsen_dunnell_2015"/>
     <w:p>
       <w:pPr>
         <w:pStyle w:val="Bibliography"/>
       </w:pPr>
       <w:r>
-        <w:t xml:space="preserve">Lipo, Carl P., and Robert C. Dunnell. 2007. Prehistoric Settlement in the Lower</w:t>
-      </w:r>
-      <w:r>
-        <w:t xml:space="preserve"> </w:t>
-      </w:r>
-      <w:r>
-        <w:t xml:space="preserve">Mississippi</w:t>
-      </w:r>
-      <w:r>
-        <w:t xml:space="preserve"> </w:t>
-      </w:r>
-      <w:r>
-        <w:t xml:space="preserve">Valley: A Critical Review. In</w:t>
-      </w:r>
-      <w:r>
-        <w:t xml:space="preserve"> </w:t>
-      </w:r>
-      <w:r>
-        <w:rPr>
-          <w:i/>
-          <w:iCs/>
-        </w:rPr>
-        <w:t xml:space="preserve">Time’s River: Archaeological Syntheses from the Lower</w:t>
-      </w:r>
-      <w:r>
-        <w:rPr>
-          <w:i/>
-          <w:iCs/>
-        </w:rPr>
-        <w:t xml:space="preserve"> </w:t>
-      </w:r>
-      <w:r>
-        <w:rPr>
-          <w:i/>
-          <w:iCs/>
-        </w:rPr>
-        <w:t xml:space="preserve">Mississippi</w:t>
-      </w:r>
-      <w:r>
-        <w:rPr>
-          <w:i/>
-          <w:iCs/>
-        </w:rPr>
-        <w:t xml:space="preserve"> </w:t>
-      </w:r>
-      <w:r>
-        <w:rPr>
-          <w:i/>
-          <w:iCs/>
-        </w:rPr>
-        <w:t xml:space="preserve">Valley</w:t>
-      </w:r>
-      <w:r>
-        <w:t xml:space="preserve">, edited by Janet Rafferty and Evan Peacock, pp. 125–167. University of Alabama Press, Tuscaloosa.</w:t>
-      </w:r>
-    </w:p>
-    <w:bookmarkEnd w:id="259"/>
-    <w:bookmarkStart w:id="260" w:name="ref-lipo_madsen_2001"/>
-    <w:p>
-      <w:pPr>
-        <w:pStyle w:val="Bibliography"/>
-      </w:pPr>
-      <w:r>
-        <w:t xml:space="preserve">Lipo, Carl P., and Mark E. Madsen. 2001. Neutrality,</w:t>
-      </w:r>
-      <w:r>
-        <w:t xml:space="preserve"> </w:t>
-      </w:r>
-      <w:r>
-        <w:t xml:space="preserve">“Style,”</w:t>
-      </w:r>
-      <w:r>
-        <w:t xml:space="preserve"> </w:t>
-      </w:r>
-      <w:r>
-        <w:t xml:space="preserve">and Drift: Building Methods for Studying Cultural Transmission in the Archaeological Record. In</w:t>
-      </w:r>
-      <w:r>
-        <w:t xml:space="preserve"> </w:t>
-      </w:r>
-      <w:r>
-        <w:rPr>
-          <w:i/>
-          <w:iCs/>
-        </w:rPr>
-        <w:t xml:space="preserve">Style and Function: Conceptual Issues in Evolutionary Archaeology</w:t>
-      </w:r>
-      <w:r>
-        <w:t xml:space="preserve">, edited by Teresa D. Hurt and Gordon F. M. Rakita, pp. 91–118. Bergin &amp; Garvey, Westport, Connecticut.</w:t>
-      </w:r>
-    </w:p>
-    <w:bookmarkEnd w:id="260"/>
-    <w:bookmarkStart w:id="262" w:name="ref-lipo_madsen_dunnell_2015"/>
-    <w:p>
-      <w:pPr>
-        <w:pStyle w:val="Bibliography"/>
-      </w:pPr>
-      <w:r>
         <w:t xml:space="preserve">Lipo, Carl P., Mark E. Madsen, and Robert C. Dunnell. 2015. A Theoretically-Sufficient and Computationally-Practical Technique for Deterministic Frequency Seriation.</w:t>
       </w:r>
       <w:r>
@@ -7148,7 +7281,7 @@
       <w:r>
         <w:t xml:space="preserve"> </w:t>
       </w:r>
-      <w:hyperlink r:id="rId261">
+      <w:hyperlink r:id="rId259">
         <w:r>
           <w:rPr>
             <w:rStyle w:val="Hyperlink"/>
@@ -7160,8 +7293,8 @@
         <w:t xml:space="preserve">.</w:t>
       </w:r>
     </w:p>
-    <w:bookmarkEnd w:id="262"/>
-    <w:bookmarkStart w:id="264" w:name="ref-lipo_madsen_dunnell_hunt_1997"/>
+    <w:bookmarkEnd w:id="260"/>
+    <w:bookmarkStart w:id="262" w:name="ref-lipo_madsen_dunnell_hunt_1997"/>
     <w:p>
       <w:pPr>
         <w:pStyle w:val="Bibliography"/>
@@ -7188,7 +7321,7 @@
       <w:r>
         <w:t xml:space="preserve"> </w:t>
       </w:r>
-      <w:hyperlink r:id="rId263">
+      <w:hyperlink r:id="rId261">
         <w:r>
           <w:rPr>
             <w:rStyle w:val="Hyperlink"/>
@@ -7200,379 +7333,258 @@
         <w:t xml:space="preserve">.</w:t>
       </w:r>
     </w:p>
+    <w:bookmarkEnd w:id="262"/>
+    <w:bookmarkStart w:id="263" w:name="ref-madsen_2012"/>
+    <w:p>
+      <w:pPr>
+        <w:pStyle w:val="Bibliography"/>
+      </w:pPr>
+      <w:r>
+        <w:t xml:space="preserve">Madsen, Mark E. 2012. Neutral Cultural Transmission in Time-Averaged Archaeological Assemblages. arXiv preprint arXiv:1204.2043 [physics.soc-ph].</w:t>
+      </w:r>
+    </w:p>
+    <w:bookmarkEnd w:id="263"/>
+    <w:bookmarkStart w:id="264" w:name="ref-mainfort_1996"/>
+    <w:p>
+      <w:pPr>
+        <w:pStyle w:val="Bibliography"/>
+      </w:pPr>
+      <w:r>
+        <w:t xml:space="preserve">Mainfort, Jr., Robert C. 1996. Late Period Chronology in the Central</w:t>
+      </w:r>
+      <w:r>
+        <w:t xml:space="preserve"> </w:t>
+      </w:r>
+      <w:r>
+        <w:t xml:space="preserve">Mississippi</w:t>
+      </w:r>
+      <w:r>
+        <w:t xml:space="preserve"> </w:t>
+      </w:r>
+      <w:r>
+        <w:t xml:space="preserve">Valley: A Western</w:t>
+      </w:r>
+      <w:r>
+        <w:t xml:space="preserve"> </w:t>
+      </w:r>
+      <w:r>
+        <w:t xml:space="preserve">Tennessee</w:t>
+      </w:r>
+      <w:r>
+        <w:t xml:space="preserve"> </w:t>
+      </w:r>
+      <w:r>
+        <w:t xml:space="preserve">Perspective.</w:t>
+      </w:r>
+      <w:r>
+        <w:t xml:space="preserve"> </w:t>
+      </w:r>
+      <w:r>
+        <w:rPr>
+          <w:i/>
+          <w:iCs/>
+        </w:rPr>
+        <w:t xml:space="preserve">Southeastern Archaeology</w:t>
+      </w:r>
+      <w:r>
+        <w:t xml:space="preserve"> </w:t>
+      </w:r>
+      <w:r>
+        <w:t xml:space="preserve">15(2):172–181.</w:t>
+      </w:r>
+    </w:p>
     <w:bookmarkEnd w:id="264"/>
-    <w:bookmarkStart w:id="266" w:name="ref-holland-lulewicz_2019"/>
+    <w:bookmarkStart w:id="265" w:name="ref-mainfort_2001"/>
     <w:p>
       <w:pPr>
         <w:pStyle w:val="Bibliography"/>
       </w:pPr>
       <w:r>
-        <w:t xml:space="preserve">Lulewicz, Jacob. 2019. The Social Networks and Structural Variation of</w:t>
-      </w:r>
-      <w:r>
-        <w:t xml:space="preserve"> </w:t>
-      </w:r>
-      <w:r>
-        <w:t xml:space="preserve">Mississippian</w:t>
-      </w:r>
-      <w:r>
-        <w:t xml:space="preserve"> </w:t>
-      </w:r>
-      <w:r>
-        <w:t xml:space="preserve">Sociopolitics in the Southeastern</w:t>
-      </w:r>
-      <w:r>
-        <w:t xml:space="preserve"> </w:t>
-      </w:r>
-      <w:r>
-        <w:t xml:space="preserve">United</w:t>
-      </w:r>
-      <w:r>
-        <w:t xml:space="preserve"> </w:t>
-      </w:r>
-      <w:r>
-        <w:t xml:space="preserve">States</w:t>
-      </w:r>
-      <w:r>
-        <w:t xml:space="preserve">.</w:t>
-      </w:r>
-      <w:r>
-        <w:t xml:space="preserve"> </w:t>
-      </w:r>
-      <w:r>
-        <w:rPr>
-          <w:i/>
-          <w:iCs/>
-        </w:rPr>
-        <w:t xml:space="preserve">Proceedings of the National Academy of Sciences</w:t>
-      </w:r>
-      <w:r>
-        <w:t xml:space="preserve"> </w:t>
-      </w:r>
-      <w:r>
-        <w:t xml:space="preserve">116(14):6707–6712.</w:t>
-      </w:r>
-      <w:r>
-        <w:t xml:space="preserve"> </w:t>
-      </w:r>
-      <w:hyperlink r:id="rId265">
-        <w:r>
-          <w:rPr>
-            <w:rStyle w:val="Hyperlink"/>
-          </w:rPr>
-          <w:t xml:space="preserve">https://doi.org/10.1073/pnas.1818346116</w:t>
-        </w:r>
-      </w:hyperlink>
-      <w:r>
-        <w:t xml:space="preserve">.</w:t>
+        <w:t xml:space="preserve">Mainfort, Jr., Robert C. 2001. The Late Prehistoric and Protohistoric Periods in the Central</w:t>
+      </w:r>
+      <w:r>
+        <w:t xml:space="preserve"> </w:t>
+      </w:r>
+      <w:r>
+        <w:t xml:space="preserve">Mississippi</w:t>
+      </w:r>
+      <w:r>
+        <w:t xml:space="preserve"> </w:t>
+      </w:r>
+      <w:r>
+        <w:t xml:space="preserve">Valley. In</w:t>
+      </w:r>
+      <w:r>
+        <w:t xml:space="preserve"> </w:t>
+      </w:r>
+      <w:r>
+        <w:rPr>
+          <w:i/>
+          <w:iCs/>
+        </w:rPr>
+        <w:t xml:space="preserve">Societies in Eclipse: Archaeology of the Eastern Woodlands Indians, a.d. 1400–1700</w:t>
+      </w:r>
+      <w:r>
+        <w:t xml:space="preserve">, edited by David S. Brose, C. Wesley Cowan, and Jr. Mainfort Robert C., pp. 173–190. Smithsonian Institution Press, Washington, DC.</w:t>
+      </w:r>
+    </w:p>
+    <w:bookmarkEnd w:id="265"/>
+    <w:bookmarkStart w:id="266" w:name="ref-mainfort_2003"/>
+    <w:p>
+      <w:pPr>
+        <w:pStyle w:val="Bibliography"/>
+      </w:pPr>
+      <w:r>
+        <w:t xml:space="preserve">Mainfort, Jr., Robert C. 2003. An Ordination Approach to Assessing Late Period Phases in the Central</w:t>
+      </w:r>
+      <w:r>
+        <w:t xml:space="preserve"> </w:t>
+      </w:r>
+      <w:r>
+        <w:t xml:space="preserve">Mississippi</w:t>
+      </w:r>
+      <w:r>
+        <w:t xml:space="preserve"> </w:t>
+      </w:r>
+      <w:r>
+        <w:t xml:space="preserve">Valley.</w:t>
+      </w:r>
+      <w:r>
+        <w:t xml:space="preserve"> </w:t>
+      </w:r>
+      <w:r>
+        <w:rPr>
+          <w:i/>
+          <w:iCs/>
+        </w:rPr>
+        <w:t xml:space="preserve">Southeastern Archaeology</w:t>
+      </w:r>
+      <w:r>
+        <w:t xml:space="preserve"> </w:t>
+      </w:r>
+      <w:r>
+        <w:t xml:space="preserve">22(2):176–184.</w:t>
       </w:r>
     </w:p>
     <w:bookmarkEnd w:id="266"/>
-    <w:bookmarkStart w:id="268" w:name="ref-lyman_2021"/>
+    <w:bookmarkStart w:id="267" w:name="ref-mayr_1959"/>
     <w:p>
       <w:pPr>
         <w:pStyle w:val="Bibliography"/>
       </w:pPr>
       <w:r>
-        <w:t xml:space="preserve">Lyman, R. Lee. 2021. On the Past and Future of Discussing, Teaching, and Learning the Hows and Whys of Archaeological Systematics.</w:t>
-      </w:r>
-      <w:r>
-        <w:t xml:space="preserve"> </w:t>
-      </w:r>
-      <w:r>
-        <w:rPr>
-          <w:i/>
-          <w:iCs/>
-        </w:rPr>
-        <w:t xml:space="preserve">Journal of Archaeological Science</w:t>
-      </w:r>
-      <w:r>
-        <w:t xml:space="preserve"> </w:t>
-      </w:r>
-      <w:r>
-        <w:t xml:space="preserve">131:105412.</w:t>
-      </w:r>
-      <w:r>
-        <w:t xml:space="preserve"> </w:t>
-      </w:r>
-      <w:hyperlink r:id="rId267">
-        <w:r>
-          <w:rPr>
-            <w:rStyle w:val="Hyperlink"/>
-          </w:rPr>
-          <w:t xml:space="preserve">https://doi.org/10.1016/j.jas.2021.105412</w:t>
-        </w:r>
-      </w:hyperlink>
-      <w:r>
-        <w:t xml:space="preserve">.</w:t>
+        <w:t xml:space="preserve">Mayr, Ernst. 1959. Typological Versus Population Thinking. In</w:t>
+      </w:r>
+      <w:r>
+        <w:t xml:space="preserve"> </w:t>
+      </w:r>
+      <w:r>
+        <w:rPr>
+          <w:i/>
+          <w:iCs/>
+        </w:rPr>
+        <w:t xml:space="preserve">Evolution and Anthropology: A Centennial Appraisal</w:t>
+      </w:r>
+      <w:r>
+        <w:t xml:space="preserve">, edited by Betty J. Meggers, pp. 409–412. The Anthropological Society of Washington, Washington, D.C.</w:t>
+      </w:r>
+    </w:p>
+    <w:bookmarkEnd w:id="267"/>
+    <w:bookmarkStart w:id="268" w:name="ref-mcnutt_1996"/>
+    <w:p>
+      <w:pPr>
+        <w:pStyle w:val="Bibliography"/>
+      </w:pPr>
+      <w:r>
+        <w:t xml:space="preserve">McNutt, Charles H. 1996. The Central</w:t>
+      </w:r>
+      <w:r>
+        <w:t xml:space="preserve"> </w:t>
+      </w:r>
+      <w:r>
+        <w:t xml:space="preserve">Mississippi</w:t>
+      </w:r>
+      <w:r>
+        <w:t xml:space="preserve"> </w:t>
+      </w:r>
+      <w:r>
+        <w:t xml:space="preserve">Valley: A Summary. In</w:t>
+      </w:r>
+      <w:r>
+        <w:t xml:space="preserve"> </w:t>
+      </w:r>
+      <w:r>
+        <w:rPr>
+          <w:i/>
+          <w:iCs/>
+        </w:rPr>
+        <w:t xml:space="preserve">Prehistory of the Central</w:t>
+      </w:r>
+      <w:r>
+        <w:rPr>
+          <w:i/>
+          <w:iCs/>
+        </w:rPr>
+        <w:t xml:space="preserve"> </w:t>
+      </w:r>
+      <w:r>
+        <w:rPr>
+          <w:i/>
+          <w:iCs/>
+        </w:rPr>
+        <w:t xml:space="preserve">Mississippi</w:t>
+      </w:r>
+      <w:r>
+        <w:rPr>
+          <w:i/>
+          <w:iCs/>
+        </w:rPr>
+        <w:t xml:space="preserve"> </w:t>
+      </w:r>
+      <w:r>
+        <w:rPr>
+          <w:i/>
+          <w:iCs/>
+        </w:rPr>
+        <w:t xml:space="preserve">Valley</w:t>
+      </w:r>
+      <w:r>
+        <w:t xml:space="preserve">, edited by Charles H. McNutt, pp. 187–. University of Alabama Press, Tuscaloosa.</w:t>
       </w:r>
     </w:p>
     <w:bookmarkEnd w:id="268"/>
-    <w:bookmarkStart w:id="269" w:name="ref-madsen_2012"/>
+    <w:bookmarkStart w:id="269" w:name="ref-mesoudi_2021"/>
     <w:p>
       <w:pPr>
         <w:pStyle w:val="Bibliography"/>
       </w:pPr>
       <w:r>
-        <w:t xml:space="preserve">Madsen, Mark E. 2012. Neutral Cultural Transmission in Time-Averaged Archaeological Assemblages. arXiv preprint arXiv:1204.2043 [physics.soc-ph].</w:t>
+        <w:t xml:space="preserve">Mesoudi, Alex. 2021. Cultural Selection and Biased Transformation: Two Dynamics of Cultural Evolution.</w:t>
+      </w:r>
+      <w:r>
+        <w:t xml:space="preserve"> </w:t>
+      </w:r>
+      <w:r>
+        <w:rPr>
+          <w:i/>
+          <w:iCs/>
+        </w:rPr>
+        <w:t xml:space="preserve">Philosophical Transactions of the Royal Society B: Biological Sciences</w:t>
+      </w:r>
+      <w:r>
+        <w:t xml:space="preserve"> </w:t>
+      </w:r>
+      <w:r>
+        <w:t xml:space="preserve">376:20200053.</w:t>
       </w:r>
     </w:p>
     <w:bookmarkEnd w:id="269"/>
-    <w:bookmarkStart w:id="270" w:name="ref-mainfort_1996"/>
+    <w:bookmarkStart w:id="271" w:name="ref-miller_atkins_premo_2018"/>
     <w:p>
       <w:pPr>
         <w:pStyle w:val="Bibliography"/>
       </w:pPr>
       <w:r>
-        <w:t xml:space="preserve">Mainfort, Jr., Robert C. 1996a. Late Period Chronology in the Central</w:t>
-      </w:r>
-      <w:r>
-        <w:t xml:space="preserve"> </w:t>
-      </w:r>
-      <w:r>
-        <w:t xml:space="preserve">Mississippi</w:t>
-      </w:r>
-      <w:r>
-        <w:t xml:space="preserve"> </w:t>
-      </w:r>
-      <w:r>
-        <w:t xml:space="preserve">Valley: A Western</w:t>
-      </w:r>
-      <w:r>
-        <w:t xml:space="preserve"> </w:t>
-      </w:r>
-      <w:r>
-        <w:t xml:space="preserve">Tennessee</w:t>
-      </w:r>
-      <w:r>
-        <w:t xml:space="preserve"> </w:t>
-      </w:r>
-      <w:r>
-        <w:t xml:space="preserve">Perspective.</w:t>
-      </w:r>
-      <w:r>
-        <w:t xml:space="preserve"> </w:t>
-      </w:r>
-      <w:r>
-        <w:rPr>
-          <w:i/>
-          <w:iCs/>
-        </w:rPr>
-        <w:t xml:space="preserve">Southeastern Archaeology</w:t>
-      </w:r>
-      <w:r>
-        <w:t xml:space="preserve"> </w:t>
-      </w:r>
-      <w:r>
-        <w:t xml:space="preserve">15(2):172–181.</w:t>
-      </w:r>
-    </w:p>
-    <w:bookmarkEnd w:id="270"/>
-    <w:bookmarkStart w:id="271" w:name="ref-mainfort_1996b"/>
-    <w:p>
-      <w:pPr>
-        <w:pStyle w:val="Bibliography"/>
-      </w:pPr>
-      <w:r>
-        <w:t xml:space="preserve">Mainfort, Jr., Robert C. 1996b. Late Period Chronology in the Central Mississippi Valley: A Western Tennessee Perspective.</w:t>
-      </w:r>
-      <w:r>
-        <w:t xml:space="preserve"> </w:t>
-      </w:r>
-      <w:r>
-        <w:rPr>
-          <w:i/>
-          <w:iCs/>
-        </w:rPr>
-        <w:t xml:space="preserve">Southeastern Archaeology</w:t>
-      </w:r>
-      <w:r>
-        <w:t xml:space="preserve"> </w:t>
-      </w:r>
-      <w:r>
-        <w:t xml:space="preserve">15(2):172–181.</w:t>
-      </w:r>
-    </w:p>
-    <w:bookmarkEnd w:id="271"/>
-    <w:bookmarkStart w:id="272" w:name="ref-mainfort_2001"/>
-    <w:p>
-      <w:pPr>
-        <w:pStyle w:val="Bibliography"/>
-      </w:pPr>
-      <w:r>
-        <w:t xml:space="preserve">Mainfort, Jr., Robert C. 2001. The Late Prehistoric and Protohistoric Periods in the Central</w:t>
-      </w:r>
-      <w:r>
-        <w:t xml:space="preserve"> </w:t>
-      </w:r>
-      <w:r>
-        <w:t xml:space="preserve">Mississippi</w:t>
-      </w:r>
-      <w:r>
-        <w:t xml:space="preserve"> </w:t>
-      </w:r>
-      <w:r>
-        <w:t xml:space="preserve">Valley. In</w:t>
-      </w:r>
-      <w:r>
-        <w:t xml:space="preserve"> </w:t>
-      </w:r>
-      <w:r>
-        <w:rPr>
-          <w:i/>
-          <w:iCs/>
-        </w:rPr>
-        <w:t xml:space="preserve">Societies in Eclipse: Archaeology of the Eastern Woodlands Indians, a.d. 1400–1700</w:t>
-      </w:r>
-      <w:r>
-        <w:t xml:space="preserve">, edited by David S. Brose, C. Wesley Cowan, and Jr. Mainfort Robert C., pp. 173–190. Smithsonian Institution Press, Washington, DC.</w:t>
-      </w:r>
-    </w:p>
-    <w:bookmarkEnd w:id="272"/>
-    <w:bookmarkStart w:id="273" w:name="ref-mainfort_2003"/>
-    <w:p>
-      <w:pPr>
-        <w:pStyle w:val="Bibliography"/>
-      </w:pPr>
-      <w:r>
-        <w:t xml:space="preserve">Mainfort, Jr., Robert C. 2003. An Ordination Approach to Assessing Late Period Phases in the Central</w:t>
-      </w:r>
-      <w:r>
-        <w:t xml:space="preserve"> </w:t>
-      </w:r>
-      <w:r>
-        <w:t xml:space="preserve">Mississippi</w:t>
-      </w:r>
-      <w:r>
-        <w:t xml:space="preserve"> </w:t>
-      </w:r>
-      <w:r>
-        <w:t xml:space="preserve">Valley.</w:t>
-      </w:r>
-      <w:r>
-        <w:t xml:space="preserve"> </w:t>
-      </w:r>
-      <w:r>
-        <w:rPr>
-          <w:i/>
-          <w:iCs/>
-        </w:rPr>
-        <w:t xml:space="preserve">Southeastern Archaeology</w:t>
-      </w:r>
-      <w:r>
-        <w:t xml:space="preserve"> </w:t>
-      </w:r>
-      <w:r>
-        <w:t xml:space="preserve">22(2):176–184.</w:t>
-      </w:r>
-    </w:p>
-    <w:bookmarkEnd w:id="273"/>
-    <w:bookmarkStart w:id="274" w:name="ref-mayr_1959"/>
-    <w:p>
-      <w:pPr>
-        <w:pStyle w:val="Bibliography"/>
-      </w:pPr>
-      <w:r>
-        <w:t xml:space="preserve">Mayr, Ernst. 1959. Typological Versus Population Thinking. In</w:t>
-      </w:r>
-      <w:r>
-        <w:t xml:space="preserve"> </w:t>
-      </w:r>
-      <w:r>
-        <w:rPr>
-          <w:i/>
-          <w:iCs/>
-        </w:rPr>
-        <w:t xml:space="preserve">Evolution and Anthropology: A Centennial Appraisal</w:t>
-      </w:r>
-      <w:r>
-        <w:t xml:space="preserve">, edited by Betty J. Meggers, pp. 409–412. The Anthropological Society of Washington, Washington, D.C.</w:t>
-      </w:r>
-    </w:p>
-    <w:bookmarkEnd w:id="274"/>
-    <w:bookmarkStart w:id="275" w:name="ref-mcnutt_ed_1996"/>
-    <w:p>
-      <w:pPr>
-        <w:pStyle w:val="Bibliography"/>
-      </w:pPr>
-      <w:r>
-        <w:t xml:space="preserve">McNutt, Charles H. (editor). 1996.</w:t>
-      </w:r>
-      <w:r>
-        <w:t xml:space="preserve"> </w:t>
-      </w:r>
-      <w:r>
-        <w:rPr>
-          <w:i/>
-          <w:iCs/>
-        </w:rPr>
-        <w:t xml:space="preserve">Prehistory of the Central</w:t>
-      </w:r>
-      <w:r>
-        <w:rPr>
-          <w:i/>
-          <w:iCs/>
-        </w:rPr>
-        <w:t xml:space="preserve"> </w:t>
-      </w:r>
-      <w:r>
-        <w:rPr>
-          <w:i/>
-          <w:iCs/>
-        </w:rPr>
-        <w:t xml:space="preserve">Mississippi</w:t>
-      </w:r>
-      <w:r>
-        <w:rPr>
-          <w:i/>
-          <w:iCs/>
-        </w:rPr>
-        <w:t xml:space="preserve"> </w:t>
-      </w:r>
-      <w:r>
-        <w:rPr>
-          <w:i/>
-          <w:iCs/>
-        </w:rPr>
-        <w:t xml:space="preserve">Valley</w:t>
-      </w:r>
-      <w:r>
-        <w:t xml:space="preserve">. University of Alabama Press, Tuscaloosa.</w:t>
-      </w:r>
-    </w:p>
-    <w:bookmarkEnd w:id="275"/>
-    <w:bookmarkStart w:id="276" w:name="ref-mesoudi_2021"/>
-    <w:p>
-      <w:pPr>
-        <w:pStyle w:val="Bibliography"/>
-      </w:pPr>
-      <w:r>
-        <w:t xml:space="preserve">Mesoudi, Alex. 2021. Cultural Selection and Biased Transformation: Two Dynamics of Cultural Evolution.</w:t>
-      </w:r>
-      <w:r>
-        <w:t xml:space="preserve"> </w:t>
-      </w:r>
-      <w:r>
-        <w:rPr>
-          <w:i/>
-          <w:iCs/>
-        </w:rPr>
-        <w:t xml:space="preserve">Philosophical Transactions of the Royal Society B: Biological Sciences</w:t>
-      </w:r>
-      <w:r>
-        <w:t xml:space="preserve"> </w:t>
-      </w:r>
-      <w:r>
-        <w:t xml:space="preserve">376:20200053.</w:t>
-      </w:r>
-    </w:p>
-    <w:bookmarkEnd w:id="276"/>
-    <w:bookmarkStart w:id="278" w:name="ref-miller_atkins_premo_2018"/>
-    <w:p>
-      <w:pPr>
-        <w:pStyle w:val="Bibliography"/>
-      </w:pPr>
-      <w:r>
         <w:t xml:space="preserve">Miller-Atkins, Galen, and L. S. Premo. 2018. Time-Averaging and the Spatial Scale of Regional Cultural Differentiation in Archaeological Assemblages.</w:t>
       </w:r>
       <w:r>
@@ -7594,7 +7606,7 @@
       <w:r>
         <w:t xml:space="preserve"> </w:t>
       </w:r>
-      <w:hyperlink r:id="rId277">
+      <w:hyperlink r:id="rId270">
         <w:r>
           <w:rPr>
             <w:rStyle w:val="Hyperlink"/>
@@ -7606,410 +7618,423 @@
         <w:t xml:space="preserve">.</w:t>
       </w:r>
     </w:p>
-    <w:bookmarkEnd w:id="278"/>
-    <w:bookmarkStart w:id="279" w:name="ref-milner_1998"/>
+    <w:bookmarkEnd w:id="271"/>
+    <w:bookmarkStart w:id="272" w:name="ref-mitchem_2001"/>
     <w:p>
       <w:pPr>
         <w:pStyle w:val="Bibliography"/>
       </w:pPr>
       <w:r>
-        <w:t xml:space="preserve">Milner, George R. 1998.</w:t>
-      </w:r>
-      <w:r>
-        <w:t xml:space="preserve"> </w:t>
-      </w:r>
-      <w:r>
-        <w:rPr>
-          <w:i/>
-          <w:iCs/>
-        </w:rPr>
-        <w:t xml:space="preserve">The</w:t>
-      </w:r>
-      <w:r>
-        <w:rPr>
-          <w:i/>
-          <w:iCs/>
-        </w:rPr>
-        <w:t xml:space="preserve"> </w:t>
-      </w:r>
-      <w:r>
-        <w:rPr>
-          <w:i/>
-          <w:iCs/>
-        </w:rPr>
-        <w:t xml:space="preserve">Cahokia</w:t>
-      </w:r>
-      <w:r>
-        <w:rPr>
-          <w:i/>
-          <w:iCs/>
-        </w:rPr>
-        <w:t xml:space="preserve"> </w:t>
-      </w:r>
-      <w:r>
-        <w:rPr>
-          <w:i/>
-          <w:iCs/>
-        </w:rPr>
-        <w:t xml:space="preserve">Chiefdom: The Archaeology of a</w:t>
-      </w:r>
-      <w:r>
-        <w:rPr>
-          <w:i/>
-          <w:iCs/>
-        </w:rPr>
-        <w:t xml:space="preserve"> </w:t>
-      </w:r>
-      <w:r>
-        <w:rPr>
-          <w:i/>
-          <w:iCs/>
-        </w:rPr>
-        <w:t xml:space="preserve">Mississippian</w:t>
-      </w:r>
-      <w:r>
-        <w:rPr>
-          <w:i/>
-          <w:iCs/>
-        </w:rPr>
-        <w:t xml:space="preserve"> </w:t>
-      </w:r>
-      <w:r>
-        <w:rPr>
-          <w:i/>
-          <w:iCs/>
-        </w:rPr>
-        <w:t xml:space="preserve">Society</w:t>
-      </w:r>
-      <w:r>
-        <w:t xml:space="preserve">. Smithsonian Institution Press, Washington, D.C.</w:t>
+        <w:t xml:space="preserve">Mitchem, Jeffrey M. 2001. A Decade of Hypothesis Testing at the</w:t>
+      </w:r>
+      <w:r>
+        <w:t xml:space="preserve"> </w:t>
+      </w:r>
+      <w:r>
+        <w:t xml:space="preserve">Parkin</w:t>
+      </w:r>
+      <w:r>
+        <w:t xml:space="preserve"> </w:t>
+      </w:r>
+      <w:r>
+        <w:t xml:space="preserve">Site,</w:t>
+      </w:r>
+      <w:r>
+        <w:t xml:space="preserve"> </w:t>
+      </w:r>
+      <w:r>
+        <w:t xml:space="preserve">Arkansas</w:t>
+      </w:r>
+      <w:r>
+        <w:t xml:space="preserve">.</w:t>
+      </w:r>
+    </w:p>
+    <w:bookmarkEnd w:id="272"/>
+    <w:bookmarkStart w:id="273" w:name="ref-mitchem_2017"/>
+    <w:p>
+      <w:pPr>
+        <w:pStyle w:val="Bibliography"/>
+      </w:pPr>
+      <w:r>
+        <w:t xml:space="preserve">Mitchem, Jeffrey M., David W. Stahle, Timothy S. Mulvihill, and Jami J. Lockhart. 2017. Making the Case for the</w:t>
+      </w:r>
+      <w:r>
+        <w:t xml:space="preserve"> </w:t>
+      </w:r>
+      <w:r>
+        <w:t xml:space="preserve">Parkin</w:t>
+      </w:r>
+      <w:r>
+        <w:t xml:space="preserve"> </w:t>
+      </w:r>
+      <w:r>
+        <w:t xml:space="preserve">Site as</w:t>
+      </w:r>
+      <w:r>
+        <w:t xml:space="preserve"> </w:t>
+      </w:r>
+      <w:r>
+        <w:t xml:space="preserve">Casqui</w:t>
+      </w:r>
+      <w:r>
+        <w:t xml:space="preserve">:</w:t>
+      </w:r>
+      <w:r>
+        <w:t xml:space="preserve"> </w:t>
+      </w:r>
+      <w:r>
+        <w:t xml:space="preserve">Hernando</w:t>
+      </w:r>
+      <w:r>
+        <w:t xml:space="preserve"> </w:t>
+      </w:r>
+      <w:r>
+        <w:t xml:space="preserve">de</w:t>
+      </w:r>
+      <w:r>
+        <w:t xml:space="preserve"> </w:t>
+      </w:r>
+      <w:r>
+        <w:t xml:space="preserve">Soto</w:t>
+      </w:r>
+      <w:r>
+        <w:t xml:space="preserve">’s 1541 Cross.</w:t>
+      </w:r>
+    </w:p>
+    <w:bookmarkEnd w:id="273"/>
+    <w:bookmarkStart w:id="274" w:name="ref-morse_d_1990"/>
+    <w:p>
+      <w:pPr>
+        <w:pStyle w:val="Bibliography"/>
+      </w:pPr>
+      <w:r>
+        <w:t xml:space="preserve">Morse, Dan F. 1990. The</w:t>
+      </w:r>
+      <w:r>
+        <w:t xml:space="preserve"> </w:t>
+      </w:r>
+      <w:r>
+        <w:t xml:space="preserve">Nodena</w:t>
+      </w:r>
+      <w:r>
+        <w:t xml:space="preserve"> </w:t>
+      </w:r>
+      <w:r>
+        <w:t xml:space="preserve">Phase. In</w:t>
+      </w:r>
+      <w:r>
+        <w:t xml:space="preserve"> </w:t>
+      </w:r>
+      <w:r>
+        <w:rPr>
+          <w:i/>
+          <w:iCs/>
+        </w:rPr>
+        <w:t xml:space="preserve">Towns and Temples Along the</w:t>
+      </w:r>
+      <w:r>
+        <w:rPr>
+          <w:i/>
+          <w:iCs/>
+        </w:rPr>
+        <w:t xml:space="preserve"> </w:t>
+      </w:r>
+      <w:r>
+        <w:rPr>
+          <w:i/>
+          <w:iCs/>
+        </w:rPr>
+        <w:t xml:space="preserve">Mississippi</w:t>
+      </w:r>
+      <w:r>
+        <w:t xml:space="preserve">, edited by David H. Dye and Cheryl Anne Cox, pp. 69–97. University of Alabama Press, Tuscaloosa.</w:t>
+      </w:r>
+    </w:p>
+    <w:bookmarkEnd w:id="274"/>
+    <w:bookmarkStart w:id="275" w:name="ref-morse_morse_1996"/>
+    <w:p>
+      <w:pPr>
+        <w:pStyle w:val="Bibliography"/>
+      </w:pPr>
+      <w:r>
+        <w:t xml:space="preserve">Morse, Dan F., and Phyllis A. Morse. 1996. Changes in Interpretation in the Archaeology of the Central</w:t>
+      </w:r>
+      <w:r>
+        <w:t xml:space="preserve"> </w:t>
+      </w:r>
+      <w:r>
+        <w:t xml:space="preserve">Mississippi</w:t>
+      </w:r>
+      <w:r>
+        <w:t xml:space="preserve"> </w:t>
+      </w:r>
+      <w:r>
+        <w:t xml:space="preserve">Valley Since 1983.</w:t>
+      </w:r>
+      <w:r>
+        <w:t xml:space="preserve"> </w:t>
+      </w:r>
+      <w:r>
+        <w:rPr>
+          <w:i/>
+          <w:iCs/>
+        </w:rPr>
+        <w:t xml:space="preserve">North American Archaeologist</w:t>
+      </w:r>
+      <w:r>
+        <w:t xml:space="preserve"> </w:t>
+      </w:r>
+      <w:r>
+        <w:t xml:space="preserve">17(1):1–35.</w:t>
+      </w:r>
+    </w:p>
+    <w:bookmarkEnd w:id="275"/>
+    <w:bookmarkStart w:id="276" w:name="ref-morse_p_1981"/>
+    <w:p>
+      <w:pPr>
+        <w:pStyle w:val="Bibliography"/>
+      </w:pPr>
+      <w:r>
+        <w:t xml:space="preserve">Morse, Phyllis A. 1981.</w:t>
+      </w:r>
+      <w:r>
+        <w:t xml:space="preserve"> </w:t>
+      </w:r>
+      <w:r>
+        <w:rPr>
+          <w:i/>
+          <w:iCs/>
+        </w:rPr>
+        <w:t xml:space="preserve">Parkin: The 1978–1979 Archeological Investigations of a</w:t>
+      </w:r>
+      <w:r>
+        <w:rPr>
+          <w:i/>
+          <w:iCs/>
+        </w:rPr>
+        <w:t xml:space="preserve"> </w:t>
+      </w:r>
+      <w:r>
+        <w:rPr>
+          <w:i/>
+          <w:iCs/>
+        </w:rPr>
+        <w:t xml:space="preserve">Cross County</w:t>
+      </w:r>
+      <w:r>
+        <w:rPr>
+          <w:i/>
+          <w:iCs/>
+        </w:rPr>
+        <w:t xml:space="preserve">,</w:t>
+      </w:r>
+      <w:r>
+        <w:rPr>
+          <w:i/>
+          <w:iCs/>
+        </w:rPr>
+        <w:t xml:space="preserve"> </w:t>
+      </w:r>
+      <w:r>
+        <w:rPr>
+          <w:i/>
+          <w:iCs/>
+        </w:rPr>
+        <w:t xml:space="preserve">Arkansas</w:t>
+      </w:r>
+      <w:r>
+        <w:rPr>
+          <w:i/>
+          <w:iCs/>
+        </w:rPr>
+        <w:t xml:space="preserve"> </w:t>
+      </w:r>
+      <w:r>
+        <w:rPr>
+          <w:i/>
+          <w:iCs/>
+        </w:rPr>
+        <w:t xml:space="preserve">Site</w:t>
+      </w:r>
+      <w:r>
+        <w:t xml:space="preserve">. Arkansas Archeological Survey Research Series 13. Arkansas Archeological Survey, Fayetteville.</w:t>
+      </w:r>
+    </w:p>
+    <w:bookmarkEnd w:id="276"/>
+    <w:bookmarkStart w:id="277" w:name="ref-morse_1990"/>
+    <w:p>
+      <w:pPr>
+        <w:pStyle w:val="Bibliography"/>
+      </w:pPr>
+      <w:r>
+        <w:t xml:space="preserve">Morse, Phyllis A. 1990. The</w:t>
+      </w:r>
+      <w:r>
+        <w:t xml:space="preserve"> </w:t>
+      </w:r>
+      <w:r>
+        <w:t xml:space="preserve">Parkin</w:t>
+      </w:r>
+      <w:r>
+        <w:t xml:space="preserve"> </w:t>
+      </w:r>
+      <w:r>
+        <w:t xml:space="preserve">Site and the</w:t>
+      </w:r>
+      <w:r>
+        <w:t xml:space="preserve"> </w:t>
+      </w:r>
+      <w:r>
+        <w:t xml:space="preserve">Parkin</w:t>
+      </w:r>
+      <w:r>
+        <w:t xml:space="preserve"> </w:t>
+      </w:r>
+      <w:r>
+        <w:t xml:space="preserve">Phase. In</w:t>
+      </w:r>
+      <w:r>
+        <w:t xml:space="preserve"> </w:t>
+      </w:r>
+      <w:r>
+        <w:rPr>
+          <w:i/>
+          <w:iCs/>
+        </w:rPr>
+        <w:t xml:space="preserve">Towns and Temples Along the</w:t>
+      </w:r>
+      <w:r>
+        <w:rPr>
+          <w:i/>
+          <w:iCs/>
+        </w:rPr>
+        <w:t xml:space="preserve"> </w:t>
+      </w:r>
+      <w:r>
+        <w:rPr>
+          <w:i/>
+          <w:iCs/>
+        </w:rPr>
+        <w:t xml:space="preserve">Mississippi</w:t>
+      </w:r>
+      <w:r>
+        <w:t xml:space="preserve">, edited by David H. Dye and Cheryl Anne Cox, pp. 118–134. University of Alabama Press, Tuscaloosa.</w:t>
+      </w:r>
+    </w:p>
+    <w:bookmarkEnd w:id="277"/>
+    <w:bookmarkStart w:id="279" w:name="ref-nei_1973"/>
+    <w:p>
+      <w:pPr>
+        <w:pStyle w:val="Bibliography"/>
+      </w:pPr>
+      <w:r>
+        <w:t xml:space="preserve">Nei, Masatoshi. 1973. Analysis of Gene Diversity in Subdivided Populations.</w:t>
+      </w:r>
+      <w:r>
+        <w:t xml:space="preserve"> </w:t>
+      </w:r>
+      <w:r>
+        <w:rPr>
+          <w:i/>
+          <w:iCs/>
+        </w:rPr>
+        <w:t xml:space="preserve">Proceedings of the National Academy of Sciences</w:t>
+      </w:r>
+      <w:r>
+        <w:t xml:space="preserve"> </w:t>
+      </w:r>
+      <w:r>
+        <w:t xml:space="preserve">70(12):3321–3323.</w:t>
+      </w:r>
+      <w:r>
+        <w:t xml:space="preserve"> </w:t>
+      </w:r>
+      <w:hyperlink r:id="rId278">
+        <w:r>
+          <w:rPr>
+            <w:rStyle w:val="Hyperlink"/>
+          </w:rPr>
+          <w:t xml:space="preserve">https://doi.org/10.1073/pnas.70.12.3321</w:t>
+        </w:r>
+      </w:hyperlink>
+      <w:r>
+        <w:t xml:space="preserve">.</w:t>
       </w:r>
     </w:p>
     <w:bookmarkEnd w:id="279"/>
-    <w:bookmarkStart w:id="280" w:name="ref-mitchem_2001"/>
+    <w:bookmarkStart w:id="280" w:name="ref-neiman_1995"/>
     <w:p>
       <w:pPr>
         <w:pStyle w:val="Bibliography"/>
       </w:pPr>
       <w:r>
-        <w:t xml:space="preserve">Mitchem, Jeffrey M. 2001. A Decade of Hypothesis Testing at the</w:t>
-      </w:r>
-      <w:r>
-        <w:t xml:space="preserve"> </w:t>
-      </w:r>
-      <w:r>
-        <w:t xml:space="preserve">Parkin</w:t>
-      </w:r>
-      <w:r>
-        <w:t xml:space="preserve"> </w:t>
-      </w:r>
-      <w:r>
-        <w:t xml:space="preserve">Site,</w:t>
-      </w:r>
-      <w:r>
-        <w:t xml:space="preserve"> </w:t>
-      </w:r>
-      <w:r>
-        <w:t xml:space="preserve">Arkansas</w:t>
-      </w:r>
-      <w:r>
-        <w:t xml:space="preserve">.</w:t>
+        <w:t xml:space="preserve">Neiman, Fraser D. 1995. Stylistic Variation in Evolutionary Perspective: Inferences from Decorative Diversity and Interassemblage Distance in</w:t>
+      </w:r>
+      <w:r>
+        <w:t xml:space="preserve"> </w:t>
+      </w:r>
+      <w:r>
+        <w:t xml:space="preserve">Illinois</w:t>
+      </w:r>
+      <w:r>
+        <w:t xml:space="preserve"> </w:t>
+      </w:r>
+      <w:r>
+        <w:t xml:space="preserve">Woodland</w:t>
+      </w:r>
+      <w:r>
+        <w:t xml:space="preserve"> </w:t>
+      </w:r>
+      <w:r>
+        <w:t xml:space="preserve">Ceramic Assemblages.</w:t>
+      </w:r>
+      <w:r>
+        <w:t xml:space="preserve"> </w:t>
+      </w:r>
+      <w:r>
+        <w:rPr>
+          <w:i/>
+          <w:iCs/>
+        </w:rPr>
+        <w:t xml:space="preserve">American Antiquity</w:t>
+      </w:r>
+      <w:r>
+        <w:t xml:space="preserve"> </w:t>
+      </w:r>
+      <w:r>
+        <w:t xml:space="preserve">60(1):7–36.</w:t>
       </w:r>
     </w:p>
     <w:bookmarkEnd w:id="280"/>
-    <w:bookmarkStart w:id="281" w:name="ref-morse_d_1990"/>
+    <w:bookmarkStart w:id="281" w:name="ref-obrien_leonard_2001"/>
     <w:p>
       <w:pPr>
         <w:pStyle w:val="Bibliography"/>
       </w:pPr>
       <w:r>
-        <w:t xml:space="preserve">Morse, Dan F. 1990. The</w:t>
-      </w:r>
-      <w:r>
-        <w:t xml:space="preserve"> </w:t>
-      </w:r>
-      <w:r>
-        <w:t xml:space="preserve">Nodena</w:t>
-      </w:r>
-      <w:r>
-        <w:t xml:space="preserve"> </w:t>
-      </w:r>
-      <w:r>
-        <w:t xml:space="preserve">Phase. In</w:t>
-      </w:r>
-      <w:r>
-        <w:t xml:space="preserve"> </w:t>
-      </w:r>
-      <w:r>
-        <w:rPr>
-          <w:i/>
-          <w:iCs/>
-        </w:rPr>
-        <w:t xml:space="preserve">Towns and Temples Along the</w:t>
-      </w:r>
-      <w:r>
-        <w:rPr>
-          <w:i/>
-          <w:iCs/>
-        </w:rPr>
-        <w:t xml:space="preserve"> </w:t>
-      </w:r>
-      <w:r>
-        <w:rPr>
-          <w:i/>
-          <w:iCs/>
-        </w:rPr>
-        <w:t xml:space="preserve">Mississippi</w:t>
-      </w:r>
-      <w:r>
-        <w:t xml:space="preserve">, edited by David H. Dye and Cheryl Anne Cox, pp. 69–97. University of Alabama Press, Tuscaloosa.</w:t>
+        <w:t xml:space="preserve">O’Brien, Michael J., and Robert D. Leonard. 2001. Style and Function: An Introduction. In</w:t>
+      </w:r>
+      <w:r>
+        <w:t xml:space="preserve"> </w:t>
+      </w:r>
+      <w:r>
+        <w:rPr>
+          <w:i/>
+          <w:iCs/>
+        </w:rPr>
+        <w:t xml:space="preserve">Style and Function: Conceptual Issues in Evolutionary Archaeology</w:t>
+      </w:r>
+      <w:r>
+        <w:t xml:space="preserve">, edited by Teresa D. Hurt and Gordon F. M. Rakita, pp. 1–23. Bergin &amp; Garvey, Westport, Connecticut.</w:t>
       </w:r>
     </w:p>
     <w:bookmarkEnd w:id="281"/>
-    <w:bookmarkStart w:id="282" w:name="ref-morse_morse_1996"/>
+    <w:bookmarkStart w:id="283" w:name="ref-odwyer_kandler_2017"/>
     <w:p>
       <w:pPr>
         <w:pStyle w:val="Bibliography"/>
       </w:pPr>
       <w:r>
-        <w:t xml:space="preserve">Morse, Dan F., and Phyllis A. Morse. 1996. Changes in Interpretation in the Archaeology of the Central</w:t>
-      </w:r>
-      <w:r>
-        <w:t xml:space="preserve"> </w:t>
-      </w:r>
-      <w:r>
-        <w:t xml:space="preserve">Mississippi</w:t>
-      </w:r>
-      <w:r>
-        <w:t xml:space="preserve"> </w:t>
-      </w:r>
-      <w:r>
-        <w:t xml:space="preserve">Valley Since 1983.</w:t>
-      </w:r>
-      <w:r>
-        <w:t xml:space="preserve"> </w:t>
-      </w:r>
-      <w:r>
-        <w:rPr>
-          <w:i/>
-          <w:iCs/>
-        </w:rPr>
-        <w:t xml:space="preserve">North American Archaeologist</w:t>
-      </w:r>
-      <w:r>
-        <w:t xml:space="preserve"> </w:t>
-      </w:r>
-      <w:r>
-        <w:t xml:space="preserve">17(1):1–35.</w:t>
-      </w:r>
-    </w:p>
-    <w:bookmarkEnd w:id="282"/>
-    <w:bookmarkStart w:id="283" w:name="ref-morse_p_1981"/>
-    <w:p>
-      <w:pPr>
-        <w:pStyle w:val="Bibliography"/>
-      </w:pPr>
-      <w:r>
-        <w:t xml:space="preserve">Morse, Phyllis A. 1981.</w:t>
-      </w:r>
-      <w:r>
-        <w:t xml:space="preserve"> </w:t>
-      </w:r>
-      <w:r>
-        <w:rPr>
-          <w:i/>
-          <w:iCs/>
-        </w:rPr>
-        <w:t xml:space="preserve">Parkin: The 1978–1979 Archeological Investigations of a</w:t>
-      </w:r>
-      <w:r>
-        <w:rPr>
-          <w:i/>
-          <w:iCs/>
-        </w:rPr>
-        <w:t xml:space="preserve"> </w:t>
-      </w:r>
-      <w:r>
-        <w:rPr>
-          <w:i/>
-          <w:iCs/>
-        </w:rPr>
-        <w:t xml:space="preserve">Cross County</w:t>
-      </w:r>
-      <w:r>
-        <w:rPr>
-          <w:i/>
-          <w:iCs/>
-        </w:rPr>
-        <w:t xml:space="preserve">,</w:t>
-      </w:r>
-      <w:r>
-        <w:rPr>
-          <w:i/>
-          <w:iCs/>
-        </w:rPr>
-        <w:t xml:space="preserve"> </w:t>
-      </w:r>
-      <w:r>
-        <w:rPr>
-          <w:i/>
-          <w:iCs/>
-        </w:rPr>
-        <w:t xml:space="preserve">Arkansas</w:t>
-      </w:r>
-      <w:r>
-        <w:rPr>
-          <w:i/>
-          <w:iCs/>
-        </w:rPr>
-        <w:t xml:space="preserve"> </w:t>
-      </w:r>
-      <w:r>
-        <w:rPr>
-          <w:i/>
-          <w:iCs/>
-        </w:rPr>
-        <w:t xml:space="preserve">Site</w:t>
-      </w:r>
-      <w:r>
-        <w:t xml:space="preserve">. Arkansas Archeological Survey Research Series 13. Arkansas Archeological Survey, Fayetteville.</w:t>
-      </w:r>
-    </w:p>
-    <w:bookmarkEnd w:id="283"/>
-    <w:bookmarkStart w:id="284" w:name="ref-morse_1990"/>
-    <w:p>
-      <w:pPr>
-        <w:pStyle w:val="Bibliography"/>
-      </w:pPr>
-      <w:r>
-        <w:t xml:space="preserve">Morse, Phyllis A. 1990. The</w:t>
-      </w:r>
-      <w:r>
-        <w:t xml:space="preserve"> </w:t>
-      </w:r>
-      <w:r>
-        <w:t xml:space="preserve">Parkin</w:t>
-      </w:r>
-      <w:r>
-        <w:t xml:space="preserve"> </w:t>
-      </w:r>
-      <w:r>
-        <w:t xml:space="preserve">Site and the</w:t>
-      </w:r>
-      <w:r>
-        <w:t xml:space="preserve"> </w:t>
-      </w:r>
-      <w:r>
-        <w:t xml:space="preserve">Parkin</w:t>
-      </w:r>
-      <w:r>
-        <w:t xml:space="preserve"> </w:t>
-      </w:r>
-      <w:r>
-        <w:t xml:space="preserve">Phase. In</w:t>
-      </w:r>
-      <w:r>
-        <w:t xml:space="preserve"> </w:t>
-      </w:r>
-      <w:r>
-        <w:rPr>
-          <w:i/>
-          <w:iCs/>
-        </w:rPr>
-        <w:t xml:space="preserve">Towns and Temples Along the</w:t>
-      </w:r>
-      <w:r>
-        <w:rPr>
-          <w:i/>
-          <w:iCs/>
-        </w:rPr>
-        <w:t xml:space="preserve"> </w:t>
-      </w:r>
-      <w:r>
-        <w:rPr>
-          <w:i/>
-          <w:iCs/>
-        </w:rPr>
-        <w:t xml:space="preserve">Mississippi</w:t>
-      </w:r>
-      <w:r>
-        <w:t xml:space="preserve">, edited by David H. Dye and Cheryl Anne Cox, pp. 118–134. University of Alabama Press, Tuscaloosa.</w:t>
-      </w:r>
-    </w:p>
-    <w:bookmarkEnd w:id="284"/>
-    <w:bookmarkStart w:id="285" w:name="ref-neiman_1995"/>
-    <w:p>
-      <w:pPr>
-        <w:pStyle w:val="Bibliography"/>
-      </w:pPr>
-      <w:r>
-        <w:t xml:space="preserve">Neiman, Fraser D. 1995. Stylistic Variation in Evolutionary Perspective: Inferences from Decorative Diversity and Interassemblage Distance in</w:t>
-      </w:r>
-      <w:r>
-        <w:t xml:space="preserve"> </w:t>
-      </w:r>
-      <w:r>
-        <w:t xml:space="preserve">Illinois</w:t>
-      </w:r>
-      <w:r>
-        <w:t xml:space="preserve"> </w:t>
-      </w:r>
-      <w:r>
-        <w:t xml:space="preserve">Woodland</w:t>
-      </w:r>
-      <w:r>
-        <w:t xml:space="preserve"> </w:t>
-      </w:r>
-      <w:r>
-        <w:t xml:space="preserve">Ceramic Assemblages.</w:t>
-      </w:r>
-      <w:r>
-        <w:t xml:space="preserve"> </w:t>
-      </w:r>
-      <w:r>
-        <w:rPr>
-          <w:i/>
-          <w:iCs/>
-        </w:rPr>
-        <w:t xml:space="preserve">American Antiquity</w:t>
-      </w:r>
-      <w:r>
-        <w:t xml:space="preserve"> </w:t>
-      </w:r>
-      <w:r>
-        <w:t xml:space="preserve">60(1):7–36.</w:t>
-      </w:r>
-    </w:p>
-    <w:bookmarkEnd w:id="285"/>
-    <w:bookmarkStart w:id="286" w:name="ref-obrien_leonard_2001"/>
-    <w:p>
-      <w:pPr>
-        <w:pStyle w:val="Bibliography"/>
-      </w:pPr>
-      <w:r>
-        <w:t xml:space="preserve">O’Brien, Michael J., and Robert D. Leonard. 2001. Style and Function: An Introduction. In</w:t>
-      </w:r>
-      <w:r>
-        <w:t xml:space="preserve"> </w:t>
-      </w:r>
-      <w:r>
-        <w:rPr>
-          <w:i/>
-          <w:iCs/>
-        </w:rPr>
-        <w:t xml:space="preserve">Style and Function: Conceptual Issues in Evolutionary Archaeology</w:t>
-      </w:r>
-      <w:r>
-        <w:t xml:space="preserve">, edited by Teresa D. Hurt and Gordon F. M. Rakita, pp. 1–23. Bergin &amp; Garvey, Westport, Connecticut.</w:t>
-      </w:r>
-    </w:p>
-    <w:bookmarkEnd w:id="286"/>
-    <w:bookmarkStart w:id="288" w:name="ref-odwyer_kandler_2017"/>
-    <w:p>
-      <w:pPr>
-        <w:pStyle w:val="Bibliography"/>
-      </w:pPr>
-      <w:r>
         <w:t xml:space="preserve">O’Dwyer, James P., and Anne Kandler. 2017. Inferring Processes of Cultural Transmission: The Critical Role of Rare Variants in Distinguishing Neutrality from Novelty Biases.</w:t>
       </w:r>
       <w:r>
@@ -8031,7 +8056,7 @@
       <w:r>
         <w:t xml:space="preserve"> </w:t>
       </w:r>
-      <w:hyperlink r:id="rId287">
+      <w:hyperlink r:id="rId282">
         <w:r>
           <w:rPr>
             <w:rStyle w:val="Hyperlink"/>
@@ -8043,8 +8068,8 @@
         <w:t xml:space="preserve">.</w:t>
       </w:r>
     </w:p>
-    <w:bookmarkEnd w:id="288"/>
-    <w:bookmarkStart w:id="290" w:name="ref-peebles_kus_1977"/>
+    <w:bookmarkEnd w:id="283"/>
+    <w:bookmarkStart w:id="285" w:name="ref-peebles_kus_1977"/>
     <w:p>
       <w:pPr>
         <w:pStyle w:val="Bibliography"/>
@@ -8071,7 +8096,7 @@
       <w:r>
         <w:t xml:space="preserve"> </w:t>
       </w:r>
-      <w:hyperlink r:id="rId289">
+      <w:hyperlink r:id="rId284">
         <w:r>
           <w:rPr>
             <w:rStyle w:val="Hyperlink"/>
@@ -8083,8 +8108,8 @@
         <w:t xml:space="preserve">.</w:t>
       </w:r>
     </w:p>
-    <w:bookmarkEnd w:id="290"/>
-    <w:bookmarkStart w:id="292" w:name="ref-peeples_schachner_2012"/>
+    <w:bookmarkEnd w:id="285"/>
+    <w:bookmarkStart w:id="287" w:name="ref-peeples_schachner_2012"/>
     <w:p>
       <w:pPr>
         <w:pStyle w:val="Bibliography"/>
@@ -8111,7 +8136,7 @@
       <w:r>
         <w:t xml:space="preserve"> </w:t>
       </w:r>
-      <w:hyperlink r:id="rId291">
+      <w:hyperlink r:id="rId286">
         <w:r>
           <w:rPr>
             <w:rStyle w:val="Hyperlink"/>
@@ -8123,8 +8148,8 @@
         <w:t xml:space="preserve">.</w:t>
       </w:r>
     </w:p>
-    <w:bookmarkEnd w:id="292"/>
-    <w:bookmarkStart w:id="294" w:name="ref-perreault_2018"/>
+    <w:bookmarkEnd w:id="287"/>
+    <w:bookmarkStart w:id="289" w:name="ref-perreault_2018"/>
     <w:p>
       <w:pPr>
         <w:pStyle w:val="Bibliography"/>
@@ -8151,7 +8176,7 @@
       <w:r>
         <w:t xml:space="preserve"> </w:t>
       </w:r>
-      <w:hyperlink r:id="rId293">
+      <w:hyperlink r:id="rId288">
         <w:r>
           <w:rPr>
             <w:rStyle w:val="Hyperlink"/>
@@ -8163,8 +8188,8 @@
         <w:t xml:space="preserve">.</w:t>
       </w:r>
     </w:p>
-    <w:bookmarkEnd w:id="294"/>
-    <w:bookmarkStart w:id="295" w:name="ref-perreault_2019"/>
+    <w:bookmarkEnd w:id="289"/>
+    <w:bookmarkStart w:id="290" w:name="ref-perreault_2019"/>
     <w:p>
       <w:pPr>
         <w:pStyle w:val="Bibliography"/>
@@ -8186,13 +8211,85 @@
         <w:t xml:space="preserve">. University of Chicago Press, Chicago.</w:t>
       </w:r>
     </w:p>
-    <w:bookmarkEnd w:id="295"/>
-    <w:bookmarkStart w:id="296" w:name="ref-phillips_ford_griffin_1951"/>
+    <w:bookmarkEnd w:id="290"/>
+    <w:bookmarkStart w:id="291" w:name="ref-phillips_1970"/>
     <w:p>
       <w:pPr>
         <w:pStyle w:val="Bibliography"/>
       </w:pPr>
       <w:r>
+        <w:t xml:space="preserve">Phillips, Philip. 1970.</w:t>
+      </w:r>
+      <w:r>
+        <w:t xml:space="preserve"> </w:t>
+      </w:r>
+      <w:r>
+        <w:rPr>
+          <w:i/>
+          <w:iCs/>
+        </w:rPr>
+        <w:t xml:space="preserve">Archaeological Survey in the Lower</w:t>
+      </w:r>
+      <w:r>
+        <w:rPr>
+          <w:i/>
+          <w:iCs/>
+        </w:rPr>
+        <w:t xml:space="preserve"> </w:t>
+      </w:r>
+      <w:r>
+        <w:rPr>
+          <w:i/>
+          <w:iCs/>
+        </w:rPr>
+        <w:t xml:space="preserve">Yazoo</w:t>
+      </w:r>
+      <w:r>
+        <w:rPr>
+          <w:i/>
+          <w:iCs/>
+        </w:rPr>
+        <w:t xml:space="preserve"> </w:t>
+      </w:r>
+      <w:r>
+        <w:rPr>
+          <w:i/>
+          <w:iCs/>
+        </w:rPr>
+        <w:t xml:space="preserve">Basin,</w:t>
+      </w:r>
+      <w:r>
+        <w:rPr>
+          <w:i/>
+          <w:iCs/>
+        </w:rPr>
+        <w:t xml:space="preserve"> </w:t>
+      </w:r>
+      <w:r>
+        <w:rPr>
+          <w:i/>
+          <w:iCs/>
+        </w:rPr>
+        <w:t xml:space="preserve">Mississippi</w:t>
+      </w:r>
+      <w:r>
+        <w:rPr>
+          <w:i/>
+          <w:iCs/>
+        </w:rPr>
+        <w:t xml:space="preserve">, 1949–1955</w:t>
+      </w:r>
+      <w:r>
+        <w:t xml:space="preserve">, Vol. 60. Papers of the Peabody Museum of Archaeology and Ethnology. Peabody Museum, Harvard University, Cambridge, MA.</w:t>
+      </w:r>
+    </w:p>
+    <w:bookmarkEnd w:id="291"/>
+    <w:bookmarkStart w:id="292" w:name="ref-phillips_ford_griffin_1951"/>
+    <w:p>
+      <w:pPr>
+        <w:pStyle w:val="Bibliography"/>
+      </w:pPr>
+      <w:r>
         <w:t xml:space="preserve">Phillips, Philip, James A. Ford, and James B. Griffin. 1951.</w:t>
       </w:r>
       <w:r>
@@ -8237,8 +8334,8 @@
         <w:t xml:space="preserve">, Vol. 25. Papers of the Peabody Museum of American Archaeology and Ethnology. Peabody Museum, Harvard University, Cambridge, MA.</w:t>
       </w:r>
     </w:p>
-    <w:bookmarkEnd w:id="296"/>
-    <w:bookmarkStart w:id="298" w:name="ref-phillips_willey_1953"/>
+    <w:bookmarkEnd w:id="292"/>
+    <w:bookmarkStart w:id="294" w:name="ref-phillips_willey_1953"/>
     <w:p>
       <w:pPr>
         <w:pStyle w:val="Bibliography"/>
@@ -8265,7 +8362,7 @@
       <w:r>
         <w:t xml:space="preserve"> </w:t>
       </w:r>
-      <w:hyperlink r:id="rId297">
+      <w:hyperlink r:id="rId293">
         <w:r>
           <w:rPr>
             <w:rStyle w:val="Hyperlink"/>
@@ -8277,8 +8374,8 @@
         <w:t xml:space="preserve">.</w:t>
       </w:r>
     </w:p>
-    <w:bookmarkEnd w:id="298"/>
-    <w:bookmarkStart w:id="300" w:name="ref-powell_shennan_thomas_2009"/>
+    <w:bookmarkEnd w:id="294"/>
+    <w:bookmarkStart w:id="296" w:name="ref-powell_shennan_thomas_2009"/>
     <w:p>
       <w:pPr>
         <w:pStyle w:val="Bibliography"/>
@@ -8317,7 +8414,7 @@
       <w:r>
         <w:t xml:space="preserve"> </w:t>
       </w:r>
-      <w:hyperlink r:id="rId299">
+      <w:hyperlink r:id="rId295">
         <w:r>
           <w:rPr>
             <w:rStyle w:val="Hyperlink"/>
@@ -8329,8 +8426,8 @@
         <w:t xml:space="preserve">.</w:t>
       </w:r>
     </w:p>
-    <w:bookmarkEnd w:id="300"/>
-    <w:bookmarkStart w:id="302" w:name="ref-premo_2014"/>
+    <w:bookmarkEnd w:id="296"/>
+    <w:bookmarkStart w:id="298" w:name="ref-premo_2014"/>
     <w:p>
       <w:pPr>
         <w:pStyle w:val="Bibliography"/>
@@ -8357,7 +8454,7 @@
       <w:r>
         <w:t xml:space="preserve"> </w:t>
       </w:r>
-      <w:hyperlink r:id="rId301">
+      <w:hyperlink r:id="rId297">
         <w:r>
           <w:rPr>
             <w:rStyle w:val="Hyperlink"/>
@@ -8369,8 +8466,8 @@
         <w:t xml:space="preserve">.</w:t>
       </w:r>
     </w:p>
-    <w:bookmarkEnd w:id="302"/>
-    <w:bookmarkStart w:id="304" w:name="ref-premo_2016"/>
+    <w:bookmarkEnd w:id="298"/>
+    <w:bookmarkStart w:id="300" w:name="ref-premo_2016"/>
     <w:p>
       <w:pPr>
         <w:pStyle w:val="Bibliography"/>
@@ -8397,7 +8494,7 @@
       <w:r>
         <w:t xml:space="preserve"> </w:t>
       </w:r>
-      <w:hyperlink r:id="rId303">
+      <w:hyperlink r:id="rId299">
         <w:r>
           <w:rPr>
             <w:rStyle w:val="Hyperlink"/>
@@ -8409,8 +8506,8 @@
         <w:t xml:space="preserve">.</w:t>
       </w:r>
     </w:p>
-    <w:bookmarkEnd w:id="304"/>
-    <w:bookmarkStart w:id="306" w:name="ref-premo_scholnick_2011"/>
+    <w:bookmarkEnd w:id="300"/>
+    <w:bookmarkStart w:id="302" w:name="ref-premo_scholnick_2011"/>
     <w:p>
       <w:pPr>
         <w:pStyle w:val="Bibliography"/>
@@ -8437,7 +8534,7 @@
       <w:r>
         <w:t xml:space="preserve"> </w:t>
       </w:r>
-      <w:hyperlink r:id="rId305">
+      <w:hyperlink r:id="rId301">
         <w:r>
           <w:rPr>
             <w:rStyle w:val="Hyperlink"/>
@@ -8449,8 +8546,8 @@
         <w:t xml:space="preserve">.</w:t>
       </w:r>
     </w:p>
-    <w:bookmarkEnd w:id="306"/>
-    <w:bookmarkStart w:id="307" w:name="ref-rees_political_culture"/>
+    <w:bookmarkEnd w:id="302"/>
+    <w:bookmarkStart w:id="303" w:name="ref-rees_political_culture"/>
     <w:p>
       <w:pPr>
         <w:pStyle w:val="Bibliography"/>
@@ -8474,8 +8571,8 @@
         <w:t xml:space="preserve">. Ph.D. dissertation, University of Oklahoma, Norman.</w:t>
       </w:r>
     </w:p>
-    <w:bookmarkEnd w:id="307"/>
-    <w:bookmarkStart w:id="309" w:name="ref-reimer_etal_2020"/>
+    <w:bookmarkEnd w:id="303"/>
+    <w:bookmarkStart w:id="305" w:name="ref-reimer_etal_2020"/>
     <w:p>
       <w:pPr>
         <w:pStyle w:val="Bibliography"/>
@@ -8529,7 +8626,7 @@
       <w:r>
         <w:t xml:space="preserve"> </w:t>
       </w:r>
-      <w:hyperlink r:id="rId308">
+      <w:hyperlink r:id="rId304">
         <w:r>
           <w:rPr>
             <w:rStyle w:val="Hyperlink"/>
@@ -8541,8 +8638,8 @@
         <w:t xml:space="preserve">.</w:t>
       </w:r>
     </w:p>
-    <w:bookmarkEnd w:id="309"/>
-    <w:bookmarkStart w:id="311" w:name="ref-richerson_etal_2016"/>
+    <w:bookmarkEnd w:id="305"/>
+    <w:bookmarkStart w:id="307" w:name="ref-richerson_etal_2016"/>
     <w:p>
       <w:pPr>
         <w:pStyle w:val="Bibliography"/>
@@ -8569,7 +8666,7 @@
       <w:r>
         <w:t xml:space="preserve"> </w:t>
       </w:r>
-      <w:hyperlink r:id="rId310">
+      <w:hyperlink r:id="rId306">
         <w:r>
           <w:rPr>
             <w:rStyle w:val="Hyperlink"/>
@@ -8581,8 +8678,8 @@
         <w:t xml:space="preserve">.</w:t>
       </w:r>
     </w:p>
-    <w:bookmarkEnd w:id="311"/>
-    <w:bookmarkStart w:id="313" w:name="ref-riede_hoggard_shennan_2019"/>
+    <w:bookmarkEnd w:id="307"/>
+    <w:bookmarkStart w:id="309" w:name="ref-riede_hoggard_shennan_2019"/>
     <w:p>
       <w:pPr>
         <w:pStyle w:val="Bibliography"/>
@@ -8609,7 +8706,7 @@
       <w:r>
         <w:t xml:space="preserve"> </w:t>
       </w:r>
-      <w:hyperlink r:id="rId312">
+      <w:hyperlink r:id="rId308">
         <w:r>
           <w:rPr>
             <w:rStyle w:val="Hyperlink"/>
@@ -8621,8 +8718,8 @@
         <w:t xml:space="preserve">.</w:t>
       </w:r>
     </w:p>
-    <w:bookmarkEnd w:id="313"/>
-    <w:bookmarkStart w:id="314" w:name="ref-robinson_1951"/>
+    <w:bookmarkEnd w:id="309"/>
+    <w:bookmarkStart w:id="310" w:name="ref-robinson_1951"/>
     <w:p>
       <w:pPr>
         <w:pStyle w:val="Bibliography"/>
@@ -8647,8 +8744,8 @@
         <w:t xml:space="preserve">16(4):293–301.</w:t>
       </w:r>
     </w:p>
-    <w:bookmarkEnd w:id="314"/>
-    <w:bookmarkStart w:id="315" w:name="ref-ross-stallings_2017"/>
+    <w:bookmarkEnd w:id="310"/>
+    <w:bookmarkStart w:id="311" w:name="ref-ross-stallings_2017"/>
     <w:p>
       <w:pPr>
         <w:pStyle w:val="Bibliography"/>
@@ -8682,8 +8779,8 @@
         <w:t xml:space="preserve">, edited by Haagen D. Klaus, Amanda R. Harvey, and Mark N. Cohen, pp. 329–362. University Press of Florida, Gainesville.</w:t>
       </w:r>
     </w:p>
-    <w:bookmarkEnd w:id="315"/>
-    <w:bookmarkStart w:id="316" w:name="ref-schiffer_1972"/>
+    <w:bookmarkEnd w:id="311"/>
+    <w:bookmarkStart w:id="312" w:name="ref-schiffer_1972"/>
     <w:p>
       <w:pPr>
         <w:pStyle w:val="Bibliography"/>
@@ -8708,8 +8805,8 @@
         <w:t xml:space="preserve">37(2):156–165.</w:t>
       </w:r>
     </w:p>
-    <w:bookmarkEnd w:id="316"/>
-    <w:bookmarkStart w:id="318" w:name="ref-schneider_martins_deaguiar_2016"/>
+    <w:bookmarkEnd w:id="312"/>
+    <w:bookmarkStart w:id="314" w:name="ref-schneider_martins_deaguiar_2016"/>
     <w:p>
       <w:pPr>
         <w:pStyle w:val="Bibliography"/>
@@ -8736,7 +8833,7 @@
       <w:r>
         <w:t xml:space="preserve"> </w:t>
       </w:r>
-      <w:hyperlink r:id="rId317">
+      <w:hyperlink r:id="rId313">
         <w:r>
           <w:rPr>
             <w:rStyle w:val="Hyperlink"/>
@@ -8748,8 +8845,8 @@
         <w:t xml:space="preserve">.</w:t>
       </w:r>
     </w:p>
-    <w:bookmarkEnd w:id="318"/>
-    <w:bookmarkStart w:id="320" w:name="ref-shennan_crema_kerig_2015"/>
+    <w:bookmarkEnd w:id="314"/>
+    <w:bookmarkStart w:id="316" w:name="ref-shennan_crema_kerig_2015"/>
     <w:p>
       <w:pPr>
         <w:pStyle w:val="Bibliography"/>
@@ -8815,7 +8912,7 @@
       <w:r>
         <w:t xml:space="preserve"> </w:t>
       </w:r>
-      <w:hyperlink r:id="rId319">
+      <w:hyperlink r:id="rId315">
         <w:r>
           <w:rPr>
             <w:rStyle w:val="Hyperlink"/>
@@ -8827,401 +8924,337 @@
         <w:t xml:space="preserve">.</w:t>
       </w:r>
     </w:p>
+    <w:bookmarkEnd w:id="316"/>
+    <w:bookmarkStart w:id="317" w:name="ref-shennan_wilkinson_2001"/>
+    <w:p>
+      <w:pPr>
+        <w:pStyle w:val="Bibliography"/>
+      </w:pPr>
+      <w:r>
+        <w:t xml:space="preserve">Shennan, Stephen J., and James R. Wilkinson. 2001. Ceramic Style Change and Neutral Evolution: A Case Study from</w:t>
+      </w:r>
+      <w:r>
+        <w:t xml:space="preserve"> </w:t>
+      </w:r>
+      <w:r>
+        <w:t xml:space="preserve">Neolithic</w:t>
+      </w:r>
+      <w:r>
+        <w:t xml:space="preserve"> </w:t>
+      </w:r>
+      <w:r>
+        <w:t xml:space="preserve">Europe</w:t>
+      </w:r>
+      <w:r>
+        <w:t xml:space="preserve">.</w:t>
+      </w:r>
+      <w:r>
+        <w:t xml:space="preserve"> </w:t>
+      </w:r>
+      <w:r>
+        <w:rPr>
+          <w:i/>
+          <w:iCs/>
+        </w:rPr>
+        <w:t xml:space="preserve">American Antiquity</w:t>
+      </w:r>
+      <w:r>
+        <w:t xml:space="preserve"> </w:t>
+      </w:r>
+      <w:r>
+        <w:t xml:space="preserve">66(4):577–593.</w:t>
+      </w:r>
+    </w:p>
+    <w:bookmarkEnd w:id="317"/>
+    <w:bookmarkStart w:id="318" w:name="ref-smith_1990"/>
+    <w:p>
+      <w:pPr>
+        <w:pStyle w:val="Bibliography"/>
+      </w:pPr>
+      <w:r>
+        <w:t xml:space="preserve">Smith, Gerald P. 1990. The</w:t>
+      </w:r>
+      <w:r>
+        <w:t xml:space="preserve"> </w:t>
+      </w:r>
+      <w:r>
+        <w:t xml:space="preserve">Walls</w:t>
+      </w:r>
+      <w:r>
+        <w:t xml:space="preserve"> </w:t>
+      </w:r>
+      <w:r>
+        <w:t xml:space="preserve">Phase and Its Neighbors. In</w:t>
+      </w:r>
+      <w:r>
+        <w:t xml:space="preserve"> </w:t>
+      </w:r>
+      <w:r>
+        <w:rPr>
+          <w:i/>
+          <w:iCs/>
+        </w:rPr>
+        <w:t xml:space="preserve">Towns and Temples Along the</w:t>
+      </w:r>
+      <w:r>
+        <w:rPr>
+          <w:i/>
+          <w:iCs/>
+        </w:rPr>
+        <w:t xml:space="preserve"> </w:t>
+      </w:r>
+      <w:r>
+        <w:rPr>
+          <w:i/>
+          <w:iCs/>
+        </w:rPr>
+        <w:t xml:space="preserve">Mississippi</w:t>
+      </w:r>
+      <w:r>
+        <w:t xml:space="preserve">, edited by David H. Dye and Cheryl Anne Cox, pp. 135–169. University of Alabama Press, Tuscaloosa.</w:t>
+      </w:r>
+    </w:p>
+    <w:bookmarkEnd w:id="318"/>
+    <w:bookmarkStart w:id="319" w:name="ref-smith_neiman_2007"/>
+    <w:p>
+      <w:pPr>
+        <w:pStyle w:val="Bibliography"/>
+      </w:pPr>
+      <w:r>
+        <w:t xml:space="preserve">Smith, Karen Y., and Fraser D. Neiman. 2007. Frequency Seriation, Correspondence Analysis, and Woodland-Period Ceramic Assemblage Variation in the Deep South.</w:t>
+      </w:r>
+      <w:r>
+        <w:t xml:space="preserve"> </w:t>
+      </w:r>
+      <w:r>
+        <w:rPr>
+          <w:i/>
+          <w:iCs/>
+        </w:rPr>
+        <w:t xml:space="preserve">Southeastern Archaeology</w:t>
+      </w:r>
+      <w:r>
+        <w:t xml:space="preserve"> </w:t>
+      </w:r>
+      <w:r>
+        <w:t xml:space="preserve">26(1):47–72.</w:t>
+      </w:r>
+    </w:p>
+    <w:bookmarkEnd w:id="319"/>
+    <w:bookmarkStart w:id="320" w:name="ref-starr_1984"/>
+    <w:p>
+      <w:pPr>
+        <w:pStyle w:val="Bibliography"/>
+      </w:pPr>
+      <w:r>
+        <w:t xml:space="preserve">Starr, Mary Evelyn. 1984. Parchman Phase in the Northwestern</w:t>
+      </w:r>
+      <w:r>
+        <w:t xml:space="preserve"> </w:t>
+      </w:r>
+      <w:r>
+        <w:t xml:space="preserve">Yazoo</w:t>
+      </w:r>
+      <w:r>
+        <w:t xml:space="preserve"> </w:t>
+      </w:r>
+      <w:r>
+        <w:t xml:space="preserve">Basin. In</w:t>
+      </w:r>
+      <w:r>
+        <w:t xml:space="preserve"> </w:t>
+      </w:r>
+      <w:r>
+        <w:rPr>
+          <w:i/>
+          <w:iCs/>
+        </w:rPr>
+        <w:t xml:space="preserve">The</w:t>
+      </w:r>
+      <w:r>
+        <w:rPr>
+          <w:i/>
+          <w:iCs/>
+        </w:rPr>
+        <w:t xml:space="preserve"> </w:t>
+      </w:r>
+      <w:r>
+        <w:rPr>
+          <w:i/>
+          <w:iCs/>
+        </w:rPr>
+        <w:t xml:space="preserve">Wilsford</w:t>
+      </w:r>
+      <w:r>
+        <w:rPr>
+          <w:i/>
+          <w:iCs/>
+        </w:rPr>
+        <w:t xml:space="preserve"> </w:t>
+      </w:r>
+      <w:r>
+        <w:rPr>
+          <w:i/>
+          <w:iCs/>
+        </w:rPr>
+        <w:t xml:space="preserve">Site (22-Co-516)</w:t>
+      </w:r>
+      <w:r>
+        <w:rPr>
+          <w:i/>
+          <w:iCs/>
+        </w:rPr>
+        <w:t xml:space="preserve"> </w:t>
+      </w:r>
+      <w:r>
+        <w:rPr>
+          <w:i/>
+          <w:iCs/>
+        </w:rPr>
+        <w:t xml:space="preserve">Coahoma</w:t>
+      </w:r>
+      <w:r>
+        <w:rPr>
+          <w:i/>
+          <w:iCs/>
+        </w:rPr>
+        <w:t xml:space="preserve"> </w:t>
+      </w:r>
+      <w:r>
+        <w:rPr>
+          <w:i/>
+          <w:iCs/>
+        </w:rPr>
+        <w:t xml:space="preserve">County,</w:t>
+      </w:r>
+      <w:r>
+        <w:rPr>
+          <w:i/>
+          <w:iCs/>
+        </w:rPr>
+        <w:t xml:space="preserve"> </w:t>
+      </w:r>
+      <w:r>
+        <w:rPr>
+          <w:i/>
+          <w:iCs/>
+        </w:rPr>
+        <w:t xml:space="preserve">Mississippi</w:t>
+      </w:r>
+      <w:r>
+        <w:rPr>
+          <w:i/>
+          <w:iCs/>
+        </w:rPr>
+        <w:t xml:space="preserve">: A Late</w:t>
+      </w:r>
+      <w:r>
+        <w:rPr>
+          <w:i/>
+          <w:iCs/>
+        </w:rPr>
+        <w:t xml:space="preserve"> </w:t>
+      </w:r>
+      <w:r>
+        <w:rPr>
+          <w:i/>
+          <w:iCs/>
+        </w:rPr>
+        <w:t xml:space="preserve">Mississippi</w:t>
+      </w:r>
+      <w:r>
+        <w:rPr>
+          <w:i/>
+          <w:iCs/>
+        </w:rPr>
+        <w:t xml:space="preserve"> </w:t>
+      </w:r>
+      <w:r>
+        <w:rPr>
+          <w:i/>
+          <w:iCs/>
+        </w:rPr>
+        <w:t xml:space="preserve">Period Settlement in the Northern</w:t>
+      </w:r>
+      <w:r>
+        <w:rPr>
+          <w:i/>
+          <w:iCs/>
+        </w:rPr>
+        <w:t xml:space="preserve"> </w:t>
+      </w:r>
+      <w:r>
+        <w:rPr>
+          <w:i/>
+          <w:iCs/>
+        </w:rPr>
+        <w:t xml:space="preserve">Yazoo</w:t>
+      </w:r>
+      <w:r>
+        <w:rPr>
+          <w:i/>
+          <w:iCs/>
+        </w:rPr>
+        <w:t xml:space="preserve"> </w:t>
+      </w:r>
+      <w:r>
+        <w:rPr>
+          <w:i/>
+          <w:iCs/>
+        </w:rPr>
+        <w:t xml:space="preserve">of</w:t>
+      </w:r>
+      <w:r>
+        <w:rPr>
+          <w:i/>
+          <w:iCs/>
+        </w:rPr>
+        <w:t xml:space="preserve"> </w:t>
+      </w:r>
+      <w:r>
+        <w:rPr>
+          <w:i/>
+          <w:iCs/>
+        </w:rPr>
+        <w:t xml:space="preserve">Mississippi</w:t>
+      </w:r>
+      <w:r>
+        <w:t xml:space="preserve">, edited by John M. Connaway, pp. 163–222. Archaeological Report No. 14. Mississippi Department of Archives; History, Jackson, MS.</w:t>
+      </w:r>
+    </w:p>
     <w:bookmarkEnd w:id="320"/>
-    <w:bookmarkStart w:id="321" w:name="ref-shennan_wilkinson_2001"/>
+    <w:bookmarkStart w:id="321" w:name="ref-tomasovych_kidwell_2009"/>
     <w:p>
       <w:pPr>
         <w:pStyle w:val="Bibliography"/>
       </w:pPr>
       <w:r>
-        <w:t xml:space="preserve">Shennan, Stephen J., and James R. Wilkinson. 2001. Ceramic Style Change and Neutral Evolution: A Case Study from</w:t>
-      </w:r>
-      <w:r>
-        <w:t xml:space="preserve"> </w:t>
-      </w:r>
-      <w:r>
-        <w:t xml:space="preserve">Neolithic</w:t>
-      </w:r>
-      <w:r>
-        <w:t xml:space="preserve"> </w:t>
-      </w:r>
-      <w:r>
-        <w:t xml:space="preserve">Europe</w:t>
-      </w:r>
-      <w:r>
-        <w:t xml:space="preserve">.</w:t>
-      </w:r>
-      <w:r>
-        <w:t xml:space="preserve"> </w:t>
-      </w:r>
-      <w:r>
-        <w:rPr>
-          <w:i/>
-          <w:iCs/>
-        </w:rPr>
-        <w:t xml:space="preserve">American Antiquity</w:t>
-      </w:r>
-      <w:r>
-        <w:t xml:space="preserve"> </w:t>
-      </w:r>
-      <w:r>
-        <w:t xml:space="preserve">66(4):577–593.</w:t>
+        <w:t xml:space="preserve">Tomašových, Adam, and Susan M. Kidwell. 2009. Fidelity of Variation in Species Composition and Diversity Partitioning by Death Assemblages: Time-Averaging Transfers Diversity from Beta to Alpha Levels.</w:t>
+      </w:r>
+      <w:r>
+        <w:t xml:space="preserve"> </w:t>
+      </w:r>
+      <w:r>
+        <w:rPr>
+          <w:i/>
+          <w:iCs/>
+        </w:rPr>
+        <w:t xml:space="preserve">Paleobiology</w:t>
+      </w:r>
+      <w:r>
+        <w:t xml:space="preserve"> </w:t>
+      </w:r>
+      <w:r>
+        <w:t xml:space="preserve">35(1):94–118.</w:t>
       </w:r>
     </w:p>
     <w:bookmarkEnd w:id="321"/>
-    <w:bookmarkStart w:id="322" w:name="ref-smith_1990"/>
+    <w:bookmarkStart w:id="323" w:name="ref-tomasovych_kidwell_2010"/>
     <w:p>
       <w:pPr>
         <w:pStyle w:val="Bibliography"/>
       </w:pPr>
       <w:r>
-        <w:t xml:space="preserve">Smith, Gerald P. 1990. The</w:t>
-      </w:r>
-      <w:r>
-        <w:t xml:space="preserve"> </w:t>
-      </w:r>
-      <w:r>
-        <w:t xml:space="preserve">Walls</w:t>
-      </w:r>
-      <w:r>
-        <w:t xml:space="preserve"> </w:t>
-      </w:r>
-      <w:r>
-        <w:t xml:space="preserve">Phase and Its Neighbors. In</w:t>
-      </w:r>
-      <w:r>
-        <w:t xml:space="preserve"> </w:t>
-      </w:r>
-      <w:r>
-        <w:rPr>
-          <w:i/>
-          <w:iCs/>
-        </w:rPr>
-        <w:t xml:space="preserve">Towns and Temples Along the</w:t>
-      </w:r>
-      <w:r>
-        <w:rPr>
-          <w:i/>
-          <w:iCs/>
-        </w:rPr>
-        <w:t xml:space="preserve"> </w:t>
-      </w:r>
-      <w:r>
-        <w:rPr>
-          <w:i/>
-          <w:iCs/>
-        </w:rPr>
-        <w:t xml:space="preserve">Mississippi</w:t>
-      </w:r>
-      <w:r>
-        <w:t xml:space="preserve">, edited by David H. Dye and Cheryl Anne Cox, pp. 135–169. University of Alabama Press, Tuscaloosa.</w:t>
-      </w:r>
-    </w:p>
-    <w:bookmarkEnd w:id="322"/>
-    <w:bookmarkStart w:id="323" w:name="ref-smith_neiman_2007"/>
-    <w:p>
-      <w:pPr>
-        <w:pStyle w:val="Bibliography"/>
-      </w:pPr>
-      <w:r>
-        <w:t xml:space="preserve">Smith, Karen Y., and Fraser D. Neiman. 2007. Frequency Seriation, Correspondence Analysis, and Woodland-Period Ceramic Assemblage Variation in the Deep South.</w:t>
-      </w:r>
-      <w:r>
-        <w:t xml:space="preserve"> </w:t>
-      </w:r>
-      <w:r>
-        <w:rPr>
-          <w:i/>
-          <w:iCs/>
-        </w:rPr>
-        <w:t xml:space="preserve">Southeastern Archaeology</w:t>
-      </w:r>
-      <w:r>
-        <w:t xml:space="preserve"> </w:t>
-      </w:r>
-      <w:r>
-        <w:t xml:space="preserve">26(1):47–72.</w:t>
-      </w:r>
-    </w:p>
-    <w:bookmarkEnd w:id="323"/>
-    <w:bookmarkStart w:id="324" w:name="ref-starr_1984"/>
-    <w:p>
-      <w:pPr>
-        <w:pStyle w:val="Bibliography"/>
-      </w:pPr>
-      <w:r>
-        <w:t xml:space="preserve">Starr, Mary Evelyn. 1984. Parchman Phase in the Northwestern</w:t>
-      </w:r>
-      <w:r>
-        <w:t xml:space="preserve"> </w:t>
-      </w:r>
-      <w:r>
-        <w:t xml:space="preserve">Yazoo</w:t>
-      </w:r>
-      <w:r>
-        <w:t xml:space="preserve"> </w:t>
-      </w:r>
-      <w:r>
-        <w:t xml:space="preserve">Basin. In</w:t>
-      </w:r>
-      <w:r>
-        <w:t xml:space="preserve"> </w:t>
-      </w:r>
-      <w:r>
-        <w:rPr>
-          <w:i/>
-          <w:iCs/>
-        </w:rPr>
-        <w:t xml:space="preserve">The</w:t>
-      </w:r>
-      <w:r>
-        <w:rPr>
-          <w:i/>
-          <w:iCs/>
-        </w:rPr>
-        <w:t xml:space="preserve"> </w:t>
-      </w:r>
-      <w:r>
-        <w:rPr>
-          <w:i/>
-          <w:iCs/>
-        </w:rPr>
-        <w:t xml:space="preserve">Wilsford</w:t>
-      </w:r>
-      <w:r>
-        <w:rPr>
-          <w:i/>
-          <w:iCs/>
-        </w:rPr>
-        <w:t xml:space="preserve"> </w:t>
-      </w:r>
-      <w:r>
-        <w:rPr>
-          <w:i/>
-          <w:iCs/>
-        </w:rPr>
-        <w:t xml:space="preserve">Site (22-Co-516)</w:t>
-      </w:r>
-      <w:r>
-        <w:rPr>
-          <w:i/>
-          <w:iCs/>
-        </w:rPr>
-        <w:t xml:space="preserve"> </w:t>
-      </w:r>
-      <w:r>
-        <w:rPr>
-          <w:i/>
-          <w:iCs/>
-        </w:rPr>
-        <w:t xml:space="preserve">Coahoma</w:t>
-      </w:r>
-      <w:r>
-        <w:rPr>
-          <w:i/>
-          <w:iCs/>
-        </w:rPr>
-        <w:t xml:space="preserve"> </w:t>
-      </w:r>
-      <w:r>
-        <w:rPr>
-          <w:i/>
-          <w:iCs/>
-        </w:rPr>
-        <w:t xml:space="preserve">County,</w:t>
-      </w:r>
-      <w:r>
-        <w:rPr>
-          <w:i/>
-          <w:iCs/>
-        </w:rPr>
-        <w:t xml:space="preserve"> </w:t>
-      </w:r>
-      <w:r>
-        <w:rPr>
-          <w:i/>
-          <w:iCs/>
-        </w:rPr>
-        <w:t xml:space="preserve">Mississippi</w:t>
-      </w:r>
-      <w:r>
-        <w:rPr>
-          <w:i/>
-          <w:iCs/>
-        </w:rPr>
-        <w:t xml:space="preserve">: A Late</w:t>
-      </w:r>
-      <w:r>
-        <w:rPr>
-          <w:i/>
-          <w:iCs/>
-        </w:rPr>
-        <w:t xml:space="preserve"> </w:t>
-      </w:r>
-      <w:r>
-        <w:rPr>
-          <w:i/>
-          <w:iCs/>
-        </w:rPr>
-        <w:t xml:space="preserve">Mississippi</w:t>
-      </w:r>
-      <w:r>
-        <w:rPr>
-          <w:i/>
-          <w:iCs/>
-        </w:rPr>
-        <w:t xml:space="preserve"> </w:t>
-      </w:r>
-      <w:r>
-        <w:rPr>
-          <w:i/>
-          <w:iCs/>
-        </w:rPr>
-        <w:t xml:space="preserve">Period Settlement in the Northern</w:t>
-      </w:r>
-      <w:r>
-        <w:rPr>
-          <w:i/>
-          <w:iCs/>
-        </w:rPr>
-        <w:t xml:space="preserve"> </w:t>
-      </w:r>
-      <w:r>
-        <w:rPr>
-          <w:i/>
-          <w:iCs/>
-        </w:rPr>
-        <w:t xml:space="preserve">Yazoo</w:t>
-      </w:r>
-      <w:r>
-        <w:rPr>
-          <w:i/>
-          <w:iCs/>
-        </w:rPr>
-        <w:t xml:space="preserve"> </w:t>
-      </w:r>
-      <w:r>
-        <w:rPr>
-          <w:i/>
-          <w:iCs/>
-        </w:rPr>
-        <w:t xml:space="preserve">of</w:t>
-      </w:r>
-      <w:r>
-        <w:rPr>
-          <w:i/>
-          <w:iCs/>
-        </w:rPr>
-        <w:t xml:space="preserve"> </w:t>
-      </w:r>
-      <w:r>
-        <w:rPr>
-          <w:i/>
-          <w:iCs/>
-        </w:rPr>
-        <w:t xml:space="preserve">Mississippi</w:t>
-      </w:r>
-      <w:r>
-        <w:t xml:space="preserve">, edited by John M. Connaway, pp. 163–222. Archaeological Report No. 14. Mississippi Department of Archives; History, Jackson, MS.</w:t>
-      </w:r>
-    </w:p>
-    <w:bookmarkEnd w:id="324"/>
-    <w:bookmarkStart w:id="326" w:name="ref-sullivan_2024"/>
-    <w:p>
-      <w:pPr>
-        <w:pStyle w:val="Bibliography"/>
-      </w:pPr>
-      <w:r>
-        <w:t xml:space="preserve">Sullivan, Lynne P., Kevin E. Smith, Scott C. Meeks, and Shawn M. Patch. 2024. Tracking</w:t>
-      </w:r>
-      <w:r>
-        <w:t xml:space="preserve"> </w:t>
-      </w:r>
-      <w:r>
-        <w:t xml:space="preserve">Mississippian</w:t>
-      </w:r>
-      <w:r>
-        <w:t xml:space="preserve"> </w:t>
-      </w:r>
-      <w:r>
-        <w:t xml:space="preserve">Migrations from the Central</w:t>
-      </w:r>
-      <w:r>
-        <w:t xml:space="preserve"> </w:t>
-      </w:r>
-      <w:r>
-        <w:t xml:space="preserve">Mississippi</w:t>
-      </w:r>
-      <w:r>
-        <w:t xml:space="preserve"> </w:t>
-      </w:r>
-      <w:r>
-        <w:t xml:space="preserve">Valley to the Ridge and Valley with a Unified Absolute Chronology.</w:t>
-      </w:r>
-      <w:r>
-        <w:t xml:space="preserve"> </w:t>
-      </w:r>
-      <w:r>
-        <w:rPr>
-          <w:i/>
-          <w:iCs/>
-        </w:rPr>
-        <w:t xml:space="preserve">American Antiquity</w:t>
-      </w:r>
-      <w:r>
-        <w:t xml:space="preserve"> </w:t>
-      </w:r>
-      <w:r>
-        <w:t xml:space="preserve">89(2):221–237.</w:t>
-      </w:r>
-      <w:r>
-        <w:t xml:space="preserve"> </w:t>
-      </w:r>
-      <w:hyperlink r:id="rId325">
-        <w:r>
-          <w:rPr>
-            <w:rStyle w:val="Hyperlink"/>
-          </w:rPr>
-          <w:t xml:space="preserve">https://doi.org/10.1017/aaq.2024.1</w:t>
-        </w:r>
-      </w:hyperlink>
-      <w:r>
-        <w:t xml:space="preserve">.</w:t>
-      </w:r>
-    </w:p>
-    <w:bookmarkEnd w:id="326"/>
-    <w:bookmarkStart w:id="327" w:name="ref-tomasovych_kidwell_2009"/>
-    <w:p>
-      <w:pPr>
-        <w:pStyle w:val="Bibliography"/>
-      </w:pPr>
-      <w:r>
-        <w:t xml:space="preserve">Tomašových, Adam, and Susan M. Kidwell. 2009. Fidelity of Variation in Species Composition and Diversity Partitioning by Death Assemblages: Time-Averaging Transfers Diversity from Beta to Alpha Levels.</w:t>
-      </w:r>
-      <w:r>
-        <w:t xml:space="preserve"> </w:t>
-      </w:r>
-      <w:r>
-        <w:rPr>
-          <w:i/>
-          <w:iCs/>
-        </w:rPr>
-        <w:t xml:space="preserve">Paleobiology</w:t>
-      </w:r>
-      <w:r>
-        <w:t xml:space="preserve"> </w:t>
-      </w:r>
-      <w:r>
-        <w:t xml:space="preserve">35(1):94–118.</w:t>
-      </w:r>
-    </w:p>
-    <w:bookmarkEnd w:id="327"/>
-    <w:bookmarkStart w:id="329" w:name="ref-tomasovych_kidwell_2010"/>
-    <w:p>
-      <w:pPr>
-        <w:pStyle w:val="Bibliography"/>
-      </w:pPr>
-      <w:r>
         <w:t xml:space="preserve">Tomašových, Adam, and Susan M. Kidwell. 2010. The Effects of Temporal Resolution on Species Turnover and on Testing Metacommunity Models.</w:t>
       </w:r>
       <w:r>
@@ -9243,7 +9276,7 @@
       <w:r>
         <w:t xml:space="preserve"> </w:t>
       </w:r>
-      <w:hyperlink r:id="rId328">
+      <w:hyperlink r:id="rId322">
         <w:r>
           <w:rPr>
             <w:rStyle w:val="Hyperlink"/>
@@ -9255,8 +9288,8 @@
         <w:t xml:space="preserve">.</w:t>
       </w:r>
     </w:p>
-    <w:bookmarkEnd w:id="329"/>
-    <w:bookmarkStart w:id="330" w:name="ref-willey_phillips_1958"/>
+    <w:bookmarkEnd w:id="323"/>
+    <w:bookmarkStart w:id="324" w:name="ref-willey_phillips_1958"/>
     <w:p>
       <w:pPr>
         <w:pStyle w:val="Bibliography"/>
@@ -9278,8 +9311,8 @@
         <w:t xml:space="preserve">. University of Chicago Press, Chicago.</w:t>
       </w:r>
     </w:p>
-    <w:bookmarkEnd w:id="330"/>
-    <w:bookmarkStart w:id="331" w:name="ref-williams_1954"/>
+    <w:bookmarkEnd w:id="324"/>
+    <w:bookmarkStart w:id="325" w:name="ref-williams_1954"/>
     <w:p>
       <w:pPr>
         <w:pStyle w:val="Bibliography"/>
@@ -9288,8 +9321,8 @@
         <w:t xml:space="preserve">Williams, Stephen. 1954. An Archeological Study of the Mississippian Culture in Southeast Missouri. PhD thesis, Yale University, New Haven.</w:t>
       </w:r>
     </w:p>
-    <w:bookmarkEnd w:id="331"/>
-    <w:bookmarkStart w:id="333" w:name="ref-wright_1943"/>
+    <w:bookmarkEnd w:id="325"/>
+    <w:bookmarkStart w:id="327" w:name="ref-wright_1943"/>
     <w:p>
       <w:pPr>
         <w:pStyle w:val="Bibliography"/>
@@ -9316,7 +9349,7 @@
       <w:r>
         <w:t xml:space="preserve"> </w:t>
       </w:r>
-      <w:hyperlink r:id="rId332">
+      <w:hyperlink r:id="rId326">
         <w:r>
           <w:rPr>
             <w:rStyle w:val="Hyperlink"/>
@@ -9328,8 +9361,8 @@
         <w:t xml:space="preserve">.</w:t>
       </w:r>
     </w:p>
-    <w:bookmarkEnd w:id="333"/>
-    <w:bookmarkStart w:id="335" w:name="ref-wright_1951"/>
+    <w:bookmarkEnd w:id="327"/>
+    <w:bookmarkStart w:id="329" w:name="ref-wright_1951"/>
     <w:p>
       <w:pPr>
         <w:pStyle w:val="Bibliography"/>
@@ -9356,7 +9389,7 @@
       <w:r>
         <w:t xml:space="preserve"> </w:t>
       </w:r>
-      <w:hyperlink r:id="rId334">
+      <w:hyperlink r:id="rId328">
         <w:r>
           <w:rPr>
             <w:rStyle w:val="Hyperlink"/>
@@ -9368,8 +9401,8 @@
         <w:t xml:space="preserve">.</w:t>
       </w:r>
     </w:p>
-    <w:bookmarkEnd w:id="335"/>
-    <w:bookmarkStart w:id="337" w:name="ref-youngblood_miton_morin_2023"/>
+    <w:bookmarkEnd w:id="329"/>
+    <w:bookmarkStart w:id="331" w:name="ref-youngblood_miton_morin_2023"/>
     <w:p>
       <w:pPr>
         <w:pStyle w:val="Bibliography"/>
@@ -9396,7 +9429,7 @@
       <w:r>
         <w:t xml:space="preserve"> </w:t>
       </w:r>
-      <w:hyperlink r:id="rId336">
+      <w:hyperlink r:id="rId330">
         <w:r>
           <w:rPr>
             <w:rStyle w:val="Hyperlink"/>
@@ -9408,10 +9441,10 @@
         <w:t xml:space="preserve">.</w:t>
       </w:r>
     </w:p>
-    <w:bookmarkEnd w:id="337"/>
-    <w:bookmarkEnd w:id="338"/>
-    <w:bookmarkEnd w:id="339"/>
-    <w:bookmarkEnd w:id="340"/>
+    <w:bookmarkEnd w:id="331"/>
+    <w:bookmarkEnd w:id="332"/>
+    <w:bookmarkEnd w:id="333"/>
+    <w:bookmarkEnd w:id="334"/>
     <w:sectPr>
       <w:footerReference r:id="rId100" w:type="default"/>
       <w:footnotePr>

</xml_diff>

<commit_message>
Carry the axis-geography finding and Hollywood dates into the release
Co-Authored-By: Claude Opus 5.5 (1M context) <noreply@anthropic.com>
</commit_message>
<xml_diff>
--- a/docs/manuscript/MAIN_TEXT.docx
+++ b/docs/manuscript/MAIN_TEXT.docx
@@ -2,7 +2,7 @@
 <file path=word/document.xml><?xml version="1.0" encoding="utf-8"?>
 <w:document xmlns:w="http://schemas.openxmlformats.org/wordprocessingml/2006/main" xmlns:m="http://schemas.openxmlformats.org/officeDocument/2006/math" xmlns:r="http://schemas.openxmlformats.org/officeDocument/2006/relationships" xmlns:o="urn:schemas-microsoft-com:office:office" xmlns:v="urn:schemas-microsoft-com:vml" xmlns:w10="urn:schemas-microsoft-com:office:word" xmlns:a="http://schemas.openxmlformats.org/drawingml/2006/main" xmlns:pic="http://schemas.openxmlformats.org/drawingml/2006/picture" xmlns:wp="http://schemas.openxmlformats.org/drawingml/2006/wordprocessingDrawing">
   <w:body>
-    <w:bookmarkStart w:id="334" w:name="X8bf6248c9f3f97f4894a761f3e01800d2c2c84f"/>
+    <w:bookmarkStart w:id="337" w:name="X8bf6248c9f3f97f4894a761f3e01800d2c2c84f"/>
     <w:p>
       <w:pPr>
         <w:pStyle w:val="Heading1"/>
@@ -352,7 +352,22 @@
         <w:t xml:space="preserve">(1970)</w:t>
       </w:r>
       <w:r>
-        <w:t xml:space="preserve">. In practice, however, researchers have treated phases as societies. Willey and Phillips</w:t>
+        <w:t xml:space="preserve">. In practice, however, researchers have treated phases as societies, and the survey phases of the lower valley were built as units</w:t>
+      </w:r>
+      <w:r>
+        <w:t xml:space="preserve"> </w:t>
+      </w:r>
+      <w:r>
+        <w:t xml:space="preserve">“which were also spatial and intended to elucidate sociopolitical boundaries”</w:t>
+      </w:r>
+      <w:r>
+        <w:t xml:space="preserve"> </w:t>
+      </w:r>
+      <w:r>
+        <w:t xml:space="preserve">(Haley 2014)</w:t>
+      </w:r>
+      <w:r>
+        <w:t xml:space="preserve">. Willey and Phillips</w:t>
       </w:r>
       <w:r>
         <w:t xml:space="preserve"> </w:t>
@@ -2026,7 +2041,16 @@
         <w:t xml:space="preserve">(Baxter 1994; Peeples and Schachner 2012; Smith and Neiman 2007)</w:t>
       </w:r>
       <w:r>
-        <w:t xml:space="preserve">. Only four dated proveniences match our assemblages (26 dates pooled), and they cannot establish which end of the axis is later: using pooled calibrated medians, age and position correlate at Spearman 0.40 in magnitude, with Clay Hill out of order, and using one-sigma calibrated midpoints the correlation is zero. We therefore use the axis in its computed orientation, treat it as an order rather than a calendar, and report every result that depends on its direction both ways.</w:t>
+        <w:t xml:space="preserve">. Only four dated proveniences match our assemblages (26 dates pooled), and they cannot establish which end of the axis is later: using pooled calibrated medians, age and position correlate at Spearman 0.40 in magnitude, with Clay Hill out of order, and using one-sigma calibrated midpoints the correlation is zero. The axis also follows geography more closely than time. Its rank correlation with latitude is -0.77, and latitude and longitude together account for 62 percent of its variance; Kent Place and Hollywood, the two earliest dated sites (House 1993 reports an archaeomagnetic date of AD 1345 to 1380 for the Kent floor, and Haley reports calibrated one-sigma ranges of AD 1285 to 1435 for Hollywood), lie at the same end as Clay Hill, the latest</w:t>
+      </w:r>
+      <w:r>
+        <w:t xml:space="preserve"> </w:t>
+      </w:r>
+      <w:r>
+        <w:t xml:space="preserve">(Haley 2014; House 1993:23)</w:t>
+      </w:r>
+      <w:r>
+        <w:t xml:space="preserve">. The first axis is therefore largely a south-to-north gradient in composition, and an order along it is an order in space at least as much as in time. We use it in its computed orientation, report every result that depends on its direction both ways, and treat any trend along it as a trend across the basin rather than through time (Supplemental Text).</w:t>
       </w:r>
     </w:p>
     <w:p>
@@ -2858,7 +2882,7 @@
         <w:pStyle w:val="FirstParagraph"/>
       </w:pPr>
       <w:r>
-        <w:t xml:space="preserve">If phases were becoming bounded groups, differences between them should grow as interaction narrows. They do not (Figure 6). The raw trend in cultural</w:t>
+        <w:t xml:space="preserve">If phases were becoming bounded groups, differences between them should grow as interaction narrows. Along the seriation order they do not (Figure 6), although that order is largely south to north rather than early to late, so this test speaks to change across the basin more than to change through time. The raw trend in cultural</w:t>
       </w:r>
       <w:r>
         <w:t xml:space="preserve"> </w:t>
@@ -5039,7 +5063,19 @@
         <w:pStyle w:val="BodyText"/>
       </w:pPr>
       <w:r>
-        <w:t xml:space="preserve">The remaining difference lies mostly in the two most thinly sampled clusters, not around Parkin, and it appears only where clusters shrink toward the spacing of the assemblages themselves. Restricted copying across boundaries, which these data cannot detect at the calibrated mixing rate, does not produce it either. Of the four simplifications we relaxed, only one reproduces it while keeping diversity matched: new styles arising somewhat locally rather than at the same rates across the whole basin. That account is still neutral copying, and it is itself geographic, since the local innovation profiles follow the same spatial clusters as everything else. It does not require a social frontier.</w:t>
+        <w:t xml:space="preserve">The remaining difference lies mostly in the two most thinly sampled clusters, not around Parkin, and it appears only where clusters shrink toward the spacing of the assemblages themselves. The Walls-area cluster also spans what McNutt, Franklin, and Henry</w:t>
+      </w:r>
+      <w:r>
+        <w:t xml:space="preserve"> </w:t>
+      </w:r>
+      <w:r>
+        <w:t xml:space="preserve">(2012:247)</w:t>
+      </w:r>
+      <w:r>
+        <w:t xml:space="preserve"> </w:t>
+      </w:r>
+      <w:r>
+        <w:t xml:space="preserve">describe as a lineage of about two centuries, so part of its difference may be chronological, a matter of age that an ordinal sequence cannot fully separate from place. Restricted copying across boundaries, which these data cannot detect at the calibrated mixing rate, does not produce it either. Of the four simplifications we relaxed, only one reproduces it while keeping diversity matched: new styles arising somewhat locally rather than at the same rates across the whole basin. That account is still neutral copying, and it is itself geographic, since the local innovation profiles follow the same spatial clusters as everything else. It does not require a social frontier.</w:t>
       </w:r>
     </w:p>
     <w:p>
@@ -5097,7 +5133,31 @@
         <w:t xml:space="preserve"> </w:t>
       </w:r>
       <w:r>
-        <w:t xml:space="preserve">while forming no groups. Nearness in an ordination is nearness on the ground, seen through the pottery. His own redrawn phases make the same point from the other side. Drawn after the ordination, they sit where the pottery differs and no longer form the tightest division of the map. Together the two schemes show one gradient read two ways, once by proximity and once by the pottery, with a boundary in neither. We therefore read a phase as a length scale on a continuous gradient, made visible by where settlement happened to cluster, rather than as a bounded unit. These data cannot say what that length is: sherd counts that differ more than twentyfold, unequal accumulation spans, and an order derived from the same frequencies together limit what any spatial measure can resolve here.</w:t>
+        <w:t xml:space="preserve">while forming no groups. Nearness in an ordination is nearness on the ground, seen through the pottery. His own redrawn phases make the same point from the other side. Drawn after the ordination, they sit where the pottery differs and no longer form the tightest division of the map. Together the two schemes show one gradient read two ways, once by proximity and once by the pottery, with a boundary in neither. A phase also folds time into space. McNutt, Franklin, and Henry</w:t>
+      </w:r>
+      <w:r>
+        <w:t xml:space="preserve"> </w:t>
+      </w:r>
+      <w:r>
+        <w:t xml:space="preserve">(2012:247)</w:t>
+      </w:r>
+      <w:r>
+        <w:t xml:space="preserve"> </w:t>
+      </w:r>
+      <w:r>
+        <w:t xml:space="preserve">describe the Walls phase as</w:t>
+      </w:r>
+      <w:r>
+        <w:t xml:space="preserve"> </w:t>
+      </w:r>
+      <w:r>
+        <w:t xml:space="preserve">“a developmental lineage”</w:t>
+      </w:r>
+      <w:r>
+        <w:t xml:space="preserve"> </w:t>
+      </w:r>
+      <w:r>
+        <w:t xml:space="preserve">spanning roughly two centuries, from earlier sites such as Cheatham and Woodlyn to later occupations at Walls, Irby, and Norfolk, so the members of a phase need not even be contemporaneous. We therefore read a phase as a length scale on a continuous gradient, made visible by where settlement happened to cluster, rather than as a bounded unit. These data cannot say what that length is: sherd counts that differ more than twentyfold, unequal accumulation spans, and an order derived from the same frequencies together limit what any spatial measure can resolve here.</w:t>
       </w:r>
     </w:p>
     <w:p>
@@ -5233,7 +5293,7 @@
         <w:t xml:space="preserve"> </w:t>
       </w:r>
       <w:r>
-        <w:t xml:space="preserve">can detect closure, and only closure expressed as growing divergence between spatial groups. Weaker closure, closure carried purely by conformity within groups, and closure along social divisions that do not follow geography would all escape detection (Supplemental Text). The second is chronology. Radiocarbon dates pool to four matched proveniences across a calibration plateau, and cannot establish which end of the order is later; reversing the order changes the closure posterior only slightly, the copying-model comparison is reported both ways, and the settlement and exchange evidence does not depend on it. The third is time-averaging, which damps differences between assemblages</w:t>
+        <w:t xml:space="preserve">can detect closure, and only closure expressed as growing divergence between spatial groups. Weaker closure, closure carried purely by conformity within groups, and closure along social divisions that do not follow geography would all escape detection (Supplemental Text). The second is chronology. Radiocarbon dates match only a few assemblages, the seriation axis follows latitude more closely than age, and the order of assemblages is therefore not a time sequence. The absence of a growing trend is a weak statement about change through time; the arguments about where the phase lines fall, and what copying across distance produces, do not depend on it, and the copying-model comparison gives nearly the same answer when all assemblages are treated as contemporaneous. The third is time-averaging, which damps differences between assemblages</w:t>
       </w:r>
       <w:r>
         <w:t xml:space="preserve"> </w:t>
@@ -5386,7 +5446,7 @@
       </w:r>
     </w:p>
     <w:bookmarkEnd w:id="182"/>
-    <w:bookmarkStart w:id="333" w:name="references"/>
+    <w:bookmarkStart w:id="336" w:name="references"/>
     <w:p>
       <w:pPr>
         <w:pStyle w:val="Heading2"/>
@@ -5395,7 +5455,7 @@
         <w:t xml:space="preserve">References</w:t>
       </w:r>
     </w:p>
-    <w:bookmarkStart w:id="332" w:name="refs"/>
+    <w:bookmarkStart w:id="335" w:name="refs"/>
     <w:bookmarkStart w:id="183" w:name="ref-anderson_1996"/>
     <w:p>
       <w:pPr>
@@ -6401,12 +6461,70 @@
       </w:r>
     </w:p>
     <w:bookmarkEnd w:id="226"/>
-    <w:bookmarkStart w:id="228" w:name="ref-henrich_2001"/>
+    <w:bookmarkStart w:id="228" w:name="ref-haley_2014"/>
     <w:p>
       <w:pPr>
         <w:pStyle w:val="Bibliography"/>
       </w:pPr>
       <w:r>
+        <w:t xml:space="preserve">Haley, Bryan S. 2014. The Big Picture at</w:t>
+      </w:r>
+      <w:r>
+        <w:t xml:space="preserve"> </w:t>
+      </w:r>
+      <w:r>
+        <w:t xml:space="preserve">Hollywood</w:t>
+      </w:r>
+      <w:r>
+        <w:t xml:space="preserve">: Geophysical and Archaeological Investigations at a</w:t>
+      </w:r>
+      <w:r>
+        <w:t xml:space="preserve"> </w:t>
+      </w:r>
+      <w:r>
+        <w:t xml:space="preserve">Mississippian</w:t>
+      </w:r>
+      <w:r>
+        <w:t xml:space="preserve"> </w:t>
+      </w:r>
+      <w:r>
+        <w:t xml:space="preserve">Mound Centre.</w:t>
+      </w:r>
+      <w:r>
+        <w:t xml:space="preserve"> </w:t>
+      </w:r>
+      <w:r>
+        <w:rPr>
+          <w:i/>
+          <w:iCs/>
+        </w:rPr>
+        <w:t xml:space="preserve">Archaeological Prospection</w:t>
+      </w:r>
+      <w:r>
+        <w:t xml:space="preserve">.</w:t>
+      </w:r>
+      <w:r>
+        <w:t xml:space="preserve"> </w:t>
+      </w:r>
+      <w:hyperlink r:id="rId227">
+        <w:r>
+          <w:rPr>
+            <w:rStyle w:val="Hyperlink"/>
+          </w:rPr>
+          <w:t xml:space="preserve">https://doi.org/10.1002/arp.1477</w:t>
+        </w:r>
+      </w:hyperlink>
+      <w:r>
+        <w:t xml:space="preserve">.</w:t>
+      </w:r>
+    </w:p>
+    <w:bookmarkEnd w:id="228"/>
+    <w:bookmarkStart w:id="230" w:name="ref-henrich_2001"/>
+    <w:p>
+      <w:pPr>
+        <w:pStyle w:val="Bibliography"/>
+      </w:pPr>
+      <w:r>
         <w:t xml:space="preserve">Henrich, Joseph. 2001. Cultural Transmission and the Diffusion of Innovations: Adoption Dynamics Indicate That Biased Cultural Transmission Is the Predominate Force in Behavioral Change.</w:t>
       </w:r>
       <w:r>
@@ -6428,7 +6546,7 @@
       <w:r>
         <w:t xml:space="preserve"> </w:t>
       </w:r>
-      <w:hyperlink r:id="rId227">
+      <w:hyperlink r:id="rId229">
         <w:r>
           <w:rPr>
             <w:rStyle w:val="Hyperlink"/>
@@ -6440,8 +6558,8 @@
         <w:t xml:space="preserve">.</w:t>
       </w:r>
     </w:p>
-    <w:bookmarkEnd w:id="228"/>
-    <w:bookmarkStart w:id="230" w:name="ref-henrich_2004"/>
+    <w:bookmarkEnd w:id="230"/>
+    <w:bookmarkStart w:id="232" w:name="ref-henrich_2004"/>
     <w:p>
       <w:pPr>
         <w:pStyle w:val="Bibliography"/>
@@ -6480,7 +6598,7 @@
       <w:r>
         <w:t xml:space="preserve"> </w:t>
       </w:r>
-      <w:hyperlink r:id="rId229">
+      <w:hyperlink r:id="rId231">
         <w:r>
           <w:rPr>
             <w:rStyle w:val="Hyperlink"/>
@@ -6492,8 +6610,8 @@
         <w:t xml:space="preserve">.</w:t>
       </w:r>
     </w:p>
-    <w:bookmarkEnd w:id="230"/>
-    <w:bookmarkStart w:id="232" w:name="ref-henrich_boyd_1998"/>
+    <w:bookmarkEnd w:id="232"/>
+    <w:bookmarkStart w:id="234" w:name="ref-henrich_boyd_1998"/>
     <w:p>
       <w:pPr>
         <w:pStyle w:val="Bibliography"/>
@@ -6520,7 +6638,7 @@
       <w:r>
         <w:t xml:space="preserve"> </w:t>
       </w:r>
-      <w:hyperlink r:id="rId231">
+      <w:hyperlink r:id="rId233">
         <w:r>
           <w:rPr>
             <w:rStyle w:val="Hyperlink"/>
@@ -6532,8 +6650,8 @@
         <w:t xml:space="preserve">.</w:t>
       </w:r>
     </w:p>
-    <w:bookmarkEnd w:id="232"/>
-    <w:bookmarkStart w:id="233" w:name="ref-holdaway_wandsnider_2008"/>
+    <w:bookmarkEnd w:id="234"/>
+    <w:bookmarkStart w:id="235" w:name="ref-holdaway_wandsnider_2008"/>
     <w:p>
       <w:pPr>
         <w:pStyle w:val="Bibliography"/>
@@ -6555,8 +6673,8 @@
         <w:t xml:space="preserve">. University of Utah Press, Salt Lake City.</w:t>
       </w:r>
     </w:p>
-    <w:bookmarkEnd w:id="233"/>
-    <w:bookmarkStart w:id="235" w:name="ref-holland-lulewicz_ritchison_2021"/>
+    <w:bookmarkEnd w:id="235"/>
+    <w:bookmarkStart w:id="237" w:name="ref-holland-lulewicz_ritchison_2021"/>
     <w:p>
       <w:pPr>
         <w:pStyle w:val="Bibliography"/>
@@ -6583,7 +6701,7 @@
       <w:r>
         <w:t xml:space="preserve"> </w:t>
       </w:r>
-      <w:hyperlink r:id="rId234">
+      <w:hyperlink r:id="rId236">
         <w:r>
           <w:rPr>
             <w:rStyle w:val="Hyperlink"/>
@@ -6595,8 +6713,8 @@
         <w:t xml:space="preserve">.</w:t>
       </w:r>
     </w:p>
-    <w:bookmarkEnd w:id="235"/>
-    <w:bookmarkStart w:id="236" w:name="ref-house_1991"/>
+    <w:bookmarkEnd w:id="237"/>
+    <w:bookmarkStart w:id="238" w:name="ref-house_1991"/>
     <w:p>
       <w:pPr>
         <w:pStyle w:val="Bibliography"/>
@@ -6638,8 +6756,8 @@
         <w:t xml:space="preserve">. PhD thesis, Southern Illinois University at Carbondale, Carbondale.</w:t>
       </w:r>
     </w:p>
-    <w:bookmarkEnd w:id="236"/>
-    <w:bookmarkStart w:id="237" w:name="ref-house_1993"/>
+    <w:bookmarkEnd w:id="238"/>
+    <w:bookmarkStart w:id="239" w:name="ref-house_1993"/>
     <w:p>
       <w:pPr>
         <w:pStyle w:val="Bibliography"/>
@@ -6664,8 +6782,8 @@
         <w:t xml:space="preserve">12(1):21–32.</w:t>
       </w:r>
     </w:p>
-    <w:bookmarkEnd w:id="237"/>
-    <w:bookmarkStart w:id="238" w:name="ref-hudson_smith_depratter_1990"/>
+    <w:bookmarkEnd w:id="239"/>
+    <w:bookmarkStart w:id="240" w:name="ref-hudson_smith_depratter_1990"/>
     <w:p>
       <w:pPr>
         <w:pStyle w:val="Bibliography"/>
@@ -6725,8 +6843,8 @@
         <w:t xml:space="preserve">, edited by David H. Dye and Cheryl Anne Cox, pp. 181–207. University of Alabama Press, Tuscaloosa.</w:t>
       </w:r>
     </w:p>
-    <w:bookmarkEnd w:id="238"/>
-    <w:bookmarkStart w:id="240" w:name="ref-hunt_2006"/>
+    <w:bookmarkEnd w:id="240"/>
+    <w:bookmarkStart w:id="242" w:name="ref-hunt_2006"/>
     <w:p>
       <w:pPr>
         <w:pStyle w:val="Bibliography"/>
@@ -6753,7 +6871,7 @@
       <w:r>
         <w:t xml:space="preserve"> </w:t>
       </w:r>
-      <w:hyperlink r:id="rId239">
+      <w:hyperlink r:id="rId241">
         <w:r>
           <w:rPr>
             <w:rStyle w:val="Hyperlink"/>
@@ -6765,8 +6883,8 @@
         <w:t xml:space="preserve">.</w:t>
       </w:r>
     </w:p>
-    <w:bookmarkEnd w:id="240"/>
-    <w:bookmarkStart w:id="242" w:name="ref-hunt_bell_travis_2008"/>
+    <w:bookmarkEnd w:id="242"/>
+    <w:bookmarkStart w:id="244" w:name="ref-hunt_bell_travis_2008"/>
     <w:p>
       <w:pPr>
         <w:pStyle w:val="Bibliography"/>
@@ -6793,7 +6911,7 @@
       <w:r>
         <w:t xml:space="preserve"> </w:t>
       </w:r>
-      <w:hyperlink r:id="rId241">
+      <w:hyperlink r:id="rId243">
         <w:r>
           <w:rPr>
             <w:rStyle w:val="Hyperlink"/>
@@ -6805,8 +6923,8 @@
         <w:t xml:space="preserve">.</w:t>
       </w:r>
     </w:p>
-    <w:bookmarkEnd w:id="242"/>
-    <w:bookmarkStart w:id="243" w:name="ref-hurlbert_1971"/>
+    <w:bookmarkEnd w:id="244"/>
+    <w:bookmarkStart w:id="245" w:name="ref-hurlbert_1971"/>
     <w:p>
       <w:pPr>
         <w:pStyle w:val="Bibliography"/>
@@ -6831,8 +6949,8 @@
         <w:t xml:space="preserve">52(4):577–586.</w:t>
       </w:r>
     </w:p>
-    <w:bookmarkEnd w:id="243"/>
-    <w:bookmarkStart w:id="245" w:name="ref-kandler_shennan_2013"/>
+    <w:bookmarkEnd w:id="245"/>
+    <w:bookmarkStart w:id="247" w:name="ref-kandler_shennan_2013"/>
     <w:p>
       <w:pPr>
         <w:pStyle w:val="Bibliography"/>
@@ -6859,7 +6977,7 @@
       <w:r>
         <w:t xml:space="preserve"> </w:t>
       </w:r>
-      <w:hyperlink r:id="rId244">
+      <w:hyperlink r:id="rId246">
         <w:r>
           <w:rPr>
             <w:rStyle w:val="Hyperlink"/>
@@ -6871,8 +6989,8 @@
         <w:t xml:space="preserve">.</w:t>
       </w:r>
     </w:p>
-    <w:bookmarkEnd w:id="245"/>
-    <w:bookmarkStart w:id="247" w:name="ref-kandler_shennan_2015"/>
+    <w:bookmarkEnd w:id="247"/>
+    <w:bookmarkStart w:id="249" w:name="ref-kandler_shennan_2015"/>
     <w:p>
       <w:pPr>
         <w:pStyle w:val="Bibliography"/>
@@ -6911,7 +7029,7 @@
       <w:r>
         <w:t xml:space="preserve"> </w:t>
       </w:r>
-      <w:hyperlink r:id="rId246">
+      <w:hyperlink r:id="rId248">
         <w:r>
           <w:rPr>
             <w:rStyle w:val="Hyperlink"/>
@@ -6923,8 +7041,8 @@
         <w:t xml:space="preserve">.</w:t>
       </w:r>
     </w:p>
-    <w:bookmarkEnd w:id="247"/>
-    <w:bookmarkStart w:id="249" w:name="ref-kandler_wilder_fortunato_2017"/>
+    <w:bookmarkEnd w:id="249"/>
+    <w:bookmarkStart w:id="251" w:name="ref-kandler_wilder_fortunato_2017"/>
     <w:p>
       <w:pPr>
         <w:pStyle w:val="Bibliography"/>
@@ -6951,7 +7069,7 @@
       <w:r>
         <w:t xml:space="preserve"> </w:t>
       </w:r>
-      <w:hyperlink r:id="rId248">
+      <w:hyperlink r:id="rId250">
         <w:r>
           <w:rPr>
             <w:rStyle w:val="Hyperlink"/>
@@ -6963,8 +7081,8 @@
         <w:t xml:space="preserve">.</w:t>
       </w:r>
     </w:p>
-    <w:bookmarkEnd w:id="249"/>
-    <w:bookmarkStart w:id="251" w:name="ref-kidwell_tomasovych_2013"/>
+    <w:bookmarkEnd w:id="251"/>
+    <w:bookmarkStart w:id="253" w:name="ref-kidwell_tomasovych_2013"/>
     <w:p>
       <w:pPr>
         <w:pStyle w:val="Bibliography"/>
@@ -6991,7 +7109,7 @@
       <w:r>
         <w:t xml:space="preserve"> </w:t>
       </w:r>
-      <w:hyperlink r:id="rId250">
+      <w:hyperlink r:id="rId252">
         <w:r>
           <w:rPr>
             <w:rStyle w:val="Hyperlink"/>
@@ -7003,8 +7121,8 @@
         <w:t xml:space="preserve">.</w:t>
       </w:r>
     </w:p>
-    <w:bookmarkEnd w:id="251"/>
-    <w:bookmarkStart w:id="252" w:name="ref-king_freer_1995"/>
+    <w:bookmarkEnd w:id="253"/>
+    <w:bookmarkStart w:id="254" w:name="ref-king_freer_1995"/>
     <w:p>
       <w:pPr>
         <w:pStyle w:val="Bibliography"/>
@@ -7038,8 +7156,8 @@
         <w:t xml:space="preserve">, edited by Michael S. Nassaney and Kenneth E. Sassaman, pp. 266–288. University of Tennessee Press, Knoxville.</w:t>
       </w:r>
     </w:p>
-    <w:bookmarkEnd w:id="252"/>
-    <w:bookmarkStart w:id="253" w:name="ref-lehner_grill_2013"/>
+    <w:bookmarkEnd w:id="254"/>
+    <w:bookmarkStart w:id="255" w:name="ref-lehner_grill_2013"/>
     <w:p>
       <w:pPr>
         <w:pStyle w:val="Bibliography"/>
@@ -7064,8 +7182,8 @@
         <w:t xml:space="preserve">27(15):2171–2186.</w:t>
       </w:r>
     </w:p>
-    <w:bookmarkEnd w:id="253"/>
-    <w:bookmarkStart w:id="254" w:name="ref-lipo_2001"/>
+    <w:bookmarkEnd w:id="255"/>
+    <w:bookmarkStart w:id="256" w:name="ref-lipo_2001"/>
     <w:p>
       <w:pPr>
         <w:pStyle w:val="Bibliography"/>
@@ -7115,8 +7233,8 @@
         <w:t xml:space="preserve">. BAR International Series 918. Archaeopress, Oxford.</w:t>
       </w:r>
     </w:p>
-    <w:bookmarkEnd w:id="254"/>
-    <w:bookmarkStart w:id="256" w:name="ref-lipo_dinapoli_madsen_hunt_2021"/>
+    <w:bookmarkEnd w:id="256"/>
+    <w:bookmarkStart w:id="258" w:name="ref-lipo_dinapoli_madsen_hunt_2021"/>
     <w:p>
       <w:pPr>
         <w:pStyle w:val="Bibliography"/>
@@ -7143,7 +7261,7 @@
       <w:r>
         <w:t xml:space="preserve"> </w:t>
       </w:r>
-      <w:hyperlink r:id="rId255">
+      <w:hyperlink r:id="rId257">
         <w:r>
           <w:rPr>
             <w:rStyle w:val="Hyperlink"/>
@@ -7155,8 +7273,8 @@
         <w:t xml:space="preserve">.</w:t>
       </w:r>
     </w:p>
-    <w:bookmarkEnd w:id="256"/>
-    <w:bookmarkStart w:id="257" w:name="ref-lipo_dunnell_2007"/>
+    <w:bookmarkEnd w:id="258"/>
+    <w:bookmarkStart w:id="259" w:name="ref-lipo_dunnell_2007"/>
     <w:p>
       <w:pPr>
         <w:pStyle w:val="Bibliography"/>
@@ -7218,8 +7336,8 @@
         <w:t xml:space="preserve">, edited by Janet Rafferty and Evan Peacock, pp. 125–167. University of Alabama Press, Tuscaloosa.</w:t>
       </w:r>
     </w:p>
-    <w:bookmarkEnd w:id="257"/>
-    <w:bookmarkStart w:id="258" w:name="ref-lipo_madsen_2001"/>
+    <w:bookmarkEnd w:id="259"/>
+    <w:bookmarkStart w:id="260" w:name="ref-lipo_madsen_2001"/>
     <w:p>
       <w:pPr>
         <w:pStyle w:val="Bibliography"/>
@@ -7253,8 +7371,8 @@
         <w:t xml:space="preserve">, edited by Teresa D. Hurt and Gordon F. M. Rakita, pp. 91–118. Bergin &amp; Garvey, Westport, Connecticut.</w:t>
       </w:r>
     </w:p>
-    <w:bookmarkEnd w:id="258"/>
-    <w:bookmarkStart w:id="260" w:name="ref-lipo_madsen_dunnell_2015"/>
+    <w:bookmarkEnd w:id="260"/>
+    <w:bookmarkStart w:id="262" w:name="ref-lipo_madsen_dunnell_2015"/>
     <w:p>
       <w:pPr>
         <w:pStyle w:val="Bibliography"/>
@@ -7281,7 +7399,7 @@
       <w:r>
         <w:t xml:space="preserve"> </w:t>
       </w:r>
-      <w:hyperlink r:id="rId259">
+      <w:hyperlink r:id="rId261">
         <w:r>
           <w:rPr>
             <w:rStyle w:val="Hyperlink"/>
@@ -7293,8 +7411,8 @@
         <w:t xml:space="preserve">.</w:t>
       </w:r>
     </w:p>
-    <w:bookmarkEnd w:id="260"/>
-    <w:bookmarkStart w:id="262" w:name="ref-lipo_madsen_dunnell_hunt_1997"/>
+    <w:bookmarkEnd w:id="262"/>
+    <w:bookmarkStart w:id="264" w:name="ref-lipo_madsen_dunnell_hunt_1997"/>
     <w:p>
       <w:pPr>
         <w:pStyle w:val="Bibliography"/>
@@ -7321,7 +7439,7 @@
       <w:r>
         <w:t xml:space="preserve"> </w:t>
       </w:r>
-      <w:hyperlink r:id="rId261">
+      <w:hyperlink r:id="rId263">
         <w:r>
           <w:rPr>
             <w:rStyle w:val="Hyperlink"/>
@@ -7333,8 +7451,8 @@
         <w:t xml:space="preserve">.</w:t>
       </w:r>
     </w:p>
-    <w:bookmarkEnd w:id="262"/>
-    <w:bookmarkStart w:id="263" w:name="ref-madsen_2012"/>
+    <w:bookmarkEnd w:id="264"/>
+    <w:bookmarkStart w:id="265" w:name="ref-madsen_2012"/>
     <w:p>
       <w:pPr>
         <w:pStyle w:val="Bibliography"/>
@@ -7343,8 +7461,8 @@
         <w:t xml:space="preserve">Madsen, Mark E. 2012. Neutral Cultural Transmission in Time-Averaged Archaeological Assemblages. arXiv preprint arXiv:1204.2043 [physics.soc-ph].</w:t>
       </w:r>
     </w:p>
-    <w:bookmarkEnd w:id="263"/>
-    <w:bookmarkStart w:id="264" w:name="ref-mainfort_1996"/>
+    <w:bookmarkEnd w:id="265"/>
+    <w:bookmarkStart w:id="266" w:name="ref-mainfort_1996"/>
     <w:p>
       <w:pPr>
         <w:pStyle w:val="Bibliography"/>
@@ -7393,8 +7511,8 @@
         <w:t xml:space="preserve">15(2):172–181.</w:t>
       </w:r>
     </w:p>
-    <w:bookmarkEnd w:id="264"/>
-    <w:bookmarkStart w:id="265" w:name="ref-mainfort_2001"/>
+    <w:bookmarkEnd w:id="266"/>
+    <w:bookmarkStart w:id="267" w:name="ref-mainfort_2001"/>
     <w:p>
       <w:pPr>
         <w:pStyle w:val="Bibliography"/>
@@ -7428,8 +7546,8 @@
         <w:t xml:space="preserve">, edited by David S. Brose, C. Wesley Cowan, and Jr. Mainfort Robert C., pp. 173–190. Smithsonian Institution Press, Washington, DC.</w:t>
       </w:r>
     </w:p>
-    <w:bookmarkEnd w:id="265"/>
-    <w:bookmarkStart w:id="266" w:name="ref-mainfort_2003"/>
+    <w:bookmarkEnd w:id="267"/>
+    <w:bookmarkStart w:id="268" w:name="ref-mainfort_2003"/>
     <w:p>
       <w:pPr>
         <w:pStyle w:val="Bibliography"/>
@@ -7466,8 +7584,8 @@
         <w:t xml:space="preserve">22(2):176–184.</w:t>
       </w:r>
     </w:p>
-    <w:bookmarkEnd w:id="266"/>
-    <w:bookmarkStart w:id="267" w:name="ref-mayr_1959"/>
+    <w:bookmarkEnd w:id="268"/>
+    <w:bookmarkStart w:id="269" w:name="ref-mayr_1959"/>
     <w:p>
       <w:pPr>
         <w:pStyle w:val="Bibliography"/>
@@ -7489,8 +7607,8 @@
         <w:t xml:space="preserve">, edited by Betty J. Meggers, pp. 409–412. The Anthropological Society of Washington, Washington, D.C.</w:t>
       </w:r>
     </w:p>
-    <w:bookmarkEnd w:id="267"/>
-    <w:bookmarkStart w:id="268" w:name="ref-mcnutt_1996"/>
+    <w:bookmarkEnd w:id="269"/>
+    <w:bookmarkStart w:id="270" w:name="ref-mcnutt_1996"/>
     <w:p>
       <w:pPr>
         <w:pStyle w:val="Bibliography"/>
@@ -7552,13 +7670,108 @@
         <w:t xml:space="preserve">, edited by Charles H. McNutt, pp. 187–. University of Alabama Press, Tuscaloosa.</w:t>
       </w:r>
     </w:p>
-    <w:bookmarkEnd w:id="268"/>
-    <w:bookmarkStart w:id="269" w:name="ref-mesoudi_2021"/>
+    <w:bookmarkEnd w:id="270"/>
+    <w:bookmarkStart w:id="271" w:name="ref-mcnutt_franklin_henry_2012"/>
     <w:p>
       <w:pPr>
         <w:pStyle w:val="Bibliography"/>
       </w:pPr>
       <w:r>
+        <w:t xml:space="preserve">McNutt, Charles H., Jay D. Franklin, and Edward R. Henry. 2012. New Perspectives on</w:t>
+      </w:r>
+      <w:r>
+        <w:t xml:space="preserve"> </w:t>
+      </w:r>
+      <w:r>
+        <w:t xml:space="preserve">Mississippian</w:t>
+      </w:r>
+      <w:r>
+        <w:t xml:space="preserve"> </w:t>
+      </w:r>
+      <w:r>
+        <w:t xml:space="preserve">Occupations in Western</w:t>
+      </w:r>
+      <w:r>
+        <w:t xml:space="preserve"> </w:t>
+      </w:r>
+      <w:r>
+        <w:t xml:space="preserve">Tennessee</w:t>
+      </w:r>
+      <w:r>
+        <w:t xml:space="preserve"> </w:t>
+      </w:r>
+      <w:r>
+        <w:t xml:space="preserve">and Northwestern</w:t>
+      </w:r>
+      <w:r>
+        <w:t xml:space="preserve"> </w:t>
+      </w:r>
+      <w:r>
+        <w:t xml:space="preserve">Mississippi</w:t>
+      </w:r>
+      <w:r>
+        <w:t xml:space="preserve">: Recent Chronological and Geophysical Investigations at</w:t>
+      </w:r>
+      <w:r>
+        <w:t xml:space="preserve"> </w:t>
+      </w:r>
+      <w:r>
+        <w:t xml:space="preserve">Chucalissa</w:t>
+      </w:r>
+      <w:r>
+        <w:t xml:space="preserve"> </w:t>
+      </w:r>
+      <w:r>
+        <w:t xml:space="preserve">(40SY1),</w:t>
+      </w:r>
+      <w:r>
+        <w:t xml:space="preserve"> </w:t>
+      </w:r>
+      <w:r>
+        <w:t xml:space="preserve">Shelby</w:t>
+      </w:r>
+      <w:r>
+        <w:t xml:space="preserve"> </w:t>
+      </w:r>
+      <w:r>
+        <w:t xml:space="preserve">County</w:t>
+      </w:r>
+      <w:r>
+        <w:t xml:space="preserve">,</w:t>
+      </w:r>
+      <w:r>
+        <w:t xml:space="preserve"> </w:t>
+      </w:r>
+      <w:r>
+        <w:t xml:space="preserve">Tennessee</w:t>
+      </w:r>
+      <w:r>
+        <w:t xml:space="preserve">.</w:t>
+      </w:r>
+      <w:r>
+        <w:t xml:space="preserve"> </w:t>
+      </w:r>
+      <w:r>
+        <w:rPr>
+          <w:i/>
+          <w:iCs/>
+        </w:rPr>
+        <w:t xml:space="preserve">Southeastern Archaeology</w:t>
+      </w:r>
+      <w:r>
+        <w:t xml:space="preserve"> </w:t>
+      </w:r>
+      <w:r>
+        <w:t xml:space="preserve">31(2):231–250.</w:t>
+      </w:r>
+    </w:p>
+    <w:bookmarkEnd w:id="271"/>
+    <w:bookmarkStart w:id="272" w:name="ref-mesoudi_2021"/>
+    <w:p>
+      <w:pPr>
+        <w:pStyle w:val="Bibliography"/>
+      </w:pPr>
+      <w:r>
         <w:t xml:space="preserve">Mesoudi, Alex. 2021. Cultural Selection and Biased Transformation: Two Dynamics of Cultural Evolution.</w:t>
       </w:r>
       <w:r>
@@ -7578,8 +7791,8 @@
         <w:t xml:space="preserve">376:20200053.</w:t>
       </w:r>
     </w:p>
-    <w:bookmarkEnd w:id="269"/>
-    <w:bookmarkStart w:id="271" w:name="ref-miller_atkins_premo_2018"/>
+    <w:bookmarkEnd w:id="272"/>
+    <w:bookmarkStart w:id="274" w:name="ref-miller_atkins_premo_2018"/>
     <w:p>
       <w:pPr>
         <w:pStyle w:val="Bibliography"/>
@@ -7606,7 +7819,7 @@
       <w:r>
         <w:t xml:space="preserve"> </w:t>
       </w:r>
-      <w:hyperlink r:id="rId270">
+      <w:hyperlink r:id="rId273">
         <w:r>
           <w:rPr>
             <w:rStyle w:val="Hyperlink"/>
@@ -7618,8 +7831,8 @@
         <w:t xml:space="preserve">.</w:t>
       </w:r>
     </w:p>
-    <w:bookmarkEnd w:id="271"/>
-    <w:bookmarkStart w:id="272" w:name="ref-mitchem_2001"/>
+    <w:bookmarkEnd w:id="274"/>
+    <w:bookmarkStart w:id="275" w:name="ref-mitchem_2001"/>
     <w:p>
       <w:pPr>
         <w:pStyle w:val="Bibliography"/>
@@ -7649,8 +7862,8 @@
         <w:t xml:space="preserve">.</w:t>
       </w:r>
     </w:p>
-    <w:bookmarkEnd w:id="272"/>
-    <w:bookmarkStart w:id="273" w:name="ref-mitchem_2017"/>
+    <w:bookmarkEnd w:id="275"/>
+    <w:bookmarkStart w:id="276" w:name="ref-mitchem_2017"/>
     <w:p>
       <w:pPr>
         <w:pStyle w:val="Bibliography"/>
@@ -7701,8 +7914,8 @@
         <w:t xml:space="preserve">’s 1541 Cross.</w:t>
       </w:r>
     </w:p>
-    <w:bookmarkEnd w:id="273"/>
-    <w:bookmarkStart w:id="274" w:name="ref-morse_d_1990"/>
+    <w:bookmarkEnd w:id="276"/>
+    <w:bookmarkStart w:id="277" w:name="ref-morse_d_1990"/>
     <w:p>
       <w:pPr>
         <w:pStyle w:val="Bibliography"/>
@@ -7750,8 +7963,8 @@
         <w:t xml:space="preserve">, edited by David H. Dye and Cheryl Anne Cox, pp. 69–97. University of Alabama Press, Tuscaloosa.</w:t>
       </w:r>
     </w:p>
-    <w:bookmarkEnd w:id="274"/>
-    <w:bookmarkStart w:id="275" w:name="ref-morse_morse_1996"/>
+    <w:bookmarkEnd w:id="277"/>
+    <w:bookmarkStart w:id="278" w:name="ref-morse_morse_1996"/>
     <w:p>
       <w:pPr>
         <w:pStyle w:val="Bibliography"/>
@@ -7788,8 +8001,8 @@
         <w:t xml:space="preserve">17(1):1–35.</w:t>
       </w:r>
     </w:p>
-    <w:bookmarkEnd w:id="275"/>
-    <w:bookmarkStart w:id="276" w:name="ref-morse_p_1981"/>
+    <w:bookmarkEnd w:id="278"/>
+    <w:bookmarkStart w:id="279" w:name="ref-morse_p_1981"/>
     <w:p>
       <w:pPr>
         <w:pStyle w:val="Bibliography"/>
@@ -7860,8 +8073,8 @@
         <w:t xml:space="preserve">. Arkansas Archeological Survey Research Series 13. Arkansas Archeological Survey, Fayetteville.</w:t>
       </w:r>
     </w:p>
-    <w:bookmarkEnd w:id="276"/>
-    <w:bookmarkStart w:id="277" w:name="ref-morse_1990"/>
+    <w:bookmarkEnd w:id="279"/>
+    <w:bookmarkStart w:id="280" w:name="ref-morse_1990"/>
     <w:p>
       <w:pPr>
         <w:pStyle w:val="Bibliography"/>
@@ -7921,8 +8134,8 @@
         <w:t xml:space="preserve">, edited by David H. Dye and Cheryl Anne Cox, pp. 118–134. University of Alabama Press, Tuscaloosa.</w:t>
       </w:r>
     </w:p>
-    <w:bookmarkEnd w:id="277"/>
-    <w:bookmarkStart w:id="279" w:name="ref-nei_1973"/>
+    <w:bookmarkEnd w:id="280"/>
+    <w:bookmarkStart w:id="282" w:name="ref-nei_1973"/>
     <w:p>
       <w:pPr>
         <w:pStyle w:val="Bibliography"/>
@@ -7949,7 +8162,7 @@
       <w:r>
         <w:t xml:space="preserve"> </w:t>
       </w:r>
-      <w:hyperlink r:id="rId278">
+      <w:hyperlink r:id="rId281">
         <w:r>
           <w:rPr>
             <w:rStyle w:val="Hyperlink"/>
@@ -7961,8 +8174,8 @@
         <w:t xml:space="preserve">.</w:t>
       </w:r>
     </w:p>
-    <w:bookmarkEnd w:id="279"/>
-    <w:bookmarkStart w:id="280" w:name="ref-neiman_1995"/>
+    <w:bookmarkEnd w:id="282"/>
+    <w:bookmarkStart w:id="283" w:name="ref-neiman_1995"/>
     <w:p>
       <w:pPr>
         <w:pStyle w:val="Bibliography"/>
@@ -8005,8 +8218,8 @@
         <w:t xml:space="preserve">60(1):7–36.</w:t>
       </w:r>
     </w:p>
-    <w:bookmarkEnd w:id="280"/>
-    <w:bookmarkStart w:id="281" w:name="ref-obrien_leonard_2001"/>
+    <w:bookmarkEnd w:id="283"/>
+    <w:bookmarkStart w:id="284" w:name="ref-obrien_leonard_2001"/>
     <w:p>
       <w:pPr>
         <w:pStyle w:val="Bibliography"/>
@@ -8028,8 +8241,8 @@
         <w:t xml:space="preserve">, edited by Teresa D. Hurt and Gordon F. M. Rakita, pp. 1–23. Bergin &amp; Garvey, Westport, Connecticut.</w:t>
       </w:r>
     </w:p>
-    <w:bookmarkEnd w:id="281"/>
-    <w:bookmarkStart w:id="283" w:name="ref-odwyer_kandler_2017"/>
+    <w:bookmarkEnd w:id="284"/>
+    <w:bookmarkStart w:id="286" w:name="ref-odwyer_kandler_2017"/>
     <w:p>
       <w:pPr>
         <w:pStyle w:val="Bibliography"/>
@@ -8056,7 +8269,7 @@
       <w:r>
         <w:t xml:space="preserve"> </w:t>
       </w:r>
-      <w:hyperlink r:id="rId282">
+      <w:hyperlink r:id="rId285">
         <w:r>
           <w:rPr>
             <w:rStyle w:val="Hyperlink"/>
@@ -8068,8 +8281,8 @@
         <w:t xml:space="preserve">.</w:t>
       </w:r>
     </w:p>
-    <w:bookmarkEnd w:id="283"/>
-    <w:bookmarkStart w:id="285" w:name="ref-peebles_kus_1977"/>
+    <w:bookmarkEnd w:id="286"/>
+    <w:bookmarkStart w:id="288" w:name="ref-peebles_kus_1977"/>
     <w:p>
       <w:pPr>
         <w:pStyle w:val="Bibliography"/>
@@ -8096,7 +8309,7 @@
       <w:r>
         <w:t xml:space="preserve"> </w:t>
       </w:r>
-      <w:hyperlink r:id="rId284">
+      <w:hyperlink r:id="rId287">
         <w:r>
           <w:rPr>
             <w:rStyle w:val="Hyperlink"/>
@@ -8108,8 +8321,8 @@
         <w:t xml:space="preserve">.</w:t>
       </w:r>
     </w:p>
-    <w:bookmarkEnd w:id="285"/>
-    <w:bookmarkStart w:id="287" w:name="ref-peeples_schachner_2012"/>
+    <w:bookmarkEnd w:id="288"/>
+    <w:bookmarkStart w:id="290" w:name="ref-peeples_schachner_2012"/>
     <w:p>
       <w:pPr>
         <w:pStyle w:val="Bibliography"/>
@@ -8136,7 +8349,7 @@
       <w:r>
         <w:t xml:space="preserve"> </w:t>
       </w:r>
-      <w:hyperlink r:id="rId286">
+      <w:hyperlink r:id="rId289">
         <w:r>
           <w:rPr>
             <w:rStyle w:val="Hyperlink"/>
@@ -8148,8 +8361,8 @@
         <w:t xml:space="preserve">.</w:t>
       </w:r>
     </w:p>
-    <w:bookmarkEnd w:id="287"/>
-    <w:bookmarkStart w:id="289" w:name="ref-perreault_2018"/>
+    <w:bookmarkEnd w:id="290"/>
+    <w:bookmarkStart w:id="292" w:name="ref-perreault_2018"/>
     <w:p>
       <w:pPr>
         <w:pStyle w:val="Bibliography"/>
@@ -8176,7 +8389,7 @@
       <w:r>
         <w:t xml:space="preserve"> </w:t>
       </w:r>
-      <w:hyperlink r:id="rId288">
+      <w:hyperlink r:id="rId291">
         <w:r>
           <w:rPr>
             <w:rStyle w:val="Hyperlink"/>
@@ -8188,8 +8401,8 @@
         <w:t xml:space="preserve">.</w:t>
       </w:r>
     </w:p>
-    <w:bookmarkEnd w:id="289"/>
-    <w:bookmarkStart w:id="290" w:name="ref-perreault_2019"/>
+    <w:bookmarkEnd w:id="292"/>
+    <w:bookmarkStart w:id="293" w:name="ref-perreault_2019"/>
     <w:p>
       <w:pPr>
         <w:pStyle w:val="Bibliography"/>
@@ -8211,8 +8424,8 @@
         <w:t xml:space="preserve">. University of Chicago Press, Chicago.</w:t>
       </w:r>
     </w:p>
-    <w:bookmarkEnd w:id="290"/>
-    <w:bookmarkStart w:id="291" w:name="ref-phillips_1970"/>
+    <w:bookmarkEnd w:id="293"/>
+    <w:bookmarkStart w:id="294" w:name="ref-phillips_1970"/>
     <w:p>
       <w:pPr>
         <w:pStyle w:val="Bibliography"/>
@@ -8283,8 +8496,8 @@
         <w:t xml:space="preserve">, Vol. 60. Papers of the Peabody Museum of Archaeology and Ethnology. Peabody Museum, Harvard University, Cambridge, MA.</w:t>
       </w:r>
     </w:p>
-    <w:bookmarkEnd w:id="291"/>
-    <w:bookmarkStart w:id="292" w:name="ref-phillips_ford_griffin_1951"/>
+    <w:bookmarkEnd w:id="294"/>
+    <w:bookmarkStart w:id="295" w:name="ref-phillips_ford_griffin_1951"/>
     <w:p>
       <w:pPr>
         <w:pStyle w:val="Bibliography"/>
@@ -8334,8 +8547,8 @@
         <w:t xml:space="preserve">, Vol. 25. Papers of the Peabody Museum of American Archaeology and Ethnology. Peabody Museum, Harvard University, Cambridge, MA.</w:t>
       </w:r>
     </w:p>
-    <w:bookmarkEnd w:id="292"/>
-    <w:bookmarkStart w:id="294" w:name="ref-phillips_willey_1953"/>
+    <w:bookmarkEnd w:id="295"/>
+    <w:bookmarkStart w:id="297" w:name="ref-phillips_willey_1953"/>
     <w:p>
       <w:pPr>
         <w:pStyle w:val="Bibliography"/>
@@ -8362,7 +8575,7 @@
       <w:r>
         <w:t xml:space="preserve"> </w:t>
       </w:r>
-      <w:hyperlink r:id="rId293">
+      <w:hyperlink r:id="rId296">
         <w:r>
           <w:rPr>
             <w:rStyle w:val="Hyperlink"/>
@@ -8374,8 +8587,8 @@
         <w:t xml:space="preserve">.</w:t>
       </w:r>
     </w:p>
-    <w:bookmarkEnd w:id="294"/>
-    <w:bookmarkStart w:id="296" w:name="ref-powell_shennan_thomas_2009"/>
+    <w:bookmarkEnd w:id="297"/>
+    <w:bookmarkStart w:id="299" w:name="ref-powell_shennan_thomas_2009"/>
     <w:p>
       <w:pPr>
         <w:pStyle w:val="Bibliography"/>
@@ -8414,7 +8627,7 @@
       <w:r>
         <w:t xml:space="preserve"> </w:t>
       </w:r>
-      <w:hyperlink r:id="rId295">
+      <w:hyperlink r:id="rId298">
         <w:r>
           <w:rPr>
             <w:rStyle w:val="Hyperlink"/>
@@ -8426,8 +8639,8 @@
         <w:t xml:space="preserve">.</w:t>
       </w:r>
     </w:p>
-    <w:bookmarkEnd w:id="296"/>
-    <w:bookmarkStart w:id="298" w:name="ref-premo_2014"/>
+    <w:bookmarkEnd w:id="299"/>
+    <w:bookmarkStart w:id="301" w:name="ref-premo_2014"/>
     <w:p>
       <w:pPr>
         <w:pStyle w:val="Bibliography"/>
@@ -8454,7 +8667,7 @@
       <w:r>
         <w:t xml:space="preserve"> </w:t>
       </w:r>
-      <w:hyperlink r:id="rId297">
+      <w:hyperlink r:id="rId300">
         <w:r>
           <w:rPr>
             <w:rStyle w:val="Hyperlink"/>
@@ -8466,8 +8679,8 @@
         <w:t xml:space="preserve">.</w:t>
       </w:r>
     </w:p>
-    <w:bookmarkEnd w:id="298"/>
-    <w:bookmarkStart w:id="300" w:name="ref-premo_2016"/>
+    <w:bookmarkEnd w:id="301"/>
+    <w:bookmarkStart w:id="303" w:name="ref-premo_2016"/>
     <w:p>
       <w:pPr>
         <w:pStyle w:val="Bibliography"/>
@@ -8494,7 +8707,7 @@
       <w:r>
         <w:t xml:space="preserve"> </w:t>
       </w:r>
-      <w:hyperlink r:id="rId299">
+      <w:hyperlink r:id="rId302">
         <w:r>
           <w:rPr>
             <w:rStyle w:val="Hyperlink"/>
@@ -8506,8 +8719,8 @@
         <w:t xml:space="preserve">.</w:t>
       </w:r>
     </w:p>
-    <w:bookmarkEnd w:id="300"/>
-    <w:bookmarkStart w:id="302" w:name="ref-premo_scholnick_2011"/>
+    <w:bookmarkEnd w:id="303"/>
+    <w:bookmarkStart w:id="305" w:name="ref-premo_scholnick_2011"/>
     <w:p>
       <w:pPr>
         <w:pStyle w:val="Bibliography"/>
@@ -8534,7 +8747,7 @@
       <w:r>
         <w:t xml:space="preserve"> </w:t>
       </w:r>
-      <w:hyperlink r:id="rId301">
+      <w:hyperlink r:id="rId304">
         <w:r>
           <w:rPr>
             <w:rStyle w:val="Hyperlink"/>
@@ -8546,8 +8759,8 @@
         <w:t xml:space="preserve">.</w:t>
       </w:r>
     </w:p>
-    <w:bookmarkEnd w:id="302"/>
-    <w:bookmarkStart w:id="303" w:name="ref-rees_political_culture"/>
+    <w:bookmarkEnd w:id="305"/>
+    <w:bookmarkStart w:id="306" w:name="ref-rees_political_culture"/>
     <w:p>
       <w:pPr>
         <w:pStyle w:val="Bibliography"/>
@@ -8571,8 +8784,8 @@
         <w:t xml:space="preserve">. Ph.D. dissertation, University of Oklahoma, Norman.</w:t>
       </w:r>
     </w:p>
-    <w:bookmarkEnd w:id="303"/>
-    <w:bookmarkStart w:id="305" w:name="ref-reimer_etal_2020"/>
+    <w:bookmarkEnd w:id="306"/>
+    <w:bookmarkStart w:id="308" w:name="ref-reimer_etal_2020"/>
     <w:p>
       <w:pPr>
         <w:pStyle w:val="Bibliography"/>
@@ -8626,7 +8839,7 @@
       <w:r>
         <w:t xml:space="preserve"> </w:t>
       </w:r>
-      <w:hyperlink r:id="rId304">
+      <w:hyperlink r:id="rId307">
         <w:r>
           <w:rPr>
             <w:rStyle w:val="Hyperlink"/>
@@ -8638,8 +8851,8 @@
         <w:t xml:space="preserve">.</w:t>
       </w:r>
     </w:p>
-    <w:bookmarkEnd w:id="305"/>
-    <w:bookmarkStart w:id="307" w:name="ref-richerson_etal_2016"/>
+    <w:bookmarkEnd w:id="308"/>
+    <w:bookmarkStart w:id="310" w:name="ref-richerson_etal_2016"/>
     <w:p>
       <w:pPr>
         <w:pStyle w:val="Bibliography"/>
@@ -8666,7 +8879,7 @@
       <w:r>
         <w:t xml:space="preserve"> </w:t>
       </w:r>
-      <w:hyperlink r:id="rId306">
+      <w:hyperlink r:id="rId309">
         <w:r>
           <w:rPr>
             <w:rStyle w:val="Hyperlink"/>
@@ -8678,8 +8891,8 @@
         <w:t xml:space="preserve">.</w:t>
       </w:r>
     </w:p>
-    <w:bookmarkEnd w:id="307"/>
-    <w:bookmarkStart w:id="309" w:name="ref-riede_hoggard_shennan_2019"/>
+    <w:bookmarkEnd w:id="310"/>
+    <w:bookmarkStart w:id="312" w:name="ref-riede_hoggard_shennan_2019"/>
     <w:p>
       <w:pPr>
         <w:pStyle w:val="Bibliography"/>
@@ -8706,7 +8919,7 @@
       <w:r>
         <w:t xml:space="preserve"> </w:t>
       </w:r>
-      <w:hyperlink r:id="rId308">
+      <w:hyperlink r:id="rId311">
         <w:r>
           <w:rPr>
             <w:rStyle w:val="Hyperlink"/>
@@ -8718,8 +8931,8 @@
         <w:t xml:space="preserve">.</w:t>
       </w:r>
     </w:p>
-    <w:bookmarkEnd w:id="309"/>
-    <w:bookmarkStart w:id="310" w:name="ref-robinson_1951"/>
+    <w:bookmarkEnd w:id="312"/>
+    <w:bookmarkStart w:id="313" w:name="ref-robinson_1951"/>
     <w:p>
       <w:pPr>
         <w:pStyle w:val="Bibliography"/>
@@ -8744,8 +8957,8 @@
         <w:t xml:space="preserve">16(4):293–301.</w:t>
       </w:r>
     </w:p>
-    <w:bookmarkEnd w:id="310"/>
-    <w:bookmarkStart w:id="311" w:name="ref-ross-stallings_2017"/>
+    <w:bookmarkEnd w:id="313"/>
+    <w:bookmarkStart w:id="314" w:name="ref-ross-stallings_2017"/>
     <w:p>
       <w:pPr>
         <w:pStyle w:val="Bibliography"/>
@@ -8779,8 +8992,8 @@
         <w:t xml:space="preserve">, edited by Haagen D. Klaus, Amanda R. Harvey, and Mark N. Cohen, pp. 329–362. University Press of Florida, Gainesville.</w:t>
       </w:r>
     </w:p>
-    <w:bookmarkEnd w:id="311"/>
-    <w:bookmarkStart w:id="312" w:name="ref-schiffer_1972"/>
+    <w:bookmarkEnd w:id="314"/>
+    <w:bookmarkStart w:id="315" w:name="ref-schiffer_1972"/>
     <w:p>
       <w:pPr>
         <w:pStyle w:val="Bibliography"/>
@@ -8805,8 +9018,8 @@
         <w:t xml:space="preserve">37(2):156–165.</w:t>
       </w:r>
     </w:p>
-    <w:bookmarkEnd w:id="312"/>
-    <w:bookmarkStart w:id="314" w:name="ref-schneider_martins_deaguiar_2016"/>
+    <w:bookmarkEnd w:id="315"/>
+    <w:bookmarkStart w:id="317" w:name="ref-schneider_martins_deaguiar_2016"/>
     <w:p>
       <w:pPr>
         <w:pStyle w:val="Bibliography"/>
@@ -8833,7 +9046,7 @@
       <w:r>
         <w:t xml:space="preserve"> </w:t>
       </w:r>
-      <w:hyperlink r:id="rId313">
+      <w:hyperlink r:id="rId316">
         <w:r>
           <w:rPr>
             <w:rStyle w:val="Hyperlink"/>
@@ -8845,8 +9058,8 @@
         <w:t xml:space="preserve">.</w:t>
       </w:r>
     </w:p>
-    <w:bookmarkEnd w:id="314"/>
-    <w:bookmarkStart w:id="316" w:name="ref-shennan_crema_kerig_2015"/>
+    <w:bookmarkEnd w:id="317"/>
+    <w:bookmarkStart w:id="319" w:name="ref-shennan_crema_kerig_2015"/>
     <w:p>
       <w:pPr>
         <w:pStyle w:val="Bibliography"/>
@@ -8912,7 +9125,7 @@
       <w:r>
         <w:t xml:space="preserve"> </w:t>
       </w:r>
-      <w:hyperlink r:id="rId315">
+      <w:hyperlink r:id="rId318">
         <w:r>
           <w:rPr>
             <w:rStyle w:val="Hyperlink"/>
@@ -8924,8 +9137,8 @@
         <w:t xml:space="preserve">.</w:t>
       </w:r>
     </w:p>
-    <w:bookmarkEnd w:id="316"/>
-    <w:bookmarkStart w:id="317" w:name="ref-shennan_wilkinson_2001"/>
+    <w:bookmarkEnd w:id="319"/>
+    <w:bookmarkStart w:id="320" w:name="ref-shennan_wilkinson_2001"/>
     <w:p>
       <w:pPr>
         <w:pStyle w:val="Bibliography"/>
@@ -8965,8 +9178,8 @@
         <w:t xml:space="preserve">66(4):577–593.</w:t>
       </w:r>
     </w:p>
-    <w:bookmarkEnd w:id="317"/>
-    <w:bookmarkStart w:id="318" w:name="ref-smith_1990"/>
+    <w:bookmarkEnd w:id="320"/>
+    <w:bookmarkStart w:id="321" w:name="ref-smith_1990"/>
     <w:p>
       <w:pPr>
         <w:pStyle w:val="Bibliography"/>
@@ -9014,8 +9227,8 @@
         <w:t xml:space="preserve">, edited by David H. Dye and Cheryl Anne Cox, pp. 135–169. University of Alabama Press, Tuscaloosa.</w:t>
       </w:r>
     </w:p>
-    <w:bookmarkEnd w:id="318"/>
-    <w:bookmarkStart w:id="319" w:name="ref-smith_neiman_2007"/>
+    <w:bookmarkEnd w:id="321"/>
+    <w:bookmarkStart w:id="322" w:name="ref-smith_neiman_2007"/>
     <w:p>
       <w:pPr>
         <w:pStyle w:val="Bibliography"/>
@@ -9040,8 +9253,8 @@
         <w:t xml:space="preserve">26(1):47–72.</w:t>
       </w:r>
     </w:p>
-    <w:bookmarkEnd w:id="319"/>
-    <w:bookmarkStart w:id="320" w:name="ref-starr_1984"/>
+    <w:bookmarkEnd w:id="322"/>
+    <w:bookmarkStart w:id="323" w:name="ref-starr_1984"/>
     <w:p>
       <w:pPr>
         <w:pStyle w:val="Bibliography"/>
@@ -9222,8 +9435,8 @@
         <w:t xml:space="preserve">, edited by John M. Connaway, pp. 163–222. Archaeological Report No. 14. Mississippi Department of Archives; History, Jackson, MS.</w:t>
       </w:r>
     </w:p>
-    <w:bookmarkEnd w:id="320"/>
-    <w:bookmarkStart w:id="321" w:name="ref-tomasovych_kidwell_2009"/>
+    <w:bookmarkEnd w:id="323"/>
+    <w:bookmarkStart w:id="324" w:name="ref-tomasovych_kidwell_2009"/>
     <w:p>
       <w:pPr>
         <w:pStyle w:val="Bibliography"/>
@@ -9248,8 +9461,8 @@
         <w:t xml:space="preserve">35(1):94–118.</w:t>
       </w:r>
     </w:p>
-    <w:bookmarkEnd w:id="321"/>
-    <w:bookmarkStart w:id="323" w:name="ref-tomasovych_kidwell_2010"/>
+    <w:bookmarkEnd w:id="324"/>
+    <w:bookmarkStart w:id="326" w:name="ref-tomasovych_kidwell_2010"/>
     <w:p>
       <w:pPr>
         <w:pStyle w:val="Bibliography"/>
@@ -9276,7 +9489,7 @@
       <w:r>
         <w:t xml:space="preserve"> </w:t>
       </w:r>
-      <w:hyperlink r:id="rId322">
+      <w:hyperlink r:id="rId325">
         <w:r>
           <w:rPr>
             <w:rStyle w:val="Hyperlink"/>
@@ -9288,8 +9501,8 @@
         <w:t xml:space="preserve">.</w:t>
       </w:r>
     </w:p>
-    <w:bookmarkEnd w:id="323"/>
-    <w:bookmarkStart w:id="324" w:name="ref-willey_phillips_1958"/>
+    <w:bookmarkEnd w:id="326"/>
+    <w:bookmarkStart w:id="327" w:name="ref-willey_phillips_1958"/>
     <w:p>
       <w:pPr>
         <w:pStyle w:val="Bibliography"/>
@@ -9311,8 +9524,8 @@
         <w:t xml:space="preserve">. University of Chicago Press, Chicago.</w:t>
       </w:r>
     </w:p>
-    <w:bookmarkEnd w:id="324"/>
-    <w:bookmarkStart w:id="325" w:name="ref-williams_1954"/>
+    <w:bookmarkEnd w:id="327"/>
+    <w:bookmarkStart w:id="328" w:name="ref-williams_1954"/>
     <w:p>
       <w:pPr>
         <w:pStyle w:val="Bibliography"/>
@@ -9321,8 +9534,8 @@
         <w:t xml:space="preserve">Williams, Stephen. 1954. An Archeological Study of the Mississippian Culture in Southeast Missouri. PhD thesis, Yale University, New Haven.</w:t>
       </w:r>
     </w:p>
-    <w:bookmarkEnd w:id="325"/>
-    <w:bookmarkStart w:id="327" w:name="ref-wright_1943"/>
+    <w:bookmarkEnd w:id="328"/>
+    <w:bookmarkStart w:id="330" w:name="ref-wright_1943"/>
     <w:p>
       <w:pPr>
         <w:pStyle w:val="Bibliography"/>
@@ -9349,7 +9562,7 @@
       <w:r>
         <w:t xml:space="preserve"> </w:t>
       </w:r>
-      <w:hyperlink r:id="rId326">
+      <w:hyperlink r:id="rId329">
         <w:r>
           <w:rPr>
             <w:rStyle w:val="Hyperlink"/>
@@ -9361,8 +9574,8 @@
         <w:t xml:space="preserve">.</w:t>
       </w:r>
     </w:p>
-    <w:bookmarkEnd w:id="327"/>
-    <w:bookmarkStart w:id="329" w:name="ref-wright_1951"/>
+    <w:bookmarkEnd w:id="330"/>
+    <w:bookmarkStart w:id="332" w:name="ref-wright_1951"/>
     <w:p>
       <w:pPr>
         <w:pStyle w:val="Bibliography"/>
@@ -9389,7 +9602,7 @@
       <w:r>
         <w:t xml:space="preserve"> </w:t>
       </w:r>
-      <w:hyperlink r:id="rId328">
+      <w:hyperlink r:id="rId331">
         <w:r>
           <w:rPr>
             <w:rStyle w:val="Hyperlink"/>
@@ -9401,8 +9614,8 @@
         <w:t xml:space="preserve">.</w:t>
       </w:r>
     </w:p>
-    <w:bookmarkEnd w:id="329"/>
-    <w:bookmarkStart w:id="331" w:name="ref-youngblood_miton_morin_2023"/>
+    <w:bookmarkEnd w:id="332"/>
+    <w:bookmarkStart w:id="334" w:name="ref-youngblood_miton_morin_2023"/>
     <w:p>
       <w:pPr>
         <w:pStyle w:val="Bibliography"/>
@@ -9429,7 +9642,7 @@
       <w:r>
         <w:t xml:space="preserve"> </w:t>
       </w:r>
-      <w:hyperlink r:id="rId330">
+      <w:hyperlink r:id="rId333">
         <w:r>
           <w:rPr>
             <w:rStyle w:val="Hyperlink"/>
@@ -9441,10 +9654,10 @@
         <w:t xml:space="preserve">.</w:t>
       </w:r>
     </w:p>
-    <w:bookmarkEnd w:id="331"/>
-    <w:bookmarkEnd w:id="332"/>
-    <w:bookmarkEnd w:id="333"/>
     <w:bookmarkEnd w:id="334"/>
+    <w:bookmarkEnd w:id="335"/>
+    <w:bookmarkEnd w:id="336"/>
+    <w:bookmarkEnd w:id="337"/>
     <w:sectPr>
       <w:footerReference r:id="rId100" w:type="default"/>
       <w:footnotePr>

</xml_diff>

<commit_message>
Refresh from mls-emergence 55d89ab: 2026-09-24 review revisions, analyses 91-92, partition power figure
Narrows the claims in the main text and supplement, adds the turnover
sensitivity and relaxations-by-scale analyses with their findings, adds
Figure S12 (partition power distributions), and carries the updated
bibliography, cover letter and rebuilt docx files.

Co-Authored-By: Claude Fable 5.1 <noreply@anthropic.com>
</commit_message>
<xml_diff>
--- a/docs/manuscript/MAIN_TEXT.docx
+++ b/docs/manuscript/MAIN_TEXT.docx
@@ -2,7 +2,7 @@
 <file path=word/document.xml><?xml version="1.0" encoding="utf-8"?>
 <w:document xmlns:w="http://schemas.openxmlformats.org/wordprocessingml/2006/main" xmlns:m="http://schemas.openxmlformats.org/officeDocument/2006/math" xmlns:r="http://schemas.openxmlformats.org/officeDocument/2006/relationships" xmlns:o="urn:schemas-microsoft-com:office:office" xmlns:v="urn:schemas-microsoft-com:vml" xmlns:w10="urn:schemas-microsoft-com:office:word" xmlns:a="http://schemas.openxmlformats.org/drawingml/2006/main" xmlns:pic="http://schemas.openxmlformats.org/drawingml/2006/picture" xmlns:wp="http://schemas.openxmlformats.org/drawingml/2006/wordprocessingDrawing">
   <w:body>
-    <w:bookmarkStart w:id="270" w:name="X8bf6248c9f3f97f4894a761f3e01800d2c2c84f"/>
+    <w:bookmarkStart w:id="275" w:name="X8bf6248c9f3f97f4894a761f3e01800d2c2c84f"/>
     <w:p>
       <w:pPr>
         <w:pStyle w:val="Heading1"/>
@@ -37,7 +37,7 @@
         <w:pStyle w:val="FirstParagraph"/>
       </w:pPr>
       <w:r>
-        <w:t xml:space="preserve">Archaeologists group assemblages into phases and then treat the phases as groups, giving them the qualities of communities or polities. Earlier studies, including our own, showed that the phases of the Lower Mississippi River Valley do not separate cleanly, but not what the phases are. We explain them with cultural transmission theory. Potters copy near neighbors more than distant ones, so neutral drift makes nearby assemblages alike whether or not groups exist. Settlement is clumped, and a smooth gradient sampled at clumps and sorted by resemblance and proximity looks like a set of groups. A phase is a group only if its frequencies show what distance-limited copying cannot produce: learning concentrated inside and divergence across its edge. We test this on the decorated-type frequencies of the Late Mississippian St. Francis basin in northeastern Arkansas, including the Parkin phase, long read as a polity. The site map alone recovers the phases, arbitrary lines separate the pottery better than the phase lines do, and pottery simulated with no groups sorts into the phases as readily as the real pottery. The Parkin phase differs from the rest of the basin no more than copying without groups produces and no more than arbitrary divisions of the map. The pottery does vary over shorter distances than our copying model predicts, but that variation does not follow the phase lines.</w:t>
+        <w:t xml:space="preserve">Traditionally, archaeologists group assemblages into phases and assign them community or polity status. Earlier studies have shown that the phases of the Lower Mississippi River Valley do not separate cleanly, but they have not explained what produces their apparent organization. We explain phases using cultural transmission theory in which potters copy near neighbors more than distant ones. Neutral drift makes nearby assemblages alike whether or not groups exist. Settlement is clumped, and a smooth gradient sampled at clumps and sorted by resemblance and proximity looks like a set of groups. We present a method for determining whether a phase marks a restriction on the copying of decorated pottery. In such cases, the frequencies of artifact classes show what distance-limited copying does not produce: learning concentrated inside and divergence across its edge. We test this on the decorated-type frequencies of the Late Mississippian St. Francis basin in northeastern Arkansas, including the Parkin phase, long read as a polity. The site map alone recovers the phases; alternative spatial divisions of the same sites capture as much or more of the ceramic differentiation, and sherd frequencies simulated with no groups sort into the phases as readily as the real assemblages. The Parkin phase differs from the rest of the basin no more than arbitrary divisions of the map. The frequencies of assemblage types vary over shorter distances than a copying model predicts, but that variation does not follow phase borders. Phases therefore do not uniquely capture the basin’s ceramic differentiation, and spatially structured copying plausibly accounts for their apparent organization. The results do not exclude a Parkin polity, since political boundaries need not coincide with ceramic traditions.</w:t>
       </w:r>
     </w:p>
     <w:p>
@@ -73,7 +73,7 @@
         <w:pStyle w:val="FirstParagraph"/>
       </w:pPr>
       <w:r>
-        <w:t xml:space="preserve">Los arqueólogos agrupan los conjuntos cerámicos en fases y luego tratan esas fases como grupos, atribuyéndoles las cualidades de comunidades o entidades políticas. Estudios anteriores, incluidos los nuestros, mostraron que las fases del valle bajo del río Misisipi no se separan con nitidez, pero no qué son las fases. Las explicamos con la teoría de la transmisión cultural. Los alfareros copian a sus vecinos cercanos más que a los lejanos, de modo que la deriva neutral hace que los conjuntos cercanos se parezcan, existan o no grupos. Los asentamientos están agrupados, y un gradiente continuo muestreado en esos agrupamientos y ordenado por semejanza y proximidad parece un conjunto de grupos. Una fase es un grupo solo si sus frecuencias muestran lo que la copia limitada por la distancia no puede producir: aprendizaje concentrado en su interior y divergencia a través de su límite. Ponemos esto a prueba con las frecuencias de los tipos decorados del Misisipiano tardío en la cuenca del río St. Francis, en el noreste de Arkansas, incluida la fase Parkin, interpretada durante mucho tiempo como una entidad política. El mapa de sitios por sí solo recupera las fases, líneas arbitrarias separan la cerámica mejor que las líneas de las fases, y la cerámica simulada sin grupos se clasifica en las fases con la misma facilidad que la cerámica real. La fase Parkin no difiere del resto de la cuenca más de lo que produce la copia sin grupos, ni más que divisiones arbitrarias del mapa. La cerámica sí varía a distancias más cortas de lo que predice nuestro modelo de copia, pero esa variación no sigue las líneas de las fases.</w:t>
+        <w:t xml:space="preserve">Tradicionalmente, los arqueólogos agrupan los conjuntos cerámicos en fases y les atribuyen las cualidades de comunidades o entidades políticas. Estudios anteriores han mostrado que las fases del valle bajo del río Misisipi no se separan con nitidez, pero no han explicado qué produce su aparente organización. Explicamos las fases con la teoría de la transmisión cultural, según la cual los alfareros copian a sus vecinos cercanos más que a los lejanos. La deriva neutral hace que los conjuntos cercanos se parezcan, ya existan o no grupos. Los asentamientos están agrupados, y un gradiente continuo, muestreado en esos agrupamientos y ordenado por semejanza y proximidad, parece un conjunto de grupos. Presentamos un método para determinar si una fase constituye una restricción para la copia de la cerámica decorada. En tal caso, las frecuencias de las clases de artefactos muestran lo que la copia limitada por la distancia no produce: aprendizaje concentrado en su interior y divergencia a través de su límite. Lo ponemos a prueba con las frecuencias de los tipos decorados del Misisipiano tardío en la cuenca del río St. Francis, en el noreste de Arkansas, incluida la fase Parkin, interpretada durante mucho tiempo como una entidad política. El mapa de sitios, por sí solo, recupera las fases; otras divisiones espaciales de los mismos sitios captan tanta o más diferenciación cerámica, y las frecuencias simuladas sin grupos se clasifican en las fases con la misma facilidad que los conjuntos reales. La fase Parkin no difiere del resto de la cuenca más que por divisiones arbitrarias del mapa. Las frecuencias de los tipos varían a distancias más cortas de las predichas por un modelo de copia, pero esa variación no sigue los límites de las fases. Por lo tanto, las fases heredadas no captan de manera exclusiva la diferenciación cerámica de la cuenca, y la copia estructurada en el espacio constituye una explicación plausible de su aparente organización. Los resultados no excluyen la existencia de una entidad política en Parkin, ya que los límites políticos no tienen por qué coincidir con las tradiciones cerámicas.</w:t>
       </w:r>
     </w:p>
     <w:p>
@@ -109,7 +109,7 @@
         <w:pStyle w:val="FirstParagraph"/>
       </w:pPr>
       <w:r>
-        <w:t xml:space="preserve">Archaeologists divide the late pre-contact record of the Lower Mississippi River Valley into spatially and temporally bounded units known as phases (Figure 1). These include the Kent</w:t>
+        <w:t xml:space="preserve">Archaeologists have divided the late pre-contact record of the Lower Mississippi River Valley into spatially and temporally bounded units known as phases (Figure 1). These include the Kent</w:t>
       </w:r>
       <w:r>
         <w:t xml:space="preserve"> </w:t>
@@ -175,7 +175,7 @@
         <w:t xml:space="preserve"> </w:t>
       </w:r>
       <w:r>
-        <w:t xml:space="preserve">phases. The Parkin phase stands out because it contains the Parkin site, the largest moated and palisaded town in the St. Francis basin of northeastern Arkansas. Reconstructions of the route of the Hernando de Soto expedition identify it as Casqui, the seat of a paramount chief the expedition met in 1541</w:t>
+        <w:t xml:space="preserve">phases. The Parkin phase stands out because it contains the Parkin site, the largest moated and palisaded town in the St. Francis basin of northeastern Arkansas. Reconstructions of the Hernando de Soto expedition’s route identify it as Casqui, the seat of a paramount chief the expedition met in 1541</w:t>
       </w:r>
       <w:r>
         <w:t xml:space="preserve"> </w:t>
@@ -205,7 +205,7 @@
           <wp:inline>
             <wp:extent cx="4114800" cy="8037789"/>
             <wp:effectExtent b="0" l="0" r="0" t="0"/>
-            <wp:docPr descr="Figure 1. Decorated-ceramic assemblages of the lower Mississippi Valley and the culture-historical phase scheme this paper tests. Five of the seven Late Mississippian phases (Parkin, Nodena, Kent, Walls, and Parchman) are drawn as territories; Jones Bayou and Tipton, in western Tennessee, have no assemblage with decorated counts in this study’s matrix and appear only in the legend. Assemblages without a phase assignment are not drawn. Each territory is built by assigning every point on the map to its nearest assemblage and then merging those areas according to the phase Mainfort (1996) assigns each assemblage, with a gap drawn between adjacent territories for legibility. Territories are drawn over the HydroRIVERS river network (Lehner and Grill 2013), with line width scaled by flow order. Markers show each assemblage’s phase, and Parkin is starred. The bounded territories illustrate the premise under test, that each hosted a distinct, internally interacting society. The mapped assemblages fall in Arkansas, Tennessee, and Mississippi; Missouri lies just north of the frame. Inset: location in North America." title="" id="112" name="Picture"/>
+            <wp:docPr descr="Figure 1. Decorated-ceramic assemblages of the lower Mississippi Valley and the culture-historical phase scheme this paper tests. Each territory is built by assigning every point on the map to its nearest assemblage and then merging those areas according to the phase Mainfort (1996) assigns to each assemblage; assemblages without a phase assignment are not drawn. Territories are drawn over the HydroRIVERS river network (Lehner and Grill 2013), with line width scaled by flow order. Markers show each assemblage that comprises its phase, and Parkin is starred. The bounded territories illustrate the premise under test, that each hosted a distinct, internally interacting society. The mapped assemblages fall in Arkansas, Tennessee, and Mississippi; Missouri lies just north of the frame. Inset: location in North America." title="" id="112" name="Picture"/>
             <a:graphic>
               <a:graphicData uri="http://schemas.openxmlformats.org/drawingml/2006/picture">
                 <pic:pic>
@@ -258,7 +258,7 @@
         <w:t xml:space="preserve"> </w:t>
       </w:r>
       <w:r>
-        <w:t xml:space="preserve">Decorated-ceramic assemblages of the lower Mississippi Valley and the culture-historical phase scheme this paper tests. Five of the seven Late Mississippian phases (Parkin, Nodena, Kent, Walls, and Parchman) are drawn as territories; Jones Bayou and Tipton, in western Tennessee, have no assemblage with decorated counts in this study’s matrix and appear only in the legend. Assemblages without a phase assignment are not drawn. Each territory is built by assigning every point on the map to its nearest assemblage and then merging those areas according to the phase Mainfort</w:t>
+        <w:t xml:space="preserve">Decorated-ceramic assemblages of the lower Mississippi Valley and the culture-historical phase scheme this paper tests. Each territory is built by assigning every point on the map to its nearest assemblage and then merging those areas according to the phase Mainfort</w:t>
       </w:r>
       <w:r>
         <w:t xml:space="preserve"> </w:t>
@@ -270,7 +270,7 @@
         <w:t xml:space="preserve"> </w:t>
       </w:r>
       <w:r>
-        <w:t xml:space="preserve">assigns each assemblage, with a gap drawn between adjacent territories for legibility. Territories are drawn over the HydroRIVERS river network</w:t>
+        <w:t xml:space="preserve">assigns to each assemblage; assemblages without a phase assignment are not drawn. Territories are drawn over the HydroRIVERS river network</w:t>
       </w:r>
       <w:r>
         <w:t xml:space="preserve"> </w:t>
@@ -279,7 +279,7 @@
         <w:t xml:space="preserve">(Lehner and Grill 2013)</w:t>
       </w:r>
       <w:r>
-        <w:t xml:space="preserve">, with line width scaled by flow order. Markers show each assemblage’s phase, and Parkin is starred. The bounded territories illustrate the premise under test, that each hosted a distinct, internally interacting society. The mapped assemblages fall in Arkansas, Tennessee, and Mississippi; Missouri lies just north of the frame. Inset: location in North America.</w:t>
+        <w:t xml:space="preserve">, with line width scaled by flow order. Markers show each assemblage that comprises its phase, and Parkin is starred. The bounded territories illustrate the premise under test, that each hosted a distinct, internally interacting society. The mapped assemblages fall in Arkansas, Tennessee, and Mississippi; Missouri lies just north of the frame. Inset: location in North America.</w:t>
       </w:r>
     </w:p>
     <w:p>
@@ -287,7 +287,7 @@
         <w:pStyle w:val="BodyText"/>
       </w:pPr>
       <w:r>
-        <w:t xml:space="preserve">A phase is a culture-history construct: a set of assemblages grouped together because their decorated-class frequencies seriate, meaning they can be placed in one sequence of gradually changing frequencies, and because the sites lie near one another. In the Willey-Phillips framework the phase is</w:t>
+        <w:t xml:space="preserve">A phase is a culture-history construct in which a set of assemblages are grouped together because their decorated-class frequencies seriate, meaning they can be placed in one sequence of gradually changing frequencies, and because the sites lie near one another. In the Willey-Phillips framework, the phase is</w:t>
       </w:r>
       <w:r>
         <w:t xml:space="preserve"> </w:t>
@@ -308,7 +308,7 @@
         <w:t xml:space="preserve">(Phillips and Willey 1953; Willey and Phillips 1958:22)</w:t>
       </w:r>
       <w:r>
-        <w:t xml:space="preserve">, and the lower-valley phases tested here were formulated in that framework by Phillips</w:t>
+        <w:t xml:space="preserve">. Phillips formulated the lower-valley phases tested here within that framework</w:t>
       </w:r>
       <w:r>
         <w:t xml:space="preserve"> </w:t>
@@ -409,7 +409,7 @@
         <w:pStyle w:val="BodyText"/>
       </w:pPr>
       <w:r>
-        <w:t xml:space="preserve">The phases have been questioned on this ground before. Fox</w:t>
+        <w:t xml:space="preserve">This point has been raised before. Fox</w:t>
       </w:r>
       <w:r>
         <w:t xml:space="preserve"> </w:t>
@@ -433,7 +433,7 @@
         <w:t xml:space="preserve"> </w:t>
       </w:r>
       <w:r>
-        <w:t xml:space="preserve">put the same question to very nearly the record we use, ordinating ten decorated types from 39 sites and finding</w:t>
+        <w:t xml:space="preserve">put the same question to the assemblages of the Lower Mississippi Valley, ordinating ten decorated types from 39 sites and finding</w:t>
       </w:r>
       <w:r>
         <w:t xml:space="preserve"> </w:t>
@@ -487,7 +487,7 @@
         <w:t xml:space="preserve">(Lipo 2001:60)</w:t>
       </w:r>
       <w:r>
-        <w:t xml:space="preserve">. These studies show that the phases do not separate cleanly. None of them explains what the phases are, or why they looked real to the people who drew them, and an ordination alone cannot, because loosely clustered assemblages are what both bounded groups and unbounded copying across distance would produce.</w:t>
+        <w:t xml:space="preserve">. These studies show that the phases do not separate cleanly. None of them explains what the phases are, or why they looked real to the people who drew them. Ordination methods alone cannot explain these units because loosely clustered assemblages could arise from both bounded groups and unbounded copying across distance.</w:t>
       </w:r>
     </w:p>
     <w:p>
@@ -495,7 +495,7 @@
         <w:pStyle w:val="BodyText"/>
       </w:pPr>
       <w:r>
-        <w:t xml:space="preserve">That explanation is what this paper provides. We ask two questions. First, what explains the phases? We argue that they follow from how people learn: potters copy near neighbors more than distant ones, settlement is clumped, and a smooth gradient in style sampled at those clumps looks like a set of groups. Second, does the Parkin phase, the one most often treated as a polity, show anything in its decorated-type frequencies that sets it apart as one? Both questions turn on the same test. Copying across space produces spatial structure in stylistic frequencies whatever else is happening, so a phase has the qualities of a group only if its frequencies show properties that spatially structured drift cannot produce. In brief, the phases are what copying across distance looks like when it is sampled at clumped settlements, and the Parkin phase shows nothing in its pottery that sets it apart as a polity.</w:t>
+        <w:t xml:space="preserve">This paper offers and tests that explanation. We ask two questions. First, what explains the phases? We argue that they can follow from how people learn. Potters copy near neighbors more than distant ones, settlements clump, and a smooth gradient in style sampled at those clumps looks like groups. Second, does the Parkin phase, the one most often treated as a polity, show anything in its decorated-type frequencies that sets it apart? Both questions turn on the same test. Copying across space produces spatial structure in stylistic frequencies whatever else is happening, so a phase marks a restriction on the copying of decorated pottery only if its class frequencies show properties that spatially structured drift does not produce. This test is narrower than the question of whether a society or polity existed. Political affiliation need not coincide with a ceramic tradition, so what the pottery can show is whether learning was bounded where the phase lines fall, not whether people were politically organized.</w:t>
       </w:r>
     </w:p>
     <w:p>
@@ -503,7 +503,60 @@
         <w:pStyle w:val="BodyText"/>
       </w:pPr>
       <w:r>
-        <w:t xml:space="preserve">The late pre-contact St. Francis basin suits the test. Its decorated assemblages are well documented, the decorated classes are the long-established Phillips-Ford-Griffin types, and European contact and the demographic collapse that followed ended the sequence before any later reorganization could overwrite it</w:t>
+        <w:t xml:space="preserve">We proceed in two steps, and the order matters. Our primary test concerns the inherited scheme, the phases as Phillips</w:t>
+      </w:r>
+      <w:r>
+        <w:t xml:space="preserve"> </w:t>
+      </w:r>
+      <w:r>
+        <w:t xml:space="preserve">(1970)</w:t>
+      </w:r>
+      <w:r>
+        <w:t xml:space="preserve"> </w:t>
+      </w:r>
+      <w:r>
+        <w:t xml:space="preserve">formulated them and Mainfort</w:t>
+      </w:r>
+      <w:r>
+        <w:t xml:space="preserve"> </w:t>
+      </w:r>
+      <w:r>
+        <w:t xml:space="preserve">(1996)</w:t>
+      </w:r>
+      <w:r>
+        <w:t xml:space="preserve"> </w:t>
+      </w:r>
+      <w:r>
+        <w:t xml:space="preserve">mapped them, because that scheme is the one that has been read as a set of societies and because it was drawn by inspection and proximity. We then turn to the phases that Mainfort</w:t>
+      </w:r>
+      <w:r>
+        <w:t xml:space="preserve"> </w:t>
+      </w:r>
+      <w:r>
+        <w:t xml:space="preserve">(2003)</w:t>
+      </w:r>
+      <w:r>
+        <w:t xml:space="preserve"> </w:t>
+      </w:r>
+      <w:r>
+        <w:t xml:space="preserve">redrew after ordinating the decorated types of largely the same collections. That scheme cannot carry the primary test, since lines drawn from the pottery will separate the pottery whether or not they mark bounded groups. It serves instead as a contrast: it shows what the same tests return when phase lines follow the assemblages rather than the map.</w:t>
+      </w:r>
+    </w:p>
+    <w:p>
+      <w:pPr>
+        <w:pStyle w:val="BodyText"/>
+      </w:pPr>
+      <w:r>
+        <w:t xml:space="preserve">The late pre-contact St. Francis basin provides the data for our test. Its decorated assemblages are built from the well-documented decorated classes of the long-established Phillips-Ford-Griffin types</w:t>
+      </w:r>
+      <w:r>
+        <w:t xml:space="preserve"> </w:t>
+      </w:r>
+      <w:r>
+        <w:t xml:space="preserve">(Phillips et al. 1951)</w:t>
+      </w:r>
+      <w:r>
+        <w:t xml:space="preserve">. European contact and the demographic collapse that followed ended the sequence before any later reorganization could overwrite it</w:t>
       </w:r>
       <w:r>
         <w:t xml:space="preserve"> </w:t>
@@ -512,7 +565,7 @@
         <w:t xml:space="preserve">(Lipo 2001; Morse and Morse 1996)</w:t>
       </w:r>
       <w:r>
-        <w:t xml:space="preserve">. Its assemblages are time-averaged surface collections, built up over many years of use and discard. We treat them as the accumulated product of copying across a population, to be measured and explained as they are, rather than as degraded snapshots of a single moment</w:t>
+        <w:t xml:space="preserve">. Like much of the archaeological record, these assemblages are time-averaged surface collections, built up over many years of use and discard. We treat them as the accumulated product of copying across a population, to be measured and explained as they are, rather than as degraded snapshots of a single moment</w:t>
       </w:r>
       <w:r>
         <w:t xml:space="preserve"> </w:t>
@@ -521,7 +574,7 @@
         <w:t xml:space="preserve">(Dunnell 1995; Holdaway and Wandsnider 2008; Lipo et al. 2015; Neiman 1995; Perreault 2019; Schiffer 1972)</w:t>
       </w:r>
       <w:r>
-        <w:t xml:space="preserve">. Their coarse resolution limits which questions they can answer but does not disqualify them.</w:t>
+        <w:t xml:space="preserve">. Their coarse resolution limits the questions they can answer, but it does not disqualify them.</w:t>
       </w:r>
     </w:p>
     <w:bookmarkEnd w:id="114"/>
@@ -539,7 +592,7 @@
         <w:pStyle w:val="FirstParagraph"/>
       </w:pPr>
       <w:r>
-        <w:t xml:space="preserve">The explanation rests on the theory of cultural transmission, and it is simple. Potters learned how to decorate pots from other people, and the decorations they made reflect whom they learned from. Under the neutral model of cultural transmission, decorative variants that make no difference to how a pot performs change in frequency through innovation and chance copying in a finite population of learners, much as selectively neutral alleles do</w:t>
+        <w:t xml:space="preserve">The explanation rests on the theory of cultural transmission, and it is simple. Potters learned how to decorate pots from others, and the decorations they made reflect who they learned from. Under the neutral model of cultural transmission, decorative variants that make no difference to how a pot performs change in frequency through innovation and chance copying in a finite population of learners, much as selectively neutral alleles do</w:t>
       </w:r>
       <w:r>
         <w:t xml:space="preserve"> </w:t>
@@ -566,7 +619,7 @@
         <w:t xml:space="preserve"> </w:t>
       </w:r>
       <w:r>
-        <w:t xml:space="preserve">People learn from those they live near and see often, so a potter is more likely to copy a neighbor than someone a day’s travel away. Under neutral drift, that alone makes nearby assemblages more alike than distant ones, and similarity fades smoothly with distance. Population geneticists call this isolation by distance</w:t>
+        <w:t xml:space="preserve">People learn from those they live near and see often, so a potter is more likely to copy a neighbor than someone further away. Under neutral drift, that alone makes nearby assemblages more alike than distant ones, and similarity fades smoothly with distance. Population geneticists call this isolation by distance</w:t>
       </w:r>
       <w:r>
         <w:t xml:space="preserve"> </w:t>
@@ -584,7 +637,7 @@
         <w:t xml:space="preserve">(Neiman 1995; Shennan et al. 2015)</w:t>
       </w:r>
       <w:r>
-        <w:t xml:space="preserve">. It requires no groups. It is what copying produces across any landscape where interaction is local, and it produces between-place differences on its own, because small or poorly connected places drift toward depleted, idiosyncratic repertoires</w:t>
+        <w:t xml:space="preserve">. It requires no groups. This effect is what copying produces across any landscape with local interaction. It produces between-place differences on its own, because small or poorly connected places drift toward distinctive and idiosyncratic repertoires</w:t>
       </w:r>
       <w:r>
         <w:t xml:space="preserve"> </w:t>
@@ -611,7 +664,7 @@
         <w:t xml:space="preserve"> </w:t>
       </w:r>
       <w:r>
-        <w:t xml:space="preserve">People did not live evenly across the basin. Sites concentrate on particular reaches of river, with stretches of less occupied country between them. The smooth gradient in style is therefore sampled unevenly, densely in some places and sparsely or not at all in others.</w:t>
+        <w:t xml:space="preserve">People did not live evenly across the basin. Sites concentrate on particular reaches of the basin’s rivers, with less-occupied stretches between them. The smooth gradient in style is therefore sampled unevenly, densely in some places and sparsely or not at all in others.</w:t>
       </w:r>
     </w:p>
     <w:p>
@@ -629,7 +682,7 @@
         <w:t xml:space="preserve"> </w:t>
       </w:r>
       <w:r>
-        <w:t xml:space="preserve">Seriation and ordination sort assemblages by resemblance, and the culture historians who drew the phases also sorted them by proximity. On a smooth gradient sampled at clumps, both criteria gather the assemblages of each clump together and draw the lines between clumps. The result looks like a set of distinct groups with boundaries, although nothing in the process that made the pottery has a boundary anywhere</w:t>
+        <w:t xml:space="preserve">Seriation and ordination sort assemblages by resemblance, and the culture historians who drew the phases also sorted them by proximity. On a smooth gradient sampled at clumps, both criteria gather the assemblages of each clump together and draw the lines between clumps. The result looks like a set of distinct groups with boundaries, although nothing in the process that made the type frequencies has a boundary</w:t>
       </w:r>
       <w:r>
         <w:t xml:space="preserve"> </w:t>
@@ -659,13 +712,13 @@
           <w:i/>
           <w:iCs/>
         </w:rPr>
-        <w:t xml:space="preserve">A group requires more.</w:t>
-      </w:r>
-      <w:r>
-        <w:t xml:space="preserve"> </w:t>
-      </w:r>
-      <w:r>
-        <w:t xml:space="preserve">A bounded group, whether a community or a polity, concentrates learning inside itself and restricts it across its edge. That leaves properties in stylistic frequencies that spatially structured drift does not produce: differences between groups larger than copying across the same map generates, a step in similarity at the group’s edge, beyond what distance predicts; and boundaries where the pottery changes fastest, so that the pottery rather than the map recovers them</w:t>
+        <w:t xml:space="preserve">A bounded interaction group requires more.</w:t>
+      </w:r>
+      <w:r>
+        <w:t xml:space="preserve"> </w:t>
+      </w:r>
+      <w:r>
+        <w:t xml:space="preserve">A group that concentrates learning inside itself and restricts it across its edge leaves properties in stylistic frequencies that spatially structured drift does not produce. These are conceptually detectable as differences between groups larger than what copying across the same map generates. This difference will appear as a step in similarity at the group’s edge, beyond what distance predicts. Boundaries also appear where assemblage styles change fastest, so type frequencies rather than the map reveal them</w:t>
       </w:r>
       <w:r>
         <w:t xml:space="preserve"> </w:t>
@@ -674,7 +727,7 @@
         <w:t xml:space="preserve">(Crema et al. 2016; Henrich 2001; Henrich and Boyd 1998)</w:t>
       </w:r>
       <w:r>
-        <w:t xml:space="preserve">. Divergence that grows as interaction narrows would be a further sign, but this record’s chronology cannot test it well (Supplemental Text). Each of these has to be judged against copying with no groups on the real geography, not against zero, and against other lines drawn across the same map, because any line cut through a gradient separates some difference.</w:t>
+        <w:t xml:space="preserve">. Divergence that grows as interaction narrows would be a further sign, but this record’s chronology is not suited for testing this possibility (Supplemental Text). Each of these possibilities has to be judged against copying with no groups on the real geography, not against zero, and against other lines drawn across the same map, because any line cut through a gradient separates some difference.</w:t>
       </w:r>
     </w:p>
     <w:p>
@@ -682,7 +735,7 @@
         <w:pStyle w:val="BodyText"/>
       </w:pPr>
       <w:r>
-        <w:t xml:space="preserve">These expectations give the Parkin phase a clear test. If the phase was a polity whose members learned from, married into, and exchanged with one another more than with outsiders, its pottery should stand apart from the rest of the basin by more than copying across distance produces and by more than an arbitrary line drawn across the same sites would separate, with a step in similarity at its edge that other lines do not show. The alternative readings of the late pre-contact valley do not require any of that. On those readings, polities in this part of the valley never achieved regional integration</w:t>
+        <w:t xml:space="preserve">These expectations give the Parkin phase a clear test. If the Parkin phase was a polity whose members learned from, married into, and exchanged with one another more than with outsiders, its assemblage composition should stand apart from the rest of the basin by more than copying across distance produces. Assemblages should be more distinctive than what an arbitrary line drawn across the same sites separates. Empirically, there should be a step in similarity at its edge that other lines do not show. Alternative models of late pre-contact valley populations do not require these attributes. The alternative finding is that the polities in this part of the valley never achieved regional integration</w:t>
       </w:r>
       <w:r>
         <w:t xml:space="preserve"> </w:t>
@@ -722,7 +775,7 @@
       </w:r>
     </w:p>
     <w:bookmarkEnd w:id="115"/>
-    <w:bookmarkStart w:id="124" w:name="materials-and-methods"/>
+    <w:bookmarkStart w:id="125" w:name="materials-and-methods"/>
     <w:p>
       <w:pPr>
         <w:pStyle w:val="Heading2"/>
@@ -745,7 +798,28 @@
         <w:pStyle w:val="FirstParagraph"/>
       </w:pPr>
       <w:r>
-        <w:t xml:space="preserve">The ceramic data are decorated-class counts from the Lower Mississippi Valley Survey collections of Phillips, Ford, and Griffin</w:t>
+        <w:t xml:space="preserve">In this study, we test the phase assignments Mainfort</w:t>
+      </w:r>
+      <w:r>
+        <w:t xml:space="preserve"> </w:t>
+      </w:r>
+      <w:r>
+        <w:t xml:space="preserve">(1996)</w:t>
+      </w:r>
+      <w:r>
+        <w:t xml:space="preserve"> </w:t>
+      </w:r>
+      <w:r>
+        <w:t xml:space="preserve">presents, which largely follow Phillips</w:t>
+      </w:r>
+      <w:r>
+        <w:t xml:space="preserve"> </w:t>
+      </w:r>
+      <w:r>
+        <w:t xml:space="preserve">(1970)</w:t>
+      </w:r>
+      <w:r>
+        <w:t xml:space="preserve">. The ceramic data are decorated-class counts from the Lower Mississippi Valley Survey collections of Phillips, Ford, and Griffin</w:t>
       </w:r>
       <w:r>
         <w:t xml:space="preserve"> </w:t>
@@ -763,7 +837,7 @@
         <w:t xml:space="preserve">(2001)</w:t>
       </w:r>
       <w:r>
-        <w:t xml:space="preserve">. We use decorated classes only, because the neutral model applies to stylistic variation, variants whose frequencies change through copying and chance rather than through how a pot performs</w:t>
+        <w:t xml:space="preserve">. We use decorated classes only because the neutral model applies to stylistic variation, variants whose frequencies change through copying and chance rather than through how a pot performs</w:t>
       </w:r>
       <w:r>
         <w:t xml:space="preserve"> </w:t>
@@ -772,7 +846,7 @@
         <w:t xml:space="preserve">(Dunnell 1978; Neiman 1995)</w:t>
       </w:r>
       <w:r>
-        <w:t xml:space="preserve">. Plain wares track vessel function, paste, and the activities carried out at a site, none of which a copying model represents; Mississippi Plain and Bell Plain make up 87 percent of the typed sherds in the one published table for the region that reports them</w:t>
+        <w:t xml:space="preserve">. Plain wares track vessel function, paste, and site activities, none of which a copying model represents. Combining the frequency of plain and decorated classes also mixes factors driving relative investment in decorated ceramics, which social learning and copying do not simply drive. Mississippi Plain and Bell Plain make up 87 percent of the typed sherds in the one published table for the region that reports them</w:t>
       </w:r>
       <w:r>
         <w:t xml:space="preserve"> </w:t>
@@ -781,7 +855,7 @@
         <w:t xml:space="preserve">(Mainfort 2003)</w:t>
       </w:r>
       <w:r>
-        <w:t xml:space="preserve">. Ten decorated classes remain, one pooling Barton Incised, Kent Incised, and Mound Place Incised and one pooling the painted types Old Town Red, Nodena Red and White, and Avenue Polychrome. Each class is a culture-history type, a unit of measurement built by analysts, not a category assumed to have existed in the past.</w:t>
+        <w:t xml:space="preserve">. Ten decorated classes remain, one pooling Barton Incised, Kent Incised, and Mound Place Incised, and one pooling the painted types Old Town Red, Nodena Red and White, and Avenue Polychrome. Each class is a culture-history type, a unit of measurement built by analysts, not a category assumed to have existed in the past.</w:t>
       </w:r>
     </w:p>
     <w:p>
@@ -789,7 +863,7 @@
         <w:pStyle w:val="BodyText"/>
       </w:pPr>
       <w:r>
-        <w:t xml:space="preserve">Each assemblage takes its counts from a single source, and no counts are summed across sources. Of the 38 assemblages in the matrix, 20 come from Lipo’s compilation, which adds controlled surface collections and limited excavation in 1996 and 1997 at seven sites</w:t>
+        <w:t xml:space="preserve">Of the 38 assemblages used in this study, 20 come from Lipo’s compilation, which adds controlled surface collections and limited excavation in 1996 and 1997 at seven sites</w:t>
       </w:r>
       <w:r>
         <w:t xml:space="preserve"> </w:t>
@@ -798,7 +872,16 @@
         <w:t xml:space="preserve">(Lipo 2001)</w:t>
       </w:r>
       <w:r>
-        <w:t xml:space="preserve">, and 18 carry the original survey counts alone. Mainfort</w:t>
+        <w:t xml:space="preserve">, and 18 consist of the original survey counts from Phillips, Ford, and Griffin</w:t>
+      </w:r>
+      <w:r>
+        <w:t xml:space="preserve"> </w:t>
+      </w:r>
+      <w:r>
+        <w:t xml:space="preserve">(1951)</w:t>
+      </w:r>
+      <w:r>
+        <w:t xml:space="preserve">. Mainfort</w:t>
       </w:r>
       <w:r>
         <w:t xml:space="preserve"> </w:t>
@@ -819,7 +902,7 @@
         <w:t xml:space="preserve">(Mainfort 2003:182)</w:t>
       </w:r>
       <w:r>
-        <w:t xml:space="preserve">. Because his counts are not independent of ours, we never combine them; we use his table only for a second, separate test under his own phase assignments.</w:t>
+        <w:t xml:space="preserve">. Because his counts are not entirely independent of ours, we do not combine them. Nor do we make his table the primary dataset. His phases were drawn from an ordination of these types, as noted above, and his table is not a larger sample once it is restricted to decorated classes: at a minimum of 100 decorated sherds, it holds 29 sites and 13,296 sherds in five phases, two of which have only four and three sites, against the 28 assemblages and 14,101 sherds analyzed here. We therefore analyze his table and his phases separately, as a contrast case.</w:t>
       </w:r>
     </w:p>
     <w:p>
@@ -827,19 +910,54 @@
         <w:pStyle w:val="BodyText"/>
       </w:pPr>
       <w:r>
-        <w:t xml:space="preserve">An assemblage enters the analysis when Mainfort</w:t>
-      </w:r>
-      <w:r>
-        <w:t xml:space="preserve"> </w:t>
-      </w:r>
-      <w:r>
-        <w:t xml:space="preserve">(1996)</w:t>
-      </w:r>
-      <w:r>
-        <w:t xml:space="preserve"> </w:t>
-      </w:r>
-      <w:r>
-        <w:t xml:space="preserve">assigns it to one of the basin’s phases, or when it falls inside the territory his assignments define. The Parchman phase is excluded on geography, because its three assemblages lie across the Mississippi in Coahoma County, 30 to 46 km from the nearest other assemblage. An assemblage also needs at least 75 decorated sherds, the smallest count at which sampling alone rarely produces a difference between two assemblages as large as those the comparisons below turn on (Supplemental Text). These rules leave 28 assemblages holding 14,101 decorated sherds (median 251 per assemblage, range 79 to 1,709) in three phases: Parkin with 11 assemblages, Kent with 8, and Walls with 9. Twenty-five carry Mainfort’s assignment and three the territory’s. Nodena keeps only one assemblage above the minimum, and Jones Bayou and Tipton have decorated counts only in Mainfort’s table, so the three phases tested are the ones the survey sampled well enough for a between-group measure to mean something.</w:t>
+        <w:t xml:space="preserve">An assemblage enters our analysis based on the phase Mainfort</w:t>
+      </w:r>
+      <w:r>
+        <w:t xml:space="preserve"> </w:t>
+      </w:r>
+      <w:r>
+        <w:t xml:space="preserve">(1996:Figure 1)</w:t>
+      </w:r>
+      <w:r>
+        <w:t xml:space="preserve"> </w:t>
+      </w:r>
+      <w:r>
+        <w:t xml:space="preserve">assigns it to, or when it falls within the territory his assignments define. We exclude the Parchman phase on geography because its three assemblages lie across the Mississippi in Coahoma County, 30 to 46 km from the nearest other assemblage. We include only assemblages with at least 75 decorated sherds, the smallest count tested at which the</w:t>
+      </w:r>
+      <w:r>
+        <w:t xml:space="preserve"> </w:t>
+      </w:r>
+      <m:oMath>
+        <m:sSub>
+          <m:e>
+            <m:r>
+              <m:t>F</m:t>
+            </m:r>
+          </m:e>
+          <m:sub>
+            <m:r>
+              <m:t>S</m:t>
+            </m:r>
+            <m:r>
+              <m:t>T</m:t>
+            </m:r>
+          </m:sub>
+        </m:sSub>
+      </m:oMath>
+      <w:r>
+        <w:t xml:space="preserve"> </w:t>
+      </w:r>
+      <w:r>
+        <w:t xml:space="preserve">that sampling alone produces between two assemblages drawn from one profile falls, at its 95th percentile, below the observed five-cluster value (Supplemental Text). These rules leave 28 assemblages holding 14,101 decorated sherds (median 251 per assemblage, range 79 to 1,709) in three phases: Parkin with 11 assemblages, Kent with 8, and Walls with 9. Twenty-five carry Mainfort’s assignment and three the territory’s. We georeferenced each assemblage from the Lower Mississippi Survey site files. We obtained settlement attributes from a regional database</w:t>
+      </w:r>
+      <w:r>
+        <w:t xml:space="preserve"> </w:t>
+      </w:r>
+      <w:r>
+        <w:t xml:space="preserve">(Lipo and Dunnell 2007)</w:t>
+      </w:r>
+      <w:r>
+        <w:t xml:space="preserve">.</w:t>
       </w:r>
     </w:p>
     <w:p>
@@ -847,24 +965,7 @@
         <w:pStyle w:val="BodyText"/>
       </w:pPr>
       <w:r>
-        <w:t xml:space="preserve">We georeferenced each assemblage from the Lower Mississippi Survey site files. Where a location derives from a survey coordinate, we read it in the survey’s original 1927 datum (Supplemental Text). Settlement attributes come from a regional database</w:t>
-      </w:r>
-      <w:r>
-        <w:t xml:space="preserve"> </w:t>
-      </w:r>
-      <w:r>
-        <w:t xml:space="preserve">(Lipo and Dunnell 2007)</w:t>
-      </w:r>
-      <w:r>
-        <w:t xml:space="preserve">.</w:t>
-      </w:r>
-    </w:p>
-    <w:p>
-      <w:pPr>
-        <w:pStyle w:val="BodyText"/>
-      </w:pPr>
-      <w:r>
-        <w:t xml:space="preserve">Two properties of the data limit what any transmission analysis can claim. The assemblages are time-averaged, so sherds made at different times are counted together, which distorts diversity and neutrality measures in proportion to how long variants remain in use</w:t>
+        <w:t xml:space="preserve">Two properties of our data limit what any transmission analysis can claim. The assemblages are time-averaged, so sherds made at different times are counted together, which distorts diversity and neutrality measures in proportion to how long variants remain in use</w:t>
       </w:r>
       <w:r>
         <w:t xml:space="preserve"> </w:t>
@@ -873,7 +974,7 @@
         <w:t xml:space="preserve">(Madsen 2012; Miller-Atkins and Premo 2018)</w:t>
       </w:r>
       <w:r>
-        <w:t xml:space="preserve">. The neutral model also describes people copying one another, whereas an assemblage counts durable objects, so its expectations apply to this record only approximately</w:t>
+        <w:t xml:space="preserve">. The neutral model also describes people copying one another, whereas an assemblage counts durable objects, so the model’s expectations apply only approximately to this record</w:t>
       </w:r>
       <w:r>
         <w:t xml:space="preserve"> </w:t>
@@ -945,7 +1046,7 @@
         <w:t xml:space="preserve">(Baxter 1994; Peeples and Schachner 2012; Smith and Neiman 2007)</w:t>
       </w:r>
       <w:r>
-        <w:t xml:space="preserve">. That axis follows geography more closely than time. Its rank correlation with latitude is +0.77, and latitude and longitude together account for 62 percent of its variance. Kent Place and Hollywood, the two earliest dated sites, lie at the same end as Clay Hill, the latest</w:t>
+        <w:t xml:space="preserve">. That axis follows geography more closely than time. Its rank correlation with latitude is +0.77, and latitude and longitude together account for 62 percent of its variance. Kent Place and Hollywood, the two earliest dated deposits, lie at the same end as Clay Hill, the latest</w:t>
       </w:r>
       <w:r>
         <w:t xml:space="preserve"> </w:t>
@@ -957,7 +1058,7 @@
         <w:t xml:space="preserve"> </w:t>
       </w:r>
       <w:r>
-        <w:t xml:space="preserve">(Supplemental Text). An order along the axis is an order in space at least as much as in time, and none of the tests of the phase lines depends on it.</w:t>
+        <w:t xml:space="preserve">(Supplemental Text). Fortunately for our analysis, an order along the axis is an order in space at least as much as in time, and none of our phase-line tests depends on it.</w:t>
       </w:r>
     </w:p>
     <w:p>
@@ -969,7 +1070,7 @@
           <wp:inline>
             <wp:extent cx="5334000" cy="3639186"/>
             <wp:effectExtent b="0" l="0" r="0" t="0"/>
-            <wp:docPr descr="Figure 2. Correspondence-analysis seriation of the 28 decorated assemblages, plotted on the first two dimensions and colored by rank on the first (oriented, as in every analysis, in the direction the pooled calibrated medians of the four radiocarbon-dated assemblages weakly favor; they do not establish it). Parkin is starred. The assemblages form a continuum rather than discrete clusters, echoing Mainfort’s (2003) independent ordination." title="" id="118" name="Picture"/>
+            <wp:docPr descr="Figure 2. Correspondence-analysis seriation of the 28 decorated assemblages, plotted on the first two dimensions and colored by rank on the first (oriented, as in every analysis, in the direction the pooled calibrated medians of the four radiocarbon-dated assemblages weakly favor; they do not establish it). Parkin is the starred marker. The assemblages form a continuum rather than discrete clusters, echoing Mainfort’s (2003) independent ordination." title="" id="118" name="Picture"/>
             <a:graphic>
               <a:graphicData uri="http://schemas.openxmlformats.org/drawingml/2006/picture">
                 <pic:pic>
@@ -1022,7 +1123,7 @@
         <w:t xml:space="preserve"> </w:t>
       </w:r>
       <w:r>
-        <w:t xml:space="preserve">Correspondence-analysis seriation of the 28 decorated assemblages, plotted on the first two dimensions and colored by rank on the first (oriented, as in every analysis, in the direction the pooled calibrated medians of the four radiocarbon-dated assemblages weakly favor; they do not establish it). Parkin is starred. The assemblages form a continuum rather than discrete clusters, echoing Mainfort’s (2003) independent ordination.</w:t>
+        <w:t xml:space="preserve">Correspondence-analysis seriation of the 28 decorated assemblages, plotted on the first two dimensions and colored by rank on the first (oriented, as in every analysis, in the direction the pooled calibrated medians of the four radiocarbon-dated assemblages weakly favor; they do not establish it). Parkin is the starred marker. The assemblages form a continuum rather than discrete clusters, echoing Mainfort’s (2003) independent ordination.</w:t>
       </w:r>
     </w:p>
     <w:bookmarkEnd w:id="120"/>
@@ -1040,7 +1141,7 @@
         <w:pStyle w:val="FirstParagraph"/>
       </w:pPr>
       <w:r>
-        <w:t xml:space="preserve">Two measures carry the tests. The first is a cultural version of Wright’s</w:t>
+        <w:t xml:space="preserve">Two measures underpin our tests. The first is a cultural version of Wright’s</w:t>
       </w:r>
       <w:r>
         <w:t xml:space="preserve"> </w:t>
@@ -1069,7 +1170,7 @@
         <w:t xml:space="preserve">(Bell et al. 2009; Wright 1951)</w:t>
       </w:r>
       <w:r>
-        <w:t xml:space="preserve">, which says how much of the variation in decoration lies between groups rather than within them. We measure decorated diversity with the Gini-Simpson index, the probability that two sherds drawn at random belong to different classes, and cultural</w:t>
+        <w:t xml:space="preserve">, which indicates how much variation in decoration lies between groups rather than within them. We measure decorated diversity with the Gini-Simpson index, the probability that two sherds drawn at random belong to different classes, and cultural</w:t>
       </w:r>
       <w:r>
         <w:t xml:space="preserve"> </w:t>
@@ -1107,7 +1208,7 @@
         <w:t xml:space="preserve"> </w:t>
       </w:r>
       <w:r>
-        <w:t xml:space="preserve">diversity form of the index. When all groups draw on one shared pool it sits near zero, and as groups come to favor distinct repertoires it climbs. The second measure is the boundary excess: similarity between assemblages, measured with the Brainerd-Robinson coefficient</w:t>
+        <w:t xml:space="preserve">diversity form of the index. When all groups draw on one shared pool, it sits near zero. As groups favor distinct repertoires, it climbs. The second measure is the boundary excess. Similarity between assemblages, measured with the Brainerd-Robinson coefficient</w:t>
       </w:r>
       <w:r>
         <w:t xml:space="preserve"> </w:t>
@@ -1116,7 +1217,7 @@
         <w:t xml:space="preserve">(Brainerd 1951; Robinson 1951)</w:t>
       </w:r>
       <w:r>
-        <w:t xml:space="preserve">, normally fades smoothly with distance, and the step in similarity at a line, which we measure as a boundary excess, is how much more similarity is lost across the line than distance predicts.</w:t>
+        <w:t xml:space="preserve">, normally fades smoothly with distance. The boundary excess is how much more similarity is lost across a line than distance predicts, a step in similarity at the line.</w:t>
       </w:r>
     </w:p>
     <w:p>
@@ -1124,7 +1225,7 @@
         <w:pStyle w:val="BodyText"/>
       </w:pPr>
       <w:r>
-        <w:t xml:space="preserve">We established before looking at the phases that cultural</w:t>
+        <w:t xml:space="preserve">Before looking at the phases, we established that cultural</w:t>
       </w:r>
       <w:r>
         <w:t xml:space="preserve"> </w:t>
@@ -1176,7 +1277,7 @@
         <w:t xml:space="preserve"> </w:t>
       </w:r>
       <w:r>
-        <w:t xml:space="preserve">tracked the imposed groups steadily. Three other measures often used for the purpose, the departure from unbiased copying</w:t>
+        <w:t xml:space="preserve">tracked the imposed groups steadily. We found that three other measures often used for the purpose, the departure from unbiased copying</w:t>
       </w:r>
       <w:r>
         <w:t xml:space="preserve"> </w:t>
@@ -1194,7 +1295,7 @@
         <w:t xml:space="preserve">(Lipo et al. 2015)</w:t>
       </w:r>
       <w:r>
-        <w:t xml:space="preserve">, and the boundary excess, did not (Supplemental Text, Figures S1 to S3). We therefore draw inferences about groups from cultural</w:t>
+        <w:t xml:space="preserve">, and the boundary excess, do not sufficiently detect boundaries under real-world conditions (Supplemental Text, Figures S1 to S3). We therefore draw inferences about groups from cultural</w:t>
       </w:r>
       <w:r>
         <w:t xml:space="preserve"> </w:t>
@@ -1238,7 +1339,7 @@
         <w:t xml:space="preserve">k</w:t>
       </w:r>
       <w:r>
-        <w:t xml:space="preserve">-means on the assemblage coordinates. The site layout is best described by two clusters, judged by the silhouette score, which rewards clusters that are compact and well separated. Because cultural</w:t>
+        <w:t xml:space="preserve">-means on the assemblage coordinates. The site layout is best described by two clusters, as indicated by the silhouette score, which rewards compact, well-separated clusters. Because cultural</w:t>
       </w:r>
       <w:r>
         <w:t xml:space="preserve"> </w:t>
@@ -1264,7 +1365,7 @@
         <w:t xml:space="preserve"> </w:t>
       </w:r>
       <w:r>
-        <w:t xml:space="preserve">depends on how many pieces the basin is cut into, we also fit a model that uses no divisions at all. It treats decorated-class composition as a continuous surface over the map, with a separate term for whatever is specific to each site, and asks how much of the variation among assemblages follows location and how much belongs to individual sites. Bounded groups would leave site-specific character that location does not explain.</w:t>
+        <w:t xml:space="preserve">depends on how many pieces the basin is cut into, we also fit a model with no divisions. It treats decorated-class composition as a continuous surface over the map, with a separate term for site-specific deviations, and asks how well that surface describes the record. It is a description, not a test for groups: a group whose members lie near one another shares a composition that a smooth surface can absorb at the sampled sites, so the model cannot tell continuous copying from groups aligned with geography.</w:t>
       </w:r>
     </w:p>
     <w:bookmarkEnd w:id="121"/>
@@ -1282,7 +1383,7 @@
         <w:pStyle w:val="FirstParagraph"/>
       </w:pPr>
       <w:r>
-        <w:t xml:space="preserve">The central comparison runs a model of copying with no groups on the real geography of the assemblages and asks whether it reproduces the record. The model follows the finite-population network model of Lipo, DiNapoli, Madsen, and Hunt</w:t>
+        <w:t xml:space="preserve">The central comparison runs a copying model with no groups on the real geography of the St. Francis River basin using assemblage data and asks whether it reproduces the record. The model follows the finite-population network model of Lipo, DiNapoli, Madsen, and Hunt</w:t>
       </w:r>
       <w:r>
         <w:t xml:space="preserve"> </w:t>
@@ -1291,7 +1392,7 @@
         <w:t xml:space="preserve">(2021)</w:t>
       </w:r>
       <w:r>
-        <w:t xml:space="preserve">. Each assemblage is a node holding a finite population of learners, who copy decorated classes mostly within their node and occasionally from other nodes, with a probability that falls off with distance along the rivers. New variants enter at a constant rate, in proportion to each class’s share of the region’s pooled counts, which reflects that the types lump unequal numbers of decorative variants. We call this the copying model; it contains no groups. Deposition is pooled over a trailing window of eight time steps to reproduce time-averaging, and the simulated assemblages are subsampled to each real assemblage’s sherd count.</w:t>
+        <w:t xml:space="preserve">. Each assemblage is a node holding a finite population of learners, who copy decorated classes mostly within their node and occasionally from other nodes, with a probability that falls off with distance measured along the rivers. New variants enter at a constant rate, proportional to each class’s share of the region’s pooled counts, reflecting that types lump unequal numbers of decorative variants. We call this the copying model. It contains no groups. We pool deposition over a trailing window of eight time steps to reproduce time-averaging, and we subsample the simulated assemblages to match each real assemblage’s sherd count.</w:t>
       </w:r>
     </w:p>
     <w:p>
@@ -1299,7 +1400,7 @@
         <w:pStyle w:val="BodyText"/>
       </w:pPr>
       <w:r>
-        <w:t xml:space="preserve">A copying model’s predictions about differences between groups depend on population size, innovation rate, and mixing rate together, so we first tune those three to reproduce the diversity within the real assemblages: mean within-assemblage diversity, mean number of classes present, and the diversity of all assemblages pooled. None of these involves the groups being tested. We search a grid of 297 combinations and keep those whose simulations match all three summaries within 10 percent, confirmed by rerunning each fifty times (Supplemental Text). Among the confirmed combinations we use the one that produces the most between-group difference, so the comparison is as favorable to the no-groups model as the grid allows, and we repeat the key comparisons at the next five. For each comparison we report the share of simulated datasets that reach the observed value, a predictive check of the model against the record.</w:t>
+        <w:t xml:space="preserve">A copying model’s predictions about differences between groups depend on population size, innovation rate, and mixing rate together, so we first tune those three to reproduce the diversity within the real assemblages, including mean within-assemblage diversity, mean number of classes present, and the diversity of all assemblages pooled. None of these involves the groups being tested. We search a grid of 297 combinations and keep those whose simulations match all three summaries within 10 percent, confirmed by rerunning each matched combination fifty times (Supplemental Text). Among the confirmed combinations, we use the one that produces the most between-group difference, so the comparison is as favorable to the no-groups model as the grid allows.</w:t>
       </w:r>
     </w:p>
     <w:p>
@@ -1307,7 +1408,7 @@
         <w:pStyle w:val="BodyText"/>
       </w:pPr>
       <w:r>
-        <w:t xml:space="preserve">To give the phases a fair chance to be groups, we also ran the model with both properties a bounded group would have: copying across the phase lines weakened to between half and three percent of its strength, and new variants in each phase drawn from a partly reordered version of the regional profile, so that new styles arise locally. The 16 combinations of those settings were each run 300 times, and an approximate Bayesian posterior over them says which the record favors (Supplemental Text).</w:t>
+        <w:t xml:space="preserve">To give the phases a fair chance to be groups, we also ran the model with two properties a bounded group would have. First, we simulate copying across the phase lines weakened to between half and three percent of its strength. Second, we add new variants in each phase drawn from a partly reordered version of the regional profile, so that new styles arise locally. We ran each of the 16 combinations of those settings 300 times. An approximate Bayesian posterior over them indicates which the record favors (Supplemental Text).</w:t>
       </w:r>
     </w:p>
     <w:bookmarkEnd w:id="122"/>
@@ -1325,7 +1426,7 @@
         <w:pStyle w:val="FirstParagraph"/>
       </w:pPr>
       <w:r>
-        <w:t xml:space="preserve">Five tests ask whether the phase lines behave as the edges of groups would. First, we compare the between-group</w:t>
+        <w:t xml:space="preserve">We conduct five tests to ask whether the phase lines behave as group edges would. First, we compare the between-group</w:t>
       </w:r>
       <w:r>
         <w:t xml:space="preserve"> </w:t>
@@ -1351,7 +1452,94 @@
         <w:t xml:space="preserve"> </w:t>
       </w:r>
       <w:r>
-        <w:t xml:space="preserve">and boundary excess under the phase assignments with alternative divisions of the same assemblages into groups of the same sizes, drawn either around randomly placed centers or to be as spatially compact as possible. We state each comparison as the posterior probability that the phase lines separate the pottery better than an alternative, drawing each assemblage’s class proportions from their posterior (2,000 times for</w:t>
+        <w:t xml:space="preserve">and boundary excess under the phase assignments with alternative divisions of the same assemblages into groups of the same sizes, drawn around randomly placed centers or made as spatially compact as possible. We state each comparison as the posterior probability that the phase lines separate type frequencies better than an alternative (see Statistical approach). Simulations with copying restricted at the phase lines show whether this comparison could detect such a restriction. Second, we cluster the assemblages using site coordinates and decorated-class composition together, vary how much weight composition carries, and measure agreement with Mainfort’s assignments with the adjusted Rand index</w:t>
+      </w:r>
+      <w:r>
+        <w:t xml:space="preserve"> </w:t>
+      </w:r>
+      <w:r>
+        <w:t xml:space="preserve">(Hubert and Arabie 1985)</w:t>
+      </w:r>
+      <w:r>
+        <w:t xml:space="preserve">, which averages zero for unrelated divisions and one for identical ones. Third, we map the local rate of composition change and ask whether the phase lines fall where it changes fastest. Fourth, we run the copying model on the real map of the valley and cluster its simulated assemblages the same way we cluster the real assemblages. Fifth, we ask whether the phase lines run through gaps in late-period settlement, using sites independent of the analyzed assemblages.</w:t>
+      </w:r>
+    </w:p>
+    <w:p>
+      <w:pPr>
+        <w:pStyle w:val="BodyText"/>
+      </w:pPr>
+      <w:r>
+        <w:t xml:space="preserve">We test the Parkin phase the same way, dividing the basin into the Parkin phase and the rest, against the copying model and against arbitrary divisions of the same sizes. A polity should also leave traces outside the ceramic assemblages. We describe the distribution of maximum mound height within the basin, the only size attribute the regional compilation records for most sites, as context for whether sites form the hierarchy of settlement types and sizes that Peebles and Kus</w:t>
+      </w:r>
+      <w:r>
+        <w:t xml:space="preserve"> </w:t>
+      </w:r>
+      <w:r>
+        <w:t xml:space="preserve">(1977:431)</w:t>
+      </w:r>
+      <w:r>
+        <w:t xml:space="preserve"> </w:t>
+      </w:r>
+      <w:r>
+        <w:t xml:space="preserve">take as a correlate of ranked society. As a comparison, we also draw on evidence from Cobb’s</w:t>
+      </w:r>
+      <w:r>
+        <w:t xml:space="preserve"> </w:t>
+      </w:r>
+      <w:r>
+        <w:t xml:space="preserve">(2000)</w:t>
+      </w:r>
+      <w:r>
+        <w:t xml:space="preserve"> </w:t>
+      </w:r>
+      <w:r>
+        <w:t xml:space="preserve">analysis of the production and distribution of Mill Creek chert hoes, goods whose control would mark economic centralization.</w:t>
+      </w:r>
+    </w:p>
+    <w:p>
+      <w:pPr>
+        <w:pStyle w:val="BodyText"/>
+      </w:pPr>
+      <w:r>
+        <w:t xml:space="preserve">The contrast case applies the first two tests, together with a search for the most spatially compact division, to Mainfort’s</w:t>
+      </w:r>
+      <w:r>
+        <w:t xml:space="preserve"> </w:t>
+      </w:r>
+      <w:r>
+        <w:t xml:space="preserve">(2003)</w:t>
+      </w:r>
+      <w:r>
+        <w:t xml:space="preserve"> </w:t>
+      </w:r>
+      <w:r>
+        <w:t xml:space="preserve">counts under his own phases. Because the two schemes were drawn differently, this explanation predicts that they behave differently. If the inherited phases are a gradient sorted by proximity, the map should recover them, and other lines should separate the assemblages as well or better. A scheme drawn from an ordination should instead be recovered better once composition enters, and its lines should separate the assemblages better than other lines do. If phases of either kind marked bounded groups, however, both schemes should locate the same boundaries. We do not run the copying model on his table, since the model is calibrated to our matrix, so the contrast case cannot show whether his phases differ by more than copying alone produces.</w:t>
+      </w:r>
+    </w:p>
+    <w:bookmarkEnd w:id="123"/>
+    <w:bookmarkStart w:id="124" w:name="statistical-approach"/>
+    <w:p>
+      <w:pPr>
+        <w:pStyle w:val="Heading3"/>
+      </w:pPr>
+      <w:r>
+        <w:t xml:space="preserve">Statistical approach</w:t>
+      </w:r>
+    </w:p>
+    <w:p>
+      <w:pPr>
+        <w:pStyle w:val="FirstParagraph"/>
+      </w:pPr>
+      <w:r>
+        <w:t xml:space="preserve">Every inference in this paper is Bayesian, and the numbers we report fall into three kinds: posterior quantities, which state what the record implies about a quantity once we carry through the uncertainty in its counts; predictive checks, which compare the record with what a simulation model produces; and descriptive statistics. No inference about the record rests on a significance test or a p-value. Because the three kinds answer different questions, we identify each result below by the kind of number it is.</w:t>
+      </w:r>
+    </w:p>
+    <w:p>
+      <w:pPr>
+        <w:pStyle w:val="BodyText"/>
+      </w:pPr>
+      <w:r>
+        <w:t xml:space="preserve">Sampling is the first source of uncertainty. Each assemblage is a finite sample of sherds, so its class proportions are uncertain, and more so for a small assemblage than for a large one. We represent that uncertainty with a posterior distribution over each assemblage’s proportions: with a multinomial likelihood for the counts and a Dirichlet(1/2) prior on the proportions (the Jeffreys prior for this likelihood), the posterior is a Dirichlet distribution with parameters equal to the counts plus one half. Drawing proportions from it repeatedly, 2,000 times for</w:t>
       </w:r>
       <w:r>
         <w:t xml:space="preserve"> </w:t>
@@ -1374,7 +1562,10 @@
         </m:sSub>
       </m:oMath>
       <w:r>
-        <w:t xml:space="preserve">, 500 for the step in similarity) so that the uncertainty in the counts is carried through. Simulations with copying restricted at the phase lines show whether this comparison could detect such a restriction. Second, we cluster the assemblages using site coordinates and decorated-class composition together, varying how much weight composition carries, and measure agreement with Mainfort’s assignments with the adjusted Rand index, which is zero on average for unrelated divisions and one for identical ones. Third, we map the local rate at which composition changes and ask whether the phase lines fall where it changes fastest. Fourth, we run the copying model on the real map and cluster its simulated pottery exactly as we cluster the real pottery. Fifth, we ask whether the phase lines run through gaps in late-period settlement, using sites independent of the analyzed assemblages.</w:t>
+        <w:t xml:space="preserve"> </w:t>
+      </w:r>
+      <w:r>
+        <w:t xml:space="preserve">and 500 times for the slower boundary excess, and recomputing a statistic on each draw gives that statistic’s posterior distribution. We report its median and a 95 percent credible interval (the 2.5th to 97.5th percentiles of the draws); given the counts and the prior, the quantity lies in that interval with probability 0.95. When the phase lines are compared with alternative divisions, each draw is scored against 20 alternatives of each kind (10 for the boundary excess) chosen at random from 300, and the posterior probability that the phase lines separate the pottery better is the share of all these comparisons they win. A probability of 0.20 therefore means that, allowing for sampling error in every assemblage, the phase lines beat a randomly chosen alternative in one comparison in five. Where a probability or a share rounds to zero, we give the number of comparisons or runs behind it, since the true value is then known only to be smaller than that resolution.</w:t>
       </w:r>
     </w:p>
     <w:p>
@@ -1382,36 +1573,55 @@
         <w:pStyle w:val="BodyText"/>
       </w:pPr>
       <w:r>
-        <w:t xml:space="preserve">The Parkin phase is tested the same way, as a division of the basin into the Parkin phase and the rest, against the copying model and against arbitrary divisions of the same sizes. A polity should also leave traces outside the pottery. We examine the distribution of maximum mound height within the basin, the one attribute recorded the same way at every site, to ask whether sites form the hierarchy of settlement types and sizes that Peebles and Kus</w:t>
-      </w:r>
-      <w:r>
-        <w:t xml:space="preserve"> </w:t>
-      </w:r>
-      <w:r>
-        <w:t xml:space="preserve">(1977:431)</w:t>
-      </w:r>
-      <w:r>
-        <w:t xml:space="preserve"> </w:t>
-      </w:r>
-      <w:r>
-        <w:t xml:space="preserve">take as a correlate of ranked society, and we draw on Cobb’s</w:t>
-      </w:r>
-      <w:r>
-        <w:t xml:space="preserve"> </w:t>
-      </w:r>
-      <w:r>
-        <w:t xml:space="preserve">(2000)</w:t>
-      </w:r>
-      <w:r>
-        <w:t xml:space="preserve"> </w:t>
-      </w:r>
-      <w:r>
-        <w:t xml:space="preserve">analysis of the production and distribution of Mill Creek chert hoes, goods whose control would mark economic centralization.</w:t>
-      </w:r>
-    </w:p>
-    <w:bookmarkEnd w:id="123"/>
+        <w:t xml:space="preserve">Our spatial model with no divisions is a Bayesian hierarchical model written in Stan and fitted by Hamiltonian Monte Carlo</w:t>
+      </w:r>
+      <w:r>
+        <w:t xml:space="preserve"> </w:t>
+      </w:r>
+      <w:r>
+        <w:t xml:space="preserve">(Carpenter et al. 2017)</w:t>
+      </w:r>
+      <w:r>
+        <w:t xml:space="preserve">. We report its spatial share as a posterior median with a credible interval, and we report its priors, convergence diagnostics, and checks against quantities it was not fitted to in the Supplemental Text.</w:t>
+      </w:r>
+    </w:p>
+    <w:p>
+      <w:pPr>
+        <w:pStyle w:val="BodyText"/>
+      </w:pPr>
+      <w:r>
+        <w:t xml:space="preserve">In contrast, the copying model is a simulator with no likelihood we can write down, and we use it in two ways. As a predictive check, we run it repeatedly at a fixed, calibrated combination of population size, innovation rate, and mixing rate, compute on each simulated dataset the same statistic computed on the record, and report the median and 95 percent range (the 2.5th to 97.5th percentiles) of the simulated values together with the share of runs reaching the observed value</w:t>
+      </w:r>
+      <w:r>
+        <w:t xml:space="preserve"> </w:t>
+      </w:r>
+      <w:r>
+        <w:t xml:space="preserve">(Gelman et al. 1996)</w:t>
+      </w:r>
+      <w:r>
+        <w:t xml:space="preserve">. A small share says that the model rarely produces what the record shows. It measures fit and is not compared with a threshold. Because the parameters are fixed at calibrated values rather than drawn from a posterior, the check carries no uncertainty about them. We address this by repeating the key comparisons at the six most favorable calibrated combinations. A 95 percent range and a 95 percent credible interval should not be confused: the first describes how much a statistic varies under a model, whereas the second describes a quantity of the record. The second use of the simulator is approximate Bayesian computation over the 16 settings of the bounded-groups model</w:t>
+      </w:r>
+      <w:r>
+        <w:t xml:space="preserve"> </w:t>
+      </w:r>
+      <w:r>
+        <w:t xml:space="preserve">(Beaumont et al. 2002)</w:t>
+      </w:r>
+      <w:r>
+        <w:t xml:space="preserve">. Each setting receives the same prior probability, and a setting’s posterior probability is its share of the 5 percent of all runs whose summary statistics lie closest to the record’s. Since 12 of the 16 settings include a copying boundary, the prior probability of a boundary is 0.75, and the evidence lies in how far the posterior moves from that value. To judge that movement, we pass simulated records with and without a built-in boundary through the same procedure and report where the record’s value falls relative to them.</w:t>
+      </w:r>
+    </w:p>
+    <w:p>
+      <w:pPr>
+        <w:pStyle w:val="BodyText"/>
+      </w:pPr>
+      <w:r>
+        <w:t xml:space="preserve">Rank correlations, the adjusted Rand index, silhouette scores, and the percentile of a division among alternatives are descriptive. Each summarizes the record or a set of divisions, and none carries an inferential claim by itself.</w:t>
+      </w:r>
+    </w:p>
     <w:bookmarkEnd w:id="124"/>
-    <w:bookmarkStart w:id="153" w:name="results"/>
+    <w:bookmarkEnd w:id="125"/>
+    <w:bookmarkStart w:id="154" w:name="results"/>
     <w:p>
       <w:pPr>
         <w:pStyle w:val="Heading2"/>
@@ -1420,7 +1630,7 @@
         <w:t xml:space="preserve">Results</w:t>
       </w:r>
     </w:p>
-    <w:bookmarkStart w:id="125" w:name="what-spatially-structured-drift-explains"/>
+    <w:bookmarkStart w:id="126" w:name="what-spatially-structured-drift-explains"/>
     <w:p>
       <w:pPr>
         <w:pStyle w:val="Heading3"/>
@@ -1434,7 +1644,7 @@
         <w:pStyle w:val="FirstParagraph"/>
       </w:pPr>
       <w:r>
-        <w:t xml:space="preserve">Neutral copying on the real map accounts for most of what the basin’s decorated-type frequencies show. Tuning the model to the record’s diversity matched 50 of the 297 combinations on the six-run screen, and 45 still matched when rerun fifty times (Supplemental Text, Figure S7). At the matched combination most favorable to it (2,000 learners per node, an innovation rate of 0.001, and a mixing rate of 0.02), copying with no groups reproduces the fading of similarity with distance (observed rank correlation -0.20, against a simulated 95 percent range of -0.53 to +0.04) and the difference between the two spatial clusters the site layout supports (Table 1).</w:t>
+        <w:t xml:space="preserve">Neutral copying on the real map accounts for most of what the basin’s decorated-type frequencies show. Tuning the model to the record’s diversity matched 50 of the 297 combinations on the six-run screen, and 45 still matched when rerun fifty times (Supplemental Text, Figure S7). At the matched combination most favorable to it (2,000 learners per node, an innovation rate of 0.001, and a mixing rate of 0.02), copying with no groups reproduces the fading of similarity with distance (observed correlation of similarity with distance along the rivers -0.20, against a simulated 95 percent range of -0.53 to +0.04) and the difference between the two spatial clusters the site layout supports (Table 1).</w:t>
       </w:r>
     </w:p>
     <w:p>
@@ -1442,7 +1652,7 @@
         <w:pStyle w:val="BodyText"/>
       </w:pPr>
       <w:r>
-        <w:t xml:space="preserve">A model with no divisions at all gives the same picture. It assigns 99.6 percent of the variation in composition among assemblages to location (95 percent credible interval 97.2 to 100 percent), leaving almost none of the site-specific character that bounded groups would produce, and it reproduces the observed between-cluster</w:t>
+        <w:t xml:space="preserve">A model with no divisions at all describes the record adequately. On the logit scale of its latent class probabilities, it assigns 99.6 percent of the variance among assemblages to the spatial surface (posterior median; 95 percent credible interval 97.2 to 100 percent) and little to independent site deviations, and it reproduces the observed between-cluster</w:t>
       </w:r>
       <w:r>
         <w:t xml:space="preserve"> </w:t>
@@ -1468,7 +1678,7 @@
         <w:t xml:space="preserve"> </w:t>
       </w:r>
       <w:r>
-        <w:t xml:space="preserve">at three clusters, the fading of similarity with distance, and the spread of diversity among assemblages (Supplemental Text). Composition changes across the basin as a broad, continuous gradient. This model describes the pattern rather than a mechanism, and its surface can bend over short distances, so it also carries variation that the copying model, taken next, does not produce.</w:t>
+        <w:t xml:space="preserve">at three clusters, the fading of similarity with distance, and the spread of diversity among assemblages (Supplemental Text). As a description, the high spatial share does not distinguish a continuous copying process from groups aligned with geography. The surface can also bend over short distances, so it carries variation that the copying model, taken next, does not produce.</w:t>
       </w:r>
     </w:p>
     <w:p>
@@ -1512,7 +1722,7 @@
         <w:t xml:space="preserve"> </w:t>
       </w:r>
       <w:r>
-        <w:t xml:space="preserve">against the neutral copying model, which contains no groups. Model values are the median and 95 percent range over 300 runs at the matched combination most favorable to the model; the last column gives the share of runs reaching the observed value there and, in parentheses, the range of that share across the six most favorable combinations that passed the confirmation. Radius is the root-mean-square distance from an assemblage to its group’s center. At five or more clusters at least one cluster holds a single assemblage, so finer divisions are reported only in the Supplemental Text.</w:t>
+        <w:t xml:space="preserve">against the neutral copying model, which contains no groups. Model values are the median and 95 percent range over 300 runs at the matched combination most favorable to the model. The last column gives the share of runs reaching the observed value there and, in parentheses, the range of that share across the six most favorable combinations that passed the confirmation. Radius is the root-mean-square distance from an assemblage to its group’s center. A share of 0 percent means none of 300 runs, a frequency below about 0.3 percent, not an impossibility. At five or more clusters, at least one cluster holds a single assemblage, so finer divisions are reported only in the Supplemental Text.</w:t>
       </w:r>
     </w:p>
     <w:tbl>
@@ -1683,7 +1893,7 @@
               <w:pStyle w:val="Compact"/>
             </w:pPr>
             <w:r>
-              <w:t xml:space="preserve">The published phases</w:t>
+              <w:t xml:space="preserve">The inherited phases</w:t>
             </w:r>
           </w:p>
         </w:tc>
@@ -1894,7 +2104,7 @@
         <w:pStyle w:val="BodyText"/>
       </w:pPr>
       <w:r>
-        <w:t xml:space="preserve">The model does not account for everything. Between the phases, it reaches the observed difference in 5 percent of runs at the most favorable combination, and at three and four spatial clusters it reaches the observed value in 0 to 6 percent of runs at every one of the six (Table 1). The pottery varies over shorter distances than calibrated copying makes it vary. The step in similarity across the phase lines exceeds the model as well: the boundary excess is +10.0, against a simulated median of +1.5 (95 percent range -6.0 to +7.8), and 1 of 300 runs reaches it. This additional variation is not a sampling effect. Redrawing every assemblage from the basin’s pooled profile at its own sherd count gives between-cluster differences near zero (Supplemental Text).</w:t>
+        <w:t xml:space="preserve">The model does not account for everything. Between phases, it matches the observed difference in 5 percent of runs at the most favorable combination, and at three and four spatial clusters it matches the observed value in 0 to 6 percent of runs at each of the six (Table 1). The assemblages vary over shorter distances than calibrated copying does. The step in similarity across the phase lines also exceeds the model. The boundary excess is +10.0, against a simulated median of +1.5 (95 percent range -6.0 to +7.8), and 1 of 300 runs reaches it. This additional variation is not due to sampling. Redrawing every assemblage from the basin’s pooled profile at its own sherd count gives between-cluster differences near zero (Supplemental Text).</w:t>
       </w:r>
     </w:p>
     <w:p>
@@ -1902,7 +2112,15 @@
         <w:pStyle w:val="BodyText"/>
       </w:pPr>
       <w:r>
-        <w:t xml:space="preserve">The next section asks whether that additional variation follows the phase lines. What produces it is a separate question, and the model can narrow it without settling it (Table 2). Of the ways we tried to make the model less simple, only one reproduces the observed differences while keeping the record’s diversity matched: letting new styles arise somewhat locally, each area drawing its new variants from a slightly different version of the regional profile. With the areas defined as the two spatial clusters and a quarter of the classes reordered, the median between-cluster</w:t>
+        <w:t xml:space="preserve">The next section asks whether that additional variation follows the phase lines. What produces it is a separate question, and the model can narrow it without settling it (Table 2). We relaxed four simplifications of the model one at a time at the calibrated combination, and read every variant, the baseline included, by the same three criteria: whether its median reaches the observation, how often its runs reach it, and whether the record’s diversity stays matched (Supplemental Text). No variant that keeps diversity matched brings its median up to the observed three- and four-cluster values. Two raise the share of runs reaching those values while keeping diversity matched. Letting new styles arise somewhat locally, each of the two spatial clusters drawing its new variants from a slightly different version of the regional profile, raises it from 3 and 1 percent in baseline runs with the same seeds to 42 and 40 percent when a quarter of the classes are reordered (300 runs each); with the phases as the areas and a fifth of the classes reordered, 39 percent of runs reach the observed between-phase value. Copying that falls off over a short straight-line distance, 6 km, raises it to 11 and 7 percent. Unequal site populations and shorter fall-off along the rivers raise it further but break the diversity match; not recalibrated, they are unsupported rather than excluded. None of these variants restricts who copies whom, and the test cannot tell whether local innovation followed the phases or any other division of the basin.</w:t>
+      </w:r>
+    </w:p>
+    <w:p>
+      <w:pPr>
+        <w:pStyle w:val="BodyText"/>
+      </w:pPr>
+      <w:r>
+        <w:t xml:space="preserve">Restricting copying across the phase lines, the property that would make the phases groups, also increases both statistics. With copying across the lines cut to 3 percent of its strength, 40 percent of runs reach the observed between-phase</w:t>
       </w:r>
       <w:r>
         <w:t xml:space="preserve"> </w:t>
@@ -1928,7 +2146,25 @@
         <w:t xml:space="preserve"> </w:t>
       </w:r>
       <w:r>
-        <w:t xml:space="preserve">is 0.0073 against the observed 0.0062 (1,200 runs); with the areas defined as the phases and a fifth reordered, the between-phase median is 0.0077 and 39 percent of runs reach the observed value. This is still neutral copying, and nothing in it restricts who copies whom. The test cannot tell whether such local innovation followed the phases or any other division of the basin. Restricting copying across the phase lines, the property that would make the phases groups, also raises both statistics: with copying across the lines cut to 3 percent of its strength, 40 percent of runs reach the observed between-phase</w:t>
+        <w:t xml:space="preserve">and 34 percent reach the observed step at the lines. The copying model, however, cannot distinguish the two. The posterior probability of a copying boundary at the phase lines is 0.79, against a prior of 0.75. On simulated records with a boundary built in, the same procedure returns a median of 0.81 to 0.95 (40 test records per setting), and on records without one, a median of 0.66. The record’s value falls between the two, so it leans slightly toward a boundary without resolving one. That lean is not specific to the phases: run on three arbitrary divisions with the phases’ group sizes, the same analysis gives 0.78 to 0.92. The comparisons of where the lines fall, taken up next, bear on the question more directly, although they too discriminate only moderately.</w:t>
+      </w:r>
+    </w:p>
+    <w:p>
+      <w:pPr>
+        <w:pStyle w:val="BodyText"/>
+      </w:pPr>
+      <w:r>
+        <w:rPr>
+          <w:b/>
+          <w:bCs/>
+        </w:rPr>
+        <w:t xml:space="preserve">Table 2.</w:t>
+      </w:r>
+      <w:r>
+        <w:t xml:space="preserve"> </w:t>
+      </w:r>
+      <w:r>
+        <w:t xml:space="preserve">The accounts of the basin’s decorated-type frequencies tested here, what each predicts, and how it fared. Every copying-model account is read on the same three criteria: whether its median between-group</w:t>
       </w:r>
       <w:r>
         <w:t xml:space="preserve"> </w:t>
@@ -1954,61 +2190,7 @@
         <w:t xml:space="preserve"> </w:t>
       </w:r>
       <w:r>
-        <w:t xml:space="preserve">and 34 percent the observed step at the lines. The copying model does not tell the two apart. The posterior probability of a copying boundary at the phase lines is 0.79, against a prior of 0.75, just below the median of 0.81 to 0.95 the design returns on test data with a boundary built in (40 test runs per setting) and above the median of 0.66 it returns without one: the record leans slightly toward a boundary without resolving it. That lean is not specific to the phases: run on three arbitrary divisions with the phases’ group sizes, the same analysis gives 0.78 to 0.92. Where the lines fall decides the question, taken up next.</w:t>
-      </w:r>
-    </w:p>
-    <w:p>
-      <w:pPr>
-        <w:pStyle w:val="BodyText"/>
-      </w:pPr>
-      <w:r>
-        <w:rPr>
-          <w:b/>
-          <w:bCs/>
-        </w:rPr>
-        <w:t xml:space="preserve">Table 2.</w:t>
-      </w:r>
-      <w:r>
-        <w:t xml:space="preserve"> </w:t>
-      </w:r>
-      <w:r>
-        <w:t xml:space="preserve">The accounts of the basin’s decorated-type frequencies tested here, what each predicts, and how it fared. An account meets the standard only if it reaches the observed between-group</w:t>
-      </w:r>
-      <w:r>
-        <w:t xml:space="preserve"> </w:t>
-      </w:r>
-      <m:oMath>
-        <m:sSub>
-          <m:e>
-            <m:r>
-              <m:t>F</m:t>
-            </m:r>
-          </m:e>
-          <m:sub>
-            <m:r>
-              <m:t>S</m:t>
-            </m:r>
-            <m:r>
-              <m:t>T</m:t>
-            </m:r>
-          </m:sub>
-        </m:sSub>
-      </m:oMath>
-      <w:r>
-        <w:t xml:space="preserve"> </w:t>
-      </w:r>
-      <w:r>
-        <w:rPr>
-          <w:i/>
-          <w:iCs/>
-        </w:rPr>
-        <w:t xml:space="preserve">and</w:t>
-      </w:r>
-      <w:r>
-        <w:t xml:space="preserve"> </w:t>
-      </w:r>
-      <w:r>
-        <w:t xml:space="preserve">keeps all three within-assemblage diversity summaries within 10 percent of the observed values. Full grids and diagnostics are in the Supplemental Text.</w:t>
+        <w:t xml:space="preserve">reaches the observed value, the share of its runs reaching the observed value (predictive coverage), and whether it keeps all three within-assemblage diversity summaries within 10 percent of the observed values. Shares for the relaxations are from 300 runs at the calibrated combination, scored at three and four spatial clusters, where the baseline falls short. Relaxations are one at a time and not recalibrated. Full grids and diagnostics are in the Supplemental Text.</w:t>
       </w:r>
     </w:p>
     <w:tbl>
@@ -2080,7 +2262,7 @@
               <w:pStyle w:val="Compact"/>
             </w:pPr>
             <w:r>
-              <w:t xml:space="preserve">Differences among assemblages and the fade of similarity with distance, with no group anywhere</w:t>
+              <w:t xml:space="preserve">Differences among assemblages and the decrease in similarity with distance, with no group anywhere</w:t>
             </w:r>
           </w:p>
         </w:tc>
@@ -2095,13 +2277,13 @@
                 <w:b/>
                 <w:bCs/>
               </w:rPr>
-              <w:t xml:space="preserve">Explains most of the record.</w:t>
+              <w:t xml:space="preserve">Adequate at coarse scale only.</w:t>
             </w:r>
             <w:r>
               <w:t xml:space="preserve"> </w:t>
             </w:r>
             <w:r>
-              <w:t xml:space="preserve">Reproduces the fade with distance and the two-cluster difference; the phases and finer divisions differ more than it produces</w:t>
+              <w:t xml:space="preserve">Diversity matched; covers the decrease with distance and the two-cluster difference (13 percent of runs), but runs reach the three- and four-cluster values in 0 to 6 percent and the between-phase value in 5 percent</w:t>
             </w:r>
           </w:p>
         </w:tc>
@@ -2125,7 +2307,7 @@
               <w:pStyle w:val="Compact"/>
             </w:pPr>
             <w:r>
-              <w:t xml:space="preserve">Lines where the pottery changes; lines the pottery recovers better than the map; lines that separate the pottery better than other lines</w:t>
+              <w:t xml:space="preserve">Lines where the assemblage composition changes; lines the assemblages recover better than the map; lines that separate the assemblages better than other lines</w:t>
             </w:r>
           </w:p>
         </w:tc>
@@ -2146,7 +2328,7 @@
               <w:t xml:space="preserve"> </w:t>
             </w:r>
             <w:r>
-              <w:t xml:space="preserve">The map recovers the lines; arbitrary lines separate the pottery better, which restricted copying at the lines would reverse</w:t>
+              <w:t xml:space="preserve">The map recovers the lines, and alternative divisions separate the assemblages as well or better; in simulation at the calibrated combination a strong restriction usually reverses that ordering, but the real score is uncommon under every simulated setting, so a weak restriction cannot be excluded</w:t>
             </w:r>
           </w:p>
         </w:tc>
@@ -2217,7 +2399,7 @@
               <w:t xml:space="preserve"> </w:t>
             </w:r>
             <w:r>
-              <w:t xml:space="preserve">from local innovation; posterior 0.79 against a prior of 0.75</w:t>
+              <w:t xml:space="preserve">from local innovation; posterior 0.79 against a prior of 0.75, and 0.78 to 0.92 for arbitrary divisions</w:t>
             </w:r>
           </w:p>
         </w:tc>
@@ -2230,7 +2412,7 @@
               <w:pStyle w:val="Compact"/>
             </w:pPr>
             <w:r>
-              <w:t xml:space="preserve">Unequal site populations, a different transport geography, or unequal accumulation spans</w:t>
+              <w:t xml:space="preserve">Unequal site populations; shorter or differently shaped fall-off along the rivers</w:t>
             </w:r>
           </w:p>
         </w:tc>
@@ -2241,7 +2423,7 @@
               <w:pStyle w:val="Compact"/>
             </w:pPr>
             <w:r>
-              <w:t xml:space="preserve">Faster drift at small or isolated sites, or more distinct narrow deposits</w:t>
+              <w:t xml:space="preserve">Faster drift at small or isolated sites</w:t>
             </w:r>
           </w:p>
         </w:tc>
@@ -2256,13 +2438,103 @@
                 <w:b/>
                 <w:bCs/>
               </w:rPr>
-              <w:t xml:space="preserve">Fail.</w:t>
+              <w:t xml:space="preserve">Not supported at the calibrated combination.</w:t>
             </w:r>
             <w:r>
               <w:t xml:space="preserve"> </w:t>
             </w:r>
             <w:r>
-              <w:t xml:space="preserve">Reach the observed value only by breaking the diversity match, or not at all</w:t>
+              <w:t xml:space="preserve">Raise the share of runs reaching the finer-scale values appreciably only where they break the diversity match</w:t>
+            </w:r>
+          </w:p>
+        </w:tc>
+      </w:tr>
+      <w:tr>
+        <w:tc>
+          <w:tcPr/>
+          <w:p>
+            <w:pPr>
+              <w:pStyle w:val="Compact"/>
+            </w:pPr>
+            <w:r>
+              <w:t xml:space="preserve">Unequal accumulation spans</w:t>
+            </w:r>
+          </w:p>
+        </w:tc>
+        <w:tc>
+          <w:tcPr/>
+          <w:p>
+            <w:pPr>
+              <w:pStyle w:val="Compact"/>
+            </w:pPr>
+            <w:r>
+              <w:t xml:space="preserve">More distinct narrow deposits</w:t>
+            </w:r>
+          </w:p>
+        </w:tc>
+        <w:tc>
+          <w:tcPr/>
+          <w:p>
+            <w:pPr>
+              <w:pStyle w:val="Compact"/>
+            </w:pPr>
+            <w:r>
+              <w:rPr>
+                <w:b/>
+                <w:bCs/>
+              </w:rPr>
+              <w:t xml:space="preserve">No effect</w:t>
+            </w:r>
+            <w:r>
+              <w:t xml:space="preserve"> </w:t>
+            </w:r>
+            <w:r>
+              <w:t xml:space="preserve">on the two-cluster differentiation; not rescored at finer scales</w:t>
+            </w:r>
+          </w:p>
+        </w:tc>
+      </w:tr>
+      <w:tr>
+        <w:tc>
+          <w:tcPr/>
+          <w:p>
+            <w:pPr>
+              <w:pStyle w:val="Compact"/>
+            </w:pPr>
+            <w:r>
+              <w:t xml:space="preserve">Copying falling off over 6 km of straight-line distance</w:t>
+            </w:r>
+          </w:p>
+        </w:tc>
+        <w:tc>
+          <w:tcPr/>
+          <w:p>
+            <w:pPr>
+              <w:pStyle w:val="Compact"/>
+            </w:pPr>
+            <w:r>
+              <w:t xml:space="preserve">Differentiation over shorter distances</w:t>
+            </w:r>
+          </w:p>
+        </w:tc>
+        <w:tc>
+          <w:tcPr/>
+          <w:p>
+            <w:pPr>
+              <w:pStyle w:val="Compact"/>
+            </w:pPr>
+            <w:r>
+              <w:rPr>
+                <w:b/>
+                <w:bCs/>
+              </w:rPr>
+              <w:t xml:space="preserve">Adequate by coverage.</w:t>
+            </w:r>
+            <w:r>
+              <w:t xml:space="preserve"> </w:t>
+            </w:r>
+            <w:r>
+              <w:t xml:space="preserve">Diversity matched; 11 and 7 percent of runs reach the three- and four-cluster values; medians fall short</w:t>
             </w:r>
           </w:p>
         </w:tc>
@@ -2301,17 +2573,20 @@
                 <w:b/>
                 <w:bCs/>
               </w:rPr>
-              <w:t xml:space="preserve">Meets the standard</w:t>
+              <w:t xml:space="preserve">Adequate by coverage.</w:t>
             </w:r>
             <w:r>
-              <w:t xml:space="preserve">, with widely spread simulations</w:t>
+              <w:t xml:space="preserve"> </w:t>
+            </w:r>
+            <w:r>
+              <w:t xml:space="preserve">Diversity matched; 28 to 44 percent of runs reach the three- and four-cluster values at reordered shares of 0.2 to 0.3; medians fall short at those scales, and simulations are widely spread</w:t>
             </w:r>
           </w:p>
         </w:tc>
       </w:tr>
     </w:tbl>
-    <w:bookmarkEnd w:id="125"/>
-    <w:bookmarkStart w:id="141" w:name="where-the-phase-lines-fall"/>
+    <w:bookmarkEnd w:id="126"/>
+    <w:bookmarkStart w:id="142" w:name="where-the-phase-lines-fall"/>
     <w:p>
       <w:pPr>
         <w:pStyle w:val="Heading3"/>
@@ -2325,7 +2600,7 @@
         <w:pStyle w:val="FirstParagraph"/>
       </w:pPr>
       <w:r>
-        <w:t xml:space="preserve">If the phases were groups, their lines should be where the pottery changes. They are not.</w:t>
+        <w:t xml:space="preserve">If the phases marked restrictions on copying, their lines should separate the assemblages better than other lines and fall where composition changes fastest. They do neither.</w:t>
       </w:r>
     </w:p>
     <w:p>
@@ -2333,7 +2608,7 @@
         <w:pStyle w:val="BodyText"/>
       </w:pPr>
       <w:r>
-        <w:t xml:space="preserve">Arbitrary lines separate the pottery better than the phase lines do. With the uncertainty in every assemblage’s counts carried through, the between-phase</w:t>
+        <w:t xml:space="preserve">Most alternative divisions of the same sites separate the assemblages better than the phase lines do. With the uncertainty in every assemblage’s counts carried through, the between-phase</w:t>
       </w:r>
       <w:r>
         <w:t xml:space="preserve"> </w:t>
@@ -2359,7 +2634,7 @@
         <w:t xml:space="preserve"> </w:t>
       </w:r>
       <w:r>
-        <w:t xml:space="preserve">has a posterior median of 0.0109 (95 percent credible interval 0.0091 to 0.0128). Divisions of the same assemblages into groups of the same sizes around randomly placed centers give a median of 0.0145, and divisions drawn to be as compact as possible give 0.0165. The probability that the phase lines separate the pottery better than a division around random centers is 0.20, and better than a compact division 0.05 (Figure 3B, C). The step in similarity at the lines tells the same story. The boundary excess at the phase lines (posterior median +9.4, 95 percent credible interval +4.6 to +13.9) exceeds what copying alone produces, but arbitrary divisions of the map show the same step, with a median of +6.9 around random centers and +4.6 for compact divisions, and the probability that the phase lines show more is 0.59 and 0.61. The shorter-range variation the copying model misses is a property of the basin’s pottery wherever it is divided, not of the phase lines.</w:t>
+        <w:t xml:space="preserve">has a posterior median of 0.0109 (95 percent credible interval 0.0091 to 0.0128). Divisions of the same assemblages into groups of the same sizes around randomly placed centers give a median of 0.0145, and divisions drawn to be as compact as possible give 0.0165. The posterior probability that the phase lines separate the assemblages better than a division around random centers is 0.20, and better than a compact division 0.05 (Figure 3B, C). The step in similarity at the lines is less decisive. The boundary excess at the phase lines (posterior median +9.4, 95 percent credible interval +4.6 to +13.9) exceeds what copying alone produces, but arbitrary divisions of the map show a similar step, with a median of +6.9 around random centers and +4.6 for compact divisions, and the posterior probability that the phase lines show more is 0.59 and 0.61, close to even. The shorter-range variation the copying model misses is a property of the basin’s assemblages, however they are divided, not of the phase lines.</w:t>
       </w:r>
     </w:p>
     <w:p>
@@ -2367,7 +2642,7 @@
         <w:pStyle w:val="BodyText"/>
       </w:pPr>
       <w:r>
-        <w:t xml:space="preserve">This comparison can detect lines that mark restricted copying. In simulations with copying across the phase lines cut to 3 percent of its strength, the phase lines separate the simulated pottery better than a median 90 percent of same-size divisions around random centers and 74 percent of compact ones, against 62 and 41 percent with no restriction. The real phase lines, scored the same way, beat 30 and 4 percent (the posterior probabilities above, which carry the uncertainty in the counts, are 0.20 and 0.05). On the step in similarity the picture is less clear: the real lines beat 72 and 68 percent of the alternatives (posterior probabilities 0.59 and 0.61), above the simulations without restriction (56 and 27 percent) and within the range of those with copying restricted (76 to 90 and 58 to 78 percent). On the measure the record can use, the phase lines behave as lines with no restriction behind them.</w:t>
+        <w:t xml:space="preserve">This comparison responds to restricted copying at the lines, but it does not discriminate sharply. In records simulated at the calibrated combination with copying across the phase lines cut to 3 percent of its strength, the phase lines separate the simulated assemblages better than a median of 90 percent of same-size divisions around random centers and 74 percent of compact ones, versus 62 and 41 percent with no restriction. The real phase lines, scored the same way, beat 30 and 4 percent. The simulated distributions overlap widely (Supplemental Text, Figure S8). A score as low as the real one against random-center divisions occurs in 5 percent of records simulated without a restriction and 1 percent with the strongest (100 records per setting), and against compact divisions in 13 and 4 percent. The separation is smaller at two other diversity-matched combinations (Supplemental Text). The real score lies in the lower tail of every setting, the unrestricted one included, so it weighs moderately against a strong restriction at the calibrated combination and less at the others, cannot exclude a weak one, and leaves open that the copying model misdescribes how the assemblages vary. On the step in similarity the comparison is less informative still: the real lines beat 72 and 68 percent of the alternatives, above the median without restriction (56 and 27 percent) and within the range of those with copying restricted (76 to 90 and 58 to 78 percent).</w:t>
       </w:r>
     </w:p>
     <w:p>
@@ -2375,7 +2650,7 @@
         <w:pStyle w:val="BodyText"/>
       </w:pPr>
       <w:r>
-        <w:t xml:space="preserve">What the phase lines do follow is the map. Their within-group spread, 189.9 km² per assemblage, is the tightest three-way division of these assemblages at these group sizes that our search found. A search that minimizes spatial spread and never sees a potsherd returned the phase division exactly in 156 of 1,000 random starts and found nothing tighter in any of them. The phases are the most compact way to divide the sites into groups of those sizes.</w:t>
+        <w:t xml:space="preserve">The phase lines reflect the map’s spatial structure. Their within-group spread, 189.9 km² per assemblage, is the tightest three-way division of these assemblages at these group sizes that our search found. A search that minimizes spatial spread and is not based on type frequencies returned the phase division in exactly 156 of 1,000 random starts and found nothing tighter in any of them. The phases are the most compact way to divide the sites into spatially delineated groups of those sizes.</w:t>
       </w:r>
     </w:p>
     <w:p>
@@ -2387,18 +2662,18 @@
           <wp:inline>
             <wp:extent cx="5334000" cy="2584123"/>
             <wp:effectExtent b="0" l="0" r="0" t="0"/>
-            <wp:docPr descr="Figure 3. Scale and boundaries. (A) Observed between-cluster cultural F_{ST} against the neutral copying model as the basin is divided into two through six clusters. The observed value lies inside the model’s range at two clusters and above it from three. (B) Within-group spatial spread against cultural F_{ST} for divisions with the phases’ group sizes around randomly placed centers (light) and drawn to minimize spread (dark); the star is the phase division. Differentiation is unrelated to compactness among the random divisions (Spearman -0.02) and moderately related among the compact ones (+0.45), and no division in either set is tighter than the phases. (C) The phase division’s F_{ST} (solid line) against the compact divisions, near the bottom of their range." title="" id="127" name="Picture"/>
+            <wp:docPr descr="Figure 3. Scale and boundaries. (A) Observed between-cluster cultural F_{ST} against the neutral copying model as the basin is divided into two through six clusters. The observed value lies inside the model’s range at two clusters and above it from three. (B) Within-group spatial spread against cultural F_{ST} for divisions with the phases’ group sizes around randomly placed centers (light) and drawn to minimize spread (dark); the star is the phase division. Differentiation is unrelated to compactness among the random divisions (Spearman -0.02) and moderately related among the compact ones (+0.45), and no division in either set is tighter than the phases. (C) The phase division’s F_{ST} (solid line) against the compact divisions is near the bottom of their range." title="" id="128" name="Picture"/>
             <a:graphic>
               <a:graphicData uri="http://schemas.openxmlformats.org/drawingml/2006/picture">
                 <pic:pic>
                   <pic:nvPicPr>
-                    <pic:cNvPr descr="../../figures/fig12_phase_partition.png" id="128" name="Picture"/>
+                    <pic:cNvPr descr="../../figures/fig12_phase_partition.png" id="129" name="Picture"/>
                     <pic:cNvPicPr>
                       <a:picLocks noChangeArrowheads="1" noChangeAspect="1"/>
                     </pic:cNvPicPr>
                   </pic:nvPicPr>
                   <pic:blipFill>
-                    <a:blip r:embed="rId126"/>
+                    <a:blip r:embed="rId127"/>
                     <a:stretch>
                       <a:fillRect/>
                     </a:stretch>
@@ -2518,7 +2793,7 @@
         <w:t xml:space="preserve"> </w:t>
       </w:r>
       <w:r>
-        <w:t xml:space="preserve">(solid line) against the compact divisions, near the bottom of their range.</w:t>
+        <w:t xml:space="preserve">(solid line) against the compact divisions is near the bottom of their range.</w:t>
       </w:r>
     </w:p>
     <w:p>
@@ -2526,7 +2801,7 @@
         <w:pStyle w:val="BodyText"/>
       </w:pPr>
       <w:r>
-        <w:t xml:space="preserve">The lines also fall where composition changes slowly. Mapping the local rate at which composition changes across the basin (Figure 4A), an edge between communities should appear as a ridge of fast change. The phase lines do not follow ridges. Median change along them is 0.0105 per kilometer, against 0.0124 along lines built the same way from 200 same-size divisions around randomly placed centers, and none of those 200 runs through slower-changing country than the phase lines do (Figure 4B).</w:t>
+        <w:t xml:space="preserve">At smoothing scales near the site spacing, the reconstructed phase boundaries also run through areas where composition changes slowly. These boundaries are our reconstruction, the edges of the territories built from Mainfort’s assignments as in Figure 1, not lines drawn by the original authors. Mapping the local rate at which composition changes across the basin with a 15 km bandwidth (Figure 4A), an edge between communities should appear as a ridge of fast change. The reconstructed boundaries, however, do not follow ridges. Median change along them is 0.0105 per kilometer, against 0.0124 along boundaries built the same way from 200 same-size divisions around randomly placed centers, and none of those 200 runs through slower-changing areas (Figure 4B). The ranking holds at 10 to 15 km but not at 20 to 30 km, where the reconstructed boundaries sit at the 24th to 43rd percentiles, and on this sampling geometry it discriminates weakly: a score as low as the real one occurs in 5 percent of records simulated without a restriction and 2 percent with copying across the lines cut to 3 percent (Supplemental Text). The turnover map therefore describes where composition changes and adds little independent weight against a boundary.</w:t>
       </w:r>
     </w:p>
     <w:p>
@@ -2538,18 +2813,18 @@
           <wp:inline>
             <wp:extent cx="5334000" cy="3028550"/>
             <wp:effectExtent b="0" l="0" r="0" t="0"/>
-            <wp:docPr descr="Figure 4. Composition as a continuous surface. (A) The local rate of change in the ten decorated-class proportions, computed on a 220 by 220 grid with a 15 km Gaussian bandwidth and masked where fewer than two assemblages support the estimate. Circles are assemblages. (B) The same surface with the published phase boundaries overlaid; the rate of change along them is lower than along the boundaries of any of 200 same-size divisions around randomly placed centers. (C) Observed cultural F_{ST} against cluster radius in kilometers, with the neutral copying model’s range behind it, from coarse to fine. The observed value lies inside the range at an 18 km radius and above it from 14 km. Below a radius of about 10 km the clusters begin to isolate single assemblages, so the finest divisions should not be read as structure." title="" id="130" name="Picture"/>
+            <wp:docPr descr="Figure 4. Composition as a continuous surface. (A) The local rate of change in the ten decorated-class proportions, computed on a 220 by 220 grid with a 15 km Gaussian bandwidth and masked where fewer than two assemblages support the estimate. Circles are assemblages. (B) The same surface with the reconstructed phase boundaries overlaid, the edges of territories built from Mainfort’s assignments as in Figure 1. At this bandwidth the rate of change along them is lower than along the boundaries of any of 200 same-size divisions around randomly placed centers; the ranking holds at 10 to 15 km but not at 20 to 30 km (Supplemental Text). (C) Observed cultural F_{ST} against cluster radius in kilometers, with the neutral copying model’s range behind it, from coarse to fine. The observed value lies inside the range at an 18 km radius and above it from 14 km. Below a radius of about 10 km, the clusters begin to isolate single assemblages, so the finest divisions should not be read as structure." title="" id="131" name="Picture"/>
             <a:graphic>
               <a:graphicData uri="http://schemas.openxmlformats.org/drawingml/2006/picture">
                 <pic:pic>
                   <pic:nvPicPr>
-                    <pic:cNvPr descr="../../figures/fig13_groupness_surface.png" id="131" name="Picture"/>
+                    <pic:cNvPr descr="../../figures/fig13_groupness_surface.png" id="132" name="Picture"/>
                     <pic:cNvPicPr>
                       <a:picLocks noChangeArrowheads="1" noChangeAspect="1"/>
                     </pic:cNvPicPr>
                   </pic:nvPicPr>
                   <pic:blipFill>
-                    <a:blip r:embed="rId129"/>
+                    <a:blip r:embed="rId130"/>
                     <a:stretch>
                       <a:fillRect/>
                     </a:stretch>
@@ -2591,7 +2866,7 @@
         <w:t xml:space="preserve"> </w:t>
       </w:r>
       <w:r>
-        <w:t xml:space="preserve">Composition as a continuous surface. (A) The local rate of change in the ten decorated-class proportions, computed on a 220 by 220 grid with a 15 km Gaussian bandwidth and masked where fewer than two assemblages support the estimate. Circles are assemblages. (B) The same surface with the published phase boundaries overlaid; the rate of change along them is lower than along the boundaries of any of 200 same-size divisions around randomly placed centers. (C) Observed cultural</w:t>
+        <w:t xml:space="preserve">Composition as a continuous surface. (A) The local rate of change in the ten decorated-class proportions, computed on a 220 by 220 grid with a 15 km Gaussian bandwidth and masked where fewer than two assemblages support the estimate. Circles are assemblages. (B) The same surface with the reconstructed phase boundaries overlaid, the edges of territories built from Mainfort’s assignments as in Figure 1. At this bandwidth the rate of change along them is lower than along the boundaries of any of 200 same-size divisions around randomly placed centers; the ranking holds at 10 to 15 km but not at 20 to 30 km (Supplemental Text). (C) Observed cultural</w:t>
       </w:r>
       <w:r>
         <w:t xml:space="preserve"> </w:t>
@@ -2617,7 +2892,7 @@
         <w:t xml:space="preserve"> </w:t>
       </w:r>
       <w:r>
-        <w:t xml:space="preserve">against cluster radius in kilometers, with the neutral copying model’s range behind it, from coarse to fine. The observed value lies inside the range at an 18 km radius and above it from 14 km. Below a radius of about 10 km the clusters begin to isolate single assemblages, so the finest divisions should not be read as structure.</w:t>
+        <w:t xml:space="preserve">against cluster radius in kilometers, with the neutral copying model’s range behind it, from coarse to fine. The observed value lies inside the range at an 18 km radius and above it from 14 km. Below a radius of about 10 km, the clusters begin to isolate single assemblages, so the finest divisions should not be read as structure.</w:t>
       </w:r>
     </w:p>
     <w:p>
@@ -2625,7 +2900,7 @@
         <w:pStyle w:val="BodyText"/>
       </w:pPr>
       <w:r>
-        <w:t xml:space="preserve">The site map alone recovers the phases. Clustering the assemblages on their coordinates alone reproduces Mainfort’s assignments exactly, with an adjusted Rand index of 1.000 (Figure 5). Adding composition lowers the agreement at every weight: from a tenth of the coordinates’ weight up to equal weight it is 0.607, and composition alone reaches 0.204. Divisions with the phases’ group sizes around random centers reach 0.570, which is what three groups of these sizes produce by chance. The three assemblages placed by territory rather than by Mainfort are left out of this score, since measuring a geographic rule against geography would build in the agreement. The pottery, when it enters, moves the answer away from the published phases rather than toward them.</w:t>
+        <w:t xml:space="preserve">The site map alone can reconstruct the phases. Clustering the assemblages on their coordinates alone reproduces phase assignments exactly, with an adjusted Rand index of 1.000 (Figure 5). Adding assemblage composition as a factor actually lowers agreement at every weight, from a tenth of the coordinates’ weight up to equal weight. Divisions with the phases’ group sizes around random centers reach 0.570, which is what three groups of these sizes produce by chance alone. The three assemblages placed by territory rather than by Mainfort’s phase assignments are excluded from this score, since measuring a geographic rule against geography would be circular.</w:t>
       </w:r>
     </w:p>
     <w:p>
@@ -2637,18 +2912,18 @@
           <wp:inline>
             <wp:extent cx="3412944" cy="2730967"/>
             <wp:effectExtent b="0" l="0" r="0" t="0"/>
-            <wp:docPr descr="Figure 5. What recovers the phases. Agreement with Mainfort’s phase assignments, measured by the adjusted Rand index over the 25 assemblages he assigned, as the median over 40 starting configurations, for clusterings on site coordinates and decorated-class composition as the weight on composition varies. Zero weight is the site map alone. Three transforms of composition are shown; the text quotes the chi-square transform, the only one with no free parameter. The dash-dotted line is the agreement reached by divisions with the phases’ group sizes around random centers. Agreement is complete with the site map alone and falls as composition enters." title="" id="133" name="Picture"/>
+            <wp:docPr descr="Figure 5. What recovers the phases. Agreement with Mainfort’s phase assignments, measured by the adjusted Rand index over the 25 assemblages he assigned, as the median over 40 starting configurations, for clusterings on site coordinates and decorated-class composition as the weight on composition varies. Zero weight is the site map alone. Three composition transforms are shown; the text quotes the chi-square transform, the only one with no free parameter. The dash-dotted line is the agreement reached by divisions with the phases’ group sizes around random centers. Agreement is complete with the site map alone and falls as composition enters." title="" id="134" name="Picture"/>
             <a:graphic>
               <a:graphicData uri="http://schemas.openxmlformats.org/drawingml/2006/picture">
                 <pic:pic>
                   <pic:nvPicPr>
-                    <pic:cNvPr descr="../../figures/fig14_phase_recovery.png" id="134" name="Picture"/>
+                    <pic:cNvPr descr="../../figures/fig14_phase_recovery.png" id="135" name="Picture"/>
                     <pic:cNvPicPr>
                       <a:picLocks noChangeArrowheads="1" noChangeAspect="1"/>
                     </pic:cNvPicPr>
                   </pic:nvPicPr>
                   <pic:blipFill>
-                    <a:blip r:embed="rId132"/>
+                    <a:blip r:embed="rId133"/>
                     <a:stretch>
                       <a:fillRect/>
                     </a:stretch>
@@ -2690,7 +2965,7 @@
         <w:t xml:space="preserve"> </w:t>
       </w:r>
       <w:r>
-        <w:t xml:space="preserve">What recovers the phases. Agreement with Mainfort’s phase assignments, measured by the adjusted Rand index over the 25 assemblages he assigned, as the median over 40 starting configurations, for clusterings on site coordinates and decorated-class composition as the weight on composition varies. Zero weight is the site map alone. Three transforms of composition are shown; the text quotes the chi-square transform, the only one with no free parameter. The dash-dotted line is the agreement reached by divisions with the phases’ group sizes around random centers. Agreement is complete with the site map alone and falls as composition enters.</w:t>
+        <w:t xml:space="preserve">What recovers the phases. Agreement with Mainfort’s phase assignments, measured by the adjusted Rand index over the 25 assemblages he assigned, as the median over 40 starting configurations, for clusterings on site coordinates and decorated-class composition as the weight on composition varies. Zero weight is the site map alone. Three composition transforms are shown; the text quotes the chi-square transform, the only one with no free parameter. The dash-dotted line is the agreement reached by divisions with the phases’ group sizes around random centers. Agreement is complete with the site map alone and falls as composition enters.</w:t>
       </w:r>
     </w:p>
     <w:p>
@@ -2698,7 +2973,7 @@
         <w:pStyle w:val="BodyText"/>
       </w:pPr>
       <w:r>
-        <w:t xml:space="preserve">Pottery made by copying with no groups sorts into the phases as readily as the real pottery. We ran the copying model on the real site map 300 times, sampled its pottery at the real sherd counts, and clustered each simulated record the same way as the real one (Figure 6). Wherever site location enters the clustering, the simulated pottery matches the phases at least as well as the real pottery does, and usually better: with a quarter weight on composition every simulated record agrees with the phases at least as well as the real one (simulated median 1.000, real 0.607), and at equal weight 74 percent do (median 0.765). With pottery alone, where location cannot help, the real record’s agreement of 0.204 sits at the simulated median of 0.176, and 46 percent of simulated records reach it. A culture historian sorting such pottery by resemblance and proximity would have found the same phases.</w:t>
+        <w:t xml:space="preserve">Simulated assemblages made by copying with no groups sort into the phases as readily as the real assemblages. We ran the copying model on the real site map 300 times, sampled its type frequencies using the assemblage sherd counts, and clustered each simulated record the same way as the real one (Figure 6). The spatial patterns produced by simulated assemblages match the phases at least as well as the real assemblages do, and usually better. With a quarter weight on assemblage composition, our simulated record agrees with the phases at least as well as the real one (simulated median 1.000, real 0.607), and at equal weight, 74 percent do (median 0.765). Based on type frequencies alone, without considering assemblage location, the real record’s agreement of 0.204 sits at the simulated median of 0.176, and 46 percent of simulated records produce the spatial patterns. A culture historian sorting such ceramic assemblages by resemblance and proximity would almost certainly have found the same phases.</w:t>
       </w:r>
     </w:p>
     <w:p>
@@ -2710,18 +2985,18 @@
           <wp:inline>
             <wp:extent cx="3272267" cy="2715676"/>
             <wp:effectExtent b="0" l="0" r="0" t="0"/>
-            <wp:docPr descr="Figure 6. Would a culture historian have found these phases in pottery made by copying with no groups? Agreement with Mainfort’s phase assignments, by adjusted Rand index over the 25 assemblages he assigned, as the weight on decorated-class composition relative to site coordinates varies from the map alone to pottery alone. The line with markers is the real record; the band is the 95 percent range over 300 runs of the neutral copying model, which contains no groups, sampled at the real sherd counts and clustered the same way. The zero-weight point is identical by construction." title="" id="136" name="Picture"/>
+            <wp:docPr descr="Figure 6. Would a culture historian have found these phases in ceramic assemblages made by copying with no groups? Agreement with Mainfort’s phase assignments, by adjusted Rand index over the 25 assemblages he assigned, as the weight on decorated-class composition relative to site coordinates varies from the map alone to assemblage type frequencies alone. The line with markers is the real record; the band is the 95 percent range over 300 runs of the neutral copying model, which contains no groups, sampled at the real sherd counts and clustered the same way. The zero-weight point is identical by construction." title="" id="137" name="Picture"/>
             <a:graphic>
               <a:graphicData uri="http://schemas.openxmlformats.org/drawingml/2006/picture">
                 <pic:pic>
                   <pic:nvPicPr>
-                    <pic:cNvPr descr="../../figures/fig15_phases_under_drift.png" id="137" name="Picture"/>
+                    <pic:cNvPr descr="../../figures/fig15_phases_under_drift.png" id="138" name="Picture"/>
                     <pic:cNvPicPr>
                       <a:picLocks noChangeArrowheads="1" noChangeAspect="1"/>
                     </pic:cNvPicPr>
                   </pic:nvPicPr>
                   <pic:blipFill>
-                    <a:blip r:embed="rId135"/>
+                    <a:blip r:embed="rId136"/>
                     <a:stretch>
                       <a:fillRect/>
                     </a:stretch>
@@ -2763,7 +3038,7 @@
         <w:t xml:space="preserve"> </w:t>
       </w:r>
       <w:r>
-        <w:t xml:space="preserve">Would a culture historian have found these phases in pottery made by copying with no groups? Agreement with Mainfort’s phase assignments, by adjusted Rand index over the 25 assemblages he assigned, as the weight on decorated-class composition relative to site coordinates varies from the map alone to pottery alone. The line with markers is the real record; the band is the 95 percent range over 300 runs of the neutral copying model, which contains no groups, sampled at the real sherd counts and clustered the same way. The zero-weight point is identical by construction.</w:t>
+        <w:t xml:space="preserve">Would a culture historian have found these phases in ceramic assemblages made by copying with no groups? Agreement with Mainfort’s phase assignments, by adjusted Rand index over the 25 assemblages he assigned, as the weight on decorated-class composition relative to site coordinates varies from the map alone to assemblage type frequencies alone. The line with markers is the real record; the band is the 95 percent range over 300 runs of the neutral copying model, which contains no groups, sampled at the real sherd counts and clustered the same way. The zero-weight point is identical by construction.</w:t>
       </w:r>
     </w:p>
     <w:p>
@@ -2771,7 +3046,7 @@
         <w:pStyle w:val="BodyText"/>
       </w:pPr>
       <w:r>
-        <w:t xml:space="preserve">The lines fall between clumps of analyzed assemblages, but not through empty country. The settlement compilation records 83 sites with a late pre-contact component in the mapped area, and dropping the 28 within a kilometer of an analyzed assemblage leaves 55 whose positions are independent of the pottery. Measured at a 5 km scale, only 37 percent of same-size divisions around random centers and 14 percent of compact ones run through denser late-period settlement than the phase lines do (Figure 7); of the three scales tested (3, 5, and 8 km), only at 8 km do the phase lines run through emptier country than most. The clumps the phases gather are clumps of sampled sites, not settlements separated by vacant land. What makes settlement clumped is partly the rivers. Late-period sites lie a median 1.8 km from a major river, against 3.6 km for random points in the same area, but points placed as close to the rivers as the sites are come out randomly spaced (Clark-Evans ratio 0.99 against the sites’ 0.63), so the clumps form on particular reaches of river for reasons proximity alone does not supply.</w:t>
+        <w:t xml:space="preserve">The lines between clumps of analyzed assemblages are not separated by areas of empty land. The settlement compilation records 83 sites with a late pre-contact component in the mapped area, and dropping the 28 within a kilometer of an analyzed assemblage leaves 55 whose positions are independent of the original locations. Measured at a 5 km scale, only 37 percent of same-size divisions around random centers and 14 percent of compact ones run through denser late-period settlement than the phase lines do (Figure 7). Of the three scales tested (3, 5, and 8 km), only at 8 km do the phase lines run through emptier country than most. The clumps the phases gather are clumps of sampled sites, not settlements separated by vacant land. Rivers partly explain settlement clumping. Late-period sites lie a median 1.8 km from a major river, against 3.6 km for random points in the same area, but points placed as close to the rivers as the sites are come out randomly spaced (Clark-Evans ratio 0.99 against the sites’ 0.63). Assemblage clumps form on particular reaches of riverways for reasons proximity alone does not explain.</w:t>
       </w:r>
     </w:p>
     <w:p>
@@ -2783,18 +3058,18 @@
           <wp:inline>
             <wp:extent cx="5238686" cy="3223336"/>
             <wp:effectExtent b="0" l="0" r="0" t="0"/>
-            <wp:docPr descr="Figure 7. Do the phase boundaries follow gaps in settlement? (A) Density of the 55 late-period sites more than 1 km from any analyzed assemblage (5 km bandwidth), with the assemblages as open circles and the phase boundaries as points. (B) Median settlement density along the phase boundaries (vertical line) against the same quantity for the boundaries of 300 divisions with the phases’ group sizes, around random centers (light) and drawn to be compact (dark)." title="" id="139" name="Picture"/>
+            <wp:docPr descr="Figure 7. Do the reconstructed phase boundaries follow gaps in settlement? (A) Density of the 55 late-period sites more than 1 km from any analyzed assemblage (5 km bandwidth), with the assemblages as open circles and the reconstructed phase boundaries (territory edges built as in Figure 1) as points. (B) Median settlement density along the reconstructed phase boundaries (vertical line) against the same quantity for the boundaries of 300 divisions with the phases’ group sizes, around random centers (light) and drawn to be compact (dark)." title="" id="140" name="Picture"/>
             <a:graphic>
               <a:graphicData uri="http://schemas.openxmlformats.org/drawingml/2006/picture">
                 <pic:pic>
                   <pic:nvPicPr>
-                    <pic:cNvPr descr="../../figures/fig16_settlement_gaps.png" id="140" name="Picture"/>
+                    <pic:cNvPr descr="../../figures/fig16_settlement_gaps.png" id="141" name="Picture"/>
                     <pic:cNvPicPr>
                       <a:picLocks noChangeArrowheads="1" noChangeAspect="1"/>
                     </pic:cNvPicPr>
                   </pic:nvPicPr>
                   <pic:blipFill>
-                    <a:blip r:embed="rId138"/>
+                    <a:blip r:embed="rId139"/>
                     <a:stretch>
                       <a:fillRect/>
                     </a:stretch>
@@ -2836,11 +3111,11 @@
         <w:t xml:space="preserve"> </w:t>
       </w:r>
       <w:r>
-        <w:t xml:space="preserve">Do the phase boundaries follow gaps in settlement? (A) Density of the 55 late-period sites more than 1 km from any analyzed assemblage (5 km bandwidth), with the assemblages as open circles and the phase boundaries as points. (B) Median settlement density along the phase boundaries (vertical line) against the same quantity for the boundaries of 300 divisions with the phases’ group sizes, around random centers (light) and drawn to be compact (dark).</w:t>
-      </w:r>
-    </w:p>
-    <w:bookmarkEnd w:id="141"/>
-    <w:bookmarkStart w:id="148" w:name="does-the-parkin-phase-stand-apart"/>
+        <w:t xml:space="preserve">Do the reconstructed phase boundaries follow gaps in settlement? (A) Density of the 55 late-period sites more than 1 km from any analyzed assemblage (5 km bandwidth), with the assemblages as open circles and the reconstructed phase boundaries (territory edges built as in Figure 1) as points. (B) Median settlement density along the reconstructed phase boundaries (vertical line) against the same quantity for the boundaries of 300 divisions with the phases’ group sizes, around random centers (light) and drawn to be compact (dark).</w:t>
+      </w:r>
+    </w:p>
+    <w:bookmarkEnd w:id="142"/>
+    <w:bookmarkStart w:id="149" w:name="does-the-parkin-phase-stand-apart"/>
     <w:p>
       <w:pPr>
         <w:pStyle w:val="Heading3"/>
@@ -2911,7 +3186,7 @@
         <w:pStyle w:val="BodyText"/>
       </w:pPr>
       <w:r>
-        <w:t xml:space="preserve">Arbitrary lines separate the pottery as well. With the uncertainty in the counts carried through, the Parkin-versus-rest</w:t>
+        <w:t xml:space="preserve">Alternative divisions separate the assemblages as well. With the uncertainty in the counts carried through, the Parkin-versus-rest</w:t>
       </w:r>
       <w:r>
         <w:t xml:space="preserve"> </w:t>
@@ -2937,7 +3212,7 @@
         <w:t xml:space="preserve"> </w:t>
       </w:r>
       <w:r>
-        <w:t xml:space="preserve">has a posterior median of 0.0061 (95 percent credible interval 0.0051 to 0.0074), against 0.0064 for same-size divisions around random centers and 0.0076 for compact ones. The probability that the Parkin line separates the pottery better is 0.27 and 0.00. The step in similarity across the Parkin line, a boundary excess of +13.7, exceeds what copying alone produces (simulated median +0.5, 95 percent range -6.5 to +7.5; no run reaches it), but it is the same shorter-range variation seen at arbitrary lines drawn across this map. Around random centers the median is +10.7 and the probability that the Parkin line shows more is 0.53; for compact divisions the median is +15.1 and the probability 0.05. The pottery sets the Parkin phase apart from its neighbors no more than it sets apart any comparably sized piece of the basin. This comparison has little power for a single line, however. In simulations with copying across the Parkin phase’s edge cut to 3 percent, the Parkin line beats a median 72 percent of random-center divisions, against 64 percent with no restriction. The record therefore cannot exclude restricted copying at the edge of the Parkin phase; it shows nothing that requires it.</w:t>
+        <w:t xml:space="preserve">has a posterior median of 0.0061 (95 percent credible interval 0.0051 to 0.0074), against 0.0064 for same-size divisions around random centers and 0.0076 for compact ones. The posterior probability that the Parkin line separates the assemblages better is 0.27 against divisions around random centers and 0.00025 against compact ones, the second from 10 favorable comparisons among 40,000. The step in similarity across the Parkin line, a boundary excess of +13.7, exceeds what copying alone produces (simulated median +0.5, 95 percent range -6.5 to +7.5; none of 300 runs reaches it), but it is the same shorter-range variation seen at arbitrary lines drawn across this map. Around random centers, the median is +10.7 and the posterior probability that the Parkin line shows more is 0.53; for compact divisions, the median is +15.1, and the probability is 0.05. The assemblage composition sets the Parkin phase apart from its neighbors no more than it sets apart any comparably sized piece of the basin. This comparison has little power for a single line, however. In simulations with copying across the Parkin phase’s edge cut to 3 percent, the Parkin line beats a median 72 percent of random-center divisions, against 64 percent with no restriction, and a score as low as the real one (28 percent) occurs in 10 and 16 percent of simulated records. The record therefore cannot exclude restricted copying at the edge of the Parkin phase. However, the assemblage composition shows nothing that requires it.</w:t>
       </w:r>
     </w:p>
     <w:p>
@@ -2945,7 +3220,7 @@
         <w:pStyle w:val="BodyText"/>
       </w:pPr>
       <w:r>
-        <w:t xml:space="preserve">Nor is Parkin the center of the pattern. Deterministic seriation of the basin assemblages returns 34 maximal co-seriable groups at a continuity threshold of 0.1, none larger than four assemblages, and 18 of the 28 assemblages belong to more than one (Figure 8). Groups that had actually closed would give orderings that are incompatible and separate, whereas here most assemblages belong to several at once, which is what a continuous field too varied to fit one ordering produces. Parkin belongs to three groups, a bridge between orderings but not the most connected one: Barton Ranch, Rose Mound, and Williamson each belong to six. Lipo, Madsen, and Dunnell</w:t>
+        <w:t xml:space="preserve">Two further descriptions of the basin place Parkin in context, although neither is a test. Deterministic seriation of the basin assemblages returns 34 maximal co-seriable groups at a continuity threshold of 0.1, none larger than four assemblages, and 18 of the 28 assemblages belong to more than one (Figure 8). Overlapping orderings of this kind are what a continuous field too varied to fit one ordering would produce, but the recovery experiment showed that seriation structure cannot detect imposed groups at this resolution, and we have not validated the overlap statistic separately, so the overlap is consistent with the absence of closure rather than evidence against it. Parkin belongs to three groups, a bridge between orderings but not the most connected one: Barton Ranch, Rose Mound, and Williamson each belong to six. Lipo, Madsen, and Dunnell</w:t>
       </w:r>
       <w:r>
         <w:t xml:space="preserve"> </w:t>
@@ -2957,7 +3232,7 @@
         <w:t xml:space="preserve"> </w:t>
       </w:r>
       <w:r>
-        <w:t xml:space="preserve">found the same position and read it as a possible sign of emerging hierarchy, but a bridge between orderings is not the center of one.</w:t>
+        <w:t xml:space="preserve">found the same position and read it as a possible sign of emerging hierarchy.</w:t>
       </w:r>
     </w:p>
     <w:p>
@@ -2969,18 +3244,18 @@
           <wp:inline>
             <wp:extent cx="5334000" cy="3603744"/>
             <wp:effectExtent b="0" l="0" r="0" t="0"/>
-            <wp:docPr descr="Figure 8. Deterministic seriation structure of the basin assemblages. Left: the distribution of co-seriable group sizes, a fragmented structure of 34 maximal groups with a maximum size of four. Right: the most connected assemblages ranked by the number of groups they belong to, with Parkin highlighted as a bridge (member of three groups) between orderings rather than at the center of one." title="" id="143" name="Picture"/>
+            <wp:docPr descr="Figure 8. Deterministic seriation structure of the basin assemblages. Left: the distribution of co-seriable group sizes, a fragmented structure of 34 maximal groups with a maximum size of four. Right: the most connected assemblages ranked by the number of groups they belong to, with Parkin highlighted as a bridge (member of three groups) between orderings rather than at the center of one. The overlap statistic is descriptive; it has not been validated as a detector of closure (Supplemental Text)." title="" id="144" name="Picture"/>
             <a:graphic>
               <a:graphicData uri="http://schemas.openxmlformats.org/drawingml/2006/picture">
                 <pic:pic>
                   <pic:nvPicPr>
-                    <pic:cNvPr descr="../../figures/fig7_idss_structure.png" id="144" name="Picture"/>
+                    <pic:cNvPr descr="../../figures/fig7_idss_structure.png" id="145" name="Picture"/>
                     <pic:cNvPicPr>
                       <a:picLocks noChangeArrowheads="1" noChangeAspect="1"/>
                     </pic:cNvPicPr>
                   </pic:nvPicPr>
                   <pic:blipFill>
-                    <a:blip r:embed="rId142"/>
+                    <a:blip r:embed="rId143"/>
                     <a:stretch>
                       <a:fillRect/>
                     </a:stretch>
@@ -3022,7 +3297,7 @@
         <w:t xml:space="preserve"> </w:t>
       </w:r>
       <w:r>
-        <w:t xml:space="preserve">Deterministic seriation structure of the basin assemblages. Left: the distribution of co-seriable group sizes, a fragmented structure of 34 maximal groups with a maximum size of four. Right: the most connected assemblages ranked by the number of groups they belong to, with Parkin highlighted as a bridge (member of three groups) between orderings rather than at the center of one.</w:t>
+        <w:t xml:space="preserve">Deterministic seriation structure of the basin assemblages. Left: the distribution of co-seriable group sizes, a fragmented structure of 34 maximal groups with a maximum size of four. Right: the most connected assemblages ranked by the number of groups they belong to, with Parkin highlighted as a bridge (member of three groups) between orderings rather than at the center of one. The overlap statistic is descriptive; it has not been validated as a detector of closure (Supplemental Text).</w:t>
       </w:r>
     </w:p>
     <w:p>
@@ -3030,7 +3305,7 @@
         <w:pStyle w:val="BodyText"/>
       </w:pPr>
       <w:r>
-        <w:t xml:space="preserve">The settlement record points the same way. Parkin’s principal mound is a flat-topped platform 6.5 m (21.3 ft) high on the western edge of the site, overlooking the St. Francis River, with six smaller mounds near it; the site covers 17 acres (6.9 ha), is ditched on three sides, and its deposits rise 3 m above the floodplain</w:t>
+        <w:t xml:space="preserve">The settlement record is the second description. Parkin’s principal mound is a flat-topped platform 6.5 m (21.3 ft) high on the western edge of the site, overlooking the St. Francis River, with six smaller mounds near it; the site covers 17 acres (6.9 ha), is ditched on three sides, and its deposits rise 3 m above the floodplain</w:t>
       </w:r>
       <w:r>
         <w:t xml:space="preserve"> </w:t>
@@ -3039,7 +3314,7 @@
         <w:t xml:space="preserve">(Morse 1981, 1990)</w:t>
       </w:r>
       <w:r>
-        <w:t xml:space="preserve">. Its mound is the second tallest of the 55 basin sites with a recorded height, behind one at 23 ft, and the tallest exceeds the second by a ratio of only 1.08 (Figure 9). Parkin’s height comes from excavation reports, whereas the others come from a regional compilation without per-site sources. Mound heights form a graded series with a prominent center, not a separate administrative tier. The chert-hoe economy agrees: Mill Creek hoes were made by autonomous workshops at the source and moved largely down the line, with elites at consuming centers gaining at most privileged access</w:t>
+        <w:t xml:space="preserve">. Its mound is the second tallest of the 55 basin sites with a recorded height, behind one at 23 ft, and the tallest exceeds the second by a ratio of only 1.08 (Figure 9). Parkin’s height comes from excavation reports, whereas the others come from a regional compilation without per-site sources, so the series mixes measurement sources. Mound heights form a graded series with no gap at the top. Maximum mound height is a limited proxy for political rank: it records the final size of one construction, not the organization that built it, and a graded series is compatible with more than one form of ranking, so it describes the settlement record without testing for an administrative tier. Regional evidence on the chert-hoe economy is similar in kind: autonomous workshops made Mill Creek hoes at the source and moved them largely down the line, with elites at consuming centers gaining at most privileged access</w:t>
       </w:r>
       <w:r>
         <w:t xml:space="preserve"> </w:t>
@@ -3048,7 +3323,7 @@
         <w:t xml:space="preserve">(Cobb 2000:75, 154, 198)</w:t>
       </w:r>
       <w:r>
-        <w:t xml:space="preserve">, although that evidence is regional rather than specific to the basin.</w:t>
+        <w:t xml:space="preserve">. That evidence is not specific to the basin and cannot test Parkin’s position locally.</w:t>
       </w:r>
     </w:p>
     <w:p>
@@ -3060,18 +3335,18 @@
           <wp:inline>
             <wp:extent cx="5334000" cy="3332419"/>
             <wp:effectExtent b="0" l="0" r="0" t="0"/>
-            <wp:docPr descr="Figure 9. Settlement cross-check. Main panel: maximum mound height ranked across the basin, the one attribute recorded the same way for every site (mound area is recorded as zero for Parkin and is not used). Parkin’s principal mound is 21.3 ft (6.5 m) after Morse (1981, 1990), second among the 55 basin sites with a recorded height; the compilation otherwise used gives Parkin 23 ft, and we substitute the excavated value. The distribution is graded, with no gap at the top (tallest-to-second ratio 1.08). Inset: the proportion of sites with a mound, a defensive ditch, and St. Francis-type fortification across the basin set (n = 92)." title="" id="146" name="Picture"/>
+            <wp:docPr descr="Figure 9. Settlement cross-check. Main panel: maximum mound height ranked across the basin, the one size attribute the regional compilation records for most sites, from sources that are not uniform (mound area is recorded as zero for Parkin and is not used). Parkin’s principal mound is 21.3 ft (6.5 m) after Morse (1981, 1990), second among the 55 basin sites with a recorded height; the compilation otherwise used gives Parkin 23 ft, and we substitute the excavated value. The distribution is graded, with no gap at the top (tallest-to-second ratio 1.08). Inset: the proportion of sites with a mound, a defensive ditch, and St. Francis-type fortification across the basin set (n = 92)." title="" id="147" name="Picture"/>
             <a:graphic>
               <a:graphicData uri="http://schemas.openxmlformats.org/drawingml/2006/picture">
                 <pic:pic>
                   <pic:nvPicPr>
-                    <pic:cNvPr descr="../../figures/fig8_ranksize.png" id="147" name="Picture"/>
+                    <pic:cNvPr descr="../../figures/fig8_ranksize.png" id="148" name="Picture"/>
                     <pic:cNvPicPr>
                       <a:picLocks noChangeArrowheads="1" noChangeAspect="1"/>
                     </pic:cNvPicPr>
                   </pic:nvPicPr>
                   <pic:blipFill>
-                    <a:blip r:embed="rId145"/>
+                    <a:blip r:embed="rId146"/>
                     <a:stretch>
                       <a:fillRect/>
                     </a:stretch>
@@ -3113,17 +3388,17 @@
         <w:t xml:space="preserve"> </w:t>
       </w:r>
       <w:r>
-        <w:t xml:space="preserve">Settlement cross-check. Main panel: maximum mound height ranked across the basin, the one attribute recorded the same way for every site (mound area is recorded as zero for Parkin and is not used). Parkin’s principal mound is 21.3 ft (6.5 m) after Morse (1981, 1990), second among the 55 basin sites with a recorded height; the compilation otherwise used gives Parkin 23 ft, and we substitute the excavated value. The distribution is graded, with no gap at the top (tallest-to-second ratio 1.08). Inset: the proportion of sites with a mound, a defensive ditch, and St. Francis-type fortification across the basin set (n = 92).</w:t>
-      </w:r>
-    </w:p>
-    <w:bookmarkEnd w:id="148"/>
-    <w:bookmarkStart w:id="152" w:name="Xb4a0a395e221470d8befd6776e147cfdc236abc"/>
+        <w:t xml:space="preserve">Settlement cross-check. Main panel: maximum mound height ranked across the basin, the one size attribute the regional compilation records for most sites, from sources that are not uniform (mound area is recorded as zero for Parkin and is not used). Parkin’s principal mound is 21.3 ft (6.5 m) after Morse (1981, 1990), second among the 55 basin sites with a recorded height; the compilation otherwise used gives Parkin 23 ft, and we substitute the excavated value. The distribution is graded, with no gap at the top (tallest-to-second ratio 1.08). Inset: the proportion of sites with a mound, a defensive ditch, and St. Francis-type fortification across the basin set (n = 92).</w:t>
+      </w:r>
+    </w:p>
+    <w:bookmarkEnd w:id="149"/>
+    <w:bookmarkStart w:id="153" w:name="Xce48efa02f9f01a7c86a1a47c6ec564e4606c3d"/>
     <w:p>
       <w:pPr>
         <w:pStyle w:val="Heading3"/>
       </w:pPr>
       <w:r>
-        <w:t xml:space="preserve">A second phase scheme drawn from the pottery</w:t>
+        <w:t xml:space="preserve">The contrast case: phases redrawn from the assemblages</w:t>
       </w:r>
     </w:p>
     <w:p>
@@ -3143,7 +3418,7 @@
         <w:t xml:space="preserve"> </w:t>
       </w:r>
       <w:r>
-        <w:t xml:space="preserve">redrew the phase lines through much the same sites after ordinating their pottery. He adopted Smith’s</w:t>
+        <w:t xml:space="preserve">redrew the phase lines through much the same sites using an ordination approach. He adopted Smith’s</w:t>
       </w:r>
       <w:r>
         <w:t xml:space="preserve"> </w:t>
@@ -3173,7 +3448,7 @@
         <w:t xml:space="preserve">(Mainfort 2003:176–181)</w:t>
       </w:r>
       <w:r>
-        <w:t xml:space="preserve">. A scheme drawn from the pottery is a useful check. If phases were groups, both schemes should track the same boundaries. If they are what a gradient looks like when sites are sorted, a scheme drawn by proximity and one drawn from the pottery should behave differently.</w:t>
+        <w:t xml:space="preserve">. His scheme is our contrast case.</w:t>
       </w:r>
     </w:p>
     <w:p>
@@ -3181,7 +3456,7 @@
         <w:pStyle w:val="BodyText"/>
       </w:pPr>
       <w:r>
-        <w:t xml:space="preserve">We ran the phase-line tests on Mainfort’s own counts, using decorated types only and his assignments, with a minimum of 100 decorated sherds. That leaves 29 sites and 13,296 decorated sherds in five phases: Kent with 9 sites, Parkin with 7, Walls with 6, Horseshoe Lake with 4, and Jones Bayou with 3 (Figure 10). His table shares collections with ours at 21 sites, so this is a second tally of largely the same material rather than an independent record, and we do not repeat the copying model, which is tuned to our own matrix.</w:t>
+        <w:t xml:space="preserve">We ran the phase-line tests on Mainfort’s own counts, using decorated types only and his assignments, with a minimum of 100 decorated sherds. The resulting 29 sites fall in five phases: Kent with 9 sites, Parkin with 7, Walls with 6, Horseshoe Lake with 4, and Jones Bayou with 3 (Figure 10). His table shares collections with ours at 21 sites, so this is a second tally of largely the same material rather than an independent record.</w:t>
       </w:r>
     </w:p>
     <w:p>
@@ -3189,7 +3464,7 @@
         <w:pStyle w:val="BodyText"/>
       </w:pPr>
       <w:r>
-        <w:t xml:space="preserve">Location again carries much of the scheme. The site map alone recovers Mainfort’s assignments with an adjusted Rand index of 0.54, the pottery alone 0.25, and same-size divisions around random centers 0.31. His lines, however, separate the pottery better than the earlier scheme’s do. The between-group</w:t>
+        <w:t xml:space="preserve">Location again carries much of the scheme. The site map alone produces the phases as indicated by Mainfort’s assignments, with an adjusted Rand index of 0.54; assemblage-type frequencies alone, 0.25; and same-size divisions around random centers, 0.31. Mainfort’s phase delineation, however, separates the assemblages better than the earlier scheme. The between-group</w:t>
       </w:r>
       <w:r>
         <w:t xml:space="preserve"> </w:t>
@@ -3215,7 +3490,7 @@
         <w:t xml:space="preserve"> </w:t>
       </w:r>
       <w:r>
-        <w:t xml:space="preserve">under his phases has a posterior median of 0.046 (95 percent credible interval 0.041 to 0.051), against 0.030 for same-size divisions around random centers and 0.032 for compact ones, and the posterior probability that his lines separate the pottery better than such a division is 0.96 and 0.94. The compactness search never returns his division, and giving composition half the weight of the coordinates raises the agreement with his scheme to 0.66, above the map alone. At six of the seven sites the two schemes assign differently, the pottery sides with Mainfort’s assignment, usually by a wide margin; Young is the exception (Supplemental Text). His scheme also shows that the comparison with arbitrary lines picks out lines that follow the pottery when there are any.</w:t>
+        <w:t xml:space="preserve">under his phases has a posterior median of 0.046 (95 percent credible interval 0.041 to 0.051), against 0.030 for same-size divisions around random centers and 0.032 for compact ones, and the posterior probability that his delineations separate the assemblages better than such a division is 0.96 and 0.94. The compactness search never produces his groups, and giving composition half the weight of the coordinates raises the agreement with his scheme to 0.66, above the map alone. At six of the seven sites the two schemes assign differently, the assemblage data align better with Mainfort’s assignment, usually by a wide margin. The Young site, however, is the exception (Supplemental Text).</w:t>
       </w:r>
     </w:p>
     <w:p>
@@ -3223,7 +3498,7 @@
         <w:pStyle w:val="BodyText"/>
       </w:pPr>
       <w:r>
-        <w:t xml:space="preserve">That is what the two schemes’ origins predict. Phillips drew phases by inspection and proximity, and his lines divide the map. Mainfort redrew them after ordering the pottery, and a scheme drawn from the pottery will sit where the pottery differs. The comparison does not show that Mainfort’s phases are bounded groups: location still recovers much of them, and we have not tested his scheme against the copying model. It shows that phase lines can be made to follow the pottery if the pottery draws them, and that the inherited scheme was not drawn that way.</w:t>
+        <w:t xml:space="preserve">The two schemes behave as their origins predict. The inherited lines divide the map, whereas Mainfort’s lines fall where the assemblages differ. The two schemes also disagree about where the boundaries are, which is not what bounded groups would produce. The contrast neither shows that Mainfort’s phases are bounded groups nor independently validates the comparison, since location still recovers much of his scheme and his lines separate the assemblages in part because the assemblages drew them. What the contrast shows is that phase lines follow the pottery when the pottery draws them, and that the inherited scheme was not drawn that way.</w:t>
       </w:r>
     </w:p>
     <w:p>
@@ -3235,18 +3510,18 @@
           <wp:inline>
             <wp:extent cx="5334000" cy="2684917"/>
             <wp:effectExtent b="0" l="0" r="0" t="0"/>
-            <wp:docPr descr="Figure 10. The phase tests on Mainfort’s (2003) table, under his own phases. (A) Agreement with his assignments, by adjusted Rand index over the 29 sites with at least 100 decorated sherds, for clusterings on site coordinates and decorated-class composition as the weight on composition varies from the map alone to pottery alone; the band is the range over 40 starting configurations, and the dash-dotted line is the agreement reached by same-size divisions around random centers. (B) For the sites the two schemes assign differently, the chi-square distance from the site’s profile to the pooled profile of the phase Mainfort assigned (dark) and of the phase in Figure 1 (light), with the site itself left out of both." title="" id="150" name="Picture"/>
+            <wp:docPr descr="Figure 10. The contrast case: the phase tests on Mainfort’s (2003) table, under his phases. (A) Agreement with his assignments, by adjusted Rand index over the 29 sites with at least 100 decorated sherds, for clusterings on site coordinates and decorated-class composition as the weight on composition varies from the map alone to assemblage composition alone; the band is the range over 40 starting configurations, and the dash-dotted line is the agreement reached by same-size divisions around random centers. (B) For the sites the two schemes assign differently, the chi-square distance from the site’s profile to the pooled profile of the phase Mainfort assigned (dark) and of the phase in Figure 1 (light), with the site itself left out of both." title="" id="151" name="Picture"/>
             <a:graphic>
               <a:graphicData uri="http://schemas.openxmlformats.org/drawingml/2006/picture">
                 <pic:pic>
                   <pic:nvPicPr>
-                    <pic:cNvPr descr="../../figures/fig17_mainfort_replication.png" id="151" name="Picture"/>
+                    <pic:cNvPr descr="../../figures/fig17_mainfort_replication.png" id="152" name="Picture"/>
                     <pic:cNvPicPr>
                       <a:picLocks noChangeArrowheads="1" noChangeAspect="1"/>
                     </pic:cNvPicPr>
                   </pic:nvPicPr>
                   <pic:blipFill>
-                    <a:blip r:embed="rId149"/>
+                    <a:blip r:embed="rId150"/>
                     <a:stretch>
                       <a:fillRect/>
                     </a:stretch>
@@ -3288,12 +3563,12 @@
         <w:t xml:space="preserve"> </w:t>
       </w:r>
       <w:r>
-        <w:t xml:space="preserve">The phase tests on Mainfort’s (2003) table, under his own phases. (A) Agreement with his assignments, by adjusted Rand index over the 29 sites with at least 100 decorated sherds, for clusterings on site coordinates and decorated-class composition as the weight on composition varies from the map alone to pottery alone; the band is the range over 40 starting configurations, and the dash-dotted line is the agreement reached by same-size divisions around random centers. (B) For the sites the two schemes assign differently, the chi-square distance from the site’s profile to the pooled profile of the phase Mainfort assigned (dark) and of the phase in Figure 1 (light), with the site itself left out of both.</w:t>
-      </w:r>
-    </w:p>
-    <w:bookmarkEnd w:id="152"/>
+        <w:t xml:space="preserve">The contrast case: the phase tests on Mainfort’s (2003) table, under his phases. (A) Agreement with his assignments, by adjusted Rand index over the 29 sites with at least 100 decorated sherds, for clusterings on site coordinates and decorated-class composition as the weight on composition varies from the map alone to assemblage composition alone; the band is the range over 40 starting configurations, and the dash-dotted line is the agreement reached by same-size divisions around random centers. (B) For the sites the two schemes assign differently, the chi-square distance from the site’s profile to the pooled profile of the phase Mainfort assigned (dark) and of the phase in Figure 1 (light), with the site itself left out of both.</w:t>
+      </w:r>
+    </w:p>
     <w:bookmarkEnd w:id="153"/>
-    <w:bookmarkStart w:id="158" w:name="discussion"/>
+    <w:bookmarkEnd w:id="154"/>
+    <w:bookmarkStart w:id="159" w:name="discussion"/>
     <w:p>
       <w:pPr>
         <w:pStyle w:val="Heading2"/>
@@ -3302,7 +3577,7 @@
         <w:t xml:space="preserve">Discussion</w:t>
       </w:r>
     </w:p>
-    <w:bookmarkStart w:id="154" w:name="what-explains-the-phases"/>
+    <w:bookmarkStart w:id="155" w:name="what-explains-the-phases"/>
     <w:p>
       <w:pPr>
         <w:pStyle w:val="Heading3"/>
@@ -3316,7 +3591,7 @@
         <w:pStyle w:val="FirstParagraph"/>
       </w:pPr>
       <w:r>
-        <w:t xml:space="preserve">The phases are what copying across distance looks like when it is sampled at clumped settlements and sorted by resemblance and proximity. Nearby potters copied one another more than distant ones, so decorated-class composition changes gradually across the basin, and a model with no groups assigns nearly all of the variation among assemblages to location. Settlement was clumped on particular reaches of the rivers. Sorting the assemblages in good faith by resemblance and proximity gathers each clump together and draws the lines between them. The tests bear this out from four directions. The site map alone reproduces the phase assignments. The phase lines fall where the pottery changes least. Arbitrary lines separate the pottery better than the phase lines do. And pottery made by copying with no groups sorts into the same phases. The culture historians who drew the phases were responding to something real, a gradient in style and a clumped settlement pattern, but not to a set of bounded societies.</w:t>
+        <w:t xml:space="preserve">The results bear on three different kinds of claim, and they support each to a different degree. The first is descriptive adequacy: a smooth surface over the map describes the variation among assemblages well, and calibrated copying with no groups reproduces the fade of similarity with distance and the two-cluster difference. The second is mechanism. Spatially structured copying is sufficient to produce the inherited scheme: the site map alone reproduces the phase assignments, and assemblages made by copying with no groups sort into the same phases. Sufficiency does not identify the historical mechanism, and the finer-scale variation discussed below is explained only in part. The third is boundary evidence, whether the phase lines mark restrictions on copying. Here the result is negative but bounded. Alternative spatial divisions of the same sites capture as much or more of the ceramic differentiation than the phase lines do. In simulation at the calibrated combination, a restriction that cuts copying at the lines to a small fraction of its strength usually reverses that ordering, but the real score is also uncommon without any restriction, and the separation is smaller at other combinations, so the comparison weighs moderately against a strong restriction and cannot exclude a weak one.</w:t>
       </w:r>
     </w:p>
     <w:p>
@@ -3324,7 +3599,15 @@
         <w:pStyle w:val="BodyText"/>
       </w:pPr>
       <w:r>
-        <w:t xml:space="preserve">This explains the pattern Mainfort</w:t>
+        <w:t xml:space="preserve">The culture historians who drew the phases were responding to something real, a gradient in style sampled at clumped settlements. The assemblages give no evidence that the lines they drew were also edges of bounded learning.</w:t>
+      </w:r>
+    </w:p>
+    <w:p>
+      <w:pPr>
+        <w:pStyle w:val="BodyText"/>
+      </w:pPr>
+      <w:r>
+        <w:t xml:space="preserve">This accounts for the pattern Mainfort</w:t>
       </w:r>
       <w:r>
         <w:t xml:space="preserve"> </w:t>
@@ -3336,7 +3619,7 @@
         <w:t xml:space="preserve"> </w:t>
       </w:r>
       <w:r>
-        <w:t xml:space="preserve">reported without being able to account for it, phase members lying</w:t>
+        <w:t xml:space="preserve">reported without being able to explain it: phase members lying</w:t>
       </w:r>
       <w:r>
         <w:t xml:space="preserve"> </w:t>
@@ -3348,7 +3631,7 @@
         <w:t xml:space="preserve"> </w:t>
       </w:r>
       <w:r>
-        <w:t xml:space="preserve">while forming no groups. Nearness in an ordination is nearness on the ground, seen through the pottery. His own redrawn phases make the same point from the other side: drawn after the ordination, they sit where the pottery differs and no longer form the tightest division of the map. The two schemes are one gradient read two ways, once by proximity and once by the pottery. A phase also folds time into space. McNutt, Franklin, and Henry</w:t>
+        <w:t xml:space="preserve">while forming no groups. Nearness in an ordination is nearness on the ground, seen through the assemblages. His own redrawn phases make the same point from the other side: drawn after the ordination, they sit where the assemblages differ and no longer form the map’s tightest division. The two schemes are one gradient viewed in two ways, once by proximity and once by the assemblages. The redrawn scheme also shows that the same tests can favor a set of phase lines, so the inherited scheme’s failure is not built into them. A phase also folds time into space. McNutt, Franklin, and Henry</w:t>
       </w:r>
       <w:r>
         <w:t xml:space="preserve"> </w:t>
@@ -3396,7 +3679,7 @@
         <w:t xml:space="preserve"> </w:t>
       </w:r>
       <w:r>
-        <w:t xml:space="preserve">What the comparison adds is the mechanism, and a test that shows it describes the Parkin, Kent, and Walls phases.</w:t>
+        <w:t xml:space="preserve">The comparison adds a mechanism shown to be sufficient, and tests of whether the Parkin, Kent, and Walls phase lines behave as edges of bounded learning.</w:t>
       </w:r>
     </w:p>
     <w:p>
@@ -3404,11 +3687,11 @@
         <w:pStyle w:val="BodyText"/>
       </w:pPr>
       <w:r>
-        <w:t xml:space="preserve">The pottery does carry one property the copying model does not produce. It varies over shorter distances than calibrated copying makes it vary, so that divisions into three or more groups differ more than the model predicts and every line drawn across the map shows a step in similarity. That variation is real, not a sampling effect, but it is not organized by the phase lines, and it is not centered on Parkin. The one change to the model that reproduces it while keeping the record’s diversity matched is new styles arising somewhat locally rather than at the same rates everywhere. That is still neutral copying, and it is itself geographic. We treat it as a mechanism the record is consistent with rather than one it demonstrates: the local innovation profiles in the test are random reorderings of the regional one, individual simulations are widely spread, and the test cannot say whether local innovation followed the phases or any other division. Part of the variation may also be chronological, a matter of age that an order derived from the same frequencies cannot separate from place. A restriction on copying at the phase lines would also raise these differences, but it would have made the phase lines separate the pottery better than most arbitrary lines, and they separate it worse.</w:t>
-      </w:r>
-    </w:p>
-    <w:bookmarkEnd w:id="154"/>
-    <w:bookmarkStart w:id="155" w:name="parkin-and-the-polity"/>
+        <w:t xml:space="preserve">The assemblages carry one property the calibrated copying model does not produce. They vary over shorter distances than calibrated copying would, so divisions into three or more groups differ more than the model predicts, and every line drawn across the map shows a step in similarity. That variation is not organized by the phase lines or centered on Parkin, and it remains incompletely explained. New styles arising somewhat locally and copying that falls off over a few kilometers both make the observed differences more common in simulation while keeping the record’s diversity matched (Table 2). Both are still neutral copying and both are themselves geographic, but we treat them as mechanisms the record is consistent with rather than ones it demonstrates. Part of the variation may also be chronological, a matter of age that an order derived from the same frequencies cannot separate from place.</w:t>
+      </w:r>
+    </w:p>
+    <w:bookmarkEnd w:id="155"/>
+    <w:bookmarkStart w:id="156" w:name="parkin-and-the-polity"/>
     <w:p>
       <w:pPr>
         <w:pStyle w:val="Heading3"/>
@@ -3422,7 +3705,7 @@
         <w:pStyle w:val="FirstParagraph"/>
       </w:pPr>
       <w:r>
-        <w:t xml:space="preserve">Parkin was the basin’s largest town and had one of its tallest mounds, and its prominence was real. The polity that prominence is taken to imply does not appear in the decorated-type frequencies. The Parkin phase is exactly the northern of the two clusters the site map supports. Its difference from the rest of the basin is the one the copying model reproduces most easily, arbitrary lines separate the pottery as well as its boundary does, and the step in similarity at its edge is no larger than at comparable lines drawn across the same map. A single line gives these comparisons little power, so restricted copying at the phase’s edge cannot be excluded, but nothing in the frequencies requires it. Parkin links several seriation orderings rather than anchoring one, mound heights form a graded series with no separate top tier, and hoes reached their consumers largely down the line.</w:t>
+        <w:t xml:space="preserve">Parkin was the basin’s largest town and had one of its tallest mounds, and its prominence was real. The decorated-type frequencies, however, do not show a boundary in ceramic learning at the edge of the Parkin phase. The phase is the northern of the two clusters the regional map supports, its difference from the rest of the basin is the one the copying model reproduces most easily, and alternative divisions separate the assemblages as well as its boundary does. Because a single line gives these comparisons little power, restricted copying at the phase’s edge cannot be excluded, but nothing in the frequencies requires it.</w:t>
       </w:r>
     </w:p>
     <w:p>
@@ -3454,7 +3737,7 @@
         <w:t xml:space="preserve"> </w:t>
       </w:r>
       <w:r>
-        <w:t xml:space="preserve">also notes that Parkin’s position below the confluence of the St. Francis and Tyronza gave it control of river travel, which accounts for its prominence as well as extraction does. Skeletal evidence that people at a mound center ate better than people at a nearby village comes from Hollywood, one of the assemblages analyzed here, compared with a village of fourteen individuals</w:t>
+        <w:t xml:space="preserve">also notes that Parkin’s position below the confluence of the St. Francis and Tyronza gave it control of river travel, which accounts for its prominence as well as extraction does. Skeletal evidence that people at a mound center ate better than people at a nearby village comes from Hollywood, one of the assemblages analyzed here. Compared with a village of fourteen individuals</w:t>
       </w:r>
       <w:r>
         <w:t xml:space="preserve"> </w:t>
@@ -3463,7 +3746,7 @@
         <w:t xml:space="preserve">(Ross-Stallings 2017)</w:t>
       </w:r>
       <w:r>
-        <w:t xml:space="preserve">, and a difference in health between two sites need not arise from an extractive hierarchy. The region’s own history also offers a precedent for separating polity from ceramic phase. Coosa, the best-documented Mississippian paramountcy, spanned two ceramic traditions and site clusters that were separable at the phase level, and political affiliation rather than shared decoration bound them together</w:t>
+        <w:t xml:space="preserve">, a health difference between two sites need not arise from an extractive hierarchy. The region’s own history also offers a precedent for separating polity from a ceramically defined phase. Coosa, the best-documented Mississippian paramountcy, spanned two ceramic traditions and site clusters that were separable at the phase level, and political affiliation rather than shared decoration bound them together</w:t>
       </w:r>
       <w:r>
         <w:t xml:space="preserve"> </w:t>
@@ -3472,11 +3755,11 @@
         <w:t xml:space="preserve">(Anderson 1996:250–251)</w:t>
       </w:r>
       <w:r>
-        <w:t xml:space="preserve">. A polity need not coincide with a phase, and the reverse inference, from one phase to one polity, has no warrant on its own. If the polity the De Soto expedition met was at Parkin, it is registered in ceremony, fortification, and settlement size, not in a boundary written into the pottery.</w:t>
-      </w:r>
-    </w:p>
-    <w:bookmarkEnd w:id="155"/>
-    <w:bookmarkStart w:id="156" w:name="limits"/>
+        <w:t xml:space="preserve">. A polity need not coincide with a phase, and the reverse inference, from one phase to one polity, has no warrant on its own. If the polity the De Soto expedition met was at Parkin, the evidence for it lies in ceremony, fortification, and settlement size. The decorated pottery is silent on it rather than evidence against it.</w:t>
+      </w:r>
+    </w:p>
+    <w:bookmarkEnd w:id="156"/>
+    <w:bookmarkStart w:id="157" w:name="limits"/>
     <w:p>
       <w:pPr>
         <w:pStyle w:val="Heading3"/>
@@ -3490,7 +3773,7 @@
         <w:pStyle w:val="FirstParagraph"/>
       </w:pPr>
       <w:r>
-        <w:t xml:space="preserve">Four limits bound these conclusions. The first is resolution. On a record of this size only cultural</w:t>
+        <w:t xml:space="preserve">Four limits bound these conclusions. The first is resolution. On a record of this size, only cultural</w:t>
       </w:r>
       <w:r>
         <w:t xml:space="preserve"> </w:t>
@@ -3516,7 +3799,33 @@
         <w:t xml:space="preserve"> </w:t>
       </w:r>
       <w:r>
-        <w:t xml:space="preserve">can detect groups, and only groups that follow geography closely enough to be captured by spatial divisions; social divisions that cut across the map, or closure carried purely by conformity within groups, would escape detection (Supplemental Text). The second is chronology. Radiocarbon dates match only four assemblages, and the seriation axis follows latitude more closely than age. The tests of the phase lines do not depend on it, and the copying-model comparison gives nearly the same answer when all assemblages are treated as contemporaneous, but the record cannot say whether any difference grew through time; within its limits it shows none (Supplemental Text). The third is time-averaging, which damps differences between assemblages</w:t>
+        <w:t xml:space="preserve">can detect groups, and only groups that follow geography closely enough to be captured by spatial divisions; social divisions that cut across the map could raise</w:t>
+      </w:r>
+      <w:r>
+        <w:t xml:space="preserve"> </w:t>
+      </w:r>
+      <m:oMath>
+        <m:sSub>
+          <m:e>
+            <m:r>
+              <m:t>F</m:t>
+            </m:r>
+          </m:e>
+          <m:sub>
+            <m:r>
+              <m:t>S</m:t>
+            </m:r>
+            <m:r>
+              <m:t>T</m:t>
+            </m:r>
+          </m:sub>
+        </m:sSub>
+      </m:oMath>
+      <w:r>
+        <w:t xml:space="preserve"> </w:t>
+      </w:r>
+      <w:r>
+        <w:t xml:space="preserve">at spatial divisions without being identified as groups, and closure carried purely by conformity within one pool would escape detection (Supplemental Text). The second is chronology. Radiocarbon dates match only four assemblages, and the seriation axis follows latitude more closely than age. The phase-line tests do not depend on it, and the copying-model comparison gives nearly the same answer when all assemblages are treated as contemporaneous, but the record cannot say whether any difference grew through time; within its limits, it shows none (Supplemental Text). The third is time-averaging, which damps differences between assemblages</w:t>
       </w:r>
       <w:r>
         <w:t xml:space="preserve"> </w:t>
@@ -3525,17 +3834,17 @@
         <w:t xml:space="preserve">(Kidwell and Tomašových 2013; Perreault 2018; Tomašových and Kidwell 2009; Youngblood et al. 2023)</w:t>
       </w:r>
       <w:r>
-        <w:t xml:space="preserve">. We built it into the copying model, so its cost is already in the reported ranges. The fourth is the copying model itself. Which combination is most favorable to it depends on the random seeds used to rank them, so we report the key comparisons across six (Table 1). And the model distinguishes a copying boundary at the phase lines from new styles arising locally only weakly, which is why the conclusion about the phases rests on where their lines fall and what could have drawn them rather than on the model’s failure to find restricted copying.</w:t>
-      </w:r>
-    </w:p>
-    <w:bookmarkEnd w:id="156"/>
-    <w:bookmarkStart w:id="157" w:name="what-this-approach-contributes"/>
+        <w:t xml:space="preserve">. We built it into the copying model, so its cost is already in the reported ranges. The fourth is the copying model itself. Which combination is most favorable to it depends on the random seeds used to rank them, so we report the key comparisons across six (Table 1). The model distinguishes a copying boundary at the phase lines from new styles arising locally only weakly, so the conclusion about the phases rests on how their lines compare with other divisions of the map and what could have drawn them, rather than on the model’s failure to find restricted copying.</w:t>
+      </w:r>
+    </w:p>
+    <w:bookmarkEnd w:id="157"/>
+    <w:bookmarkStart w:id="158" w:name="X58aa97846e4267ccd885b870dbd88e44a706276"/>
     <w:p>
       <w:pPr>
         <w:pStyle w:val="Heading3"/>
       </w:pPr>
       <w:r>
-        <w:t xml:space="preserve">What this approach contributes</w:t>
+        <w:t xml:space="preserve">What this approach contributes to the study of social units</w:t>
       </w:r>
     </w:p>
     <w:p>
@@ -3543,7 +3852,33 @@
         <w:pStyle w:val="FirstParagraph"/>
       </w:pPr>
       <w:r>
-        <w:t xml:space="preserve">The approach rests on two requirements that apply beyond this case. Before a similarity pattern is read as social, the record must be shown able to detect a social boundary; here that leaves one usable measure of four. Before a model of copying with no groups is credited with reproducing a record, it must be shown to fit that record’s own diversity. The second requirement changed our own results: calibrated, the model is narrower than an uncalibrated one and shows the shorter-range variation it misses. A model run at the wrong diversity is easily credited with structure it cannot produce, just as a localized neutral process is easily mistaken for biased copying when diversity is taken at face value</w:t>
+        <w:t xml:space="preserve">Our approach rests on two requirements that apply beyond this case. Before treating a similarity pattern as the result of differential social interaction, the record must be shown able to detect a social boundary. Here, we show that</w:t>
+      </w:r>
+      <w:r>
+        <w:t xml:space="preserve"> </w:t>
+      </w:r>
+      <m:oMath>
+        <m:sSub>
+          <m:e>
+            <m:r>
+              <m:t>F</m:t>
+            </m:r>
+          </m:e>
+          <m:sub>
+            <m:r>
+              <m:t>S</m:t>
+            </m:r>
+            <m:r>
+              <m:t>T</m:t>
+            </m:r>
+          </m:sub>
+        </m:sSub>
+      </m:oMath>
+      <w:r>
+        <w:t xml:space="preserve"> </w:t>
+      </w:r>
+      <w:r>
+        <w:t xml:space="preserve">is the one measure of four that can do this with assemblage-scale data that includes time aggregation. Before a model of copying with no groups is credited with reproducing a record, it must be shown to fit that record’s own diversity. The second requirement changed our own results: calibrated, the model is narrower than an uncalibrated one and shows the shorter-range variation it misses. A model that is run at the wrong diversity is easily credited with structure it cannot produce, just as a localized neutral process is easily mistaken for biased copying when diversity is taken at face value</w:t>
       </w:r>
       <w:r>
         <w:t xml:space="preserve"> </w:t>
@@ -3552,7 +3887,7 @@
         <w:t xml:space="preserve">(Premo 2016; Premo and Scholnick 2011; Schneider et al. 2016)</w:t>
       </w:r>
       <w:r>
-        <w:t xml:space="preserve">. The approach also asks a question of the phase scheme that ordination alone cannot: not whether the phases separate, but whether their lines separate the pottery better than other lines drawn across the same map. These are standards of measurement for an evolutionary archaeology that has long been clearer about what evolves than about how to measure it</w:t>
+        <w:t xml:space="preserve">. Our approach also asks a question ordination alone cannot. We ask not whether the phases separate, but whether their delineations separate the assemblages better than other lines drawn across the same map. These are standards of measurement for an evolutionary archaeology that has long been clearer about what evolves than about how to measure it</w:t>
       </w:r>
       <w:r>
         <w:t xml:space="preserve"> </w:t>
@@ -3569,7 +3904,7 @@
         <w:pStyle w:val="BodyText"/>
       </w:pPr>
       <w:r>
-        <w:t xml:space="preserve">The shorter-range variation and Parkin’s role would be better tested on stratified, excavated assemblages with independent radiocarbon dates, on compositional and petrographic evidence for where pottery was made, and on exchange, mortuary, and dietary records</w:t>
+        <w:t xml:space="preserve">For the St. Francis Basin assemblages, the shorter-range variation and Parkin’s role would be better tested on stratified, excavated assemblages with independent radiocarbon dates, on compositional and petrographic evidence for where assemblages were made, and on exchange, mortuary, and dietary records</w:t>
       </w:r>
       <w:r>
         <w:t xml:space="preserve"> </w:t>
@@ -3581,9 +3916,9 @@
         <w:t xml:space="preserve">.</w:t>
       </w:r>
     </w:p>
-    <w:bookmarkEnd w:id="157"/>
     <w:bookmarkEnd w:id="158"/>
-    <w:bookmarkStart w:id="159" w:name="conclusion"/>
+    <w:bookmarkEnd w:id="159"/>
+    <w:bookmarkStart w:id="160" w:name="conclusion"/>
     <w:p>
       <w:pPr>
         <w:pStyle w:val="Heading2"/>
@@ -3597,7 +3932,7 @@
         <w:pStyle w:val="FirstParagraph"/>
       </w:pPr>
       <w:r>
-        <w:t xml:space="preserve">The phase is the unit on which lower Mississippi Valley culture history is built, and it carries an unstated claim: that assemblages grouped by seriation and proximity record a community, and at Parkin a polity. Earlier work showed that the phases do not separate cleanly. This paper explains what they are. Potters copied near neighbors more than distant ones, so style changed gradually across the basin; settlement was clumped; and sorting assemblages by resemblance and proximity turns that gradient into what looks like a set of groups. The site map alone recovers the phases, arbitrary lines separate the pottery better than the phase lines do, and pottery made by copying with no groups sorts into the same phases.</w:t>
+        <w:t xml:space="preserve">The phase is the unit on which Lower Mississippi Valley culture history is built, and it often carries an unstated claim: that assemblages grouped by seriation and proximity record a community, and at Parkin, a polity. Earlier work showed that the phases do not separate cleanly. This paper tests whether the inherited phases of the St. Francis basin coincide with restrictions on the copying of decorated pottery, and offers an explanation for their apparent organization. The inherited phases do not uniquely capture the decorated-ceramic differentiation of the basin. A regional map of deposit locations alone recovers them, alternative spatial divisions of the same sites capture as much or more of the differentiation, and pottery made by copying with no groups sorts into the same phases. Phases redrawn from an ordination of the assemblages behave differently, following the pottery rather than the map, which is the contrast this explanation predicts. Spatially structured copying, sampled at clumped settlements and sorted by resemblance and proximity, is therefore a sufficient and plausible account of how the phases came to look like groups.</w:t>
       </w:r>
     </w:p>
     <w:p>
@@ -3605,11 +3940,11 @@
         <w:pStyle w:val="BodyText"/>
       </w:pPr>
       <w:r>
-        <w:t xml:space="preserve">The pottery does vary over shorter distances than calibrated copying produces, but arbitrary lines capture that variation as well as the phase lines do, and restricted copying at the phase lines would have made them capture it better. The Parkin phase has no evidence in its decorated-type frequencies that sets it apart as a polity. It is the northern half of the site map, its pottery differs from the rest of the basin no more than copying without groups produces and no more than arbitrary divisions separate, and comparable steps in similarity appear at arbitrary lines across the basin. A similarity cluster is not, by itself, a society. Before a phase is read as one, its frequencies must show what copying across distance cannot produce, and its lines must separate the pottery better than lines drawn anywhere else.</w:t>
-      </w:r>
-    </w:p>
-    <w:bookmarkEnd w:id="159"/>
-    <w:bookmarkStart w:id="160" w:name="data-and-code-availability"/>
+        <w:t xml:space="preserve">These results weaken the use of phase membership alone as evidence of bounded ceramic interaction communities. They do not exclude a Parkin polity, whose political boundaries need not have followed ceramic traditions, nor weak restrictions on copying at the phase lines, and the additional variation at finer scales remains incompletely explained. Before a phase is interpreted as a bounded community, its frequencies should show what copying across distance does not produce, and its lines should separate the assemblages better than other lines drawn across the same map.</w:t>
+      </w:r>
+    </w:p>
+    <w:bookmarkEnd w:id="160"/>
+    <w:bookmarkStart w:id="161" w:name="data-and-code-availability"/>
     <w:p>
       <w:pPr>
         <w:pStyle w:val="Heading2"/>
@@ -3623,7 +3958,7 @@
         <w:pStyle w:val="FirstParagraph"/>
       </w:pPr>
       <w:r>
-        <w:t xml:space="preserve">All data and code needed to reproduce the analyses and figures reported here are openly available at https://github.com/clipo/phases. Upon publication, we will release a versioned snapshot of the repository at https://doi.org/10.5281/zenodo.20796240. The repository includes the decorated-ceramic class counts, the georeferencing and radiocarbon data, the complete analysis procedure, and instructions for reproducing all results and figures. The neutral copying model is implemented in</w:t>
+        <w:t xml:space="preserve">All data and code needed to reproduce the analyses and figures reported here are openly available at https://github.com/clipo/phases. Upon publication, we will release a versioned snapshot of the repository at https://doi.org/10.5281/zenodo.20796240. The repository includes decorated-ceramic class counts, georeferencing and radiocarbon data, the full analysis procedure, and instructions for reproducing all results and figures. The neutral copying model is implemented in</w:t>
       </w:r>
       <w:r>
         <w:t xml:space="preserve"> </w:t>
@@ -3641,8 +3976,8 @@
         <w:t xml:space="preserve">and analyses 47 and 50, which write every simulation, the calibration series, and a configuration fingerprint. The code is released under the MIT License, and the data under a Creative Commons Attribution 4.0 International license.</w:t>
       </w:r>
     </w:p>
-    <w:bookmarkEnd w:id="160"/>
-    <w:bookmarkStart w:id="269" w:name="references"/>
+    <w:bookmarkEnd w:id="161"/>
+    <w:bookmarkStart w:id="274" w:name="references"/>
     <w:p>
       <w:pPr>
         <w:pStyle w:val="Heading2"/>
@@ -3651,8 +3986,8 @@
         <w:t xml:space="preserve">References</w:t>
       </w:r>
     </w:p>
-    <w:bookmarkStart w:id="268" w:name="refs"/>
-    <w:bookmarkStart w:id="161" w:name="ref-anderson_1996"/>
+    <w:bookmarkStart w:id="273" w:name="refs"/>
+    <w:bookmarkStart w:id="162" w:name="ref-anderson_1996"/>
     <w:p>
       <w:pPr>
         <w:pStyle w:val="Bibliography"/>
@@ -3674,8 +4009,8 @@
         <w:t xml:space="preserve">, edited by John F. Scarry, pp. 231–252. University Press of Florida, Gainesville.</w:t>
       </w:r>
     </w:p>
-    <w:bookmarkEnd w:id="161"/>
-    <w:bookmarkStart w:id="162" w:name="ref-baxter_1994"/>
+    <w:bookmarkEnd w:id="162"/>
+    <w:bookmarkStart w:id="163" w:name="ref-baxter_1994"/>
     <w:p>
       <w:pPr>
         <w:pStyle w:val="Bibliography"/>
@@ -3697,13 +4032,51 @@
         <w:t xml:space="preserve">. Edinburgh University Press, Edinburgh.</w:t>
       </w:r>
     </w:p>
-    <w:bookmarkEnd w:id="162"/>
-    <w:bookmarkStart w:id="164" w:name="ref-beck_2003"/>
+    <w:bookmarkEnd w:id="163"/>
+    <w:bookmarkStart w:id="164" w:name="ref-beaumont_zhang_balding_2002"/>
     <w:p>
       <w:pPr>
         <w:pStyle w:val="Bibliography"/>
       </w:pPr>
       <w:r>
+        <w:t xml:space="preserve">Beaumont, Mark A., Wenyang Zhang, and David J. Balding. 2002. Approximate</w:t>
+      </w:r>
+      <w:r>
+        <w:t xml:space="preserve"> </w:t>
+      </w:r>
+      <w:r>
+        <w:t xml:space="preserve">Bayesian</w:t>
+      </w:r>
+      <w:r>
+        <w:t xml:space="preserve"> </w:t>
+      </w:r>
+      <w:r>
+        <w:t xml:space="preserve">Computation in Population Genetics.</w:t>
+      </w:r>
+      <w:r>
+        <w:t xml:space="preserve"> </w:t>
+      </w:r>
+      <w:r>
+        <w:rPr>
+          <w:i/>
+          <w:iCs/>
+        </w:rPr>
+        <w:t xml:space="preserve">Genetics</w:t>
+      </w:r>
+      <w:r>
+        <w:t xml:space="preserve"> </w:t>
+      </w:r>
+      <w:r>
+        <w:t xml:space="preserve">162(4):2025–2035.</w:t>
+      </w:r>
+    </w:p>
+    <w:bookmarkEnd w:id="164"/>
+    <w:bookmarkStart w:id="166" w:name="ref-beck_2003"/>
+    <w:p>
+      <w:pPr>
+        <w:pStyle w:val="Bibliography"/>
+      </w:pPr>
+      <w:r>
         <w:t xml:space="preserve">Beck, Jr., Robin A. 2003. Consolidation and Hierarchy: Chiefdom Variability in the</w:t>
       </w:r>
       <w:r>
@@ -3737,7 +4110,7 @@
       <w:r>
         <w:t xml:space="preserve"> </w:t>
       </w:r>
-      <w:hyperlink r:id="rId163">
+      <w:hyperlink r:id="rId165">
         <w:r>
           <w:rPr>
             <w:rStyle w:val="Hyperlink"/>
@@ -3749,8 +4122,8 @@
         <w:t xml:space="preserve">.</w:t>
       </w:r>
     </w:p>
-    <w:bookmarkEnd w:id="164"/>
-    <w:bookmarkStart w:id="166" w:name="ref-bell_richerson_mcelreath_2009"/>
+    <w:bookmarkEnd w:id="166"/>
+    <w:bookmarkStart w:id="168" w:name="ref-bell_richerson_mcelreath_2009"/>
     <w:p>
       <w:pPr>
         <w:pStyle w:val="Bibliography"/>
@@ -3777,7 +4150,7 @@
       <w:r>
         <w:t xml:space="preserve"> </w:t>
       </w:r>
-      <w:hyperlink r:id="rId165">
+      <w:hyperlink r:id="rId167">
         <w:r>
           <w:rPr>
             <w:rStyle w:val="Hyperlink"/>
@@ -3789,8 +4162,8 @@
         <w:t xml:space="preserve">.</w:t>
       </w:r>
     </w:p>
-    <w:bookmarkEnd w:id="166"/>
-    <w:bookmarkStart w:id="168" w:name="ref-bentley_hahn_shennan_2004"/>
+    <w:bookmarkEnd w:id="168"/>
+    <w:bookmarkStart w:id="170" w:name="ref-bentley_hahn_shennan_2004"/>
     <w:p>
       <w:pPr>
         <w:pStyle w:val="Bibliography"/>
@@ -3817,7 +4190,7 @@
       <w:r>
         <w:t xml:space="preserve"> </w:t>
       </w:r>
-      <w:hyperlink r:id="rId167">
+      <w:hyperlink r:id="rId169">
         <w:r>
           <w:rPr>
             <w:rStyle w:val="Hyperlink"/>
@@ -3829,8 +4202,8 @@
         <w:t xml:space="preserve">.</w:t>
       </w:r>
     </w:p>
-    <w:bookmarkEnd w:id="168"/>
-    <w:bookmarkStart w:id="170" w:name="ref-blitz_1999"/>
+    <w:bookmarkEnd w:id="170"/>
+    <w:bookmarkStart w:id="172" w:name="ref-blitz_1999"/>
     <w:p>
       <w:pPr>
         <w:pStyle w:val="Bibliography"/>
@@ -3869,7 +4242,7 @@
       <w:r>
         <w:t xml:space="preserve"> </w:t>
       </w:r>
-      <w:hyperlink r:id="rId169">
+      <w:hyperlink r:id="rId171">
         <w:r>
           <w:rPr>
             <w:rStyle w:val="Hyperlink"/>
@@ -3881,8 +4254,8 @@
         <w:t xml:space="preserve">.</w:t>
       </w:r>
     </w:p>
-    <w:bookmarkEnd w:id="170"/>
-    <w:bookmarkStart w:id="171" w:name="ref-brainerd_1951"/>
+    <w:bookmarkEnd w:id="172"/>
+    <w:bookmarkStart w:id="173" w:name="ref-brainerd_1951"/>
     <w:p>
       <w:pPr>
         <w:pStyle w:val="Bibliography"/>
@@ -3907,13 +4280,39 @@
         <w:t xml:space="preserve">16(4):301–313.</w:t>
       </w:r>
     </w:p>
-    <w:bookmarkEnd w:id="171"/>
-    <w:bookmarkStart w:id="172" w:name="ref-cobb_2000"/>
+    <w:bookmarkEnd w:id="173"/>
+    <w:bookmarkStart w:id="174" w:name="ref-carpenter_etal_2017"/>
     <w:p>
       <w:pPr>
         <w:pStyle w:val="Bibliography"/>
       </w:pPr>
       <w:r>
+        <w:t xml:space="preserve">Carpenter, Bob, Andrew Gelman, Matthew D. Hoffman, Daniel Lee, Ben Goodrich, Michael Betancourt, Marcus Brubaker, Jiqiang Guo, Peter Li, and Allen Riddell. 2017. Stan: A Probabilistic Programming Language.</w:t>
+      </w:r>
+      <w:r>
+        <w:t xml:space="preserve"> </w:t>
+      </w:r>
+      <w:r>
+        <w:rPr>
+          <w:i/>
+          <w:iCs/>
+        </w:rPr>
+        <w:t xml:space="preserve">Journal of Statistical Software</w:t>
+      </w:r>
+      <w:r>
+        <w:t xml:space="preserve"> </w:t>
+      </w:r>
+      <w:r>
+        <w:t xml:space="preserve">76(1):1–32.</w:t>
+      </w:r>
+    </w:p>
+    <w:bookmarkEnd w:id="174"/>
+    <w:bookmarkStart w:id="175" w:name="ref-cobb_2000"/>
+    <w:p>
+      <w:pPr>
+        <w:pStyle w:val="Bibliography"/>
+      </w:pPr>
+      <w:r>
         <w:t xml:space="preserve">Cobb, Charles R. 2000.</w:t>
       </w:r>
       <w:r>
@@ -3958,8 +4357,8 @@
         <w:t xml:space="preserve">. University of Alabama Press, Tuscaloosa.</w:t>
       </w:r>
     </w:p>
-    <w:bookmarkEnd w:id="172"/>
-    <w:bookmarkStart w:id="174" w:name="ref-crema_bortolini_lake_2023"/>
+    <w:bookmarkEnd w:id="175"/>
+    <w:bookmarkStart w:id="177" w:name="ref-crema_bortolini_lake_2023"/>
     <w:p>
       <w:pPr>
         <w:pStyle w:val="Bibliography"/>
@@ -3986,7 +4385,7 @@
       <w:r>
         <w:t xml:space="preserve"> </w:t>
       </w:r>
-      <w:hyperlink r:id="rId173">
+      <w:hyperlink r:id="rId176">
         <w:r>
           <w:rPr>
             <w:rStyle w:val="Hyperlink"/>
@@ -3998,8 +4397,8 @@
         <w:t xml:space="preserve">.</w:t>
       </w:r>
     </w:p>
-    <w:bookmarkEnd w:id="174"/>
-    <w:bookmarkStart w:id="176" w:name="ref-crema_kandler_shennan_2016"/>
+    <w:bookmarkEnd w:id="177"/>
+    <w:bookmarkStart w:id="179" w:name="ref-crema_kandler_shennan_2016"/>
     <w:p>
       <w:pPr>
         <w:pStyle w:val="Bibliography"/>
@@ -4026,7 +4425,7 @@
       <w:r>
         <w:t xml:space="preserve"> </w:t>
       </w:r>
-      <w:hyperlink r:id="rId175">
+      <w:hyperlink r:id="rId178">
         <w:r>
           <w:rPr>
             <w:rStyle w:val="Hyperlink"/>
@@ -4038,8 +4437,8 @@
         <w:t xml:space="preserve">.</w:t>
       </w:r>
     </w:p>
-    <w:bookmarkEnd w:id="176"/>
-    <w:bookmarkStart w:id="178" w:name="ref-dunnell_1978"/>
+    <w:bookmarkEnd w:id="179"/>
+    <w:bookmarkStart w:id="181" w:name="ref-dunnell_1978"/>
     <w:p>
       <w:pPr>
         <w:pStyle w:val="Bibliography"/>
@@ -4066,7 +4465,7 @@
       <w:r>
         <w:t xml:space="preserve"> </w:t>
       </w:r>
-      <w:hyperlink r:id="rId177">
+      <w:hyperlink r:id="rId180">
         <w:r>
           <w:rPr>
             <w:rStyle w:val="Hyperlink"/>
@@ -4078,8 +4477,8 @@
         <w:t xml:space="preserve">.</w:t>
       </w:r>
     </w:p>
-    <w:bookmarkEnd w:id="178"/>
-    <w:bookmarkStart w:id="179" w:name="ref-dunnell_1980"/>
+    <w:bookmarkEnd w:id="181"/>
+    <w:bookmarkStart w:id="182" w:name="ref-dunnell_1980"/>
     <w:p>
       <w:pPr>
         <w:pStyle w:val="Bibliography"/>
@@ -4101,8 +4500,8 @@
         <w:t xml:space="preserve">, edited by Michael B. Schiffer, pp. 35–99. Academic Press, New York.</w:t>
       </w:r>
     </w:p>
-    <w:bookmarkEnd w:id="179"/>
-    <w:bookmarkStart w:id="180" w:name="ref-dunnell_1995"/>
+    <w:bookmarkEnd w:id="182"/>
+    <w:bookmarkStart w:id="183" w:name="ref-dunnell_1995"/>
     <w:p>
       <w:pPr>
         <w:pStyle w:val="Bibliography"/>
@@ -4124,8 +4523,8 @@
         <w:t xml:space="preserve">, edited by Patrice A. Teltser, pp. 33–50. University of Arizona Press, Tucson.</w:t>
       </w:r>
     </w:p>
-    <w:bookmarkEnd w:id="180"/>
-    <w:bookmarkStart w:id="182" w:name="ref-eerkens_lipo_2005"/>
+    <w:bookmarkEnd w:id="183"/>
+    <w:bookmarkStart w:id="185" w:name="ref-eerkens_lipo_2005"/>
     <w:p>
       <w:pPr>
         <w:pStyle w:val="Bibliography"/>
@@ -4152,7 +4551,7 @@
       <w:r>
         <w:t xml:space="preserve"> </w:t>
       </w:r>
-      <w:hyperlink r:id="rId181">
+      <w:hyperlink r:id="rId184">
         <w:r>
           <w:rPr>
             <w:rStyle w:val="Hyperlink"/>
@@ -4164,8 +4563,8 @@
         <w:t xml:space="preserve">.</w:t>
       </w:r>
     </w:p>
-    <w:bookmarkEnd w:id="182"/>
-    <w:bookmarkStart w:id="184" w:name="ref-eerkens_lipo_2007"/>
+    <w:bookmarkEnd w:id="185"/>
+    <w:bookmarkStart w:id="187" w:name="ref-eerkens_lipo_2007"/>
     <w:p>
       <w:pPr>
         <w:pStyle w:val="Bibliography"/>
@@ -4192,7 +4591,7 @@
       <w:r>
         <w:t xml:space="preserve"> </w:t>
       </w:r>
-      <w:hyperlink r:id="rId183">
+      <w:hyperlink r:id="rId186">
         <w:r>
           <w:rPr>
             <w:rStyle w:val="Hyperlink"/>
@@ -4204,8 +4603,8 @@
         <w:t xml:space="preserve">.</w:t>
       </w:r>
     </w:p>
-    <w:bookmarkEnd w:id="184"/>
-    <w:bookmarkStart w:id="186" w:name="ref-fogarty_kandler_creanza_2024"/>
+    <w:bookmarkEnd w:id="187"/>
+    <w:bookmarkStart w:id="189" w:name="ref-fogarty_kandler_creanza_2024"/>
     <w:p>
       <w:pPr>
         <w:pStyle w:val="Bibliography"/>
@@ -4232,7 +4631,7 @@
       <w:r>
         <w:t xml:space="preserve"> </w:t>
       </w:r>
-      <w:hyperlink r:id="rId185">
+      <w:hyperlink r:id="rId188">
         <w:r>
           <w:rPr>
             <w:rStyle w:val="Hyperlink"/>
@@ -4244,8 +4643,8 @@
         <w:t xml:space="preserve">.</w:t>
       </w:r>
     </w:p>
-    <w:bookmarkEnd w:id="186"/>
-    <w:bookmarkStart w:id="187" w:name="ref-fox_1998"/>
+    <w:bookmarkEnd w:id="189"/>
+    <w:bookmarkStart w:id="190" w:name="ref-fox_1998"/>
     <w:p>
       <w:pPr>
         <w:pStyle w:val="Bibliography"/>
@@ -4267,13 +4666,39 @@
         <w:t xml:space="preserve">, edited by Michael J. O’Brien and Robert C. Dunnell, pp. 31–58. University of Alabama Press, Tuscaloosa.</w:t>
       </w:r>
     </w:p>
-    <w:bookmarkEnd w:id="187"/>
-    <w:bookmarkStart w:id="189" w:name="ref-haley_2014"/>
+    <w:bookmarkEnd w:id="190"/>
+    <w:bookmarkStart w:id="191" w:name="ref-gelman_meng_stern_1996"/>
     <w:p>
       <w:pPr>
         <w:pStyle w:val="Bibliography"/>
       </w:pPr>
       <w:r>
+        <w:t xml:space="preserve">Gelman, Andrew, Xiao-Li Meng, and Hal Stern. 1996. Posterior Predictive Assessment of Model Fitness via Realized Discrepancies.</w:t>
+      </w:r>
+      <w:r>
+        <w:t xml:space="preserve"> </w:t>
+      </w:r>
+      <w:r>
+        <w:rPr>
+          <w:i/>
+          <w:iCs/>
+        </w:rPr>
+        <w:t xml:space="preserve">Statistica Sinica</w:t>
+      </w:r>
+      <w:r>
+        <w:t xml:space="preserve"> </w:t>
+      </w:r>
+      <w:r>
+        <w:t xml:space="preserve">6(4):733–807.</w:t>
+      </w:r>
+    </w:p>
+    <w:bookmarkEnd w:id="191"/>
+    <w:bookmarkStart w:id="193" w:name="ref-haley_2014"/>
+    <w:p>
+      <w:pPr>
+        <w:pStyle w:val="Bibliography"/>
+      </w:pPr>
+      <w:r>
         <w:t xml:space="preserve">Haley, Bryan S. 2014. The Big Picture at</w:t>
       </w:r>
       <w:r>
@@ -4316,7 +4741,7 @@
       <w:r>
         <w:t xml:space="preserve"> </w:t>
       </w:r>
-      <w:hyperlink r:id="rId188">
+      <w:hyperlink r:id="rId192">
         <w:r>
           <w:rPr>
             <w:rStyle w:val="Hyperlink"/>
@@ -4328,8 +4753,8 @@
         <w:t xml:space="preserve">.</w:t>
       </w:r>
     </w:p>
-    <w:bookmarkEnd w:id="189"/>
-    <w:bookmarkStart w:id="191" w:name="ref-henrich_2001"/>
+    <w:bookmarkEnd w:id="193"/>
+    <w:bookmarkStart w:id="195" w:name="ref-henrich_2001"/>
     <w:p>
       <w:pPr>
         <w:pStyle w:val="Bibliography"/>
@@ -4356,7 +4781,7 @@
       <w:r>
         <w:t xml:space="preserve"> </w:t>
       </w:r>
-      <w:hyperlink r:id="rId190">
+      <w:hyperlink r:id="rId194">
         <w:r>
           <w:rPr>
             <w:rStyle w:val="Hyperlink"/>
@@ -4368,8 +4793,8 @@
         <w:t xml:space="preserve">.</w:t>
       </w:r>
     </w:p>
-    <w:bookmarkEnd w:id="191"/>
-    <w:bookmarkStart w:id="193" w:name="ref-henrich_boyd_1998"/>
+    <w:bookmarkEnd w:id="195"/>
+    <w:bookmarkStart w:id="197" w:name="ref-henrich_boyd_1998"/>
     <w:p>
       <w:pPr>
         <w:pStyle w:val="Bibliography"/>
@@ -4396,7 +4821,7 @@
       <w:r>
         <w:t xml:space="preserve"> </w:t>
       </w:r>
-      <w:hyperlink r:id="rId192">
+      <w:hyperlink r:id="rId196">
         <w:r>
           <w:rPr>
             <w:rStyle w:val="Hyperlink"/>
@@ -4408,8 +4833,8 @@
         <w:t xml:space="preserve">.</w:t>
       </w:r>
     </w:p>
-    <w:bookmarkEnd w:id="193"/>
-    <w:bookmarkStart w:id="194" w:name="ref-holdaway_wandsnider_2008"/>
+    <w:bookmarkEnd w:id="197"/>
+    <w:bookmarkStart w:id="198" w:name="ref-holdaway_wandsnider_2008"/>
     <w:p>
       <w:pPr>
         <w:pStyle w:val="Bibliography"/>
@@ -4431,8 +4856,8 @@
         <w:t xml:space="preserve">. University of Utah Press, Salt Lake City.</w:t>
       </w:r>
     </w:p>
-    <w:bookmarkEnd w:id="194"/>
-    <w:bookmarkStart w:id="196" w:name="ref-holland-lulewicz_ritchison_2021"/>
+    <w:bookmarkEnd w:id="198"/>
+    <w:bookmarkStart w:id="200" w:name="ref-holland-lulewicz_ritchison_2021"/>
     <w:p>
       <w:pPr>
         <w:pStyle w:val="Bibliography"/>
@@ -4459,7 +4884,7 @@
       <w:r>
         <w:t xml:space="preserve"> </w:t>
       </w:r>
-      <w:hyperlink r:id="rId195">
+      <w:hyperlink r:id="rId199">
         <w:r>
           <w:rPr>
             <w:rStyle w:val="Hyperlink"/>
@@ -4471,8 +4896,8 @@
         <w:t xml:space="preserve">.</w:t>
       </w:r>
     </w:p>
-    <w:bookmarkEnd w:id="196"/>
-    <w:bookmarkStart w:id="197" w:name="ref-house_1991"/>
+    <w:bookmarkEnd w:id="200"/>
+    <w:bookmarkStart w:id="201" w:name="ref-house_1991"/>
     <w:p>
       <w:pPr>
         <w:pStyle w:val="Bibliography"/>
@@ -4514,8 +4939,8 @@
         <w:t xml:space="preserve">. PhD thesis, Southern Illinois University at Carbondale, Carbondale.</w:t>
       </w:r>
     </w:p>
-    <w:bookmarkEnd w:id="197"/>
-    <w:bookmarkStart w:id="198" w:name="ref-house_1993"/>
+    <w:bookmarkEnd w:id="201"/>
+    <w:bookmarkStart w:id="202" w:name="ref-house_1993"/>
     <w:p>
       <w:pPr>
         <w:pStyle w:val="Bibliography"/>
@@ -4540,13 +4965,39 @@
         <w:t xml:space="preserve">12(1):21–32.</w:t>
       </w:r>
     </w:p>
-    <w:bookmarkEnd w:id="198"/>
-    <w:bookmarkStart w:id="199" w:name="ref-hudson_smith_depratter_1990"/>
+    <w:bookmarkEnd w:id="202"/>
+    <w:bookmarkStart w:id="203" w:name="ref-hubert_arabie_1985"/>
     <w:p>
       <w:pPr>
         <w:pStyle w:val="Bibliography"/>
       </w:pPr>
       <w:r>
+        <w:t xml:space="preserve">Hubert, Lawrence, and Phipps Arabie. 1985. Comparing Partitions.</w:t>
+      </w:r>
+      <w:r>
+        <w:t xml:space="preserve"> </w:t>
+      </w:r>
+      <w:r>
+        <w:rPr>
+          <w:i/>
+          <w:iCs/>
+        </w:rPr>
+        <w:t xml:space="preserve">Journal of Classification</w:t>
+      </w:r>
+      <w:r>
+        <w:t xml:space="preserve"> </w:t>
+      </w:r>
+      <w:r>
+        <w:t xml:space="preserve">2:193–218.</w:t>
+      </w:r>
+    </w:p>
+    <w:bookmarkEnd w:id="203"/>
+    <w:bookmarkStart w:id="204" w:name="ref-hudson_smith_depratter_1990"/>
+    <w:p>
+      <w:pPr>
+        <w:pStyle w:val="Bibliography"/>
+      </w:pPr>
+      <w:r>
         <w:t xml:space="preserve">Hudson, Charles, Marvin T. Smith, and Chester B. DePratter. 1990. The Hernando de Soto Expedition: From</w:t>
       </w:r>
       <w:r>
@@ -4601,8 +5052,8 @@
         <w:t xml:space="preserve">, edited by David H. Dye and Cheryl Anne Cox, pp. 181–207. University of Alabama Press, Tuscaloosa.</w:t>
       </w:r>
     </w:p>
-    <w:bookmarkEnd w:id="199"/>
-    <w:bookmarkStart w:id="201" w:name="ref-kidwell_tomasovych_2013"/>
+    <w:bookmarkEnd w:id="204"/>
+    <w:bookmarkStart w:id="206" w:name="ref-kidwell_tomasovych_2013"/>
     <w:p>
       <w:pPr>
         <w:pStyle w:val="Bibliography"/>
@@ -4629,7 +5080,7 @@
       <w:r>
         <w:t xml:space="preserve"> </w:t>
       </w:r>
-      <w:hyperlink r:id="rId200">
+      <w:hyperlink r:id="rId205">
         <w:r>
           <w:rPr>
             <w:rStyle w:val="Hyperlink"/>
@@ -4641,8 +5092,8 @@
         <w:t xml:space="preserve">.</w:t>
       </w:r>
     </w:p>
-    <w:bookmarkEnd w:id="201"/>
-    <w:bookmarkStart w:id="202" w:name="ref-king_freer_1995"/>
+    <w:bookmarkEnd w:id="206"/>
+    <w:bookmarkStart w:id="207" w:name="ref-king_freer_1995"/>
     <w:p>
       <w:pPr>
         <w:pStyle w:val="Bibliography"/>
@@ -4676,8 +5127,8 @@
         <w:t xml:space="preserve">, edited by Michael S. Nassaney and Kenneth E. Sassaman, pp. 266–288. University of Tennessee Press, Knoxville.</w:t>
       </w:r>
     </w:p>
-    <w:bookmarkEnd w:id="202"/>
-    <w:bookmarkStart w:id="203" w:name="ref-lehner_grill_2013"/>
+    <w:bookmarkEnd w:id="207"/>
+    <w:bookmarkStart w:id="208" w:name="ref-lehner_grill_2013"/>
     <w:p>
       <w:pPr>
         <w:pStyle w:val="Bibliography"/>
@@ -4702,8 +5153,8 @@
         <w:t xml:space="preserve">27(15):2171–2186.</w:t>
       </w:r>
     </w:p>
-    <w:bookmarkEnd w:id="203"/>
-    <w:bookmarkStart w:id="204" w:name="ref-lipo_2001"/>
+    <w:bookmarkEnd w:id="208"/>
+    <w:bookmarkStart w:id="209" w:name="ref-lipo_2001"/>
     <w:p>
       <w:pPr>
         <w:pStyle w:val="Bibliography"/>
@@ -4753,8 +5204,8 @@
         <w:t xml:space="preserve">. BAR International Series 918. Archaeopress, Oxford.</w:t>
       </w:r>
     </w:p>
-    <w:bookmarkEnd w:id="204"/>
-    <w:bookmarkStart w:id="206" w:name="ref-lipo_dinapoli_madsen_hunt_2021"/>
+    <w:bookmarkEnd w:id="209"/>
+    <w:bookmarkStart w:id="211" w:name="ref-lipo_dinapoli_madsen_hunt_2021"/>
     <w:p>
       <w:pPr>
         <w:pStyle w:val="Bibliography"/>
@@ -4781,7 +5232,7 @@
       <w:r>
         <w:t xml:space="preserve"> </w:t>
       </w:r>
-      <w:hyperlink r:id="rId205">
+      <w:hyperlink r:id="rId210">
         <w:r>
           <w:rPr>
             <w:rStyle w:val="Hyperlink"/>
@@ -4793,8 +5244,8 @@
         <w:t xml:space="preserve">.</w:t>
       </w:r>
     </w:p>
-    <w:bookmarkEnd w:id="206"/>
-    <w:bookmarkStart w:id="207" w:name="ref-lipo_dunnell_2007"/>
+    <w:bookmarkEnd w:id="211"/>
+    <w:bookmarkStart w:id="212" w:name="ref-lipo_dunnell_2007"/>
     <w:p>
       <w:pPr>
         <w:pStyle w:val="Bibliography"/>
@@ -4856,8 +5307,8 @@
         <w:t xml:space="preserve">, edited by Janet Rafferty and Evan Peacock, pp. 125–167. University of Alabama Press, Tuscaloosa.</w:t>
       </w:r>
     </w:p>
-    <w:bookmarkEnd w:id="207"/>
-    <w:bookmarkStart w:id="209" w:name="ref-lipo_madsen_dunnell_2015"/>
+    <w:bookmarkEnd w:id="212"/>
+    <w:bookmarkStart w:id="214" w:name="ref-lipo_madsen_dunnell_2015"/>
     <w:p>
       <w:pPr>
         <w:pStyle w:val="Bibliography"/>
@@ -4884,7 +5335,7 @@
       <w:r>
         <w:t xml:space="preserve"> </w:t>
       </w:r>
-      <w:hyperlink r:id="rId208">
+      <w:hyperlink r:id="rId213">
         <w:r>
           <w:rPr>
             <w:rStyle w:val="Hyperlink"/>
@@ -4896,8 +5347,8 @@
         <w:t xml:space="preserve">.</w:t>
       </w:r>
     </w:p>
-    <w:bookmarkEnd w:id="209"/>
-    <w:bookmarkStart w:id="211" w:name="ref-lipo_madsen_dunnell_hunt_1997"/>
+    <w:bookmarkEnd w:id="214"/>
+    <w:bookmarkStart w:id="216" w:name="ref-lipo_madsen_dunnell_hunt_1997"/>
     <w:p>
       <w:pPr>
         <w:pStyle w:val="Bibliography"/>
@@ -4924,7 +5375,7 @@
       <w:r>
         <w:t xml:space="preserve"> </w:t>
       </w:r>
-      <w:hyperlink r:id="rId210">
+      <w:hyperlink r:id="rId215">
         <w:r>
           <w:rPr>
             <w:rStyle w:val="Hyperlink"/>
@@ -4936,8 +5387,8 @@
         <w:t xml:space="preserve">.</w:t>
       </w:r>
     </w:p>
-    <w:bookmarkEnd w:id="211"/>
-    <w:bookmarkStart w:id="212" w:name="ref-madsen_2012"/>
+    <w:bookmarkEnd w:id="216"/>
+    <w:bookmarkStart w:id="217" w:name="ref-madsen_2012"/>
     <w:p>
       <w:pPr>
         <w:pStyle w:val="Bibliography"/>
@@ -4946,8 +5397,8 @@
         <w:t xml:space="preserve">Madsen, Mark E. 2012. Neutral Cultural Transmission in Time-Averaged Archaeological Assemblages. arXiv preprint arXiv:1204.2043 [physics.soc-ph].</w:t>
       </w:r>
     </w:p>
-    <w:bookmarkEnd w:id="212"/>
-    <w:bookmarkStart w:id="213" w:name="ref-mainfort_1996"/>
+    <w:bookmarkEnd w:id="217"/>
+    <w:bookmarkStart w:id="218" w:name="ref-mainfort_1996"/>
     <w:p>
       <w:pPr>
         <w:pStyle w:val="Bibliography"/>
@@ -4996,8 +5447,8 @@
         <w:t xml:space="preserve">15(2):172–181.</w:t>
       </w:r>
     </w:p>
-    <w:bookmarkEnd w:id="213"/>
-    <w:bookmarkStart w:id="214" w:name="ref-mainfort_2001"/>
+    <w:bookmarkEnd w:id="218"/>
+    <w:bookmarkStart w:id="219" w:name="ref-mainfort_2001"/>
     <w:p>
       <w:pPr>
         <w:pStyle w:val="Bibliography"/>
@@ -5031,8 +5482,8 @@
         <w:t xml:space="preserve">, edited by David S. Brose, C. Wesley Cowan, and Jr. Mainfort Robert C., pp. 173–190. Smithsonian Institution Press, Washington, DC.</w:t>
       </w:r>
     </w:p>
-    <w:bookmarkEnd w:id="214"/>
-    <w:bookmarkStart w:id="215" w:name="ref-mainfort_2003"/>
+    <w:bookmarkEnd w:id="219"/>
+    <w:bookmarkStart w:id="220" w:name="ref-mainfort_2003"/>
     <w:p>
       <w:pPr>
         <w:pStyle w:val="Bibliography"/>
@@ -5069,8 +5520,8 @@
         <w:t xml:space="preserve">22(2):176–184.</w:t>
       </w:r>
     </w:p>
-    <w:bookmarkEnd w:id="215"/>
-    <w:bookmarkStart w:id="216" w:name="ref-mayr_1959"/>
+    <w:bookmarkEnd w:id="220"/>
+    <w:bookmarkStart w:id="221" w:name="ref-mayr_1959"/>
     <w:p>
       <w:pPr>
         <w:pStyle w:val="Bibliography"/>
@@ -5092,8 +5543,8 @@
         <w:t xml:space="preserve">, edited by Betty J. Meggers, pp. 409–412. The Anthropological Society of Washington, Washington, D.C.</w:t>
       </w:r>
     </w:p>
-    <w:bookmarkEnd w:id="216"/>
-    <w:bookmarkStart w:id="217" w:name="ref-mcnutt_1996"/>
+    <w:bookmarkEnd w:id="221"/>
+    <w:bookmarkStart w:id="222" w:name="ref-mcnutt_1996"/>
     <w:p>
       <w:pPr>
         <w:pStyle w:val="Bibliography"/>
@@ -5155,8 +5606,8 @@
         <w:t xml:space="preserve">, edited by Charles H. McNutt, pp. 187–. University of Alabama Press, Tuscaloosa.</w:t>
       </w:r>
     </w:p>
-    <w:bookmarkEnd w:id="217"/>
-    <w:bookmarkStart w:id="218" w:name="ref-mcnutt_franklin_henry_2012"/>
+    <w:bookmarkEnd w:id="222"/>
+    <w:bookmarkStart w:id="223" w:name="ref-mcnutt_franklin_henry_2012"/>
     <w:p>
       <w:pPr>
         <w:pStyle w:val="Bibliography"/>
@@ -5250,8 +5701,8 @@
         <w:t xml:space="preserve">31(2):231–250.</w:t>
       </w:r>
     </w:p>
-    <w:bookmarkEnd w:id="218"/>
-    <w:bookmarkStart w:id="220" w:name="ref-miller_atkins_premo_2018"/>
+    <w:bookmarkEnd w:id="223"/>
+    <w:bookmarkStart w:id="225" w:name="ref-miller_atkins_premo_2018"/>
     <w:p>
       <w:pPr>
         <w:pStyle w:val="Bibliography"/>
@@ -5278,7 +5729,7 @@
       <w:r>
         <w:t xml:space="preserve"> </w:t>
       </w:r>
-      <w:hyperlink r:id="rId219">
+      <w:hyperlink r:id="rId224">
         <w:r>
           <w:rPr>
             <w:rStyle w:val="Hyperlink"/>
@@ -5290,8 +5741,8 @@
         <w:t xml:space="preserve">.</w:t>
       </w:r>
     </w:p>
-    <w:bookmarkEnd w:id="220"/>
-    <w:bookmarkStart w:id="221" w:name="ref-mitchem_2001"/>
+    <w:bookmarkEnd w:id="225"/>
+    <w:bookmarkStart w:id="226" w:name="ref-mitchem_2001"/>
     <w:p>
       <w:pPr>
         <w:pStyle w:val="Bibliography"/>
@@ -5321,8 +5772,8 @@
         <w:t xml:space="preserve">.</w:t>
       </w:r>
     </w:p>
-    <w:bookmarkEnd w:id="221"/>
-    <w:bookmarkStart w:id="222" w:name="ref-mitchem_2017"/>
+    <w:bookmarkEnd w:id="226"/>
+    <w:bookmarkStart w:id="227" w:name="ref-mitchem_2017"/>
     <w:p>
       <w:pPr>
         <w:pStyle w:val="Bibliography"/>
@@ -5373,8 +5824,8 @@
         <w:t xml:space="preserve">’s 1541 Cross.</w:t>
       </w:r>
     </w:p>
-    <w:bookmarkEnd w:id="222"/>
-    <w:bookmarkStart w:id="223" w:name="ref-morse_d_1990"/>
+    <w:bookmarkEnd w:id="227"/>
+    <w:bookmarkStart w:id="228" w:name="ref-morse_d_1990"/>
     <w:p>
       <w:pPr>
         <w:pStyle w:val="Bibliography"/>
@@ -5422,8 +5873,8 @@
         <w:t xml:space="preserve">, edited by David H. Dye and Cheryl Anne Cox, pp. 69–97. University of Alabama Press, Tuscaloosa.</w:t>
       </w:r>
     </w:p>
-    <w:bookmarkEnd w:id="223"/>
-    <w:bookmarkStart w:id="224" w:name="ref-morse_morse_1996"/>
+    <w:bookmarkEnd w:id="228"/>
+    <w:bookmarkStart w:id="229" w:name="ref-morse_morse_1996"/>
     <w:p>
       <w:pPr>
         <w:pStyle w:val="Bibliography"/>
@@ -5460,8 +5911,8 @@
         <w:t xml:space="preserve">17(1):1–35.</w:t>
       </w:r>
     </w:p>
-    <w:bookmarkEnd w:id="224"/>
-    <w:bookmarkStart w:id="225" w:name="ref-morse_p_1981"/>
+    <w:bookmarkEnd w:id="229"/>
+    <w:bookmarkStart w:id="230" w:name="ref-morse_p_1981"/>
     <w:p>
       <w:pPr>
         <w:pStyle w:val="Bibliography"/>
@@ -5532,8 +5983,8 @@
         <w:t xml:space="preserve">. Arkansas Archeological Survey Research Series 13. Arkansas Archeological Survey, Fayetteville.</w:t>
       </w:r>
     </w:p>
-    <w:bookmarkEnd w:id="225"/>
-    <w:bookmarkStart w:id="226" w:name="ref-morse_1990"/>
+    <w:bookmarkEnd w:id="230"/>
+    <w:bookmarkStart w:id="231" w:name="ref-morse_1990"/>
     <w:p>
       <w:pPr>
         <w:pStyle w:val="Bibliography"/>
@@ -5593,8 +6044,8 @@
         <w:t xml:space="preserve">, edited by David H. Dye and Cheryl Anne Cox, pp. 118–134. University of Alabama Press, Tuscaloosa.</w:t>
       </w:r>
     </w:p>
-    <w:bookmarkEnd w:id="226"/>
-    <w:bookmarkStart w:id="228" w:name="ref-nei_1973"/>
+    <w:bookmarkEnd w:id="231"/>
+    <w:bookmarkStart w:id="233" w:name="ref-nei_1973"/>
     <w:p>
       <w:pPr>
         <w:pStyle w:val="Bibliography"/>
@@ -5621,7 +6072,7 @@
       <w:r>
         <w:t xml:space="preserve"> </w:t>
       </w:r>
-      <w:hyperlink r:id="rId227">
+      <w:hyperlink r:id="rId232">
         <w:r>
           <w:rPr>
             <w:rStyle w:val="Hyperlink"/>
@@ -5633,8 +6084,8 @@
         <w:t xml:space="preserve">.</w:t>
       </w:r>
     </w:p>
-    <w:bookmarkEnd w:id="228"/>
-    <w:bookmarkStart w:id="229" w:name="ref-neiman_1995"/>
+    <w:bookmarkEnd w:id="233"/>
+    <w:bookmarkStart w:id="234" w:name="ref-neiman_1995"/>
     <w:p>
       <w:pPr>
         <w:pStyle w:val="Bibliography"/>
@@ -5677,8 +6128,8 @@
         <w:t xml:space="preserve">60(1):7–36.</w:t>
       </w:r>
     </w:p>
-    <w:bookmarkEnd w:id="229"/>
-    <w:bookmarkStart w:id="231" w:name="ref-peebles_kus_1977"/>
+    <w:bookmarkEnd w:id="234"/>
+    <w:bookmarkStart w:id="236" w:name="ref-peebles_kus_1977"/>
     <w:p>
       <w:pPr>
         <w:pStyle w:val="Bibliography"/>
@@ -5705,7 +6156,7 @@
       <w:r>
         <w:t xml:space="preserve"> </w:t>
       </w:r>
-      <w:hyperlink r:id="rId230">
+      <w:hyperlink r:id="rId235">
         <w:r>
           <w:rPr>
             <w:rStyle w:val="Hyperlink"/>
@@ -5717,8 +6168,8 @@
         <w:t xml:space="preserve">.</w:t>
       </w:r>
     </w:p>
-    <w:bookmarkEnd w:id="231"/>
-    <w:bookmarkStart w:id="233" w:name="ref-peeples_schachner_2012"/>
+    <w:bookmarkEnd w:id="236"/>
+    <w:bookmarkStart w:id="238" w:name="ref-peeples_schachner_2012"/>
     <w:p>
       <w:pPr>
         <w:pStyle w:val="Bibliography"/>
@@ -5745,7 +6196,7 @@
       <w:r>
         <w:t xml:space="preserve"> </w:t>
       </w:r>
-      <w:hyperlink r:id="rId232">
+      <w:hyperlink r:id="rId237">
         <w:r>
           <w:rPr>
             <w:rStyle w:val="Hyperlink"/>
@@ -5757,8 +6208,8 @@
         <w:t xml:space="preserve">.</w:t>
       </w:r>
     </w:p>
-    <w:bookmarkEnd w:id="233"/>
-    <w:bookmarkStart w:id="235" w:name="ref-perreault_2018"/>
+    <w:bookmarkEnd w:id="238"/>
+    <w:bookmarkStart w:id="240" w:name="ref-perreault_2018"/>
     <w:p>
       <w:pPr>
         <w:pStyle w:val="Bibliography"/>
@@ -5785,7 +6236,7 @@
       <w:r>
         <w:t xml:space="preserve"> </w:t>
       </w:r>
-      <w:hyperlink r:id="rId234">
+      <w:hyperlink r:id="rId239">
         <w:r>
           <w:rPr>
             <w:rStyle w:val="Hyperlink"/>
@@ -5797,8 +6248,8 @@
         <w:t xml:space="preserve">.</w:t>
       </w:r>
     </w:p>
-    <w:bookmarkEnd w:id="235"/>
-    <w:bookmarkStart w:id="236" w:name="ref-perreault_2019"/>
+    <w:bookmarkEnd w:id="240"/>
+    <w:bookmarkStart w:id="241" w:name="ref-perreault_2019"/>
     <w:p>
       <w:pPr>
         <w:pStyle w:val="Bibliography"/>
@@ -5820,8 +6271,8 @@
         <w:t xml:space="preserve">. University of Chicago Press, Chicago.</w:t>
       </w:r>
     </w:p>
-    <w:bookmarkEnd w:id="236"/>
-    <w:bookmarkStart w:id="237" w:name="ref-phillips_1970"/>
+    <w:bookmarkEnd w:id="241"/>
+    <w:bookmarkStart w:id="242" w:name="ref-phillips_1970"/>
     <w:p>
       <w:pPr>
         <w:pStyle w:val="Bibliography"/>
@@ -5892,8 +6343,8 @@
         <w:t xml:space="preserve">, Vol. 60. Papers of the Peabody Museum of Archaeology and Ethnology. Peabody Museum, Harvard University, Cambridge, MA.</w:t>
       </w:r>
     </w:p>
-    <w:bookmarkEnd w:id="237"/>
-    <w:bookmarkStart w:id="238" w:name="ref-phillips_ford_griffin_1951"/>
+    <w:bookmarkEnd w:id="242"/>
+    <w:bookmarkStart w:id="243" w:name="ref-phillips_ford_griffin_1951"/>
     <w:p>
       <w:pPr>
         <w:pStyle w:val="Bibliography"/>
@@ -5943,8 +6394,8 @@
         <w:t xml:space="preserve">, Vol. 25. Papers of the Peabody Museum of American Archaeology and Ethnology. Peabody Museum, Harvard University, Cambridge, MA.</w:t>
       </w:r>
     </w:p>
-    <w:bookmarkEnd w:id="238"/>
-    <w:bookmarkStart w:id="240" w:name="ref-phillips_willey_1953"/>
+    <w:bookmarkEnd w:id="243"/>
+    <w:bookmarkStart w:id="245" w:name="ref-phillips_willey_1953"/>
     <w:p>
       <w:pPr>
         <w:pStyle w:val="Bibliography"/>
@@ -5971,7 +6422,7 @@
       <w:r>
         <w:t xml:space="preserve"> </w:t>
       </w:r>
-      <w:hyperlink r:id="rId239">
+      <w:hyperlink r:id="rId244">
         <w:r>
           <w:rPr>
             <w:rStyle w:val="Hyperlink"/>
@@ -5983,8 +6434,8 @@
         <w:t xml:space="preserve">.</w:t>
       </w:r>
     </w:p>
-    <w:bookmarkEnd w:id="240"/>
-    <w:bookmarkStart w:id="242" w:name="ref-premo_2016"/>
+    <w:bookmarkEnd w:id="245"/>
+    <w:bookmarkStart w:id="247" w:name="ref-premo_2016"/>
     <w:p>
       <w:pPr>
         <w:pStyle w:val="Bibliography"/>
@@ -6011,7 +6462,7 @@
       <w:r>
         <w:t xml:space="preserve"> </w:t>
       </w:r>
-      <w:hyperlink r:id="rId241">
+      <w:hyperlink r:id="rId246">
         <w:r>
           <w:rPr>
             <w:rStyle w:val="Hyperlink"/>
@@ -6023,8 +6474,8 @@
         <w:t xml:space="preserve">.</w:t>
       </w:r>
     </w:p>
-    <w:bookmarkEnd w:id="242"/>
-    <w:bookmarkStart w:id="244" w:name="ref-premo_scholnick_2011"/>
+    <w:bookmarkEnd w:id="247"/>
+    <w:bookmarkStart w:id="249" w:name="ref-premo_scholnick_2011"/>
     <w:p>
       <w:pPr>
         <w:pStyle w:val="Bibliography"/>
@@ -6051,7 +6502,7 @@
       <w:r>
         <w:t xml:space="preserve"> </w:t>
       </w:r>
-      <w:hyperlink r:id="rId243">
+      <w:hyperlink r:id="rId248">
         <w:r>
           <w:rPr>
             <w:rStyle w:val="Hyperlink"/>
@@ -6063,8 +6514,8 @@
         <w:t xml:space="preserve">.</w:t>
       </w:r>
     </w:p>
-    <w:bookmarkEnd w:id="244"/>
-    <w:bookmarkStart w:id="245" w:name="ref-rees_political_culture"/>
+    <w:bookmarkEnd w:id="249"/>
+    <w:bookmarkStart w:id="250" w:name="ref-rees_political_culture"/>
     <w:p>
       <w:pPr>
         <w:pStyle w:val="Bibliography"/>
@@ -6088,8 +6539,8 @@
         <w:t xml:space="preserve">. Ph.D. dissertation, University of Oklahoma, Norman.</w:t>
       </w:r>
     </w:p>
-    <w:bookmarkEnd w:id="245"/>
-    <w:bookmarkStart w:id="247" w:name="ref-reimer_etal_2020"/>
+    <w:bookmarkEnd w:id="250"/>
+    <w:bookmarkStart w:id="252" w:name="ref-reimer_etal_2020"/>
     <w:p>
       <w:pPr>
         <w:pStyle w:val="Bibliography"/>
@@ -6143,7 +6594,7 @@
       <w:r>
         <w:t xml:space="preserve"> </w:t>
       </w:r>
-      <w:hyperlink r:id="rId246">
+      <w:hyperlink r:id="rId251">
         <w:r>
           <w:rPr>
             <w:rStyle w:val="Hyperlink"/>
@@ -6155,8 +6606,8 @@
         <w:t xml:space="preserve">.</w:t>
       </w:r>
     </w:p>
-    <w:bookmarkEnd w:id="247"/>
-    <w:bookmarkStart w:id="248" w:name="ref-robinson_1951"/>
+    <w:bookmarkEnd w:id="252"/>
+    <w:bookmarkStart w:id="253" w:name="ref-robinson_1951"/>
     <w:p>
       <w:pPr>
         <w:pStyle w:val="Bibliography"/>
@@ -6181,8 +6632,8 @@
         <w:t xml:space="preserve">16(4):293–301.</w:t>
       </w:r>
     </w:p>
-    <w:bookmarkEnd w:id="248"/>
-    <w:bookmarkStart w:id="249" w:name="ref-ross-stallings_2017"/>
+    <w:bookmarkEnd w:id="253"/>
+    <w:bookmarkStart w:id="254" w:name="ref-ross-stallings_2017"/>
     <w:p>
       <w:pPr>
         <w:pStyle w:val="Bibliography"/>
@@ -6216,8 +6667,8 @@
         <w:t xml:space="preserve">, edited by Haagen D. Klaus, Amanda R. Harvey, and Mark N. Cohen, pp. 329–362. University Press of Florida, Gainesville.</w:t>
       </w:r>
     </w:p>
-    <w:bookmarkEnd w:id="249"/>
-    <w:bookmarkStart w:id="250" w:name="ref-schiffer_1972"/>
+    <w:bookmarkEnd w:id="254"/>
+    <w:bookmarkStart w:id="255" w:name="ref-schiffer_1972"/>
     <w:p>
       <w:pPr>
         <w:pStyle w:val="Bibliography"/>
@@ -6242,8 +6693,8 @@
         <w:t xml:space="preserve">37(2):156–165.</w:t>
       </w:r>
     </w:p>
-    <w:bookmarkEnd w:id="250"/>
-    <w:bookmarkStart w:id="252" w:name="ref-schneider_martins_deaguiar_2016"/>
+    <w:bookmarkEnd w:id="255"/>
+    <w:bookmarkStart w:id="257" w:name="ref-schneider_martins_deaguiar_2016"/>
     <w:p>
       <w:pPr>
         <w:pStyle w:val="Bibliography"/>
@@ -6270,7 +6721,7 @@
       <w:r>
         <w:t xml:space="preserve"> </w:t>
       </w:r>
-      <w:hyperlink r:id="rId251">
+      <w:hyperlink r:id="rId256">
         <w:r>
           <w:rPr>
             <w:rStyle w:val="Hyperlink"/>
@@ -6282,8 +6733,8 @@
         <w:t xml:space="preserve">.</w:t>
       </w:r>
     </w:p>
-    <w:bookmarkEnd w:id="252"/>
-    <w:bookmarkStart w:id="254" w:name="ref-shennan_crema_kerig_2015"/>
+    <w:bookmarkEnd w:id="257"/>
+    <w:bookmarkStart w:id="259" w:name="ref-shennan_crema_kerig_2015"/>
     <w:p>
       <w:pPr>
         <w:pStyle w:val="Bibliography"/>
@@ -6349,7 +6800,7 @@
       <w:r>
         <w:t xml:space="preserve"> </w:t>
       </w:r>
-      <w:hyperlink r:id="rId253">
+      <w:hyperlink r:id="rId258">
         <w:r>
           <w:rPr>
             <w:rStyle w:val="Hyperlink"/>
@@ -6361,8 +6812,8 @@
         <w:t xml:space="preserve">.</w:t>
       </w:r>
     </w:p>
-    <w:bookmarkEnd w:id="254"/>
-    <w:bookmarkStart w:id="255" w:name="ref-shennan_wilkinson_2001"/>
+    <w:bookmarkEnd w:id="259"/>
+    <w:bookmarkStart w:id="260" w:name="ref-shennan_wilkinson_2001"/>
     <w:p>
       <w:pPr>
         <w:pStyle w:val="Bibliography"/>
@@ -6402,8 +6853,8 @@
         <w:t xml:space="preserve">66(4):577–593.</w:t>
       </w:r>
     </w:p>
-    <w:bookmarkEnd w:id="255"/>
-    <w:bookmarkStart w:id="256" w:name="ref-smith_1990"/>
+    <w:bookmarkEnd w:id="260"/>
+    <w:bookmarkStart w:id="261" w:name="ref-smith_1990"/>
     <w:p>
       <w:pPr>
         <w:pStyle w:val="Bibliography"/>
@@ -6451,8 +6902,8 @@
         <w:t xml:space="preserve">, edited by David H. Dye and Cheryl Anne Cox, pp. 135–169. University of Alabama Press, Tuscaloosa.</w:t>
       </w:r>
     </w:p>
-    <w:bookmarkEnd w:id="256"/>
-    <w:bookmarkStart w:id="257" w:name="ref-smith_neiman_2007"/>
+    <w:bookmarkEnd w:id="261"/>
+    <w:bookmarkStart w:id="262" w:name="ref-smith_neiman_2007"/>
     <w:p>
       <w:pPr>
         <w:pStyle w:val="Bibliography"/>
@@ -6477,8 +6928,8 @@
         <w:t xml:space="preserve">26(1):47–72.</w:t>
       </w:r>
     </w:p>
-    <w:bookmarkEnd w:id="257"/>
-    <w:bookmarkStart w:id="258" w:name="ref-starr_1984"/>
+    <w:bookmarkEnd w:id="262"/>
+    <w:bookmarkStart w:id="263" w:name="ref-starr_1984"/>
     <w:p>
       <w:pPr>
         <w:pStyle w:val="Bibliography"/>
@@ -6659,8 +7110,8 @@
         <w:t xml:space="preserve">, edited by John M. Connaway, pp. 163–222. Archaeological Report No. 14. Mississippi Department of Archives; History, Jackson, MS.</w:t>
       </w:r>
     </w:p>
-    <w:bookmarkEnd w:id="258"/>
-    <w:bookmarkStart w:id="259" w:name="ref-tomasovych_kidwell_2009"/>
+    <w:bookmarkEnd w:id="263"/>
+    <w:bookmarkStart w:id="264" w:name="ref-tomasovych_kidwell_2009"/>
     <w:p>
       <w:pPr>
         <w:pStyle w:val="Bibliography"/>
@@ -6685,8 +7136,8 @@
         <w:t xml:space="preserve">35(1):94–118.</w:t>
       </w:r>
     </w:p>
-    <w:bookmarkEnd w:id="259"/>
-    <w:bookmarkStart w:id="260" w:name="ref-willey_phillips_1958"/>
+    <w:bookmarkEnd w:id="264"/>
+    <w:bookmarkStart w:id="265" w:name="ref-willey_phillips_1958"/>
     <w:p>
       <w:pPr>
         <w:pStyle w:val="Bibliography"/>
@@ -6708,8 +7159,8 @@
         <w:t xml:space="preserve">. University of Chicago Press, Chicago.</w:t>
       </w:r>
     </w:p>
-    <w:bookmarkEnd w:id="260"/>
-    <w:bookmarkStart w:id="261" w:name="ref-williams_1954"/>
+    <w:bookmarkEnd w:id="265"/>
+    <w:bookmarkStart w:id="266" w:name="ref-williams_1954"/>
     <w:p>
       <w:pPr>
         <w:pStyle w:val="Bibliography"/>
@@ -6718,8 +7169,8 @@
         <w:t xml:space="preserve">Williams, Stephen. 1954. An Archeological Study of the Mississippian Culture in Southeast Missouri. PhD thesis, Yale University, New Haven.</w:t>
       </w:r>
     </w:p>
-    <w:bookmarkEnd w:id="261"/>
-    <w:bookmarkStart w:id="263" w:name="ref-wright_1943"/>
+    <w:bookmarkEnd w:id="266"/>
+    <w:bookmarkStart w:id="268" w:name="ref-wright_1943"/>
     <w:p>
       <w:pPr>
         <w:pStyle w:val="Bibliography"/>
@@ -6746,7 +7197,7 @@
       <w:r>
         <w:t xml:space="preserve"> </w:t>
       </w:r>
-      <w:hyperlink r:id="rId262">
+      <w:hyperlink r:id="rId267">
         <w:r>
           <w:rPr>
             <w:rStyle w:val="Hyperlink"/>
@@ -6758,8 +7209,8 @@
         <w:t xml:space="preserve">.</w:t>
       </w:r>
     </w:p>
-    <w:bookmarkEnd w:id="263"/>
-    <w:bookmarkStart w:id="265" w:name="ref-wright_1951"/>
+    <w:bookmarkEnd w:id="268"/>
+    <w:bookmarkStart w:id="270" w:name="ref-wright_1951"/>
     <w:p>
       <w:pPr>
         <w:pStyle w:val="Bibliography"/>
@@ -6786,7 +7237,7 @@
       <w:r>
         <w:t xml:space="preserve"> </w:t>
       </w:r>
-      <w:hyperlink r:id="rId264">
+      <w:hyperlink r:id="rId269">
         <w:r>
           <w:rPr>
             <w:rStyle w:val="Hyperlink"/>
@@ -6798,8 +7249,8 @@
         <w:t xml:space="preserve">.</w:t>
       </w:r>
     </w:p>
-    <w:bookmarkEnd w:id="265"/>
-    <w:bookmarkStart w:id="267" w:name="ref-youngblood_miton_morin_2023"/>
+    <w:bookmarkEnd w:id="270"/>
+    <w:bookmarkStart w:id="272" w:name="ref-youngblood_miton_morin_2023"/>
     <w:p>
       <w:pPr>
         <w:pStyle w:val="Bibliography"/>
@@ -6826,7 +7277,7 @@
       <w:r>
         <w:t xml:space="preserve"> </w:t>
       </w:r>
-      <w:hyperlink r:id="rId266">
+      <w:hyperlink r:id="rId271">
         <w:r>
           <w:rPr>
             <w:rStyle w:val="Hyperlink"/>
@@ -6838,10 +7289,10 @@
         <w:t xml:space="preserve">.</w:t>
       </w:r>
     </w:p>
-    <w:bookmarkEnd w:id="267"/>
-    <w:bookmarkEnd w:id="268"/>
-    <w:bookmarkEnd w:id="269"/>
-    <w:bookmarkEnd w:id="270"/>
+    <w:bookmarkEnd w:id="272"/>
+    <w:bookmarkEnd w:id="273"/>
+    <w:bookmarkEnd w:id="274"/>
+    <w:bookmarkEnd w:id="275"/>
     <w:sectPr>
       <w:footerReference r:id="rId100" w:type="default"/>
       <w:footnotePr>

</xml_diff>

<commit_message>
Refresh from mls-emergence 7bd1b93: drop the southeast-Missouri section from the supplement
Carries the author's 2026-09-30 wording edits to both manuscripts, the
supplement without its attempted southeast-Missouri extension, Figure S7
redrawn with the basin panel only, and the sync script that now keeps the
review log private.

Co-Authored-By: Claude Fable 5.1 <noreply@anthropic.com>
</commit_message>
<xml_diff>
--- a/docs/manuscript/MAIN_TEXT.docx
+++ b/docs/manuscript/MAIN_TEXT.docx
@@ -37,7 +37,7 @@
         <w:pStyle w:val="FirstParagraph"/>
       </w:pPr>
       <w:r>
-        <w:t xml:space="preserve">Traditionally, archaeologists group assemblages into phases and assign them community or polity status. Earlier studies have shown that the phases of the Lower Mississippi River Valley do not separate cleanly, but they have not explained what produces their apparent organization. We explain phases using cultural transmission theory in which potters copy near neighbors more than distant ones. Neutral drift makes nearby assemblages alike whether or not groups exist. Settlement is clumped, and a smooth gradient sampled at clumps and sorted by resemblance and proximity looks like a set of groups. We present a method for determining whether a phase marks a restriction on the copying of decorated pottery. In such cases, the frequencies of artifact classes show what distance-limited copying does not produce: learning concentrated inside and divergence across its edge. We test this on the decorated-type frequencies of the Late Mississippian St. Francis basin in northeastern Arkansas, including the Parkin phase, long read as a polity. The site map alone recovers the phases; alternative spatial divisions of the same sites capture as much or more of the ceramic differentiation, and sherd frequencies simulated with no groups sort into the phases as readily as the real assemblages. The Parkin phase differs from the rest of the basin no more than arbitrary divisions of the map. The frequencies of assemblage types vary over shorter distances than a copying model predicts, but that variation does not follow phase borders. Phases therefore do not uniquely capture the basin’s ceramic differentiation, and spatially structured copying plausibly accounts for their apparent organization. The results do not exclude a Parkin polity, since political boundaries need not coincide with ceramic traditions.</w:t>
+        <w:t xml:space="preserve">Traditionally, archaeologists group assemblages into phases and assign them community or polity status. Earlier studies have shown that the phases of the Lower Mississippi River Valley do not separate cleanly, but they have not explained what produces their apparent organization. We explain phases using cultural transmission theory in which potters copy near neighbors more than distant ones. Neutral drift makes nearby assemblages alike whether or not groups exist. Settlement is clumped, and a smooth gradient sampled at clumps and sorted by resemblance and proximity looks like a set of groups. We present a method for determining whether a phase restricts copying of variability in decorated pottery. In such cases, the frequencies of artifact classes show what distance-limited copying does not produce: learning concentrated inside and divergence across its edge. We test our method on the decorated-type frequencies of the Late Mississippian St. Francis basin in northeastern Arkansas, including the Parkin phase, long read as a polity. The site map alone can reproduce the phases. Alternative spatial divisions of the same sites capture as much or more ceramic type differentiation, and sherd frequencies simulated with no groups sort into the phases as readily as the real assemblages. The Parkin phase differs from the rest of the basin no more than arbitrary divisions of the map. The frequencies of assemblage types vary over shorter distances than a copying model predicts, but that variation does not follow phase borders. Phases therefore do not uniquely capture the basin’s ceramic differentiation, and spatially structured copying plausibly accounts for their apparent organization. The results do not exclude a Parkin polity, however, since political boundaries need not coincide with ceramic traditions.</w:t>
       </w:r>
     </w:p>
     <w:p>
@@ -109,7 +109,7 @@
         <w:pStyle w:val="FirstParagraph"/>
       </w:pPr>
       <w:r>
-        <w:t xml:space="preserve">Archaeologists have divided the late pre-contact record of the Lower Mississippi River Valley into spatially and temporally bounded units known as phases (Figure 1). These include the Kent</w:t>
+        <w:t xml:space="preserve">Archaeologists have traditionally divided the late pre-contact record of the Lower Mississippi River Valley into spatially and temporally bounded units known as phases (Figure 1). These include the Kent</w:t>
       </w:r>
       <w:r>
         <w:t xml:space="preserve"> </w:t>
@@ -184,7 +184,7 @@
         <w:t xml:space="preserve">(Hudson et al. 1990; Mitchem et al. 2017; Phyllis A. Morse 1990:125–129)</w:t>
       </w:r>
       <w:r>
-        <w:t xml:space="preserve">. Because of its size, fortification, platform mound, and ethnohistoric identification, Parkin is routinely read as the center of a Mississippian polity, following the long-standing expectation that a ranked society leaves a hierarchy of settlement types and sizes with its center at the top</w:t>
+        <w:t xml:space="preserve">. Because of its size, fortification, platform mound, and ethnohistoric identification, Parkin is routinely interpreted as the center of a Mississippian polity, following the long-standing expectation that a ranked society leaves a hierarchy of settlement types and sizes with its center at the top</w:t>
       </w:r>
       <w:r>
         <w:t xml:space="preserve"> </w:t>
@@ -193,7 +193,7 @@
         <w:t xml:space="preserve">(Peebles and Kus 1977:431)</w:t>
       </w:r>
       <w:r>
-        <w:t xml:space="preserve">. That reading makes a specific claim: the Parkin phase was a bounded, hierarchically organized society with Parkin at its head.</w:t>
+        <w:t xml:space="preserve">. This interpretation claims that the Parkin phase was a bounded, hierarchically organized society with the Parkin site at its head.</w:t>
       </w:r>
     </w:p>
     <w:p>
@@ -287,7 +287,7 @@
         <w:pStyle w:val="BodyText"/>
       </w:pPr>
       <w:r>
-        <w:t xml:space="preserve">A phase is a culture-history construct in which a set of assemblages are grouped together because their decorated-class frequencies seriate, meaning they can be placed in one sequence of gradually changing frequencies, and because the sites lie near one another. In the Willey-Phillips framework, the phase is</w:t>
+        <w:t xml:space="preserve">A phase is a culture-history construct in which a set of assemblages are grouped together because their decorated-class frequencies seriate. This property means they can be placed in one sequence of gradually changing frequencies, and because the sites lie near one another. In the Willey-Phillips framework, the phase is</w:t>
       </w:r>
       <w:r>
         <w:t xml:space="preserve"> </w:t>
@@ -418,10 +418,7 @@
         <w:t xml:space="preserve">(1998)</w:t>
       </w:r>
       <w:r>
-        <w:t xml:space="preserve"> </w:t>
-      </w:r>
-      <w:r>
-        <w:t xml:space="preserve">used cluster analysis and ordination to show that the southeast-Missouri phases fail as both groups and classes, with member assemblages falling into statistical clusters at random rather than by phase. Mainfort</w:t>
+        <w:t xml:space="preserve">, for example, used cluster analysis and ordination to show that the southeast-Missouri phases fail as both groups and classes, with member assemblages falling into statistical clusters at random rather than by phase. Mainfort</w:t>
       </w:r>
       <w:r>
         <w:t xml:space="preserve"> </w:t>
@@ -433,7 +430,7 @@
         <w:t xml:space="preserve"> </w:t>
       </w:r>
       <w:r>
-        <w:t xml:space="preserve">put the same question to the assemblages of the Lower Mississippi Valley, ordinating ten decorated types from 39 sites and finding</w:t>
+        <w:t xml:space="preserve">addressed the same issue for the assemblages of the Lower Mississippi Valley. He used an ordination approach to sort ten decorated types from 39 sites and found</w:t>
       </w:r>
       <w:r>
         <w:t xml:space="preserve"> </w:t>
@@ -487,7 +484,7 @@
         <w:t xml:space="preserve">(Lipo 2001:60)</w:t>
       </w:r>
       <w:r>
-        <w:t xml:space="preserve">. These studies show that the phases do not separate cleanly. None of them explains what the phases are, or why they looked real to the people who drew them. Ordination methods alone cannot explain these units because loosely clustered assemblages could arise from both bounded groups and unbounded copying across distance.</w:t>
+        <w:t xml:space="preserve">. These studies show that the phases do not separate cleanly. None of these investigations, however, explains what the phases are, or why they looked real to the people who drew them. Ordination methods alone cannot explain these units because loosely clustered assemblages can arise from both bounded groups and unbounded copying across distance.</w:t>
       </w:r>
     </w:p>
     <w:p>
@@ -495,7 +492,7 @@
         <w:pStyle w:val="BodyText"/>
       </w:pPr>
       <w:r>
-        <w:t xml:space="preserve">This paper offers and tests that explanation. We ask two questions. First, what explains the phases? We argue that they can follow from how people learn. Potters copy near neighbors more than distant ones, settlements clump, and a smooth gradient in style sampled at those clumps looks like groups. Second, does the Parkin phase, the one most often treated as a polity, show anything in its decorated-type frequencies that sets it apart? Both questions turn on the same test. Copying across space produces spatial structure in stylistic frequencies whatever else is happening, so a phase marks a restriction on the copying of decorated pottery only if its class frequencies show properties that spatially structured drift does not produce. This test is narrower than the question of whether a society or polity existed. Political affiliation need not coincide with a ceramic tradition, so what the pottery can show is whether learning was bounded where the phase lines fall, not whether people were politically organized.</w:t>
+        <w:t xml:space="preserve">This paper offers and tests an explanation. We ask two questions. First, what explains the phases? We argue that they can follow from how people learn. Potters copy near neighbors more than distant ones, settlements clump, and a smooth gradient in style sampled at those clumps looks like groups. Second, does the Parkin phase, the one unit most often treated as a polity, show anything in its decorated-type frequencies that sets it apart? Both questions can be investigated using the same test. Copying across space produces spatial structure in stylistic frequencies regardless of whatever else is happening. A phase, then, should be identifiable as a restriction on the copying of decorated pottery if its class frequencies show properties that spatially structured drift does not produce. This test is more restrictive than asking whether a society or polity existed. Political affiliation, of course, need not coincide with a ceramic tradition, but ceramics offer empirical evidence in the archaeological record about how social learning was structured. However, pottery can show only whether learning was bounded where the phase lines fall, not whether people were politically organized.</w:t>
       </w:r>
     </w:p>
     <w:p>
@@ -503,7 +500,7 @@
         <w:pStyle w:val="BodyText"/>
       </w:pPr>
       <w:r>
-        <w:t xml:space="preserve">We proceed in two steps, and the order matters. Our primary test concerns the inherited scheme, the phases as Phillips</w:t>
+        <w:t xml:space="preserve">We proceed in two steps. Our primary test concerns the phases as Phillips</w:t>
       </w:r>
       <w:r>
         <w:t xml:space="preserve"> </w:t>
@@ -515,19 +512,7 @@
         <w:t xml:space="preserve"> </w:t>
       </w:r>
       <w:r>
-        <w:t xml:space="preserve">formulated them and Mainfort</w:t>
-      </w:r>
-      <w:r>
-        <w:t xml:space="preserve"> </w:t>
-      </w:r>
-      <w:r>
-        <w:t xml:space="preserve">(1996)</w:t>
-      </w:r>
-      <w:r>
-        <w:t xml:space="preserve"> </w:t>
-      </w:r>
-      <w:r>
-        <w:t xml:space="preserve">mapped them, because that scheme is the one that has been read as a set of societies and because it was drawn by inspection and proximity. We then turn to the phases that Mainfort</w:t>
+        <w:t xml:space="preserve">formulated in the Lower Mississippi River Valley using assemblage similarity and spatial positions. We then turn to the phases that Mainfort</w:t>
       </w:r>
       <w:r>
         <w:t xml:space="preserve"> </w:t>
@@ -539,7 +524,7 @@
         <w:t xml:space="preserve"> </w:t>
       </w:r>
       <w:r>
-        <w:t xml:space="preserve">redrew after ordinating the decorated types of largely the same collections. That scheme cannot carry the primary test, since lines drawn from the pottery will separate the pottery whether or not they mark bounded groups. It serves instead as a contrast: it shows what the same tests return when phase lines follow the assemblages rather than the map.</w:t>
+        <w:t xml:space="preserve">redrew after ordinating the decorated types of largely the same collections. We use this second analysis to show what the same tests return when phase lines are formulated following the assemblage composition rather than the map.</w:t>
       </w:r>
     </w:p>
     <w:p>
@@ -592,7 +577,7 @@
         <w:pStyle w:val="FirstParagraph"/>
       </w:pPr>
       <w:r>
-        <w:t xml:space="preserve">The explanation rests on the theory of cultural transmission, and it is simple. Potters learned how to decorate pots from others, and the decorations they made reflect who they learned from. Under the neutral model of cultural transmission, decorative variants that make no difference to how a pot performs change in frequency through innovation and chance copying in a finite population of learners, much as selectively neutral alleles do</w:t>
+        <w:t xml:space="preserve">Our method is built on cultural transmission theory, and it is simple. Potters learned how to decorate pots from others, and the decorations they made reflect who they learned from. Under the neutral model of cultural transmission, decorative variants that make no difference to how a pot performs change in frequency through innovation and chance copying in a finite population of learners, much as selectively neutral alleles do</w:t>
       </w:r>
       <w:r>
         <w:t xml:space="preserve"> </w:t>
@@ -628,7 +613,7 @@
         <w:t xml:space="preserve">(Wright 1943)</w:t>
       </w:r>
       <w:r>
-        <w:t xml:space="preserve">, and it has long been expected of stylistic frequencies</w:t>
+        <w:t xml:space="preserve">, and it has long been noted to drive stylistic frequencies</w:t>
       </w:r>
       <w:r>
         <w:t xml:space="preserve"> </w:t>
@@ -664,7 +649,7 @@
         <w:t xml:space="preserve"> </w:t>
       </w:r>
       <w:r>
-        <w:t xml:space="preserve">People did not live evenly across the basin. Sites concentrate on particular reaches of the basin’s rivers, with less-occupied stretches between them. The smooth gradient in style is therefore sampled unevenly, densely in some places and sparsely or not at all in others.</w:t>
+        <w:t xml:space="preserve">People did not live evenly across the basin. Sites concentrate on particular reaches of the basin’s rivers, with less-occupied stretches of land between them. The smooth gradient in style is therefore sampled unevenly, densely in some places and sparsely or not at all in others.</w:t>
       </w:r>
     </w:p>
     <w:p>
@@ -700,7 +685,7 @@
         <w:t xml:space="preserve">(Dunnell 1980; Mayr 1959)</w:t>
       </w:r>
       <w:r>
-        <w:t xml:space="preserve">. Read typologically, a cluster of similar assemblages is a unit with members and an edge. Read as a population, it is a place where a continuous field of copying happened to be sampled.</w:t>
+        <w:t xml:space="preserve">. Interpreted typologically, a cluster of similar assemblages is a unit with members and an edge. Interpreted as a population, it is a place where a continuous field of copying happened to be sampled.</w:t>
       </w:r>
     </w:p>
     <w:p>
@@ -727,7 +712,7 @@
         <w:t xml:space="preserve">(Crema et al. 2016; Henrich 2001; Henrich and Boyd 1998)</w:t>
       </w:r>
       <w:r>
-        <w:t xml:space="preserve">. Divergence that grows as interaction narrows would be a further sign, but this record’s chronology is not suited for testing this possibility (Supplemental Text). Each of these possibilities has to be judged against copying with no groups on the real geography, not against zero, and against other lines drawn across the same map, because any line cut through a gradient separates some difference.</w:t>
+        <w:t xml:space="preserve">. Divergence that grows as interaction narrows would be a further sign, but the lack of a detailed chronological record for these deposits makes the record not well-suited for testing this possibility (Supplemental Text). Each of these possibilities has to be evaluated against a model of copying with no groups on the real geography, not against zero, and against other lines drawn across the same map, because any line cut through a gradient separates some difference.</w:t>
       </w:r>
     </w:p>
     <w:p>
@@ -735,7 +720,7 @@
         <w:pStyle w:val="BodyText"/>
       </w:pPr>
       <w:r>
-        <w:t xml:space="preserve">These expectations give the Parkin phase a clear test. If the Parkin phase was a polity whose members learned from, married into, and exchanged with one another more than with outsiders, its assemblage composition should stand apart from the rest of the basin by more than copying across distance produces. Assemblages should be more distinctive than what an arbitrary line drawn across the same sites separates. Empirically, there should be a step in similarity at its edge that other lines do not show. Alternative models of late pre-contact valley populations do not require these attributes. The alternative finding is that the polities in this part of the valley never achieved regional integration</w:t>
+        <w:t xml:space="preserve">These expectations provide functional means to evaluate the Parkin phase. If the Parkin phase was a polity whose members learned from, married into, and exchanged with one another more than with outsiders, its assemblage composition should stand apart from the rest of the basin by more than copying across distance produces. Assemblages should be more distinctive than what an arbitrary line drawn across the same sites separates. Empirically, there should be a step in similarity at its edge that other delineations do not show. Alternative models of late pre-contact valley populations do not require these attributes. The alternative finding is that the polities in this part of the valley never achieved regional integration</w:t>
       </w:r>
       <w:r>
         <w:t xml:space="preserve"> </w:t>
@@ -762,7 +747,7 @@
         <w:t xml:space="preserve">(Hudson et al. 1990; Mitchem 2001; Phyllis A. Morse 1990)</w:t>
       </w:r>
       <w:r>
-        <w:t xml:space="preserve">. Settlement form cannot decide between these readings, because a large center with a palisade and a platform mound is as compatible with competing peer communities as with a consolidated hierarchy</w:t>
+        <w:t xml:space="preserve">. Settlement form cannot decide between these interpretations, because a large center with a palisade and a platform mound is as compatible with competing peer communities as with a consolidated hierarchy</w:t>
       </w:r>
       <w:r>
         <w:t xml:space="preserve"> </w:t>
@@ -798,19 +783,7 @@
         <w:pStyle w:val="FirstParagraph"/>
       </w:pPr>
       <w:r>
-        <w:t xml:space="preserve">In this study, we test the phase assignments Mainfort</w:t>
-      </w:r>
-      <w:r>
-        <w:t xml:space="preserve"> </w:t>
-      </w:r>
-      <w:r>
-        <w:t xml:space="preserve">(1996)</w:t>
-      </w:r>
-      <w:r>
-        <w:t xml:space="preserve"> </w:t>
-      </w:r>
-      <w:r>
-        <w:t xml:space="preserve">presents, which largely follow Phillips</w:t>
+        <w:t xml:space="preserve">In this study, we test the phase assignments defined by Phillips</w:t>
       </w:r>
       <w:r>
         <w:t xml:space="preserve"> </w:t>
@@ -846,16 +819,16 @@
         <w:t xml:space="preserve">(Dunnell 1978; Neiman 1995)</w:t>
       </w:r>
       <w:r>
-        <w:t xml:space="preserve">. Plain wares track vessel function, paste, and site activities, none of which a copying model represents. Combining the frequency of plain and decorated classes also mixes factors driving relative investment in decorated ceramics, which social learning and copying do not simply drive. Mississippi Plain and Bell Plain make up 87 percent of the typed sherds in the one published table for the region that reports them</w:t>
-      </w:r>
-      <w:r>
-        <w:t xml:space="preserve"> </w:t>
-      </w:r>
-      <w:r>
-        <w:t xml:space="preserve">(Mainfort 2003)</w:t>
-      </w:r>
-      <w:r>
-        <w:t xml:space="preserve">. Ten decorated classes remain, one pooling Barton Incised, Kent Incised, and Mound Place Incised, and one pooling the painted types Old Town Red, Nodena Red and White, and Avenue Polychrome. Each class is a culture-history type, a unit of measurement built by analysts, not a category assumed to have existed in the past.</w:t>
+        <w:t xml:space="preserve">. Plain wares track vessel function, paste, and site activities, none of which a copying model represents. Combining the frequency of plain and decorated classes also mixes factors driving relative investment in decorating ceramics, a process driven by factors beyond social learning and copying. Mississippi Plain and Bell Plain make up ca. 87 percent of the typed sherds. Ten decorated classes remain. Following Lipo</w:t>
+      </w:r>
+      <w:r>
+        <w:t xml:space="preserve"> </w:t>
+      </w:r>
+      <w:r>
+        <w:t xml:space="preserve">(2001)</w:t>
+      </w:r>
+      <w:r>
+        <w:t xml:space="preserve">, to increase sample sizes and to ensure consistent identification, we pool sherds from Barton Incised, Kent Incised, and Mound Place Incised. We also pool the painted types Old Town Red, Nodena Red and White, and Avenue Polychrome. Each class is a culture-history type, a unit of measurement built by analysts, not a category assumed to have existed in the past.</w:t>
       </w:r>
     </w:p>
     <w:p>
@@ -1339,7 +1312,7 @@
         <w:t xml:space="preserve">k</w:t>
       </w:r>
       <w:r>
-        <w:t xml:space="preserve">-means on the assemblage coordinates. The site layout is best described by two clusters, as indicated by the silhouette score, which rewards compact, well-separated clusters. Because cultural</w:t>
+        <w:t xml:space="preserve">-means on the assemblage coordinates. The site layout is best described by two clusters, as the silhouette score indicates, which rewards compact, well-separated clusters. Because cultural</w:t>
       </w:r>
       <w:r>
         <w:t xml:space="preserve"> </w:t>
@@ -1565,7 +1538,7 @@
         <w:t xml:space="preserve"> </w:t>
       </w:r>
       <w:r>
-        <w:t xml:space="preserve">and 500 times for the slower boundary excess, and recomputing a statistic on each draw gives that statistic’s posterior distribution. We report its median and a 95 percent credible interval (the 2.5th to 97.5th percentiles of the draws); given the counts and the prior, the quantity lies in that interval with probability 0.95. When the phase lines are compared with alternative divisions, each draw is scored against 20 alternatives of each kind (10 for the boundary excess) chosen at random from 300, and the posterior probability that the phase lines separate the pottery better is the share of all these comparisons they win. A probability of 0.20 therefore means that, allowing for sampling error in every assemblage, the phase lines beat a randomly chosen alternative in one comparison in five. Where a probability or a share rounds to zero, we give the number of comparisons or runs behind it, since the true value is then known only to be smaller than that resolution.</w:t>
+        <w:t xml:space="preserve">and 500 times for the slower boundary excess, and recomputing a statistic on each draw gives that statistic’s posterior distribution. We report its median and a 95 percent credible interval (the 2.5th to 97.5th percentiles of the draws); given the counts and the prior, the quantity lies in that interval with probability 0.95. When the phase lines are compared with alternative divisions, each draw is scored against 20 alternatives of each kind (10 for the boundary excess) chosen at random from 300, and the posterior probability that the phase lines separate the assemblages better is the share of all these comparisons they win. A probability of 0.20 therefore means that, allowing for sampling error in every assemblage, the phase lines beat a randomly chosen alternative in one comparison in five. Where a probability or a share rounds to zero, we give the number of comparisons or runs behind it, since the true value is then known only to be smaller than that resolution.</w:t>
       </w:r>
     </w:p>
     <w:p>
@@ -1678,7 +1651,7 @@
         <w:t xml:space="preserve"> </w:t>
       </w:r>
       <w:r>
-        <w:t xml:space="preserve">at three clusters, the fading of similarity with distance, and the spread of diversity among assemblages (Supplemental Text). As a description, the high spatial share does not distinguish a continuous copying process from groups aligned with geography. The surface can also bend over short distances, so it carries variation that the copying model, taken next, does not produce.</w:t>
+        <w:t xml:space="preserve">at three clusters, the fading of similarity with distance, and the spread of diversity among assemblages (Supplemental Text). In other words, the high spatial share does not distinguish a continuous copying process from groups aligned with geography. The surface can also bend over short distances, so it carries variation that the copying model, taken next, does not produce.</w:t>
       </w:r>
     </w:p>
     <w:p>
@@ -1722,7 +1695,7 @@
         <w:t xml:space="preserve"> </w:t>
       </w:r>
       <w:r>
-        <w:t xml:space="preserve">against the neutral copying model, which contains no groups. Model values are the median and 95 percent range over 300 runs at the matched combination most favorable to the model. The last column gives the share of runs reaching the observed value there and, in parentheses, the range of that share across the six most favorable combinations that passed the confirmation. Radius is the root-mean-square distance from an assemblage to its group’s center. A share of 0 percent means none of 300 runs, a frequency below about 0.3 percent, not an impossibility. At five or more clusters, at least one cluster holds a single assemblage, so finer divisions are reported only in the Supplemental Text.</w:t>
+        <w:t xml:space="preserve">against the neutral copying model, which contains no groups. Model values are the median and 95 percent range over 300 runs at the matched combination most favorable to the model. The last column gives the share of runs reaching the observed value there and, in parentheses, the range of that share across the six most favorable combinations that passed the confirmation. Radius is the root-mean-square distance from an assemblage to its group’s center. A share of 0 percent means none of the 300 runs; a frequency below about 0.3 percent is not an impossibility. At five or more clusters, at least one cluster holds a single assemblage, so finer divisions are reported only in the Supplemental Text.</w:t>
       </w:r>
     </w:p>
     <w:tbl>
@@ -2112,7 +2085,7 @@
         <w:pStyle w:val="BodyText"/>
       </w:pPr>
       <w:r>
-        <w:t xml:space="preserve">The next section asks whether that additional variation follows the phase lines. What produces it is a separate question, and the model can narrow it without settling it (Table 2). We relaxed four simplifications of the model one at a time at the calibrated combination, and read every variant, the baseline included, by the same three criteria: whether its median reaches the observation, how often its runs reach it, and whether the record’s diversity stays matched (Supplemental Text). No variant that keeps diversity matched brings its median up to the observed three- and four-cluster values. Two raise the share of runs reaching those values while keeping diversity matched. Letting new styles arise somewhat locally, each of the two spatial clusters drawing its new variants from a slightly different version of the regional profile, raises it from 3 and 1 percent in baseline runs with the same seeds to 42 and 40 percent when a quarter of the classes are reordered (300 runs each); with the phases as the areas and a fifth of the classes reordered, 39 percent of runs reach the observed between-phase value. Copying that falls off over a short straight-line distance, 6 km, raises it to 11 and 7 percent. Unequal site populations and shorter fall-off along the rivers raise it further but break the diversity match; not recalibrated, they are unsupported rather than excluded. None of these variants restricts who copies whom, and the test cannot tell whether local innovation followed the phases or any other division of the basin.</w:t>
+        <w:t xml:space="preserve">The next section asks whether that additional variation follows the phase lines. What produces it is a separate question, and the model can narrow it without settling it (Table 2). We relaxed four model simplifications one at a time at the calibrated combination, and evaluated every variant, including the baseline, by the same three criteria: whether its median reaches the observation, how often its runs reach it, and whether the record’s diversity stays matched (Supplemental Text). No variant that keeps diversity matched brings its median up to the observed three- and four-cluster values. Two raise the share of runs reaching those values while keeping diversity matched. Letting new styles arise somewhat locally, each of the two spatial clusters drawing its new variants from a slightly different version of the regional profile, raises it from 3 and 1 percent in baseline runs with the same seeds to 42 and 40 percent when a quarter of the classes are reordered (300 runs each); with the phases as the areas and a fifth of the classes reordered, 39 percent of runs reach the observed between-phase value. Copying that falls off over a short straight-line distance (6 km) raises it to 11 and 7 percent. Unequal site populations and shorter fall-off along the rivers raise it further but break the diversity match; not recalibrated, they are unsupported rather than excluded. None of these variants restricts who copies whom, and the test cannot tell whether local innovation followed the phases or any other division of the basin.</w:t>
       </w:r>
     </w:p>
     <w:p>
@@ -2120,7 +2093,7 @@
         <w:pStyle w:val="BodyText"/>
       </w:pPr>
       <w:r>
-        <w:t xml:space="preserve">Restricting copying across the phase lines, the property that would make the phases groups, also increases both statistics. With copying across the lines cut to 3 percent of its strength, 40 percent of runs reach the observed between-phase</w:t>
+        <w:t xml:space="preserve">Restricting copying across the phase lines, the property that would make the phase groups, also increases both statistics. With copying across the lines cut to 3 percent of its strength, 40 percent of runs reach the observed between-phase</w:t>
       </w:r>
       <w:r>
         <w:t xml:space="preserve"> </w:t>
@@ -2146,7 +2119,7 @@
         <w:t xml:space="preserve"> </w:t>
       </w:r>
       <w:r>
-        <w:t xml:space="preserve">and 34 percent reach the observed step at the lines. The copying model, however, cannot distinguish the two. The posterior probability of a copying boundary at the phase lines is 0.79, against a prior of 0.75. On simulated records with a boundary built in, the same procedure returns a median of 0.81 to 0.95 (40 test records per setting), and on records without one, a median of 0.66. The record’s value falls between the two, so it leans slightly toward a boundary without resolving one. That lean is not specific to the phases: run on three arbitrary divisions with the phases’ group sizes, the same analysis gives 0.78 to 0.92. The comparisons of where the lines fall, taken up next, bear on the question more directly, although they too discriminate only moderately.</w:t>
+        <w:t xml:space="preserve">and 34 percent reach the observed step at the lines. The copying model, however, cannot distinguish the two. The posterior probability of a copying boundary at the phase lines is 0.79, against a prior of 0.75. On simulated records with a built-in boundary, the same procedure returns a median of 0.81 to 0.95 (40 test records per setting), and on records without one, a median of 0.66. The record’s value falls between the two, so it leans slightly toward a boundary without resolving one. That lean is not specific to the phases: run on three arbitrary divisions with the phases’ group sizes, the same analysis gives 0.78 to 0.92. The comparisons of where the lines fall, taken up next, bear more directly on the question, although they too discriminate only moderately.</w:t>
       </w:r>
     </w:p>
     <w:p>
@@ -2634,7 +2607,7 @@
         <w:t xml:space="preserve"> </w:t>
       </w:r>
       <w:r>
-        <w:t xml:space="preserve">has a posterior median of 0.0109 (95 percent credible interval 0.0091 to 0.0128). Divisions of the same assemblages into groups of the same sizes around randomly placed centers give a median of 0.0145, and divisions drawn to be as compact as possible give 0.0165. The posterior probability that the phase lines separate the assemblages better than a division around random centers is 0.20, and better than a compact division 0.05 (Figure 3B, C). The step in similarity at the lines is less decisive. The boundary excess at the phase lines (posterior median +9.4, 95 percent credible interval +4.6 to +13.9) exceeds what copying alone produces, but arbitrary divisions of the map show a similar step, with a median of +6.9 around random centers and +4.6 for compact divisions, and the posterior probability that the phase lines show more is 0.59 and 0.61, close to even. The shorter-range variation the copying model misses is a property of the basin’s assemblages, however they are divided, not of the phase lines.</w:t>
+        <w:t xml:space="preserve">has a posterior median of 0.0109 (95 percent credible interval 0.0091 to 0.0128). Divisions of the same assemblages into groups of the same sizes around randomly placed centers give a median of 0.0145, and divisions drawn to be as compact as possible give 0.0165. The posterior probability that the phase lines separate the assemblages better than a division around random centers is 0.20, and better than a compact division is 0.05 (Figure 3B, C). The similarity step at the lines is less decisive. The boundary excess at the phase lines (posterior median +9.4, 95 percent credible interval +4.6 to +13.9) exceeds what copying alone produces, but arbitrary divisions of the map show a similar step, with a median of +6.9 around random centers and +4.6 for compact divisions, and the posterior probability that the phase lines show more is 0.59 and 0.61, close to even. The shorter-range variation the copying model misses is a property of the basin’s assemblages, however they are divided, not of the phase lines.</w:t>
       </w:r>
     </w:p>
     <w:p>
@@ -2642,7 +2615,7 @@
         <w:pStyle w:val="BodyText"/>
       </w:pPr>
       <w:r>
-        <w:t xml:space="preserve">This comparison responds to restricted copying at the lines, but it does not discriminate sharply. In records simulated at the calibrated combination with copying across the phase lines cut to 3 percent of its strength, the phase lines separate the simulated assemblages better than a median of 90 percent of same-size divisions around random centers and 74 percent of compact ones, versus 62 and 41 percent with no restriction. The real phase lines, scored the same way, beat 30 and 4 percent. The simulated distributions overlap widely (Supplemental Text, Figure S8). A score as low as the real one against random-center divisions occurs in 5 percent of records simulated without a restriction and 1 percent with the strongest (100 records per setting), and against compact divisions in 13 and 4 percent. The separation is smaller at two other diversity-matched combinations (Supplemental Text). The real score lies in the lower tail of every setting, the unrestricted one included, so it weighs moderately against a strong restriction at the calibrated combination and less at the others, cannot exclude a weak one, and leaves open that the copying model misdescribes how the assemblages vary. On the step in similarity the comparison is less informative still: the real lines beat 72 and 68 percent of the alternatives, above the median without restriction (56 and 27 percent) and within the range of those with copying restricted (76 to 90 and 58 to 78 percent).</w:t>
+        <w:t xml:space="preserve">This comparison responds to restricted copying at the lines, but it does not discriminate sharply. In records simulated at the calibrated combination, with copying across the phase lines cut to 3 percent of its strength, the phase lines separate the simulated assemblages better than a median of 90 percent for same-size divisions around random centers and 74 percent for compact ones, versus 62 and 41 percent with no restriction. The real phase lines, scored the same way, beat 30 and 4 percent. The simulated distributions overlap widely (Supplemental Text, Figure S8). A score as low as the real one against random-center divisions occurs in 5 percent of records simulated without a restriction and 1 percent with the strongest (100 records per setting), and against compact divisions in 13 and 4 percent. The separation is smaller at two other diversity-matched combinations (Supplemental Text). The real score lies in the lower tail of every setting, including the unrestricted one, so it weighs moderately against a strong restriction at the calibrated combination and less at the others; it cannot exclude a weak one, and it leaves open that the copying model misdescribes how the assemblages vary. On the step in similarity, the comparison is even less informative: the real lines beat 72 and 68 percent of the alternatives, above the median without restriction (56 and 27 percent) and within the range of those with copying restricted (76 to 90 and 58 to 78 percent).</w:t>
       </w:r>
     </w:p>
     <w:p>
@@ -2813,7 +2786,7 @@
           <wp:inline>
             <wp:extent cx="5334000" cy="3028550"/>
             <wp:effectExtent b="0" l="0" r="0" t="0"/>
-            <wp:docPr descr="Figure 4. Composition as a continuous surface. (A) The local rate of change in the ten decorated-class proportions, computed on a 220 by 220 grid with a 15 km Gaussian bandwidth and masked where fewer than two assemblages support the estimate. Circles are assemblages. (B) The same surface with the reconstructed phase boundaries overlaid, the edges of territories built from Mainfort’s assignments as in Figure 1. At this bandwidth the rate of change along them is lower than along the boundaries of any of 200 same-size divisions around randomly placed centers; the ranking holds at 10 to 15 km but not at 20 to 30 km (Supplemental Text). (C) Observed cultural F_{ST} against cluster radius in kilometers, with the neutral copying model’s range behind it, from coarse to fine. The observed value lies inside the range at an 18 km radius and above it from 14 km. Below a radius of about 10 km, the clusters begin to isolate single assemblages, so the finest divisions should not be read as structure." title="" id="131" name="Picture"/>
+            <wp:docPr descr="Figure 4. Composition as a continuous surface. (A) The local rate of change in the ten decorated-class proportions, computed on a 220 by 220 grid with a 15 km Gaussian bandwidth and masked where fewer than two assemblages support the estimate. Circles are assemblages. (B) The same surface with reconstructed phase boundaries overlaid, with territory edges built from Mainfort’s assignments as in Figure 1. At this bandwidth, the rate of change along them is lower than along the boundaries of any of 200 same-size divisions around randomly placed centers; the ranking holds at 10 to 15 km but not at 20 to 30 km (Supplemental Text). (C) Observed cultural F_{ST} against cluster radius in kilometers, with the neutral copying model’s range behind it, from coarse to fine. The observed value lies inside the range at an 18 km radius and above it from 14 km. Below a radius of about 10 km, the clusters begin to isolate single assemblages, so the finest divisions should not be read as structure." title="" id="131" name="Picture"/>
             <a:graphic>
               <a:graphicData uri="http://schemas.openxmlformats.org/drawingml/2006/picture">
                 <pic:pic>
@@ -2866,7 +2839,7 @@
         <w:t xml:space="preserve"> </w:t>
       </w:r>
       <w:r>
-        <w:t xml:space="preserve">Composition as a continuous surface. (A) The local rate of change in the ten decorated-class proportions, computed on a 220 by 220 grid with a 15 km Gaussian bandwidth and masked where fewer than two assemblages support the estimate. Circles are assemblages. (B) The same surface with the reconstructed phase boundaries overlaid, the edges of territories built from Mainfort’s assignments as in Figure 1. At this bandwidth the rate of change along them is lower than along the boundaries of any of 200 same-size divisions around randomly placed centers; the ranking holds at 10 to 15 km but not at 20 to 30 km (Supplemental Text). (C) Observed cultural</w:t>
+        <w:t xml:space="preserve">Composition as a continuous surface. (A) The local rate of change in the ten decorated-class proportions, computed on a 220 by 220 grid with a 15 km Gaussian bandwidth and masked where fewer than two assemblages support the estimate. Circles are assemblages. (B) The same surface with reconstructed phase boundaries overlaid, with territory edges built from Mainfort’s assignments as in Figure 1. At this bandwidth, the rate of change along them is lower than along the boundaries of any of 200 same-size divisions around randomly placed centers; the ranking holds at 10 to 15 km but not at 20 to 30 km (Supplemental Text). (C) Observed cultural</w:t>
       </w:r>
       <w:r>
         <w:t xml:space="preserve"> </w:t>
@@ -3186,7 +3159,7 @@
         <w:pStyle w:val="BodyText"/>
       </w:pPr>
       <w:r>
-        <w:t xml:space="preserve">Alternative divisions separate the assemblages as well. With the uncertainty in the counts carried through, the Parkin-versus-rest</w:t>
+        <w:t xml:space="preserve">Alternative divisions also separate the assemblages. With uncertainty in the counts carried through, the Parkin-versus-rest</w:t>
       </w:r>
       <w:r>
         <w:t xml:space="preserve"> </w:t>
@@ -3212,7 +3185,7 @@
         <w:t xml:space="preserve"> </w:t>
       </w:r>
       <w:r>
-        <w:t xml:space="preserve">has a posterior median of 0.0061 (95 percent credible interval 0.0051 to 0.0074), against 0.0064 for same-size divisions around random centers and 0.0076 for compact ones. The posterior probability that the Parkin line separates the assemblages better is 0.27 against divisions around random centers and 0.00025 against compact ones, the second from 10 favorable comparisons among 40,000. The step in similarity across the Parkin line, a boundary excess of +13.7, exceeds what copying alone produces (simulated median +0.5, 95 percent range -6.5 to +7.5; none of 300 runs reaches it), but it is the same shorter-range variation seen at arbitrary lines drawn across this map. Around random centers, the median is +10.7 and the posterior probability that the Parkin line shows more is 0.53; for compact divisions, the median is +15.1, and the probability is 0.05. The assemblage composition sets the Parkin phase apart from its neighbors no more than it sets apart any comparably sized piece of the basin. This comparison has little power for a single line, however. In simulations with copying across the Parkin phase’s edge cut to 3 percent, the Parkin line beats a median 72 percent of random-center divisions, against 64 percent with no restriction, and a score as low as the real one (28 percent) occurs in 10 and 16 percent of simulated records. The record therefore cannot exclude restricted copying at the edge of the Parkin phase. However, the assemblage composition shows nothing that requires it.</w:t>
+        <w:t xml:space="preserve">has a posterior median of 0.0061 (95 percent credible interval 0.0051 to 0.0074), compared with 0.0064 for same-size divisions around random centers and 0.0076 for compact ones. The posterior probability that the Parkin line separates the assemblages better is 0.27 against divisions around random centers and 0.00025 against compact ones, the second from 10 favorable comparisons among 40,000. The step in similarity across the Parkin line, a boundary excess of +13.7, exceeds what copying alone produces (simulated median +0.5, 95 percent range -6.5 to +7.5; none of 300 runs reaches it), but it is the same shorter-range variation seen at arbitrary lines drawn across this map. Around random centers, the median is +10.7 and the posterior probability that the Parkin line shows more is 0.53; for compact divisions, the median is +15.1, and the probability is 0.05. The assemblage composition sets the Parkin phase apart from its neighbors no more than it sets apart any comparably sized piece of the basin. This comparison has little power for a single line, however. In simulations with copying across the Parkin phase’s edge cut to 3 percent, the Parkin line beats a median 72 percent of random-center divisions, against 64 percent with no restriction, and a score as low as the real one (28 percent) occurs in 10 and 16 percent of simulated records. The record therefore cannot exclude restricted copying at the edge of the Parkin phase. However, the assemblage composition shows nothing that requires it.</w:t>
       </w:r>
     </w:p>
     <w:p>
@@ -3220,7 +3193,7 @@
         <w:pStyle w:val="BodyText"/>
       </w:pPr>
       <w:r>
-        <w:t xml:space="preserve">Two further descriptions of the basin place Parkin in context, although neither is a test. Deterministic seriation of the basin assemblages returns 34 maximal co-seriable groups at a continuity threshold of 0.1, none larger than four assemblages, and 18 of the 28 assemblages belong to more than one (Figure 8). Overlapping orderings of this kind are what a continuous field too varied to fit one ordering would produce, but the recovery experiment showed that seriation structure cannot detect imposed groups at this resolution, and we have not validated the overlap statistic separately, so the overlap is consistent with the absence of closure rather than evidence against it. Parkin belongs to three groups, a bridge between orderings but not the most connected one: Barton Ranch, Rose Mound, and Williamson each belong to six. Lipo, Madsen, and Dunnell</w:t>
+        <w:t xml:space="preserve">Two further descriptions of the basin place Parkin in context, although neither tests it. Deterministic seriation of the basin assemblages returns 34 maximal co-seriable groups at a continuity threshold of 0.1, none larger than four assemblages, and 18 of the 28 assemblages belong to more than one (Figure 8). Overlapping orderings of this kind are what a continuous field too varied to fit one ordering would produce, but the recovery experiment showed that seriation structure cannot detect imposed groups at this resolution, and we have not validated the overlap statistic separately, so the overlap is consistent with the absence of closure rather than evidence against it. Parkin belongs to three groups, a bridge between orderings but not the most connected one: Barton Ranch, Rose Mound, and Williamson each belong to six. Lipo, Madsen, and Dunnell</w:t>
       </w:r>
       <w:r>
         <w:t xml:space="preserve"> </w:t>
@@ -3314,7 +3287,7 @@
         <w:t xml:space="preserve">(Morse 1981, 1990)</w:t>
       </w:r>
       <w:r>
-        <w:t xml:space="preserve">. Its mound is the second tallest of the 55 basin sites with a recorded height, behind one at 23 ft, and the tallest exceeds the second by a ratio of only 1.08 (Figure 9). Parkin’s height comes from excavation reports, whereas the others come from a regional compilation without per-site sources, so the series mixes measurement sources. Mound heights form a graded series with no gap at the top. Maximum mound height is a limited proxy for political rank: it records the final size of one construction, not the organization that built it, and a graded series is compatible with more than one form of ranking, so it describes the settlement record without testing for an administrative tier. Regional evidence on the chert-hoe economy is similar in kind: autonomous workshops made Mill Creek hoes at the source and moved them largely down the line, with elites at consuming centers gaining at most privileged access</w:t>
+        <w:t xml:space="preserve">. Its mound is the second tallest of the 55 basin sites with a recorded height, behind one at 23 ft, and the tallest exceeds the second by a ratio of only 1.08 (Figure 9). Parkin’s height comes from excavation reports, whereas the others come from a regional compilation without per-site sources, so the series mixes measurement sources. Mound heights form a graded series with no gap at the top. Maximum mound height is a limited proxy for political rank: it records the final size of one construction, not the organization that built it, and a graded series fits more than one form of ranking, so it describes the settlement record without testing for an administrative tier. Regional evidence on the chert-hoe economy is similar: autonomous workshops made Mill Creek hoes at the source and moved them largely down the line, with elites at consuming centers gaining at most privileged access</w:t>
       </w:r>
       <w:r>
         <w:t xml:space="preserve"> </w:t>
@@ -3323,7 +3296,7 @@
         <w:t xml:space="preserve">(Cobb 2000:75, 154, 198)</w:t>
       </w:r>
       <w:r>
-        <w:t xml:space="preserve">. That evidence is not specific to the basin and cannot test Parkin’s position locally.</w:t>
+        <w:t xml:space="preserve">. That evidence is not basin-specific and cannot test Parkin’s position locally.</w:t>
       </w:r>
     </w:p>
     <w:p>
@@ -3456,7 +3429,7 @@
         <w:pStyle w:val="BodyText"/>
       </w:pPr>
       <w:r>
-        <w:t xml:space="preserve">We ran the phase-line tests on Mainfort’s own counts, using decorated types only and his assignments, with a minimum of 100 decorated sherds. The resulting 29 sites fall in five phases: Kent with 9 sites, Parkin with 7, Walls with 6, Horseshoe Lake with 4, and Jones Bayou with 3 (Figure 10). His table shares collections with ours at 21 sites, so this is a second tally of largely the same material rather than an independent record.</w:t>
+        <w:t xml:space="preserve">We ran the phase-line tests on Mainfort’s own counts, using decorated types only and his assignments, with a minimum of 100 decorated sherds. The resulting 29 sites fall in five phases: Kent with 9 sites, Parkin with 7, Walls with 6, Horseshoe Lake with 4, and Jones Bayou with 3 (Figure 10). His table overlaps ours at 21 sites, so this is a second tally of largely the same material rather than an independent record.</w:t>
       </w:r>
     </w:p>
     <w:p>
@@ -3490,7 +3463,7 @@
         <w:t xml:space="preserve"> </w:t>
       </w:r>
       <w:r>
-        <w:t xml:space="preserve">under his phases has a posterior median of 0.046 (95 percent credible interval 0.041 to 0.051), against 0.030 for same-size divisions around random centers and 0.032 for compact ones, and the posterior probability that his delineations separate the assemblages better than such a division is 0.96 and 0.94. The compactness search never produces his groups, and giving composition half the weight of the coordinates raises the agreement with his scheme to 0.66, above the map alone. At six of the seven sites the two schemes assign differently, the assemblage data align better with Mainfort’s assignment, usually by a wide margin. The Young site, however, is the exception (Supplemental Text).</w:t>
+        <w:t xml:space="preserve">under his phases has a posterior median of 0.046 (95 percent credible interval 0.041 to 0.051), against 0.030 for same-size divisions around random centers and 0.032 for compact ones, and the posterior probability that his delineations separate the assemblages better than such a division is 0.96 and 0.94. The compactness search never produces his groups, and giving composition half the weight of the coordinates raises the agreement with his scheme to 0.66, above the map alone. At six of the seven sites where the two schemes differ, the assemblage data align better with Mainfort’s assignment, usually by a wide margin. The Young site, however, is the exception (Supplemental Text).</w:t>
       </w:r>
     </w:p>
     <w:p>
@@ -3498,7 +3471,7 @@
         <w:pStyle w:val="BodyText"/>
       </w:pPr>
       <w:r>
-        <w:t xml:space="preserve">The two schemes behave as their origins predict. The inherited lines divide the map, whereas Mainfort’s lines fall where the assemblages differ. The two schemes also disagree about where the boundaries are, which is not what bounded groups would produce. The contrast neither shows that Mainfort’s phases are bounded groups nor independently validates the comparison, since location still recovers much of his scheme and his lines separate the assemblages in part because the assemblages drew them. What the contrast shows is that phase lines follow the pottery when the pottery draws them, and that the inherited scheme was not drawn that way.</w:t>
+        <w:t xml:space="preserve">The two schemes behave as their origins predict. The inherited lines divide the map, whereas Mainfort’s lines fall where the assemblages differ. The two schemes also disagree about where the boundaries are, which bounded groups would not produce. The contrast neither shows that Mainfort’s phases are bounded groups nor independently validates the comparison, since location still recovers much of his scheme and his lines separate the assemblages in part because the assemblages drew them. What the contrast shows is that phase lines follow the assemblages when the assemblage type frequencies draw them, and that the inherited scheme was not drawn that way.</w:t>
       </w:r>
     </w:p>
     <w:p>
@@ -3591,7 +3564,7 @@
         <w:pStyle w:val="FirstParagraph"/>
       </w:pPr>
       <w:r>
-        <w:t xml:space="preserve">The results bear on three different kinds of claim, and they support each to a different degree. The first is descriptive adequacy: a smooth surface over the map describes the variation among assemblages well, and calibrated copying with no groups reproduces the fade of similarity with distance and the two-cluster difference. The second is mechanism. Spatially structured copying is sufficient to produce the inherited scheme: the site map alone reproduces the phase assignments, and assemblages made by copying with no groups sort into the same phases. Sufficiency does not identify the historical mechanism, and the finer-scale variation discussed below is explained only in part. The third is boundary evidence, whether the phase lines mark restrictions on copying. Here the result is negative but bounded. Alternative spatial divisions of the same sites capture as much or more of the ceramic differentiation than the phase lines do. In simulation at the calibrated combination, a restriction that cuts copying at the lines to a small fraction of its strength usually reverses that ordering, but the real score is also uncommon without any restriction, and the separation is smaller at other combinations, so the comparison weighs moderately against a strong restriction and cannot exclude a weak one.</w:t>
+        <w:t xml:space="preserve">The results bear on three different kinds of claim, and they support each to varying degrees. The first is descriptive adequacy: a smooth surface over the map describes the variation among assemblages well, and calibrated copying with no groups reproduces the fade of similarity with distance and the two-cluster difference. The second is mechanism. Spatially structured copying is sufficient to produce the inherited scheme: the site map alone reproduces the phase assignments, and assemblages copied without groups sort into the same phases. Sufficiency does not identify the historical mechanism, and the finer-scale variation discussed below is explained only in part. The third is boundary evidence, whether the phase lines mark restrictions on copying. Here the result is negative but bounded. Alternative spatial divisions of the same sites capture as much or more of the ceramic differentiation than the phase lines do. In simulation at the calibrated combination, a restriction that cuts copying at the lines to a small fraction of its strength usually reverses that ordering, but the real score is also uncommon without any restriction, and the separation is smaller at other combinations, so the comparison weighs moderately against a strong restriction and cannot exclude a weak one.</w:t>
       </w:r>
     </w:p>
     <w:p>
@@ -3599,7 +3572,7 @@
         <w:pStyle w:val="BodyText"/>
       </w:pPr>
       <w:r>
-        <w:t xml:space="preserve">The culture historians who drew the phases were responding to something real, a gradient in style sampled at clumped settlements. The assemblages give no evidence that the lines they drew were also edges of bounded learning.</w:t>
+        <w:t xml:space="preserve">The culture historians who drew the phases were responding to something real, a gradient in style sampled at clumped settlements. The assemblages give no evidence that the lines they drew also marked the edges of bounded learning.</w:t>
       </w:r>
     </w:p>
     <w:p>
@@ -3619,7 +3592,7 @@
         <w:t xml:space="preserve"> </w:t>
       </w:r>
       <w:r>
-        <w:t xml:space="preserve">reported without being able to explain it: phase members lying</w:t>
+        <w:t xml:space="preserve">reported but could not explain: phase members lying</w:t>
       </w:r>
       <w:r>
         <w:t xml:space="preserve"> </w:t>
@@ -3655,7 +3628,7 @@
         <w:t xml:space="preserve"> </w:t>
       </w:r>
       <w:r>
-        <w:t xml:space="preserve">spanning roughly two centuries, so the members of a phase need not even be contemporaneous. The reading is not new to the regional literature. McNutt</w:t>
+        <w:t xml:space="preserve">spanning roughly two centuries, so the members of a phase need not even be contemporaneous. The interpretation is not new to the regional literature. McNutt</w:t>
       </w:r>
       <w:r>
         <w:t xml:space="preserve"> </w:t>
@@ -3679,7 +3652,7 @@
         <w:t xml:space="preserve"> </w:t>
       </w:r>
       <w:r>
-        <w:t xml:space="preserve">The comparison adds a mechanism shown to be sufficient, and tests of whether the Parkin, Kent, and Walls phase lines behave as edges of bounded learning.</w:t>
+        <w:t xml:space="preserve">The comparison adds a mechanism shown to be sufficient, and tests whether the Parkin, Kent, and Walls phase lines behave as edges of bounded learning.</w:t>
       </w:r>
     </w:p>
     <w:p>
@@ -3687,7 +3660,7 @@
         <w:pStyle w:val="BodyText"/>
       </w:pPr>
       <w:r>
-        <w:t xml:space="preserve">The assemblages carry one property the calibrated copying model does not produce. They vary over shorter distances than calibrated copying would, so divisions into three or more groups differ more than the model predicts, and every line drawn across the map shows a step in similarity. That variation is not organized by the phase lines or centered on Parkin, and it remains incompletely explained. New styles arising somewhat locally and copying that falls off over a few kilometers both make the observed differences more common in simulation while keeping the record’s diversity matched (Table 2). Both are still neutral copying and both are themselves geographic, but we treat them as mechanisms the record is consistent with rather than ones it demonstrates. Part of the variation may also be chronological, a matter of age that an order derived from the same frequencies cannot separate from place.</w:t>
+        <w:t xml:space="preserve">The assemblages carry one property the calibrated copying model does not produce. They vary over shorter distances than calibrated copying would, so divisions into three or more groups differ more than the model predicts, and every line drawn across the map shows a step in similarity. That variation is not organized by the phase lines or centered on Parkin, and it remains incompletely explained. New styles arising somewhat locally, with copying that falls off over a few kilometers, both make the observed differences more common in simulation while keeping the record’s diversity matched (Table 2). Both are still neutral copying, and both are themselves geographic, but we treat them as mechanisms the record is consistent with rather than ones it demonstrates. Part of the variation may also be chronological, a matter of age that an order derived from the same frequencies cannot separate from place.</w:t>
       </w:r>
     </w:p>
     <w:bookmarkEnd w:id="155"/>
@@ -3705,7 +3678,7 @@
         <w:pStyle w:val="FirstParagraph"/>
       </w:pPr>
       <w:r>
-        <w:t xml:space="preserve">Parkin was the basin’s largest town and had one of its tallest mounds, and its prominence was real. The decorated-type frequencies, however, do not show a boundary in ceramic learning at the edge of the Parkin phase. The phase is the northern of the two clusters the regional map supports, its difference from the rest of the basin is the one the copying model reproduces most easily, and alternative divisions separate the assemblages as well as its boundary does. Because a single line gives these comparisons little power, restricted copying at the phase’s edge cannot be excluded, but nothing in the frequencies requires it.</w:t>
+        <w:t xml:space="preserve">Parkin was the basin’s largest town and had one of its tallest mounds, and its prominence was real. The decorated-type frequencies, however, do not show a boundary in ceramic learning at the edge of the Parkin phase. The phase is the northern of the two clusters the regional map supports. Its difference from the rest of the basin is the one the copying model reproduces most easily, and alternative divisions separate the assemblages as well as its boundary does. Because a single line gives these comparisons little power, restricted copying at the phase’s edge cannot be excluded, but nothing in the frequencies requires it.</w:t>
       </w:r>
     </w:p>
     <w:p>
@@ -3852,7 +3825,7 @@
         <w:pStyle w:val="FirstParagraph"/>
       </w:pPr>
       <w:r>
-        <w:t xml:space="preserve">Our approach rests on two requirements that apply beyond this case. Before treating a similarity pattern as the result of differential social interaction, the record must be shown able to detect a social boundary. Here, we show that</w:t>
+        <w:t xml:space="preserve">Our approach rests on two requirements that apply beyond this case. Before treating a similarity pattern as the result of differential social interaction, the record must be shown to detect a social boundary. Here, we show that</w:t>
       </w:r>
       <w:r>
         <w:t xml:space="preserve"> </w:t>
@@ -3904,7 +3877,7 @@
         <w:pStyle w:val="BodyText"/>
       </w:pPr>
       <w:r>
-        <w:t xml:space="preserve">For the St. Francis Basin assemblages, the shorter-range variation and Parkin’s role would be better tested on stratified, excavated assemblages with independent radiocarbon dates, on compositional and petrographic evidence for where assemblages were made, and on exchange, mortuary, and dietary records</w:t>
+        <w:t xml:space="preserve">For the St. Francis Basin assemblages, the shorter-range variation and Parkin’s role would be better tested with stratified, excavated assemblages with independent radiocarbon dates, compositional and petrographic evidence for where assemblages were made, and exchange, mortuary, and dietary records</w:t>
       </w:r>
       <w:r>
         <w:t xml:space="preserve"> </w:t>
@@ -3932,7 +3905,7 @@
         <w:pStyle w:val="FirstParagraph"/>
       </w:pPr>
       <w:r>
-        <w:t xml:space="preserve">The phase is the unit on which Lower Mississippi Valley culture history is built, and it often carries an unstated claim: that assemblages grouped by seriation and proximity record a community, and at Parkin, a polity. Earlier work showed that the phases do not separate cleanly. This paper tests whether the inherited phases of the St. Francis basin coincide with restrictions on the copying of decorated pottery, and offers an explanation for their apparent organization. The inherited phases do not uniquely capture the decorated-ceramic differentiation of the basin. A regional map of deposit locations alone recovers them, alternative spatial divisions of the same sites capture as much or more of the differentiation, and pottery made by copying with no groups sorts into the same phases. Phases redrawn from an ordination of the assemblages behave differently, following the pottery rather than the map, which is the contrast this explanation predicts. Spatially structured copying, sampled at clumped settlements and sorted by resemblance and proximity, is therefore a sufficient and plausible account of how the phases came to look like groups.</w:t>
+        <w:t xml:space="preserve">The phase is the unit on which Lower Mississippi Valley culture history is built, and it often carries an unstated claim: that assemblages grouped by seriation and proximity record a community, and at Parkin, a polity. Earlier work showed that the phases do not separate cleanly. This paper tests whether the inherited phases of the St. Francis basin coincide with restrictions on the copying of decorated pottery, and offers an explanation for their apparent organization. The inherited phases do not uniquely capture the basin’s decorated-ceramic differentiation. A regional map of deposit locations alone recovers them. Alternative spatial divisions of the same sites capture as much or more of the differentiation, and pottery made by copying with no groups sorts into the same phases. Phases redrawn from an ordination of the assemblages behave differently, following the pottery rather than the map, which is the contrast this explanation predicts. Spatially structured copying, sampled at clumped settlements and sorted by resemblance and proximity, is therefore a sufficient and plausible account of how the phases came to look like groups.</w:t>
       </w:r>
     </w:p>
     <w:p>

</xml_diff>

<commit_message>
Refresh from mls-emergence 936b510: Phillips's (1970) phases as the primary scheme
The primary analysis now tests the phases as Phillips (1970) drew them, read
from Lipo (2001: Figure 2.6), on the Phillips-Ford-Griffin and Lipo counts.
The Cummins coordinate is corrected. Mainfort's (2003) table is a second
tally under his revised scheme. Every output, figure and both manuscripts are
regenerated from that pipeline.

New in this refresh: the phase outlines and the script that builds them, the
per-assemblage phase-fit analysis, the sign checks (scripts/check_signs.py and
the direction tests), and a reproducibility fix to the boundary sampling.

Co-Authored-By: Claude Fable 5.1 <noreply@anthropic.com>
</commit_message>
<xml_diff>
--- a/docs/manuscript/MAIN_TEXT.docx
+++ b/docs/manuscript/MAIN_TEXT.docx
@@ -2,7 +2,7 @@
 <file path=word/document.xml><?xml version="1.0" encoding="utf-8"?>
 <w:document xmlns:w="http://schemas.openxmlformats.org/wordprocessingml/2006/main" xmlns:m="http://schemas.openxmlformats.org/officeDocument/2006/math" xmlns:r="http://schemas.openxmlformats.org/officeDocument/2006/relationships" xmlns:o="urn:schemas-microsoft-com:office:office" xmlns:v="urn:schemas-microsoft-com:vml" xmlns:w10="urn:schemas-microsoft-com:office:word" xmlns:a="http://schemas.openxmlformats.org/drawingml/2006/main" xmlns:pic="http://schemas.openxmlformats.org/drawingml/2006/picture" xmlns:wp="http://schemas.openxmlformats.org/drawingml/2006/wordprocessingDrawing">
   <w:body>
-    <w:bookmarkStart w:id="275" w:name="X8bf6248c9f3f97f4894a761f3e01800d2c2c84f"/>
+    <w:bookmarkStart w:id="277" w:name="X8bf6248c9f3f97f4894a761f3e01800d2c2c84f"/>
     <w:p>
       <w:pPr>
         <w:pStyle w:val="Heading1"/>
@@ -37,7 +37,7 @@
         <w:pStyle w:val="FirstParagraph"/>
       </w:pPr>
       <w:r>
-        <w:t xml:space="preserve">Traditionally, archaeologists group assemblages into phases and assign them community or polity status. Earlier studies have shown that the phases of the Lower Mississippi River Valley do not separate cleanly, but they have not explained what produces their apparent organization. We explain phases using cultural transmission theory in which potters copy near neighbors more than distant ones. Neutral drift makes nearby assemblages alike whether or not groups exist. Settlement is clumped, and a smooth gradient sampled at clumps and sorted by resemblance and proximity looks like a set of groups. We present a method for determining whether a phase restricts copying of variability in decorated pottery. In such cases, the frequencies of artifact classes show what distance-limited copying does not produce: learning concentrated inside and divergence across its edge. We test our method on the decorated-type frequencies of the Late Mississippian St. Francis basin in northeastern Arkansas, including the Parkin phase, long read as a polity. The site map alone can reproduce the phases. Alternative spatial divisions of the same sites capture as much or more ceramic type differentiation, and sherd frequencies simulated with no groups sort into the phases as readily as the real assemblages. The Parkin phase differs from the rest of the basin no more than arbitrary divisions of the map. The frequencies of assemblage types vary over shorter distances than a copying model predicts, but that variation does not follow phase borders. Phases therefore do not uniquely capture the basin’s ceramic differentiation, and spatially structured copying plausibly accounts for their apparent organization. The results do not exclude a Parkin polity, however, since political boundaries need not coincide with ceramic traditions.</w:t>
+        <w:t xml:space="preserve">Traditionally, archaeologists group assemblages into phases and assign them community or polity status. Earlier studies have shown that the phases of the Lower Mississippi River Valley do not separate cleanly, but they have not explained what produces their apparent organization. We explain phases using cultural transmission theory in which potters copy near neighbors more than distant ones. Neutral drift makes nearby assemblages alike whether or not groups exist. Settlement is clumped, and a smooth gradient sampled at clumps and sorted by resemblance and proximity looks like a set of groups. We present a method for determining whether a phase restricts copying of variability in decorated pottery. In such cases, the frequencies of artifact classes show what distance-limited copying does not produce: learning concentrated inside and divergence across its edge. We test our method on the decorated-type frequencies of the Late Mississippian St. Francis basin in northeastern Arkansas under the phases Phillips defined, including the Parkin phase, long read as a polity. The phase lines run through sparsely settled country, and hierarchical clustering of site locations alone recovers the phases for all but two assemblages, as expected of units sorted by proximity. The lines separate the assemblages about as well as alternative divisions of the same sites, and the step in similarity across them appears at arbitrary lines as well. Under the same clustering, frequencies simulated with no groups sort into the phases about as readily as the real assemblages when composition is given a quarter of location’s weight or less, and less readily at equal weight and on resemblance alone; the real frequencies’ advantage there is expected, since the phases were drawn from them. The Parkin phase separates the assemblages no better than divisions around random centers, though better than compact ones. The frequencies vary over shorter distances than a copying model predicts, and that variation is not specific to phase borders. Phases therefore do not uniquely capture the basin’s ceramic differentiation, and the assemblages neither require nor exclude restricted copying at their lines. The results do not exclude a Parkin polity, since political boundaries need not coincide with ceramic traditions.</w:t>
       </w:r>
     </w:p>
     <w:p>
@@ -73,7 +73,7 @@
         <w:pStyle w:val="FirstParagraph"/>
       </w:pPr>
       <w:r>
-        <w:t xml:space="preserve">Tradicionalmente, los arqueólogos agrupan los conjuntos cerámicos en fases y les atribuyen las cualidades de comunidades o entidades políticas. Estudios anteriores han mostrado que las fases del valle bajo del río Misisipi no se separan con nitidez, pero no han explicado qué produce su aparente organización. Explicamos las fases con la teoría de la transmisión cultural, según la cual los alfareros copian a sus vecinos cercanos más que a los lejanos. La deriva neutral hace que los conjuntos cercanos se parezcan, ya existan o no grupos. Los asentamientos están agrupados, y un gradiente continuo, muestreado en esos agrupamientos y ordenado por semejanza y proximidad, parece un conjunto de grupos. Presentamos un método para determinar si una fase constituye una restricción para la copia de la cerámica decorada. En tal caso, las frecuencias de las clases de artefactos muestran lo que la copia limitada por la distancia no produce: aprendizaje concentrado en su interior y divergencia a través de su límite. Lo ponemos a prueba con las frecuencias de los tipos decorados del Misisipiano tardío en la cuenca del río St. Francis, en el noreste de Arkansas, incluida la fase Parkin, interpretada durante mucho tiempo como una entidad política. El mapa de sitios, por sí solo, recupera las fases; otras divisiones espaciales de los mismos sitios captan tanta o más diferenciación cerámica, y las frecuencias simuladas sin grupos se clasifican en las fases con la misma facilidad que los conjuntos reales. La fase Parkin no difiere del resto de la cuenca más que por divisiones arbitrarias del mapa. Las frecuencias de los tipos varían a distancias más cortas de las predichas por un modelo de copia, pero esa variación no sigue los límites de las fases. Por lo tanto, las fases heredadas no captan de manera exclusiva la diferenciación cerámica de la cuenca, y la copia estructurada en el espacio constituye una explicación plausible de su aparente organización. Los resultados no excluyen la existencia de una entidad política en Parkin, ya que los límites políticos no tienen por qué coincidir con las tradiciones cerámicas.</w:t>
+        <w:t xml:space="preserve">Tradicionalmente, los arqueólogos agrupan los conjuntos cerámicos en fases y les atribuyen las cualidades de comunidades o entidades políticas. Estudios anteriores han mostrado que las fases del valle bajo del río Misisipi no se separan con nitidez, pero no han explicado qué produce su aparente organización. Explicamos las fases con la teoría de la transmisión cultural, según la cual los alfareros copian a sus vecinos cercanos más que a los lejanos. La deriva neutral hace que los conjuntos cercanos se parezcan, ya existan o no grupos. Los asentamientos están agrupados, y un gradiente continuo, muestreado en esos agrupamientos y ordenado por semejanza y proximidad, parece un conjunto de grupos. Presentamos un método para determinar si una fase constituye una restricción para la copia de la cerámica decorada. En tal caso, las frecuencias de las clases de artefactos muestran lo que la copia limitada por la distancia no produce: aprendizaje concentrado en su interior y divergencia a través de su límite. Lo ponemos a prueba con las frecuencias de los tipos decorados del Misisipiano tardío en la cuenca del río St. Francis, en el noreste de Arkansas, según las fases definidas por Phillips, incluida la fase Parkin, interpretada durante mucho tiempo como una entidad política. Los límites de las fases atraviesan zonas poco pobladas, y el agrupamiento jerárquico de las ubicaciones de los sitios, por sí solo, recupera las fases para todos los conjuntos salvo dos, como cabe esperar de unidades ordenadas por proximidad. Los límites separan los conjuntos aproximadamente tan bien como otras divisiones de los mismos sitios, y el escalón de semejanza que los cruza aparece también en límites arbitrarios. Con el mismo agrupamiento, las frecuencias simuladas sin grupos se clasifican en las fases aproximadamente con la misma facilidad que los conjuntos reales cuando la composición recibe una cuarta parte del peso de la ubicación o menos, y con menos facilidad cuando pesa tanto como la ubicación o cuenta sola; esa ventaja de las frecuencias reales es esperable, ya que las fases se trazaron a partir de ellas. La fase Parkin no separa los conjuntos mejor que las divisiones en torno a centros aleatorios, aunque sí mejor que las divisiones compactas. Las frecuencias varían a distancias más cortas de las predichas por un modelo de copia, y esa variación no es propia de los límites de las fases. Por lo tanto, las fases no captan de manera exclusiva la diferenciación cerámica de la cuenca, y los conjuntos ni exigen ni excluyen una copia restringida en sus límites. Los resultados no excluyen la existencia de una entidad política en Parkin, ya que los límites políticos no tienen por qué coincidir con las tradiciones cerámicas.</w:t>
       </w:r>
     </w:p>
     <w:p>
@@ -109,7 +109,7 @@
         <w:pStyle w:val="FirstParagraph"/>
       </w:pPr>
       <w:r>
-        <w:t xml:space="preserve">Archaeologists have traditionally divided the late pre-contact record of the Lower Mississippi River Valley into spatially and temporally bounded units known as phases (Figure 1). These include the Kent</w:t>
+        <w:t xml:space="preserve">Archaeologists have traditionally divided the late pre-contact record of the Lower Mississippi River Valley into spatially and temporally bounded units known as phases. These include the Kent</w:t>
       </w:r>
       <w:r>
         <w:t xml:space="preserve"> </w:t>
@@ -175,7 +175,19 @@
         <w:t xml:space="preserve"> </w:t>
       </w:r>
       <w:r>
-        <w:t xml:space="preserve">phases. The Parkin phase stands out because it contains the Parkin site, the largest moated and palisaded town in the St. Francis basin of northeastern Arkansas. Reconstructions of the Hernando de Soto expedition’s route identify it as Casqui, the seat of a paramount chief the expedition met in 1541</w:t>
+        <w:t xml:space="preserve">phases. Figure 1 shows four of them, Nodena, Parkin, Walls, and Kent, as Phillips</w:t>
+      </w:r>
+      <w:r>
+        <w:t xml:space="preserve"> </w:t>
+      </w:r>
+      <w:r>
+        <w:t xml:space="preserve">(1970)</w:t>
+      </w:r>
+      <w:r>
+        <w:t xml:space="preserve"> </w:t>
+      </w:r>
+      <w:r>
+        <w:t xml:space="preserve">drew them. The Parkin phase stands out because it contains the Parkin site, the largest moated and palisaded town in the St. Francis basin of northeastern Arkansas. Reconstructions of the Hernando de Soto expedition’s route identify it as Casqui, the seat of a paramount chief the expedition met in 1541</w:t>
       </w:r>
       <w:r>
         <w:t xml:space="preserve"> </w:t>
@@ -203,14 +215,14 @@
       <w:r>
         <w:drawing>
           <wp:inline>
-            <wp:extent cx="4114800" cy="8037789"/>
+            <wp:extent cx="3566160" cy="5368444"/>
             <wp:effectExtent b="0" l="0" r="0" t="0"/>
-            <wp:docPr descr="Figure 1. Decorated-ceramic assemblages of the lower Mississippi Valley and the culture-historical phase scheme this paper tests. Each territory is built by assigning every point on the map to its nearest assemblage and then merging those areas according to the phase Mainfort (1996) assigns to each assemblage; assemblages without a phase assignment are not drawn. Territories are drawn over the HydroRIVERS river network (Lehner and Grill 2013), with line width scaled by flow order. Markers show each assemblage that comprises its phase, and Parkin is starred. The bounded territories illustrate the premise under test, that each hosted a distinct, internally interacting society. The mapped assemblages fall in Arkansas, Tennessee, and Mississippi; Missouri lies just north of the frame. Inset: location in North America." title="" id="112" name="Picture"/>
+            <wp:docPr descr="Figure 1. The study area and the late pre-contact phases as Phillips (1970) drew them. The Nodena, Parkin, Walls, and Kent phase areas are redrawn from Lipo (2001:Figure 2.6), after Phillips (1970), and are placed on the map from the survey-quadrangle frame of that figure. Filled circles are the 28 decorated-ceramic assemblages analyzed here, open circles are the eight other assemblages of the 38 used in this study that fall inside the frame, and the Parkin site is starred. Phase areas are drawn over the HydroRIVERS river network (Lehner and Grill 2013), with line width scaled by flow order. The bounded areas illustrate the premise under test, that each hosted a distinct, internally interacting society. The mapped area lies in Arkansas, Tennessee, and Mississippi; Missouri lies just north of the frame. Inset: location in North America." title="" id="112" name="Picture"/>
             <a:graphic>
               <a:graphicData uri="http://schemas.openxmlformats.org/drawingml/2006/picture">
                 <pic:pic>
                   <pic:nvPicPr>
-                    <pic:cNvPr descr="../../figures/fig1_phases.png" id="113" name="Picture"/>
+                    <pic:cNvPr descr="../../figures/fig1_phillips1970_phases.png" id="113" name="Picture"/>
                     <pic:cNvPicPr>
                       <a:picLocks noChangeArrowheads="1" noChangeAspect="1"/>
                     </pic:cNvPicPr>
@@ -224,7 +236,7 @@
                   <pic:spPr bwMode="auto">
                     <a:xfrm>
                       <a:off x="0" y="0"/>
-                      <a:ext cx="4114800" cy="8037789"/>
+                      <a:ext cx="3566160" cy="5368444"/>
                     </a:xfrm>
                     <a:prstGeom prst="rect">
                       <a:avLst/>
@@ -258,19 +270,37 @@
         <w:t xml:space="preserve"> </w:t>
       </w:r>
       <w:r>
-        <w:t xml:space="preserve">Decorated-ceramic assemblages of the lower Mississippi Valley and the culture-historical phase scheme this paper tests. Each territory is built by assigning every point on the map to its nearest assemblage and then merging those areas according to the phase Mainfort</w:t>
-      </w:r>
-      <w:r>
-        <w:t xml:space="preserve"> </w:t>
-      </w:r>
-      <w:r>
-        <w:t xml:space="preserve">(1996)</w:t>
-      </w:r>
-      <w:r>
-        <w:t xml:space="preserve"> </w:t>
-      </w:r>
-      <w:r>
-        <w:t xml:space="preserve">assigns to each assemblage; assemblages without a phase assignment are not drawn. Territories are drawn over the HydroRIVERS river network</w:t>
+        <w:t xml:space="preserve">The study area and the late pre-contact phases as Phillips</w:t>
+      </w:r>
+      <w:r>
+        <w:t xml:space="preserve"> </w:t>
+      </w:r>
+      <w:r>
+        <w:t xml:space="preserve">(1970)</w:t>
+      </w:r>
+      <w:r>
+        <w:t xml:space="preserve"> </w:t>
+      </w:r>
+      <w:r>
+        <w:t xml:space="preserve">drew them. The Nodena, Parkin, Walls, and Kent phase areas are redrawn from Lipo</w:t>
+      </w:r>
+      <w:r>
+        <w:t xml:space="preserve"> </w:t>
+      </w:r>
+      <w:r>
+        <w:t xml:space="preserve">(2001:Figure 2.6)</w:t>
+      </w:r>
+      <w:r>
+        <w:t xml:space="preserve">, after Phillips</w:t>
+      </w:r>
+      <w:r>
+        <w:t xml:space="preserve"> </w:t>
+      </w:r>
+      <w:r>
+        <w:t xml:space="preserve">(1970)</w:t>
+      </w:r>
+      <w:r>
+        <w:t xml:space="preserve">, and are placed on the map from the survey-quadrangle frame of that figure. Filled circles are the 28 decorated-ceramic assemblages analyzed here, open circles are the eight other assemblages of the 38 used in this study that fall inside the frame, and the Parkin site is starred. Phase areas are drawn over the HydroRIVERS river network</w:t>
       </w:r>
       <w:r>
         <w:t xml:space="preserve"> </w:t>
@@ -279,7 +309,7 @@
         <w:t xml:space="preserve">(Lehner and Grill 2013)</w:t>
       </w:r>
       <w:r>
-        <w:t xml:space="preserve">, with line width scaled by flow order. Markers show each assemblage that comprises its phase, and Parkin is starred. The bounded territories illustrate the premise under test, that each hosted a distinct, internally interacting society. The mapped assemblages fall in Arkansas, Tennessee, and Mississippi; Missouri lies just north of the frame. Inset: location in North America.</w:t>
+        <w:t xml:space="preserve">, with line width scaled by flow order. The bounded areas illustrate the premise under test, that each hosted a distinct, internally interacting society. The mapped area lies in Arkansas, Tennessee, and Mississippi; Missouri lies just north of the frame. Inset: location in North America.</w:t>
       </w:r>
     </w:p>
     <w:p>
@@ -512,7 +542,7 @@
         <w:t xml:space="preserve"> </w:t>
       </w:r>
       <w:r>
-        <w:t xml:space="preserve">formulated in the Lower Mississippi River Valley using assemblage similarity and spatial positions. We then turn to the phases that Mainfort</w:t>
+        <w:t xml:space="preserve">formulated in the Lower Mississippi River Valley using assemblage similarity and spatial positions. We then repeat the tests on the table Mainfort</w:t>
       </w:r>
       <w:r>
         <w:t xml:space="preserve"> </w:t>
@@ -524,7 +554,28 @@
         <w:t xml:space="preserve"> </w:t>
       </w:r>
       <w:r>
-        <w:t xml:space="preserve">redrew after ordinating the decorated types of largely the same collections. We use this second analysis to show what the same tests return when phase lines are formulated following the assemblage composition rather than the map.</w:t>
+        <w:t xml:space="preserve">compiled from largely the same collections, under his phase assignments. These follow Phillips’s, with Smith’s</w:t>
+      </w:r>
+      <w:r>
+        <w:t xml:space="preserve"> </w:t>
+      </w:r>
+      <w:r>
+        <w:t xml:space="preserve">(1990)</w:t>
+      </w:r>
+      <w:r>
+        <w:t xml:space="preserve"> </w:t>
+      </w:r>
+      <w:r>
+        <w:t xml:space="preserve">Horseshoe Lake phase split out, and add the phases of western Tennessee</w:t>
+      </w:r>
+      <w:r>
+        <w:t xml:space="preserve"> </w:t>
+      </w:r>
+      <w:r>
+        <w:t xml:space="preserve">(Mainfort 2003:176–177)</w:t>
+      </w:r>
+      <w:r>
+        <w:t xml:space="preserve">. We use this second analysis to ask whether the results hold on a second tally and a revised set of lines.</w:t>
       </w:r>
     </w:p>
     <w:p>
@@ -819,7 +870,19 @@
         <w:t xml:space="preserve">(Dunnell 1978; Neiman 1995)</w:t>
       </w:r>
       <w:r>
-        <w:t xml:space="preserve">. Plain wares track vessel function, paste, and site activities, none of which a copying model represents. Combining the frequency of plain and decorated classes also mixes factors driving relative investment in decorating ceramics, a process driven by factors beyond social learning and copying. Mississippi Plain and Bell Plain make up ca. 87 percent of the typed sherds. Ten decorated classes remain. Following Lipo</w:t>
+        <w:t xml:space="preserve">. Plain wares track vessel function, paste, and site activities, none of which a copying model represents. Combining the frequency of plain and decorated classes also mixes factors driving relative investment in decorating ceramics, a process driven by factors beyond social learning and copying. In Mainfort’s</w:t>
+      </w:r>
+      <w:r>
+        <w:t xml:space="preserve"> </w:t>
+      </w:r>
+      <w:r>
+        <w:t xml:space="preserve">(2003)</w:t>
+      </w:r>
+      <w:r>
+        <w:t xml:space="preserve"> </w:t>
+      </w:r>
+      <w:r>
+        <w:t xml:space="preserve">table of the same collections, Mississippi Plain and Bell Plain make up ca. 87 percent of the typed sherds. Ten decorated classes remain. Following Lipo</w:t>
       </w:r>
       <w:r>
         <w:t xml:space="preserve"> </w:t>
@@ -875,7 +938,16 @@
         <w:t xml:space="preserve">(Mainfort 2003:182)</w:t>
       </w:r>
       <w:r>
-        <w:t xml:space="preserve">. Because his counts are not entirely independent of ours, we do not combine them. Nor do we make his table the primary dataset. His phases were drawn from an ordination of these types, as noted above, and his table is not a larger sample once it is restricted to decorated classes: at a minimum of 100 decorated sherds, it holds 29 sites and 13,296 sherds in five phases, two of which have only four and three sites, against the 28 assemblages and 14,101 sherds analyzed here. We therefore analyze his table and his phases separately, as a contrast case.</w:t>
+        <w:t xml:space="preserve">. Because his counts are not entirely independent of ours, we do not combine them. Nor do we make his table the primary dataset. His assignments revise Phillips’s with phases defined later</w:t>
+      </w:r>
+      <w:r>
+        <w:t xml:space="preserve"> </w:t>
+      </w:r>
+      <w:r>
+        <w:t xml:space="preserve">(Smith 1990)</w:t>
+      </w:r>
+      <w:r>
+        <w:t xml:space="preserve">, and his table is not a larger sample once it is restricted to decorated classes: at a minimum of 100 decorated sherds, it holds 29 sites and 13,296 sherds in five phases, two of which have only four and three sites, against the 28 assemblages and 14,101 sherds analyzed here. We therefore analyze his table and his phases separately, as a second case.</w:t>
       </w:r>
     </w:p>
     <w:p>
@@ -883,19 +955,31 @@
         <w:pStyle w:val="BodyText"/>
       </w:pPr>
       <w:r>
-        <w:t xml:space="preserve">An assemblage enters our analysis based on the phase Mainfort</w:t>
-      </w:r>
-      <w:r>
-        <w:t xml:space="preserve"> </w:t>
-      </w:r>
-      <w:r>
-        <w:t xml:space="preserve">(1996:Figure 1)</w:t>
-      </w:r>
-      <w:r>
-        <w:t xml:space="preserve"> </w:t>
-      </w:r>
-      <w:r>
-        <w:t xml:space="preserve">assigns it to, or when it falls within the territory his assignments define. We exclude the Parchman phase on geography because its three assemblages lie across the Mississippi in Coahoma County, 30 to 46 km from the nearest other assemblage. We include only assemblages with at least 75 decorated sherds, the smallest count tested at which the</w:t>
+        <w:t xml:space="preserve">An assemblage takes the phase of the area it lies in, using the phase areas of Phillips</w:t>
+      </w:r>
+      <w:r>
+        <w:t xml:space="preserve"> </w:t>
+      </w:r>
+      <w:r>
+        <w:t xml:space="preserve">(1970)</w:t>
+      </w:r>
+      <w:r>
+        <w:t xml:space="preserve"> </w:t>
+      </w:r>
+      <w:r>
+        <w:t xml:space="preserve">as Lipo</w:t>
+      </w:r>
+      <w:r>
+        <w:t xml:space="preserve"> </w:t>
+      </w:r>
+      <w:r>
+        <w:t xml:space="preserve">(2001:Figure 2.6)</w:t>
+      </w:r>
+      <w:r>
+        <w:t xml:space="preserve"> </w:t>
+      </w:r>
+      <w:r>
+        <w:t xml:space="preserve">mapped them (Figure 1). An assemblage that lies inside no area takes the nearest one. Two assemblages of the matrix, Parchman and Salomon in Coahoma County, Mississippi, lie south of the mapped areas and are not assigned. We include only assemblages with at least 75 decorated sherds. At that count, the</w:t>
       </w:r>
       <w:r>
         <w:t xml:space="preserve"> </w:t>
@@ -921,7 +1005,7 @@
         <w:t xml:space="preserve"> </w:t>
       </w:r>
       <w:r>
-        <w:t xml:space="preserve">that sampling alone produces between two assemblages drawn from one profile falls, at its 95th percentile, below the observed five-cluster value (Supplemental Text). These rules leave 28 assemblages holding 14,101 decorated sherds (median 251 per assemblage, range 79 to 1,709) in three phases: Parkin with 11 assemblages, Kent with 8, and Walls with 9. Twenty-five carry Mainfort’s assignment and three the territory’s. We georeferenced each assemblage from the Lower Mississippi Survey site files. We obtained settlement attributes from a regional database</w:t>
+        <w:t xml:space="preserve">that sampling alone produces between two assemblages drawn from one profile has a median of 14 percent of the observed five-cluster value, and its 95th percentile falls below that value (Supplemental Text). The Nodena phase keeps a single assemblage of that size, Carson Lake, and is not carried as a phase of one. These rules leave 28 assemblages holding 14,101 decorated sherds (median 251 per assemblage, range 79 to 1,709) in three phases: Parkin with 12 assemblages, Kent with 11, and Walls with 5. Twenty-six lie inside a phase area. The other two, Cramor Place and Holden Lake, lie 1.0 km outside the nearest area, within the drafting error of the source map. We georeferenced each assemblage from the Lower Mississippi Survey site files. We obtained settlement attributes from a regional database</w:t>
       </w:r>
       <w:r>
         <w:t xml:space="preserve"> </w:t>
@@ -1001,7 +1085,7 @@
         <w:t xml:space="preserve">2020)</w:t>
       </w:r>
       <w:r>
-        <w:t xml:space="preserve">, place the basin occupation in the fourteenth to sixteenth centuries (summed-probability median AD 1428; Parkin, AD 1483), with a decline across the contact interval (Supplemental Text). A calibration plateau across that interval prevents year-scale resolution</w:t>
+        <w:t xml:space="preserve">, place about three-quarters of the summed probability between the mid-thirteenth and the mid-seventeenth centuries (median AD 1428; Parkin, AD 1483). The summed probability does not fall at the contact interval: the century after AD 1541 holds as much of it as the century before, and it falls in the century after that (Supplemental Text). A calibration plateau across the contact interval prevents year-scale resolution</w:t>
       </w:r>
       <w:r>
         <w:t xml:space="preserve"> </w:t>
@@ -1019,7 +1103,7 @@
         <w:t xml:space="preserve">(Baxter 1994; Peeples and Schachner 2012; Smith and Neiman 2007)</w:t>
       </w:r>
       <w:r>
-        <w:t xml:space="preserve">. That axis follows geography more closely than time. Its rank correlation with latitude is +0.77, and latitude and longitude together account for 62 percent of its variance. Kent Place and Hollywood, the two earliest dated deposits, lie at the same end as Clay Hill, the latest</w:t>
+        <w:t xml:space="preserve">. That axis follows geography more closely than time. Its rank correlation with latitude is +0.77, and latitude and longitude together account for 63 percent of its variance. Kent Place and Hollywood, the two earliest dated deposits, lie at the same end as Clay Hill, the latest</w:t>
       </w:r>
       <w:r>
         <w:t xml:space="preserve"> </w:t>
@@ -1190,7 +1274,7 @@
         <w:t xml:space="preserve">(Brainerd 1951; Robinson 1951)</w:t>
       </w:r>
       <w:r>
-        <w:t xml:space="preserve">, normally fades smoothly with distance. The boundary excess is how much more similarity is lost across a line than distance predicts, a step in similarity at the line.</w:t>
+        <w:t xml:space="preserve">, normally fades smoothly with distance. The boundary excess is how much more similarity is lost across a line than distance predicts, a step in similarity at the line. We compare pairs of assemblages on the same side of a line with pairs on opposite sides at matched distances, in four distance bins, and average the differences over the bins that hold at least five pairs of each kind.</w:t>
       </w:r>
     </w:p>
     <w:p>
@@ -1425,7 +1509,18 @@
         <w:t xml:space="preserve"> </w:t>
       </w:r>
       <w:r>
-        <w:t xml:space="preserve">and boundary excess under the phase assignments with alternative divisions of the same assemblages into groups of the same sizes, drawn around randomly placed centers or made as spatially compact as possible. We state each comparison as the posterior probability that the phase lines separate type frequencies better than an alternative (see Statistical approach). Simulations with copying restricted at the phase lines show whether this comparison could detect such a restriction. Second, we cluster the assemblages using site coordinates and decorated-class composition together, vary how much weight composition carries, and measure agreement with Mainfort’s assignments with the adjusted Rand index</w:t>
+        <w:t xml:space="preserve">and boundary excess under the phase assignments with alternative divisions of the same assemblages into groups of the same sizes, drawn around randomly placed centers or made as spatially compact as possible. We state each comparison as the posterior probability that the phase lines separate type frequencies better than an alternative (see Statistical approach). Simulations with copying restricted at the phase lines show whether this comparison could detect such a restriction. Second, we cluster the assemblages, by</w:t>
+      </w:r>
+      <w:r>
+        <w:t xml:space="preserve"> </w:t>
+      </w:r>
+      <m:oMath>
+        <m:r>
+          <m:t>k</m:t>
+        </m:r>
+      </m:oMath>
+      <w:r>
+        <w:t xml:space="preserve">-means and by Ward linkage, using site coordinates and decorated-class composition together, vary how much weight composition carries, and measure agreement with the phase assignments with the adjusted Rand index</w:t>
       </w:r>
       <w:r>
         <w:t xml:space="preserve"> </w:t>
@@ -1474,7 +1569,7 @@
         <w:pStyle w:val="BodyText"/>
       </w:pPr>
       <w:r>
-        <w:t xml:space="preserve">The contrast case applies the first two tests, together with a search for the most spatially compact division, to Mainfort’s</w:t>
+        <w:t xml:space="preserve">The second case applies the first two tests, together with a search for the most spatially compact division, to Mainfort’s</w:t>
       </w:r>
       <w:r>
         <w:t xml:space="preserve"> </w:t>
@@ -1486,7 +1581,7 @@
         <w:t xml:space="preserve"> </w:t>
       </w:r>
       <w:r>
-        <w:t xml:space="preserve">counts under his own phases. Because the two schemes were drawn differently, this explanation predicts that they behave differently. If the inherited phases are a gradient sorted by proximity, the map should recover them, and other lines should separate the assemblages as well or better. A scheme drawn from an ordination should instead be recovered better once composition enters, and its lines should separate the assemblages better than other lines do. If phases of either kind marked bounded groups, however, both schemes should locate the same boundaries. We do not run the copying model on his table, since the model is calibrated to our matrix, so the contrast case cannot show whether his phases differ by more than copying alone produces.</w:t>
+        <w:t xml:space="preserve">counts under his own phase assignments. It asks whether the results depend on the tally or on the particular lines. His table is a second count of largely the same collections, and his scheme differs from Phillips’s at the Horseshoe Lake phase and in western Tennessee. If the phases marked bounded groups, the two schemes should locate the same boundaries where they cover the same ground. We do not run the copying model on his table, since the model is calibrated to our matrix, so the second case cannot show whether his phases differ by more than copying alone produces.</w:t>
       </w:r>
     </w:p>
     <w:bookmarkEnd w:id="123"/>
@@ -1538,7 +1633,7 @@
         <w:t xml:space="preserve"> </w:t>
       </w:r>
       <w:r>
-        <w:t xml:space="preserve">and 500 times for the slower boundary excess, and recomputing a statistic on each draw gives that statistic’s posterior distribution. We report its median and a 95 percent credible interval (the 2.5th to 97.5th percentiles of the draws); given the counts and the prior, the quantity lies in that interval with probability 0.95. When the phase lines are compared with alternative divisions, each draw is scored against 20 alternatives of each kind (10 for the boundary excess) chosen at random from 300, and the posterior probability that the phase lines separate the assemblages better is the share of all these comparisons they win. A probability of 0.20 therefore means that, allowing for sampling error in every assemblage, the phase lines beat a randomly chosen alternative in one comparison in five. Where a probability or a share rounds to zero, we give the number of comparisons or runs behind it, since the true value is then known only to be smaller than that resolution.</w:t>
+        <w:t xml:space="preserve">and 500 times for the slower boundary excess, and recomputing a statistic on each draw gives that statistic’s posterior distribution. We report its median and a 95 percent credible interval (the 2.5th to 97.5th percentiles of the draws); given the counts and the prior, the quantity lies in that interval with probability 0.95. When the phase lines are compared with alternative divisions, each draw is scored against 20 alternatives of each kind (10 for the boundary excess) chosen at random from 300, and the posterior probability that the phase lines separate the assemblages better is the share of all these comparisons they win. A probability of 0.57 therefore means that, allowing for sampling error in every assemblage, the phase lines beat a randomly chosen alternative in somewhat more than half of the comparisons. Where a probability or a share rounds to zero, we give the number of comparisons or runs behind it, since the true value is then known only to be smaller than that resolution.</w:t>
       </w:r>
     </w:p>
     <w:p>
@@ -1594,7 +1689,7 @@
     </w:p>
     <w:bookmarkEnd w:id="124"/>
     <w:bookmarkEnd w:id="125"/>
-    <w:bookmarkStart w:id="154" w:name="results"/>
+    <w:bookmarkStart w:id="157" w:name="results"/>
     <w:p>
       <w:pPr>
         <w:pStyle w:val="Heading2"/>
@@ -1617,7 +1712,7 @@
         <w:pStyle w:val="FirstParagraph"/>
       </w:pPr>
       <w:r>
-        <w:t xml:space="preserve">Neutral copying on the real map accounts for most of what the basin’s decorated-type frequencies show. Tuning the model to the record’s diversity matched 50 of the 297 combinations on the six-run screen, and 45 still matched when rerun fifty times (Supplemental Text, Figure S7). At the matched combination most favorable to it (2,000 learners per node, an innovation rate of 0.001, and a mixing rate of 0.02), copying with no groups reproduces the fading of similarity with distance (observed correlation of similarity with distance along the rivers -0.20, against a simulated 95 percent range of -0.53 to +0.04) and the difference between the two spatial clusters the site layout supports (Table 1).</w:t>
+        <w:t xml:space="preserve">Neutral copying on the real map accounts for most of what the basin’s decorated-type frequencies show. Tuning the model to the record’s diversity matched 51 of the 297 combinations on the six-run screen, and 48 still matched when rerun fifty times (Supplemental Text, Figure S7). At the matched combination most favorable to it (2,000 learners per node, an innovation rate of 0.001, and a mixing rate of 0.02), copying with no groups reproduces the fading of similarity with distance (observed correlation of similarity with distance along the rivers -0.20, against a simulated 95 percent range of -0.48 to +0.04) and the difference between the two spatial clusters the site layout supports (Table 1).</w:t>
       </w:r>
     </w:p>
     <w:p>
@@ -1625,7 +1720,7 @@
         <w:pStyle w:val="BodyText"/>
       </w:pPr>
       <w:r>
-        <w:t xml:space="preserve">A model with no divisions at all describes the record adequately. On the logit scale of its latent class probabilities, it assigns 99.6 percent of the variance among assemblages to the spatial surface (posterior median; 95 percent credible interval 97.2 to 100 percent) and little to independent site deviations, and it reproduces the observed between-cluster</w:t>
+        <w:t xml:space="preserve">A model with no divisions at all describes the record adequately. On the logit scale of its latent class probabilities, it assigns 98.7 percent of the variance among assemblages to the spatial surface (posterior median; 95 percent credible interval 95.4 to 100 percent) and little to independent site deviations, and it reproduces the observed between-cluster</w:t>
       </w:r>
       <w:r>
         <w:t xml:space="preserve"> </w:t>
@@ -1695,7 +1790,7 @@
         <w:t xml:space="preserve"> </w:t>
       </w:r>
       <w:r>
-        <w:t xml:space="preserve">against the neutral copying model, which contains no groups. Model values are the median and 95 percent range over 300 runs at the matched combination most favorable to the model. The last column gives the share of runs reaching the observed value there and, in parentheses, the range of that share across the six most favorable combinations that passed the confirmation. Radius is the root-mean-square distance from an assemblage to its group’s center. A share of 0 percent means none of the 300 runs; a frequency below about 0.3 percent is not an impossibility. At five or more clusters, at least one cluster holds a single assemblage, so finer divisions are reported only in the Supplemental Text.</w:t>
+        <w:t xml:space="preserve">against the neutral copying model, which contains no groups. Model values are the median and 95 percent range over 300 runs at the matched combination most favorable to the model. The last column gives the share of runs reaching the observed value there and, in parentheses, the range of that share across the six most favorable combinations that passed the confirmation. Radius is the root-mean-square distance from an assemblage to its group’s center. A share of 0 percent means none of the 300 runs; a frequency below about 0.3 percent is not an impossibility. Divisions finer than four clusters are reported in the Supplemental Text; from eight clusters on, at least one cluster holds a single assemblage.</w:t>
       </w:r>
     </w:p>
     <w:tbl>
@@ -1795,7 +1890,7 @@
               <w:pStyle w:val="Compact"/>
             </w:pPr>
             <w:r>
-              <w:t xml:space="preserve">Two spatial clusters (the Parkin phase against the rest)</w:t>
+              <w:t xml:space="preserve">Two spatial clusters</w:t>
             </w:r>
           </w:p>
         </w:tc>
@@ -1819,7 +1914,7 @@
               <w:jc w:val="right"/>
             </w:pPr>
             <w:r>
-              <w:t xml:space="preserve">17.6</w:t>
+              <w:t xml:space="preserve">16.6</w:t>
             </w:r>
           </w:p>
         </w:tc>
@@ -1842,7 +1937,7 @@
               <w:pStyle w:val="Compact"/>
             </w:pPr>
             <w:r>
-              <w:t xml:space="preserve">0.0019 (0.0002 to 0.0124)</w:t>
+              <w:t xml:space="preserve">0.0021 (0.0002 to 0.0108)</w:t>
             </w:r>
           </w:p>
         </w:tc>
@@ -1853,7 +1948,7 @@
               <w:pStyle w:val="Compact"/>
             </w:pPr>
             <w:r>
-              <w:t xml:space="preserve">13% (4 to 16%)</w:t>
+              <w:t xml:space="preserve">12% (8 to 13%)</w:t>
             </w:r>
           </w:p>
         </w:tc>
@@ -1866,7 +1961,7 @@
               <w:pStyle w:val="Compact"/>
             </w:pPr>
             <w:r>
-              <w:t xml:space="preserve">The inherited phases</w:t>
+              <w:t xml:space="preserve">The phases</w:t>
             </w:r>
           </w:p>
         </w:tc>
@@ -1890,7 +1985,7 @@
               <w:jc w:val="right"/>
             </w:pPr>
             <w:r>
-              <w:t xml:space="preserve">13.8</w:t>
+              <w:t xml:space="preserve">14.1</w:t>
             </w:r>
           </w:p>
         </w:tc>
@@ -1902,7 +1997,7 @@
               <w:jc w:val="right"/>
             </w:pPr>
             <w:r>
-              <w:t xml:space="preserve">0.0110</w:t>
+              <w:t xml:space="preserve">0.0123</w:t>
             </w:r>
           </w:p>
         </w:tc>
@@ -1913,7 +2008,7 @@
               <w:pStyle w:val="Compact"/>
             </w:pPr>
             <w:r>
-              <w:t xml:space="preserve">0.0034 (0.0008 to 0.0138)</w:t>
+              <w:t xml:space="preserve">0.0024 (0.0004 to 0.0104)</w:t>
             </w:r>
           </w:p>
         </w:tc>
@@ -1924,7 +2019,7 @@
               <w:pStyle w:val="Compact"/>
             </w:pPr>
             <w:r>
-              <w:t xml:space="preserve">5% (1 to 12%)</w:t>
+              <w:t xml:space="preserve">1% (0 to 3%)</w:t>
             </w:r>
           </w:p>
         </w:tc>
@@ -1961,7 +2056,7 @@
               <w:jc w:val="right"/>
             </w:pPr>
             <w:r>
-              <w:t xml:space="preserve">13.6</w:t>
+              <w:t xml:space="preserve">12.5</w:t>
             </w:r>
           </w:p>
         </w:tc>
@@ -1984,7 +2079,7 @@
               <w:pStyle w:val="Compact"/>
             </w:pPr>
             <w:r>
-              <w:t xml:space="preserve">0.0035 (0.0007 to 0.0135)</w:t>
+              <w:t xml:space="preserve">0.0036 (0.0006 to 0.0132)</w:t>
             </w:r>
           </w:p>
         </w:tc>
@@ -1995,7 +2090,7 @@
               <w:pStyle w:val="Compact"/>
             </w:pPr>
             <w:r>
-              <w:t xml:space="preserve">1% (1 to 6%)</w:t>
+              <w:t xml:space="preserve">1% (0 to 2%)</w:t>
             </w:r>
           </w:p>
         </w:tc>
@@ -2032,7 +2127,7 @@
               <w:jc w:val="right"/>
             </w:pPr>
             <w:r>
-              <w:t xml:space="preserve">11.7</w:t>
+              <w:t xml:space="preserve">10.3</w:t>
             </w:r>
           </w:p>
         </w:tc>
@@ -2055,7 +2150,7 @@
               <w:pStyle w:val="Compact"/>
             </w:pPr>
             <w:r>
-              <w:t xml:space="preserve">0.0041 (0.0010 to 0.0146)</w:t>
+              <w:t xml:space="preserve">0.0040 (0.0011 to 0.0135)</w:t>
             </w:r>
           </w:p>
         </w:tc>
@@ -2066,7 +2161,7 @@
               <w:pStyle w:val="Compact"/>
             </w:pPr>
             <w:r>
-              <w:t xml:space="preserve">1% (0 to 4%)</w:t>
+              <w:t xml:space="preserve">1% (0 to 1%)</w:t>
             </w:r>
           </w:p>
         </w:tc>
@@ -2077,7 +2172,7 @@
         <w:pStyle w:val="BodyText"/>
       </w:pPr>
       <w:r>
-        <w:t xml:space="preserve">The model does not account for everything. Between phases, it matches the observed difference in 5 percent of runs at the most favorable combination, and at three and four spatial clusters it matches the observed value in 0 to 6 percent of runs at each of the six (Table 1). The assemblages vary over shorter distances than calibrated copying does. The step in similarity across the phase lines also exceeds the model. The boundary excess is +10.0, against a simulated median of +1.5 (95 percent range -6.0 to +7.8), and 1 of 300 runs reaches it. This additional variation is not due to sampling. Redrawing every assemblage from the basin’s pooled profile at its own sherd count gives between-cluster differences near zero (Supplemental Text).</w:t>
+        <w:t xml:space="preserve">The model does not account for everything. Between phases, it matches the observed difference in 1 percent of runs at the most favorable combination and in 0 to 3 percent across the six, and at three and four spatial clusters it matches the observed value in 0 to 2 percent of runs at each of the six (Table 1). The assemblages vary over shorter distances than calibrated copying does. The step in similarity across the phase lines also exceeds the model. The boundary excess is +7.7, against a simulated median of +1.2 (95 percent range -3.3 to +6.7), and 1 percent of 300 runs reach it. This additional variation is not due to sampling. Redrawing every assemblage from the basin’s pooled profile at its own sherd count gives between-cluster differences near zero (Supplemental Text).</w:t>
       </w:r>
     </w:p>
     <w:p>
@@ -2085,7 +2180,7 @@
         <w:pStyle w:val="BodyText"/>
       </w:pPr>
       <w:r>
-        <w:t xml:space="preserve">The next section asks whether that additional variation follows the phase lines. What produces it is a separate question, and the model can narrow it without settling it (Table 2). We relaxed four model simplifications one at a time at the calibrated combination, and evaluated every variant, including the baseline, by the same three criteria: whether its median reaches the observation, how often its runs reach it, and whether the record’s diversity stays matched (Supplemental Text). No variant that keeps diversity matched brings its median up to the observed three- and four-cluster values. Two raise the share of runs reaching those values while keeping diversity matched. Letting new styles arise somewhat locally, each of the two spatial clusters drawing its new variants from a slightly different version of the regional profile, raises it from 3 and 1 percent in baseline runs with the same seeds to 42 and 40 percent when a quarter of the classes are reordered (300 runs each); with the phases as the areas and a fifth of the classes reordered, 39 percent of runs reach the observed between-phase value. Copying that falls off over a short straight-line distance (6 km) raises it to 11 and 7 percent. Unequal site populations and shorter fall-off along the rivers raise it further but break the diversity match; not recalibrated, they are unsupported rather than excluded. None of these variants restricts who copies whom, and the test cannot tell whether local innovation followed the phases or any other division of the basin.</w:t>
+        <w:t xml:space="preserve">The next section asks whether that additional variation follows the phase lines. What produces it is a separate question, and the model can narrow it without settling it (Table 2). We relaxed four model simplifications one at a time at the calibrated combination, and evaluated every variant, including the baseline, by the same three criteria: whether its median reaches the observation, how often its runs reach it, and whether the record’s diversity stays matched (Supplemental Text). No variant that keeps diversity matched brings its median up to the observed four-cluster value, and one reaches the three-cluster value only at its strongest setting. Among the variants that keep diversity matched, two raise the share of runs reaching those values, one markedly and one slightly, and the others leave it within two points of the baseline. Letting new styles arise somewhat locally, each of the two spatial clusters drawing its new variants from a slightly different version of the regional profile, raises it from 2 and 1 percent in baseline runs with the same seeds to 44 and 41 percent when a quarter of the classes are reordered (300 runs each); with the phases as the areas and a fifth of the classes reordered, 30 percent of runs reach the observed between-phase value (the grid that treats the phases as groups; Supplemental Text). Copying that falls off over a short straight-line distance (6 km) raises it to 7 and 5 percent. Unequal site populations and shorter fall-off along the rivers raise it further but break the diversity match; not recalibrated, they are unsupported rather than excluded. These runs do not resolve the grain of local innovation. The settings that fit use areas the size of half the basin (the two clusters, 16.6 km in radius; Table 1). With five or eight neighborhoods of sites as the areas, runs reach the three- and four-cluster values in 13 to 30 percent of cases but break the diversity match, so those settings are unsupported at this calibration. With each site drawing its own new variants, runs reach those values no more often than the baseline does: 2 and 0 percent at the one strength that keeps diversity matched, a small dose that changes the profile of only 15 percent of sites, and 2 and 1 percent at a dose comparable to the weakest two-cluster setting, where the diversity match breaks (Supplemental Text). None of these variants restricts who copies whom, and the test cannot tell whether local innovation followed the phases or any other division of the basin.</w:t>
       </w:r>
     </w:p>
     <w:p>
@@ -2093,7 +2188,7 @@
         <w:pStyle w:val="BodyText"/>
       </w:pPr>
       <w:r>
-        <w:t xml:space="preserve">Restricting copying across the phase lines, the property that would make the phase groups, also increases both statistics. With copying across the lines cut to 3 percent of its strength, 40 percent of runs reach the observed between-phase</w:t>
+        <w:t xml:space="preserve">Restricting copying across the phase lines, the property that would make the phases groups, also increases both statistics. With copying across the lines cut to 3 percent of its strength, 22 percent of runs reach the observed between-phase</w:t>
       </w:r>
       <w:r>
         <w:t xml:space="preserve"> </w:t>
@@ -2119,7 +2214,7 @@
         <w:t xml:space="preserve"> </w:t>
       </w:r>
       <w:r>
-        <w:t xml:space="preserve">and 34 percent reach the observed step at the lines. The copying model, however, cannot distinguish the two. The posterior probability of a copying boundary at the phase lines is 0.79, against a prior of 0.75. On simulated records with a built-in boundary, the same procedure returns a median of 0.81 to 0.95 (40 test records per setting), and on records without one, a median of 0.66. The record’s value falls between the two, so it leans slightly toward a boundary without resolving one. That lean is not specific to the phases: run on three arbitrary divisions with the phases’ group sizes, the same analysis gives 0.78 to 0.92. The comparisons of where the lines fall, taken up next, bear more directly on the question, although they too discriminate only moderately.</w:t>
+        <w:t xml:space="preserve">and 38 percent reach the observed step at the lines. The copying model, however, cannot distinguish the two. The posterior probability of a copying boundary at the phase lines is 0.75, the same as its prior. On simulated records with a built-in boundary, the same procedure returns a median of 0.79 to 0.94 (40 test records per setting), and on records without one, a median of 0.66. The record’s value falls between the two and has not moved from the prior, so the model neither supports nor excludes a boundary. Three arbitrary divisions with the phases’ group sizes, run through the same analysis, give 0.70 to 0.85. The comparisons of where the lines fall, taken up next, bear more directly on the question, although they too discriminate only moderately.</w:t>
       </w:r>
     </w:p>
     <w:p>
@@ -2163,7 +2258,7 @@
         <w:t xml:space="preserve"> </w:t>
       </w:r>
       <w:r>
-        <w:t xml:space="preserve">reaches the observed value, the share of its runs reaching the observed value (predictive coverage), and whether it keeps all three within-assemblage diversity summaries within 10 percent of the observed values. Shares for the relaxations are from 300 runs at the calibrated combination, scored at three and four spatial clusters, where the baseline falls short. Relaxations are one at a time and not recalibrated. Full grids and diagnostics are in the Supplemental Text.</w:t>
+        <w:t xml:space="preserve">reaches the observed value, the share of its runs reaching the observed value (predictive coverage), and whether it keeps all three within-assemblage diversity summaries within 10 percent of the observed values. Shares for the relaxations are from 300 runs at the calibrated combination, scored at three and four spatial clusters, where the baseline falls short; the baseline row gives the range across the six leading combinations (Table 1), and the same seeds as the relaxations give 2 and 1 percent. Relaxations are one at a time and not recalibrated. Full grids and diagnostics are in the Supplemental Text.</w:t>
       </w:r>
     </w:p>
     <w:tbl>
@@ -2256,7 +2351,7 @@
               <w:t xml:space="preserve"> </w:t>
             </w:r>
             <w:r>
-              <w:t xml:space="preserve">Diversity matched; covers the decrease with distance and the two-cluster difference (13 percent of runs), but runs reach the three- and four-cluster values in 0 to 6 percent and the between-phase value in 5 percent</w:t>
+              <w:t xml:space="preserve">Diversity matched; covers the decrease with distance and the two-cluster difference (12 percent of runs), but runs reach the three- and four-cluster values in 0 to 2 percent and the between-phase value in 0 to 3 percent</w:t>
             </w:r>
           </w:p>
         </w:tc>
@@ -2295,13 +2390,13 @@
                 <w:b/>
                 <w:bCs/>
               </w:rPr>
-              <w:t xml:space="preserve">Not supported.</w:t>
+              <w:t xml:space="preserve">Not resolved.</w:t>
             </w:r>
             <w:r>
               <w:t xml:space="preserve"> </w:t>
             </w:r>
             <w:r>
-              <w:t xml:space="preserve">The map recovers the lines, and alternative divisions separate the assemblages as well or better; in simulation at the calibrated combination a strong restriction usually reverses that ordering, but the real score is uncommon under every simulated setting, so a weak restriction cannot be excluded</w:t>
+              <w:t xml:space="preserve">The lines separate the assemblages about as well as alternative divisions (posterior probabilities 0.57 and 0.72), and hierarchical clustering of site locations alone recovers them for all but two assemblages, while composition changes slowly along them at bandwidths of 10 to 15 km; in simulation at the calibrated combination the real score is common with no restriction and less common with a strong one, which weighs weakly against a restriction and excludes neither</w:t>
             </w:r>
           </w:p>
         </w:tc>
@@ -2372,7 +2467,7 @@
               <w:t xml:space="preserve"> </w:t>
             </w:r>
             <w:r>
-              <w:t xml:space="preserve">from local innovation; posterior 0.79 against a prior of 0.75, and 0.78 to 0.92 for arbitrary divisions</w:t>
+              <w:t xml:space="preserve">from local innovation; posterior 0.75 against a prior of 0.75, and 0.70 to 0.85 for arbitrary divisions</w:t>
             </w:r>
           </w:p>
         </w:tc>
@@ -2507,7 +2602,7 @@
               <w:t xml:space="preserve"> </w:t>
             </w:r>
             <w:r>
-              <w:t xml:space="preserve">Diversity matched; 11 and 7 percent of runs reach the three- and four-cluster values; medians fall short</w:t>
+              <w:t xml:space="preserve">Diversity matched; 7 and 5 percent of runs reach the three- and four-cluster values; medians fall short</w:t>
             </w:r>
           </w:p>
         </w:tc>
@@ -2552,7 +2647,7 @@
               <w:t xml:space="preserve"> </w:t>
             </w:r>
             <w:r>
-              <w:t xml:space="preserve">Diversity matched; 28 to 44 percent of runs reach the three- and four-cluster values at reordered shares of 0.2 to 0.3; medians fall short at those scales, and simulations are widely spread</w:t>
+              <w:t xml:space="preserve">Diversity matched; 28 to 50 percent of runs reach the three- and four-cluster values at reordered shares of 0.2 to 0.3; the median reaches the three-cluster value only at 0.3 and falls short at four clusters, and simulations are widely spread</w:t>
             </w:r>
           </w:p>
         </w:tc>
@@ -2573,7 +2668,7 @@
         <w:pStyle w:val="FirstParagraph"/>
       </w:pPr>
       <w:r>
-        <w:t xml:space="preserve">If the phases marked restrictions on copying, their lines should separate the assemblages better than other lines and fall where composition changes fastest. They do neither.</w:t>
+        <w:t xml:space="preserve">If the phases marked restrictions on copying, their lines should separate the assemblages better than other lines and fall where composition changes fastest. On the first, the comparison is close to even. On the second, the lines fall where composition changes slowly.</w:t>
       </w:r>
     </w:p>
     <w:p>
@@ -2581,7 +2676,7 @@
         <w:pStyle w:val="BodyText"/>
       </w:pPr>
       <w:r>
-        <w:t xml:space="preserve">Most alternative divisions of the same sites separate the assemblages better than the phase lines do. With the uncertainty in every assemblage’s counts carried through, the between-phase</w:t>
+        <w:t xml:space="preserve">The phase lines separate the assemblages about as well as alternative divisions of the same sites. With the uncertainty in every assemblage’s counts carried through, the between-phase</w:t>
       </w:r>
       <w:r>
         <w:t xml:space="preserve"> </w:t>
@@ -2607,7 +2702,7 @@
         <w:t xml:space="preserve"> </w:t>
       </w:r>
       <w:r>
-        <w:t xml:space="preserve">has a posterior median of 0.0109 (95 percent credible interval 0.0091 to 0.0128). Divisions of the same assemblages into groups of the same sizes around randomly placed centers give a median of 0.0145, and divisions drawn to be as compact as possible give 0.0165. The posterior probability that the phase lines separate the assemblages better than a division around random centers is 0.20, and better than a compact division is 0.05 (Figure 3B, C). The similarity step at the lines is less decisive. The boundary excess at the phase lines (posterior median +9.4, 95 percent credible interval +4.6 to +13.9) exceeds what copying alone produces, but arbitrary divisions of the map show a similar step, with a median of +6.9 around random centers and +4.6 for compact divisions, and the posterior probability that the phase lines show more is 0.59 and 0.61, close to even. The shorter-range variation the copying model misses is a property of the basin’s assemblages, however they are divided, not of the phase lines.</w:t>
+        <w:t xml:space="preserve">has a posterior median of 0.0121 (95 percent credible interval 0.0101 to 0.0144). Divisions of the same assemblages into groups of the same sizes around randomly placed centers give a median of 0.0112, and divisions drawn to be as compact as possible give 0.0103. The posterior probability that the phase lines separate the assemblages better than a division around random centers is 0.57, and better than a compact division is 0.72 (Figure 3B, C). The similarity step at the lines gives the same answer. The boundary excess at the phase lines has a posterior median of +7.3 (95 percent credible interval +4.6 to +9.8), and its direct value of +7.7 lies above the copying model’s range, but arbitrary divisions of the map show a similar step, with a median of +6.3 for divisions of both kinds, and the posterior probability that the phase lines show more is 0.58 and 0.65. On both measures the phase lines do somewhat better than the alternatives, by margins that leave the comparison open. The shorter-range variation the copying model misses is a property of the basin’s assemblages, however they are divided, and the phase lines capture about as much of it as other lines do.</w:t>
       </w:r>
     </w:p>
     <w:p>
@@ -2615,7 +2710,7 @@
         <w:pStyle w:val="BodyText"/>
       </w:pPr>
       <w:r>
-        <w:t xml:space="preserve">This comparison responds to restricted copying at the lines, but it does not discriminate sharply. In records simulated at the calibrated combination, with copying across the phase lines cut to 3 percent of its strength, the phase lines separate the simulated assemblages better than a median of 90 percent for same-size divisions around random centers and 74 percent for compact ones, versus 62 and 41 percent with no restriction. The real phase lines, scored the same way, beat 30 and 4 percent. The simulated distributions overlap widely (Supplemental Text, Figure S8). A score as low as the real one against random-center divisions occurs in 5 percent of records simulated without a restriction and 1 percent with the strongest (100 records per setting), and against compact divisions in 13 and 4 percent. The separation is smaller at two other diversity-matched combinations (Supplemental Text). The real score lies in the lower tail of every setting, including the unrestricted one, so it weighs moderately against a strong restriction at the calibrated combination and less at the others; it cannot exclude a weak one, and it leaves open that the copying model misdescribes how the assemblages vary. On the step in similarity, the comparison is even less informative: the real lines beat 72 and 68 percent of the alternatives, above the median without restriction (56 and 27 percent) and within the range of those with copying restricted (76 to 90 and 58 to 78 percent).</w:t>
+        <w:t xml:space="preserve">This comparison responds to restricted copying at the lines, but it does not discriminate sharply. In records simulated at the calibrated combination, with copying across the phase lines cut to 3 percent of its strength, the phase lines separate the simulated assemblages better than a median of 83 percent of same-size divisions around random centers and 79 percent of compact ones, versus 38 percent of each with no restriction. The real phase lines, scored the same way, beat 64 and 58 percent. The simulated distributions overlap widely (Supplemental Text, Figure S8). A score as low as the real one against random-center divisions occurs in 78 percent of records simulated without a restriction and 29 percent with the strongest (100 records per setting), and against compact divisions in 66 and 28 percent. The separation is smaller at two other diversity-matched combinations (Supplemental Text). The real score therefore lies above the middle of the unrestricted records and below the middle of the strongly restricted ones. It is unremarkable under either. A score this low is between two and three times as common without a restriction as with the strongest one, which weighs weakly against a restriction at the lines and does not exclude one. The step in similarity is no more informative: the real lines beat 76 and 84 percent of the alternatives, above the median without restriction (65 and 63 percent) and at or below the medians with copying restricted (86 to 92 and 84 to 94 percent).</w:t>
       </w:r>
     </w:p>
     <w:p>
@@ -2623,7 +2718,7 @@
         <w:pStyle w:val="BodyText"/>
       </w:pPr>
       <w:r>
-        <w:t xml:space="preserve">The phase lines reflect the map’s spatial structure. Their within-group spread, 189.9 km² per assemblage, is the tightest three-way division of these assemblages at these group sizes that our search found. A search that minimizes spatial spread and is not based on type frequencies returned the phase division in exactly 156 of 1,000 random starts and found nothing tighter in any of them. The phases are the most compact way to divide the sites into spatially delineated groups of those sizes.</w:t>
+        <w:t xml:space="preserve">The phase division is not the map’s most compact one. Its within-group spread is 197.5 km² per assemblage, against 157.1 km² for the tightest three-way division of these assemblages at these group sizes that our search found. A search that minimizes spatial spread and is not based on type frequencies did not return the phase division in any of 1,000 random starts (mean adjusted Rand index with the phases 0.53), and 41 percent of the compact divisions and 15 percent of those around random centers are tighter than the phases.</w:t>
       </w:r>
     </w:p>
     <w:p>
@@ -2633,9 +2728,9 @@
       <w:r>
         <w:drawing>
           <wp:inline>
-            <wp:extent cx="5334000" cy="2584123"/>
+            <wp:extent cx="5334000" cy="2603144"/>
             <wp:effectExtent b="0" l="0" r="0" t="0"/>
-            <wp:docPr descr="Figure 3. Scale and boundaries. (A) Observed between-cluster cultural F_{ST} against the neutral copying model as the basin is divided into two through six clusters. The observed value lies inside the model’s range at two clusters and above it from three. (B) Within-group spatial spread against cultural F_{ST} for divisions with the phases’ group sizes around randomly placed centers (light) and drawn to minimize spread (dark); the star is the phase division. Differentiation is unrelated to compactness among the random divisions (Spearman -0.02) and moderately related among the compact ones (+0.45), and no division in either set is tighter than the phases. (C) The phase division’s F_{ST} (solid line) against the compact divisions is near the bottom of their range." title="" id="128" name="Picture"/>
+            <wp:docPr descr="Figure 3. Scale and boundaries. (A) Observed between-cluster cultural F_{ST} against the neutral copying model as the basin is divided into two through six clusters. The observed value lies inside the model’s range at two clusters and above it from three. (B) Within-group spatial spread against cultural F_{ST} for divisions with the phases’ group sizes around randomly placed centers (light) and drawn to minimize spread (dark); the star is the phase division. Differentiation is unrelated to compactness among the random divisions (Spearman -0.02) and falls as spread rises among the compact ones (-0.63); 15 percent of the random divisions and 41 percent of the compact ones are tighter than the phases. (C) The phase division’s F_{ST} (solid line) against the compact divisions sits at the 62nd percentile of their range." title="" id="128" name="Picture"/>
             <a:graphic>
               <a:graphicData uri="http://schemas.openxmlformats.org/drawingml/2006/picture">
                 <pic:pic>
@@ -2654,7 +2749,7 @@
                   <pic:spPr bwMode="auto">
                     <a:xfrm>
                       <a:off x="0" y="0"/>
-                      <a:ext cx="5334000" cy="2584123"/>
+                      <a:ext cx="5334000" cy="2603144"/>
                     </a:xfrm>
                     <a:prstGeom prst="rect">
                       <a:avLst/>
@@ -2740,7 +2835,7 @@
         <w:t xml:space="preserve"> </w:t>
       </w:r>
       <w:r>
-        <w:t xml:space="preserve">for divisions with the phases’ group sizes around randomly placed centers (light) and drawn to minimize spread (dark); the star is the phase division. Differentiation is unrelated to compactness among the random divisions (Spearman -0.02) and moderately related among the compact ones (+0.45), and no division in either set is tighter than the phases. (C) The phase division’s</w:t>
+        <w:t xml:space="preserve">for divisions with the phases’ group sizes around randomly placed centers (light) and drawn to minimize spread (dark); the star is the phase division. Differentiation is unrelated to compactness among the random divisions (Spearman -0.02) and falls as spread rises among the compact ones (-0.63); 15 percent of the random divisions and 41 percent of the compact ones are tighter than the phases. (C) The phase division’s</w:t>
       </w:r>
       <w:r>
         <w:t xml:space="preserve"> </w:t>
@@ -2766,7 +2861,7 @@
         <w:t xml:space="preserve"> </w:t>
       </w:r>
       <w:r>
-        <w:t xml:space="preserve">(solid line) against the compact divisions is near the bottom of their range.</w:t>
+        <w:t xml:space="preserve">(solid line) against the compact divisions sits at the 62nd percentile of their range.</w:t>
       </w:r>
     </w:p>
     <w:p>
@@ -2774,7 +2869,7 @@
         <w:pStyle w:val="BodyText"/>
       </w:pPr>
       <w:r>
-        <w:t xml:space="preserve">At smoothing scales near the site spacing, the reconstructed phase boundaries also run through areas where composition changes slowly. These boundaries are our reconstruction, the edges of the territories built from Mainfort’s assignments as in Figure 1, not lines drawn by the original authors. Mapping the local rate at which composition changes across the basin with a 15 km bandwidth (Figure 4A), an edge between communities should appear as a ridge of fast change. The reconstructed boundaries, however, do not follow ridges. Median change along them is 0.0105 per kilometer, against 0.0124 along boundaries built the same way from 200 same-size divisions around randomly placed centers, and none of those 200 runs through slower-changing areas (Figure 4B). The ranking holds at 10 to 15 km but not at 20 to 30 km, where the reconstructed boundaries sit at the 24th to 43rd percentiles, and on this sampling geometry it discriminates weakly: a score as low as the real one occurs in 5 percent of records simulated without a restriction and 2 percent with copying across the lines cut to 3 percent (Supplemental Text). The turnover map therefore describes where composition changes and adds little independent weight against a boundary.</w:t>
+        <w:t xml:space="preserve">At smoothing scales near the site spacing, the reconstructed phase boundaries run through areas where composition changes slowly. These boundaries are our reconstruction. Every point on the map goes to its nearest analyzed assemblage, those areas are merged by phase, and the boundaries are the edges where two phases meet. They are not the outlines of Figure 1, which leave unassigned ground between the phase areas. Mapping the local rate at which composition changes across the basin with a 15 km bandwidth (Figure 4A), an edge between communities should appear as a ridge of fast change. The reconstructed boundaries do not follow ridges. Median change along them is 0.0103 per kilometer, against 0.0117 along boundaries built the same way from 200 same-size divisions around randomly placed centers, which places them at the 8th percentile of those divisions (Figure 4B). The ranking is low at 10 to 15 km but not at 20 to 30 km, where the reconstructed boundaries sit at the 40th to 46th percentiles, and on this sampling geometry it discriminates weakly. On the coarser grid used for the simulations, where the real boundaries sit at the 7.5th percentile, a score that low occurs in 12 percent of records simulated without a restriction and 3 percent with copying across the lines cut to 3 percent (Supplemental Text). The turnover map therefore describes where composition changes and adds little independent weight against a boundary.</w:t>
       </w:r>
     </w:p>
     <w:p>
@@ -2784,9 +2879,9 @@
       <w:r>
         <w:drawing>
           <wp:inline>
-            <wp:extent cx="5334000" cy="3028550"/>
+            <wp:extent cx="5334000" cy="2877949"/>
             <wp:effectExtent b="0" l="0" r="0" t="0"/>
-            <wp:docPr descr="Figure 4. Composition as a continuous surface. (A) The local rate of change in the ten decorated-class proportions, computed on a 220 by 220 grid with a 15 km Gaussian bandwidth and masked where fewer than two assemblages support the estimate. Circles are assemblages. (B) The same surface with reconstructed phase boundaries overlaid, with territory edges built from Mainfort’s assignments as in Figure 1. At this bandwidth, the rate of change along them is lower than along the boundaries of any of 200 same-size divisions around randomly placed centers; the ranking holds at 10 to 15 km but not at 20 to 30 km (Supplemental Text). (C) Observed cultural F_{ST} against cluster radius in kilometers, with the neutral copying model’s range behind it, from coarse to fine. The observed value lies inside the range at an 18 km radius and above it from 14 km. Below a radius of about 10 km, the clusters begin to isolate single assemblages, so the finest divisions should not be read as structure." title="" id="131" name="Picture"/>
+            <wp:docPr descr="Figure 4. Composition as a continuous surface. (A) The local rate of change in the ten decorated-class proportions, computed on a 220 by 220 grid with a 15 km Gaussian bandwidth and masked where fewer than two assemblages support the estimate. Circles are assemblages. (B) The same surface with the reconstructed phase boundaries overlaid: the edges between territories built by giving every point on the map to its nearest analyzed assemblage and merging those areas by phase. At this bandwidth, the rate of change along them sits at the 8th percentile of the boundaries of 200 same-size divisions around randomly placed centers; the ranking is low at 10 to 15 km but not at 20 to 30 km (Supplemental Text). (C) Observed cultural F_{ST} against cluster radius in kilometers, with the neutral copying model’s range behind it, from coarse to fine. The observed value lies inside the range at a 17 km radius and above it from 13 km. Below a radius of about 6 km, the clusters begin to isolate single assemblages, so the finest divisions should not be read as structure." title="" id="131" name="Picture"/>
             <a:graphic>
               <a:graphicData uri="http://schemas.openxmlformats.org/drawingml/2006/picture">
                 <pic:pic>
@@ -2805,7 +2900,7 @@
                   <pic:spPr bwMode="auto">
                     <a:xfrm>
                       <a:off x="0" y="0"/>
-                      <a:ext cx="5334000" cy="3028550"/>
+                      <a:ext cx="5334000" cy="2877949"/>
                     </a:xfrm>
                     <a:prstGeom prst="rect">
                       <a:avLst/>
@@ -2839,7 +2934,7 @@
         <w:t xml:space="preserve"> </w:t>
       </w:r>
       <w:r>
-        <w:t xml:space="preserve">Composition as a continuous surface. (A) The local rate of change in the ten decorated-class proportions, computed on a 220 by 220 grid with a 15 km Gaussian bandwidth and masked where fewer than two assemblages support the estimate. Circles are assemblages. (B) The same surface with reconstructed phase boundaries overlaid, with territory edges built from Mainfort’s assignments as in Figure 1. At this bandwidth, the rate of change along them is lower than along the boundaries of any of 200 same-size divisions around randomly placed centers; the ranking holds at 10 to 15 km but not at 20 to 30 km (Supplemental Text). (C) Observed cultural</w:t>
+        <w:t xml:space="preserve">Composition as a continuous surface. (A) The local rate of change in the ten decorated-class proportions, computed on a 220 by 220 grid with a 15 km Gaussian bandwidth and masked where fewer than two assemblages support the estimate. Circles are assemblages. (B) The same surface with the reconstructed phase boundaries overlaid: the edges between territories built by giving every point on the map to its nearest analyzed assemblage and merging those areas by phase. At this bandwidth, the rate of change along them sits at the 8th percentile of the boundaries of 200 same-size divisions around randomly placed centers; the ranking is low at 10 to 15 km but not at 20 to 30 km (Supplemental Text). (C) Observed cultural</w:t>
       </w:r>
       <w:r>
         <w:t xml:space="preserve"> </w:t>
@@ -2865,7 +2960,7 @@
         <w:t xml:space="preserve"> </w:t>
       </w:r>
       <w:r>
-        <w:t xml:space="preserve">against cluster radius in kilometers, with the neutral copying model’s range behind it, from coarse to fine. The observed value lies inside the range at an 18 km radius and above it from 14 km. Below a radius of about 10 km, the clusters begin to isolate single assemblages, so the finest divisions should not be read as structure.</w:t>
+        <w:t xml:space="preserve">against cluster radius in kilometers, with the neutral copying model’s range behind it, from coarse to fine. The observed value lies inside the range at a 17 km radius and above it from 13 km. Below a radius of about 6 km, the clusters begin to isolate single assemblages, so the finest divisions should not be read as structure.</w:t>
       </w:r>
     </w:p>
     <w:p>
@@ -2873,7 +2968,29 @@
         <w:pStyle w:val="BodyText"/>
       </w:pPr>
       <w:r>
-        <w:t xml:space="preserve">The site map alone can reconstruct the phases. Clustering the assemblages on their coordinates alone reproduces phase assignments exactly, with an adjusted Rand index of 1.000 (Figure 5). Adding assemblage composition as a factor actually lowers agreement at every weight, from a tenth of the coordinates’ weight up to equal weight. Divisions with the phases’ group sizes around random centers reach 0.570, which is what three groups of these sizes produce by chance alone. The three assemblages placed by territory rather than by Mainfort’s phase assignments are excluded from this score, since measuring a geographic rule against geography would be circular.</w:t>
+        <w:t xml:space="preserve">Clustered hierarchically, location recovers the phases for all but two assemblages. Clustering the assemblages on their coordinates alone by Ward linkage agrees with the phase assignments at an adjusted Rand index of 0.740, and the only assemblages it places with another phase are Big Eddy and Castile Landing, the two in the narrow southern arm of Phillips’s Parkin area, which it groups with Kent.</w:t>
+      </w:r>
+      <w:r>
+        <w:t xml:space="preserve"> </w:t>
+      </w:r>
+      <m:oMath>
+        <m:r>
+          <m:t>K</m:t>
+        </m:r>
+      </m:oMath>
+      <w:r>
+        <w:t xml:space="preserve">-means on the coordinates gives 0.480 (Figure 5), no better than the 0.485 that divisions with the phases’ group sizes around random centers reach, because it also groups the four easternmost Kent assemblages (Beck, Belle Meade, Commerce, and Hollywood) with Walls. Adding assemblage composition brings</w:t>
+      </w:r>
+      <w:r>
+        <w:t xml:space="preserve"> </w:t>
+      </w:r>
+      <m:oMath>
+        <m:r>
+          <m:t>k</m:t>
+        </m:r>
+      </m:oMath>
+      <w:r>
+        <w:t xml:space="preserve">-means to the same 0.740, from a quarter of the coordinates’ weight up to equal weight, with the same two assemblages misplaced, and it does not raise the Ward value. Composition alone gives 0.358 and misplaces six of the 26. If Big Eddy and Castile Landing are counted as Kent, Ward linkage on the site map alone reproduces the scheme exactly (Supplemental Text). The two assemblages placed by the nearest phase area rather than by lying inside one are excluded from these scores, since measuring a geographic rule against geography would be circular.</w:t>
       </w:r>
     </w:p>
     <w:p>
@@ -2883,9 +3000,9 @@
       <w:r>
         <w:drawing>
           <wp:inline>
-            <wp:extent cx="3412944" cy="2730967"/>
+            <wp:extent cx="3412944" cy="2767665"/>
             <wp:effectExtent b="0" l="0" r="0" t="0"/>
-            <wp:docPr descr="Figure 5. What recovers the phases. Agreement with Mainfort’s phase assignments, measured by the adjusted Rand index over the 25 assemblages he assigned, as the median over 40 starting configurations, for clusterings on site coordinates and decorated-class composition as the weight on composition varies. Zero weight is the site map alone. Three composition transforms are shown; the text quotes the chi-square transform, the only one with no free parameter. The dash-dotted line is the agreement reached by divisions with the phases’ group sizes around random centers. Agreement is complete with the site map alone and falls as composition enters." title="" id="134" name="Picture"/>
+            <wp:docPr descr="Figure 5. What recovers the phases. Agreement with the phase assignments, measured by the adjusted Rand index over the 26 assemblages inside a phase area, as the median over 40 seeds, for clusterings on site coordinates and decorated-class composition as the weight on composition varies. Zero weight is the site map alone. Three composition transforms are shown; the text quotes the chi-square transform, the only one with no free parameter. The dash-dotted line is the agreement reached by divisions with the phases’ group sizes around random centers. The clusterings shown are by k-means. Agreement with the site map alone sits at that line and rises to 0.740 as composition enters; Ward linkage reaches 0.740 on the site map alone (text)." title="" id="134" name="Picture"/>
             <a:graphic>
               <a:graphicData uri="http://schemas.openxmlformats.org/drawingml/2006/picture">
                 <pic:pic>
@@ -2904,7 +3021,7 @@
                   <pic:spPr bwMode="auto">
                     <a:xfrm>
                       <a:off x="0" y="0"/>
-                      <a:ext cx="3412944" cy="2730967"/>
+                      <a:ext cx="3412944" cy="2767665"/>
                     </a:xfrm>
                     <a:prstGeom prst="rect">
                       <a:avLst/>
@@ -2938,7 +3055,18 @@
         <w:t xml:space="preserve"> </w:t>
       </w:r>
       <w:r>
-        <w:t xml:space="preserve">What recovers the phases. Agreement with Mainfort’s phase assignments, measured by the adjusted Rand index over the 25 assemblages he assigned, as the median over 40 starting configurations, for clusterings on site coordinates and decorated-class composition as the weight on composition varies. Zero weight is the site map alone. Three composition transforms are shown; the text quotes the chi-square transform, the only one with no free parameter. The dash-dotted line is the agreement reached by divisions with the phases’ group sizes around random centers. Agreement is complete with the site map alone and falls as composition enters.</w:t>
+        <w:t xml:space="preserve">What recovers the phases. Agreement with the phase assignments, measured by the adjusted Rand index over the 26 assemblages inside a phase area, as the median over 40 seeds, for clusterings on site coordinates and decorated-class composition as the weight on composition varies. Zero weight is the site map alone. Three composition transforms are shown; the text quotes the chi-square transform, the only one with no free parameter. The dash-dotted line is the agreement reached by divisions with the phases’ group sizes around random centers. The clusterings shown are by</w:t>
+      </w:r>
+      <w:r>
+        <w:t xml:space="preserve"> </w:t>
+      </w:r>
+      <m:oMath>
+        <m:r>
+          <m:t>k</m:t>
+        </m:r>
+      </m:oMath>
+      <w:r>
+        <w:t xml:space="preserve">-means. Agreement with the site map alone sits at that line and rises to 0.740 as composition enters; Ward linkage reaches 0.740 on the site map alone (text).</w:t>
       </w:r>
     </w:p>
     <w:p>
@@ -2946,7 +3074,46 @@
         <w:pStyle w:val="BodyText"/>
       </w:pPr>
       <w:r>
-        <w:t xml:space="preserve">Simulated assemblages made by copying with no groups sort into the phases as readily as the real assemblages. We ran the copying model on the real site map 300 times, sampled its type frequencies using the assemblage sherd counts, and clustered each simulated record the same way as the real one (Figure 6). The spatial patterns produced by simulated assemblages match the phases at least as well as the real assemblages do, and usually better. With a quarter weight on assemblage composition, our simulated record agrees with the phases at least as well as the real one (simulated median 1.000, real 0.607), and at equal weight, 74 percent do (median 0.765). Based on type frequencies alone, without considering assemblage location, the real record’s agreement of 0.204 sits at the simulated median of 0.176, and 46 percent of simulated records produce the spatial patterns. A culture historian sorting such ceramic assemblages by resemblance and proximity would almost certainly have found the same phases.</w:t>
+        <w:t xml:space="preserve">Most assemblages fit their own phase, and some fit two. We compared each assemblage’s decorated-class profile with the pooled profile of each phase, leaving the assemblage out of its own phase’s pool. Of the 28, 22 are closest to their own phase with a posterior probability above 0.75. Four are closer to another phase: Big Eddy, Holden Lake, and Turnbow to Kent, and Belle Meade to Parkin. Two are not clearly placed, with probabilities of 0.60 and 0.40 for their own phase: Castile Landing, nearly as close to Kent as to its own Parkin, and Mound Place, slightly closer to both Kent and Parkin than to its own Walls (Supplemental Text). Castile Landing shows how a line through this record can be drawn either way. It lies 12 km from the nearest Kent assemblage and 16 km from the nearest Parkin assemblage, and its pottery is nearly as close to Kent as to Parkin.</w:t>
+      </w:r>
+    </w:p>
+    <w:p>
+      <w:pPr>
+        <w:pStyle w:val="BodyText"/>
+      </w:pPr>
+      <w:r>
+        <w:t xml:space="preserve">Under Ward linkage, assemblages made by copying with no groups sort into the phases about as readily as the real assemblages when composition is given a quarter of location’s weight or less, and less readily at equal weight and on composition alone. We ran the copying model on the real site map 300 times, sampled its type frequencies using the assemblage sherd counts, and clustered each simulated record the same way as the real one (Figure 6). Under Ward linkage, with a quarter weight on assemblage composition, the simulated records agree with the phases at a median of 0.740, the real record’s value, and 68 percent of them reach it. At half weight, 36 percent do. At equal weight, the simulated median falls to 0.487, and 6 percent reach the real 0.740. The decline is not steady: at twice the coordinates’ weight, the real record’s own agreement falls to 0.454, and 46 percent of simulated records reach it. Based on type frequencies alone, the real record’s agreement of 0.358 lies near the top of the simulated range (median 0.098, 95 percent range -0.045 to 0.416), and 6 percent of simulated records reach it.</w:t>
+      </w:r>
+      <w:r>
+        <w:t xml:space="preserve"> </w:t>
+      </w:r>
+      <m:oMath>
+        <m:r>
+          <m:t>K</m:t>
+        </m:r>
+      </m:oMath>
+      <w:r>
+        <w:t xml:space="preserve">-means gives the same result at equal weight and on composition alone (6 and 5 percent). At a quarter weight it shows a wider gap (13 percent), because in the real record the pottery corrects the division</w:t>
+      </w:r>
+      <w:r>
+        <w:t xml:space="preserve"> </w:t>
+      </w:r>
+      <m:oMath>
+        <m:r>
+          <m:t>k</m:t>
+        </m:r>
+      </m:oMath>
+      <w:r>
+        <w:t xml:space="preserve">-means makes of the site map, and in most simulated records it does not. A culture historian sorting drift-made assemblages mainly by proximity would have found much the same phases. Sorted mainly by resemblance, the real assemblages line up with the phases better than most simulated ones do. Part of that is expected by construction. Phillips distinguished the phases using the frequencies of these types</w:t>
+      </w:r>
+      <w:r>
+        <w:t xml:space="preserve"> </w:t>
+      </w:r>
+      <w:r>
+        <w:t xml:space="preserve">(Mainfort 2003:177)</w:t>
+      </w:r>
+      <w:r>
+        <w:t xml:space="preserve">, so the frequencies that defined a phase recover it better than frequencies that did not, and the comparison cannot show that the structure marks a restriction on copying.</w:t>
       </w:r>
     </w:p>
     <w:p>
@@ -2956,9 +3123,9 @@
       <w:r>
         <w:drawing>
           <wp:inline>
-            <wp:extent cx="3272267" cy="2715676"/>
+            <wp:extent cx="5334000" cy="2837043"/>
             <wp:effectExtent b="0" l="0" r="0" t="0"/>
-            <wp:docPr descr="Figure 6. Would a culture historian have found these phases in ceramic assemblages made by copying with no groups? Agreement with Mainfort’s phase assignments, by adjusted Rand index over the 25 assemblages he assigned, as the weight on decorated-class composition relative to site coordinates varies from the map alone to assemblage type frequencies alone. The line with markers is the real record; the band is the 95 percent range over 300 runs of the neutral copying model, which contains no groups, sampled at the real sherd counts and clustered the same way. The zero-weight point is identical by construction." title="" id="137" name="Picture"/>
+            <wp:docPr descr="Figure 6. Would a culture historian have found these phases in ceramic assemblages made by copying with no groups? Agreement with the phase assignments, by adjusted Rand index over the 26 assemblages inside a phase area, as the weight on decorated-class composition relative to site coordinates varies from the map alone to assemblage type frequencies alone. Assemblages are clustered by k-means (A; the median over 10 seeds) and by Ward linkage (B). The line with markers is the real record; the dashed line is the median and the band the 95 percent range over 300 runs of the neutral copying model, which contains no groups, sampled at the real sherd counts and clustered the same way. The zero-weight point is identical by construction." title="" id="137" name="Picture"/>
             <a:graphic>
               <a:graphicData uri="http://schemas.openxmlformats.org/drawingml/2006/picture">
                 <pic:pic>
@@ -2977,7 +3144,7 @@
                   <pic:spPr bwMode="auto">
                     <a:xfrm>
                       <a:off x="0" y="0"/>
-                      <a:ext cx="3272267" cy="2715676"/>
+                      <a:ext cx="5334000" cy="2837043"/>
                     </a:xfrm>
                     <a:prstGeom prst="rect">
                       <a:avLst/>
@@ -3011,7 +3178,18 @@
         <w:t xml:space="preserve"> </w:t>
       </w:r>
       <w:r>
-        <w:t xml:space="preserve">Would a culture historian have found these phases in ceramic assemblages made by copying with no groups? Agreement with Mainfort’s phase assignments, by adjusted Rand index over the 25 assemblages he assigned, as the weight on decorated-class composition relative to site coordinates varies from the map alone to assemblage type frequencies alone. The line with markers is the real record; the band is the 95 percent range over 300 runs of the neutral copying model, which contains no groups, sampled at the real sherd counts and clustered the same way. The zero-weight point is identical by construction.</w:t>
+        <w:t xml:space="preserve">Would a culture historian have found these phases in ceramic assemblages made by copying with no groups? Agreement with the phase assignments, by adjusted Rand index over the 26 assemblages inside a phase area, as the weight on decorated-class composition relative to site coordinates varies from the map alone to assemblage type frequencies alone. Assemblages are clustered by</w:t>
+      </w:r>
+      <w:r>
+        <w:t xml:space="preserve"> </w:t>
+      </w:r>
+      <m:oMath>
+        <m:r>
+          <m:t>k</m:t>
+        </m:r>
+      </m:oMath>
+      <w:r>
+        <w:t xml:space="preserve">-means (A; the median over 10 seeds) and by Ward linkage (B). The line with markers is the real record; the dashed line is the median and the band the 95 percent range over 300 runs of the neutral copying model, which contains no groups, sampled at the real sherd counts and clustered the same way. The zero-weight point is identical by construction.</w:t>
       </w:r>
     </w:p>
     <w:p>
@@ -3019,7 +3197,7 @@
         <w:pStyle w:val="BodyText"/>
       </w:pPr>
       <w:r>
-        <w:t xml:space="preserve">The lines between clumps of analyzed assemblages are not separated by areas of empty land. The settlement compilation records 83 sites with a late pre-contact component in the mapped area, and dropping the 28 within a kilometer of an analyzed assemblage leaves 55 whose positions are independent of the original locations. Measured at a 5 km scale, only 37 percent of same-size divisions around random centers and 14 percent of compact ones run through denser late-period settlement than the phase lines do (Figure 7). Of the three scales tested (3, 5, and 8 km), only at 8 km do the phase lines run through emptier country than most. The clumps the phases gather are clumps of sampled sites, not settlements separated by vacant land. Rivers partly explain settlement clumping. Late-period sites lie a median 1.8 km from a major river, against 3.6 km for random points in the same area, but points placed as close to the rivers as the sites are come out randomly spaced (Clark-Evans ratio 0.99 against the sites’ 0.63). Assemblage clumps form on particular reaches of riverways for reasons proximity alone does not explain.</w:t>
+        <w:t xml:space="preserve">The phase lines run through sparsely settled country. The settlement compilation records 81 sites with a late pre-contact component in the mapped area, and dropping the 28 within a kilometer of an analyzed assemblage leaves 53 whose positions are independent of the analyzed locations. Measured at a 5 km scale, 94 percent of same-size divisions around random centers and 100 percent of compact ones run through denser late-period settlement than the phase lines do (Figure 7), and the result is similar at the other two scales tested, 98 and 100 percent at 3 km and 89 and 86 percent at 8 km. The clumps the phases gather are clumps of settlement with less-occupied land between them. Rivers partly explain settlement clumping. Late-period sites lie a median 1.7 km from a major river, against 3.4 km for random points in the same area, but points placed as close to the rivers as the sites are come out randomly spaced (Clark-Evans ratio 0.98 against the sites’ 0.67). Assemblage clumps form on particular reaches of riverways for reasons proximity alone does not explain.</w:t>
       </w:r>
     </w:p>
     <w:p>
@@ -3029,9 +3207,9 @@
       <w:r>
         <w:drawing>
           <wp:inline>
-            <wp:extent cx="5238686" cy="3223336"/>
+            <wp:extent cx="5334000" cy="3135547"/>
             <wp:effectExtent b="0" l="0" r="0" t="0"/>
-            <wp:docPr descr="Figure 7. Do the reconstructed phase boundaries follow gaps in settlement? (A) Density of the 55 late-period sites more than 1 km from any analyzed assemblage (5 km bandwidth), with the assemblages as open circles and the reconstructed phase boundaries (territory edges built as in Figure 1) as points. (B) Median settlement density along the reconstructed phase boundaries (vertical line) against the same quantity for the boundaries of 300 divisions with the phases’ group sizes, around random centers (light) and drawn to be compact (dark)." title="" id="140" name="Picture"/>
+            <wp:docPr descr="Figure 7. Do the reconstructed phase boundaries follow gaps in settlement? (A) Density of the 53 late-period sites more than 1 km from any analyzed assemblage (small dots; 5 km bandwidth), with the assemblages as open circles and the reconstructed phase boundaries (territory edges built as in Figure 4B) as points. (B) Median settlement density along the reconstructed phase boundaries (vertical line) against the same quantity for the boundaries of 300 divisions with the phases’ group sizes, around random centers (light) and drawn to be compact (dark)." title="" id="140" name="Picture"/>
             <a:graphic>
               <a:graphicData uri="http://schemas.openxmlformats.org/drawingml/2006/picture">
                 <pic:pic>
@@ -3050,7 +3228,7 @@
                   <pic:spPr bwMode="auto">
                     <a:xfrm>
                       <a:off x="0" y="0"/>
-                      <a:ext cx="5238686" cy="3223336"/>
+                      <a:ext cx="5334000" cy="3135547"/>
                     </a:xfrm>
                     <a:prstGeom prst="rect">
                       <a:avLst/>
@@ -3084,7 +3262,7 @@
         <w:t xml:space="preserve"> </w:t>
       </w:r>
       <w:r>
-        <w:t xml:space="preserve">Do the reconstructed phase boundaries follow gaps in settlement? (A) Density of the 55 late-period sites more than 1 km from any analyzed assemblage (5 km bandwidth), with the assemblages as open circles and the reconstructed phase boundaries (territory edges built as in Figure 1) as points. (B) Median settlement density along the reconstructed phase boundaries (vertical line) against the same quantity for the boundaries of 300 divisions with the phases’ group sizes, around random centers (light) and drawn to be compact (dark).</w:t>
+        <w:t xml:space="preserve">Do the reconstructed phase boundaries follow gaps in settlement? (A) Density of the 53 late-period sites more than 1 km from any analyzed assemblage (small dots; 5 km bandwidth), with the assemblages as open circles and the reconstructed phase boundaries (territory edges built as in Figure 4B) as points. (B) Median settlement density along the reconstructed phase boundaries (vertical line) against the same quantity for the boundaries of 300 divisions with the phases’ group sizes, around random centers (light) and drawn to be compact (dark).</w:t>
       </w:r>
     </w:p>
     <w:bookmarkEnd w:id="142"/>
@@ -3102,7 +3280,7 @@
         <w:pStyle w:val="FirstParagraph"/>
       </w:pPr>
       <w:r>
-        <w:t xml:space="preserve">The Parkin phase is, to the site, the northern of the two spatial clusters the site layout supports: the division of the basin into the Parkin phase and the rest is identical to the two-cluster division (adjusted Rand index 1.000). Its difference from the rest of the basin is therefore the two-cluster difference of Table 1, cultural</w:t>
+        <w:t xml:space="preserve">The Parkin phase is close to the northern of the two spatial clusters the site layout supports, although the two divisions are no longer the same one (adjusted Rand index 0.857). Its difference from the rest of the basin is a cultural</w:t>
       </w:r>
       <w:r>
         <w:t xml:space="preserve"> </w:t>
@@ -3128,7 +3306,7 @@
         <w:t xml:space="preserve"> </w:t>
       </w:r>
       <w:r>
-        <w:t xml:space="preserve">0.0062, which the copying model reaches in 13 percent of runs at the most favorable combination and 4 to 16 percent across the six. Of all the divisions tested, the one that sets the Parkin phase apart is the one the copying model reproduces most easily, partly because a division into two large groups yields a smaller</w:t>
+        <w:t xml:space="preserve">of 0.0067, which the copying model reaches in 8 percent of runs at the most favorable combination and 4 to 9 percent across the six (model median 0.0018, 95 percent range 0.0002 to 0.0101). Of the divisions tested, only the two-cluster division is reproduced more often, partly because a division into two large groups yields a smaller</w:t>
       </w:r>
       <w:r>
         <w:t xml:space="preserve"> </w:t>
@@ -3159,7 +3337,7 @@
         <w:pStyle w:val="BodyText"/>
       </w:pPr>
       <w:r>
-        <w:t xml:space="preserve">Alternative divisions also separate the assemblages. With uncertainty in the counts carried through, the Parkin-versus-rest</w:t>
+        <w:t xml:space="preserve">Whether the Parkin line separates the assemblages better than other lines depends on the kind of line. With uncertainty in the counts carried through, the Parkin-versus-rest</w:t>
       </w:r>
       <w:r>
         <w:t xml:space="preserve"> </w:t>
@@ -3185,7 +3363,7 @@
         <w:t xml:space="preserve"> </w:t>
       </w:r>
       <w:r>
-        <w:t xml:space="preserve">has a posterior median of 0.0061 (95 percent credible interval 0.0051 to 0.0074), compared with 0.0064 for same-size divisions around random centers and 0.0076 for compact ones. The posterior probability that the Parkin line separates the assemblages better is 0.27 against divisions around random centers and 0.00025 against compact ones, the second from 10 favorable comparisons among 40,000. The step in similarity across the Parkin line, a boundary excess of +13.7, exceeds what copying alone produces (simulated median +0.5, 95 percent range -6.5 to +7.5; none of 300 runs reaches it), but it is the same shorter-range variation seen at arbitrary lines drawn across this map. Around random centers, the median is +10.7 and the posterior probability that the Parkin line shows more is 0.53; for compact divisions, the median is +15.1, and the probability is 0.05. The assemblage composition sets the Parkin phase apart from its neighbors no more than it sets apart any comparably sized piece of the basin. This comparison has little power for a single line, however. In simulations with copying across the Parkin phase’s edge cut to 3 percent, the Parkin line beats a median 72 percent of random-center divisions, against 64 percent with no restriction, and a score as low as the real one (28 percent) occurs in 10 and 16 percent of simulated records. The record therefore cannot exclude restricted copying at the edge of the Parkin phase. However, the assemblage composition shows nothing that requires it.</w:t>
+        <w:t xml:space="preserve">has a posterior median of 0.0066 (95 percent credible interval 0.0052 to 0.0083), compared with 0.0062 for same-size divisions around random centers and 0.0057 for compact ones. The posterior probability that the Parkin line separates the assemblages better is 0.52 against divisions around random centers and 0.94 against compact ones. The step in similarity across the Parkin line, a boundary excess of +5.7 (posterior median +5.9, 95 percent credible interval +3.5 to +8.3), lies within what copying alone produces (simulated median 0.0, 95 percent range -3.9 to +5.9; 3 percent of 300 runs reach it), and arbitrary lines drawn across this map show the same step. The posterior median is also +5.9 for divisions of both kinds, and the posterior probability that the Parkin line shows more is 0.43 and 0.49. The assemblage composition sets the Parkin phase apart from its neighbors about as much as it sets apart a comparably sized piece of the basin around a random center, and more than the compact two-way divisions do. This comparison has little power for a single line, however. In simulations with copying across the phase lines, the Parkin phase’s edge among them, cut to 3 percent, the Parkin line beats a median 72 percent of random-center divisions, against 58 percent with no restriction, and a score as low as the real one (58 percent) occurs in 23 and 52 percent of simulated records. The compact two-way divisions are few and similar, so the comparison with them carries less weight (Supplemental Text). The record therefore cannot exclude restricted copying at the edge of the Parkin phase. However, the assemblage composition shows nothing that requires it.</w:t>
       </w:r>
     </w:p>
     <w:p>
@@ -3308,7 +3486,7 @@
           <wp:inline>
             <wp:extent cx="5334000" cy="3332419"/>
             <wp:effectExtent b="0" l="0" r="0" t="0"/>
-            <wp:docPr descr="Figure 9. Settlement cross-check. Main panel: maximum mound height ranked across the basin, the one size attribute the regional compilation records for most sites, from sources that are not uniform (mound area is recorded as zero for Parkin and is not used). Parkin’s principal mound is 21.3 ft (6.5 m) after Morse (1981, 1990), second among the 55 basin sites with a recorded height; the compilation otherwise used gives Parkin 23 ft, and we substitute the excavated value. The distribution is graded, with no gap at the top (tallest-to-second ratio 1.08). Inset: the proportion of sites with a mound, a defensive ditch, and St. Francis-type fortification across the basin set (n = 92)." title="" id="147" name="Picture"/>
+            <wp:docPr descr="Figure 9. Settlement cross-check. Left: maximum mound height ranked across the basin, the one size attribute the regional compilation records for most sites, from sources that are not uniform (mound area is recorded as zero for Parkin and is not used). Parkin’s principal mound is 21.3 ft (6.5 m) after Morse (1981, 1990), second among the 55 basin sites with a recorded height; the compilation otherwise used gives Parkin 23 ft, and we substitute the excavated value. The distribution is graded, with no gap at the top (tallest-to-second ratio 1.08). Right: the proportion of sites with a mound, a defensive ditch, and St. Francis-type fortification across the basin set (n = 92)." title="" id="147" name="Picture"/>
             <a:graphic>
               <a:graphicData uri="http://schemas.openxmlformats.org/drawingml/2006/picture">
                 <pic:pic>
@@ -3361,17 +3539,17 @@
         <w:t xml:space="preserve"> </w:t>
       </w:r>
       <w:r>
-        <w:t xml:space="preserve">Settlement cross-check. Main panel: maximum mound height ranked across the basin, the one size attribute the regional compilation records for most sites, from sources that are not uniform (mound area is recorded as zero for Parkin and is not used). Parkin’s principal mound is 21.3 ft (6.5 m) after Morse (1981, 1990), second among the 55 basin sites with a recorded height; the compilation otherwise used gives Parkin 23 ft, and we substitute the excavated value. The distribution is graded, with no gap at the top (tallest-to-second ratio 1.08). Inset: the proportion of sites with a mound, a defensive ditch, and St. Francis-type fortification across the basin set (n = 92).</w:t>
+        <w:t xml:space="preserve">Settlement cross-check. Left: maximum mound height ranked across the basin, the one size attribute the regional compilation records for most sites, from sources that are not uniform (mound area is recorded as zero for Parkin and is not used). Parkin’s principal mound is 21.3 ft (6.5 m) after Morse (1981, 1990), second among the 55 basin sites with a recorded height; the compilation otherwise used gives Parkin 23 ft, and we substitute the excavated value. The distribution is graded, with no gap at the top (tallest-to-second ratio 1.08). Right: the proportion of sites with a mound, a defensive ditch, and St. Francis-type fortification across the basin set (n = 92).</w:t>
       </w:r>
     </w:p>
     <w:bookmarkEnd w:id="149"/>
-    <w:bookmarkStart w:id="153" w:name="Xce48efa02f9f01a7c86a1a47c6ec564e4606c3d"/>
+    <w:bookmarkStart w:id="156" w:name="a-second-tally-under-a-revised-scheme"/>
     <w:p>
       <w:pPr>
         <w:pStyle w:val="Heading3"/>
       </w:pPr>
       <w:r>
-        <w:t xml:space="preserve">The contrast case: phases redrawn from the assemblages</w:t>
+        <w:t xml:space="preserve">A second tally under a revised scheme</w:t>
       </w:r>
     </w:p>
     <w:p>
@@ -3391,7 +3569,16 @@
         <w:t xml:space="preserve"> </w:t>
       </w:r>
       <w:r>
-        <w:t xml:space="preserve">redrew the phase lines through much the same sites using an ordination approach. He adopted Smith’s</w:t>
+        <w:t xml:space="preserve">compiled his table from much the same sites and assigned them to phases following Phillips, with two kinds of change</w:t>
+      </w:r>
+      <w:r>
+        <w:t xml:space="preserve"> </w:t>
+      </w:r>
+      <w:r>
+        <w:t xml:space="preserve">(Mainfort 2003:176–177)</w:t>
+      </w:r>
+      <w:r>
+        <w:t xml:space="preserve">. He adopted Smith’s</w:t>
       </w:r>
       <w:r>
         <w:t xml:space="preserve"> </w:t>
@@ -3403,16 +3590,7 @@
         <w:t xml:space="preserve"> </w:t>
       </w:r>
       <w:r>
-        <w:t xml:space="preserve">Horseshoe Lake phase, which gathers Beck, Belle Meade, Mound Place, and Young</w:t>
-      </w:r>
-      <w:r>
-        <w:t xml:space="preserve"> </w:t>
-      </w:r>
-      <w:r>
-        <w:t xml:space="preserve">(Mainfort 2003:177)</w:t>
-      </w:r>
-      <w:r>
-        <w:t xml:space="preserve">, and his table also places Hollywood and Commerce in Kent rather than Walls, Castile Landing in Parkin rather than Kent, and Carson Lake in Walls rather than Nodena, although his text treats Carson Lake as a Nodena site</w:t>
+        <w:t xml:space="preserve">Horseshoe Lake phase, which takes Belle Meade and Beck from Phillips’s Kent phase and Mound Place from his Walls phase, together with Young, which lies inside Phillips’s Walls area. He also added Smith’s Tipton and Jones Bayou phases in western Tennessee, which Phillips’s scheme does not reach. His table places Carson Lake in Walls, although his text treats it as a Nodena site</w:t>
       </w:r>
       <w:r>
         <w:t xml:space="preserve"> </w:t>
@@ -3421,7 +3599,7 @@
         <w:t xml:space="preserve">(Mainfort 2003:176–181)</w:t>
       </w:r>
       <w:r>
-        <w:t xml:space="preserve">. His scheme is our contrast case.</w:t>
+        <w:t xml:space="preserve">. Where the two schemes cover the same ground, they differ at these five sites.</w:t>
       </w:r>
     </w:p>
     <w:p>
@@ -3434,10 +3612,87 @@
     </w:p>
     <w:p>
       <w:pPr>
+        <w:pStyle w:val="CaptionedFigure"/>
+      </w:pPr>
+      <w:r>
+        <w:drawing>
+          <wp:inline>
+            <wp:extent cx="4114800" cy="5313314"/>
+            <wp:effectExtent b="0" l="0" r="0" t="0"/>
+            <wp:docPr descr="Figure 10. The phases as Mainfort (2003) assigned them: the 39 sites of his table, in seven phases. The territories are our construction from his assignments, not lines he drew. Every point on the map goes to its nearest site and those areas are merged by phase, so a phase can fall in more than one piece, as Walls and Nodena do. Filled markers are the 29 sites the second case tests, those with at least 100 decorated sherds in the five phases that keep at least two such sites; open markers are his other ten sites. The Parkin site is starred. Hydrography as in Figure 1." title="" id="151" name="Picture"/>
+            <a:graphic>
+              <a:graphicData uri="http://schemas.openxmlformats.org/drawingml/2006/picture">
+                <pic:pic>
+                  <pic:nvPicPr>
+                    <pic:cNvPr descr="../../figures/fig18_mainfort2003_phases.png" id="152" name="Picture"/>
+                    <pic:cNvPicPr>
+                      <a:picLocks noChangeArrowheads="1" noChangeAspect="1"/>
+                    </pic:cNvPicPr>
+                  </pic:nvPicPr>
+                  <pic:blipFill>
+                    <a:blip r:embed="rId150"/>
+                    <a:stretch>
+                      <a:fillRect/>
+                    </a:stretch>
+                  </pic:blipFill>
+                  <pic:spPr bwMode="auto">
+                    <a:xfrm>
+                      <a:off x="0" y="0"/>
+                      <a:ext cx="4114800" cy="5313314"/>
+                    </a:xfrm>
+                    <a:prstGeom prst="rect">
+                      <a:avLst/>
+                    </a:prstGeom>
+                    <a:noFill/>
+                    <a:ln w="9525">
+                      <a:noFill/>
+                      <a:headEnd/>
+                      <a:tailEnd/>
+                    </a:ln>
+                  </pic:spPr>
+                </pic:pic>
+              </a:graphicData>
+            </a:graphic>
+          </wp:inline>
+        </w:drawing>
+      </w:r>
+    </w:p>
+    <w:p>
+      <w:pPr>
+        <w:pStyle w:val="ImageCaption"/>
+      </w:pPr>
+      <w:r>
+        <w:rPr>
+          <w:b/>
+          <w:bCs/>
+        </w:rPr>
+        <w:t xml:space="preserve">Figure 10.</w:t>
+      </w:r>
+      <w:r>
+        <w:t xml:space="preserve"> </w:t>
+      </w:r>
+      <w:r>
+        <w:t xml:space="preserve">The phases as Mainfort</w:t>
+      </w:r>
+      <w:r>
+        <w:t xml:space="preserve"> </w:t>
+      </w:r>
+      <w:r>
+        <w:t xml:space="preserve">(2003)</w:t>
+      </w:r>
+      <w:r>
+        <w:t xml:space="preserve"> </w:t>
+      </w:r>
+      <w:r>
+        <w:t xml:space="preserve">assigned them: the 39 sites of his table, in seven phases. The territories are our construction from his assignments, not lines he drew. Every point on the map goes to its nearest site and those areas are merged by phase, so a phase can fall in more than one piece, as Walls and Nodena do. Filled markers are the 29 sites the second case tests, those with at least 100 decorated sherds in the five phases that keep at least two such sites; open markers are his other ten sites. The Parkin site is starred. Hydrography as in Figure 1.</w:t>
+      </w:r>
+    </w:p>
+    <w:p>
+      <w:pPr>
         <w:pStyle w:val="BodyText"/>
       </w:pPr>
       <w:r>
-        <w:t xml:space="preserve">Location again carries much of the scheme. The site map alone produces the phases as indicated by Mainfort’s assignments, with an adjusted Rand index of 0.54; assemblage-type frequencies alone, 0.25; and same-size divisions around random centers, 0.31. Mainfort’s phase delineation, however, separates the assemblages better than the earlier scheme. The between-group</w:t>
+        <w:t xml:space="preserve">Location again carries part of the scheme. The site map alone agrees with Mainfort’s assignments at an adjusted Rand index of 0.54; assemblage-type frequencies alone, 0.25; and same-size divisions around random centers, 0.31 (Figure 11A). Giving composition half the weight of the coordinates raises the agreement to 0.66; at the other weights tested it is at or below the map alone. His lines separate the assemblages more clearly than the three phases do on our matrix. The between-group</w:t>
       </w:r>
       <w:r>
         <w:t xml:space="preserve"> </w:t>
@@ -3463,7 +3718,7 @@
         <w:t xml:space="preserve"> </w:t>
       </w:r>
       <w:r>
-        <w:t xml:space="preserve">under his phases has a posterior median of 0.046 (95 percent credible interval 0.041 to 0.051), against 0.030 for same-size divisions around random centers and 0.032 for compact ones, and the posterior probability that his delineations separate the assemblages better than such a division is 0.96 and 0.94. The compactness search never produces his groups, and giving composition half the weight of the coordinates raises the agreement with his scheme to 0.66, above the map alone. At six of the seven sites where the two schemes differ, the assemblage data align better with Mainfort’s assignment, usually by a wide margin. The Young site, however, is the exception (Supplemental Text).</w:t>
+        <w:t xml:space="preserve">under his phases has a posterior median of 0.046 (95 percent credible interval 0.041 to 0.051), against 0.030 for same-size divisions around random centers and 0.032 for compact ones, and the posterior probability that his delineations separate the assemblages better than such a division is 0.96 and 0.94. The compactness search never produces his groups. The two results are not directly comparable, since his table reaches into western Tennessee and divides its sites into five phases. At the four contested sites that can be tested, the assemblage data do not consistently favor either scheme. Belle Meade and Mound Place lie closer to the phase Mainfort assigns, and Beck and Young to the phase the primary analysis assigns (Figure 11B). Carson Lake cannot be compared, because his table holds no other Nodena site with 100 decorated sherds (Supplemental Text).</w:t>
       </w:r>
     </w:p>
     <w:p>
@@ -3471,7 +3726,7 @@
         <w:pStyle w:val="BodyText"/>
       </w:pPr>
       <w:r>
-        <w:t xml:space="preserve">The two schemes behave as their origins predict. The inherited lines divide the map, whereas Mainfort’s lines fall where the assemblages differ. The two schemes also disagree about where the boundaries are, which bounded groups would not produce. The contrast neither shows that Mainfort’s phases are bounded groups nor independently validates the comparison, since location still recovers much of his scheme and his lines separate the assemblages in part because the assemblages drew them. What the contrast shows is that phase lines follow the assemblages when the assemblage type frequencies draw them, and that the inherited scheme was not drawn that way.</w:t>
+        <w:t xml:space="preserve">The second case agrees with the primary one in part. On both tallies, location recovers much of the scheme, and the phase lines separate the assemblages at least as well as arbitrary lines. On Mainfort’s table, with five phases reaching into Tennessee, they separate them clearly better (probabilities of 0.96 and 0.94, against 0.57 and 0.72 for the three phases). Neither result shows that the phases mark bounded groups, since both schemes were drawn using the frequencies of these types and location still recovers part of each. Where the two schemes disagree, at the Horseshoe Lake phase, the assemblages do not decide between them.</w:t>
       </w:r>
     </w:p>
     <w:p>
@@ -3483,18 +3738,18 @@
           <wp:inline>
             <wp:extent cx="5334000" cy="2684917"/>
             <wp:effectExtent b="0" l="0" r="0" t="0"/>
-            <wp:docPr descr="Figure 10. The contrast case: the phase tests on Mainfort’s (2003) table, under his phases. (A) Agreement with his assignments, by adjusted Rand index over the 29 sites with at least 100 decorated sherds, for clusterings on site coordinates and decorated-class composition as the weight on composition varies from the map alone to assemblage composition alone; the band is the range over 40 starting configurations, and the dash-dotted line is the agreement reached by same-size divisions around random centers. (B) For the sites the two schemes assign differently, the chi-square distance from the site’s profile to the pooled profile of the phase Mainfort assigned (dark) and of the phase in Figure 1 (light), with the site itself left out of both." title="" id="151" name="Picture"/>
+            <wp:docPr descr="Figure 11. The second case: the phase tests on Mainfort’s (2003) table, under his phases. (A) Agreement with his assignments, by adjusted Rand index over the 29 sites with at least 100 decorated sherds, for clusterings on site coordinates and decorated-class composition as the weight on composition varies from the map alone to assemblage composition alone; the 40 seeds give the same value at every weight, so the band showing their range has no width, and the dash-dotted line is the agreement reached by same-size divisions around random centers. (B) For four of the five sites the two schemes assign differently (Carson Lake has no other tested site in its primary-analysis phase and is not shown), the chi-square distance from the site’s profile to the pooled profile of the phase Mainfort assigned (dark) and of the phase the primary analysis assigns (light), with the site itself left out of both." title="" id="154" name="Picture"/>
             <a:graphic>
               <a:graphicData uri="http://schemas.openxmlformats.org/drawingml/2006/picture">
                 <pic:pic>
                   <pic:nvPicPr>
-                    <pic:cNvPr descr="../../figures/fig17_mainfort_replication.png" id="152" name="Picture"/>
+                    <pic:cNvPr descr="../../figures/fig17_mainfort_replication.png" id="155" name="Picture"/>
                     <pic:cNvPicPr>
                       <a:picLocks noChangeArrowheads="1" noChangeAspect="1"/>
                     </pic:cNvPicPr>
                   </pic:nvPicPr>
                   <pic:blipFill>
-                    <a:blip r:embed="rId150"/>
+                    <a:blip r:embed="rId153"/>
                     <a:stretch>
                       <a:fillRect/>
                     </a:stretch>
@@ -3530,18 +3785,18 @@
           <w:b/>
           <w:bCs/>
         </w:rPr>
-        <w:t xml:space="preserve">Figure 10.</w:t>
-      </w:r>
-      <w:r>
-        <w:t xml:space="preserve"> </w:t>
-      </w:r>
-      <w:r>
-        <w:t xml:space="preserve">The contrast case: the phase tests on Mainfort’s (2003) table, under his phases. (A) Agreement with his assignments, by adjusted Rand index over the 29 sites with at least 100 decorated sherds, for clusterings on site coordinates and decorated-class composition as the weight on composition varies from the map alone to assemblage composition alone; the band is the range over 40 starting configurations, and the dash-dotted line is the agreement reached by same-size divisions around random centers. (B) For the sites the two schemes assign differently, the chi-square distance from the site’s profile to the pooled profile of the phase Mainfort assigned (dark) and of the phase in Figure 1 (light), with the site itself left out of both.</w:t>
-      </w:r>
-    </w:p>
-    <w:bookmarkEnd w:id="153"/>
-    <w:bookmarkEnd w:id="154"/>
-    <w:bookmarkStart w:id="159" w:name="discussion"/>
+        <w:t xml:space="preserve">Figure 11.</w:t>
+      </w:r>
+      <w:r>
+        <w:t xml:space="preserve"> </w:t>
+      </w:r>
+      <w:r>
+        <w:t xml:space="preserve">The second case: the phase tests on Mainfort’s (2003) table, under his phases. (A) Agreement with his assignments, by adjusted Rand index over the 29 sites with at least 100 decorated sherds, for clusterings on site coordinates and decorated-class composition as the weight on composition varies from the map alone to assemblage composition alone; the 40 seeds give the same value at every weight, so the band showing their range has no width, and the dash-dotted line is the agreement reached by same-size divisions around random centers. (B) For four of the five sites the two schemes assign differently (Carson Lake has no other tested site in its primary-analysis phase and is not shown), the chi-square distance from the site’s profile to the pooled profile of the phase Mainfort assigned (dark) and of the phase the primary analysis assigns (light), with the site itself left out of both.</w:t>
+      </w:r>
+    </w:p>
+    <w:bookmarkEnd w:id="156"/>
+    <w:bookmarkEnd w:id="157"/>
+    <w:bookmarkStart w:id="162" w:name="discussion"/>
     <w:p>
       <w:pPr>
         <w:pStyle w:val="Heading2"/>
@@ -3550,7 +3805,7 @@
         <w:t xml:space="preserve">Discussion</w:t>
       </w:r>
     </w:p>
-    <w:bookmarkStart w:id="155" w:name="what-explains-the-phases"/>
+    <w:bookmarkStart w:id="158" w:name="what-explains-the-phases"/>
     <w:p>
       <w:pPr>
         <w:pStyle w:val="Heading3"/>
@@ -3564,7 +3819,7 @@
         <w:pStyle w:val="FirstParagraph"/>
       </w:pPr>
       <w:r>
-        <w:t xml:space="preserve">The results bear on three different kinds of claim, and they support each to varying degrees. The first is descriptive adequacy: a smooth surface over the map describes the variation among assemblages well, and calibrated copying with no groups reproduces the fade of similarity with distance and the two-cluster difference. The second is mechanism. Spatially structured copying is sufficient to produce the inherited scheme: the site map alone reproduces the phase assignments, and assemblages copied without groups sort into the same phases. Sufficiency does not identify the historical mechanism, and the finer-scale variation discussed below is explained only in part. The third is boundary evidence, whether the phase lines mark restrictions on copying. Here the result is negative but bounded. Alternative spatial divisions of the same sites capture as much or more of the ceramic differentiation than the phase lines do. In simulation at the calibrated combination, a restriction that cuts copying at the lines to a small fraction of its strength usually reverses that ordering, but the real score is also uncommon without any restriction, and the separation is smaller at other combinations, so the comparison weighs moderately against a strong restriction and cannot exclude a weak one.</w:t>
+        <w:t xml:space="preserve">The results bear on three different kinds of claim, and they support each to varying degrees. The first is descriptive adequacy: a smooth surface over the map describes the variation among assemblages well, and calibrated copying with no groups reproduces the fade of similarity with distance and the two-cluster difference. The second is mechanism. The phases have the properties expected of units built by sorting a clumped record by resemblance and proximity. Their lines run through sparsely settled country, and hierarchical clustering of site locations alone recovers them for all but two assemblages. Copying with no groups is sufficient for much of this, but not all of it. Assemblages copied without groups sort into the phases about as readily as the real ones under hierarchical clustering when composition is given a quarter of location’s weight or less, and less readily at equal weight and on resemblance alone, and the calibrated model falls short of the differences among the phases, as it does for the spatial divisions of the basin into three or more clusters. The third is boundary evidence, whether the phase lines mark restrictions on copying. Here the result is open. The phase lines separate the assemblages about as well as alternative divisions of the same sites, somewhat better than compact ones, and the step in similarity across them appears at arbitrary lines as well. In simulation at the calibrated combination, the real score is common without any restriction at the lines and less common, though not rare, with a strong one, so the comparison leans weakly against a restriction and excludes neither possibility.</w:t>
       </w:r>
     </w:p>
     <w:p>
@@ -3572,7 +3827,7 @@
         <w:pStyle w:val="BodyText"/>
       </w:pPr>
       <w:r>
-        <w:t xml:space="preserve">The culture historians who drew the phases were responding to something real, a gradient in style sampled at clumped settlements. The assemblages give no evidence that the lines they drew also marked the edges of bounded learning.</w:t>
+        <w:t xml:space="preserve">The culture historians who drew the phases were responding to something real, a gradient in style sampled at clumped settlements. The assemblages do not show that the lines they drew also marked the edges of bounded learning, and they do not exclude it. Where the lines cross occupied ground, they are arbitrary in the way a gradient makes them. Six of the 28 assemblages do not clearly fit their own phase best, and Castile Landing fits Parkin and Kent about equally well.</w:t>
       </w:r>
     </w:p>
     <w:p>
@@ -3604,7 +3859,7 @@
         <w:t xml:space="preserve"> </w:t>
       </w:r>
       <w:r>
-        <w:t xml:space="preserve">while forming no groups. Nearness in an ordination is nearness on the ground, seen through the assemblages. His own redrawn phases make the same point from the other side: drawn after the ordination, they sit where the assemblages differ and no longer form the map’s tightest division. The two schemes are one gradient viewed in two ways, once by proximity and once by the assemblages. The redrawn scheme also shows that the same tests can favor a set of phase lines, so the inherited scheme’s failure is not built into them. A phase also folds time into space. McNutt, Franklin, and Henry</w:t>
+        <w:t xml:space="preserve">while forming no groups. Nearness in an ordination is nearness on the ground, seen through the assemblages. His table adds a second tally. There the site map alone agrees with his scheme at 0.54, and his lines separate the assemblages better than arbitrary ones. The tests can therefore favor a set of phase lines, and on our matrix they favor Phillips’s only weakly. A phase also folds time into space. McNutt, Franklin, and Henry</w:t>
       </w:r>
       <w:r>
         <w:t xml:space="preserve"> </w:t>
@@ -3652,7 +3907,7 @@
         <w:t xml:space="preserve"> </w:t>
       </w:r>
       <w:r>
-        <w:t xml:space="preserve">The comparison adds a mechanism shown to be sufficient, and tests whether the Parkin, Kent, and Walls phase lines behave as edges of bounded learning.</w:t>
+        <w:t xml:space="preserve">The comparison adds a test of that reading: whether the Parkin, Kent, and Walls phase lines behave as edges of bounded learning.</w:t>
       </w:r>
     </w:p>
     <w:p>
@@ -3660,96 +3915,7 @@
         <w:pStyle w:val="BodyText"/>
       </w:pPr>
       <w:r>
-        <w:t xml:space="preserve">The assemblages carry one property the calibrated copying model does not produce. They vary over shorter distances than calibrated copying would, so divisions into three or more groups differ more than the model predicts, and every line drawn across the map shows a step in similarity. That variation is not organized by the phase lines or centered on Parkin, and it remains incompletely explained. New styles arising somewhat locally, with copying that falls off over a few kilometers, both make the observed differences more common in simulation while keeping the record’s diversity matched (Table 2). Both are still neutral copying, and both are themselves geographic, but we treat them as mechanisms the record is consistent with rather than ones it demonstrates. Part of the variation may also be chronological, a matter of age that an order derived from the same frequencies cannot separate from place.</w:t>
-      </w:r>
-    </w:p>
-    <w:bookmarkEnd w:id="155"/>
-    <w:bookmarkStart w:id="156" w:name="parkin-and-the-polity"/>
-    <w:p>
-      <w:pPr>
-        <w:pStyle w:val="Heading3"/>
-      </w:pPr>
-      <w:r>
-        <w:t xml:space="preserve">Parkin and the polity</w:t>
-      </w:r>
-    </w:p>
-    <w:p>
-      <w:pPr>
-        <w:pStyle w:val="FirstParagraph"/>
-      </w:pPr>
-      <w:r>
-        <w:t xml:space="preserve">Parkin was the basin’s largest town and had one of its tallest mounds, and its prominence was real. The decorated-type frequencies, however, do not show a boundary in ceramic learning at the edge of the Parkin phase. The phase is the northern of the two clusters the regional map supports. Its difference from the rest of the basin is the one the copying model reproduces most easily, and alternative divisions separate the assemblages as well as its boundary does. Because a single line gives these comparisons little power, restricted copying at the phase’s edge cannot be excluded, but nothing in the frequencies requires it.</w:t>
-      </w:r>
-    </w:p>
-    <w:p>
-      <w:pPr>
-        <w:pStyle w:val="BodyText"/>
-      </w:pPr>
-      <w:r>
-        <w:t xml:space="preserve">The arguments usually offered for a Parkin polity do not supply the missing signal. The argument that Parkin, on poor soil, must have drawn tribute from productive neighbors</w:t>
-      </w:r>
-      <w:r>
-        <w:t xml:space="preserve"> </w:t>
-      </w:r>
-      <w:r>
-        <w:t xml:space="preserve">(Phyllis A. Morse 1990:124)</w:t>
-      </w:r>
-      <w:r>
-        <w:t xml:space="preserve"> </w:t>
-      </w:r>
-      <w:r>
-        <w:t xml:space="preserve">assumes the tribute it concludes, and Morse</w:t>
-      </w:r>
-      <w:r>
-        <w:t xml:space="preserve"> </w:t>
-      </w:r>
-      <w:r>
-        <w:t xml:space="preserve">(1990:123)</w:t>
-      </w:r>
-      <w:r>
-        <w:t xml:space="preserve"> </w:t>
-      </w:r>
-      <w:r>
-        <w:t xml:space="preserve">also notes that Parkin’s position below the confluence of the St. Francis and Tyronza gave it control of river travel, which accounts for its prominence as well as extraction does. Skeletal evidence that people at a mound center ate better than people at a nearby village comes from Hollywood, one of the assemblages analyzed here. Compared with a village of fourteen individuals</w:t>
-      </w:r>
-      <w:r>
-        <w:t xml:space="preserve"> </w:t>
-      </w:r>
-      <w:r>
-        <w:t xml:space="preserve">(Ross-Stallings 2017)</w:t>
-      </w:r>
-      <w:r>
-        <w:t xml:space="preserve">, a health difference between two sites need not arise from an extractive hierarchy. The region’s own history also offers a precedent for separating polity from a ceramically defined phase. Coosa, the best-documented Mississippian paramountcy, spanned two ceramic traditions and site clusters that were separable at the phase level, and political affiliation rather than shared decoration bound them together</w:t>
-      </w:r>
-      <w:r>
-        <w:t xml:space="preserve"> </w:t>
-      </w:r>
-      <w:r>
-        <w:t xml:space="preserve">(Anderson 1996:250–251)</w:t>
-      </w:r>
-      <w:r>
-        <w:t xml:space="preserve">. A polity need not coincide with a phase, and the reverse inference, from one phase to one polity, has no warrant on its own. If the polity the De Soto expedition met was at Parkin, the evidence for it lies in ceremony, fortification, and settlement size. The decorated pottery is silent on it rather than evidence against it.</w:t>
-      </w:r>
-    </w:p>
-    <w:bookmarkEnd w:id="156"/>
-    <w:bookmarkStart w:id="157" w:name="limits"/>
-    <w:p>
-      <w:pPr>
-        <w:pStyle w:val="Heading3"/>
-      </w:pPr>
-      <w:r>
-        <w:t xml:space="preserve">Limits</w:t>
-      </w:r>
-    </w:p>
-    <w:p>
-      <w:pPr>
-        <w:pStyle w:val="FirstParagraph"/>
-      </w:pPr>
-      <w:r>
-        <w:t xml:space="preserve">Four limits bound these conclusions. The first is resolution. On a record of this size, only cultural</w:t>
-      </w:r>
-      <w:r>
-        <w:t xml:space="preserve"> </w:t>
+        <w:t xml:space="preserve">The assemblages carry one property the calibrated copying model does not produce, and it concerns a small part of the variation. Mean diversity within an assemblage is 95 percent of the diversity of all assemblages pooled (0.563 against 0.592), and the three phases account for about 1 percent of it (</w:t>
       </w:r>
       <m:oMath>
         <m:sSub>
@@ -3772,7 +3938,93 @@
         <w:t xml:space="preserve"> </w:t>
       </w:r>
       <w:r>
-        <w:t xml:space="preserve">can detect groups, and only groups that follow geography closely enough to be captured by spatial divisions; social divisions that cut across the map could raise</w:t>
+        <w:t xml:space="preserve">0.012). Within that small part, the assemblages vary over shorter distances than calibrated copying would, so divisions into three or more groups differ more than the model predicts, and arbitrary divisions of the map show a step in similarity of about the size seen at the phase lines. That variation is not specific to the phase lines or to Parkin, since other divisions of the map capture about as much of it, and it remains incompletely explained. New styles arising somewhat locally, and copying that falls off over a few kilometers, both make the observed differences more common in simulation while keeping the record’s diversity matched (Table 2). Both are still neutral copying, and both are themselves geographic. The simulations do not fix the scale of either. Local innovation fits with areas the size of half the basin, its finer-grained settings either break the diversity match or are weakly tested, and the short fall-off raises the shares only slightly. One reading, which we offer as a hypothesis and have not tested, is that interaction was concentrated in the area a community used from day to day, a few kilometers around a settlement, as would be expected of farmers, hunters, and fishers who drew on local resources. We treat these as mechanisms the record is consistent with rather than ones it demonstrates. Part of the variation may also be chronological, a matter of age that an order derived from the same frequencies cannot separate from place.</w:t>
+      </w:r>
+    </w:p>
+    <w:bookmarkEnd w:id="158"/>
+    <w:bookmarkStart w:id="159" w:name="parkin-and-the-polity"/>
+    <w:p>
+      <w:pPr>
+        <w:pStyle w:val="Heading3"/>
+      </w:pPr>
+      <w:r>
+        <w:t xml:space="preserve">Parkin and the polity</w:t>
+      </w:r>
+    </w:p>
+    <w:p>
+      <w:pPr>
+        <w:pStyle w:val="FirstParagraph"/>
+      </w:pPr>
+      <w:r>
+        <w:t xml:space="preserve">Parkin was the basin’s largest town and had one of its tallest mounds, and its prominence was real. The decorated-type frequencies, however, do not show a boundary in ceramic learning at the edge of the Parkin phase. The phase is close to the northern of the two clusters the regional map supports. Its difference from the rest of the basin is one the copying model reproduces more often than any division but the two-cluster one, the step in similarity at its edge lies within what copying alone produces, and divisions around random centers separate the assemblages as well as its boundary does, although compact ones do not. Because a single line gives these comparisons little power, restricted copying at the phase’s edge cannot be excluded, but nothing in the frequencies requires it.</w:t>
+      </w:r>
+    </w:p>
+    <w:p>
+      <w:pPr>
+        <w:pStyle w:val="BodyText"/>
+      </w:pPr>
+      <w:r>
+        <w:t xml:space="preserve">The arguments usually offered for a Parkin polity do not supply the missing signal. The argument that Parkin, on poor soil, must have drawn tribute from productive neighbors</w:t>
+      </w:r>
+      <w:r>
+        <w:t xml:space="preserve"> </w:t>
+      </w:r>
+      <w:r>
+        <w:t xml:space="preserve">(Phyllis A. Morse 1990:124)</w:t>
+      </w:r>
+      <w:r>
+        <w:t xml:space="preserve"> </w:t>
+      </w:r>
+      <w:r>
+        <w:t xml:space="preserve">assumes the tribute it concludes, and Morse</w:t>
+      </w:r>
+      <w:r>
+        <w:t xml:space="preserve"> </w:t>
+      </w:r>
+      <w:r>
+        <w:t xml:space="preserve">(1990:123)</w:t>
+      </w:r>
+      <w:r>
+        <w:t xml:space="preserve"> </w:t>
+      </w:r>
+      <w:r>
+        <w:t xml:space="preserve">also notes that Parkin’s position below the confluence of the St. Francis and Tyronza gave it control of river travel, which accounts for its prominence as well as extraction does. Skeletal evidence that people at a mound center ate better than people at a nearby village comes from Hollywood, one of the assemblages analyzed here. Compared with a village of fourteen individuals</w:t>
+      </w:r>
+      <w:r>
+        <w:t xml:space="preserve"> </w:t>
+      </w:r>
+      <w:r>
+        <w:t xml:space="preserve">(Ross-Stallings 2017)</w:t>
+      </w:r>
+      <w:r>
+        <w:t xml:space="preserve">, a health difference between two sites need not arise from an extractive hierarchy. The region’s own history also offers a precedent for separating polity from a ceramically defined phase. Coosa, the best-documented Mississippian paramountcy, spanned two ceramic traditions and site clusters that were separable at the phase level, and political affiliation rather than shared decoration bound them together</w:t>
+      </w:r>
+      <w:r>
+        <w:t xml:space="preserve"> </w:t>
+      </w:r>
+      <w:r>
+        <w:t xml:space="preserve">(Anderson 1996:250–251)</w:t>
+      </w:r>
+      <w:r>
+        <w:t xml:space="preserve">. A polity need not coincide with a phase, and the reverse inference, from one phase to one polity, has no warrant on its own. If the polity the De Soto expedition met was at Parkin, the evidence for it lies in ceremony, fortification, and settlement size. The decorated pottery is silent on it rather than evidence against it.</w:t>
+      </w:r>
+    </w:p>
+    <w:bookmarkEnd w:id="159"/>
+    <w:bookmarkStart w:id="160" w:name="limits"/>
+    <w:p>
+      <w:pPr>
+        <w:pStyle w:val="Heading3"/>
+      </w:pPr>
+      <w:r>
+        <w:t xml:space="preserve">Limits</w:t>
+      </w:r>
+    </w:p>
+    <w:p>
+      <w:pPr>
+        <w:pStyle w:val="FirstParagraph"/>
+      </w:pPr>
+      <w:r>
+        <w:t xml:space="preserve">Four limits bound these conclusions. The first is resolution. On a record of this size, only cultural</w:t>
       </w:r>
       <w:r>
         <w:t xml:space="preserve"> </w:t>
@@ -3798,34 +4050,7 @@
         <w:t xml:space="preserve"> </w:t>
       </w:r>
       <w:r>
-        <w:t xml:space="preserve">at spatial divisions without being identified as groups, and closure carried purely by conformity within one pool would escape detection (Supplemental Text). The second is chronology. Radiocarbon dates match only four assemblages, and the seriation axis follows latitude more closely than age. The phase-line tests do not depend on it, and the copying-model comparison gives nearly the same answer when all assemblages are treated as contemporaneous, but the record cannot say whether any difference grew through time; within its limits, it shows none (Supplemental Text). The third is time-averaging, which damps differences between assemblages</w:t>
-      </w:r>
-      <w:r>
-        <w:t xml:space="preserve"> </w:t>
-      </w:r>
-      <w:r>
-        <w:t xml:space="preserve">(Kidwell and Tomašových 2013; Perreault 2018; Tomašových and Kidwell 2009; Youngblood et al. 2023)</w:t>
-      </w:r>
-      <w:r>
-        <w:t xml:space="preserve">. We built it into the copying model, so its cost is already in the reported ranges. The fourth is the copying model itself. Which combination is most favorable to it depends on the random seeds used to rank them, so we report the key comparisons across six (Table 1). The model distinguishes a copying boundary at the phase lines from new styles arising locally only weakly, so the conclusion about the phases rests on how their lines compare with other divisions of the map and what could have drawn them, rather than on the model’s failure to find restricted copying.</w:t>
-      </w:r>
-    </w:p>
-    <w:bookmarkEnd w:id="157"/>
-    <w:bookmarkStart w:id="158" w:name="X58aa97846e4267ccd885b870dbd88e44a706276"/>
-    <w:p>
-      <w:pPr>
-        <w:pStyle w:val="Heading3"/>
-      </w:pPr>
-      <w:r>
-        <w:t xml:space="preserve">What this approach contributes to the study of social units</w:t>
-      </w:r>
-    </w:p>
-    <w:p>
-      <w:pPr>
-        <w:pStyle w:val="FirstParagraph"/>
-      </w:pPr>
-      <w:r>
-        <w:t xml:space="preserve">Our approach rests on two requirements that apply beyond this case. Before treating a similarity pattern as the result of differential social interaction, the record must be shown to detect a social boundary. Here, we show that</w:t>
+        <w:t xml:space="preserve">can detect groups, and only groups that follow geography closely enough to be captured by spatial divisions; social divisions that cut across the map could raise</w:t>
       </w:r>
       <w:r>
         <w:t xml:space="preserve"> </w:t>
@@ -3851,6 +4076,59 @@
         <w:t xml:space="preserve"> </w:t>
       </w:r>
       <w:r>
+        <w:t xml:space="preserve">at spatial divisions without being identified as groups, and closure carried purely by conformity within one pool would escape detection (Supplemental Text). The second is chronology. Radiocarbon dates match only four assemblages, and the seriation axis follows latitude more closely than age. The phase-line tests do not depend on it, and the copying-model comparison gives nearly the same answer when all assemblages are treated as contemporaneous, but the record cannot say whether any difference grew through time; within its limits, it shows none (Supplemental Text). The third is time-averaging, which damps differences between assemblages</w:t>
+      </w:r>
+      <w:r>
+        <w:t xml:space="preserve"> </w:t>
+      </w:r>
+      <w:r>
+        <w:t xml:space="preserve">(Kidwell and Tomašových 2013; Perreault 2018; Tomašových and Kidwell 2009; Youngblood et al. 2023)</w:t>
+      </w:r>
+      <w:r>
+        <w:t xml:space="preserve">. We built it into the copying model, so its cost is already in the reported ranges. The fourth is the copying model itself. Which combination is most favorable to it depends on the random seeds used to rank them, so we report the key comparisons across six (Table 1). The model distinguishes a copying boundary at the phase lines from new styles arising locally only weakly, so the conclusion about the phases rests on how their lines compare with other divisions of the map and what could have drawn them, rather than on the model’s failure to find restricted copying.</w:t>
+      </w:r>
+    </w:p>
+    <w:bookmarkEnd w:id="160"/>
+    <w:bookmarkStart w:id="161" w:name="X58aa97846e4267ccd885b870dbd88e44a706276"/>
+    <w:p>
+      <w:pPr>
+        <w:pStyle w:val="Heading3"/>
+      </w:pPr>
+      <w:r>
+        <w:t xml:space="preserve">What this approach contributes to the study of social units</w:t>
+      </w:r>
+    </w:p>
+    <w:p>
+      <w:pPr>
+        <w:pStyle w:val="FirstParagraph"/>
+      </w:pPr>
+      <w:r>
+        <w:t xml:space="preserve">Our approach rests on two requirements that apply beyond this case. Before treating a similarity pattern as the result of differential social interaction, the record must be shown to detect a social boundary. Here, we show that</w:t>
+      </w:r>
+      <w:r>
+        <w:t xml:space="preserve"> </w:t>
+      </w:r>
+      <m:oMath>
+        <m:sSub>
+          <m:e>
+            <m:r>
+              <m:t>F</m:t>
+            </m:r>
+          </m:e>
+          <m:sub>
+            <m:r>
+              <m:t>S</m:t>
+            </m:r>
+            <m:r>
+              <m:t>T</m:t>
+            </m:r>
+          </m:sub>
+        </m:sSub>
+      </m:oMath>
+      <w:r>
+        <w:t xml:space="preserve"> </w:t>
+      </w:r>
+      <w:r>
         <w:t xml:space="preserve">is the one measure of four that can do this with assemblage-scale data that includes time aggregation. Before a model of copying with no groups is credited with reproducing a record, it must be shown to fit that record’s own diversity. The second requirement changed our own results: calibrated, the model is narrower than an uncalibrated one and shows the shorter-range variation it misses. A model that is run at the wrong diversity is easily credited with structure it cannot produce, just as a localized neutral process is easily mistaken for biased copying when diversity is taken at face value</w:t>
       </w:r>
       <w:r>
@@ -3889,9 +4167,9 @@
         <w:t xml:space="preserve">.</w:t>
       </w:r>
     </w:p>
-    <w:bookmarkEnd w:id="158"/>
-    <w:bookmarkEnd w:id="159"/>
-    <w:bookmarkStart w:id="160" w:name="conclusion"/>
+    <w:bookmarkEnd w:id="161"/>
+    <w:bookmarkEnd w:id="162"/>
+    <w:bookmarkStart w:id="163" w:name="conclusion"/>
     <w:p>
       <w:pPr>
         <w:pStyle w:val="Heading2"/>
@@ -3905,7 +4183,7 @@
         <w:pStyle w:val="FirstParagraph"/>
       </w:pPr>
       <w:r>
-        <w:t xml:space="preserve">The phase is the unit on which Lower Mississippi Valley culture history is built, and it often carries an unstated claim: that assemblages grouped by seriation and proximity record a community, and at Parkin, a polity. Earlier work showed that the phases do not separate cleanly. This paper tests whether the inherited phases of the St. Francis basin coincide with restrictions on the copying of decorated pottery, and offers an explanation for their apparent organization. The inherited phases do not uniquely capture the basin’s decorated-ceramic differentiation. A regional map of deposit locations alone recovers them. Alternative spatial divisions of the same sites capture as much or more of the differentiation, and pottery made by copying with no groups sorts into the same phases. Phases redrawn from an ordination of the assemblages behave differently, following the pottery rather than the map, which is the contrast this explanation predicts. Spatially structured copying, sampled at clumped settlements and sorted by resemblance and proximity, is therefore a sufficient and plausible account of how the phases came to look like groups.</w:t>
+        <w:t xml:space="preserve">The phase is the unit on which Lower Mississippi Valley culture history is built, and it often carries an unstated claim: that assemblages grouped by seriation and proximity record a community, and at Parkin, a polity. Earlier work showed that the phases do not separate cleanly. This paper tests whether the phases of the St. Francis basin, as Phillips defined them, coincide with restrictions on the copying of decorated pottery, and offers an explanation for their apparent organization. The phases have the properties of units sorted by resemblance and proximity from a clumped record. Their lines run through sparsely settled country, and hierarchical clustering of site locations alone recovers them for all but two assemblages. They do not uniquely capture the basin’s decorated-ceramic differentiation. Alternative spatial divisions of the same sites capture about as much of it, and the step in similarity at the phase lines appears at arbitrary lines as well. Pottery made by copying with no groups sorts into the phases about as readily as the real pottery under hierarchical clustering when composition is given a quarter of location’s weight or less. On resemblance alone, the real pottery fits the phases better than most simulated pottery does, but the same frequencies were used to draw them. On a second tally under a revised scheme, location again recovers much of the scheme, and the phase lines separate the assemblages more clearly. Spatially structured copying, sampled at clumped settlements and sorted by resemblance and proximity, remains a plausible account of how the phases came to look like groups, but the calibrated model does not reproduce them in full.</w:t>
       </w:r>
     </w:p>
     <w:p>
@@ -3913,11 +4191,11 @@
         <w:pStyle w:val="BodyText"/>
       </w:pPr>
       <w:r>
-        <w:t xml:space="preserve">These results weaken the use of phase membership alone as evidence of bounded ceramic interaction communities. They do not exclude a Parkin polity, whose political boundaries need not have followed ceramic traditions, nor weak restrictions on copying at the phase lines, and the additional variation at finer scales remains incompletely explained. Before a phase is interpreted as a bounded community, its frequencies should show what copying across distance does not produce, and its lines should separate the assemblages better than other lines drawn across the same map.</w:t>
-      </w:r>
-    </w:p>
-    <w:bookmarkEnd w:id="160"/>
-    <w:bookmarkStart w:id="161" w:name="data-and-code-availability"/>
+        <w:t xml:space="preserve">These results weaken the use of phase membership alone as evidence of bounded ceramic interaction communities. They do not exclude a Parkin polity, whose political boundaries need not have followed ceramic traditions, nor restrictions on copying at the phase lines, and the additional variation at finer scales remains incompletely explained. Before a phase is interpreted as a bounded community, its frequencies should show what copying across distance does not produce, and its lines should separate the assemblages better than other lines drawn across the same map.</w:t>
+      </w:r>
+    </w:p>
+    <w:bookmarkEnd w:id="163"/>
+    <w:bookmarkStart w:id="164" w:name="data-and-code-availability"/>
     <w:p>
       <w:pPr>
         <w:pStyle w:val="Heading2"/>
@@ -3949,8 +4227,8 @@
         <w:t xml:space="preserve">and analyses 47 and 50, which write every simulation, the calibration series, and a configuration fingerprint. The code is released under the MIT License, and the data under a Creative Commons Attribution 4.0 International license.</w:t>
       </w:r>
     </w:p>
-    <w:bookmarkEnd w:id="161"/>
-    <w:bookmarkStart w:id="274" w:name="references"/>
+    <w:bookmarkEnd w:id="164"/>
+    <w:bookmarkStart w:id="276" w:name="references"/>
     <w:p>
       <w:pPr>
         <w:pStyle w:val="Heading2"/>
@@ -3959,8 +4237,8 @@
         <w:t xml:space="preserve">References</w:t>
       </w:r>
     </w:p>
-    <w:bookmarkStart w:id="273" w:name="refs"/>
-    <w:bookmarkStart w:id="162" w:name="ref-anderson_1996"/>
+    <w:bookmarkStart w:id="275" w:name="refs"/>
+    <w:bookmarkStart w:id="165" w:name="ref-anderson_1996"/>
     <w:p>
       <w:pPr>
         <w:pStyle w:val="Bibliography"/>
@@ -3982,8 +4260,8 @@
         <w:t xml:space="preserve">, edited by John F. Scarry, pp. 231–252. University Press of Florida, Gainesville.</w:t>
       </w:r>
     </w:p>
-    <w:bookmarkEnd w:id="162"/>
-    <w:bookmarkStart w:id="163" w:name="ref-baxter_1994"/>
+    <w:bookmarkEnd w:id="165"/>
+    <w:bookmarkStart w:id="166" w:name="ref-baxter_1994"/>
     <w:p>
       <w:pPr>
         <w:pStyle w:val="Bibliography"/>
@@ -4005,8 +4283,8 @@
         <w:t xml:space="preserve">. Edinburgh University Press, Edinburgh.</w:t>
       </w:r>
     </w:p>
-    <w:bookmarkEnd w:id="163"/>
-    <w:bookmarkStart w:id="164" w:name="ref-beaumont_zhang_balding_2002"/>
+    <w:bookmarkEnd w:id="166"/>
+    <w:bookmarkStart w:id="167" w:name="ref-beaumont_zhang_balding_2002"/>
     <w:p>
       <w:pPr>
         <w:pStyle w:val="Bibliography"/>
@@ -4043,8 +4321,8 @@
         <w:t xml:space="preserve">162(4):2025–2035.</w:t>
       </w:r>
     </w:p>
-    <w:bookmarkEnd w:id="164"/>
-    <w:bookmarkStart w:id="166" w:name="ref-beck_2003"/>
+    <w:bookmarkEnd w:id="167"/>
+    <w:bookmarkStart w:id="169" w:name="ref-beck_2003"/>
     <w:p>
       <w:pPr>
         <w:pStyle w:val="Bibliography"/>
@@ -4083,7 +4361,7 @@
       <w:r>
         <w:t xml:space="preserve"> </w:t>
       </w:r>
-      <w:hyperlink r:id="rId165">
+      <w:hyperlink r:id="rId168">
         <w:r>
           <w:rPr>
             <w:rStyle w:val="Hyperlink"/>
@@ -4095,8 +4373,8 @@
         <w:t xml:space="preserve">.</w:t>
       </w:r>
     </w:p>
-    <w:bookmarkEnd w:id="166"/>
-    <w:bookmarkStart w:id="168" w:name="ref-bell_richerson_mcelreath_2009"/>
+    <w:bookmarkEnd w:id="169"/>
+    <w:bookmarkStart w:id="171" w:name="ref-bell_richerson_mcelreath_2009"/>
     <w:p>
       <w:pPr>
         <w:pStyle w:val="Bibliography"/>
@@ -4123,7 +4401,7 @@
       <w:r>
         <w:t xml:space="preserve"> </w:t>
       </w:r>
-      <w:hyperlink r:id="rId167">
+      <w:hyperlink r:id="rId170">
         <w:r>
           <w:rPr>
             <w:rStyle w:val="Hyperlink"/>
@@ -4135,8 +4413,8 @@
         <w:t xml:space="preserve">.</w:t>
       </w:r>
     </w:p>
-    <w:bookmarkEnd w:id="168"/>
-    <w:bookmarkStart w:id="170" w:name="ref-bentley_hahn_shennan_2004"/>
+    <w:bookmarkEnd w:id="171"/>
+    <w:bookmarkStart w:id="173" w:name="ref-bentley_hahn_shennan_2004"/>
     <w:p>
       <w:pPr>
         <w:pStyle w:val="Bibliography"/>
@@ -4163,7 +4441,7 @@
       <w:r>
         <w:t xml:space="preserve"> </w:t>
       </w:r>
-      <w:hyperlink r:id="rId169">
+      <w:hyperlink r:id="rId172">
         <w:r>
           <w:rPr>
             <w:rStyle w:val="Hyperlink"/>
@@ -4175,8 +4453,8 @@
         <w:t xml:space="preserve">.</w:t>
       </w:r>
     </w:p>
-    <w:bookmarkEnd w:id="170"/>
-    <w:bookmarkStart w:id="172" w:name="ref-blitz_1999"/>
+    <w:bookmarkEnd w:id="173"/>
+    <w:bookmarkStart w:id="175" w:name="ref-blitz_1999"/>
     <w:p>
       <w:pPr>
         <w:pStyle w:val="Bibliography"/>
@@ -4215,7 +4493,7 @@
       <w:r>
         <w:t xml:space="preserve"> </w:t>
       </w:r>
-      <w:hyperlink r:id="rId171">
+      <w:hyperlink r:id="rId174">
         <w:r>
           <w:rPr>
             <w:rStyle w:val="Hyperlink"/>
@@ -4227,8 +4505,8 @@
         <w:t xml:space="preserve">.</w:t>
       </w:r>
     </w:p>
-    <w:bookmarkEnd w:id="172"/>
-    <w:bookmarkStart w:id="173" w:name="ref-brainerd_1951"/>
+    <w:bookmarkEnd w:id="175"/>
+    <w:bookmarkStart w:id="176" w:name="ref-brainerd_1951"/>
     <w:p>
       <w:pPr>
         <w:pStyle w:val="Bibliography"/>
@@ -4253,8 +4531,8 @@
         <w:t xml:space="preserve">16(4):301–313.</w:t>
       </w:r>
     </w:p>
-    <w:bookmarkEnd w:id="173"/>
-    <w:bookmarkStart w:id="174" w:name="ref-carpenter_etal_2017"/>
+    <w:bookmarkEnd w:id="176"/>
+    <w:bookmarkStart w:id="177" w:name="ref-carpenter_etal_2017"/>
     <w:p>
       <w:pPr>
         <w:pStyle w:val="Bibliography"/>
@@ -4279,8 +4557,8 @@
         <w:t xml:space="preserve">76(1):1–32.</w:t>
       </w:r>
     </w:p>
-    <w:bookmarkEnd w:id="174"/>
-    <w:bookmarkStart w:id="175" w:name="ref-cobb_2000"/>
+    <w:bookmarkEnd w:id="177"/>
+    <w:bookmarkStart w:id="178" w:name="ref-cobb_2000"/>
     <w:p>
       <w:pPr>
         <w:pStyle w:val="Bibliography"/>
@@ -4330,8 +4608,8 @@
         <w:t xml:space="preserve">. University of Alabama Press, Tuscaloosa.</w:t>
       </w:r>
     </w:p>
-    <w:bookmarkEnd w:id="175"/>
-    <w:bookmarkStart w:id="177" w:name="ref-crema_bortolini_lake_2023"/>
+    <w:bookmarkEnd w:id="178"/>
+    <w:bookmarkStart w:id="180" w:name="ref-crema_bortolini_lake_2023"/>
     <w:p>
       <w:pPr>
         <w:pStyle w:val="Bibliography"/>
@@ -4358,7 +4636,7 @@
       <w:r>
         <w:t xml:space="preserve"> </w:t>
       </w:r>
-      <w:hyperlink r:id="rId176">
+      <w:hyperlink r:id="rId179">
         <w:r>
           <w:rPr>
             <w:rStyle w:val="Hyperlink"/>
@@ -4370,8 +4648,8 @@
         <w:t xml:space="preserve">.</w:t>
       </w:r>
     </w:p>
-    <w:bookmarkEnd w:id="177"/>
-    <w:bookmarkStart w:id="179" w:name="ref-crema_kandler_shennan_2016"/>
+    <w:bookmarkEnd w:id="180"/>
+    <w:bookmarkStart w:id="182" w:name="ref-crema_kandler_shennan_2016"/>
     <w:p>
       <w:pPr>
         <w:pStyle w:val="Bibliography"/>
@@ -4398,7 +4676,7 @@
       <w:r>
         <w:t xml:space="preserve"> </w:t>
       </w:r>
-      <w:hyperlink r:id="rId178">
+      <w:hyperlink r:id="rId181">
         <w:r>
           <w:rPr>
             <w:rStyle w:val="Hyperlink"/>
@@ -4410,8 +4688,8 @@
         <w:t xml:space="preserve">.</w:t>
       </w:r>
     </w:p>
-    <w:bookmarkEnd w:id="179"/>
-    <w:bookmarkStart w:id="181" w:name="ref-dunnell_1978"/>
+    <w:bookmarkEnd w:id="182"/>
+    <w:bookmarkStart w:id="184" w:name="ref-dunnell_1978"/>
     <w:p>
       <w:pPr>
         <w:pStyle w:val="Bibliography"/>
@@ -4438,7 +4716,7 @@
       <w:r>
         <w:t xml:space="preserve"> </w:t>
       </w:r>
-      <w:hyperlink r:id="rId180">
+      <w:hyperlink r:id="rId183">
         <w:r>
           <w:rPr>
             <w:rStyle w:val="Hyperlink"/>
@@ -4450,8 +4728,8 @@
         <w:t xml:space="preserve">.</w:t>
       </w:r>
     </w:p>
-    <w:bookmarkEnd w:id="181"/>
-    <w:bookmarkStart w:id="182" w:name="ref-dunnell_1980"/>
+    <w:bookmarkEnd w:id="184"/>
+    <w:bookmarkStart w:id="185" w:name="ref-dunnell_1980"/>
     <w:p>
       <w:pPr>
         <w:pStyle w:val="Bibliography"/>
@@ -4473,8 +4751,8 @@
         <w:t xml:space="preserve">, edited by Michael B. Schiffer, pp. 35–99. Academic Press, New York.</w:t>
       </w:r>
     </w:p>
-    <w:bookmarkEnd w:id="182"/>
-    <w:bookmarkStart w:id="183" w:name="ref-dunnell_1995"/>
+    <w:bookmarkEnd w:id="185"/>
+    <w:bookmarkStart w:id="186" w:name="ref-dunnell_1995"/>
     <w:p>
       <w:pPr>
         <w:pStyle w:val="Bibliography"/>
@@ -4496,8 +4774,8 @@
         <w:t xml:space="preserve">, edited by Patrice A. Teltser, pp. 33–50. University of Arizona Press, Tucson.</w:t>
       </w:r>
     </w:p>
-    <w:bookmarkEnd w:id="183"/>
-    <w:bookmarkStart w:id="185" w:name="ref-eerkens_lipo_2005"/>
+    <w:bookmarkEnd w:id="186"/>
+    <w:bookmarkStart w:id="188" w:name="ref-eerkens_lipo_2005"/>
     <w:p>
       <w:pPr>
         <w:pStyle w:val="Bibliography"/>
@@ -4524,7 +4802,7 @@
       <w:r>
         <w:t xml:space="preserve"> </w:t>
       </w:r>
-      <w:hyperlink r:id="rId184">
+      <w:hyperlink r:id="rId187">
         <w:r>
           <w:rPr>
             <w:rStyle w:val="Hyperlink"/>
@@ -4536,8 +4814,8 @@
         <w:t xml:space="preserve">.</w:t>
       </w:r>
     </w:p>
-    <w:bookmarkEnd w:id="185"/>
-    <w:bookmarkStart w:id="187" w:name="ref-eerkens_lipo_2007"/>
+    <w:bookmarkEnd w:id="188"/>
+    <w:bookmarkStart w:id="190" w:name="ref-eerkens_lipo_2007"/>
     <w:p>
       <w:pPr>
         <w:pStyle w:val="Bibliography"/>
@@ -4564,7 +4842,7 @@
       <w:r>
         <w:t xml:space="preserve"> </w:t>
       </w:r>
-      <w:hyperlink r:id="rId186">
+      <w:hyperlink r:id="rId189">
         <w:r>
           <w:rPr>
             <w:rStyle w:val="Hyperlink"/>
@@ -4576,8 +4854,8 @@
         <w:t xml:space="preserve">.</w:t>
       </w:r>
     </w:p>
-    <w:bookmarkEnd w:id="187"/>
-    <w:bookmarkStart w:id="189" w:name="ref-fogarty_kandler_creanza_2024"/>
+    <w:bookmarkEnd w:id="190"/>
+    <w:bookmarkStart w:id="192" w:name="ref-fogarty_kandler_creanza_2024"/>
     <w:p>
       <w:pPr>
         <w:pStyle w:val="Bibliography"/>
@@ -4604,7 +4882,7 @@
       <w:r>
         <w:t xml:space="preserve"> </w:t>
       </w:r>
-      <w:hyperlink r:id="rId188">
+      <w:hyperlink r:id="rId191">
         <w:r>
           <w:rPr>
             <w:rStyle w:val="Hyperlink"/>
@@ -4616,8 +4894,8 @@
         <w:t xml:space="preserve">.</w:t>
       </w:r>
     </w:p>
-    <w:bookmarkEnd w:id="189"/>
-    <w:bookmarkStart w:id="190" w:name="ref-fox_1998"/>
+    <w:bookmarkEnd w:id="192"/>
+    <w:bookmarkStart w:id="193" w:name="ref-fox_1998"/>
     <w:p>
       <w:pPr>
         <w:pStyle w:val="Bibliography"/>
@@ -4639,8 +4917,8 @@
         <w:t xml:space="preserve">, edited by Michael J. O’Brien and Robert C. Dunnell, pp. 31–58. University of Alabama Press, Tuscaloosa.</w:t>
       </w:r>
     </w:p>
-    <w:bookmarkEnd w:id="190"/>
-    <w:bookmarkStart w:id="191" w:name="ref-gelman_meng_stern_1996"/>
+    <w:bookmarkEnd w:id="193"/>
+    <w:bookmarkStart w:id="194" w:name="ref-gelman_meng_stern_1996"/>
     <w:p>
       <w:pPr>
         <w:pStyle w:val="Bibliography"/>
@@ -4665,8 +4943,8 @@
         <w:t xml:space="preserve">6(4):733–807.</w:t>
       </w:r>
     </w:p>
-    <w:bookmarkEnd w:id="191"/>
-    <w:bookmarkStart w:id="193" w:name="ref-haley_2014"/>
+    <w:bookmarkEnd w:id="194"/>
+    <w:bookmarkStart w:id="196" w:name="ref-haley_2014"/>
     <w:p>
       <w:pPr>
         <w:pStyle w:val="Bibliography"/>
@@ -4714,7 +4992,7 @@
       <w:r>
         <w:t xml:space="preserve"> </w:t>
       </w:r>
-      <w:hyperlink r:id="rId192">
+      <w:hyperlink r:id="rId195">
         <w:r>
           <w:rPr>
             <w:rStyle w:val="Hyperlink"/>
@@ -4726,8 +5004,8 @@
         <w:t xml:space="preserve">.</w:t>
       </w:r>
     </w:p>
-    <w:bookmarkEnd w:id="193"/>
-    <w:bookmarkStart w:id="195" w:name="ref-henrich_2001"/>
+    <w:bookmarkEnd w:id="196"/>
+    <w:bookmarkStart w:id="198" w:name="ref-henrich_2001"/>
     <w:p>
       <w:pPr>
         <w:pStyle w:val="Bibliography"/>
@@ -4754,7 +5032,7 @@
       <w:r>
         <w:t xml:space="preserve"> </w:t>
       </w:r>
-      <w:hyperlink r:id="rId194">
+      <w:hyperlink r:id="rId197">
         <w:r>
           <w:rPr>
             <w:rStyle w:val="Hyperlink"/>
@@ -4766,8 +5044,8 @@
         <w:t xml:space="preserve">.</w:t>
       </w:r>
     </w:p>
-    <w:bookmarkEnd w:id="195"/>
-    <w:bookmarkStart w:id="197" w:name="ref-henrich_boyd_1998"/>
+    <w:bookmarkEnd w:id="198"/>
+    <w:bookmarkStart w:id="200" w:name="ref-henrich_boyd_1998"/>
     <w:p>
       <w:pPr>
         <w:pStyle w:val="Bibliography"/>
@@ -4794,7 +5072,7 @@
       <w:r>
         <w:t xml:space="preserve"> </w:t>
       </w:r>
-      <w:hyperlink r:id="rId196">
+      <w:hyperlink r:id="rId199">
         <w:r>
           <w:rPr>
             <w:rStyle w:val="Hyperlink"/>
@@ -4806,8 +5084,8 @@
         <w:t xml:space="preserve">.</w:t>
       </w:r>
     </w:p>
-    <w:bookmarkEnd w:id="197"/>
-    <w:bookmarkStart w:id="198" w:name="ref-holdaway_wandsnider_2008"/>
+    <w:bookmarkEnd w:id="200"/>
+    <w:bookmarkStart w:id="201" w:name="ref-holdaway_wandsnider_2008"/>
     <w:p>
       <w:pPr>
         <w:pStyle w:val="Bibliography"/>
@@ -4829,8 +5107,8 @@
         <w:t xml:space="preserve">. University of Utah Press, Salt Lake City.</w:t>
       </w:r>
     </w:p>
-    <w:bookmarkEnd w:id="198"/>
-    <w:bookmarkStart w:id="200" w:name="ref-holland-lulewicz_ritchison_2021"/>
+    <w:bookmarkEnd w:id="201"/>
+    <w:bookmarkStart w:id="203" w:name="ref-holland-lulewicz_ritchison_2021"/>
     <w:p>
       <w:pPr>
         <w:pStyle w:val="Bibliography"/>
@@ -4857,7 +5135,7 @@
       <w:r>
         <w:t xml:space="preserve"> </w:t>
       </w:r>
-      <w:hyperlink r:id="rId199">
+      <w:hyperlink r:id="rId202">
         <w:r>
           <w:rPr>
             <w:rStyle w:val="Hyperlink"/>
@@ -4869,8 +5147,8 @@
         <w:t xml:space="preserve">.</w:t>
       </w:r>
     </w:p>
-    <w:bookmarkEnd w:id="200"/>
-    <w:bookmarkStart w:id="201" w:name="ref-house_1991"/>
+    <w:bookmarkEnd w:id="203"/>
+    <w:bookmarkStart w:id="204" w:name="ref-house_1991"/>
     <w:p>
       <w:pPr>
         <w:pStyle w:val="Bibliography"/>
@@ -4912,8 +5190,8 @@
         <w:t xml:space="preserve">. PhD thesis, Southern Illinois University at Carbondale, Carbondale.</w:t>
       </w:r>
     </w:p>
-    <w:bookmarkEnd w:id="201"/>
-    <w:bookmarkStart w:id="202" w:name="ref-house_1993"/>
+    <w:bookmarkEnd w:id="204"/>
+    <w:bookmarkStart w:id="205" w:name="ref-house_1993"/>
     <w:p>
       <w:pPr>
         <w:pStyle w:val="Bibliography"/>
@@ -4938,8 +5216,8 @@
         <w:t xml:space="preserve">12(1):21–32.</w:t>
       </w:r>
     </w:p>
-    <w:bookmarkEnd w:id="202"/>
-    <w:bookmarkStart w:id="203" w:name="ref-hubert_arabie_1985"/>
+    <w:bookmarkEnd w:id="205"/>
+    <w:bookmarkStart w:id="206" w:name="ref-hubert_arabie_1985"/>
     <w:p>
       <w:pPr>
         <w:pStyle w:val="Bibliography"/>
@@ -4964,8 +5242,8 @@
         <w:t xml:space="preserve">2:193–218.</w:t>
       </w:r>
     </w:p>
-    <w:bookmarkEnd w:id="203"/>
-    <w:bookmarkStart w:id="204" w:name="ref-hudson_smith_depratter_1990"/>
+    <w:bookmarkEnd w:id="206"/>
+    <w:bookmarkStart w:id="207" w:name="ref-hudson_smith_depratter_1990"/>
     <w:p>
       <w:pPr>
         <w:pStyle w:val="Bibliography"/>
@@ -5025,8 +5303,8 @@
         <w:t xml:space="preserve">, edited by David H. Dye and Cheryl Anne Cox, pp. 181–207. University of Alabama Press, Tuscaloosa.</w:t>
       </w:r>
     </w:p>
-    <w:bookmarkEnd w:id="204"/>
-    <w:bookmarkStart w:id="206" w:name="ref-kidwell_tomasovych_2013"/>
+    <w:bookmarkEnd w:id="207"/>
+    <w:bookmarkStart w:id="209" w:name="ref-kidwell_tomasovych_2013"/>
     <w:p>
       <w:pPr>
         <w:pStyle w:val="Bibliography"/>
@@ -5053,7 +5331,7 @@
       <w:r>
         <w:t xml:space="preserve"> </w:t>
       </w:r>
-      <w:hyperlink r:id="rId205">
+      <w:hyperlink r:id="rId208">
         <w:r>
           <w:rPr>
             <w:rStyle w:val="Hyperlink"/>
@@ -5065,8 +5343,8 @@
         <w:t xml:space="preserve">.</w:t>
       </w:r>
     </w:p>
-    <w:bookmarkEnd w:id="206"/>
-    <w:bookmarkStart w:id="207" w:name="ref-king_freer_1995"/>
+    <w:bookmarkEnd w:id="209"/>
+    <w:bookmarkStart w:id="210" w:name="ref-king_freer_1995"/>
     <w:p>
       <w:pPr>
         <w:pStyle w:val="Bibliography"/>
@@ -5100,8 +5378,8 @@
         <w:t xml:space="preserve">, edited by Michael S. Nassaney and Kenneth E. Sassaman, pp. 266–288. University of Tennessee Press, Knoxville.</w:t>
       </w:r>
     </w:p>
-    <w:bookmarkEnd w:id="207"/>
-    <w:bookmarkStart w:id="208" w:name="ref-lehner_grill_2013"/>
+    <w:bookmarkEnd w:id="210"/>
+    <w:bookmarkStart w:id="211" w:name="ref-lehner_grill_2013"/>
     <w:p>
       <w:pPr>
         <w:pStyle w:val="Bibliography"/>
@@ -5126,8 +5404,8 @@
         <w:t xml:space="preserve">27(15):2171–2186.</w:t>
       </w:r>
     </w:p>
-    <w:bookmarkEnd w:id="208"/>
-    <w:bookmarkStart w:id="209" w:name="ref-lipo_2001"/>
+    <w:bookmarkEnd w:id="211"/>
+    <w:bookmarkStart w:id="212" w:name="ref-lipo_2001"/>
     <w:p>
       <w:pPr>
         <w:pStyle w:val="Bibliography"/>
@@ -5177,8 +5455,8 @@
         <w:t xml:space="preserve">. BAR International Series 918. Archaeopress, Oxford.</w:t>
       </w:r>
     </w:p>
-    <w:bookmarkEnd w:id="209"/>
-    <w:bookmarkStart w:id="211" w:name="ref-lipo_dinapoli_madsen_hunt_2021"/>
+    <w:bookmarkEnd w:id="212"/>
+    <w:bookmarkStart w:id="214" w:name="ref-lipo_dinapoli_madsen_hunt_2021"/>
     <w:p>
       <w:pPr>
         <w:pStyle w:val="Bibliography"/>
@@ -5205,7 +5483,7 @@
       <w:r>
         <w:t xml:space="preserve"> </w:t>
       </w:r>
-      <w:hyperlink r:id="rId210">
+      <w:hyperlink r:id="rId213">
         <w:r>
           <w:rPr>
             <w:rStyle w:val="Hyperlink"/>
@@ -5217,8 +5495,8 @@
         <w:t xml:space="preserve">.</w:t>
       </w:r>
     </w:p>
-    <w:bookmarkEnd w:id="211"/>
-    <w:bookmarkStart w:id="212" w:name="ref-lipo_dunnell_2007"/>
+    <w:bookmarkEnd w:id="214"/>
+    <w:bookmarkStart w:id="215" w:name="ref-lipo_dunnell_2007"/>
     <w:p>
       <w:pPr>
         <w:pStyle w:val="Bibliography"/>
@@ -5280,8 +5558,8 @@
         <w:t xml:space="preserve">, edited by Janet Rafferty and Evan Peacock, pp. 125–167. University of Alabama Press, Tuscaloosa.</w:t>
       </w:r>
     </w:p>
-    <w:bookmarkEnd w:id="212"/>
-    <w:bookmarkStart w:id="214" w:name="ref-lipo_madsen_dunnell_2015"/>
+    <w:bookmarkEnd w:id="215"/>
+    <w:bookmarkStart w:id="217" w:name="ref-lipo_madsen_dunnell_2015"/>
     <w:p>
       <w:pPr>
         <w:pStyle w:val="Bibliography"/>
@@ -5308,7 +5586,7 @@
       <w:r>
         <w:t xml:space="preserve"> </w:t>
       </w:r>
-      <w:hyperlink r:id="rId213">
+      <w:hyperlink r:id="rId216">
         <w:r>
           <w:rPr>
             <w:rStyle w:val="Hyperlink"/>
@@ -5320,8 +5598,8 @@
         <w:t xml:space="preserve">.</w:t>
       </w:r>
     </w:p>
-    <w:bookmarkEnd w:id="214"/>
-    <w:bookmarkStart w:id="216" w:name="ref-lipo_madsen_dunnell_hunt_1997"/>
+    <w:bookmarkEnd w:id="217"/>
+    <w:bookmarkStart w:id="219" w:name="ref-lipo_madsen_dunnell_hunt_1997"/>
     <w:p>
       <w:pPr>
         <w:pStyle w:val="Bibliography"/>
@@ -5348,7 +5626,7 @@
       <w:r>
         <w:t xml:space="preserve"> </w:t>
       </w:r>
-      <w:hyperlink r:id="rId215">
+      <w:hyperlink r:id="rId218">
         <w:r>
           <w:rPr>
             <w:rStyle w:val="Hyperlink"/>
@@ -5360,8 +5638,8 @@
         <w:t xml:space="preserve">.</w:t>
       </w:r>
     </w:p>
-    <w:bookmarkEnd w:id="216"/>
-    <w:bookmarkStart w:id="217" w:name="ref-madsen_2012"/>
+    <w:bookmarkEnd w:id="219"/>
+    <w:bookmarkStart w:id="220" w:name="ref-madsen_2012"/>
     <w:p>
       <w:pPr>
         <w:pStyle w:val="Bibliography"/>
@@ -5370,14 +5648,14 @@
         <w:t xml:space="preserve">Madsen, Mark E. 2012. Neutral Cultural Transmission in Time-Averaged Archaeological Assemblages. arXiv preprint arXiv:1204.2043 [physics.soc-ph].</w:t>
       </w:r>
     </w:p>
-    <w:bookmarkEnd w:id="217"/>
-    <w:bookmarkStart w:id="218" w:name="ref-mainfort_1996"/>
+    <w:bookmarkEnd w:id="220"/>
+    <w:bookmarkStart w:id="221" w:name="ref-mainfort_2001"/>
     <w:p>
       <w:pPr>
         <w:pStyle w:val="Bibliography"/>
       </w:pPr>
       <w:r>
-        <w:t xml:space="preserve">Mainfort, Jr., Robert C. 1996. Late Period Chronology in the Central</w:t>
+        <w:t xml:space="preserve">Mainfort, Jr., Robert C. 2001. The Late Prehistoric and Protohistoric Periods in the Central</w:t>
       </w:r>
       <w:r>
         <w:t xml:space="preserve"> </w:t>
@@ -5389,7 +5667,166 @@
         <w:t xml:space="preserve"> </w:t>
       </w:r>
       <w:r>
-        <w:t xml:space="preserve">Valley: A Western</w:t>
+        <w:t xml:space="preserve">Valley. In</w:t>
+      </w:r>
+      <w:r>
+        <w:t xml:space="preserve"> </w:t>
+      </w:r>
+      <w:r>
+        <w:rPr>
+          <w:i/>
+          <w:iCs/>
+        </w:rPr>
+        <w:t xml:space="preserve">Societies in Eclipse: Archaeology of the Eastern Woodlands Indians, a.d. 1400–1700</w:t>
+      </w:r>
+      <w:r>
+        <w:t xml:space="preserve">, edited by David S. Brose, C. Wesley Cowan, and Jr. Mainfort Robert C., pp. 173–190. Smithsonian Institution Press, Washington, DC.</w:t>
+      </w:r>
+    </w:p>
+    <w:bookmarkEnd w:id="221"/>
+    <w:bookmarkStart w:id="222" w:name="ref-mainfort_2003"/>
+    <w:p>
+      <w:pPr>
+        <w:pStyle w:val="Bibliography"/>
+      </w:pPr>
+      <w:r>
+        <w:t xml:space="preserve">Mainfort, Jr., Robert C. 2003. An Ordination Approach to Assessing Late Period Phases in the Central</w:t>
+      </w:r>
+      <w:r>
+        <w:t xml:space="preserve"> </w:t>
+      </w:r>
+      <w:r>
+        <w:t xml:space="preserve">Mississippi</w:t>
+      </w:r>
+      <w:r>
+        <w:t xml:space="preserve"> </w:t>
+      </w:r>
+      <w:r>
+        <w:t xml:space="preserve">Valley.</w:t>
+      </w:r>
+      <w:r>
+        <w:t xml:space="preserve"> </w:t>
+      </w:r>
+      <w:r>
+        <w:rPr>
+          <w:i/>
+          <w:iCs/>
+        </w:rPr>
+        <w:t xml:space="preserve">Southeastern Archaeology</w:t>
+      </w:r>
+      <w:r>
+        <w:t xml:space="preserve"> </w:t>
+      </w:r>
+      <w:r>
+        <w:t xml:space="preserve">22(2):176–184.</w:t>
+      </w:r>
+    </w:p>
+    <w:bookmarkEnd w:id="222"/>
+    <w:bookmarkStart w:id="223" w:name="ref-mayr_1959"/>
+    <w:p>
+      <w:pPr>
+        <w:pStyle w:val="Bibliography"/>
+      </w:pPr>
+      <w:r>
+        <w:t xml:space="preserve">Mayr, Ernst. 1959. Typological Versus Population Thinking. In</w:t>
+      </w:r>
+      <w:r>
+        <w:t xml:space="preserve"> </w:t>
+      </w:r>
+      <w:r>
+        <w:rPr>
+          <w:i/>
+          <w:iCs/>
+        </w:rPr>
+        <w:t xml:space="preserve">Evolution and Anthropology: A Centennial Appraisal</w:t>
+      </w:r>
+      <w:r>
+        <w:t xml:space="preserve">, edited by Betty J. Meggers, pp. 409–412. The Anthropological Society of Washington, Washington, D.C.</w:t>
+      </w:r>
+    </w:p>
+    <w:bookmarkEnd w:id="223"/>
+    <w:bookmarkStart w:id="224" w:name="ref-mcnutt_1996"/>
+    <w:p>
+      <w:pPr>
+        <w:pStyle w:val="Bibliography"/>
+      </w:pPr>
+      <w:r>
+        <w:t xml:space="preserve">McNutt, Charles H. 1996. The Central</w:t>
+      </w:r>
+      <w:r>
+        <w:t xml:space="preserve"> </w:t>
+      </w:r>
+      <w:r>
+        <w:t xml:space="preserve">Mississippi</w:t>
+      </w:r>
+      <w:r>
+        <w:t xml:space="preserve"> </w:t>
+      </w:r>
+      <w:r>
+        <w:t xml:space="preserve">Valley: A Summary. In</w:t>
+      </w:r>
+      <w:r>
+        <w:t xml:space="preserve"> </w:t>
+      </w:r>
+      <w:r>
+        <w:rPr>
+          <w:i/>
+          <w:iCs/>
+        </w:rPr>
+        <w:t xml:space="preserve">Prehistory of the Central</w:t>
+      </w:r>
+      <w:r>
+        <w:rPr>
+          <w:i/>
+          <w:iCs/>
+        </w:rPr>
+        <w:t xml:space="preserve"> </w:t>
+      </w:r>
+      <w:r>
+        <w:rPr>
+          <w:i/>
+          <w:iCs/>
+        </w:rPr>
+        <w:t xml:space="preserve">Mississippi</w:t>
+      </w:r>
+      <w:r>
+        <w:rPr>
+          <w:i/>
+          <w:iCs/>
+        </w:rPr>
+        <w:t xml:space="preserve"> </w:t>
+      </w:r>
+      <w:r>
+        <w:rPr>
+          <w:i/>
+          <w:iCs/>
+        </w:rPr>
+        <w:t xml:space="preserve">Valley</w:t>
+      </w:r>
+      <w:r>
+        <w:t xml:space="preserve">, edited by Charles H. McNutt, pp. 187–. University of Alabama Press, Tuscaloosa.</w:t>
+      </w:r>
+    </w:p>
+    <w:bookmarkEnd w:id="224"/>
+    <w:bookmarkStart w:id="225" w:name="ref-mcnutt_franklin_henry_2012"/>
+    <w:p>
+      <w:pPr>
+        <w:pStyle w:val="Bibliography"/>
+      </w:pPr>
+      <w:r>
+        <w:t xml:space="preserve">McNutt, Charles H., Jay D. Franklin, and Edward R. Henry. 2012. New Perspectives on</w:t>
+      </w:r>
+      <w:r>
+        <w:t xml:space="preserve"> </w:t>
+      </w:r>
+      <w:r>
+        <w:t xml:space="preserve">Mississippian</w:t>
+      </w:r>
+      <w:r>
+        <w:t xml:space="preserve"> </w:t>
+      </w:r>
+      <w:r>
+        <w:t xml:space="preserve">Occupations in Western</w:t>
       </w:r>
       <w:r>
         <w:t xml:space="preserve"> </w:t>
@@ -5401,7 +5838,52 @@
         <w:t xml:space="preserve"> </w:t>
       </w:r>
       <w:r>
-        <w:t xml:space="preserve">Perspective.</w:t>
+        <w:t xml:space="preserve">and Northwestern</w:t>
+      </w:r>
+      <w:r>
+        <w:t xml:space="preserve"> </w:t>
+      </w:r>
+      <w:r>
+        <w:t xml:space="preserve">Mississippi</w:t>
+      </w:r>
+      <w:r>
+        <w:t xml:space="preserve">: Recent Chronological and Geophysical Investigations at</w:t>
+      </w:r>
+      <w:r>
+        <w:t xml:space="preserve"> </w:t>
+      </w:r>
+      <w:r>
+        <w:t xml:space="preserve">Chucalissa</w:t>
+      </w:r>
+      <w:r>
+        <w:t xml:space="preserve"> </w:t>
+      </w:r>
+      <w:r>
+        <w:t xml:space="preserve">(40SY1),</w:t>
+      </w:r>
+      <w:r>
+        <w:t xml:space="preserve"> </w:t>
+      </w:r>
+      <w:r>
+        <w:t xml:space="preserve">Shelby</w:t>
+      </w:r>
+      <w:r>
+        <w:t xml:space="preserve"> </w:t>
+      </w:r>
+      <w:r>
+        <w:t xml:space="preserve">County</w:t>
+      </w:r>
+      <w:r>
+        <w:t xml:space="preserve">,</w:t>
+      </w:r>
+      <w:r>
+        <w:t xml:space="preserve"> </w:t>
+      </w:r>
+      <w:r>
+        <w:t xml:space="preserve">Tennessee</w:t>
+      </w:r>
+      <w:r>
+        <w:t xml:space="preserve">.</w:t>
       </w:r>
       <w:r>
         <w:t xml:space="preserve"> </w:t>
@@ -5417,270 +5899,16 @@
         <w:t xml:space="preserve"> </w:t>
       </w:r>
       <w:r>
-        <w:t xml:space="preserve">15(2):172–181.</w:t>
-      </w:r>
-    </w:p>
-    <w:bookmarkEnd w:id="218"/>
-    <w:bookmarkStart w:id="219" w:name="ref-mainfort_2001"/>
+        <w:t xml:space="preserve">31(2):231–250.</w:t>
+      </w:r>
+    </w:p>
+    <w:bookmarkEnd w:id="225"/>
+    <w:bookmarkStart w:id="227" w:name="ref-miller_atkins_premo_2018"/>
     <w:p>
       <w:pPr>
         <w:pStyle w:val="Bibliography"/>
       </w:pPr>
       <w:r>
-        <w:t xml:space="preserve">Mainfort, Jr., Robert C. 2001. The Late Prehistoric and Protohistoric Periods in the Central</w:t>
-      </w:r>
-      <w:r>
-        <w:t xml:space="preserve"> </w:t>
-      </w:r>
-      <w:r>
-        <w:t xml:space="preserve">Mississippi</w:t>
-      </w:r>
-      <w:r>
-        <w:t xml:space="preserve"> </w:t>
-      </w:r>
-      <w:r>
-        <w:t xml:space="preserve">Valley. In</w:t>
-      </w:r>
-      <w:r>
-        <w:t xml:space="preserve"> </w:t>
-      </w:r>
-      <w:r>
-        <w:rPr>
-          <w:i/>
-          <w:iCs/>
-        </w:rPr>
-        <w:t xml:space="preserve">Societies in Eclipse: Archaeology of the Eastern Woodlands Indians, a.d. 1400–1700</w:t>
-      </w:r>
-      <w:r>
-        <w:t xml:space="preserve">, edited by David S. Brose, C. Wesley Cowan, and Jr. Mainfort Robert C., pp. 173–190. Smithsonian Institution Press, Washington, DC.</w:t>
-      </w:r>
-    </w:p>
-    <w:bookmarkEnd w:id="219"/>
-    <w:bookmarkStart w:id="220" w:name="ref-mainfort_2003"/>
-    <w:p>
-      <w:pPr>
-        <w:pStyle w:val="Bibliography"/>
-      </w:pPr>
-      <w:r>
-        <w:t xml:space="preserve">Mainfort, Jr., Robert C. 2003. An Ordination Approach to Assessing Late Period Phases in the Central</w:t>
-      </w:r>
-      <w:r>
-        <w:t xml:space="preserve"> </w:t>
-      </w:r>
-      <w:r>
-        <w:t xml:space="preserve">Mississippi</w:t>
-      </w:r>
-      <w:r>
-        <w:t xml:space="preserve"> </w:t>
-      </w:r>
-      <w:r>
-        <w:t xml:space="preserve">Valley.</w:t>
-      </w:r>
-      <w:r>
-        <w:t xml:space="preserve"> </w:t>
-      </w:r>
-      <w:r>
-        <w:rPr>
-          <w:i/>
-          <w:iCs/>
-        </w:rPr>
-        <w:t xml:space="preserve">Southeastern Archaeology</w:t>
-      </w:r>
-      <w:r>
-        <w:t xml:space="preserve"> </w:t>
-      </w:r>
-      <w:r>
-        <w:t xml:space="preserve">22(2):176–184.</w:t>
-      </w:r>
-    </w:p>
-    <w:bookmarkEnd w:id="220"/>
-    <w:bookmarkStart w:id="221" w:name="ref-mayr_1959"/>
-    <w:p>
-      <w:pPr>
-        <w:pStyle w:val="Bibliography"/>
-      </w:pPr>
-      <w:r>
-        <w:t xml:space="preserve">Mayr, Ernst. 1959. Typological Versus Population Thinking. In</w:t>
-      </w:r>
-      <w:r>
-        <w:t xml:space="preserve"> </w:t>
-      </w:r>
-      <w:r>
-        <w:rPr>
-          <w:i/>
-          <w:iCs/>
-        </w:rPr>
-        <w:t xml:space="preserve">Evolution and Anthropology: A Centennial Appraisal</w:t>
-      </w:r>
-      <w:r>
-        <w:t xml:space="preserve">, edited by Betty J. Meggers, pp. 409–412. The Anthropological Society of Washington, Washington, D.C.</w:t>
-      </w:r>
-    </w:p>
-    <w:bookmarkEnd w:id="221"/>
-    <w:bookmarkStart w:id="222" w:name="ref-mcnutt_1996"/>
-    <w:p>
-      <w:pPr>
-        <w:pStyle w:val="Bibliography"/>
-      </w:pPr>
-      <w:r>
-        <w:t xml:space="preserve">McNutt, Charles H. 1996. The Central</w:t>
-      </w:r>
-      <w:r>
-        <w:t xml:space="preserve"> </w:t>
-      </w:r>
-      <w:r>
-        <w:t xml:space="preserve">Mississippi</w:t>
-      </w:r>
-      <w:r>
-        <w:t xml:space="preserve"> </w:t>
-      </w:r>
-      <w:r>
-        <w:t xml:space="preserve">Valley: A Summary. In</w:t>
-      </w:r>
-      <w:r>
-        <w:t xml:space="preserve"> </w:t>
-      </w:r>
-      <w:r>
-        <w:rPr>
-          <w:i/>
-          <w:iCs/>
-        </w:rPr>
-        <w:t xml:space="preserve">Prehistory of the Central</w:t>
-      </w:r>
-      <w:r>
-        <w:rPr>
-          <w:i/>
-          <w:iCs/>
-        </w:rPr>
-        <w:t xml:space="preserve"> </w:t>
-      </w:r>
-      <w:r>
-        <w:rPr>
-          <w:i/>
-          <w:iCs/>
-        </w:rPr>
-        <w:t xml:space="preserve">Mississippi</w:t>
-      </w:r>
-      <w:r>
-        <w:rPr>
-          <w:i/>
-          <w:iCs/>
-        </w:rPr>
-        <w:t xml:space="preserve"> </w:t>
-      </w:r>
-      <w:r>
-        <w:rPr>
-          <w:i/>
-          <w:iCs/>
-        </w:rPr>
-        <w:t xml:space="preserve">Valley</w:t>
-      </w:r>
-      <w:r>
-        <w:t xml:space="preserve">, edited by Charles H. McNutt, pp. 187–. University of Alabama Press, Tuscaloosa.</w:t>
-      </w:r>
-    </w:p>
-    <w:bookmarkEnd w:id="222"/>
-    <w:bookmarkStart w:id="223" w:name="ref-mcnutt_franklin_henry_2012"/>
-    <w:p>
-      <w:pPr>
-        <w:pStyle w:val="Bibliography"/>
-      </w:pPr>
-      <w:r>
-        <w:t xml:space="preserve">McNutt, Charles H., Jay D. Franklin, and Edward R. Henry. 2012. New Perspectives on</w:t>
-      </w:r>
-      <w:r>
-        <w:t xml:space="preserve"> </w:t>
-      </w:r>
-      <w:r>
-        <w:t xml:space="preserve">Mississippian</w:t>
-      </w:r>
-      <w:r>
-        <w:t xml:space="preserve"> </w:t>
-      </w:r>
-      <w:r>
-        <w:t xml:space="preserve">Occupations in Western</w:t>
-      </w:r>
-      <w:r>
-        <w:t xml:space="preserve"> </w:t>
-      </w:r>
-      <w:r>
-        <w:t xml:space="preserve">Tennessee</w:t>
-      </w:r>
-      <w:r>
-        <w:t xml:space="preserve"> </w:t>
-      </w:r>
-      <w:r>
-        <w:t xml:space="preserve">and Northwestern</w:t>
-      </w:r>
-      <w:r>
-        <w:t xml:space="preserve"> </w:t>
-      </w:r>
-      <w:r>
-        <w:t xml:space="preserve">Mississippi</w:t>
-      </w:r>
-      <w:r>
-        <w:t xml:space="preserve">: Recent Chronological and Geophysical Investigations at</w:t>
-      </w:r>
-      <w:r>
-        <w:t xml:space="preserve"> </w:t>
-      </w:r>
-      <w:r>
-        <w:t xml:space="preserve">Chucalissa</w:t>
-      </w:r>
-      <w:r>
-        <w:t xml:space="preserve"> </w:t>
-      </w:r>
-      <w:r>
-        <w:t xml:space="preserve">(40SY1),</w:t>
-      </w:r>
-      <w:r>
-        <w:t xml:space="preserve"> </w:t>
-      </w:r>
-      <w:r>
-        <w:t xml:space="preserve">Shelby</w:t>
-      </w:r>
-      <w:r>
-        <w:t xml:space="preserve"> </w:t>
-      </w:r>
-      <w:r>
-        <w:t xml:space="preserve">County</w:t>
-      </w:r>
-      <w:r>
-        <w:t xml:space="preserve">,</w:t>
-      </w:r>
-      <w:r>
-        <w:t xml:space="preserve"> </w:t>
-      </w:r>
-      <w:r>
-        <w:t xml:space="preserve">Tennessee</w:t>
-      </w:r>
-      <w:r>
-        <w:t xml:space="preserve">.</w:t>
-      </w:r>
-      <w:r>
-        <w:t xml:space="preserve"> </w:t>
-      </w:r>
-      <w:r>
-        <w:rPr>
-          <w:i/>
-          <w:iCs/>
-        </w:rPr>
-        <w:t xml:space="preserve">Southeastern Archaeology</w:t>
-      </w:r>
-      <w:r>
-        <w:t xml:space="preserve"> </w:t>
-      </w:r>
-      <w:r>
-        <w:t xml:space="preserve">31(2):231–250.</w:t>
-      </w:r>
-    </w:p>
-    <w:bookmarkEnd w:id="223"/>
-    <w:bookmarkStart w:id="225" w:name="ref-miller_atkins_premo_2018"/>
-    <w:p>
-      <w:pPr>
-        <w:pStyle w:val="Bibliography"/>
-      </w:pPr>
-      <w:r>
         <w:t xml:space="preserve">Miller-Atkins, Galen, and L. S. Premo. 2018. Time-Averaging and the Spatial Scale of Regional Cultural Differentiation in Archaeological Assemblages.</w:t>
       </w:r>
       <w:r>
@@ -5702,7 +5930,7 @@
       <w:r>
         <w:t xml:space="preserve"> </w:t>
       </w:r>
-      <w:hyperlink r:id="rId224">
+      <w:hyperlink r:id="rId226">
         <w:r>
           <w:rPr>
             <w:rStyle w:val="Hyperlink"/>
@@ -5714,8 +5942,8 @@
         <w:t xml:space="preserve">.</w:t>
       </w:r>
     </w:p>
-    <w:bookmarkEnd w:id="225"/>
-    <w:bookmarkStart w:id="226" w:name="ref-mitchem_2001"/>
+    <w:bookmarkEnd w:id="227"/>
+    <w:bookmarkStart w:id="228" w:name="ref-mitchem_2001"/>
     <w:p>
       <w:pPr>
         <w:pStyle w:val="Bibliography"/>
@@ -5745,8 +5973,8 @@
         <w:t xml:space="preserve">.</w:t>
       </w:r>
     </w:p>
-    <w:bookmarkEnd w:id="226"/>
-    <w:bookmarkStart w:id="227" w:name="ref-mitchem_2017"/>
+    <w:bookmarkEnd w:id="228"/>
+    <w:bookmarkStart w:id="229" w:name="ref-mitchem_2017"/>
     <w:p>
       <w:pPr>
         <w:pStyle w:val="Bibliography"/>
@@ -5797,8 +6025,8 @@
         <w:t xml:space="preserve">’s 1541 Cross.</w:t>
       </w:r>
     </w:p>
-    <w:bookmarkEnd w:id="227"/>
-    <w:bookmarkStart w:id="228" w:name="ref-morse_d_1990"/>
+    <w:bookmarkEnd w:id="229"/>
+    <w:bookmarkStart w:id="230" w:name="ref-morse_d_1990"/>
     <w:p>
       <w:pPr>
         <w:pStyle w:val="Bibliography"/>
@@ -5846,8 +6074,8 @@
         <w:t xml:space="preserve">, edited by David H. Dye and Cheryl Anne Cox, pp. 69–97. University of Alabama Press, Tuscaloosa.</w:t>
       </w:r>
     </w:p>
-    <w:bookmarkEnd w:id="228"/>
-    <w:bookmarkStart w:id="229" w:name="ref-morse_morse_1996"/>
+    <w:bookmarkEnd w:id="230"/>
+    <w:bookmarkStart w:id="231" w:name="ref-morse_morse_1996"/>
     <w:p>
       <w:pPr>
         <w:pStyle w:val="Bibliography"/>
@@ -5884,8 +6112,8 @@
         <w:t xml:space="preserve">17(1):1–35.</w:t>
       </w:r>
     </w:p>
-    <w:bookmarkEnd w:id="229"/>
-    <w:bookmarkStart w:id="230" w:name="ref-morse_p_1981"/>
+    <w:bookmarkEnd w:id="231"/>
+    <w:bookmarkStart w:id="232" w:name="ref-morse_p_1981"/>
     <w:p>
       <w:pPr>
         <w:pStyle w:val="Bibliography"/>
@@ -5956,8 +6184,8 @@
         <w:t xml:space="preserve">. Arkansas Archeological Survey Research Series 13. Arkansas Archeological Survey, Fayetteville.</w:t>
       </w:r>
     </w:p>
-    <w:bookmarkEnd w:id="230"/>
-    <w:bookmarkStart w:id="231" w:name="ref-morse_1990"/>
+    <w:bookmarkEnd w:id="232"/>
+    <w:bookmarkStart w:id="233" w:name="ref-morse_1990"/>
     <w:p>
       <w:pPr>
         <w:pStyle w:val="Bibliography"/>
@@ -6017,8 +6245,8 @@
         <w:t xml:space="preserve">, edited by David H. Dye and Cheryl Anne Cox, pp. 118–134. University of Alabama Press, Tuscaloosa.</w:t>
       </w:r>
     </w:p>
-    <w:bookmarkEnd w:id="231"/>
-    <w:bookmarkStart w:id="233" w:name="ref-nei_1973"/>
+    <w:bookmarkEnd w:id="233"/>
+    <w:bookmarkStart w:id="235" w:name="ref-nei_1973"/>
     <w:p>
       <w:pPr>
         <w:pStyle w:val="Bibliography"/>
@@ -6045,7 +6273,7 @@
       <w:r>
         <w:t xml:space="preserve"> </w:t>
       </w:r>
-      <w:hyperlink r:id="rId232">
+      <w:hyperlink r:id="rId234">
         <w:r>
           <w:rPr>
             <w:rStyle w:val="Hyperlink"/>
@@ -6057,8 +6285,8 @@
         <w:t xml:space="preserve">.</w:t>
       </w:r>
     </w:p>
-    <w:bookmarkEnd w:id="233"/>
-    <w:bookmarkStart w:id="234" w:name="ref-neiman_1995"/>
+    <w:bookmarkEnd w:id="235"/>
+    <w:bookmarkStart w:id="236" w:name="ref-neiman_1995"/>
     <w:p>
       <w:pPr>
         <w:pStyle w:val="Bibliography"/>
@@ -6101,8 +6329,8 @@
         <w:t xml:space="preserve">60(1):7–36.</w:t>
       </w:r>
     </w:p>
-    <w:bookmarkEnd w:id="234"/>
-    <w:bookmarkStart w:id="236" w:name="ref-peebles_kus_1977"/>
+    <w:bookmarkEnd w:id="236"/>
+    <w:bookmarkStart w:id="238" w:name="ref-peebles_kus_1977"/>
     <w:p>
       <w:pPr>
         <w:pStyle w:val="Bibliography"/>
@@ -6129,7 +6357,7 @@
       <w:r>
         <w:t xml:space="preserve"> </w:t>
       </w:r>
-      <w:hyperlink r:id="rId235">
+      <w:hyperlink r:id="rId237">
         <w:r>
           <w:rPr>
             <w:rStyle w:val="Hyperlink"/>
@@ -6141,8 +6369,8 @@
         <w:t xml:space="preserve">.</w:t>
       </w:r>
     </w:p>
-    <w:bookmarkEnd w:id="236"/>
-    <w:bookmarkStart w:id="238" w:name="ref-peeples_schachner_2012"/>
+    <w:bookmarkEnd w:id="238"/>
+    <w:bookmarkStart w:id="240" w:name="ref-peeples_schachner_2012"/>
     <w:p>
       <w:pPr>
         <w:pStyle w:val="Bibliography"/>
@@ -6169,7 +6397,7 @@
       <w:r>
         <w:t xml:space="preserve"> </w:t>
       </w:r>
-      <w:hyperlink r:id="rId237">
+      <w:hyperlink r:id="rId239">
         <w:r>
           <w:rPr>
             <w:rStyle w:val="Hyperlink"/>
@@ -6181,8 +6409,8 @@
         <w:t xml:space="preserve">.</w:t>
       </w:r>
     </w:p>
-    <w:bookmarkEnd w:id="238"/>
-    <w:bookmarkStart w:id="240" w:name="ref-perreault_2018"/>
+    <w:bookmarkEnd w:id="240"/>
+    <w:bookmarkStart w:id="242" w:name="ref-perreault_2018"/>
     <w:p>
       <w:pPr>
         <w:pStyle w:val="Bibliography"/>
@@ -6209,7 +6437,7 @@
       <w:r>
         <w:t xml:space="preserve"> </w:t>
       </w:r>
-      <w:hyperlink r:id="rId239">
+      <w:hyperlink r:id="rId241">
         <w:r>
           <w:rPr>
             <w:rStyle w:val="Hyperlink"/>
@@ -6221,8 +6449,8 @@
         <w:t xml:space="preserve">.</w:t>
       </w:r>
     </w:p>
-    <w:bookmarkEnd w:id="240"/>
-    <w:bookmarkStart w:id="241" w:name="ref-perreault_2019"/>
+    <w:bookmarkEnd w:id="242"/>
+    <w:bookmarkStart w:id="243" w:name="ref-perreault_2019"/>
     <w:p>
       <w:pPr>
         <w:pStyle w:val="Bibliography"/>
@@ -6244,8 +6472,8 @@
         <w:t xml:space="preserve">. University of Chicago Press, Chicago.</w:t>
       </w:r>
     </w:p>
-    <w:bookmarkEnd w:id="241"/>
-    <w:bookmarkStart w:id="242" w:name="ref-phillips_1970"/>
+    <w:bookmarkEnd w:id="243"/>
+    <w:bookmarkStart w:id="244" w:name="ref-phillips_1970"/>
     <w:p>
       <w:pPr>
         <w:pStyle w:val="Bibliography"/>
@@ -6316,8 +6544,8 @@
         <w:t xml:space="preserve">, Vol. 60. Papers of the Peabody Museum of Archaeology and Ethnology. Peabody Museum, Harvard University, Cambridge, MA.</w:t>
       </w:r>
     </w:p>
-    <w:bookmarkEnd w:id="242"/>
-    <w:bookmarkStart w:id="243" w:name="ref-phillips_ford_griffin_1951"/>
+    <w:bookmarkEnd w:id="244"/>
+    <w:bookmarkStart w:id="245" w:name="ref-phillips_ford_griffin_1951"/>
     <w:p>
       <w:pPr>
         <w:pStyle w:val="Bibliography"/>
@@ -6367,8 +6595,8 @@
         <w:t xml:space="preserve">, Vol. 25. Papers of the Peabody Museum of American Archaeology and Ethnology. Peabody Museum, Harvard University, Cambridge, MA.</w:t>
       </w:r>
     </w:p>
-    <w:bookmarkEnd w:id="243"/>
-    <w:bookmarkStart w:id="245" w:name="ref-phillips_willey_1953"/>
+    <w:bookmarkEnd w:id="245"/>
+    <w:bookmarkStart w:id="247" w:name="ref-phillips_willey_1953"/>
     <w:p>
       <w:pPr>
         <w:pStyle w:val="Bibliography"/>
@@ -6395,7 +6623,7 @@
       <w:r>
         <w:t xml:space="preserve"> </w:t>
       </w:r>
-      <w:hyperlink r:id="rId244">
+      <w:hyperlink r:id="rId246">
         <w:r>
           <w:rPr>
             <w:rStyle w:val="Hyperlink"/>
@@ -6407,8 +6635,8 @@
         <w:t xml:space="preserve">.</w:t>
       </w:r>
     </w:p>
-    <w:bookmarkEnd w:id="245"/>
-    <w:bookmarkStart w:id="247" w:name="ref-premo_2016"/>
+    <w:bookmarkEnd w:id="247"/>
+    <w:bookmarkStart w:id="249" w:name="ref-premo_2016"/>
     <w:p>
       <w:pPr>
         <w:pStyle w:val="Bibliography"/>
@@ -6435,7 +6663,7 @@
       <w:r>
         <w:t xml:space="preserve"> </w:t>
       </w:r>
-      <w:hyperlink r:id="rId246">
+      <w:hyperlink r:id="rId248">
         <w:r>
           <w:rPr>
             <w:rStyle w:val="Hyperlink"/>
@@ -6447,8 +6675,8 @@
         <w:t xml:space="preserve">.</w:t>
       </w:r>
     </w:p>
-    <w:bookmarkEnd w:id="247"/>
-    <w:bookmarkStart w:id="249" w:name="ref-premo_scholnick_2011"/>
+    <w:bookmarkEnd w:id="249"/>
+    <w:bookmarkStart w:id="251" w:name="ref-premo_scholnick_2011"/>
     <w:p>
       <w:pPr>
         <w:pStyle w:val="Bibliography"/>
@@ -6475,7 +6703,7 @@
       <w:r>
         <w:t xml:space="preserve"> </w:t>
       </w:r>
-      <w:hyperlink r:id="rId248">
+      <w:hyperlink r:id="rId250">
         <w:r>
           <w:rPr>
             <w:rStyle w:val="Hyperlink"/>
@@ -6487,8 +6715,8 @@
         <w:t xml:space="preserve">.</w:t>
       </w:r>
     </w:p>
-    <w:bookmarkEnd w:id="249"/>
-    <w:bookmarkStart w:id="250" w:name="ref-rees_political_culture"/>
+    <w:bookmarkEnd w:id="251"/>
+    <w:bookmarkStart w:id="252" w:name="ref-rees_political_culture"/>
     <w:p>
       <w:pPr>
         <w:pStyle w:val="Bibliography"/>
@@ -6512,8 +6740,8 @@
         <w:t xml:space="preserve">. Ph.D. dissertation, University of Oklahoma, Norman.</w:t>
       </w:r>
     </w:p>
-    <w:bookmarkEnd w:id="250"/>
-    <w:bookmarkStart w:id="252" w:name="ref-reimer_etal_2020"/>
+    <w:bookmarkEnd w:id="252"/>
+    <w:bookmarkStart w:id="254" w:name="ref-reimer_etal_2020"/>
     <w:p>
       <w:pPr>
         <w:pStyle w:val="Bibliography"/>
@@ -6567,7 +6795,7 @@
       <w:r>
         <w:t xml:space="preserve"> </w:t>
       </w:r>
-      <w:hyperlink r:id="rId251">
+      <w:hyperlink r:id="rId253">
         <w:r>
           <w:rPr>
             <w:rStyle w:val="Hyperlink"/>
@@ -6579,8 +6807,8 @@
         <w:t xml:space="preserve">.</w:t>
       </w:r>
     </w:p>
-    <w:bookmarkEnd w:id="252"/>
-    <w:bookmarkStart w:id="253" w:name="ref-robinson_1951"/>
+    <w:bookmarkEnd w:id="254"/>
+    <w:bookmarkStart w:id="255" w:name="ref-robinson_1951"/>
     <w:p>
       <w:pPr>
         <w:pStyle w:val="Bibliography"/>
@@ -6605,8 +6833,8 @@
         <w:t xml:space="preserve">16(4):293–301.</w:t>
       </w:r>
     </w:p>
-    <w:bookmarkEnd w:id="253"/>
-    <w:bookmarkStart w:id="254" w:name="ref-ross-stallings_2017"/>
+    <w:bookmarkEnd w:id="255"/>
+    <w:bookmarkStart w:id="256" w:name="ref-ross-stallings_2017"/>
     <w:p>
       <w:pPr>
         <w:pStyle w:val="Bibliography"/>
@@ -6640,8 +6868,8 @@
         <w:t xml:space="preserve">, edited by Haagen D. Klaus, Amanda R. Harvey, and Mark N. Cohen, pp. 329–362. University Press of Florida, Gainesville.</w:t>
       </w:r>
     </w:p>
-    <w:bookmarkEnd w:id="254"/>
-    <w:bookmarkStart w:id="255" w:name="ref-schiffer_1972"/>
+    <w:bookmarkEnd w:id="256"/>
+    <w:bookmarkStart w:id="257" w:name="ref-schiffer_1972"/>
     <w:p>
       <w:pPr>
         <w:pStyle w:val="Bibliography"/>
@@ -6666,8 +6894,8 @@
         <w:t xml:space="preserve">37(2):156–165.</w:t>
       </w:r>
     </w:p>
-    <w:bookmarkEnd w:id="255"/>
-    <w:bookmarkStart w:id="257" w:name="ref-schneider_martins_deaguiar_2016"/>
+    <w:bookmarkEnd w:id="257"/>
+    <w:bookmarkStart w:id="259" w:name="ref-schneider_martins_deaguiar_2016"/>
     <w:p>
       <w:pPr>
         <w:pStyle w:val="Bibliography"/>
@@ -6694,7 +6922,7 @@
       <w:r>
         <w:t xml:space="preserve"> </w:t>
       </w:r>
-      <w:hyperlink r:id="rId256">
+      <w:hyperlink r:id="rId258">
         <w:r>
           <w:rPr>
             <w:rStyle w:val="Hyperlink"/>
@@ -6706,8 +6934,8 @@
         <w:t xml:space="preserve">.</w:t>
       </w:r>
     </w:p>
-    <w:bookmarkEnd w:id="257"/>
-    <w:bookmarkStart w:id="259" w:name="ref-shennan_crema_kerig_2015"/>
+    <w:bookmarkEnd w:id="259"/>
+    <w:bookmarkStart w:id="261" w:name="ref-shennan_crema_kerig_2015"/>
     <w:p>
       <w:pPr>
         <w:pStyle w:val="Bibliography"/>
@@ -6773,7 +7001,7 @@
       <w:r>
         <w:t xml:space="preserve"> </w:t>
       </w:r>
-      <w:hyperlink r:id="rId258">
+      <w:hyperlink r:id="rId260">
         <w:r>
           <w:rPr>
             <w:rStyle w:val="Hyperlink"/>
@@ -6785,8 +7013,8 @@
         <w:t xml:space="preserve">.</w:t>
       </w:r>
     </w:p>
-    <w:bookmarkEnd w:id="259"/>
-    <w:bookmarkStart w:id="260" w:name="ref-shennan_wilkinson_2001"/>
+    <w:bookmarkEnd w:id="261"/>
+    <w:bookmarkStart w:id="262" w:name="ref-shennan_wilkinson_2001"/>
     <w:p>
       <w:pPr>
         <w:pStyle w:val="Bibliography"/>
@@ -6826,8 +7054,8 @@
         <w:t xml:space="preserve">66(4):577–593.</w:t>
       </w:r>
     </w:p>
-    <w:bookmarkEnd w:id="260"/>
-    <w:bookmarkStart w:id="261" w:name="ref-smith_1990"/>
+    <w:bookmarkEnd w:id="262"/>
+    <w:bookmarkStart w:id="263" w:name="ref-smith_1990"/>
     <w:p>
       <w:pPr>
         <w:pStyle w:val="Bibliography"/>
@@ -6875,8 +7103,8 @@
         <w:t xml:space="preserve">, edited by David H. Dye and Cheryl Anne Cox, pp. 135–169. University of Alabama Press, Tuscaloosa.</w:t>
       </w:r>
     </w:p>
-    <w:bookmarkEnd w:id="261"/>
-    <w:bookmarkStart w:id="262" w:name="ref-smith_neiman_2007"/>
+    <w:bookmarkEnd w:id="263"/>
+    <w:bookmarkStart w:id="264" w:name="ref-smith_neiman_2007"/>
     <w:p>
       <w:pPr>
         <w:pStyle w:val="Bibliography"/>
@@ -6901,8 +7129,8 @@
         <w:t xml:space="preserve">26(1):47–72.</w:t>
       </w:r>
     </w:p>
-    <w:bookmarkEnd w:id="262"/>
-    <w:bookmarkStart w:id="263" w:name="ref-starr_1984"/>
+    <w:bookmarkEnd w:id="264"/>
+    <w:bookmarkStart w:id="265" w:name="ref-starr_1984"/>
     <w:p>
       <w:pPr>
         <w:pStyle w:val="Bibliography"/>
@@ -7083,8 +7311,8 @@
         <w:t xml:space="preserve">, edited by John M. Connaway, pp. 163–222. Archaeological Report No. 14. Mississippi Department of Archives; History, Jackson, MS.</w:t>
       </w:r>
     </w:p>
-    <w:bookmarkEnd w:id="263"/>
-    <w:bookmarkStart w:id="264" w:name="ref-tomasovych_kidwell_2009"/>
+    <w:bookmarkEnd w:id="265"/>
+    <w:bookmarkStart w:id="266" w:name="ref-tomasovych_kidwell_2009"/>
     <w:p>
       <w:pPr>
         <w:pStyle w:val="Bibliography"/>
@@ -7109,8 +7337,8 @@
         <w:t xml:space="preserve">35(1):94–118.</w:t>
       </w:r>
     </w:p>
-    <w:bookmarkEnd w:id="264"/>
-    <w:bookmarkStart w:id="265" w:name="ref-willey_phillips_1958"/>
+    <w:bookmarkEnd w:id="266"/>
+    <w:bookmarkStart w:id="267" w:name="ref-willey_phillips_1958"/>
     <w:p>
       <w:pPr>
         <w:pStyle w:val="Bibliography"/>
@@ -7132,8 +7360,8 @@
         <w:t xml:space="preserve">. University of Chicago Press, Chicago.</w:t>
       </w:r>
     </w:p>
-    <w:bookmarkEnd w:id="265"/>
-    <w:bookmarkStart w:id="266" w:name="ref-williams_1954"/>
+    <w:bookmarkEnd w:id="267"/>
+    <w:bookmarkStart w:id="268" w:name="ref-williams_1954"/>
     <w:p>
       <w:pPr>
         <w:pStyle w:val="Bibliography"/>
@@ -7142,8 +7370,8 @@
         <w:t xml:space="preserve">Williams, Stephen. 1954. An Archeological Study of the Mississippian Culture in Southeast Missouri. PhD thesis, Yale University, New Haven.</w:t>
       </w:r>
     </w:p>
-    <w:bookmarkEnd w:id="266"/>
-    <w:bookmarkStart w:id="268" w:name="ref-wright_1943"/>
+    <w:bookmarkEnd w:id="268"/>
+    <w:bookmarkStart w:id="270" w:name="ref-wright_1943"/>
     <w:p>
       <w:pPr>
         <w:pStyle w:val="Bibliography"/>
@@ -7170,7 +7398,7 @@
       <w:r>
         <w:t xml:space="preserve"> </w:t>
       </w:r>
-      <w:hyperlink r:id="rId267">
+      <w:hyperlink r:id="rId269">
         <w:r>
           <w:rPr>
             <w:rStyle w:val="Hyperlink"/>
@@ -7182,8 +7410,8 @@
         <w:t xml:space="preserve">.</w:t>
       </w:r>
     </w:p>
-    <w:bookmarkEnd w:id="268"/>
-    <w:bookmarkStart w:id="270" w:name="ref-wright_1951"/>
+    <w:bookmarkEnd w:id="270"/>
+    <w:bookmarkStart w:id="272" w:name="ref-wright_1951"/>
     <w:p>
       <w:pPr>
         <w:pStyle w:val="Bibliography"/>
@@ -7210,7 +7438,7 @@
       <w:r>
         <w:t xml:space="preserve"> </w:t>
       </w:r>
-      <w:hyperlink r:id="rId269">
+      <w:hyperlink r:id="rId271">
         <w:r>
           <w:rPr>
             <w:rStyle w:val="Hyperlink"/>
@@ -7222,8 +7450,8 @@
         <w:t xml:space="preserve">.</w:t>
       </w:r>
     </w:p>
-    <w:bookmarkEnd w:id="270"/>
-    <w:bookmarkStart w:id="272" w:name="ref-youngblood_miton_morin_2023"/>
+    <w:bookmarkEnd w:id="272"/>
+    <w:bookmarkStart w:id="274" w:name="ref-youngblood_miton_morin_2023"/>
     <w:p>
       <w:pPr>
         <w:pStyle w:val="Bibliography"/>
@@ -7250,7 +7478,7 @@
       <w:r>
         <w:t xml:space="preserve"> </w:t>
       </w:r>
-      <w:hyperlink r:id="rId271">
+      <w:hyperlink r:id="rId273">
         <w:r>
           <w:rPr>
             <w:rStyle w:val="Hyperlink"/>
@@ -7262,10 +7490,10 @@
         <w:t xml:space="preserve">.</w:t>
       </w:r>
     </w:p>
-    <w:bookmarkEnd w:id="272"/>
-    <w:bookmarkEnd w:id="273"/>
     <w:bookmarkEnd w:id="274"/>
     <w:bookmarkEnd w:id="275"/>
+    <w:bookmarkEnd w:id="276"/>
+    <w:bookmarkEnd w:id="277"/>
     <w:sectPr>
       <w:footerReference r:id="rId100" w:type="default"/>
       <w:footnotePr>

</xml_diff>

<commit_message>
Refresh from mls-emergence a6fad09: small streams, the design analysis, numbered tables
Adds the analysis of what record would separate local innovation from
restricted copying, the inventory of unanalyzed PFG collections, the
small-stream comparison for settlement, and the manuscript text and tables
that report them. Supplement tables are numbered in order of appearance.

Co-Authored-By: Claude Fable 5.1 <noreply@anthropic.com>
</commit_message>
<xml_diff>
--- a/docs/manuscript/MAIN_TEXT.docx
+++ b/docs/manuscript/MAIN_TEXT.docx
@@ -2,7 +2,7 @@
 <file path=word/document.xml><?xml version="1.0" encoding="utf-8"?>
 <w:document xmlns:w="http://schemas.openxmlformats.org/wordprocessingml/2006/main" xmlns:m="http://schemas.openxmlformats.org/officeDocument/2006/math" xmlns:r="http://schemas.openxmlformats.org/officeDocument/2006/relationships" xmlns:o="urn:schemas-microsoft-com:office:office" xmlns:v="urn:schemas-microsoft-com:vml" xmlns:w10="urn:schemas-microsoft-com:office:word" xmlns:a="http://schemas.openxmlformats.org/drawingml/2006/main" xmlns:pic="http://schemas.openxmlformats.org/drawingml/2006/picture" xmlns:wp="http://schemas.openxmlformats.org/drawingml/2006/wordprocessingDrawing">
   <w:body>
-    <w:bookmarkStart w:id="277" w:name="X8bf6248c9f3f97f4894a761f3e01800d2c2c84f"/>
+    <w:bookmarkStart w:id="279" w:name="X8bf6248c9f3f97f4894a761f3e01800d2c2c84f"/>
     <w:p>
       <w:pPr>
         <w:pStyle w:val="Heading1"/>
@@ -37,7 +37,7 @@
         <w:pStyle w:val="FirstParagraph"/>
       </w:pPr>
       <w:r>
-        <w:t xml:space="preserve">Traditionally, archaeologists group assemblages into phases and assign them community or polity status. Earlier studies have shown that the phases of the Lower Mississippi River Valley do not separate cleanly, but they have not explained what produces their apparent organization. We explain phases using cultural transmission theory in which potters copy near neighbors more than distant ones. Neutral drift makes nearby assemblages alike whether or not groups exist. Settlement is clumped, and a smooth gradient sampled at clumps and sorted by resemblance and proximity looks like a set of groups. We present a method for determining whether a phase restricts copying of variability in decorated pottery. In such cases, the frequencies of artifact classes show what distance-limited copying does not produce: learning concentrated inside and divergence across its edge. We test our method on the decorated-type frequencies of the Late Mississippian St. Francis basin in northeastern Arkansas under the phases Phillips defined, including the Parkin phase, long read as a polity. The phase lines run through sparsely settled country, and hierarchical clustering of site locations alone recovers the phases for all but two assemblages, as expected of units sorted by proximity. The lines separate the assemblages about as well as alternative divisions of the same sites, and the step in similarity across them appears at arbitrary lines as well. Under the same clustering, frequencies simulated with no groups sort into the phases about as readily as the real assemblages when composition is given a quarter of location’s weight or less, and less readily at equal weight and on resemblance alone; the real frequencies’ advantage there is expected, since the phases were drawn from them. The Parkin phase separates the assemblages no better than divisions around random centers, though better than compact ones. The frequencies vary over shorter distances than a copying model predicts, and that variation is not specific to phase borders. Phases therefore do not uniquely capture the basin’s ceramic differentiation, and the assemblages neither require nor exclude restricted copying at their lines. The results do not exclude a Parkin polity, since political boundaries need not coincide with ceramic traditions.</w:t>
+        <w:t xml:space="preserve">Traditionally, archaeologists group assemblages into phases and assign them community or polity status. Previous studies have shown that the phases of the Lower Mississippi River Valley do not separate cleanly, but they have not explained what produces their apparent organization. We explain phases using cultural transmission theory in which potters copy near neighbors more than distant ones. Neutral drift makes nearby assemblages alike whether or not groups exist. Settlement is clumped, and a smooth gradient sampled at clumps and sorted by resemblance and proximity looks like a set of groups. We present a method for determining whether the copying of variability in decorated pottery is restricted to support the recognition of phase. In such cases, artifact-class frequencies show what distance-limited copying does not produce: social learning concentrated inside and divergence across its edge. We test our method on the decorated-type frequencies of the Late Mississippian St. Francis basin in northeastern Arkansas under the phases Phillips defined, including the Parkin phase, long read as a polity. The phase lines run through sparsely settled areas, and hierarchical clustering of site locations alone recovers the phases for all but two assemblages, as expected of units sorted by proximity. The lines separate the assemblages about as well as alternative divisions of the same sites, and the step in similarity across them appears at arbitrary lines as well. Under the same clustering, frequencies simulated with no groups sort into the phases about as readily as the real assemblages when composition is given a quarter of location’s weight or less, and less readily at equal weight and on resemblance alone; the real frequencies’ advantage there is expected, since the phases were drawn from them. The Parkin phase separates the assemblages no better than divisions around random centers, though better than compact ones. The frequencies vary over shorter distances than a copying model predicts, and that variation is not specific to phase borders. Phases therefore do not uniquely capture the basin’s ceramic differentiation, and the assemblages neither require nor exclude restricted copying at their lines. The results do not exclude a Parkin polity, since political boundaries need not coincide with ceramic traditions.</w:t>
       </w:r>
     </w:p>
     <w:p>
@@ -73,7 +73,7 @@
         <w:pStyle w:val="FirstParagraph"/>
       </w:pPr>
       <w:r>
-        <w:t xml:space="preserve">Tradicionalmente, los arqueólogos agrupan los conjuntos cerámicos en fases y les atribuyen las cualidades de comunidades o entidades políticas. Estudios anteriores han mostrado que las fases del valle bajo del río Misisipi no se separan con nitidez, pero no han explicado qué produce su aparente organización. Explicamos las fases con la teoría de la transmisión cultural, según la cual los alfareros copian a sus vecinos cercanos más que a los lejanos. La deriva neutral hace que los conjuntos cercanos se parezcan, ya existan o no grupos. Los asentamientos están agrupados, y un gradiente continuo, muestreado en esos agrupamientos y ordenado por semejanza y proximidad, parece un conjunto de grupos. Presentamos un método para determinar si una fase constituye una restricción para la copia de la cerámica decorada. En tal caso, las frecuencias de las clases de artefactos muestran lo que la copia limitada por la distancia no produce: aprendizaje concentrado en su interior y divergencia a través de su límite. Lo ponemos a prueba con las frecuencias de los tipos decorados del Misisipiano tardío en la cuenca del río St. Francis, en el noreste de Arkansas, según las fases definidas por Phillips, incluida la fase Parkin, interpretada durante mucho tiempo como una entidad política. Los límites de las fases atraviesan zonas poco pobladas, y el agrupamiento jerárquico de las ubicaciones de los sitios, por sí solo, recupera las fases para todos los conjuntos salvo dos, como cabe esperar de unidades ordenadas por proximidad. Los límites separan los conjuntos aproximadamente tan bien como otras divisiones de los mismos sitios, y el escalón de semejanza que los cruza aparece también en límites arbitrarios. Con el mismo agrupamiento, las frecuencias simuladas sin grupos se clasifican en las fases aproximadamente con la misma facilidad que los conjuntos reales cuando la composición recibe una cuarta parte del peso de la ubicación o menos, y con menos facilidad cuando pesa tanto como la ubicación o cuenta sola; esa ventaja de las frecuencias reales es esperable, ya que las fases se trazaron a partir de ellas. La fase Parkin no separa los conjuntos mejor que las divisiones en torno a centros aleatorios, aunque sí mejor que las divisiones compactas. Las frecuencias varían a distancias más cortas de las predichas por un modelo de copia, y esa variación no es propia de los límites de las fases. Por lo tanto, las fases no captan de manera exclusiva la diferenciación cerámica de la cuenca, y los conjuntos ni exigen ni excluyen una copia restringida en sus límites. Los resultados no excluyen la existencia de una entidad política en Parkin, ya que los límites políticos no tienen por qué coincidir con las tradiciones cerámicas.</w:t>
+        <w:t xml:space="preserve">Tradicionalmente, los arqueólogos agrupan los conjuntos cerámicos en fases y les atribuyen las cualidades de comunidades o entidades políticas. Estudios anteriores han mostrado que las fases del valle bajo del río Misisipi no se separan con nitidez, pero no han explicado qué produce su aparente organización. Explicamos las fases con la teoría de la transmisión cultural, según la cual los alfareros copian a sus vecinos cercanos más que a los lejanos. La deriva neutral hace que los conjuntos cercanos se parezcan, ya existan o no grupos. Los asentamientos están agrupados, y un gradiente continuo, muestreado en esos agrupamientos y ordenado por semejanza y proximidad, parece un conjunto de grupos. Presentamos un método para determinar si una fase constituye una restricción para la copia de la cerámica decorada. En tal caso, las frecuencias de las clases de artefactos muestran lo que la copia limitada por la distancia no produce: aprendizaje concentrado en su interior y divergencia a través de su límite. Lo ponemos a prueba con las frecuencias de los tipos decorados del Misisipiano tardío en la cuenca del río St. Francis, en el noreste de Arkansas, según las fases definidas por Phillips, incluida la fase Parkin, interpretada durante mucho tiempo como una entidad política. Los límites de las fases atraviesan zonas poco pobladas, y el agrupamiento jerárquico de las ubicaciones de los sitios, por sí solo, recupera las fases para todos los conjuntos salvo dos, como cabe esperar de unidades ordenadas por proximidad. Los límites separan los conjuntos aproximadamente tan bien como otras divisiones de los mismos sitios, y el escalón de semejanza que los cruza también aparece en límites arbitrarios. Con el mismo agrupamiento, las frecuencias simuladas sin grupos se clasifican en las fases aproximadamente con la misma facilidad que los conjuntos reales cuando la composición representa una cuarta parte del peso de la ubicación o menos, y con menos facilidad cuando pesa tanto como la ubicación o pesa por sí sola; esa ventaja de las frecuencias reales es esperable, ya que las fases se trazaron a partir de ellas. La fase Parkin no separa los conjuntos mejor que las divisiones en torno a centros aleatorios, aunque sí mejor que las divisiones compactas. Las frecuencias varían a distancias más cortas de las predichas por un modelo de copia, y esa variación no es propia de los límites de las fases. Por lo tanto, las fases no captan de manera exclusiva la diferenciación cerámica de la cuenca, y los conjuntos ni exigen ni excluyen una copia restringida en sus límites. Los resultados no excluyen la existencia de una entidad política en Parkin, ya que los límites políticos no tienen por qué coincidir con las tradiciones cerámicas.</w:t>
       </w:r>
     </w:p>
     <w:p>
@@ -215,9 +215,9 @@
       <w:r>
         <w:drawing>
           <wp:inline>
-            <wp:extent cx="3566160" cy="5368444"/>
+            <wp:extent cx="3474719" cy="5230792"/>
             <wp:effectExtent b="0" l="0" r="0" t="0"/>
-            <wp:docPr descr="Figure 1. The study area and the late pre-contact phases as Phillips (1970) drew them. The Nodena, Parkin, Walls, and Kent phase areas are redrawn from Lipo (2001:Figure 2.6), after Phillips (1970), and are placed on the map from the survey-quadrangle frame of that figure. Filled circles are the 28 decorated-ceramic assemblages analyzed here, open circles are the eight other assemblages of the 38 used in this study that fall inside the frame, and the Parkin site is starred. Phase areas are drawn over the HydroRIVERS river network (Lehner and Grill 2013), with line width scaled by flow order. The bounded areas illustrate the premise under test, that each hosted a distinct, internally interacting society. The mapped area lies in Arkansas, Tennessee, and Mississippi; Missouri lies just north of the frame. Inset: location in North America." title="" id="112" name="Picture"/>
+            <wp:docPr descr="Figure 1. The study area and the late pre-contact phases as Phillips (1970) defined them. The Nodena, Parkin, Walls, and Kent phase areas are redrawn from Lipo (2001:Figure 2.6), after Phillips (1970), and placed on the map using the survey-quadrangle frame from that figure. Filled circles are the 28 decorated-ceramic assemblages analyzed here, open circles are the eight other assemblages of the 38 used in this study that fall inside the frame, and the Parkin site is starred. Phase areas are drawn over the HydroRIVERS river network (Lehner and Grill 2013), with line width scaled by flow order. The bounded areas illustrate the premise under test, that each hosted a distinct, internally interacting society. The mapped area lies in Arkansas, Tennessee, and Mississippi; Missouri lies just north of the frame. Inset: location in North America." title="" id="112" name="Picture"/>
             <a:graphic>
               <a:graphicData uri="http://schemas.openxmlformats.org/drawingml/2006/picture">
                 <pic:pic>
@@ -236,7 +236,7 @@
                   <pic:spPr bwMode="auto">
                     <a:xfrm>
                       <a:off x="0" y="0"/>
-                      <a:ext cx="3566160" cy="5368444"/>
+                      <a:ext cx="3474719" cy="5230792"/>
                     </a:xfrm>
                     <a:prstGeom prst="rect">
                       <a:avLst/>
@@ -282,7 +282,7 @@
         <w:t xml:space="preserve"> </w:t>
       </w:r>
       <w:r>
-        <w:t xml:space="preserve">drew them. The Nodena, Parkin, Walls, and Kent phase areas are redrawn from Lipo</w:t>
+        <w:t xml:space="preserve">defined them. The Nodena, Parkin, Walls, and Kent phase areas are redrawn from Lipo</w:t>
       </w:r>
       <w:r>
         <w:t xml:space="preserve"> </w:t>
@@ -300,7 +300,7 @@
         <w:t xml:space="preserve">(1970)</w:t>
       </w:r>
       <w:r>
-        <w:t xml:space="preserve">, and are placed on the map from the survey-quadrangle frame of that figure. Filled circles are the 28 decorated-ceramic assemblages analyzed here, open circles are the eight other assemblages of the 38 used in this study that fall inside the frame, and the Parkin site is starred. Phase areas are drawn over the HydroRIVERS river network</w:t>
+        <w:t xml:space="preserve">, and placed on the map using the survey-quadrangle frame from that figure. Filled circles are the 28 decorated-ceramic assemblages analyzed here, open circles are the eight other assemblages of the 38 used in this study that fall inside the frame, and the Parkin site is starred. Phase areas are drawn over the HydroRIVERS river network</w:t>
       </w:r>
       <w:r>
         <w:t xml:space="preserve"> </w:t>
@@ -522,7 +522,7 @@
         <w:pStyle w:val="BodyText"/>
       </w:pPr>
       <w:r>
-        <w:t xml:space="preserve">This paper offers and tests an explanation. We ask two questions. First, what explains the phases? We argue that they can follow from how people learn. Potters copy near neighbors more than distant ones, settlements clump, and a smooth gradient in style sampled at those clumps looks like groups. Second, does the Parkin phase, the one unit most often treated as a polity, show anything in its decorated-type frequencies that sets it apart? Both questions can be investigated using the same test. Copying across space produces spatial structure in stylistic frequencies regardless of whatever else is happening. A phase, then, should be identifiable as a restriction on the copying of decorated pottery if its class frequencies show properties that spatially structured drift does not produce. This test is more restrictive than asking whether a society or polity existed. Political affiliation, of course, need not coincide with a ceramic tradition, but ceramics offer empirical evidence in the archaeological record about how social learning was structured. However, pottery can show only whether learning was bounded where the phase lines fall, not whether people were politically organized.</w:t>
+        <w:t xml:space="preserve">This paper offers and tests an explanation. We ask two questions. First, what explains the phases? We argue that they can follow from how people learn. Potters copy near neighbors more than distant ones, settlements clump, and a smooth gradient in style sampled at those clumps looks like groups. Second, does the Parkin phase, the one unit most often treated as a polity, show anything in its decorated-type frequencies that sets it apart? Both questions can be investigated using the same test. Copying across space produces spatial structure in stylistic frequencies regardless of whatever else is happening. A phase, then, should be identifiable as a restriction on the copying of decorated pottery if its class frequencies show properties that spatially structured drift does not produce. This test is not the same as asking whether a society or polity existed. Political affiliation, of course, need not coincide with a ceramic tradition, but ceramic assemblages have served as the starting point for defining such polities and offer empirical evidence in the archaeological record about how social learning was structured. Pottery can show only whether learning was bounded where the phase lines fall, not whether people were politically organized.</w:t>
       </w:r>
     </w:p>
     <w:p>
@@ -530,7 +530,7 @@
         <w:pStyle w:val="BodyText"/>
       </w:pPr>
       <w:r>
-        <w:t xml:space="preserve">We proceed in two steps. Our primary test concerns the phases as Phillips</w:t>
+        <w:t xml:space="preserve">We evaluate an example of ceramic assemblages used as the basis for phase definitions in two steps. Our primary test concerns the phases as Phillips</w:t>
       </w:r>
       <w:r>
         <w:t xml:space="preserve"> </w:t>
@@ -554,7 +554,7 @@
         <w:t xml:space="preserve"> </w:t>
       </w:r>
       <w:r>
-        <w:t xml:space="preserve">compiled from largely the same collections, under his phase assignments. These follow Phillips’s, with Smith’s</w:t>
+        <w:t xml:space="preserve">compiled from largely the same assemblages, though with increased sample sizes, under his phase assignments. These follow Phillips’s, with Smith’s</w:t>
       </w:r>
       <w:r>
         <w:t xml:space="preserve"> </w:t>
@@ -566,7 +566,7 @@
         <w:t xml:space="preserve"> </w:t>
       </w:r>
       <w:r>
-        <w:t xml:space="preserve">Horseshoe Lake phase split out, and add the phases of western Tennessee</w:t>
+        <w:t xml:space="preserve">Horseshoe Lake phase split out, and add the western Tennessee phases</w:t>
       </w:r>
       <w:r>
         <w:t xml:space="preserve"> </w:t>
@@ -583,7 +583,7 @@
         <w:pStyle w:val="BodyText"/>
       </w:pPr>
       <w:r>
-        <w:t xml:space="preserve">The late pre-contact St. Francis basin provides the data for our test. Its decorated assemblages are built from the well-documented decorated classes of the long-established Phillips-Ford-Griffin types</w:t>
+        <w:t xml:space="preserve">The late pre-contact St. Francis basin deposits provide the data for our test. These decorated assemblages are built from the well-documented decorated classes of the long-established Phillips-Ford-Griffin types</w:t>
       </w:r>
       <w:r>
         <w:t xml:space="preserve"> </w:t>
@@ -628,7 +628,7 @@
         <w:pStyle w:val="FirstParagraph"/>
       </w:pPr>
       <w:r>
-        <w:t xml:space="preserve">Our method is built on cultural transmission theory, and it is simple. Potters learned how to decorate pots from others, and the decorations they made reflect who they learned from. Under the neutral model of cultural transmission, decorative variants that make no difference to how a pot performs change in frequency through innovation and chance copying in a finite population of learners, much as selectively neutral alleles do</w:t>
+        <w:t xml:space="preserve">Our method of explaining variability in ceramic class frequencies is built on cultural transmission theory, and it is simple. Potters learned how to decorate pots from others, and the decorations they made reflect who they learned from. Under the neutral model of cultural transmission, decorative variants that make no difference to a pot’s performance change in frequency through innovation and chance copying in a finite population of learners, much the same as selectively neutral alleles do</w:t>
       </w:r>
       <w:r>
         <w:t xml:space="preserve"> </w:t>
@@ -655,7 +655,7 @@
         <w:t xml:space="preserve"> </w:t>
       </w:r>
       <w:r>
-        <w:t xml:space="preserve">People learn from those they live near and see often, so a potter is more likely to copy a neighbor than someone further away. Under neutral drift, that alone makes nearby assemblages more alike than distant ones, and similarity fades smoothly with distance. Population geneticists call this isolation by distance</w:t>
+        <w:t xml:space="preserve">People learn from those they live near and see often, so a potter is more likely to copy a neighbor than someone further away. Under neutral drift, that alone makes nearby assemblages more alike than distant ones, and similarity decreases smoothly with distance. Population geneticists call this isolation by distance</w:t>
       </w:r>
       <w:r>
         <w:t xml:space="preserve"> </w:t>
@@ -673,7 +673,7 @@
         <w:t xml:space="preserve">(Neiman 1995; Shennan et al. 2015)</w:t>
       </w:r>
       <w:r>
-        <w:t xml:space="preserve">. It requires no groups. This effect is what copying produces across any landscape with local interaction. It produces between-place differences on its own, because small or poorly connected places drift toward distinctive and idiosyncratic repertoires</w:t>
+        <w:t xml:space="preserve">. This effect is what copying produces across any landscape with local interaction. It produces between-place differences on its own, because small or poorly connected places drift toward distinctive and idiosyncratic combinations of stylistic features</w:t>
       </w:r>
       <w:r>
         <w:t xml:space="preserve"> </w:t>
@@ -700,7 +700,7 @@
         <w:t xml:space="preserve"> </w:t>
       </w:r>
       <w:r>
-        <w:t xml:space="preserve">People did not live evenly across the basin. Sites concentrate on particular reaches of the basin’s rivers, with less-occupied stretches of land between them. The smooth gradient in style is therefore sampled unevenly, densely in some places and sparsely or not at all in others.</w:t>
+        <w:t xml:space="preserve">People did not live evenly across the St. Francis basin. Settlements concentrate on particular reaches of the basin’s rivers, with less-occupied stretches of land between them. The smooth gradient in style is therefore sampled unevenly, densely in some places and sparsely or not at all in others.</w:t>
       </w:r>
     </w:p>
     <w:p>
@@ -748,7 +748,7 @@
           <w:i/>
           <w:iCs/>
         </w:rPr>
-        <w:t xml:space="preserve">A bounded interaction group requires more.</w:t>
+        <w:t xml:space="preserve">Identification of a bounded interaction group requires more than clumping.</w:t>
       </w:r>
       <w:r>
         <w:t xml:space="preserve"> </w:t>
@@ -763,7 +763,7 @@
         <w:t xml:space="preserve">(Crema et al. 2016; Henrich 2001; Henrich and Boyd 1998)</w:t>
       </w:r>
       <w:r>
-        <w:t xml:space="preserve">. Divergence that grows as interaction narrows would be a further sign, but the lack of a detailed chronological record for these deposits makes the record not well-suited for testing this possibility (Supplemental Text). Each of these possibilities has to be evaluated against a model of copying with no groups on the real geography, not against zero, and against other lines drawn across the same map, because any line cut through a gradient separates some difference.</w:t>
+        <w:t xml:space="preserve">. Divergence that grows as interaction narrows would be further evidence. However, this evidence requires a highly detailed chronological record, which is often unavailable. These deposits make the record poorly suited to testing this possibility (Supplemental Text). Each of these possibilities must be evaluated against a model of copying with no groups on the real geography, not against zero, and against other configurations of groups drawn across the same map, because any delineation through a gradient separates some difference.</w:t>
       </w:r>
     </w:p>
     <w:p>
@@ -771,7 +771,7 @@
         <w:pStyle w:val="BodyText"/>
       </w:pPr>
       <w:r>
-        <w:t xml:space="preserve">These expectations provide functional means to evaluate the Parkin phase. If the Parkin phase was a polity whose members learned from, married into, and exchanged with one another more than with outsiders, its assemblage composition should stand apart from the rest of the basin by more than copying across distance produces. Assemblages should be more distinctive than what an arbitrary line drawn across the same sites separates. Empirically, there should be a step in similarity at its edge that other delineations do not show. Alternative models of late pre-contact valley populations do not require these attributes. The alternative finding is that the polities in this part of the valley never achieved regional integration</w:t>
+        <w:t xml:space="preserve">These expectations provide functional means to evaluate the Parkin phase. If the Parkin phase was a polity whose members learned from, married into, and exchanged with one another more than with outsiders, its assemblage composition should stand apart from the rest of the basin by more than copying across distance produces. Assemblages should be more distinctive than what an arbitrary line drawn across the same sites separates. Empirically, similarity should drop at the edge in a way other delineations do not show. Alternative models of late pre-contact valley populations do not require these attributes. The alternative finding is that the polities in this part of the valley never achieved regional integration</w:t>
       </w:r>
       <w:r>
         <w:t xml:space="preserve"> </w:t>
@@ -870,7 +870,16 @@
         <w:t xml:space="preserve">(Dunnell 1978; Neiman 1995)</w:t>
       </w:r>
       <w:r>
-        <w:t xml:space="preserve">. Plain wares track vessel function, paste, and site activities, none of which a copying model represents. Combining the frequency of plain and decorated classes also mixes factors driving relative investment in decorating ceramics, a process driven by factors beyond social learning and copying. In Mainfort’s</w:t>
+        <w:t xml:space="preserve">. Variability in plain wares largely reflects changes in paste and temper, attributes that vary because of firing conditions and vessel function</w:t>
+      </w:r>
+      <w:r>
+        <w:t xml:space="preserve"> </w:t>
+      </w:r>
+      <w:r>
+        <w:t xml:space="preserve">(Feathers 2006; Feathers and Peacock 2008)</w:t>
+      </w:r>
+      <w:r>
+        <w:t xml:space="preserve">. Combining the frequency of plain and decorated classes also mixes factors driving relative investment in ceramic decoration, a process driven by factors beyond social learning and copying. In Mainfort’s</w:t>
       </w:r>
       <w:r>
         <w:t xml:space="preserve"> </w:t>
@@ -891,7 +900,7 @@
         <w:t xml:space="preserve">(2001)</w:t>
       </w:r>
       <w:r>
-        <w:t xml:space="preserve">, to increase sample sizes and to ensure consistent identification, we pool sherds from Barton Incised, Kent Incised, and Mound Place Incised. We also pool the painted types Old Town Red, Nodena Red and White, and Avenue Polychrome. Each class is a culture-history type, a unit of measurement built by analysts, not a category assumed to have existed in the past.</w:t>
+        <w:t xml:space="preserve">, to ensure consistent identification, we pool sherds from Barton Incised, Kent Incised, and Mound Place Incised. We also pool the painted types Old Town Red, Nodena Red and White, and Avenue Polychrome. Each class is a culture-history type, a unit of measurement built by analysts, not a category assumed to have existed in the past.</w:t>
       </w:r>
     </w:p>
     <w:p>
@@ -929,7 +938,7 @@
         <w:t xml:space="preserve"> </w:t>
       </w:r>
       <w:r>
-        <w:t xml:space="preserve">compiled a separate table of 39 sites, each with at least 800 sherds, drawn largely from the same survey files with additional sources</w:t>
+        <w:t xml:space="preserve">compiled a separate database of 39 sites, each with at least 800 sherds, drawn largely from the same survey files with additional sources</w:t>
       </w:r>
       <w:r>
         <w:t xml:space="preserve"> </w:t>
@@ -938,16 +947,16 @@
         <w:t xml:space="preserve">(Mainfort 2003:182)</w:t>
       </w:r>
       <w:r>
-        <w:t xml:space="preserve">. Because his counts are not entirely independent of ours, we do not combine them. Nor do we make his table the primary dataset. His assignments revise Phillips’s with phases defined later</w:t>
-      </w:r>
-      <w:r>
-        <w:t xml:space="preserve"> </w:t>
-      </w:r>
-      <w:r>
-        <w:t xml:space="preserve">(Smith 1990)</w:t>
-      </w:r>
-      <w:r>
-        <w:t xml:space="preserve">, and his table is not a larger sample once it is restricted to decorated classes: at a minimum of 100 decorated sherds, it holds 29 sites and 13,296 sherds in five phases, two of which have only four and three sites, against the 28 assemblages and 14,101 sherds analyzed here. We therefore analyze his table and his phases separately, as a second case.</w:t>
+        <w:t xml:space="preserve">. Because his counts are not entirely independent of ours, we do not combine them. Nor do we make his table the primary dataset. His phase assignments revise Phillips’s with phases defined later</w:t>
+      </w:r>
+      <w:r>
+        <w:t xml:space="preserve"> </w:t>
+      </w:r>
+      <w:r>
+        <w:t xml:space="preserve">(e.g., Smith 1990)</w:t>
+      </w:r>
+      <w:r>
+        <w:t xml:space="preserve">. His table is not a larger sample once restricted to decorated classes. Using a minimum of 100 decorated sherds, it includes 29 sites and 13,296 sherds across five phases, two of which have only four and three sites, compared with the 28 assemblages and 14,101 sherds analyzed here. We therefore analyze his table and his phases separately, as a second case.</w:t>
       </w:r>
     </w:p>
     <w:p>
@@ -979,33 +988,7 @@
         <w:t xml:space="preserve"> </w:t>
       </w:r>
       <w:r>
-        <w:t xml:space="preserve">mapped them (Figure 1). An assemblage that lies inside no area takes the nearest one. Two assemblages of the matrix, Parchman and Salomon in Coahoma County, Mississippi, lie south of the mapped areas and are not assigned. We include only assemblages with at least 75 decorated sherds. At that count, the</w:t>
-      </w:r>
-      <w:r>
-        <w:t xml:space="preserve"> </w:t>
-      </w:r>
-      <m:oMath>
-        <m:sSub>
-          <m:e>
-            <m:r>
-              <m:t>F</m:t>
-            </m:r>
-          </m:e>
-          <m:sub>
-            <m:r>
-              <m:t>S</m:t>
-            </m:r>
-            <m:r>
-              <m:t>T</m:t>
-            </m:r>
-          </m:sub>
-        </m:sSub>
-      </m:oMath>
-      <w:r>
-        <w:t xml:space="preserve"> </w:t>
-      </w:r>
-      <w:r>
-        <w:t xml:space="preserve">that sampling alone produces between two assemblages drawn from one profile has a median of 14 percent of the observed five-cluster value, and its 95th percentile falls below that value (Supplemental Text). The Nodena phase keeps a single assemblage of that size, Carson Lake, and is not carried as a phase of one. These rules leave 28 assemblages holding 14,101 decorated sherds (median 251 per assemblage, range 79 to 1,709) in three phases: Parkin with 12 assemblages, Kent with 11, and Walls with 5. Twenty-six lie inside a phase area. The other two, Cramor Place and Holden Lake, lie 1.0 km outside the nearest area, within the drafting error of the source map. We georeferenced each assemblage from the Lower Mississippi Survey site files. We obtained settlement attributes from a regional database</w:t>
+        <w:t xml:space="preserve">mapped them (Figure 1). We assign assemblages that fall outside all areas to the nearest one. Two matrix assemblages, Parchman and Salomon in Coahoma County, Mississippi, lie south of the mapped areas and are not assigned. We include only assemblages with at least 75 decorated sherds. This sample-size cutoff leaves the Nodena phase with only a single assemblage, Carson Lake. So we exclude that phase from our analyses. These rules leave 28 assemblages with 14,101 decorated sherds (median 251 per assemblage, range 79 to 1,709) in three phases: Parkin with 12 assemblages, Kent with 11, and Walls with 5. We georeferenced each assemblage from the Lower Mississippi Survey site files, and we obtained settlement attributes from a regional database</w:t>
       </w:r>
       <w:r>
         <w:t xml:space="preserve"> </w:t>
@@ -1085,7 +1068,7 @@
         <w:t xml:space="preserve">2020)</w:t>
       </w:r>
       <w:r>
-        <w:t xml:space="preserve">, place about three-quarters of the summed probability between the mid-thirteenth and the mid-seventeenth centuries (median AD 1428; Parkin, AD 1483). The summed probability does not fall at the contact interval: the century after AD 1541 holds as much of it as the century before, and it falls in the century after that (Supplemental Text). A calibration plateau across the contact interval prevents year-scale resolution</w:t>
+        <w:t xml:space="preserve">, place about three-quarters of the summed probability between the mid-thirteenth and the mid-seventeenth centuries (median AD 1428; Parkin, AD 1483). The summed probability does not fall within the contact interval. The century after AD 1541 contains as much of the range as the century before, and it falls in the century after that (Supplemental Text). A calibration plateau across the contact interval prevents year-scale resolution</w:t>
       </w:r>
       <w:r>
         <w:t xml:space="preserve"> </w:t>
@@ -1115,7 +1098,7 @@
         <w:t xml:space="preserve"> </w:t>
       </w:r>
       <w:r>
-        <w:t xml:space="preserve">(Supplemental Text). Fortunately for our analysis, an order along the axis is an order in space at least as much as in time, and none of our phase-line tests depends on it.</w:t>
+        <w:t xml:space="preserve">(Supplemental Text). Fortunately for our analysis, an order along the axis is an order in space at least as much as in time, and none of our phase-boundary tests depend on it.</w:t>
       </w:r>
     </w:p>
     <w:p>
@@ -1127,7 +1110,7 @@
           <wp:inline>
             <wp:extent cx="5334000" cy="3639186"/>
             <wp:effectExtent b="0" l="0" r="0" t="0"/>
-            <wp:docPr descr="Figure 2. Correspondence-analysis seriation of the 28 decorated assemblages, plotted on the first two dimensions and colored by rank on the first (oriented, as in every analysis, in the direction the pooled calibrated medians of the four radiocarbon-dated assemblages weakly favor; they do not establish it). Parkin is the starred marker. The assemblages form a continuum rather than discrete clusters, echoing Mainfort’s (2003) independent ordination." title="" id="118" name="Picture"/>
+            <wp:docPr descr="Figure 2. Correspondence-analysis seriation of the decorated ceramic type frequencies of the 28 assemblages, plotted on the first two dimensions and colored by rank on the first (oriented, as in every analysis, in the direction the pooled calibrated medians of the four radiocarbon-dated assemblages weakly favor). Parkin is the starred marker. The assemblages form a continuum rather than discrete clusters, echoing Mainfort’s (2003) independent ordination." title="" id="118" name="Picture"/>
             <a:graphic>
               <a:graphicData uri="http://schemas.openxmlformats.org/drawingml/2006/picture">
                 <pic:pic>
@@ -1180,7 +1163,7 @@
         <w:t xml:space="preserve"> </w:t>
       </w:r>
       <w:r>
-        <w:t xml:space="preserve">Correspondence-analysis seriation of the 28 decorated assemblages, plotted on the first two dimensions and colored by rank on the first (oriented, as in every analysis, in the direction the pooled calibrated medians of the four radiocarbon-dated assemblages weakly favor; they do not establish it). Parkin is the starred marker. The assemblages form a continuum rather than discrete clusters, echoing Mainfort’s (2003) independent ordination.</w:t>
+        <w:t xml:space="preserve">Correspondence-analysis seriation of the decorated ceramic type frequencies of the 28 assemblages, plotted on the first two dimensions and colored by rank on the first (oriented, as in every analysis, in the direction the pooled calibrated medians of the four radiocarbon-dated assemblages weakly favor). Parkin is the starred marker. The assemblages form a continuum rather than discrete clusters, echoing Mainfort’s (2003) independent ordination.</w:t>
       </w:r>
     </w:p>
     <w:bookmarkEnd w:id="120"/>
@@ -1198,7 +1181,7 @@
         <w:pStyle w:val="FirstParagraph"/>
       </w:pPr>
       <w:r>
-        <w:t xml:space="preserve">Two measures underpin our tests. The first is a cultural version of Wright’s</w:t>
+        <w:t xml:space="preserve">Two measures drive our tests. The first is a cultural version of Wright’s</w:t>
       </w:r>
       <w:r>
         <w:t xml:space="preserve"> </w:t>
@@ -1253,7 +1236,7 @@
         <w:t xml:space="preserve"> </w:t>
       </w:r>
       <w:r>
-        <w:t xml:space="preserve">is how much more diverse the pooled assemblages are than the average group, as a fraction of the pooled diversity, weighted by assemblage size. This is Nei’s</w:t>
+        <w:t xml:space="preserve">as how much more diverse the pooled assemblages are than the average group, as a fraction of pooled diversity weighted by assemblage size. This is Nei’s</w:t>
       </w:r>
       <w:r>
         <w:t xml:space="preserve"> </w:t>
@@ -1274,7 +1257,7 @@
         <w:t xml:space="preserve">(Brainerd 1951; Robinson 1951)</w:t>
       </w:r>
       <w:r>
-        <w:t xml:space="preserve">, normally fades smoothly with distance. The boundary excess is how much more similarity is lost across a line than distance predicts, a step in similarity at the line. We compare pairs of assemblages on the same side of a line with pairs on opposite sides at matched distances, in four distance bins, and average the differences over the bins that hold at least five pairs of each kind.</w:t>
+        <w:t xml:space="preserve">, normally decreases smoothly with distance. The boundary excess is how much more similarity is lost across a line than distance predicts, a step in similarity at the line. We compare pairs of assemblages on the same side of a line with pairs on opposite sides at matched distances, in four distance bins, and average the differences over the bins that hold at least five pairs of each kind.</w:t>
       </w:r>
     </w:p>
     <w:p>
@@ -1282,7 +1265,7 @@
         <w:pStyle w:val="BodyText"/>
       </w:pPr>
       <w:r>
-        <w:t xml:space="preserve">Before looking at the phases, we established that cultural</w:t>
+        <w:t xml:space="preserve">Before examining the archaeological assemblages, we established that cultural</w:t>
       </w:r>
       <w:r>
         <w:t xml:space="preserve"> </w:t>
@@ -1334,7 +1317,7 @@
         <w:t xml:space="preserve"> </w:t>
       </w:r>
       <w:r>
-        <w:t xml:space="preserve">tracked the imposed groups steadily. We found that three other measures often used for the purpose, the departure from unbiased copying</w:t>
+        <w:t xml:space="preserve">tracked the imposed groups steadily. We found that three other measures often used for the purpose that include the departure from unbiased copying</w:t>
       </w:r>
       <w:r>
         <w:t xml:space="preserve"> </w:t>
@@ -1352,7 +1335,7 @@
         <w:t xml:space="preserve">(Lipo et al. 2015)</w:t>
       </w:r>
       <w:r>
-        <w:t xml:space="preserve">, and the boundary excess, do not sufficiently detect boundaries under real-world conditions (Supplemental Text, Figures S1 to S3). We therefore draw inferences about groups from cultural</w:t>
+        <w:t xml:space="preserve">, and the boundary excess, do not sufficiently detect boundaries under real-world conditions (Supplemental Text, Figures S1 to S3). We therefore infer groups from cultural</w:t>
       </w:r>
       <w:r>
         <w:t xml:space="preserve"> </w:t>
@@ -1375,7 +1358,10 @@
         </m:sSub>
       </m:oMath>
       <w:r>
-        <w:t xml:space="preserve">, and use the step in similarity to describe what the copying model misses and to ask whether the phase lines show more of it than other lines do.</w:t>
+        <w:t xml:space="preserve"> </w:t>
+      </w:r>
+      <w:r>
+        <w:t xml:space="preserve">and use the step in similarity to describe what the copying model misses and to ask whether the phase delineations show more of it than other possible groupings do.</w:t>
       </w:r>
     </w:p>
     <w:p>
@@ -1396,7 +1382,7 @@
         <w:t xml:space="preserve">k</w:t>
       </w:r>
       <w:r>
-        <w:t xml:space="preserve">-means on the assemblage coordinates. The site layout is best described by two clusters, as the silhouette score indicates, which rewards compact, well-separated clusters. Because cultural</w:t>
+        <w:t xml:space="preserve">-means on the assemblage coordinates. The site layout is best described by two clusters, as the silhouette score indicates, which rewards compact, well-separated assemblage groupings. Because cultural</w:t>
       </w:r>
       <w:r>
         <w:t xml:space="preserve"> </w:t>
@@ -1422,7 +1408,7 @@
         <w:t xml:space="preserve"> </w:t>
       </w:r>
       <w:r>
-        <w:t xml:space="preserve">depends on how many pieces the basin is cut into, we also fit a model with no divisions. It treats decorated-class composition as a continuous surface over the map, with a separate term for site-specific deviations, and asks how well that surface describes the record. It is a description, not a test for groups: a group whose members lie near one another shares a composition that a smooth surface can absorb at the sampled sites, so the model cannot tell continuous copying from groups aligned with geography.</w:t>
+        <w:t xml:space="preserve">depends on how many pieces the basin is cut into, we also fit a model with no divisions. It treats decorated-class composition as a continuous surface over the map, with a separate term for site-specific deviations, and asks how well that surface describes the record. It is a description, not a test for groups. A group whose members lie near one another shares a composition that a smooth surface can absorb at the sampled sites, so the model cannot tell continuous copying from groups aligned with geography.</w:t>
       </w:r>
     </w:p>
     <w:bookmarkEnd w:id="121"/>
@@ -1457,7 +1443,7 @@
         <w:pStyle w:val="BodyText"/>
       </w:pPr>
       <w:r>
-        <w:t xml:space="preserve">A copying model’s predictions about differences between groups depend on population size, innovation rate, and mixing rate together, so we first tune those three to reproduce the diversity within the real assemblages, including mean within-assemblage diversity, mean number of classes present, and the diversity of all assemblages pooled. None of these involves the groups being tested. We search a grid of 297 combinations and keep those whose simulations match all three summaries within 10 percent, confirmed by rerunning each matched combination fifty times (Supplemental Text). Among the confirmed combinations, we use the one that produces the most between-group difference, so the comparison is as favorable to the no-groups model as the grid allows.</w:t>
+        <w:t xml:space="preserve">A copying model’s predictions about differences between groups depend on population size, innovation rate, and mixing rate together, so we first tune those three to reproduce the diversity within the real assemblages, including mean within-assemblage diversity, mean number of classes present, and the diversity of all assemblages pooled. None of these involve the groups being tested. We search a grid of 297 combinations and keep those whose simulations match all three summaries within 10 percent, confirmed by rerunning each matched combination fifty times (Supplemental Text). Among the confirmed combinations, we use the one that produces the largest between-group difference, giving the no-groups model its best chance of reproducing the observed differences. Any shortfall is then not due to a poorly chosen setting.</w:t>
       </w:r>
     </w:p>
     <w:p>
@@ -1465,7 +1451,7 @@
         <w:pStyle w:val="BodyText"/>
       </w:pPr>
       <w:r>
-        <w:t xml:space="preserve">To give the phases a fair chance to be groups, we also ran the model with two properties a bounded group would have. First, we simulate copying across the phase lines weakened to between half and three percent of its strength. Second, we add new variants in each phase drawn from a partly reordered version of the regional profile, so that new styles arise locally. We ran each of the 16 combinations of those settings 300 times. An approximate Bayesian posterior over them indicates which the record favors (Supplemental Text).</w:t>
+        <w:t xml:space="preserve">To give the phases a fair chance to be groups, we also ran the model with two properties a bounded group would have. First, we simulate copying across the phase boundaries weakened to between half and three percent of its strength. Second, we add new variants in each phase drawn from a partly reordered version of the regional profile, so that new styles arise locally. We ran each of the 16 combinations of those settings 300 times. An approximate Bayesian posterior over them indicates which the record favors (Supplemental Text).</w:t>
       </w:r>
     </w:p>
     <w:bookmarkEnd w:id="122"/>
@@ -1483,7 +1469,7 @@
         <w:pStyle w:val="FirstParagraph"/>
       </w:pPr>
       <w:r>
-        <w:t xml:space="preserve">We conduct five tests to ask whether the phase lines behave as group edges would. First, we compare the between-group</w:t>
+        <w:t xml:space="preserve">We conduct five tests to ask whether the phase boundaries behave as group edges would. First, we compare the between-group</w:t>
       </w:r>
       <w:r>
         <w:t xml:space="preserve"> </w:t>
@@ -1509,7 +1495,7 @@
         <w:t xml:space="preserve"> </w:t>
       </w:r>
       <w:r>
-        <w:t xml:space="preserve">and boundary excess under the phase assignments with alternative divisions of the same assemblages into groups of the same sizes, drawn around randomly placed centers or made as spatially compact as possible. We state each comparison as the posterior probability that the phase lines separate type frequencies better than an alternative (see Statistical approach). Simulations with copying restricted at the phase lines show whether this comparison could detect such a restriction. Second, we cluster the assemblages, by</w:t>
+        <w:t xml:space="preserve">and boundary excess under the phase assignments with alternative divisions of the same assemblages into groups of the same sizes, drawn around randomly placed centers or made as spatially compact as possible. We state each comparison as the posterior probability that the phase lines separate type frequencies better than an alternative (see Statistical approach). Simulations with copying restricted at the phase boundaries show whether this comparison could detect such a restriction. Second, we cluster the assemblages by</w:t>
       </w:r>
       <w:r>
         <w:t xml:space="preserve"> </w:t>
@@ -1529,7 +1515,7 @@
         <w:t xml:space="preserve">(Hubert and Arabie 1985)</w:t>
       </w:r>
       <w:r>
-        <w:t xml:space="preserve">, which averages zero for unrelated divisions and one for identical ones. Third, we map the local rate of composition change and ask whether the phase lines fall where it changes fastest. Fourth, we run the copying model on the real map of the valley and cluster its simulated assemblages the same way we cluster the real assemblages. Fifth, we ask whether the phase lines run through gaps in late-period settlement, using sites independent of the analyzed assemblages.</w:t>
+        <w:t xml:space="preserve">, which averages zero for unrelated divisions and one for identical ones. Third, we map the local rate of composition change and ask whether the phase boundaries fall where it changes fastest. Fourth, we run the copying model on the real map of the valley and cluster its simulated assemblages the same way we cluster the real assemblages. Fifth, we ask whether the phase boundaries run through gaps in late-period settlement, using sites independent of the analyzed assemblages.</w:t>
       </w:r>
     </w:p>
     <w:p>
@@ -1581,7 +1567,7 @@
         <w:t xml:space="preserve"> </w:t>
       </w:r>
       <w:r>
-        <w:t xml:space="preserve">counts under his own phase assignments. It asks whether the results depend on the tally or on the particular lines. His table is a second count of largely the same collections, and his scheme differs from Phillips’s at the Horseshoe Lake phase and in western Tennessee. If the phases marked bounded groups, the two schemes should locate the same boundaries where they cover the same ground. We do not run the copying model on his table, since the model is calibrated to our matrix, so the second case cannot show whether his phases differ by more than copying alone produces.</w:t>
+        <w:t xml:space="preserve">counts under his own phase assignments. It asks whether the results depend on the tally or on the particular boundary delineations. His table is a second count of largely the same collections, and his scheme differs from Phillips’s at the Horseshoe Lake phase and in western Tennessee. If the phases marked bounded groups, the two schemes should locate the same boundaries where they cover the same ground. We do not run the copying model on his dataset, since the model is calibrated to our matrix, so the second case cannot show whether his phases differ beyond what copying alone produces.</w:t>
       </w:r>
     </w:p>
     <w:bookmarkEnd w:id="123"/>
@@ -1633,7 +1619,7 @@
         <w:t xml:space="preserve"> </w:t>
       </w:r>
       <w:r>
-        <w:t xml:space="preserve">and 500 times for the slower boundary excess, and recomputing a statistic on each draw gives that statistic’s posterior distribution. We report its median and a 95 percent credible interval (the 2.5th to 97.5th percentiles of the draws); given the counts and the prior, the quantity lies in that interval with probability 0.95. When the phase lines are compared with alternative divisions, each draw is scored against 20 alternatives of each kind (10 for the boundary excess) chosen at random from 300, and the posterior probability that the phase lines separate the assemblages better is the share of all these comparisons they win. A probability of 0.57 therefore means that, allowing for sampling error in every assemblage, the phase lines beat a randomly chosen alternative in somewhat more than half of the comparisons. Where a probability or a share rounds to zero, we give the number of comparisons or runs behind it, since the true value is then known only to be smaller than that resolution.</w:t>
+        <w:t xml:space="preserve">and 500 times for the slower boundary excess, and recomputing a statistic on each draw gives that statistic’s posterior distribution. We report its median and a 95 percent credible interval (the 2.5th to 97.5th percentiles of the draws). Given the counts and the prior, the quantity lies in that interval with probability 0.95. When comparing the phase boundaries with alternative divisions, each draw is scored against 20 alternatives of each kind (10 for the boundary excess) chosen at random from 300, and the posterior probability that the phase boundaries separate the assemblages better is the share of these comparisons they win. A probability of 0.57 therefore means that, allowing for sampling error in every assemblage, the phase delineations beat a randomly chosen alternative in somewhat more than half of the comparisons. Where a probability or a share rounds to zero, we give the number of comparisons or runs behind it, since the true value is then known only to be smaller than that resolution.</w:t>
       </w:r>
     </w:p>
     <w:p>
@@ -1658,7 +1644,7 @@
         <w:pStyle w:val="BodyText"/>
       </w:pPr>
       <w:r>
-        <w:t xml:space="preserve">In contrast, the copying model is a simulator with no likelihood we can write down, and we use it in two ways. As a predictive check, we run it repeatedly at a fixed, calibrated combination of population size, innovation rate, and mixing rate, compute on each simulated dataset the same statistic computed on the record, and report the median and 95 percent range (the 2.5th to 97.5th percentiles) of the simulated values together with the share of runs reaching the observed value</w:t>
+        <w:t xml:space="preserve">In contrast, the copying model is a simulator with no likelihood we can write down. We use it in two ways. As a predictive check, we run it repeatedly at a fixed, calibrated combination of population size, innovation rate, and mixing rate, compute on each simulated dataset the same statistic computed on the record, and report the median and 95 percent range (the 2.5th to 97.5th percentiles) of the simulated values together with the share of runs reaching the observed value</w:t>
       </w:r>
       <w:r>
         <w:t xml:space="preserve"> </w:t>
@@ -1667,7 +1653,7 @@
         <w:t xml:space="preserve">(Gelman et al. 1996)</w:t>
       </w:r>
       <w:r>
-        <w:t xml:space="preserve">. A small share says that the model rarely produces what the record shows. It measures fit and is not compared with a threshold. Because the parameters are fixed at calibrated values rather than drawn from a posterior, the check carries no uncertainty about them. We address this by repeating the key comparisons at the six most favorable calibrated combinations. A 95 percent range and a 95 percent credible interval should not be confused: the first describes how much a statistic varies under a model, whereas the second describes a quantity of the record. The second use of the simulator is approximate Bayesian computation over the 16 settings of the bounded-groups model</w:t>
+        <w:t xml:space="preserve">. A small share says that the model rarely produces what the record shows. It measures fit and is not compared with a threshold. Because the parameters are fixed at calibrated values rather than drawn from a posterior, the check carries no uncertainty about them. We address this by repeating the key comparisons at the six most favorable calibrated combinations. A 95 percent range and a 95 percent credible interval should not be confused. The first describes how much a statistic varies under a model, whereas the second describes a record quantity. The second use of the simulator is approximate Bayesian computation over the 16 settings of the bounded-groups model</w:t>
       </w:r>
       <w:r>
         <w:t xml:space="preserve"> </w:t>
@@ -1712,7 +1698,7 @@
         <w:pStyle w:val="FirstParagraph"/>
       </w:pPr>
       <w:r>
-        <w:t xml:space="preserve">Neutral copying on the real map accounts for most of what the basin’s decorated-type frequencies show. Tuning the model to the record’s diversity matched 51 of the 297 combinations on the six-run screen, and 48 still matched when rerun fifty times (Supplemental Text, Figure S7). At the matched combination most favorable to it (2,000 learners per node, an innovation rate of 0.001, and a mixing rate of 0.02), copying with no groups reproduces the fading of similarity with distance (observed correlation of similarity with distance along the rivers -0.20, against a simulated 95 percent range of -0.48 to +0.04) and the difference between the two spatial clusters the site layout supports (Table 1).</w:t>
+        <w:t xml:space="preserve">Neutral copying on the real map accounts for most of what the basin’s decorated-type frequencies show. Tuning the model to the record’s diversity matched 51 of the 297 combinations on the six-run screen, and 48 still matched when rerun fifty times (Supplemental Text, Figure S7). At the matched combination most favorable to it (2,000 learners per node, an innovation rate of 0.001, and a mixing rate of 0.02), copying with no groups reproduces the decreasing pattern of similarity with distance (observed correlation of similarity with distance along the rivers -0.20, against a simulated 95 percent range of -0.48 to +0.04) and the difference between the two spatial clusters the site layout supports (Table 1).</w:t>
       </w:r>
     </w:p>
     <w:p>
@@ -1720,7 +1706,7 @@
         <w:pStyle w:val="BodyText"/>
       </w:pPr>
       <w:r>
-        <w:t xml:space="preserve">A model with no divisions at all describes the record adequately. On the logit scale of its latent class probabilities, it assigns 98.7 percent of the variance among assemblages to the spatial surface (posterior median; 95 percent credible interval 95.4 to 100 percent) and little to independent site deviations, and it reproduces the observed between-cluster</w:t>
+        <w:t xml:space="preserve">A model with no divisions at all describes the record adequately. On the logit scale of its latent class probabilities, it assigns 98.7 percent of the variance among assemblages to the spatial surface (posterior median; 95 percent credible interval 95.4 to 100 percent) and little to independent site deviations. It reproduces the observed between-cluster</w:t>
       </w:r>
       <w:r>
         <w:t xml:space="preserve"> </w:t>
@@ -1790,7 +1776,7 @@
         <w:t xml:space="preserve"> </w:t>
       </w:r>
       <w:r>
-        <w:t xml:space="preserve">against the neutral copying model, which contains no groups. Model values are the median and 95 percent range over 300 runs at the matched combination most favorable to the model. The last column gives the share of runs reaching the observed value there and, in parentheses, the range of that share across the six most favorable combinations that passed the confirmation. Radius is the root-mean-square distance from an assemblage to its group’s center. A share of 0 percent means none of the 300 runs; a frequency below about 0.3 percent is not an impossibility. Divisions finer than four clusters are reported in the Supplemental Text; from eight clusters on, at least one cluster holds a single assemblage.</w:t>
+        <w:t xml:space="preserve">against the neutral copying model, which contains no groups. Model values are the median and 95 percent range over 300 runs at the matched combination most favorable to the model. The last column gives the share of runs reaching the observed value there and, in parentheses, the range of that share across the six most favorable combinations that passed the confirmation. Radius is the root-mean-square distance from an assemblage to its group’s center. A share of 0 percent means none of the 300 runs. A frequency below about 0.3 percent is possible. Divisions finer than four clusters are reported in the Supplemental Text. Drom eight clusters on, at least one cluster holds a single assemblage.</w:t>
       </w:r>
     </w:p>
     <w:tbl>
@@ -2172,7 +2158,7 @@
         <w:pStyle w:val="BodyText"/>
       </w:pPr>
       <w:r>
-        <w:t xml:space="preserve">The model does not account for everything. Between phases, it matches the observed difference in 1 percent of runs at the most favorable combination and in 0 to 3 percent across the six, and at three and four spatial clusters it matches the observed value in 0 to 2 percent of runs at each of the six (Table 1). The assemblages vary over shorter distances than calibrated copying does. The step in similarity across the phase lines also exceeds the model. The boundary excess is +7.7, against a simulated median of +1.2 (95 percent range -3.3 to +6.7), and 1 percent of 300 runs reach it. This additional variation is not due to sampling. Redrawing every assemblage from the basin’s pooled profile at its own sherd count gives between-cluster differences near zero (Supplemental Text).</w:t>
+        <w:t xml:space="preserve">The model does not account for everything. Between phases, it matches the observed difference in 1 percent of runs at the most favorable combination and in 0 to 3 percent across the six. At three and four spatial clusters, it matches the observed value in 0 to 2 percent of runs at each of the six (Table 1). The assemblages vary over shorter distances than calibrated copying does. The step in similarity across the phase lines also exceeds the model. The boundary excess is +7.7, against a simulated median of +1.2 (95 percent range -3.3 to +6.7), and 1 percent of 300 runs reach it. This additional variation is not due to sampling. Redrawing every assemblage from the basin’s pooled profile at its own sherd count gives between-cluster differences near zero (Supplemental Text).</w:t>
       </w:r>
     </w:p>
     <w:p>
@@ -2180,7 +2166,7 @@
         <w:pStyle w:val="BodyText"/>
       </w:pPr>
       <w:r>
-        <w:t xml:space="preserve">The next section asks whether that additional variation follows the phase lines. What produces it is a separate question, and the model can narrow it without settling it (Table 2). We relaxed four model simplifications one at a time at the calibrated combination, and evaluated every variant, including the baseline, by the same three criteria: whether its median reaches the observation, how often its runs reach it, and whether the record’s diversity stays matched (Supplemental Text). No variant that keeps diversity matched brings its median up to the observed four-cluster value, and one reaches the three-cluster value only at its strongest setting. Among the variants that keep diversity matched, two raise the share of runs reaching those values, one markedly and one slightly, and the others leave it within two points of the baseline. Letting new styles arise somewhat locally, each of the two spatial clusters drawing its new variants from a slightly different version of the regional profile, raises it from 2 and 1 percent in baseline runs with the same seeds to 44 and 41 percent when a quarter of the classes are reordered (300 runs each); with the phases as the areas and a fifth of the classes reordered, 30 percent of runs reach the observed between-phase value (the grid that treats the phases as groups; Supplemental Text). Copying that falls off over a short straight-line distance (6 km) raises it to 7 and 5 percent. Unequal site populations and shorter fall-off along the rivers raise it further but break the diversity match; not recalibrated, they are unsupported rather than excluded. These runs do not resolve the grain of local innovation. The settings that fit use areas the size of half the basin (the two clusters, 16.6 km in radius; Table 1). With five or eight neighborhoods of sites as the areas, runs reach the three- and four-cluster values in 13 to 30 percent of cases but break the diversity match, so those settings are unsupported at this calibration. With each site drawing its own new variants, runs reach those values no more often than the baseline does: 2 and 0 percent at the one strength that keeps diversity matched, a small dose that changes the profile of only 15 percent of sites, and 2 and 1 percent at a dose comparable to the weakest two-cluster setting, where the diversity match breaks (Supplemental Text). None of these variants restricts who copies whom, and the test cannot tell whether local innovation followed the phases or any other division of the basin.</w:t>
+        <w:t xml:space="preserve">We also asked whether that small amount of additional variation follows the phase boundaries. What produces it is a separate question, and we asked the model what could. We changed the model in two kinds of ways and checked whether each made the observed differences more common while still matching the record’s diversity (Table 2).</w:t>
       </w:r>
     </w:p>
     <w:p>
@@ -2188,7 +2174,15 @@
         <w:pStyle w:val="BodyText"/>
       </w:pPr>
       <w:r>
-        <w:t xml:space="preserve">Restricting copying across the phase lines, the property that would make the phases groups, also increases both statistics. With copying across the lines cut to 3 percent of its strength, 22 percent of runs reach the observed between-phase</w:t>
+        <w:t xml:space="preserve">The first kind keeps copying unrestricted. Of four such changes, two helped. Letting new styles arise somewhat locally, with each half of the basin drawing its new variants from a slightly different version of the regional profile, raised the share of runs reaching the observed three- and four-cluster values from 2 and 1 percent to 44 and 41 percent. Letting copying fall off over a short straight-line distance (6 km) raised it slightly, to 7 and 5 percent. Unequal site populations and shorter fall-off along the rivers raised it further, but only by breaking the match to diversity. The runs do not show at what scale local innovation operates (Supplemental Text).</w:t>
+      </w:r>
+    </w:p>
+    <w:p>
+      <w:pPr>
+        <w:pStyle w:val="BodyText"/>
+      </w:pPr>
+      <w:r>
+        <w:t xml:space="preserve">The second kind restricts copying across the phase boundaries, the property that would make the phases groups. This also helped. With copying across the lines cut to 3 percent of its strength, 22 percent of runs reach the observed between-phase</w:t>
       </w:r>
       <w:r>
         <w:t xml:space="preserve"> </w:t>
@@ -2214,7 +2208,7 @@
         <w:t xml:space="preserve"> </w:t>
       </w:r>
       <w:r>
-        <w:t xml:space="preserve">and 38 percent reach the observed step at the lines. The copying model, however, cannot distinguish the two. The posterior probability of a copying boundary at the phase lines is 0.75, the same as its prior. On simulated records with a built-in boundary, the same procedure returns a median of 0.79 to 0.94 (40 test records per setting), and on records without one, a median of 0.66. The record’s value falls between the two and has not moved from the prior, so the model neither supports nor excludes a boundary. Three arbitrary divisions with the phases’ group sizes, run through the same analysis, give 0.70 to 0.85. The comparisons of where the lines fall, taken up next, bear more directly on the question, although they too discriminate only moderately.</w:t>
+        <w:t xml:space="preserve">and 38 percent reach the observed step at the lines.</w:t>
       </w:r>
     </w:p>
     <w:p>
@@ -2222,17 +2216,15 @@
         <w:pStyle w:val="BodyText"/>
       </w:pPr>
       <w:r>
-        <w:rPr>
-          <w:b/>
-          <w:bCs/>
-        </w:rPr>
-        <w:t xml:space="preserve">Table 2.</w:t>
-      </w:r>
-      <w:r>
-        <w:t xml:space="preserve"> </w:t>
-      </w:r>
-      <w:r>
-        <w:t xml:space="preserve">The accounts of the basin’s decorated-type frequencies tested here, what each predicts, and how it fared. Every copying-model account is read on the same three criteria: whether its median between-group</w:t>
+        <w:t xml:space="preserve">The model cannot distinguish between these two explanations. Three-quarters of the settings we compared include a restriction at the phase lines, so the probability of a restriction starts at 0.75 and remains 0.75 after comparison with the record. The same procedure returns 0.79 to 0.94 on simulated records built with a restriction and 0.66 on records built without one, and 0.70 to 0.85 when arbitrary divisions with the phases’ group sizes stand in for the phases. The record’s value falls among these. The additional variation can therefore be produced with or without bounded groups, and this comparison neither supports nor excludes a boundary at the phase lines. The tests of where the lines fall, taken up next, bear more directly on the question, although they too discriminate only moderately.</w:t>
+      </w:r>
+    </w:p>
+    <w:p>
+      <w:pPr>
+        <w:pStyle w:val="BodyText"/>
+      </w:pPr>
+      <w:r>
+        <w:t xml:space="preserve">Table 2. The explanations of the basin’s decorated-type frequencies tested here, what each predicts, and how it fared. We judge each version of the copying model by whether its runs reach the observed between-group</w:t>
       </w:r>
       <w:r>
         <w:t xml:space="preserve"> </w:t>
@@ -2258,7 +2250,7 @@
         <w:t xml:space="preserve"> </w:t>
       </w:r>
       <w:r>
-        <w:t xml:space="preserve">reaches the observed value, the share of its runs reaching the observed value (predictive coverage), and whether it keeps all three within-assemblage diversity summaries within 10 percent of the observed values. Shares for the relaxations are from 300 runs at the calibrated combination, scored at three and four spatial clusters, where the baseline falls short; the baseline row gives the range across the six leading combinations (Table 1), and the same seeds as the relaxations give 2 and 1 percent. Relaxations are one at a time and not recalibrated. Full grids and diagnostics are in the Supplemental Text.</w:t>
+        <w:t xml:space="preserve">at three and four clusters and whether it keeps the record’s within-assemblage diversity (within 10 percent on all three summaries). Shares are from 300 runs at the calibrated combination; the baseline row gives the range across the six leading combinations (Table 1). Each change is made alone, and the model is not recalibrated. The full results are in the Supplemental Text.</w:t>
       </w:r>
     </w:p>
     <w:tbl>
@@ -2654,13 +2646,13 @@
       </w:tr>
     </w:tbl>
     <w:bookmarkEnd w:id="126"/>
-    <w:bookmarkStart w:id="142" w:name="where-the-phase-lines-fall"/>
+    <w:bookmarkStart w:id="142" w:name="where-the-phase-boundaries-fall"/>
     <w:p>
       <w:pPr>
         <w:pStyle w:val="Heading3"/>
       </w:pPr>
       <w:r>
-        <w:t xml:space="preserve">Where the phase lines fall</w:t>
+        <w:t xml:space="preserve">Where the phase boundaries fall</w:t>
       </w:r>
     </w:p>
     <w:p>
@@ -2668,7 +2660,7 @@
         <w:pStyle w:val="FirstParagraph"/>
       </w:pPr>
       <w:r>
-        <w:t xml:space="preserve">If the phases marked restrictions on copying, their lines should separate the assemblages better than other lines and fall where composition changes fastest. On the first, the comparison is close to even. On the second, the lines fall where composition changes slowly.</w:t>
+        <w:t xml:space="preserve">If the phases marked restrictions on copying, their boundaries should separate the assemblages better than other lines and fall where composition changes fastest. On the first, the comparison is close to even. On the second, the delineations fall where composition changes slowly.</w:t>
       </w:r>
     </w:p>
     <w:p>
@@ -2676,7 +2668,7 @@
         <w:pStyle w:val="BodyText"/>
       </w:pPr>
       <w:r>
-        <w:t xml:space="preserve">The phase lines separate the assemblages about as well as alternative divisions of the same sites. With the uncertainty in every assemblage’s counts carried through, the between-phase</w:t>
+        <w:t xml:space="preserve">The phase boundaries separate the assemblages about as well as alternative divisions of the same sites. With the uncertainty in every assemblage’s counts carried through, the between-phase</w:t>
       </w:r>
       <w:r>
         <w:t xml:space="preserve"> </w:t>
@@ -2702,7 +2694,7 @@
         <w:t xml:space="preserve"> </w:t>
       </w:r>
       <w:r>
-        <w:t xml:space="preserve">has a posterior median of 0.0121 (95 percent credible interval 0.0101 to 0.0144). Divisions of the same assemblages into groups of the same sizes around randomly placed centers give a median of 0.0112, and divisions drawn to be as compact as possible give 0.0103. The posterior probability that the phase lines separate the assemblages better than a division around random centers is 0.57, and better than a compact division is 0.72 (Figure 3B, C). The similarity step at the lines gives the same answer. The boundary excess at the phase lines has a posterior median of +7.3 (95 percent credible interval +4.6 to +9.8), and its direct value of +7.7 lies above the copying model’s range, but arbitrary divisions of the map show a similar step, with a median of +6.3 for divisions of both kinds, and the posterior probability that the phase lines show more is 0.58 and 0.65. On both measures the phase lines do somewhat better than the alternatives, by margins that leave the comparison open. The shorter-range variation the copying model misses is a property of the basin’s assemblages, however they are divided, and the phase lines capture about as much of it as other lines do.</w:t>
+        <w:t xml:space="preserve">has a posterior median of 0.0121 (95 percent credible interval 0.0101 to 0.0144). Divisions of the same assemblages into groups of the same sizes around randomly placed centers give a median of 0.0112, and divisions drawn to be as compact as possible give 0.0103. The posterior probability that the phase lines separate the assemblages better than a division around random centers is 0.57, and better than a compact division is 0.72 (Figure 3B, C). The similarity step at the lines gives the same answer. The boundary excess at the phase lines has a posterior median of +7.3 (95 percent credible interval +4.6 to +9.8), and its direct value of +7.7 lies above the copying model’s range, but arbitrary divisions of the map show a similar step, with a median of +6.3 for divisions of both kinds, and the posterior probability that the phase lines show more is 0.58 and 0.65. On both measures, the phase lines do somewhat better than the alternatives, by margins that leave the comparison open. The shorter-range variation the copying model misses is a property of the basin’s assemblages. However, they are divided, and the phase lines capture about as much of it as other lines do.</w:t>
       </w:r>
     </w:p>
     <w:p>
@@ -2869,7 +2861,7 @@
         <w:pStyle w:val="BodyText"/>
       </w:pPr>
       <w:r>
-        <w:t xml:space="preserve">At smoothing scales near the site spacing, the reconstructed phase boundaries run through areas where composition changes slowly. These boundaries are our reconstruction. Every point on the map goes to its nearest analyzed assemblage, those areas are merged by phase, and the boundaries are the edges where two phases meet. They are not the outlines of Figure 1, which leave unassigned ground between the phase areas. Mapping the local rate at which composition changes across the basin with a 15 km bandwidth (Figure 4A), an edge between communities should appear as a ridge of fast change. The reconstructed boundaries do not follow ridges. Median change along them is 0.0103 per kilometer, against 0.0117 along boundaries built the same way from 200 same-size divisions around randomly placed centers, which places them at the 8th percentile of those divisions (Figure 4B). The ranking is low at 10 to 15 km but not at 20 to 30 km, where the reconstructed boundaries sit at the 40th to 46th percentiles, and on this sampling geometry it discriminates weakly. On the coarser grid used for the simulations, where the real boundaries sit at the 7.5th percentile, a score that low occurs in 12 percent of records simulated without a restriction and 3 percent with copying across the lines cut to 3 percent (Supplemental Text). The turnover map therefore describes where composition changes and adds little independent weight against a boundary.</w:t>
+        <w:t xml:space="preserve">At smoothing scales near the site spacing, the reconstructed phase boundaries run through areas where composition changes slowly. These boundaries are our reconstruction. Each point on the map is assigned to its nearest analyzed assemblage. We merge areas by phase, and the boundaries are the edges where two phases meet. They are not the outlines of Figure 1, which leave unassigned ground between the phase areas. Mapping the local rate at which composition changes across the basin with a 15 km bandwidth (Figure 4A), an edge between communities should appear as a ridge of fast change. The reconstructed boundaries do not follow ridges. Median change along them is 0.0103 per kilometer, compared with 0.0117 along boundaries built the same way from 200 same-size divisions around randomly placed centers, placing them at the 8th percentile of those divisions (Figure 4B). The ranking is low at 10 to 15 km but not at 20 to 30 km, where the reconstructed boundaries sit at the 40th to 46th percentiles, and on this sampling geometry it discriminates weakly. On the coarser grid used for the simulations, where the real boundaries sit at the 7.5th percentile, a score that low occurs in 12 percent of records simulated without a restriction and 3 percent with copying across the lines cut to 3 percent (Supplemental Text). The turnover map therefore describes where composition changes and adds little independent weight against a boundary.</w:t>
       </w:r>
     </w:p>
     <w:p>
@@ -2881,7 +2873,7 @@
           <wp:inline>
             <wp:extent cx="5334000" cy="2877949"/>
             <wp:effectExtent b="0" l="0" r="0" t="0"/>
-            <wp:docPr descr="Figure 4. Composition as a continuous surface. (A) The local rate of change in the ten decorated-class proportions, computed on a 220 by 220 grid with a 15 km Gaussian bandwidth and masked where fewer than two assemblages support the estimate. Circles are assemblages. (B) The same surface with the reconstructed phase boundaries overlaid: the edges between territories built by giving every point on the map to its nearest analyzed assemblage and merging those areas by phase. At this bandwidth, the rate of change along them sits at the 8th percentile of the boundaries of 200 same-size divisions around randomly placed centers; the ranking is low at 10 to 15 km but not at 20 to 30 km (Supplemental Text). (C) Observed cultural F_{ST} against cluster radius in kilometers, with the neutral copying model’s range behind it, from coarse to fine. The observed value lies inside the range at a 17 km radius and above it from 13 km. Below a radius of about 6 km, the clusters begin to isolate single assemblages, so the finest divisions should not be read as structure." title="" id="131" name="Picture"/>
+            <wp:docPr descr="Figure 4. Composition as a continuous surface. (A) The local rate of change in the ten decorated-class proportions, computed on a 220 by 220 grid with a 15 km Gaussian bandwidth and masked where fewer than two assemblages support the estimate. Circles are assemblages. (B) The same surface with reconstructed phase boundaries overlaid: edges between territories built by assigning each point on the map to its nearest analyzed assemblage and merging those areas by phase. At this bandwidth, the rate of change along them sits at the 8th percentile of the boundaries of 200 same-size divisions around randomly placed centers; the ranking is low at 10 to 15 km but not at 20 to 30 km (Supplemental Text). (C) Observed cultural F_{ST} against cluster radius in kilometers, with the neutral copying model’s range behind it, from coarse to fine. The observed value lies inside the range at a 17 km radius and above it from 13 km. Below a radius of about 6 km, the clusters begin to isolate single assemblages, so the finest divisions should not be read as structure." title="" id="131" name="Picture"/>
             <a:graphic>
               <a:graphicData uri="http://schemas.openxmlformats.org/drawingml/2006/picture">
                 <pic:pic>
@@ -2934,7 +2926,7 @@
         <w:t xml:space="preserve"> </w:t>
       </w:r>
       <w:r>
-        <w:t xml:space="preserve">Composition as a continuous surface. (A) The local rate of change in the ten decorated-class proportions, computed on a 220 by 220 grid with a 15 km Gaussian bandwidth and masked where fewer than two assemblages support the estimate. Circles are assemblages. (B) The same surface with the reconstructed phase boundaries overlaid: the edges between territories built by giving every point on the map to its nearest analyzed assemblage and merging those areas by phase. At this bandwidth, the rate of change along them sits at the 8th percentile of the boundaries of 200 same-size divisions around randomly placed centers; the ranking is low at 10 to 15 km but not at 20 to 30 km (Supplemental Text). (C) Observed cultural</w:t>
+        <w:t xml:space="preserve">Composition as a continuous surface. (A) The local rate of change in the ten decorated-class proportions, computed on a 220 by 220 grid with a 15 km Gaussian bandwidth and masked where fewer than two assemblages support the estimate. Circles are assemblages. (B) The same surface with reconstructed phase boundaries overlaid: edges between territories built by assigning each point on the map to its nearest analyzed assemblage and merging those areas by phase. At this bandwidth, the rate of change along them sits at the 8th percentile of the boundaries of 200 same-size divisions around randomly placed centers; the ranking is low at 10 to 15 km but not at 20 to 30 km (Supplemental Text). (C) Observed cultural</w:t>
       </w:r>
       <w:r>
         <w:t xml:space="preserve"> </w:t>
@@ -2968,7 +2960,7 @@
         <w:pStyle w:val="BodyText"/>
       </w:pPr>
       <w:r>
-        <w:t xml:space="preserve">Clustered hierarchically, location recovers the phases for all but two assemblages. Clustering the assemblages on their coordinates alone by Ward linkage agrees with the phase assignments at an adjusted Rand index of 0.740, and the only assemblages it places with another phase are Big Eddy and Castile Landing, the two in the narrow southern arm of Phillips’s Parkin area, which it groups with Kent.</w:t>
+        <w:t xml:space="preserve">Hierarchical clustering by location recovers the phases for all but two assemblages. Clustering the assemblages on their coordinates alone by Ward linkage agrees with the phase assignments at an adjusted Rand index of 0.740, and the only assemblages it places with another phase are Big Eddy and Castile Landing, the two in the narrow southern arm of Phillips’s Parkin area, which it groups with Kent.</w:t>
       </w:r>
       <w:r>
         <w:t xml:space="preserve"> </w:t>
@@ -3074,7 +3066,7 @@
         <w:pStyle w:val="BodyText"/>
       </w:pPr>
       <w:r>
-        <w:t xml:space="preserve">Most assemblages fit their own phase, and some fit two. We compared each assemblage’s decorated-class profile with the pooled profile of each phase, leaving the assemblage out of its own phase’s pool. Of the 28, 22 are closest to their own phase with a posterior probability above 0.75. Four are closer to another phase: Big Eddy, Holden Lake, and Turnbow to Kent, and Belle Meade to Parkin. Two are not clearly placed, with probabilities of 0.60 and 0.40 for their own phase: Castile Landing, nearly as close to Kent as to its own Parkin, and Mound Place, slightly closer to both Kent and Parkin than to its own Walls (Supplemental Text). Castile Landing shows how a line through this record can be drawn either way. It lies 12 km from the nearest Kent assemblage and 16 km from the nearest Parkin assemblage, and its pottery is nearly as close to Kent as to Parkin.</w:t>
+        <w:t xml:space="preserve">Most assemblages fit their own phase, and some fit two. We compared each assemblage’s decorated-class profile with the pooled profile of each phase, excluding the assemblage from its own phase’s pool. Of the 28, 22 are closest to their own phase with a posterior probability above 0.75. Four are closer to another phase: Big Eddy, Holden Lake, and Turnbow to Kent, and Belle Meade to Parkin. Two are not clearly placed, with probabilities of 0.60 and 0.40 for their own phase: Castile Landing, nearly as close to Kent as to its own Parkin, and Mound Place, slightly closer to both Kent and Parkin than to its own Walls (Supplemental Text). Castile Landing shows how a line through this record can be drawn either way. It lies 12 km from the nearest Kent assemblage and 16 km from the nearest Parkin assemblage, and its pottery is nearly as close to Kent as to Parkin.</w:t>
       </w:r>
     </w:p>
     <w:p>
@@ -3082,7 +3074,7 @@
         <w:pStyle w:val="BodyText"/>
       </w:pPr>
       <w:r>
-        <w:t xml:space="preserve">Under Ward linkage, assemblages made by copying with no groups sort into the phases about as readily as the real assemblages when composition is given a quarter of location’s weight or less, and less readily at equal weight and on composition alone. We ran the copying model on the real site map 300 times, sampled its type frequencies using the assemblage sherd counts, and clustered each simulated record the same way as the real one (Figure 6). Under Ward linkage, with a quarter weight on assemblage composition, the simulated records agree with the phases at a median of 0.740, the real record’s value, and 68 percent of them reach it. At half weight, 36 percent do. At equal weight, the simulated median falls to 0.487, and 6 percent reach the real 0.740. The decline is not steady: at twice the coordinates’ weight, the real record’s own agreement falls to 0.454, and 46 percent of simulated records reach it. Based on type frequencies alone, the real record’s agreement of 0.358 lies near the top of the simulated range (median 0.098, 95 percent range -0.045 to 0.416), and 6 percent of simulated records reach it.</w:t>
+        <w:t xml:space="preserve">Under Ward linkage, assemblages made by copying with no groups sort into the phases about as readily as the real assemblages when composition is given a quarter of location’s weight or less, and less readily at equal weight and on composition alone. We ran the copying model on the real site map 300 times, sampled its type frequencies using the assemblage sherd counts, and clustered each simulated record the same way as the real one (Figure 6). Under Ward linkage, with a quarter weight on assemblage composition, the simulated records match the phases at a median of 0.740, the real record’s value, and 68 percent reach it. At half weight, 36 percent do. At equal weight, the simulated median falls to 0.487, and 6 percent reach the real 0.740. The decline is not steady: at twice the coordinates’ weight, the real record’s own agreement falls to 0.454, and 46 percent of simulated records reach it. Based on type frequencies alone, the real record’s agreement of 0.358 lies near the top of the simulated range (median 0.098, 95 percent range -0.045 to 0.416), and 6 percent of simulated records reach it.</w:t>
       </w:r>
       <w:r>
         <w:t xml:space="preserve"> </w:t>
@@ -3093,7 +3085,7 @@
         </m:r>
       </m:oMath>
       <w:r>
-        <w:t xml:space="preserve">-means gives the same result at equal weight and on composition alone (6 and 5 percent). At a quarter weight it shows a wider gap (13 percent), because in the real record the pottery corrects the division</w:t>
+        <w:t xml:space="preserve">-means gives the same result at equal weight and on composition alone (6 and 5 percent). At a quarter weight, it shows a wider gap (13 percent), because in the real record the pottery corrects the division</w:t>
       </w:r>
       <w:r>
         <w:t xml:space="preserve"> </w:t>
@@ -3113,7 +3105,7 @@
         <w:t xml:space="preserve">(Mainfort 2003:177)</w:t>
       </w:r>
       <w:r>
-        <w:t xml:space="preserve">, so the frequencies that defined a phase recover it better than frequencies that did not, and the comparison cannot show that the structure marks a restriction on copying.</w:t>
+        <w:t xml:space="preserve">, so the frequencies that defined a phase recover it better than frequencies that did not, and the comparison cannot show that the structure restricts copying.</w:t>
       </w:r>
     </w:p>
     <w:p>
@@ -3125,7 +3117,7 @@
           <wp:inline>
             <wp:extent cx="5334000" cy="2837043"/>
             <wp:effectExtent b="0" l="0" r="0" t="0"/>
-            <wp:docPr descr="Figure 6. Would a culture historian have found these phases in ceramic assemblages made by copying with no groups? Agreement with the phase assignments, by adjusted Rand index over the 26 assemblages inside a phase area, as the weight on decorated-class composition relative to site coordinates varies from the map alone to assemblage type frequencies alone. Assemblages are clustered by k-means (A; the median over 10 seeds) and by Ward linkage (B). The line with markers is the real record; the dashed line is the median and the band the 95 percent range over 300 runs of the neutral copying model, which contains no groups, sampled at the real sherd counts and clustered the same way. The zero-weight point is identical by construction." title="" id="137" name="Picture"/>
+            <wp:docPr descr="Figure 6. Would a culture historian have found these phases in ceramic assemblages made by copying with no groups? Agreement with the phase assignments, by adjusted Rand index over the 26 assemblages within a phase area, as the weight on decorated-class composition relative to site coordinates varies from the map alone to assemblage-type frequencies alone. Assemblages are clustered by k-means (A; the median over 10 seeds) and by Ward linkage (B). The line with markers is the real record; the dashed line is the median and the band is the 95 percent range over 300 runs of the neutral copying model, which contains no groups, sampled at the real sherd counts and clustered the same way. The zero-weight point is identical by construction." title="" id="137" name="Picture"/>
             <a:graphic>
               <a:graphicData uri="http://schemas.openxmlformats.org/drawingml/2006/picture">
                 <pic:pic>
@@ -3178,7 +3170,7 @@
         <w:t xml:space="preserve"> </w:t>
       </w:r>
       <w:r>
-        <w:t xml:space="preserve">Would a culture historian have found these phases in ceramic assemblages made by copying with no groups? Agreement with the phase assignments, by adjusted Rand index over the 26 assemblages inside a phase area, as the weight on decorated-class composition relative to site coordinates varies from the map alone to assemblage type frequencies alone. Assemblages are clustered by</w:t>
+        <w:t xml:space="preserve">Would a culture historian have found these phases in ceramic assemblages made by copying with no groups? Agreement with the phase assignments, by adjusted Rand index over the 26 assemblages within a phase area, as the weight on decorated-class composition relative to site coordinates varies from the map alone to assemblage-type frequencies alone. Assemblages are clustered by</w:t>
       </w:r>
       <w:r>
         <w:t xml:space="preserve"> </w:t>
@@ -3189,7 +3181,7 @@
         </m:r>
       </m:oMath>
       <w:r>
-        <w:t xml:space="preserve">-means (A; the median over 10 seeds) and by Ward linkage (B). The line with markers is the real record; the dashed line is the median and the band the 95 percent range over 300 runs of the neutral copying model, which contains no groups, sampled at the real sherd counts and clustered the same way. The zero-weight point is identical by construction.</w:t>
+        <w:t xml:space="preserve">-means (A; the median over 10 seeds) and by Ward linkage (B). The line with markers is the real record; the dashed line is the median and the band is the 95 percent range over 300 runs of the neutral copying model, which contains no groups, sampled at the real sherd counts and clustered the same way. The zero-weight point is identical by construction.</w:t>
       </w:r>
     </w:p>
     <w:p>
@@ -3197,7 +3189,16 @@
         <w:pStyle w:val="BodyText"/>
       </w:pPr>
       <w:r>
-        <w:t xml:space="preserve">The phase lines run through sparsely settled country. The settlement compilation records 81 sites with a late pre-contact component in the mapped area, and dropping the 28 within a kilometer of an analyzed assemblage leaves 53 whose positions are independent of the analyzed locations. Measured at a 5 km scale, 94 percent of same-size divisions around random centers and 100 percent of compact ones run through denser late-period settlement than the phase lines do (Figure 7), and the result is similar at the other two scales tested, 98 and 100 percent at 3 km and 89 and 86 percent at 8 km. The clumps the phases gather are clumps of settlement with less-occupied land between them. Rivers partly explain settlement clumping. Late-period sites lie a median 1.7 km from a major river, against 3.4 km for random points in the same area, but points placed as close to the rivers as the sites are come out randomly spaced (Clark-Evans ratio 0.98 against the sites’ 0.67). Assemblage clumps form on particular reaches of riverways for reasons proximity alone does not explain.</w:t>
+        <w:t xml:space="preserve">The phase boundaries run through sparsely settled country. The settlement compilation records 81 sites with a late pre-contact component in the mapped area, and dropping the 28 within a kilometer of an analyzed assemblage leaves 53 whose positions are independent of the analyzed locations. Measured at a 5 km scale, 94 percent of same-size divisions around random centers and 100 percent of compact ones run through denser late-period settlement than the phase lines do (Figure 7), and the result is similar at the other two scales tested, 98 and 100 percent at 3 km and 89 and 86 percent at 8 km. The clumps the phases gather are settlement clumps with less-occupied land between them. Waterways explain little of that clumping. Late-period sites lie nearer the larger rivers than random points in the same area do, a median of 2.0 km against 3.8 km from streams with a mean discharge of at least 10 m</w:t>
+      </w:r>
+      <w:r>
+        <w:rPr>
+          <w:vertAlign w:val="superscript"/>
+        </w:rPr>
+        <w:t xml:space="preserve">3</w:t>
+      </w:r>
+      <w:r>
+        <w:t xml:space="preserve">/s. Small streams are so common on this floodplain, however, that almost every location is near one. When every mapped stream is counted, sites lie a median of 0.76 km from water and random points 0.93 km. Random points placed as close to the streams as the sites are come out randomly spaced (Clark-Evans ratio 1.04, against the sites’ 0.67). Settlement therefore clumps on particular stretches of the floodplain for reasons that nearness to water does not explain. The stream network is modern and leaves out the oxbow lakes and abandoned channels after which many of these sites are named (Supplemental Text).</w:t>
       </w:r>
     </w:p>
     <w:p>
@@ -3280,7 +3281,7 @@
         <w:pStyle w:val="FirstParagraph"/>
       </w:pPr>
       <w:r>
-        <w:t xml:space="preserve">The Parkin phase is close to the northern of the two spatial clusters the site layout supports, although the two divisions are no longer the same one (adjusted Rand index 0.857). Its difference from the rest of the basin is a cultural</w:t>
+        <w:t xml:space="preserve">The Parkin phase is close to the northern of the two spatial clusters the site layout supports, although the two divisions are no longer the same (adjusted Rand index 0.857). Its difference from the rest of the basin is a cultural</w:t>
       </w:r>
       <w:r>
         <w:t xml:space="preserve"> </w:t>
@@ -3363,7 +3364,7 @@
         <w:t xml:space="preserve"> </w:t>
       </w:r>
       <w:r>
-        <w:t xml:space="preserve">has a posterior median of 0.0066 (95 percent credible interval 0.0052 to 0.0083), compared with 0.0062 for same-size divisions around random centers and 0.0057 for compact ones. The posterior probability that the Parkin line separates the assemblages better is 0.52 against divisions around random centers and 0.94 against compact ones. The step in similarity across the Parkin line, a boundary excess of +5.7 (posterior median +5.9, 95 percent credible interval +3.5 to +8.3), lies within what copying alone produces (simulated median 0.0, 95 percent range -3.9 to +5.9; 3 percent of 300 runs reach it), and arbitrary lines drawn across this map show the same step. The posterior median is also +5.9 for divisions of both kinds, and the posterior probability that the Parkin line shows more is 0.43 and 0.49. The assemblage composition sets the Parkin phase apart from its neighbors about as much as it sets apart a comparably sized piece of the basin around a random center, and more than the compact two-way divisions do. This comparison has little power for a single line, however. In simulations with copying across the phase lines, the Parkin phase’s edge among them, cut to 3 percent, the Parkin line beats a median 72 percent of random-center divisions, against 58 percent with no restriction, and a score as low as the real one (58 percent) occurs in 23 and 52 percent of simulated records. The compact two-way divisions are few and similar, so the comparison with them carries less weight (Supplemental Text). The record therefore cannot exclude restricted copying at the edge of the Parkin phase. However, the assemblage composition shows nothing that requires it.</w:t>
+        <w:t xml:space="preserve">has a posterior median of 0.0066 (95 percent credible interval 0.0052 to 0.0083), compared with 0.0062 for same-size divisions around random centers and 0.0057 for compact ones. The posterior probability that the Parkin line separates the assemblages better is 0.52 against divisions around random centers and 0.94 against compact ones. The step in similarity across the Parkin line, a boundary excess of +5.7 (posterior median +5.9, 95 percent credible interval +3.5 to +8.3), lies within what copying alone produces (simulated median 0.0, 95 percent range -3.9 to +5.9; 3 percent of 300 runs reach it), and arbitrary lines drawn across this map show the same step. The posterior median is also +5.9 for both division types, and the posterior probability that the Parkin line shows more is 0.43 and 0.49. The assemblage composition sets the Parkin phase apart from its neighbors about as much as it sets apart a comparably sized piece of the basin around a random center, and more than the compact two-way divisions do. This comparison has little power for a single line, however. In simulations with copying across the phase lines, the Parkin phase’s edge among them, cut to 3 percent, the Parkin line beats a median 72 percent of random-center divisions, against 58 percent with no restriction, and a score as low as the real one (58 percent) occurs in 23 and 52 percent of simulated records. The compact two-way divisions are few and similar, so the comparison with them carries less weight (Supplemental Text). The record therefore cannot exclude restricted copying at the edge of the Parkin phase. However, the assemblage composition shows nothing that requires it.</w:t>
       </w:r>
     </w:p>
     <w:p>
@@ -3486,7 +3487,7 @@
           <wp:inline>
             <wp:extent cx="5334000" cy="3332419"/>
             <wp:effectExtent b="0" l="0" r="0" t="0"/>
-            <wp:docPr descr="Figure 9. Settlement cross-check. Left: maximum mound height ranked across the basin, the one size attribute the regional compilation records for most sites, from sources that are not uniform (mound area is recorded as zero for Parkin and is not used). Parkin’s principal mound is 21.3 ft (6.5 m) after Morse (1981, 1990), second among the 55 basin sites with a recorded height; the compilation otherwise used gives Parkin 23 ft, and we substitute the excavated value. The distribution is graded, with no gap at the top (tallest-to-second ratio 1.08). Right: the proportion of sites with a mound, a defensive ditch, and St. Francis-type fortification across the basin set (n = 92)." title="" id="147" name="Picture"/>
+            <wp:docPr descr="Figure 9. Settlement cross-check. Left: maximum mound height ranked across the basin; the one-size attribute the regional compilation records for most sites, from non-uniform sources (mound area is recorded as zero for Parkin and is not used). Parkin’s principal mound is 21.3 ft (6.5 m) after Morse (1981, 1990), second among the 55 basin sites with a recorded height; the compilation otherwise used gives Parkin 23 ft, and we substitute the excavated value. The distribution is graded, with no gap at the top (tallest-to-second ratio 1.08). Right: the proportion of sites with a mound, a defensive ditch, and St. Francis-type fortification across the basin set (n = 92)." title="" id="147" name="Picture"/>
             <a:graphic>
               <a:graphicData uri="http://schemas.openxmlformats.org/drawingml/2006/picture">
                 <pic:pic>
@@ -3539,7 +3540,7 @@
         <w:t xml:space="preserve"> </w:t>
       </w:r>
       <w:r>
-        <w:t xml:space="preserve">Settlement cross-check. Left: maximum mound height ranked across the basin, the one size attribute the regional compilation records for most sites, from sources that are not uniform (mound area is recorded as zero for Parkin and is not used). Parkin’s principal mound is 21.3 ft (6.5 m) after Morse (1981, 1990), second among the 55 basin sites with a recorded height; the compilation otherwise used gives Parkin 23 ft, and we substitute the excavated value. The distribution is graded, with no gap at the top (tallest-to-second ratio 1.08). Right: the proportion of sites with a mound, a defensive ditch, and St. Francis-type fortification across the basin set (n = 92).</w:t>
+        <w:t xml:space="preserve">Settlement cross-check. Left: maximum mound height ranked across the basin; the one-size attribute the regional compilation records for most sites, from non-uniform sources (mound area is recorded as zero for Parkin and is not used). Parkin’s principal mound is 21.3 ft (6.5 m) after Morse (1981, 1990), second among the 55 basin sites with a recorded height; the compilation otherwise used gives Parkin 23 ft, and we substitute the excavated value. The distribution is graded, with no gap at the top (tallest-to-second ratio 1.08). Right: the proportion of sites with a mound, a defensive ditch, and St. Francis-type fortification across the basin set (n = 92).</w:t>
       </w:r>
     </w:p>
     <w:bookmarkEnd w:id="149"/>
@@ -3599,7 +3600,7 @@
         <w:t xml:space="preserve">(Mainfort 2003:176–181)</w:t>
       </w:r>
       <w:r>
-        <w:t xml:space="preserve">. Where the two schemes cover the same ground, they differ at these five sites.</w:t>
+        <w:t xml:space="preserve">. Where the two schemes overlap, they differ at these five sites.</w:t>
       </w:r>
     </w:p>
     <w:p>
@@ -3607,7 +3608,7 @@
         <w:pStyle w:val="BodyText"/>
       </w:pPr>
       <w:r>
-        <w:t xml:space="preserve">We ran the phase-line tests on Mainfort’s own counts, using decorated types only and his assignments, with a minimum of 100 decorated sherds. The resulting 29 sites fall in five phases: Kent with 9 sites, Parkin with 7, Walls with 6, Horseshoe Lake with 4, and Jones Bayou with 3 (Figure 10). His table overlaps ours at 21 sites, so this is a second tally of largely the same material rather than an independent record.</w:t>
+        <w:t xml:space="preserve">We ran the phase-line tests on Mainfort’s counts, using only decorated types and his assignments, with a minimum of 100 decorated sherds. The resulting 29 sites fall in five phases: Kent with 9 sites, Parkin with 7, Walls with 6, Horseshoe Lake with 4, and Jones Bayou with 3 (Figure 10). His table overlaps ours at 21 sites, so this is a second tally of largely the same material rather than an independent record.</w:t>
       </w:r>
     </w:p>
     <w:p>
@@ -3619,7 +3620,7 @@
           <wp:inline>
             <wp:extent cx="4114800" cy="5313314"/>
             <wp:effectExtent b="0" l="0" r="0" t="0"/>
-            <wp:docPr descr="Figure 10. The phases as Mainfort (2003) assigned them: the 39 sites of his table, in seven phases. The territories are our construction from his assignments, not lines he drew. Every point on the map goes to its nearest site and those areas are merged by phase, so a phase can fall in more than one piece, as Walls and Nodena do. Filled markers are the 29 sites the second case tests, those with at least 100 decorated sherds in the five phases that keep at least two such sites; open markers are his other ten sites. The Parkin site is starred. Hydrography as in Figure 1." title="" id="151" name="Picture"/>
+            <wp:docPr descr="Figure 10. The phases as Mainfort (2003) assigned them: the 39 sites of his table, in seven phases. The territories are our construction from his assignments, not lines he drew. Every point on the map goes to its nearest site, and those areas are merged by phase, so a phase can fall in more than one piece, as Walls and Nodena do. Filled markers are the 29 sites the second case tests, those with at least 100 decorated sherds in the five phases that keep at least two such sites; open markers are his other ten sites. The Parkin site is starred. Hydrography as in Figure 1." title="" id="151" name="Picture"/>
             <a:graphic>
               <a:graphicData uri="http://schemas.openxmlformats.org/drawingml/2006/picture">
                 <pic:pic>
@@ -3684,7 +3685,7 @@
         <w:t xml:space="preserve"> </w:t>
       </w:r>
       <w:r>
-        <w:t xml:space="preserve">assigned them: the 39 sites of his table, in seven phases. The territories are our construction from his assignments, not lines he drew. Every point on the map goes to its nearest site and those areas are merged by phase, so a phase can fall in more than one piece, as Walls and Nodena do. Filled markers are the 29 sites the second case tests, those with at least 100 decorated sherds in the five phases that keep at least two such sites; open markers are his other ten sites. The Parkin site is starred. Hydrography as in Figure 1.</w:t>
+        <w:t xml:space="preserve">assigned them: the 39 sites of his table, in seven phases. The territories are our construction from his assignments, not lines he drew. Every point on the map goes to its nearest site, and those areas are merged by phase, so a phase can fall in more than one piece, as Walls and Nodena do. Filled markers are the 29 sites the second case tests, those with at least 100 decorated sherds in the five phases that keep at least two such sites; open markers are his other ten sites. The Parkin site is starred. Hydrography as in Figure 1.</w:t>
       </w:r>
     </w:p>
     <w:p>
@@ -3726,7 +3727,7 @@
         <w:pStyle w:val="BodyText"/>
       </w:pPr>
       <w:r>
-        <w:t xml:space="preserve">The second case agrees with the primary one in part. On both tallies, location recovers much of the scheme, and the phase lines separate the assemblages at least as well as arbitrary lines. On Mainfort’s table, with five phases reaching into Tennessee, they separate them clearly better (probabilities of 0.96 and 0.94, against 0.57 and 0.72 for the three phases). Neither result shows that the phases mark bounded groups, since both schemes were drawn using the frequencies of these types and location still recovers part of each. Where the two schemes disagree, at the Horseshoe Lake phase, the assemblages do not decide between them.</w:t>
+        <w:t xml:space="preserve">The second case agrees with the primary one in part. On both tallies, location recovers much of the scheme, and the phase lines separate the assemblages at least as well as arbitrary lines. On Mainfort’s table, with five phases reaching into Tennessee, they separate them clearly better (probabilities of 0.96 and 0.94, against 0.57 and 0.72 for the three phases). Neither result shows that the phases mark bounded groups, since both schemes were drawn using the frequencies of these types, and location still recovers part of each. Where the two schemes disagree, at the Horseshoe Lake phase, the assemblages do not decide between them.</w:t>
       </w:r>
     </w:p>
     <w:p>
@@ -3827,7 +3828,7 @@
         <w:pStyle w:val="BodyText"/>
       </w:pPr>
       <w:r>
-        <w:t xml:space="preserve">The culture historians who drew the phases were responding to something real, a gradient in style sampled at clumped settlements. The assemblages do not show that the lines they drew also marked the edges of bounded learning, and they do not exclude it. Where the lines cross occupied ground, they are arbitrary in the way a gradient makes them. Six of the 28 assemblages do not clearly fit their own phase best, and Castile Landing fits Parkin and Kent about equally well.</w:t>
+        <w:t xml:space="preserve">The culture historians who drew the phases were responding to something real, a gradient in style sampled at clumped settlements. The assemblages do not show that the lines they drew also marked the edges of bounded learning, and they do not rule it out. Where the lines cross occupied ground, they are arbitrary, as a gradient makes them. Six of the 28 assemblages do not clearly fit their own phase best, and Castile Landing fits Parkin and Kent about equally well.</w:t>
       </w:r>
     </w:p>
     <w:p>
@@ -3907,7 +3908,7 @@
         <w:t xml:space="preserve"> </w:t>
       </w:r>
       <w:r>
-        <w:t xml:space="preserve">The comparison adds a test of that reading: whether the Parkin, Kent, and Walls phase lines behave as edges of bounded learning.</w:t>
+        <w:t xml:space="preserve">The comparison tests that reading: whether the Parkin, Kent, and Walls phase lines behave as edges of bounded learning.</w:t>
       </w:r>
     </w:p>
     <w:p>
@@ -3938,7 +3939,15 @@
         <w:t xml:space="preserve"> </w:t>
       </w:r>
       <w:r>
-        <w:t xml:space="preserve">0.012). Within that small part, the assemblages vary over shorter distances than calibrated copying would, so divisions into three or more groups differ more than the model predicts, and arbitrary divisions of the map show a step in similarity of about the size seen at the phase lines. That variation is not specific to the phase lines or to Parkin, since other divisions of the map capture about as much of it, and it remains incompletely explained. New styles arising somewhat locally, and copying that falls off over a few kilometers, both make the observed differences more common in simulation while keeping the record’s diversity matched (Table 2). Both are still neutral copying, and both are themselves geographic. The simulations do not fix the scale of either. Local innovation fits with areas the size of half the basin, its finer-grained settings either break the diversity match or are weakly tested, and the short fall-off raises the shares only slightly. One reading, which we offer as a hypothesis and have not tested, is that interaction was concentrated in the area a community used from day to day, a few kilometers around a settlement, as would be expected of farmers, hunters, and fishers who drew on local resources. We treat these as mechanisms the record is consistent with rather than ones it demonstrates. Part of the variation may also be chronological, a matter of age that an order derived from the same frequencies cannot separate from place.</w:t>
+        <w:t xml:space="preserve">0.012). Within that small part, the assemblages vary over shorter distances than calibrated copying would, so divisions into three or more groups differ more than the model predicts, and arbitrary divisions of the map show a step in similarity of about the size seen at the phase lines. That variation is not specific to the phase lines or to Parkin, since other divisions of the map capture about as much of it, and it remains incompletely explained. New styles arising somewhat locally, and copying that falls off over a few kilometers, both make the observed differences more common in simulation while keeping the record’s diversity matched (Table 2). Both are still neutral copying, and both are themselves geographic. The simulations do not fix either scale. Local innovation fits within areas about half the size of the basin. Its finer-grained settings either break the diversity match or are weakly tested, and the short fall-off raises the shares only slightly. One reading, which we offer as a hypothesis and have not tested, is that interaction was concentrated in the area a community used from day to day, a few kilometers around a settlement, as would be expected of farmers, hunters, and fishers who drew on local resources. We treat these as mechanisms the record is consistent with rather than ones it demonstrates. Some variation may also be chronological, a matter of age that an order derived from the same frequencies cannot separate from place.</w:t>
+      </w:r>
+    </w:p>
+    <w:p>
+      <w:pPr>
+        <w:pStyle w:val="BodyText"/>
+      </w:pPr>
+      <w:r>
+        <w:t xml:space="preserve">The record leaves two explanations of the additional variation standing: new styles arising locally with copying unrestricted, and copying restricted at the phase lines. They make different predictions that ten decorated types cannot separate. A restriction should put a step at the line in every class, including common ones, whereas local innovation should appear mainly in rare and recent variants that fade smoothly across it. Attribute-level classification of the same collections, dated or stratified assemblages that show whether new variants cross the lines, more assemblages close to the lines, and attributes less easily copied than decoration, such as forming and tempering practices, would each bear on the choice. So would a line where a boundary is independently attested, such as that between Casqui and Pacaha in 1541.</w:t>
       </w:r>
     </w:p>
     <w:bookmarkEnd w:id="158"/>
@@ -3956,7 +3965,7 @@
         <w:pStyle w:val="FirstParagraph"/>
       </w:pPr>
       <w:r>
-        <w:t xml:space="preserve">Parkin was the basin’s largest town and had one of its tallest mounds, and its prominence was real. The decorated-type frequencies, however, do not show a boundary in ceramic learning at the edge of the Parkin phase. The phase is close to the northern of the two clusters the regional map supports. Its difference from the rest of the basin is one the copying model reproduces more often than any division but the two-cluster one, the step in similarity at its edge lies within what copying alone produces, and divisions around random centers separate the assemblages as well as its boundary does, although compact ones do not. Because a single line gives these comparisons little power, restricted copying at the phase’s edge cannot be excluded, but nothing in the frequencies requires it.</w:t>
+        <w:t xml:space="preserve">Parkin was the basin’s largest town and had one of its tallest mounds, and its prominence was real. The decorated-type frequencies, however, do not show a boundary in ceramic learning at the edge of the Parkin phase. The phase is close to the northern of the two clusters the regional map supports. Its difference from the rest of the basin is that the copying model reproduces it more often than any division, but the two-cluster one- the step in similarity at its edge lies within what copying alone produces, and divisions around random centers separate the assemblages as well as its boundary does, although compact ones do not. Because a single line gives these comparisons little power, restricted copying at the phase’s edge cannot be excluded, but nothing in the frequencies requires it.</w:t>
       </w:r>
     </w:p>
     <w:p>
@@ -4088,6 +4097,14 @@
         <w:t xml:space="preserve">. We built it into the copying model, so its cost is already in the reported ranges. The fourth is the copying model itself. Which combination is most favorable to it depends on the random seeds used to rank them, so we report the key comparisons across six (Table 1). The model distinguishes a copying boundary at the phase lines from new styles arising locally only weakly, so the conclusion about the phases rests on how their lines compare with other divisions of the map and what could have drawn them, rather than on the model’s failure to find restricted copying.</w:t>
       </w:r>
     </w:p>
+    <w:p>
+      <w:pPr>
+        <w:pStyle w:val="BodyText"/>
+      </w:pPr>
+      <w:r>
+        <w:t xml:space="preserve">More collections would not remove that last limit, but a finer classification might. We simulated records with a restriction at the phase lines and records with local innovation instead, and ran each through our procedure. On a record like ours, the two kinds receive overlapping probabilities of a restriction (medians of 0.82 and 0.58), and the record’s own 0.75 falls where they overlap. Quadrupling the sherd counts leaves the overlap in place. So does adding the 24 existing collections that a minimum of 10 decorated sherds would admit. Dividing each decorated class into four finer classes removes it (medians of 0.99 and 0.53). In the model, a restriction lets every class drift apart across a line, the rare ones included, while local innovation changes only the classes it reorders, and finer classes expose that difference (Supplemental Text). The model therefore points to the collections already in hand, classified by attribute rather than by type, as the place to look. Part of this result follows from how the model is built, since local innovation reorders the ten classes and leaves their finer divisions in fixed proportions, and real attribute classes may behave differently.</w:t>
+      </w:r>
+    </w:p>
     <w:bookmarkEnd w:id="160"/>
     <w:bookmarkStart w:id="161" w:name="X58aa97846e4267ccd885b870dbd88e44a706276"/>
     <w:p>
@@ -4103,7 +4120,7 @@
         <w:pStyle w:val="FirstParagraph"/>
       </w:pPr>
       <w:r>
-        <w:t xml:space="preserve">Our approach rests on two requirements that apply beyond this case. Before treating a similarity pattern as the result of differential social interaction, the record must be shown to detect a social boundary. Here, we show that</w:t>
+        <w:t xml:space="preserve">Our approach rests on two requirements that apply beyond this case. Before treating a similarity pattern as the result of differential social interaction, the record must show a social boundary. Here, we show that</w:t>
       </w:r>
       <w:r>
         <w:t xml:space="preserve"> </w:t>
@@ -4183,7 +4200,7 @@
         <w:pStyle w:val="FirstParagraph"/>
       </w:pPr>
       <w:r>
-        <w:t xml:space="preserve">The phase is the unit on which Lower Mississippi Valley culture history is built, and it often carries an unstated claim: that assemblages grouped by seriation and proximity record a community, and at Parkin, a polity. Earlier work showed that the phases do not separate cleanly. This paper tests whether the phases of the St. Francis basin, as Phillips defined them, coincide with restrictions on the copying of decorated pottery, and offers an explanation for their apparent organization. The phases have the properties of units sorted by resemblance and proximity from a clumped record. Their lines run through sparsely settled country, and hierarchical clustering of site locations alone recovers them for all but two assemblages. They do not uniquely capture the basin’s decorated-ceramic differentiation. Alternative spatial divisions of the same sites capture about as much of it, and the step in similarity at the phase lines appears at arbitrary lines as well. Pottery made by copying with no groups sorts into the phases about as readily as the real pottery under hierarchical clustering when composition is given a quarter of location’s weight or less. On resemblance alone, the real pottery fits the phases better than most simulated pottery does, but the same frequencies were used to draw them. On a second tally under a revised scheme, location again recovers much of the scheme, and the phase lines separate the assemblages more clearly. Spatially structured copying, sampled at clumped settlements and sorted by resemblance and proximity, remains a plausible account of how the phases came to look like groups, but the calibrated model does not reproduce them in full.</w:t>
+        <w:t xml:space="preserve">The phase is the unit on which Lower Mississippi Valley culture history is built, and it often carries an unstated claim: that assemblages grouped by seriation and proximity record a community, and at Parkin, a polity. Earlier work showed that the phases do not separate cleanly. This paper tests whether the phases of the St. Francis basin, as Phillips defined them, coincide with restrictions on the copying of decorated pottery, and offers an explanation for their apparent organization. The phases have the properties of units sorted by resemblance and proximity from a clumped record. Their lines run through sparsely settled country, and hierarchical clustering of site locations alone recovers them for all but two assemblages. They do not uniquely capture the basin’s decorated-ceramic differentiation. Alternative spatial divisions of the same sites capture about as much, and the step in similarity at the phase lines appears at arbitrary lines as well. Pottery made by copying with no groups sorts into the phases about as readily as the real pottery under hierarchical clustering when composition is given a quarter of location’s weight or less. On resemblance alone, the real pottery fits the phases better than most simulated pottery does, but the same frequencies were used to draw them. On a second tally under a revised scheme, location again recovers much of the scheme, and the phase lines separate the assemblages more clearly. Spatially structured copying, sampled at clumped settlements and sorted by resemblance and proximity, remains a plausible account of how the phases came to look like groups, but the calibrated model does not fully reproduce them.</w:t>
       </w:r>
     </w:p>
     <w:p>
@@ -4191,7 +4208,7 @@
         <w:pStyle w:val="BodyText"/>
       </w:pPr>
       <w:r>
-        <w:t xml:space="preserve">These results weaken the use of phase membership alone as evidence of bounded ceramic interaction communities. They do not exclude a Parkin polity, whose political boundaries need not have followed ceramic traditions, nor restrictions on copying at the phase lines, and the additional variation at finer scales remains incompletely explained. Before a phase is interpreted as a bounded community, its frequencies should show what copying across distance does not produce, and its lines should separate the assemblages better than other lines drawn across the same map.</w:t>
+        <w:t xml:space="preserve">These results weaken the use of phase membership alone as evidence of bounded ceramic interaction communities. They do not exclude a Parkin polity, whose political boundaries need not have followed ceramic traditions, nor restrictions on copying at the phase lines, and the additional variation at finer scales remains incompletely explained. Before interpreting a phase as a bounded community, its frequencies should show what copying across distance does not produce, and its lines should separate the assemblages better than other lines drawn across the same map.</w:t>
       </w:r>
     </w:p>
     <w:bookmarkEnd w:id="163"/>
@@ -4228,7 +4245,7 @@
       </w:r>
     </w:p>
     <w:bookmarkEnd w:id="164"/>
-    <w:bookmarkStart w:id="276" w:name="references"/>
+    <w:bookmarkStart w:id="278" w:name="references"/>
     <w:p>
       <w:pPr>
         <w:pStyle w:val="Heading2"/>
@@ -4237,7 +4254,7 @@
         <w:t xml:space="preserve">References</w:t>
       </w:r>
     </w:p>
-    <w:bookmarkStart w:id="275" w:name="refs"/>
+    <w:bookmarkStart w:id="277" w:name="refs"/>
     <w:bookmarkStart w:id="165" w:name="ref-anderson_1996"/>
     <w:p>
       <w:pPr>
@@ -4855,12 +4872,64 @@
       </w:r>
     </w:p>
     <w:bookmarkEnd w:id="190"/>
-    <w:bookmarkStart w:id="192" w:name="ref-fogarty_kandler_creanza_2024"/>
+    <w:bookmarkStart w:id="191" w:name="ref-feathers_2006"/>
     <w:p>
       <w:pPr>
         <w:pStyle w:val="Bibliography"/>
       </w:pPr>
       <w:r>
+        <w:t xml:space="preserve">Feathers, James K. 2006. Explaining Shell-Tempered Pottery in Prehistoric Eastern North America.</w:t>
+      </w:r>
+      <w:r>
+        <w:t xml:space="preserve"> </w:t>
+      </w:r>
+      <w:r>
+        <w:rPr>
+          <w:i/>
+          <w:iCs/>
+        </w:rPr>
+        <w:t xml:space="preserve">Journal of Archaeological Method and Theory</w:t>
+      </w:r>
+      <w:r>
+        <w:t xml:space="preserve"> </w:t>
+      </w:r>
+      <w:r>
+        <w:t xml:space="preserve">13(2):89–133.</w:t>
+      </w:r>
+    </w:p>
+    <w:bookmarkEnd w:id="191"/>
+    <w:bookmarkStart w:id="192" w:name="ref-feathers_and_peacock_2008"/>
+    <w:p>
+      <w:pPr>
+        <w:pStyle w:val="Bibliography"/>
+      </w:pPr>
+      <w:r>
+        <w:t xml:space="preserve">Feathers, James K., and Evan Peacock. 2008. Origins and Spread of Shell-Tempered Ceramics in the Eastern Woodlands: Conceptual and Methodological Frameworks for Analysis.</w:t>
+      </w:r>
+      <w:r>
+        <w:t xml:space="preserve"> </w:t>
+      </w:r>
+      <w:r>
+        <w:rPr>
+          <w:i/>
+          <w:iCs/>
+        </w:rPr>
+        <w:t xml:space="preserve">Southeastern Archaeology</w:t>
+      </w:r>
+      <w:r>
+        <w:t xml:space="preserve"> </w:t>
+      </w:r>
+      <w:r>
+        <w:t xml:space="preserve">27(2):286–293.</w:t>
+      </w:r>
+    </w:p>
+    <w:bookmarkEnd w:id="192"/>
+    <w:bookmarkStart w:id="194" w:name="ref-fogarty_kandler_creanza_2024"/>
+    <w:p>
+      <w:pPr>
+        <w:pStyle w:val="Bibliography"/>
+      </w:pPr>
+      <w:r>
         <w:t xml:space="preserve">Fogarty, Laurel, Anne Kandler, Nicole Creanza, and Marcus W. Feldman. 2024. Half a Century of Quantitative Cultural Evolution.</w:t>
       </w:r>
       <w:r>
@@ -4882,7 +4951,7 @@
       <w:r>
         <w:t xml:space="preserve"> </w:t>
       </w:r>
-      <w:hyperlink r:id="rId191">
+      <w:hyperlink r:id="rId193">
         <w:r>
           <w:rPr>
             <w:rStyle w:val="Hyperlink"/>
@@ -4894,8 +4963,8 @@
         <w:t xml:space="preserve">.</w:t>
       </w:r>
     </w:p>
-    <w:bookmarkEnd w:id="192"/>
-    <w:bookmarkStart w:id="193" w:name="ref-fox_1998"/>
+    <w:bookmarkEnd w:id="194"/>
+    <w:bookmarkStart w:id="195" w:name="ref-fox_1998"/>
     <w:p>
       <w:pPr>
         <w:pStyle w:val="Bibliography"/>
@@ -4917,8 +4986,8 @@
         <w:t xml:space="preserve">, edited by Michael J. O’Brien and Robert C. Dunnell, pp. 31–58. University of Alabama Press, Tuscaloosa.</w:t>
       </w:r>
     </w:p>
-    <w:bookmarkEnd w:id="193"/>
-    <w:bookmarkStart w:id="194" w:name="ref-gelman_meng_stern_1996"/>
+    <w:bookmarkEnd w:id="195"/>
+    <w:bookmarkStart w:id="196" w:name="ref-gelman_meng_stern_1996"/>
     <w:p>
       <w:pPr>
         <w:pStyle w:val="Bibliography"/>
@@ -4943,8 +5012,8 @@
         <w:t xml:space="preserve">6(4):733–807.</w:t>
       </w:r>
     </w:p>
-    <w:bookmarkEnd w:id="194"/>
-    <w:bookmarkStart w:id="196" w:name="ref-haley_2014"/>
+    <w:bookmarkEnd w:id="196"/>
+    <w:bookmarkStart w:id="198" w:name="ref-haley_2014"/>
     <w:p>
       <w:pPr>
         <w:pStyle w:val="Bibliography"/>
@@ -4992,7 +5061,7 @@
       <w:r>
         <w:t xml:space="preserve"> </w:t>
       </w:r>
-      <w:hyperlink r:id="rId195">
+      <w:hyperlink r:id="rId197">
         <w:r>
           <w:rPr>
             <w:rStyle w:val="Hyperlink"/>
@@ -5004,8 +5073,8 @@
         <w:t xml:space="preserve">.</w:t>
       </w:r>
     </w:p>
-    <w:bookmarkEnd w:id="196"/>
-    <w:bookmarkStart w:id="198" w:name="ref-henrich_2001"/>
+    <w:bookmarkEnd w:id="198"/>
+    <w:bookmarkStart w:id="200" w:name="ref-henrich_2001"/>
     <w:p>
       <w:pPr>
         <w:pStyle w:val="Bibliography"/>
@@ -5032,7 +5101,7 @@
       <w:r>
         <w:t xml:space="preserve"> </w:t>
       </w:r>
-      <w:hyperlink r:id="rId197">
+      <w:hyperlink r:id="rId199">
         <w:r>
           <w:rPr>
             <w:rStyle w:val="Hyperlink"/>
@@ -5044,8 +5113,8 @@
         <w:t xml:space="preserve">.</w:t>
       </w:r>
     </w:p>
-    <w:bookmarkEnd w:id="198"/>
-    <w:bookmarkStart w:id="200" w:name="ref-henrich_boyd_1998"/>
+    <w:bookmarkEnd w:id="200"/>
+    <w:bookmarkStart w:id="202" w:name="ref-henrich_boyd_1998"/>
     <w:p>
       <w:pPr>
         <w:pStyle w:val="Bibliography"/>
@@ -5072,7 +5141,7 @@
       <w:r>
         <w:t xml:space="preserve"> </w:t>
       </w:r>
-      <w:hyperlink r:id="rId199">
+      <w:hyperlink r:id="rId201">
         <w:r>
           <w:rPr>
             <w:rStyle w:val="Hyperlink"/>
@@ -5084,8 +5153,8 @@
         <w:t xml:space="preserve">.</w:t>
       </w:r>
     </w:p>
-    <w:bookmarkEnd w:id="200"/>
-    <w:bookmarkStart w:id="201" w:name="ref-holdaway_wandsnider_2008"/>
+    <w:bookmarkEnd w:id="202"/>
+    <w:bookmarkStart w:id="203" w:name="ref-holdaway_wandsnider_2008"/>
     <w:p>
       <w:pPr>
         <w:pStyle w:val="Bibliography"/>
@@ -5107,8 +5176,8 @@
         <w:t xml:space="preserve">. University of Utah Press, Salt Lake City.</w:t>
       </w:r>
     </w:p>
-    <w:bookmarkEnd w:id="201"/>
-    <w:bookmarkStart w:id="203" w:name="ref-holland-lulewicz_ritchison_2021"/>
+    <w:bookmarkEnd w:id="203"/>
+    <w:bookmarkStart w:id="205" w:name="ref-holland-lulewicz_ritchison_2021"/>
     <w:p>
       <w:pPr>
         <w:pStyle w:val="Bibliography"/>
@@ -5135,7 +5204,7 @@
       <w:r>
         <w:t xml:space="preserve"> </w:t>
       </w:r>
-      <w:hyperlink r:id="rId202">
+      <w:hyperlink r:id="rId204">
         <w:r>
           <w:rPr>
             <w:rStyle w:val="Hyperlink"/>
@@ -5147,8 +5216,8 @@
         <w:t xml:space="preserve">.</w:t>
       </w:r>
     </w:p>
-    <w:bookmarkEnd w:id="203"/>
-    <w:bookmarkStart w:id="204" w:name="ref-house_1991"/>
+    <w:bookmarkEnd w:id="205"/>
+    <w:bookmarkStart w:id="206" w:name="ref-house_1991"/>
     <w:p>
       <w:pPr>
         <w:pStyle w:val="Bibliography"/>
@@ -5190,8 +5259,8 @@
         <w:t xml:space="preserve">. PhD thesis, Southern Illinois University at Carbondale, Carbondale.</w:t>
       </w:r>
     </w:p>
-    <w:bookmarkEnd w:id="204"/>
-    <w:bookmarkStart w:id="205" w:name="ref-house_1993"/>
+    <w:bookmarkEnd w:id="206"/>
+    <w:bookmarkStart w:id="207" w:name="ref-house_1993"/>
     <w:p>
       <w:pPr>
         <w:pStyle w:val="Bibliography"/>
@@ -5216,8 +5285,8 @@
         <w:t xml:space="preserve">12(1):21–32.</w:t>
       </w:r>
     </w:p>
-    <w:bookmarkEnd w:id="205"/>
-    <w:bookmarkStart w:id="206" w:name="ref-hubert_arabie_1985"/>
+    <w:bookmarkEnd w:id="207"/>
+    <w:bookmarkStart w:id="208" w:name="ref-hubert_arabie_1985"/>
     <w:p>
       <w:pPr>
         <w:pStyle w:val="Bibliography"/>
@@ -5242,8 +5311,8 @@
         <w:t xml:space="preserve">2:193–218.</w:t>
       </w:r>
     </w:p>
-    <w:bookmarkEnd w:id="206"/>
-    <w:bookmarkStart w:id="207" w:name="ref-hudson_smith_depratter_1990"/>
+    <w:bookmarkEnd w:id="208"/>
+    <w:bookmarkStart w:id="209" w:name="ref-hudson_smith_depratter_1990"/>
     <w:p>
       <w:pPr>
         <w:pStyle w:val="Bibliography"/>
@@ -5303,8 +5372,8 @@
         <w:t xml:space="preserve">, edited by David H. Dye and Cheryl Anne Cox, pp. 181–207. University of Alabama Press, Tuscaloosa.</w:t>
       </w:r>
     </w:p>
-    <w:bookmarkEnd w:id="207"/>
-    <w:bookmarkStart w:id="209" w:name="ref-kidwell_tomasovych_2013"/>
+    <w:bookmarkEnd w:id="209"/>
+    <w:bookmarkStart w:id="211" w:name="ref-kidwell_tomasovych_2013"/>
     <w:p>
       <w:pPr>
         <w:pStyle w:val="Bibliography"/>
@@ -5331,7 +5400,7 @@
       <w:r>
         <w:t xml:space="preserve"> </w:t>
       </w:r>
-      <w:hyperlink r:id="rId208">
+      <w:hyperlink r:id="rId210">
         <w:r>
           <w:rPr>
             <w:rStyle w:val="Hyperlink"/>
@@ -5343,8 +5412,8 @@
         <w:t xml:space="preserve">.</w:t>
       </w:r>
     </w:p>
-    <w:bookmarkEnd w:id="209"/>
-    <w:bookmarkStart w:id="210" w:name="ref-king_freer_1995"/>
+    <w:bookmarkEnd w:id="211"/>
+    <w:bookmarkStart w:id="212" w:name="ref-king_freer_1995"/>
     <w:p>
       <w:pPr>
         <w:pStyle w:val="Bibliography"/>
@@ -5378,8 +5447,8 @@
         <w:t xml:space="preserve">, edited by Michael S. Nassaney and Kenneth E. Sassaman, pp. 266–288. University of Tennessee Press, Knoxville.</w:t>
       </w:r>
     </w:p>
-    <w:bookmarkEnd w:id="210"/>
-    <w:bookmarkStart w:id="211" w:name="ref-lehner_grill_2013"/>
+    <w:bookmarkEnd w:id="212"/>
+    <w:bookmarkStart w:id="213" w:name="ref-lehner_grill_2013"/>
     <w:p>
       <w:pPr>
         <w:pStyle w:val="Bibliography"/>
@@ -5404,8 +5473,8 @@
         <w:t xml:space="preserve">27(15):2171–2186.</w:t>
       </w:r>
     </w:p>
-    <w:bookmarkEnd w:id="211"/>
-    <w:bookmarkStart w:id="212" w:name="ref-lipo_2001"/>
+    <w:bookmarkEnd w:id="213"/>
+    <w:bookmarkStart w:id="214" w:name="ref-lipo_2001"/>
     <w:p>
       <w:pPr>
         <w:pStyle w:val="Bibliography"/>
@@ -5455,8 +5524,8 @@
         <w:t xml:space="preserve">. BAR International Series 918. Archaeopress, Oxford.</w:t>
       </w:r>
     </w:p>
-    <w:bookmarkEnd w:id="212"/>
-    <w:bookmarkStart w:id="214" w:name="ref-lipo_dinapoli_madsen_hunt_2021"/>
+    <w:bookmarkEnd w:id="214"/>
+    <w:bookmarkStart w:id="216" w:name="ref-lipo_dinapoli_madsen_hunt_2021"/>
     <w:p>
       <w:pPr>
         <w:pStyle w:val="Bibliography"/>
@@ -5483,7 +5552,7 @@
       <w:r>
         <w:t xml:space="preserve"> </w:t>
       </w:r>
-      <w:hyperlink r:id="rId213">
+      <w:hyperlink r:id="rId215">
         <w:r>
           <w:rPr>
             <w:rStyle w:val="Hyperlink"/>
@@ -5495,8 +5564,8 @@
         <w:t xml:space="preserve">.</w:t>
       </w:r>
     </w:p>
-    <w:bookmarkEnd w:id="214"/>
-    <w:bookmarkStart w:id="215" w:name="ref-lipo_dunnell_2007"/>
+    <w:bookmarkEnd w:id="216"/>
+    <w:bookmarkStart w:id="217" w:name="ref-lipo_dunnell_2007"/>
     <w:p>
       <w:pPr>
         <w:pStyle w:val="Bibliography"/>
@@ -5558,8 +5627,8 @@
         <w:t xml:space="preserve">, edited by Janet Rafferty and Evan Peacock, pp. 125–167. University of Alabama Press, Tuscaloosa.</w:t>
       </w:r>
     </w:p>
-    <w:bookmarkEnd w:id="215"/>
-    <w:bookmarkStart w:id="217" w:name="ref-lipo_madsen_dunnell_2015"/>
+    <w:bookmarkEnd w:id="217"/>
+    <w:bookmarkStart w:id="219" w:name="ref-lipo_madsen_dunnell_2015"/>
     <w:p>
       <w:pPr>
         <w:pStyle w:val="Bibliography"/>
@@ -5586,7 +5655,7 @@
       <w:r>
         <w:t xml:space="preserve"> </w:t>
       </w:r>
-      <w:hyperlink r:id="rId216">
+      <w:hyperlink r:id="rId218">
         <w:r>
           <w:rPr>
             <w:rStyle w:val="Hyperlink"/>
@@ -5598,8 +5667,8 @@
         <w:t xml:space="preserve">.</w:t>
       </w:r>
     </w:p>
-    <w:bookmarkEnd w:id="217"/>
-    <w:bookmarkStart w:id="219" w:name="ref-lipo_madsen_dunnell_hunt_1997"/>
+    <w:bookmarkEnd w:id="219"/>
+    <w:bookmarkStart w:id="221" w:name="ref-lipo_madsen_dunnell_hunt_1997"/>
     <w:p>
       <w:pPr>
         <w:pStyle w:val="Bibliography"/>
@@ -5626,7 +5695,7 @@
       <w:r>
         <w:t xml:space="preserve"> </w:t>
       </w:r>
-      <w:hyperlink r:id="rId218">
+      <w:hyperlink r:id="rId220">
         <w:r>
           <w:rPr>
             <w:rStyle w:val="Hyperlink"/>
@@ -5638,8 +5707,8 @@
         <w:t xml:space="preserve">.</w:t>
       </w:r>
     </w:p>
-    <w:bookmarkEnd w:id="219"/>
-    <w:bookmarkStart w:id="220" w:name="ref-madsen_2012"/>
+    <w:bookmarkEnd w:id="221"/>
+    <w:bookmarkStart w:id="222" w:name="ref-madsen_2012"/>
     <w:p>
       <w:pPr>
         <w:pStyle w:val="Bibliography"/>
@@ -5648,8 +5717,8 @@
         <w:t xml:space="preserve">Madsen, Mark E. 2012. Neutral Cultural Transmission in Time-Averaged Archaeological Assemblages. arXiv preprint arXiv:1204.2043 [physics.soc-ph].</w:t>
       </w:r>
     </w:p>
-    <w:bookmarkEnd w:id="220"/>
-    <w:bookmarkStart w:id="221" w:name="ref-mainfort_2001"/>
+    <w:bookmarkEnd w:id="222"/>
+    <w:bookmarkStart w:id="223" w:name="ref-mainfort_2001"/>
     <w:p>
       <w:pPr>
         <w:pStyle w:val="Bibliography"/>
@@ -5683,8 +5752,8 @@
         <w:t xml:space="preserve">, edited by David S. Brose, C. Wesley Cowan, and Jr. Mainfort Robert C., pp. 173–190. Smithsonian Institution Press, Washington, DC.</w:t>
       </w:r>
     </w:p>
-    <w:bookmarkEnd w:id="221"/>
-    <w:bookmarkStart w:id="222" w:name="ref-mainfort_2003"/>
+    <w:bookmarkEnd w:id="223"/>
+    <w:bookmarkStart w:id="224" w:name="ref-mainfort_2003"/>
     <w:p>
       <w:pPr>
         <w:pStyle w:val="Bibliography"/>
@@ -5721,8 +5790,8 @@
         <w:t xml:space="preserve">22(2):176–184.</w:t>
       </w:r>
     </w:p>
-    <w:bookmarkEnd w:id="222"/>
-    <w:bookmarkStart w:id="223" w:name="ref-mayr_1959"/>
+    <w:bookmarkEnd w:id="224"/>
+    <w:bookmarkStart w:id="225" w:name="ref-mayr_1959"/>
     <w:p>
       <w:pPr>
         <w:pStyle w:val="Bibliography"/>
@@ -5744,8 +5813,8 @@
         <w:t xml:space="preserve">, edited by Betty J. Meggers, pp. 409–412. The Anthropological Society of Washington, Washington, D.C.</w:t>
       </w:r>
     </w:p>
-    <w:bookmarkEnd w:id="223"/>
-    <w:bookmarkStart w:id="224" w:name="ref-mcnutt_1996"/>
+    <w:bookmarkEnd w:id="225"/>
+    <w:bookmarkStart w:id="226" w:name="ref-mcnutt_1996"/>
     <w:p>
       <w:pPr>
         <w:pStyle w:val="Bibliography"/>
@@ -5807,8 +5876,8 @@
         <w:t xml:space="preserve">, edited by Charles H. McNutt, pp. 187–. University of Alabama Press, Tuscaloosa.</w:t>
       </w:r>
     </w:p>
-    <w:bookmarkEnd w:id="224"/>
-    <w:bookmarkStart w:id="225" w:name="ref-mcnutt_franklin_henry_2012"/>
+    <w:bookmarkEnd w:id="226"/>
+    <w:bookmarkStart w:id="227" w:name="ref-mcnutt_franklin_henry_2012"/>
     <w:p>
       <w:pPr>
         <w:pStyle w:val="Bibliography"/>
@@ -5902,8 +5971,8 @@
         <w:t xml:space="preserve">31(2):231–250.</w:t>
       </w:r>
     </w:p>
-    <w:bookmarkEnd w:id="225"/>
-    <w:bookmarkStart w:id="227" w:name="ref-miller_atkins_premo_2018"/>
+    <w:bookmarkEnd w:id="227"/>
+    <w:bookmarkStart w:id="229" w:name="ref-miller_atkins_premo_2018"/>
     <w:p>
       <w:pPr>
         <w:pStyle w:val="Bibliography"/>
@@ -5930,7 +5999,7 @@
       <w:r>
         <w:t xml:space="preserve"> </w:t>
       </w:r>
-      <w:hyperlink r:id="rId226">
+      <w:hyperlink r:id="rId228">
         <w:r>
           <w:rPr>
             <w:rStyle w:val="Hyperlink"/>
@@ -5942,8 +6011,8 @@
         <w:t xml:space="preserve">.</w:t>
       </w:r>
     </w:p>
-    <w:bookmarkEnd w:id="227"/>
-    <w:bookmarkStart w:id="228" w:name="ref-mitchem_2001"/>
+    <w:bookmarkEnd w:id="229"/>
+    <w:bookmarkStart w:id="230" w:name="ref-mitchem_2001"/>
     <w:p>
       <w:pPr>
         <w:pStyle w:val="Bibliography"/>
@@ -5973,8 +6042,8 @@
         <w:t xml:space="preserve">.</w:t>
       </w:r>
     </w:p>
-    <w:bookmarkEnd w:id="228"/>
-    <w:bookmarkStart w:id="229" w:name="ref-mitchem_2017"/>
+    <w:bookmarkEnd w:id="230"/>
+    <w:bookmarkStart w:id="231" w:name="ref-mitchem_2017"/>
     <w:p>
       <w:pPr>
         <w:pStyle w:val="Bibliography"/>
@@ -6025,8 +6094,8 @@
         <w:t xml:space="preserve">’s 1541 Cross.</w:t>
       </w:r>
     </w:p>
-    <w:bookmarkEnd w:id="229"/>
-    <w:bookmarkStart w:id="230" w:name="ref-morse_d_1990"/>
+    <w:bookmarkEnd w:id="231"/>
+    <w:bookmarkStart w:id="232" w:name="ref-morse_d_1990"/>
     <w:p>
       <w:pPr>
         <w:pStyle w:val="Bibliography"/>
@@ -6074,8 +6143,8 @@
         <w:t xml:space="preserve">, edited by David H. Dye and Cheryl Anne Cox, pp. 69–97. University of Alabama Press, Tuscaloosa.</w:t>
       </w:r>
     </w:p>
-    <w:bookmarkEnd w:id="230"/>
-    <w:bookmarkStart w:id="231" w:name="ref-morse_morse_1996"/>
+    <w:bookmarkEnd w:id="232"/>
+    <w:bookmarkStart w:id="233" w:name="ref-morse_morse_1996"/>
     <w:p>
       <w:pPr>
         <w:pStyle w:val="Bibliography"/>
@@ -6112,8 +6181,8 @@
         <w:t xml:space="preserve">17(1):1–35.</w:t>
       </w:r>
     </w:p>
-    <w:bookmarkEnd w:id="231"/>
-    <w:bookmarkStart w:id="232" w:name="ref-morse_p_1981"/>
+    <w:bookmarkEnd w:id="233"/>
+    <w:bookmarkStart w:id="234" w:name="ref-morse_p_1981"/>
     <w:p>
       <w:pPr>
         <w:pStyle w:val="Bibliography"/>
@@ -6184,8 +6253,8 @@
         <w:t xml:space="preserve">. Arkansas Archeological Survey Research Series 13. Arkansas Archeological Survey, Fayetteville.</w:t>
       </w:r>
     </w:p>
-    <w:bookmarkEnd w:id="232"/>
-    <w:bookmarkStart w:id="233" w:name="ref-morse_1990"/>
+    <w:bookmarkEnd w:id="234"/>
+    <w:bookmarkStart w:id="235" w:name="ref-morse_1990"/>
     <w:p>
       <w:pPr>
         <w:pStyle w:val="Bibliography"/>
@@ -6245,8 +6314,8 @@
         <w:t xml:space="preserve">, edited by David H. Dye and Cheryl Anne Cox, pp. 118–134. University of Alabama Press, Tuscaloosa.</w:t>
       </w:r>
     </w:p>
-    <w:bookmarkEnd w:id="233"/>
-    <w:bookmarkStart w:id="235" w:name="ref-nei_1973"/>
+    <w:bookmarkEnd w:id="235"/>
+    <w:bookmarkStart w:id="237" w:name="ref-nei_1973"/>
     <w:p>
       <w:pPr>
         <w:pStyle w:val="Bibliography"/>
@@ -6273,7 +6342,7 @@
       <w:r>
         <w:t xml:space="preserve"> </w:t>
       </w:r>
-      <w:hyperlink r:id="rId234">
+      <w:hyperlink r:id="rId236">
         <w:r>
           <w:rPr>
             <w:rStyle w:val="Hyperlink"/>
@@ -6285,8 +6354,8 @@
         <w:t xml:space="preserve">.</w:t>
       </w:r>
     </w:p>
-    <w:bookmarkEnd w:id="235"/>
-    <w:bookmarkStart w:id="236" w:name="ref-neiman_1995"/>
+    <w:bookmarkEnd w:id="237"/>
+    <w:bookmarkStart w:id="238" w:name="ref-neiman_1995"/>
     <w:p>
       <w:pPr>
         <w:pStyle w:val="Bibliography"/>
@@ -6329,8 +6398,8 @@
         <w:t xml:space="preserve">60(1):7–36.</w:t>
       </w:r>
     </w:p>
-    <w:bookmarkEnd w:id="236"/>
-    <w:bookmarkStart w:id="238" w:name="ref-peebles_kus_1977"/>
+    <w:bookmarkEnd w:id="238"/>
+    <w:bookmarkStart w:id="240" w:name="ref-peebles_kus_1977"/>
     <w:p>
       <w:pPr>
         <w:pStyle w:val="Bibliography"/>
@@ -6357,7 +6426,7 @@
       <w:r>
         <w:t xml:space="preserve"> </w:t>
       </w:r>
-      <w:hyperlink r:id="rId237">
+      <w:hyperlink r:id="rId239">
         <w:r>
           <w:rPr>
             <w:rStyle w:val="Hyperlink"/>
@@ -6369,8 +6438,8 @@
         <w:t xml:space="preserve">.</w:t>
       </w:r>
     </w:p>
-    <w:bookmarkEnd w:id="238"/>
-    <w:bookmarkStart w:id="240" w:name="ref-peeples_schachner_2012"/>
+    <w:bookmarkEnd w:id="240"/>
+    <w:bookmarkStart w:id="242" w:name="ref-peeples_schachner_2012"/>
     <w:p>
       <w:pPr>
         <w:pStyle w:val="Bibliography"/>
@@ -6397,7 +6466,7 @@
       <w:r>
         <w:t xml:space="preserve"> </w:t>
       </w:r>
-      <w:hyperlink r:id="rId239">
+      <w:hyperlink r:id="rId241">
         <w:r>
           <w:rPr>
             <w:rStyle w:val="Hyperlink"/>
@@ -6409,8 +6478,8 @@
         <w:t xml:space="preserve">.</w:t>
       </w:r>
     </w:p>
-    <w:bookmarkEnd w:id="240"/>
-    <w:bookmarkStart w:id="242" w:name="ref-perreault_2018"/>
+    <w:bookmarkEnd w:id="242"/>
+    <w:bookmarkStart w:id="244" w:name="ref-perreault_2018"/>
     <w:p>
       <w:pPr>
         <w:pStyle w:val="Bibliography"/>
@@ -6437,7 +6506,7 @@
       <w:r>
         <w:t xml:space="preserve"> </w:t>
       </w:r>
-      <w:hyperlink r:id="rId241">
+      <w:hyperlink r:id="rId243">
         <w:r>
           <w:rPr>
             <w:rStyle w:val="Hyperlink"/>
@@ -6449,8 +6518,8 @@
         <w:t xml:space="preserve">.</w:t>
       </w:r>
     </w:p>
-    <w:bookmarkEnd w:id="242"/>
-    <w:bookmarkStart w:id="243" w:name="ref-perreault_2019"/>
+    <w:bookmarkEnd w:id="244"/>
+    <w:bookmarkStart w:id="245" w:name="ref-perreault_2019"/>
     <w:p>
       <w:pPr>
         <w:pStyle w:val="Bibliography"/>
@@ -6472,8 +6541,8 @@
         <w:t xml:space="preserve">. University of Chicago Press, Chicago.</w:t>
       </w:r>
     </w:p>
-    <w:bookmarkEnd w:id="243"/>
-    <w:bookmarkStart w:id="244" w:name="ref-phillips_1970"/>
+    <w:bookmarkEnd w:id="245"/>
+    <w:bookmarkStart w:id="246" w:name="ref-phillips_1970"/>
     <w:p>
       <w:pPr>
         <w:pStyle w:val="Bibliography"/>
@@ -6544,8 +6613,8 @@
         <w:t xml:space="preserve">, Vol. 60. Papers of the Peabody Museum of Archaeology and Ethnology. Peabody Museum, Harvard University, Cambridge, MA.</w:t>
       </w:r>
     </w:p>
-    <w:bookmarkEnd w:id="244"/>
-    <w:bookmarkStart w:id="245" w:name="ref-phillips_ford_griffin_1951"/>
+    <w:bookmarkEnd w:id="246"/>
+    <w:bookmarkStart w:id="247" w:name="ref-phillips_ford_griffin_1951"/>
     <w:p>
       <w:pPr>
         <w:pStyle w:val="Bibliography"/>
@@ -6595,8 +6664,8 @@
         <w:t xml:space="preserve">, Vol. 25. Papers of the Peabody Museum of American Archaeology and Ethnology. Peabody Museum, Harvard University, Cambridge, MA.</w:t>
       </w:r>
     </w:p>
-    <w:bookmarkEnd w:id="245"/>
-    <w:bookmarkStart w:id="247" w:name="ref-phillips_willey_1953"/>
+    <w:bookmarkEnd w:id="247"/>
+    <w:bookmarkStart w:id="249" w:name="ref-phillips_willey_1953"/>
     <w:p>
       <w:pPr>
         <w:pStyle w:val="Bibliography"/>
@@ -6623,7 +6692,7 @@
       <w:r>
         <w:t xml:space="preserve"> </w:t>
       </w:r>
-      <w:hyperlink r:id="rId246">
+      <w:hyperlink r:id="rId248">
         <w:r>
           <w:rPr>
             <w:rStyle w:val="Hyperlink"/>
@@ -6635,8 +6704,8 @@
         <w:t xml:space="preserve">.</w:t>
       </w:r>
     </w:p>
-    <w:bookmarkEnd w:id="247"/>
-    <w:bookmarkStart w:id="249" w:name="ref-premo_2016"/>
+    <w:bookmarkEnd w:id="249"/>
+    <w:bookmarkStart w:id="251" w:name="ref-premo_2016"/>
     <w:p>
       <w:pPr>
         <w:pStyle w:val="Bibliography"/>
@@ -6663,7 +6732,7 @@
       <w:r>
         <w:t xml:space="preserve"> </w:t>
       </w:r>
-      <w:hyperlink r:id="rId248">
+      <w:hyperlink r:id="rId250">
         <w:r>
           <w:rPr>
             <w:rStyle w:val="Hyperlink"/>
@@ -6675,8 +6744,8 @@
         <w:t xml:space="preserve">.</w:t>
       </w:r>
     </w:p>
-    <w:bookmarkEnd w:id="249"/>
-    <w:bookmarkStart w:id="251" w:name="ref-premo_scholnick_2011"/>
+    <w:bookmarkEnd w:id="251"/>
+    <w:bookmarkStart w:id="253" w:name="ref-premo_scholnick_2011"/>
     <w:p>
       <w:pPr>
         <w:pStyle w:val="Bibliography"/>
@@ -6703,7 +6772,7 @@
       <w:r>
         <w:t xml:space="preserve"> </w:t>
       </w:r>
-      <w:hyperlink r:id="rId250">
+      <w:hyperlink r:id="rId252">
         <w:r>
           <w:rPr>
             <w:rStyle w:val="Hyperlink"/>
@@ -6715,8 +6784,8 @@
         <w:t xml:space="preserve">.</w:t>
       </w:r>
     </w:p>
-    <w:bookmarkEnd w:id="251"/>
-    <w:bookmarkStart w:id="252" w:name="ref-rees_political_culture"/>
+    <w:bookmarkEnd w:id="253"/>
+    <w:bookmarkStart w:id="254" w:name="ref-rees_political_culture"/>
     <w:p>
       <w:pPr>
         <w:pStyle w:val="Bibliography"/>
@@ -6740,8 +6809,8 @@
         <w:t xml:space="preserve">. Ph.D. dissertation, University of Oklahoma, Norman.</w:t>
       </w:r>
     </w:p>
-    <w:bookmarkEnd w:id="252"/>
-    <w:bookmarkStart w:id="254" w:name="ref-reimer_etal_2020"/>
+    <w:bookmarkEnd w:id="254"/>
+    <w:bookmarkStart w:id="256" w:name="ref-reimer_etal_2020"/>
     <w:p>
       <w:pPr>
         <w:pStyle w:val="Bibliography"/>
@@ -6795,7 +6864,7 @@
       <w:r>
         <w:t xml:space="preserve"> </w:t>
       </w:r>
-      <w:hyperlink r:id="rId253">
+      <w:hyperlink r:id="rId255">
         <w:r>
           <w:rPr>
             <w:rStyle w:val="Hyperlink"/>
@@ -6807,8 +6876,8 @@
         <w:t xml:space="preserve">.</w:t>
       </w:r>
     </w:p>
-    <w:bookmarkEnd w:id="254"/>
-    <w:bookmarkStart w:id="255" w:name="ref-robinson_1951"/>
+    <w:bookmarkEnd w:id="256"/>
+    <w:bookmarkStart w:id="257" w:name="ref-robinson_1951"/>
     <w:p>
       <w:pPr>
         <w:pStyle w:val="Bibliography"/>
@@ -6833,8 +6902,8 @@
         <w:t xml:space="preserve">16(4):293–301.</w:t>
       </w:r>
     </w:p>
-    <w:bookmarkEnd w:id="255"/>
-    <w:bookmarkStart w:id="256" w:name="ref-ross-stallings_2017"/>
+    <w:bookmarkEnd w:id="257"/>
+    <w:bookmarkStart w:id="258" w:name="ref-ross-stallings_2017"/>
     <w:p>
       <w:pPr>
         <w:pStyle w:val="Bibliography"/>
@@ -6868,8 +6937,8 @@
         <w:t xml:space="preserve">, edited by Haagen D. Klaus, Amanda R. Harvey, and Mark N. Cohen, pp. 329–362. University Press of Florida, Gainesville.</w:t>
       </w:r>
     </w:p>
-    <w:bookmarkEnd w:id="256"/>
-    <w:bookmarkStart w:id="257" w:name="ref-schiffer_1972"/>
+    <w:bookmarkEnd w:id="258"/>
+    <w:bookmarkStart w:id="259" w:name="ref-schiffer_1972"/>
     <w:p>
       <w:pPr>
         <w:pStyle w:val="Bibliography"/>
@@ -6894,8 +6963,8 @@
         <w:t xml:space="preserve">37(2):156–165.</w:t>
       </w:r>
     </w:p>
-    <w:bookmarkEnd w:id="257"/>
-    <w:bookmarkStart w:id="259" w:name="ref-schneider_martins_deaguiar_2016"/>
+    <w:bookmarkEnd w:id="259"/>
+    <w:bookmarkStart w:id="261" w:name="ref-schneider_martins_deaguiar_2016"/>
     <w:p>
       <w:pPr>
         <w:pStyle w:val="Bibliography"/>
@@ -6922,7 +6991,7 @@
       <w:r>
         <w:t xml:space="preserve"> </w:t>
       </w:r>
-      <w:hyperlink r:id="rId258">
+      <w:hyperlink r:id="rId260">
         <w:r>
           <w:rPr>
             <w:rStyle w:val="Hyperlink"/>
@@ -6934,8 +7003,8 @@
         <w:t xml:space="preserve">.</w:t>
       </w:r>
     </w:p>
-    <w:bookmarkEnd w:id="259"/>
-    <w:bookmarkStart w:id="261" w:name="ref-shennan_crema_kerig_2015"/>
+    <w:bookmarkEnd w:id="261"/>
+    <w:bookmarkStart w:id="263" w:name="ref-shennan_crema_kerig_2015"/>
     <w:p>
       <w:pPr>
         <w:pStyle w:val="Bibliography"/>
@@ -7001,7 +7070,7 @@
       <w:r>
         <w:t xml:space="preserve"> </w:t>
       </w:r>
-      <w:hyperlink r:id="rId260">
+      <w:hyperlink r:id="rId262">
         <w:r>
           <w:rPr>
             <w:rStyle w:val="Hyperlink"/>
@@ -7013,8 +7082,8 @@
         <w:t xml:space="preserve">.</w:t>
       </w:r>
     </w:p>
-    <w:bookmarkEnd w:id="261"/>
-    <w:bookmarkStart w:id="262" w:name="ref-shennan_wilkinson_2001"/>
+    <w:bookmarkEnd w:id="263"/>
+    <w:bookmarkStart w:id="264" w:name="ref-shennan_wilkinson_2001"/>
     <w:p>
       <w:pPr>
         <w:pStyle w:val="Bibliography"/>
@@ -7054,8 +7123,8 @@
         <w:t xml:space="preserve">66(4):577–593.</w:t>
       </w:r>
     </w:p>
-    <w:bookmarkEnd w:id="262"/>
-    <w:bookmarkStart w:id="263" w:name="ref-smith_1990"/>
+    <w:bookmarkEnd w:id="264"/>
+    <w:bookmarkStart w:id="265" w:name="ref-smith_1990"/>
     <w:p>
       <w:pPr>
         <w:pStyle w:val="Bibliography"/>
@@ -7103,8 +7172,8 @@
         <w:t xml:space="preserve">, edited by David H. Dye and Cheryl Anne Cox, pp. 135–169. University of Alabama Press, Tuscaloosa.</w:t>
       </w:r>
     </w:p>
-    <w:bookmarkEnd w:id="263"/>
-    <w:bookmarkStart w:id="264" w:name="ref-smith_neiman_2007"/>
+    <w:bookmarkEnd w:id="265"/>
+    <w:bookmarkStart w:id="266" w:name="ref-smith_neiman_2007"/>
     <w:p>
       <w:pPr>
         <w:pStyle w:val="Bibliography"/>
@@ -7129,8 +7198,8 @@
         <w:t xml:space="preserve">26(1):47–72.</w:t>
       </w:r>
     </w:p>
-    <w:bookmarkEnd w:id="264"/>
-    <w:bookmarkStart w:id="265" w:name="ref-starr_1984"/>
+    <w:bookmarkEnd w:id="266"/>
+    <w:bookmarkStart w:id="267" w:name="ref-starr_1984"/>
     <w:p>
       <w:pPr>
         <w:pStyle w:val="Bibliography"/>
@@ -7311,8 +7380,8 @@
         <w:t xml:space="preserve">, edited by John M. Connaway, pp. 163–222. Archaeological Report No. 14. Mississippi Department of Archives; History, Jackson, MS.</w:t>
       </w:r>
     </w:p>
-    <w:bookmarkEnd w:id="265"/>
-    <w:bookmarkStart w:id="266" w:name="ref-tomasovych_kidwell_2009"/>
+    <w:bookmarkEnd w:id="267"/>
+    <w:bookmarkStart w:id="268" w:name="ref-tomasovych_kidwell_2009"/>
     <w:p>
       <w:pPr>
         <w:pStyle w:val="Bibliography"/>
@@ -7337,8 +7406,8 @@
         <w:t xml:space="preserve">35(1):94–118.</w:t>
       </w:r>
     </w:p>
-    <w:bookmarkEnd w:id="266"/>
-    <w:bookmarkStart w:id="267" w:name="ref-willey_phillips_1958"/>
+    <w:bookmarkEnd w:id="268"/>
+    <w:bookmarkStart w:id="269" w:name="ref-willey_phillips_1958"/>
     <w:p>
       <w:pPr>
         <w:pStyle w:val="Bibliography"/>
@@ -7360,8 +7429,8 @@
         <w:t xml:space="preserve">. University of Chicago Press, Chicago.</w:t>
       </w:r>
     </w:p>
-    <w:bookmarkEnd w:id="267"/>
-    <w:bookmarkStart w:id="268" w:name="ref-williams_1954"/>
+    <w:bookmarkEnd w:id="269"/>
+    <w:bookmarkStart w:id="270" w:name="ref-williams_1954"/>
     <w:p>
       <w:pPr>
         <w:pStyle w:val="Bibliography"/>
@@ -7370,8 +7439,8 @@
         <w:t xml:space="preserve">Williams, Stephen. 1954. An Archeological Study of the Mississippian Culture in Southeast Missouri. PhD thesis, Yale University, New Haven.</w:t>
       </w:r>
     </w:p>
-    <w:bookmarkEnd w:id="268"/>
-    <w:bookmarkStart w:id="270" w:name="ref-wright_1943"/>
+    <w:bookmarkEnd w:id="270"/>
+    <w:bookmarkStart w:id="272" w:name="ref-wright_1943"/>
     <w:p>
       <w:pPr>
         <w:pStyle w:val="Bibliography"/>
@@ -7398,7 +7467,7 @@
       <w:r>
         <w:t xml:space="preserve"> </w:t>
       </w:r>
-      <w:hyperlink r:id="rId269">
+      <w:hyperlink r:id="rId271">
         <w:r>
           <w:rPr>
             <w:rStyle w:val="Hyperlink"/>
@@ -7410,8 +7479,8 @@
         <w:t xml:space="preserve">.</w:t>
       </w:r>
     </w:p>
-    <w:bookmarkEnd w:id="270"/>
-    <w:bookmarkStart w:id="272" w:name="ref-wright_1951"/>
+    <w:bookmarkEnd w:id="272"/>
+    <w:bookmarkStart w:id="274" w:name="ref-wright_1951"/>
     <w:p>
       <w:pPr>
         <w:pStyle w:val="Bibliography"/>
@@ -7438,7 +7507,7 @@
       <w:r>
         <w:t xml:space="preserve"> </w:t>
       </w:r>
-      <w:hyperlink r:id="rId271">
+      <w:hyperlink r:id="rId273">
         <w:r>
           <w:rPr>
             <w:rStyle w:val="Hyperlink"/>
@@ -7450,8 +7519,8 @@
         <w:t xml:space="preserve">.</w:t>
       </w:r>
     </w:p>
-    <w:bookmarkEnd w:id="272"/>
-    <w:bookmarkStart w:id="274" w:name="ref-youngblood_miton_morin_2023"/>
+    <w:bookmarkEnd w:id="274"/>
+    <w:bookmarkStart w:id="276" w:name="ref-youngblood_miton_morin_2023"/>
     <w:p>
       <w:pPr>
         <w:pStyle w:val="Bibliography"/>
@@ -7478,7 +7547,7 @@
       <w:r>
         <w:t xml:space="preserve"> </w:t>
       </w:r>
-      <w:hyperlink r:id="rId273">
+      <w:hyperlink r:id="rId275">
         <w:r>
           <w:rPr>
             <w:rStyle w:val="Hyperlink"/>
@@ -7490,10 +7559,10 @@
         <w:t xml:space="preserve">.</w:t>
       </w:r>
     </w:p>
-    <w:bookmarkEnd w:id="274"/>
-    <w:bookmarkEnd w:id="275"/>
     <w:bookmarkEnd w:id="276"/>
     <w:bookmarkEnd w:id="277"/>
+    <w:bookmarkEnd w:id="278"/>
+    <w:bookmarkEnd w:id="279"/>
     <w:sectPr>
       <w:footerReference r:id="rId100" w:type="default"/>
       <w:footnotePr>

</xml_diff>